<commit_message>
Complete the v2 study: results, funnel analysis, paper
All 36 rows x 3 conditions complete and judged (108/108, 0 failures).
Intent recovery: ceiling 97%, floor 81%, treatment 83% (gap recovery
0.17, McNemar p = 1.0). Defects caught: 8% / 17% / 17%.

collect.py now traces each instance through floor miss -> detector
asked -> author answered -> intent recovered (7 -> 2 -> 1 -> 1), which
places the limit on detector recall. The paper reports this, the
uncertainty-detector results, and the oracle protocol deviation.
Study B page rebuilt from the re-run treatment. Deliverable-editing
helpers added for the document update.

Co-Authored-By: Claude Opus 5.5 <noreply@anthropic.com>
</commit_message>
<xml_diff>
--- a/paper/ClarifyReview_Paper_Draft.docx
+++ b/paper/ClarifyReview_Paper_Draft.docx
@@ -107,7 +107,7 @@
           <w:sz w:val="18"/>
           <w:szCs w:val="18"/>
         </w:rPr>
-        <w:t xml:space="preserve">—Commercial LLM-based code reviewers read a pull request once, infer the author's intent, and comment on that inference. When intent is ambiguous they guess. We present ClarifyReview, a reviewer that inserts an ambiguity-detection step before comment generation and asks the author one targeted question when the available context is insufficient. We evaluate it in a two-by-three ablation on SWE-bench Verified, comparing a single-pass reviewer with intent removed, the same reviewer with clarification, and a full-context ceiling. A pilot showed that removing only the linked issue leaves intent recoverable from the patch itself: intent recovery was 100% in the floor condition, leaving no gap to measure. A revised manipulation removes all natural-language statements of intent, and a mutant arm adds 32 execution-verified defects. We report these as a small-sample study under free-tier quota limits, and release the system, harness and data.</w:t>
+        <w:t xml:space="preserve">—Commercial LLM-based code reviewers read a pull request once, infer the author's intent, and comment on that inference. When intent is ambiguous they guess. We present ClarifyReview, a reviewer that inserts an ambiguity-detection step before comment generation and asks the author one targeted question when the available context is insufficient. We evaluate it in a two-by-three ablation on SWE-bench Verified, comparing a single-pass reviewer with intent removed, the same reviewer with clarification, and a full-context ceiling. A pilot showed that removing only the linked issue leaves intent recoverable from the patch itself: intent recovery was 100% in the floor condition, leaving no gap to measure. A revised manipulation removes all natural-language statements of intent, and a mutant arm adds 32 execution-verified defects. On 36 complete instances, intent recovery was 81% without clarification, 83% with it, and 97% with full context (McNemar p = 1.000). Verified defects were caught in 17%, 17% and 8% of cases respectively. We report these as a small-sample study under free-tier quota limits, and release the system, harness and data.</w:t>
       </w:r>
     </w:p>
     <w:p>
@@ -713,25 +713,1548 @@
           <w:sz w:val="20"/>
           <w:szCs w:val="20"/>
         </w:rPr>
-        <w:t xml:space="preserve">The v2 run had completed 0 instances at the time of writing; results are reported when the run completes.</w:t>
-      </w:r>
-    </w:p>
-    <w:p>
-      <w:pPr>
-        <w:spacing w:after="50" w:before="100"/>
-      </w:pPr>
-      <w:r>
-        <w:rPr>
-          <w:rFonts w:ascii="Times New Roman" w:cs="Times New Roman" w:eastAsia="Times New Roman" w:hAnsi="Times New Roman"/>
-          <w:b w:val="false"/>
-          <w:bCs w:val="false"/>
-          <w:i/>
-          <w:iCs/>
-          <w:smallCaps w:val="false"/>
-          <w:sz w:val="20"/>
-          <w:szCs w:val="20"/>
-        </w:rPr>
-        <w:t xml:space="preserve">C. Detector comparison</w:t>
+        <w:t xml:space="preserve">36 of 36 rows completed all three conditions, with no failed calls once transient provider errors were retried, and all 108 reviews were judged. Table I gives the outcomes. Gap recovery is shown only where the ceiling exceeds the floor; elsewhere it is undefined.</w:t>
+      </w:r>
+    </w:p>
+    <w:p>
+      <w:pPr>
+        <w:spacing w:after="40" w:before="100"/>
+        <w:jc w:val="center"/>
+      </w:pPr>
+      <w:r>
+        <w:rPr>
+          <w:rFonts w:ascii="Times New Roman" w:cs="Times New Roman" w:eastAsia="Times New Roman" w:hAnsi="Times New Roman"/>
+          <w:b w:val="false"/>
+          <w:bCs w:val="false"/>
+          <w:i w:val="false"/>
+          <w:iCs w:val="false"/>
+          <w:smallCaps/>
+          <w:sz w:val="16"/>
+          <w:szCs w:val="16"/>
+        </w:rPr>
+        <w:t xml:space="preserve">Table I. Judged outcomes, manipulation v2</w:t>
+      </w:r>
+    </w:p>
+    <w:tbl>
+      <w:tblPr>
+        <w:tblW w:type="dxa" w:w="4470"/>
+        <w:tblBorders>
+          <w:top w:val="single" w:color="auto" w:sz="4"/>
+          <w:left w:val="single" w:color="auto" w:sz="4"/>
+          <w:bottom w:val="single" w:color="auto" w:sz="4"/>
+          <w:right w:val="single" w:color="auto" w:sz="4"/>
+          <w:insideH w:val="single" w:color="auto" w:sz="4"/>
+          <w:insideV w:val="single" w:color="auto" w:sz="4"/>
+        </w:tblBorders>
+      </w:tblPr>
+      <w:tblGrid>
+        <w:gridCol w:w="1500"/>
+        <w:gridCol w:w="330"/>
+        <w:gridCol w:w="520"/>
+        <w:gridCol w:w="520"/>
+        <w:gridCol w:w="520"/>
+        <w:gridCol w:w="560"/>
+        <w:gridCol w:w="520"/>
+      </w:tblGrid>
+      <w:tr>
+        <w:tc>
+          <w:tcPr>
+            <w:tcW w:type="dxa" w:w="1500"/>
+            <w:tcBorders>
+              <w:top w:val="single" w:color="000000" w:sz="4"/>
+              <w:left w:val="none" w:color="FFFFFF" w:sz="0"/>
+              <w:bottom w:val="single" w:color="000000" w:sz="4"/>
+              <w:right w:val="none" w:color="FFFFFF" w:sz="0"/>
+            </w:tcBorders>
+            <w:tcMar>
+              <w:top w:type="dxa" w:w="30"/>
+              <w:left w:type="dxa" w:w="50"/>
+              <w:bottom w:type="dxa" w:w="30"/>
+              <w:right w:type="dxa" w:w="50"/>
+            </w:tcMar>
+          </w:tcPr>
+          <w:p>
+            <w:pPr>
+              <w:jc w:val="left"/>
+            </w:pPr>
+            <w:r>
+              <w:rPr>
+                <w:rFonts w:ascii="Times New Roman" w:cs="Times New Roman" w:eastAsia="Times New Roman" w:hAnsi="Times New Roman"/>
+                <w:b/>
+                <w:bCs/>
+                <w:i w:val="false"/>
+                <w:iCs w:val="false"/>
+                <w:smallCaps w:val="false"/>
+                <w:sz w:val="16"/>
+                <w:szCs w:val="16"/>
+              </w:rPr>
+              <w:t xml:space="preserve">Measure</w:t>
+            </w:r>
+          </w:p>
+        </w:tc>
+        <w:tc>
+          <w:tcPr>
+            <w:tcW w:type="dxa" w:w="330"/>
+            <w:tcBorders>
+              <w:top w:val="single" w:color="000000" w:sz="4"/>
+              <w:left w:val="none" w:color="FFFFFF" w:sz="0"/>
+              <w:bottom w:val="single" w:color="000000" w:sz="4"/>
+              <w:right w:val="none" w:color="FFFFFF" w:sz="0"/>
+            </w:tcBorders>
+            <w:tcMar>
+              <w:top w:type="dxa" w:w="30"/>
+              <w:left w:type="dxa" w:w="50"/>
+              <w:bottom w:type="dxa" w:w="30"/>
+              <w:right w:type="dxa" w:w="50"/>
+            </w:tcMar>
+          </w:tcPr>
+          <w:p>
+            <w:pPr>
+              <w:jc w:val="center"/>
+            </w:pPr>
+            <w:r>
+              <w:rPr>
+                <w:rFonts w:ascii="Times New Roman" w:cs="Times New Roman" w:eastAsia="Times New Roman" w:hAnsi="Times New Roman"/>
+                <w:b/>
+                <w:bCs/>
+                <w:i w:val="false"/>
+                <w:iCs w:val="false"/>
+                <w:smallCaps w:val="false"/>
+                <w:sz w:val="16"/>
+                <w:szCs w:val="16"/>
+              </w:rPr>
+              <w:t xml:space="preserve">n</w:t>
+            </w:r>
+          </w:p>
+        </w:tc>
+        <w:tc>
+          <w:tcPr>
+            <w:tcW w:type="dxa" w:w="520"/>
+            <w:tcBorders>
+              <w:top w:val="single" w:color="000000" w:sz="4"/>
+              <w:left w:val="none" w:color="FFFFFF" w:sz="0"/>
+              <w:bottom w:val="single" w:color="000000" w:sz="4"/>
+              <w:right w:val="none" w:color="FFFFFF" w:sz="0"/>
+            </w:tcBorders>
+            <w:tcMar>
+              <w:top w:type="dxa" w:w="30"/>
+              <w:left w:type="dxa" w:w="50"/>
+              <w:bottom w:type="dxa" w:w="30"/>
+              <w:right w:type="dxa" w:w="50"/>
+            </w:tcMar>
+          </w:tcPr>
+          <w:p>
+            <w:pPr>
+              <w:jc w:val="center"/>
+            </w:pPr>
+            <w:r>
+              <w:rPr>
+                <w:rFonts w:ascii="Times New Roman" w:cs="Times New Roman" w:eastAsia="Times New Roman" w:hAnsi="Times New Roman"/>
+                <w:b/>
+                <w:bCs/>
+                <w:i w:val="false"/>
+                <w:iCs w:val="false"/>
+                <w:smallCaps w:val="false"/>
+                <w:sz w:val="16"/>
+                <w:szCs w:val="16"/>
+              </w:rPr>
+              <w:t xml:space="preserve">Floor</w:t>
+            </w:r>
+          </w:p>
+        </w:tc>
+        <w:tc>
+          <w:tcPr>
+            <w:tcW w:type="dxa" w:w="520"/>
+            <w:tcBorders>
+              <w:top w:val="single" w:color="000000" w:sz="4"/>
+              <w:left w:val="none" w:color="FFFFFF" w:sz="0"/>
+              <w:bottom w:val="single" w:color="000000" w:sz="4"/>
+              <w:right w:val="none" w:color="FFFFFF" w:sz="0"/>
+            </w:tcBorders>
+            <w:tcMar>
+              <w:top w:type="dxa" w:w="30"/>
+              <w:left w:type="dxa" w:w="50"/>
+              <w:bottom w:type="dxa" w:w="30"/>
+              <w:right w:type="dxa" w:w="50"/>
+            </w:tcMar>
+          </w:tcPr>
+          <w:p>
+            <w:pPr>
+              <w:jc w:val="center"/>
+            </w:pPr>
+            <w:r>
+              <w:rPr>
+                <w:rFonts w:ascii="Times New Roman" w:cs="Times New Roman" w:eastAsia="Times New Roman" w:hAnsi="Times New Roman"/>
+                <w:b/>
+                <w:bCs/>
+                <w:i w:val="false"/>
+                <w:iCs w:val="false"/>
+                <w:smallCaps w:val="false"/>
+                <w:sz w:val="16"/>
+                <w:szCs w:val="16"/>
+              </w:rPr>
+              <w:t xml:space="preserve">Treat.</w:t>
+            </w:r>
+          </w:p>
+        </w:tc>
+        <w:tc>
+          <w:tcPr>
+            <w:tcW w:type="dxa" w:w="520"/>
+            <w:tcBorders>
+              <w:top w:val="single" w:color="000000" w:sz="4"/>
+              <w:left w:val="none" w:color="FFFFFF" w:sz="0"/>
+              <w:bottom w:val="single" w:color="000000" w:sz="4"/>
+              <w:right w:val="none" w:color="FFFFFF" w:sz="0"/>
+            </w:tcBorders>
+            <w:tcMar>
+              <w:top w:type="dxa" w:w="30"/>
+              <w:left w:type="dxa" w:w="50"/>
+              <w:bottom w:type="dxa" w:w="30"/>
+              <w:right w:type="dxa" w:w="50"/>
+            </w:tcMar>
+          </w:tcPr>
+          <w:p>
+            <w:pPr>
+              <w:jc w:val="center"/>
+            </w:pPr>
+            <w:r>
+              <w:rPr>
+                <w:rFonts w:ascii="Times New Roman" w:cs="Times New Roman" w:eastAsia="Times New Roman" w:hAnsi="Times New Roman"/>
+                <w:b/>
+                <w:bCs/>
+                <w:i w:val="false"/>
+                <w:iCs w:val="false"/>
+                <w:smallCaps w:val="false"/>
+                <w:sz w:val="16"/>
+                <w:szCs w:val="16"/>
+              </w:rPr>
+              <w:t xml:space="preserve">Ceil.</w:t>
+            </w:r>
+          </w:p>
+        </w:tc>
+        <w:tc>
+          <w:tcPr>
+            <w:tcW w:type="dxa" w:w="560"/>
+            <w:tcBorders>
+              <w:top w:val="single" w:color="000000" w:sz="4"/>
+              <w:left w:val="none" w:color="FFFFFF" w:sz="0"/>
+              <w:bottom w:val="single" w:color="000000" w:sz="4"/>
+              <w:right w:val="none" w:color="FFFFFF" w:sz="0"/>
+            </w:tcBorders>
+            <w:tcMar>
+              <w:top w:type="dxa" w:w="30"/>
+              <w:left w:type="dxa" w:w="50"/>
+              <w:bottom w:type="dxa" w:w="30"/>
+              <w:right w:type="dxa" w:w="50"/>
+            </w:tcMar>
+          </w:tcPr>
+          <w:p>
+            <w:pPr>
+              <w:jc w:val="center"/>
+            </w:pPr>
+            <w:r>
+              <w:rPr>
+                <w:rFonts w:ascii="Times New Roman" w:cs="Times New Roman" w:eastAsia="Times New Roman" w:hAnsi="Times New Roman"/>
+                <w:b/>
+                <w:bCs/>
+                <w:i w:val="false"/>
+                <w:iCs w:val="false"/>
+                <w:smallCaps w:val="false"/>
+                <w:sz w:val="16"/>
+                <w:szCs w:val="16"/>
+              </w:rPr>
+              <w:t xml:space="preserve">Gap rec.</w:t>
+            </w:r>
+          </w:p>
+        </w:tc>
+        <w:tc>
+          <w:tcPr>
+            <w:tcW w:type="dxa" w:w="520"/>
+            <w:tcBorders>
+              <w:top w:val="single" w:color="000000" w:sz="4"/>
+              <w:left w:val="none" w:color="FFFFFF" w:sz="0"/>
+              <w:bottom w:val="single" w:color="000000" w:sz="4"/>
+              <w:right w:val="none" w:color="FFFFFF" w:sz="0"/>
+            </w:tcBorders>
+            <w:tcMar>
+              <w:top w:type="dxa" w:w="30"/>
+              <w:left w:type="dxa" w:w="50"/>
+              <w:bottom w:type="dxa" w:w="30"/>
+              <w:right w:type="dxa" w:w="50"/>
+            </w:tcMar>
+          </w:tcPr>
+          <w:p>
+            <w:pPr>
+              <w:jc w:val="center"/>
+            </w:pPr>
+            <w:r>
+              <w:rPr>
+                <w:rFonts w:ascii="Times New Roman" w:cs="Times New Roman" w:eastAsia="Times New Roman" w:hAnsi="Times New Roman"/>
+                <w:b/>
+                <w:bCs/>
+                <w:i w:val="false"/>
+                <w:iCs w:val="false"/>
+                <w:smallCaps w:val="false"/>
+                <w:sz w:val="16"/>
+                <w:szCs w:val="16"/>
+              </w:rPr>
+              <w:t xml:space="preserve">p</w:t>
+            </w:r>
+          </w:p>
+        </w:tc>
+      </w:tr>
+      <w:tr>
+        <w:tc>
+          <w:tcPr>
+            <w:tcW w:type="dxa" w:w="1500"/>
+            <w:tcBorders>
+              <w:top w:val="none" w:color="FFFFFF" w:sz="0"/>
+              <w:left w:val="none" w:color="FFFFFF" w:sz="0"/>
+              <w:bottom w:val="single" w:color="000000" w:sz="4"/>
+              <w:right w:val="none" w:color="FFFFFF" w:sz="0"/>
+            </w:tcBorders>
+            <w:tcMar>
+              <w:top w:type="dxa" w:w="30"/>
+              <w:left w:type="dxa" w:w="50"/>
+              <w:bottom w:type="dxa" w:w="30"/>
+              <w:right w:type="dxa" w:w="50"/>
+            </w:tcMar>
+          </w:tcPr>
+          <w:p>
+            <w:pPr>
+              <w:jc w:val="left"/>
+            </w:pPr>
+            <w:r>
+              <w:rPr>
+                <w:rFonts w:ascii="Times New Roman" w:cs="Times New Roman" w:eastAsia="Times New Roman" w:hAnsi="Times New Roman"/>
+                <w:b w:val="false"/>
+                <w:bCs w:val="false"/>
+                <w:i w:val="false"/>
+                <w:iCs w:val="false"/>
+                <w:smallCaps w:val="false"/>
+                <w:sz w:val="16"/>
+                <w:szCs w:val="16"/>
+              </w:rPr>
+              <w:t xml:space="preserve">Intent recovered (all)</w:t>
+            </w:r>
+          </w:p>
+        </w:tc>
+        <w:tc>
+          <w:tcPr>
+            <w:tcW w:type="dxa" w:w="330"/>
+            <w:tcBorders>
+              <w:top w:val="none" w:color="FFFFFF" w:sz="0"/>
+              <w:left w:val="none" w:color="FFFFFF" w:sz="0"/>
+              <w:bottom w:val="single" w:color="000000" w:sz="4"/>
+              <w:right w:val="none" w:color="FFFFFF" w:sz="0"/>
+            </w:tcBorders>
+            <w:tcMar>
+              <w:top w:type="dxa" w:w="30"/>
+              <w:left w:type="dxa" w:w="50"/>
+              <w:bottom w:type="dxa" w:w="30"/>
+              <w:right w:type="dxa" w:w="50"/>
+            </w:tcMar>
+          </w:tcPr>
+          <w:p>
+            <w:pPr>
+              <w:jc w:val="center"/>
+            </w:pPr>
+            <w:r>
+              <w:rPr>
+                <w:rFonts w:ascii="Times New Roman" w:cs="Times New Roman" w:eastAsia="Times New Roman" w:hAnsi="Times New Roman"/>
+                <w:b w:val="false"/>
+                <w:bCs w:val="false"/>
+                <w:i w:val="false"/>
+                <w:iCs w:val="false"/>
+                <w:smallCaps w:val="false"/>
+                <w:sz w:val="16"/>
+                <w:szCs w:val="16"/>
+              </w:rPr>
+              <w:t xml:space="preserve">36</w:t>
+            </w:r>
+          </w:p>
+        </w:tc>
+        <w:tc>
+          <w:tcPr>
+            <w:tcW w:type="dxa" w:w="520"/>
+            <w:tcBorders>
+              <w:top w:val="none" w:color="FFFFFF" w:sz="0"/>
+              <w:left w:val="none" w:color="FFFFFF" w:sz="0"/>
+              <w:bottom w:val="single" w:color="000000" w:sz="4"/>
+              <w:right w:val="none" w:color="FFFFFF" w:sz="0"/>
+            </w:tcBorders>
+            <w:tcMar>
+              <w:top w:type="dxa" w:w="30"/>
+              <w:left w:type="dxa" w:w="50"/>
+              <w:bottom w:type="dxa" w:w="30"/>
+              <w:right w:type="dxa" w:w="50"/>
+            </w:tcMar>
+          </w:tcPr>
+          <w:p>
+            <w:pPr>
+              <w:jc w:val="center"/>
+            </w:pPr>
+            <w:r>
+              <w:rPr>
+                <w:rFonts w:ascii="Times New Roman" w:cs="Times New Roman" w:eastAsia="Times New Roman" w:hAnsi="Times New Roman"/>
+                <w:b w:val="false"/>
+                <w:bCs w:val="false"/>
+                <w:i w:val="false"/>
+                <w:iCs w:val="false"/>
+                <w:smallCaps w:val="false"/>
+                <w:sz w:val="16"/>
+                <w:szCs w:val="16"/>
+              </w:rPr>
+              <w:t xml:space="preserve">81%</w:t>
+            </w:r>
+          </w:p>
+        </w:tc>
+        <w:tc>
+          <w:tcPr>
+            <w:tcW w:type="dxa" w:w="520"/>
+            <w:tcBorders>
+              <w:top w:val="none" w:color="FFFFFF" w:sz="0"/>
+              <w:left w:val="none" w:color="FFFFFF" w:sz="0"/>
+              <w:bottom w:val="single" w:color="000000" w:sz="4"/>
+              <w:right w:val="none" w:color="FFFFFF" w:sz="0"/>
+            </w:tcBorders>
+            <w:tcMar>
+              <w:top w:type="dxa" w:w="30"/>
+              <w:left w:type="dxa" w:w="50"/>
+              <w:bottom w:type="dxa" w:w="30"/>
+              <w:right w:type="dxa" w:w="50"/>
+            </w:tcMar>
+          </w:tcPr>
+          <w:p>
+            <w:pPr>
+              <w:jc w:val="center"/>
+            </w:pPr>
+            <w:r>
+              <w:rPr>
+                <w:rFonts w:ascii="Times New Roman" w:cs="Times New Roman" w:eastAsia="Times New Roman" w:hAnsi="Times New Roman"/>
+                <w:b w:val="false"/>
+                <w:bCs w:val="false"/>
+                <w:i w:val="false"/>
+                <w:iCs w:val="false"/>
+                <w:smallCaps w:val="false"/>
+                <w:sz w:val="16"/>
+                <w:szCs w:val="16"/>
+              </w:rPr>
+              <w:t xml:space="preserve">83%</w:t>
+            </w:r>
+          </w:p>
+        </w:tc>
+        <w:tc>
+          <w:tcPr>
+            <w:tcW w:type="dxa" w:w="520"/>
+            <w:tcBorders>
+              <w:top w:val="none" w:color="FFFFFF" w:sz="0"/>
+              <w:left w:val="none" w:color="FFFFFF" w:sz="0"/>
+              <w:bottom w:val="single" w:color="000000" w:sz="4"/>
+              <w:right w:val="none" w:color="FFFFFF" w:sz="0"/>
+            </w:tcBorders>
+            <w:tcMar>
+              <w:top w:type="dxa" w:w="30"/>
+              <w:left w:type="dxa" w:w="50"/>
+              <w:bottom w:type="dxa" w:w="30"/>
+              <w:right w:type="dxa" w:w="50"/>
+            </w:tcMar>
+          </w:tcPr>
+          <w:p>
+            <w:pPr>
+              <w:jc w:val="center"/>
+            </w:pPr>
+            <w:r>
+              <w:rPr>
+                <w:rFonts w:ascii="Times New Roman" w:cs="Times New Roman" w:eastAsia="Times New Roman" w:hAnsi="Times New Roman"/>
+                <w:b w:val="false"/>
+                <w:bCs w:val="false"/>
+                <w:i w:val="false"/>
+                <w:iCs w:val="false"/>
+                <w:smallCaps w:val="false"/>
+                <w:sz w:val="16"/>
+                <w:szCs w:val="16"/>
+              </w:rPr>
+              <w:t xml:space="preserve">97%</w:t>
+            </w:r>
+          </w:p>
+        </w:tc>
+        <w:tc>
+          <w:tcPr>
+            <w:tcW w:type="dxa" w:w="560"/>
+            <w:tcBorders>
+              <w:top w:val="none" w:color="FFFFFF" w:sz="0"/>
+              <w:left w:val="none" w:color="FFFFFF" w:sz="0"/>
+              <w:bottom w:val="single" w:color="000000" w:sz="4"/>
+              <w:right w:val="none" w:color="FFFFFF" w:sz="0"/>
+            </w:tcBorders>
+            <w:tcMar>
+              <w:top w:type="dxa" w:w="30"/>
+              <w:left w:type="dxa" w:w="50"/>
+              <w:bottom w:type="dxa" w:w="30"/>
+              <w:right w:type="dxa" w:w="50"/>
+            </w:tcMar>
+          </w:tcPr>
+          <w:p>
+            <w:pPr>
+              <w:jc w:val="center"/>
+            </w:pPr>
+            <w:r>
+              <w:rPr>
+                <w:rFonts w:ascii="Times New Roman" w:cs="Times New Roman" w:eastAsia="Times New Roman" w:hAnsi="Times New Roman"/>
+                <w:b w:val="false"/>
+                <w:bCs w:val="false"/>
+                <w:i w:val="false"/>
+                <w:iCs w:val="false"/>
+                <w:smallCaps w:val="false"/>
+                <w:sz w:val="16"/>
+                <w:szCs w:val="16"/>
+              </w:rPr>
+              <w:t xml:space="preserve">0.17</w:t>
+            </w:r>
+          </w:p>
+        </w:tc>
+        <w:tc>
+          <w:tcPr>
+            <w:tcW w:type="dxa" w:w="520"/>
+            <w:tcBorders>
+              <w:top w:val="none" w:color="FFFFFF" w:sz="0"/>
+              <w:left w:val="none" w:color="FFFFFF" w:sz="0"/>
+              <w:bottom w:val="single" w:color="000000" w:sz="4"/>
+              <w:right w:val="none" w:color="FFFFFF" w:sz="0"/>
+            </w:tcBorders>
+            <w:tcMar>
+              <w:top w:type="dxa" w:w="30"/>
+              <w:left w:type="dxa" w:w="50"/>
+              <w:bottom w:type="dxa" w:w="30"/>
+              <w:right w:type="dxa" w:w="50"/>
+            </w:tcMar>
+          </w:tcPr>
+          <w:p>
+            <w:pPr>
+              <w:jc w:val="center"/>
+            </w:pPr>
+            <w:r>
+              <w:rPr>
+                <w:rFonts w:ascii="Times New Roman" w:cs="Times New Roman" w:eastAsia="Times New Roman" w:hAnsi="Times New Roman"/>
+                <w:b w:val="false"/>
+                <w:bCs w:val="false"/>
+                <w:i w:val="false"/>
+                <w:iCs w:val="false"/>
+                <w:smallCaps w:val="false"/>
+                <w:sz w:val="16"/>
+                <w:szCs w:val="16"/>
+              </w:rPr>
+              <w:t xml:space="preserve">1.000</w:t>
+            </w:r>
+          </w:p>
+        </w:tc>
+      </w:tr>
+      <w:tr>
+        <w:tc>
+          <w:tcPr>
+            <w:tcW w:type="dxa" w:w="1500"/>
+            <w:tcBorders>
+              <w:top w:val="none" w:color="FFFFFF" w:sz="0"/>
+              <w:left w:val="none" w:color="FFFFFF" w:sz="0"/>
+              <w:bottom w:val="single" w:color="000000" w:sz="4"/>
+              <w:right w:val="none" w:color="FFFFFF" w:sz="0"/>
+            </w:tcBorders>
+            <w:tcMar>
+              <w:top w:type="dxa" w:w="30"/>
+              <w:left w:type="dxa" w:w="50"/>
+              <w:bottom w:type="dxa" w:w="30"/>
+              <w:right w:type="dxa" w:w="50"/>
+            </w:tcMar>
+          </w:tcPr>
+          <w:p>
+            <w:pPr>
+              <w:jc w:val="left"/>
+            </w:pPr>
+            <w:r>
+              <w:rPr>
+                <w:rFonts w:ascii="Times New Roman" w:cs="Times New Roman" w:eastAsia="Times New Roman" w:hAnsi="Times New Roman"/>
+                <w:b w:val="false"/>
+                <w:bCs w:val="false"/>
+                <w:i w:val="false"/>
+                <w:iCs w:val="false"/>
+                <w:smallCaps w:val="false"/>
+                <w:sz w:val="16"/>
+                <w:szCs w:val="16"/>
+              </w:rPr>
+              <w:t xml:space="preserve">Intent recovered (golden)</w:t>
+            </w:r>
+          </w:p>
+        </w:tc>
+        <w:tc>
+          <w:tcPr>
+            <w:tcW w:type="dxa" w:w="330"/>
+            <w:tcBorders>
+              <w:top w:val="none" w:color="FFFFFF" w:sz="0"/>
+              <w:left w:val="none" w:color="FFFFFF" w:sz="0"/>
+              <w:bottom w:val="single" w:color="000000" w:sz="4"/>
+              <w:right w:val="none" w:color="FFFFFF" w:sz="0"/>
+            </w:tcBorders>
+            <w:tcMar>
+              <w:top w:type="dxa" w:w="30"/>
+              <w:left w:type="dxa" w:w="50"/>
+              <w:bottom w:type="dxa" w:w="30"/>
+              <w:right w:type="dxa" w:w="50"/>
+            </w:tcMar>
+          </w:tcPr>
+          <w:p>
+            <w:pPr>
+              <w:jc w:val="center"/>
+            </w:pPr>
+            <w:r>
+              <w:rPr>
+                <w:rFonts w:ascii="Times New Roman" w:cs="Times New Roman" w:eastAsia="Times New Roman" w:hAnsi="Times New Roman"/>
+                <w:b w:val="false"/>
+                <w:bCs w:val="false"/>
+                <w:i w:val="false"/>
+                <w:iCs w:val="false"/>
+                <w:smallCaps w:val="false"/>
+                <w:sz w:val="16"/>
+                <w:szCs w:val="16"/>
+              </w:rPr>
+              <w:t xml:space="preserve">24</w:t>
+            </w:r>
+          </w:p>
+        </w:tc>
+        <w:tc>
+          <w:tcPr>
+            <w:tcW w:type="dxa" w:w="520"/>
+            <w:tcBorders>
+              <w:top w:val="none" w:color="FFFFFF" w:sz="0"/>
+              <w:left w:val="none" w:color="FFFFFF" w:sz="0"/>
+              <w:bottom w:val="single" w:color="000000" w:sz="4"/>
+              <w:right w:val="none" w:color="FFFFFF" w:sz="0"/>
+            </w:tcBorders>
+            <w:tcMar>
+              <w:top w:type="dxa" w:w="30"/>
+              <w:left w:type="dxa" w:w="50"/>
+              <w:bottom w:type="dxa" w:w="30"/>
+              <w:right w:type="dxa" w:w="50"/>
+            </w:tcMar>
+          </w:tcPr>
+          <w:p>
+            <w:pPr>
+              <w:jc w:val="center"/>
+            </w:pPr>
+            <w:r>
+              <w:rPr>
+                <w:rFonts w:ascii="Times New Roman" w:cs="Times New Roman" w:eastAsia="Times New Roman" w:hAnsi="Times New Roman"/>
+                <w:b w:val="false"/>
+                <w:bCs w:val="false"/>
+                <w:i w:val="false"/>
+                <w:iCs w:val="false"/>
+                <w:smallCaps w:val="false"/>
+                <w:sz w:val="16"/>
+                <w:szCs w:val="16"/>
+              </w:rPr>
+              <w:t xml:space="preserve">79%</w:t>
+            </w:r>
+          </w:p>
+        </w:tc>
+        <w:tc>
+          <w:tcPr>
+            <w:tcW w:type="dxa" w:w="520"/>
+            <w:tcBorders>
+              <w:top w:val="none" w:color="FFFFFF" w:sz="0"/>
+              <w:left w:val="none" w:color="FFFFFF" w:sz="0"/>
+              <w:bottom w:val="single" w:color="000000" w:sz="4"/>
+              <w:right w:val="none" w:color="FFFFFF" w:sz="0"/>
+            </w:tcBorders>
+            <w:tcMar>
+              <w:top w:type="dxa" w:w="30"/>
+              <w:left w:type="dxa" w:w="50"/>
+              <w:bottom w:type="dxa" w:w="30"/>
+              <w:right w:type="dxa" w:w="50"/>
+            </w:tcMar>
+          </w:tcPr>
+          <w:p>
+            <w:pPr>
+              <w:jc w:val="center"/>
+            </w:pPr>
+            <w:r>
+              <w:rPr>
+                <w:rFonts w:ascii="Times New Roman" w:cs="Times New Roman" w:eastAsia="Times New Roman" w:hAnsi="Times New Roman"/>
+                <w:b w:val="false"/>
+                <w:bCs w:val="false"/>
+                <w:i w:val="false"/>
+                <w:iCs w:val="false"/>
+                <w:smallCaps w:val="false"/>
+                <w:sz w:val="16"/>
+                <w:szCs w:val="16"/>
+              </w:rPr>
+              <w:t xml:space="preserve">83%</w:t>
+            </w:r>
+          </w:p>
+        </w:tc>
+        <w:tc>
+          <w:tcPr>
+            <w:tcW w:type="dxa" w:w="520"/>
+            <w:tcBorders>
+              <w:top w:val="none" w:color="FFFFFF" w:sz="0"/>
+              <w:left w:val="none" w:color="FFFFFF" w:sz="0"/>
+              <w:bottom w:val="single" w:color="000000" w:sz="4"/>
+              <w:right w:val="none" w:color="FFFFFF" w:sz="0"/>
+            </w:tcBorders>
+            <w:tcMar>
+              <w:top w:type="dxa" w:w="30"/>
+              <w:left w:type="dxa" w:w="50"/>
+              <w:bottom w:type="dxa" w:w="30"/>
+              <w:right w:type="dxa" w:w="50"/>
+            </w:tcMar>
+          </w:tcPr>
+          <w:p>
+            <w:pPr>
+              <w:jc w:val="center"/>
+            </w:pPr>
+            <w:r>
+              <w:rPr>
+                <w:rFonts w:ascii="Times New Roman" w:cs="Times New Roman" w:eastAsia="Times New Roman" w:hAnsi="Times New Roman"/>
+                <w:b w:val="false"/>
+                <w:bCs w:val="false"/>
+                <w:i w:val="false"/>
+                <w:iCs w:val="false"/>
+                <w:smallCaps w:val="false"/>
+                <w:sz w:val="16"/>
+                <w:szCs w:val="16"/>
+              </w:rPr>
+              <w:t xml:space="preserve">100%</w:t>
+            </w:r>
+          </w:p>
+        </w:tc>
+        <w:tc>
+          <w:tcPr>
+            <w:tcW w:type="dxa" w:w="560"/>
+            <w:tcBorders>
+              <w:top w:val="none" w:color="FFFFFF" w:sz="0"/>
+              <w:left w:val="none" w:color="FFFFFF" w:sz="0"/>
+              <w:bottom w:val="single" w:color="000000" w:sz="4"/>
+              <w:right w:val="none" w:color="FFFFFF" w:sz="0"/>
+            </w:tcBorders>
+            <w:tcMar>
+              <w:top w:type="dxa" w:w="30"/>
+              <w:left w:type="dxa" w:w="50"/>
+              <w:bottom w:type="dxa" w:w="30"/>
+              <w:right w:type="dxa" w:w="50"/>
+            </w:tcMar>
+          </w:tcPr>
+          <w:p>
+            <w:pPr>
+              <w:jc w:val="center"/>
+            </w:pPr>
+            <w:r>
+              <w:rPr>
+                <w:rFonts w:ascii="Times New Roman" w:cs="Times New Roman" w:eastAsia="Times New Roman" w:hAnsi="Times New Roman"/>
+                <w:b w:val="false"/>
+                <w:bCs w:val="false"/>
+                <w:i w:val="false"/>
+                <w:iCs w:val="false"/>
+                <w:smallCaps w:val="false"/>
+                <w:sz w:val="16"/>
+                <w:szCs w:val="16"/>
+              </w:rPr>
+              <w:t xml:space="preserve">0.20</w:t>
+            </w:r>
+          </w:p>
+        </w:tc>
+        <w:tc>
+          <w:tcPr>
+            <w:tcW w:type="dxa" w:w="520"/>
+            <w:tcBorders>
+              <w:top w:val="none" w:color="FFFFFF" w:sz="0"/>
+              <w:left w:val="none" w:color="FFFFFF" w:sz="0"/>
+              <w:bottom w:val="single" w:color="000000" w:sz="4"/>
+              <w:right w:val="none" w:color="FFFFFF" w:sz="0"/>
+            </w:tcBorders>
+            <w:tcMar>
+              <w:top w:type="dxa" w:w="30"/>
+              <w:left w:type="dxa" w:w="50"/>
+              <w:bottom w:type="dxa" w:w="30"/>
+              <w:right w:type="dxa" w:w="50"/>
+            </w:tcMar>
+          </w:tcPr>
+          <w:p>
+            <w:pPr>
+              <w:jc w:val="center"/>
+            </w:pPr>
+            <w:r>
+              <w:rPr>
+                <w:rFonts w:ascii="Times New Roman" w:cs="Times New Roman" w:eastAsia="Times New Roman" w:hAnsi="Times New Roman"/>
+                <w:b w:val="false"/>
+                <w:bCs w:val="false"/>
+                <w:i w:val="false"/>
+                <w:iCs w:val="false"/>
+                <w:smallCaps w:val="false"/>
+                <w:sz w:val="16"/>
+                <w:szCs w:val="16"/>
+              </w:rPr>
+              <w:t xml:space="preserve">1.000</w:t>
+            </w:r>
+          </w:p>
+        </w:tc>
+      </w:tr>
+      <w:tr>
+        <w:tc>
+          <w:tcPr>
+            <w:tcW w:type="dxa" w:w="1500"/>
+            <w:tcBorders>
+              <w:top w:val="none" w:color="FFFFFF" w:sz="0"/>
+              <w:left w:val="none" w:color="FFFFFF" w:sz="0"/>
+              <w:bottom w:val="single" w:color="000000" w:sz="4"/>
+              <w:right w:val="none" w:color="FFFFFF" w:sz="0"/>
+            </w:tcBorders>
+            <w:tcMar>
+              <w:top w:type="dxa" w:w="30"/>
+              <w:left w:type="dxa" w:w="50"/>
+              <w:bottom w:type="dxa" w:w="30"/>
+              <w:right w:type="dxa" w:w="50"/>
+            </w:tcMar>
+          </w:tcPr>
+          <w:p>
+            <w:pPr>
+              <w:jc w:val="left"/>
+            </w:pPr>
+            <w:r>
+              <w:rPr>
+                <w:rFonts w:ascii="Times New Roman" w:cs="Times New Roman" w:eastAsia="Times New Roman" w:hAnsi="Times New Roman"/>
+                <w:b w:val="false"/>
+                <w:bCs w:val="false"/>
+                <w:i w:val="false"/>
+                <w:iCs w:val="false"/>
+                <w:smallCaps w:val="false"/>
+                <w:sz w:val="16"/>
+                <w:szCs w:val="16"/>
+              </w:rPr>
+              <w:t xml:space="preserve">Intent recovered (mutant)</w:t>
+            </w:r>
+          </w:p>
+        </w:tc>
+        <w:tc>
+          <w:tcPr>
+            <w:tcW w:type="dxa" w:w="330"/>
+            <w:tcBorders>
+              <w:top w:val="none" w:color="FFFFFF" w:sz="0"/>
+              <w:left w:val="none" w:color="FFFFFF" w:sz="0"/>
+              <w:bottom w:val="single" w:color="000000" w:sz="4"/>
+              <w:right w:val="none" w:color="FFFFFF" w:sz="0"/>
+            </w:tcBorders>
+            <w:tcMar>
+              <w:top w:type="dxa" w:w="30"/>
+              <w:left w:type="dxa" w:w="50"/>
+              <w:bottom w:type="dxa" w:w="30"/>
+              <w:right w:type="dxa" w:w="50"/>
+            </w:tcMar>
+          </w:tcPr>
+          <w:p>
+            <w:pPr>
+              <w:jc w:val="center"/>
+            </w:pPr>
+            <w:r>
+              <w:rPr>
+                <w:rFonts w:ascii="Times New Roman" w:cs="Times New Roman" w:eastAsia="Times New Roman" w:hAnsi="Times New Roman"/>
+                <w:b w:val="false"/>
+                <w:bCs w:val="false"/>
+                <w:i w:val="false"/>
+                <w:iCs w:val="false"/>
+                <w:smallCaps w:val="false"/>
+                <w:sz w:val="16"/>
+                <w:szCs w:val="16"/>
+              </w:rPr>
+              <w:t xml:space="preserve">12</w:t>
+            </w:r>
+          </w:p>
+        </w:tc>
+        <w:tc>
+          <w:tcPr>
+            <w:tcW w:type="dxa" w:w="520"/>
+            <w:tcBorders>
+              <w:top w:val="none" w:color="FFFFFF" w:sz="0"/>
+              <w:left w:val="none" w:color="FFFFFF" w:sz="0"/>
+              <w:bottom w:val="single" w:color="000000" w:sz="4"/>
+              <w:right w:val="none" w:color="FFFFFF" w:sz="0"/>
+            </w:tcBorders>
+            <w:tcMar>
+              <w:top w:type="dxa" w:w="30"/>
+              <w:left w:type="dxa" w:w="50"/>
+              <w:bottom w:type="dxa" w:w="30"/>
+              <w:right w:type="dxa" w:w="50"/>
+            </w:tcMar>
+          </w:tcPr>
+          <w:p>
+            <w:pPr>
+              <w:jc w:val="center"/>
+            </w:pPr>
+            <w:r>
+              <w:rPr>
+                <w:rFonts w:ascii="Times New Roman" w:cs="Times New Roman" w:eastAsia="Times New Roman" w:hAnsi="Times New Roman"/>
+                <w:b w:val="false"/>
+                <w:bCs w:val="false"/>
+                <w:i w:val="false"/>
+                <w:iCs w:val="false"/>
+                <w:smallCaps w:val="false"/>
+                <w:sz w:val="16"/>
+                <w:szCs w:val="16"/>
+              </w:rPr>
+              <w:t xml:space="preserve">83%</w:t>
+            </w:r>
+          </w:p>
+        </w:tc>
+        <w:tc>
+          <w:tcPr>
+            <w:tcW w:type="dxa" w:w="520"/>
+            <w:tcBorders>
+              <w:top w:val="none" w:color="FFFFFF" w:sz="0"/>
+              <w:left w:val="none" w:color="FFFFFF" w:sz="0"/>
+              <w:bottom w:val="single" w:color="000000" w:sz="4"/>
+              <w:right w:val="none" w:color="FFFFFF" w:sz="0"/>
+            </w:tcBorders>
+            <w:tcMar>
+              <w:top w:type="dxa" w:w="30"/>
+              <w:left w:type="dxa" w:w="50"/>
+              <w:bottom w:type="dxa" w:w="30"/>
+              <w:right w:type="dxa" w:w="50"/>
+            </w:tcMar>
+          </w:tcPr>
+          <w:p>
+            <w:pPr>
+              <w:jc w:val="center"/>
+            </w:pPr>
+            <w:r>
+              <w:rPr>
+                <w:rFonts w:ascii="Times New Roman" w:cs="Times New Roman" w:eastAsia="Times New Roman" w:hAnsi="Times New Roman"/>
+                <w:b w:val="false"/>
+                <w:bCs w:val="false"/>
+                <w:i w:val="false"/>
+                <w:iCs w:val="false"/>
+                <w:smallCaps w:val="false"/>
+                <w:sz w:val="16"/>
+                <w:szCs w:val="16"/>
+              </w:rPr>
+              <w:t xml:space="preserve">83%</w:t>
+            </w:r>
+          </w:p>
+        </w:tc>
+        <w:tc>
+          <w:tcPr>
+            <w:tcW w:type="dxa" w:w="520"/>
+            <w:tcBorders>
+              <w:top w:val="none" w:color="FFFFFF" w:sz="0"/>
+              <w:left w:val="none" w:color="FFFFFF" w:sz="0"/>
+              <w:bottom w:val="single" w:color="000000" w:sz="4"/>
+              <w:right w:val="none" w:color="FFFFFF" w:sz="0"/>
+            </w:tcBorders>
+            <w:tcMar>
+              <w:top w:type="dxa" w:w="30"/>
+              <w:left w:type="dxa" w:w="50"/>
+              <w:bottom w:type="dxa" w:w="30"/>
+              <w:right w:type="dxa" w:w="50"/>
+            </w:tcMar>
+          </w:tcPr>
+          <w:p>
+            <w:pPr>
+              <w:jc w:val="center"/>
+            </w:pPr>
+            <w:r>
+              <w:rPr>
+                <w:rFonts w:ascii="Times New Roman" w:cs="Times New Roman" w:eastAsia="Times New Roman" w:hAnsi="Times New Roman"/>
+                <w:b w:val="false"/>
+                <w:bCs w:val="false"/>
+                <w:i w:val="false"/>
+                <w:iCs w:val="false"/>
+                <w:smallCaps w:val="false"/>
+                <w:sz w:val="16"/>
+                <w:szCs w:val="16"/>
+              </w:rPr>
+              <w:t xml:space="preserve">92%</w:t>
+            </w:r>
+          </w:p>
+        </w:tc>
+        <w:tc>
+          <w:tcPr>
+            <w:tcW w:type="dxa" w:w="560"/>
+            <w:tcBorders>
+              <w:top w:val="none" w:color="FFFFFF" w:sz="0"/>
+              <w:left w:val="none" w:color="FFFFFF" w:sz="0"/>
+              <w:bottom w:val="single" w:color="000000" w:sz="4"/>
+              <w:right w:val="none" w:color="FFFFFF" w:sz="0"/>
+            </w:tcBorders>
+            <w:tcMar>
+              <w:top w:type="dxa" w:w="30"/>
+              <w:left w:type="dxa" w:w="50"/>
+              <w:bottom w:type="dxa" w:w="30"/>
+              <w:right w:type="dxa" w:w="50"/>
+            </w:tcMar>
+          </w:tcPr>
+          <w:p>
+            <w:pPr>
+              <w:jc w:val="center"/>
+            </w:pPr>
+            <w:r>
+              <w:rPr>
+                <w:rFonts w:ascii="Times New Roman" w:cs="Times New Roman" w:eastAsia="Times New Roman" w:hAnsi="Times New Roman"/>
+                <w:b w:val="false"/>
+                <w:bCs w:val="false"/>
+                <w:i w:val="false"/>
+                <w:iCs w:val="false"/>
+                <w:smallCaps w:val="false"/>
+                <w:sz w:val="16"/>
+                <w:szCs w:val="16"/>
+              </w:rPr>
+              <w:t xml:space="preserve">0.00</w:t>
+            </w:r>
+          </w:p>
+        </w:tc>
+        <w:tc>
+          <w:tcPr>
+            <w:tcW w:type="dxa" w:w="520"/>
+            <w:tcBorders>
+              <w:top w:val="none" w:color="FFFFFF" w:sz="0"/>
+              <w:left w:val="none" w:color="FFFFFF" w:sz="0"/>
+              <w:bottom w:val="single" w:color="000000" w:sz="4"/>
+              <w:right w:val="none" w:color="FFFFFF" w:sz="0"/>
+            </w:tcBorders>
+            <w:tcMar>
+              <w:top w:type="dxa" w:w="30"/>
+              <w:left w:type="dxa" w:w="50"/>
+              <w:bottom w:type="dxa" w:w="30"/>
+              <w:right w:type="dxa" w:w="50"/>
+            </w:tcMar>
+          </w:tcPr>
+          <w:p>
+            <w:pPr>
+              <w:jc w:val="center"/>
+            </w:pPr>
+            <w:r>
+              <w:rPr>
+                <w:rFonts w:ascii="Times New Roman" w:cs="Times New Roman" w:eastAsia="Times New Roman" w:hAnsi="Times New Roman"/>
+                <w:b w:val="false"/>
+                <w:bCs w:val="false"/>
+                <w:i w:val="false"/>
+                <w:iCs w:val="false"/>
+                <w:smallCaps w:val="false"/>
+                <w:sz w:val="16"/>
+                <w:szCs w:val="16"/>
+              </w:rPr>
+              <w:t xml:space="preserve">1.000</w:t>
+            </w:r>
+          </w:p>
+        </w:tc>
+      </w:tr>
+      <w:tr>
+        <w:tc>
+          <w:tcPr>
+            <w:tcW w:type="dxa" w:w="1500"/>
+            <w:tcBorders>
+              <w:top w:val="none" w:color="FFFFFF" w:sz="0"/>
+              <w:left w:val="none" w:color="FFFFFF" w:sz="0"/>
+              <w:bottom w:val="single" w:color="000000" w:sz="4"/>
+              <w:right w:val="none" w:color="FFFFFF" w:sz="0"/>
+            </w:tcBorders>
+            <w:tcMar>
+              <w:top w:type="dxa" w:w="30"/>
+              <w:left w:type="dxa" w:w="50"/>
+              <w:bottom w:type="dxa" w:w="30"/>
+              <w:right w:type="dxa" w:w="50"/>
+            </w:tcMar>
+          </w:tcPr>
+          <w:p>
+            <w:pPr>
+              <w:jc w:val="left"/>
+            </w:pPr>
+            <w:r>
+              <w:rPr>
+                <w:rFonts w:ascii="Times New Roman" w:cs="Times New Roman" w:eastAsia="Times New Roman" w:hAnsi="Times New Roman"/>
+                <w:b w:val="false"/>
+                <w:bCs w:val="false"/>
+                <w:i w:val="false"/>
+                <w:iCs w:val="false"/>
+                <w:smallCaps w:val="false"/>
+                <w:sz w:val="16"/>
+                <w:szCs w:val="16"/>
+              </w:rPr>
+              <w:t xml:space="preserve">Defect caught (mutant)</w:t>
+            </w:r>
+          </w:p>
+        </w:tc>
+        <w:tc>
+          <w:tcPr>
+            <w:tcW w:type="dxa" w:w="330"/>
+            <w:tcBorders>
+              <w:top w:val="none" w:color="FFFFFF" w:sz="0"/>
+              <w:left w:val="none" w:color="FFFFFF" w:sz="0"/>
+              <w:bottom w:val="single" w:color="000000" w:sz="4"/>
+              <w:right w:val="none" w:color="FFFFFF" w:sz="0"/>
+            </w:tcBorders>
+            <w:tcMar>
+              <w:top w:type="dxa" w:w="30"/>
+              <w:left w:type="dxa" w:w="50"/>
+              <w:bottom w:type="dxa" w:w="30"/>
+              <w:right w:type="dxa" w:w="50"/>
+            </w:tcMar>
+          </w:tcPr>
+          <w:p>
+            <w:pPr>
+              <w:jc w:val="center"/>
+            </w:pPr>
+            <w:r>
+              <w:rPr>
+                <w:rFonts w:ascii="Times New Roman" w:cs="Times New Roman" w:eastAsia="Times New Roman" w:hAnsi="Times New Roman"/>
+                <w:b w:val="false"/>
+                <w:bCs w:val="false"/>
+                <w:i w:val="false"/>
+                <w:iCs w:val="false"/>
+                <w:smallCaps w:val="false"/>
+                <w:sz w:val="16"/>
+                <w:szCs w:val="16"/>
+              </w:rPr>
+              <w:t xml:space="preserve">12</w:t>
+            </w:r>
+          </w:p>
+        </w:tc>
+        <w:tc>
+          <w:tcPr>
+            <w:tcW w:type="dxa" w:w="520"/>
+            <w:tcBorders>
+              <w:top w:val="none" w:color="FFFFFF" w:sz="0"/>
+              <w:left w:val="none" w:color="FFFFFF" w:sz="0"/>
+              <w:bottom w:val="single" w:color="000000" w:sz="4"/>
+              <w:right w:val="none" w:color="FFFFFF" w:sz="0"/>
+            </w:tcBorders>
+            <w:tcMar>
+              <w:top w:type="dxa" w:w="30"/>
+              <w:left w:type="dxa" w:w="50"/>
+              <w:bottom w:type="dxa" w:w="30"/>
+              <w:right w:type="dxa" w:w="50"/>
+            </w:tcMar>
+          </w:tcPr>
+          <w:p>
+            <w:pPr>
+              <w:jc w:val="center"/>
+            </w:pPr>
+            <w:r>
+              <w:rPr>
+                <w:rFonts w:ascii="Times New Roman" w:cs="Times New Roman" w:eastAsia="Times New Roman" w:hAnsi="Times New Roman"/>
+                <w:b w:val="false"/>
+                <w:bCs w:val="false"/>
+                <w:i w:val="false"/>
+                <w:iCs w:val="false"/>
+                <w:smallCaps w:val="false"/>
+                <w:sz w:val="16"/>
+                <w:szCs w:val="16"/>
+              </w:rPr>
+              <w:t xml:space="preserve">17%</w:t>
+            </w:r>
+          </w:p>
+        </w:tc>
+        <w:tc>
+          <w:tcPr>
+            <w:tcW w:type="dxa" w:w="520"/>
+            <w:tcBorders>
+              <w:top w:val="none" w:color="FFFFFF" w:sz="0"/>
+              <w:left w:val="none" w:color="FFFFFF" w:sz="0"/>
+              <w:bottom w:val="single" w:color="000000" w:sz="4"/>
+              <w:right w:val="none" w:color="FFFFFF" w:sz="0"/>
+            </w:tcBorders>
+            <w:tcMar>
+              <w:top w:type="dxa" w:w="30"/>
+              <w:left w:type="dxa" w:w="50"/>
+              <w:bottom w:type="dxa" w:w="30"/>
+              <w:right w:type="dxa" w:w="50"/>
+            </w:tcMar>
+          </w:tcPr>
+          <w:p>
+            <w:pPr>
+              <w:jc w:val="center"/>
+            </w:pPr>
+            <w:r>
+              <w:rPr>
+                <w:rFonts w:ascii="Times New Roman" w:cs="Times New Roman" w:eastAsia="Times New Roman" w:hAnsi="Times New Roman"/>
+                <w:b w:val="false"/>
+                <w:bCs w:val="false"/>
+                <w:i w:val="false"/>
+                <w:iCs w:val="false"/>
+                <w:smallCaps w:val="false"/>
+                <w:sz w:val="16"/>
+                <w:szCs w:val="16"/>
+              </w:rPr>
+              <w:t xml:space="preserve">17%</w:t>
+            </w:r>
+          </w:p>
+        </w:tc>
+        <w:tc>
+          <w:tcPr>
+            <w:tcW w:type="dxa" w:w="520"/>
+            <w:tcBorders>
+              <w:top w:val="none" w:color="FFFFFF" w:sz="0"/>
+              <w:left w:val="none" w:color="FFFFFF" w:sz="0"/>
+              <w:bottom w:val="single" w:color="000000" w:sz="4"/>
+              <w:right w:val="none" w:color="FFFFFF" w:sz="0"/>
+            </w:tcBorders>
+            <w:tcMar>
+              <w:top w:type="dxa" w:w="30"/>
+              <w:left w:type="dxa" w:w="50"/>
+              <w:bottom w:type="dxa" w:w="30"/>
+              <w:right w:type="dxa" w:w="50"/>
+            </w:tcMar>
+          </w:tcPr>
+          <w:p>
+            <w:pPr>
+              <w:jc w:val="center"/>
+            </w:pPr>
+            <w:r>
+              <w:rPr>
+                <w:rFonts w:ascii="Times New Roman" w:cs="Times New Roman" w:eastAsia="Times New Roman" w:hAnsi="Times New Roman"/>
+                <w:b w:val="false"/>
+                <w:bCs w:val="false"/>
+                <w:i w:val="false"/>
+                <w:iCs w:val="false"/>
+                <w:smallCaps w:val="false"/>
+                <w:sz w:val="16"/>
+                <w:szCs w:val="16"/>
+              </w:rPr>
+              <w:t xml:space="preserve">8%</w:t>
+            </w:r>
+          </w:p>
+        </w:tc>
+        <w:tc>
+          <w:tcPr>
+            <w:tcW w:type="dxa" w:w="560"/>
+            <w:tcBorders>
+              <w:top w:val="none" w:color="FFFFFF" w:sz="0"/>
+              <w:left w:val="none" w:color="FFFFFF" w:sz="0"/>
+              <w:bottom w:val="single" w:color="000000" w:sz="4"/>
+              <w:right w:val="none" w:color="FFFFFF" w:sz="0"/>
+            </w:tcBorders>
+            <w:tcMar>
+              <w:top w:type="dxa" w:w="30"/>
+              <w:left w:type="dxa" w:w="50"/>
+              <w:bottom w:type="dxa" w:w="30"/>
+              <w:right w:type="dxa" w:w="50"/>
+            </w:tcMar>
+          </w:tcPr>
+          <w:p>
+            <w:pPr>
+              <w:jc w:val="center"/>
+            </w:pPr>
+            <w:r>
+              <w:rPr>
+                <w:rFonts w:ascii="Times New Roman" w:cs="Times New Roman" w:eastAsia="Times New Roman" w:hAnsi="Times New Roman"/>
+                <w:b w:val="false"/>
+                <w:bCs w:val="false"/>
+                <w:i w:val="false"/>
+                <w:iCs w:val="false"/>
+                <w:smallCaps w:val="false"/>
+                <w:sz w:val="16"/>
+                <w:szCs w:val="16"/>
+              </w:rPr>
+              <w:t xml:space="preserve">n/a</w:t>
+            </w:r>
+          </w:p>
+        </w:tc>
+        <w:tc>
+          <w:tcPr>
+            <w:tcW w:type="dxa" w:w="520"/>
+            <w:tcBorders>
+              <w:top w:val="none" w:color="FFFFFF" w:sz="0"/>
+              <w:left w:val="none" w:color="FFFFFF" w:sz="0"/>
+              <w:bottom w:val="single" w:color="000000" w:sz="4"/>
+              <w:right w:val="none" w:color="FFFFFF" w:sz="0"/>
+            </w:tcBorders>
+            <w:tcMar>
+              <w:top w:type="dxa" w:w="30"/>
+              <w:left w:type="dxa" w:w="50"/>
+              <w:bottom w:type="dxa" w:w="30"/>
+              <w:right w:type="dxa" w:w="50"/>
+            </w:tcMar>
+          </w:tcPr>
+          <w:p>
+            <w:pPr>
+              <w:jc w:val="center"/>
+            </w:pPr>
+            <w:r>
+              <w:rPr>
+                <w:rFonts w:ascii="Times New Roman" w:cs="Times New Roman" w:eastAsia="Times New Roman" w:hAnsi="Times New Roman"/>
+                <w:b w:val="false"/>
+                <w:bCs w:val="false"/>
+                <w:i w:val="false"/>
+                <w:iCs w:val="false"/>
+                <w:smallCaps w:val="false"/>
+                <w:sz w:val="16"/>
+                <w:szCs w:val="16"/>
+              </w:rPr>
+              <w:t xml:space="preserve">1.000</w:t>
+            </w:r>
+          </w:p>
+        </w:tc>
+      </w:tr>
+      <w:tr>
+        <w:tc>
+          <w:tcPr>
+            <w:tcW w:type="dxa" w:w="1500"/>
+            <w:tcBorders>
+              <w:top w:val="none" w:color="FFFFFF" w:sz="0"/>
+              <w:left w:val="none" w:color="FFFFFF" w:sz="0"/>
+              <w:bottom w:val="single" w:color="000000" w:sz="4"/>
+              <w:right w:val="none" w:color="FFFFFF" w:sz="0"/>
+            </w:tcBorders>
+            <w:tcMar>
+              <w:top w:type="dxa" w:w="30"/>
+              <w:left w:type="dxa" w:w="50"/>
+              <w:bottom w:type="dxa" w:w="30"/>
+              <w:right w:type="dxa" w:w="50"/>
+            </w:tcMar>
+          </w:tcPr>
+          <w:p>
+            <w:pPr>
+              <w:jc w:val="left"/>
+            </w:pPr>
+            <w:r>
+              <w:rPr>
+                <w:rFonts w:ascii="Times New Roman" w:cs="Times New Roman" w:eastAsia="Times New Roman" w:hAnsi="Times New Roman"/>
+                <w:b w:val="false"/>
+                <w:bCs w:val="false"/>
+                <w:i w:val="false"/>
+                <w:iCs w:val="false"/>
+                <w:smallCaps w:val="false"/>
+                <w:sz w:val="16"/>
+                <w:szCs w:val="16"/>
+              </w:rPr>
+              <w:t xml:space="preserve">False alarm (golden)</w:t>
+            </w:r>
+          </w:p>
+        </w:tc>
+        <w:tc>
+          <w:tcPr>
+            <w:tcW w:type="dxa" w:w="330"/>
+            <w:tcBorders>
+              <w:top w:val="none" w:color="FFFFFF" w:sz="0"/>
+              <w:left w:val="none" w:color="FFFFFF" w:sz="0"/>
+              <w:bottom w:val="single" w:color="000000" w:sz="4"/>
+              <w:right w:val="none" w:color="FFFFFF" w:sz="0"/>
+            </w:tcBorders>
+            <w:tcMar>
+              <w:top w:type="dxa" w:w="30"/>
+              <w:left w:type="dxa" w:w="50"/>
+              <w:bottom w:type="dxa" w:w="30"/>
+              <w:right w:type="dxa" w:w="50"/>
+            </w:tcMar>
+          </w:tcPr>
+          <w:p>
+            <w:pPr>
+              <w:jc w:val="center"/>
+            </w:pPr>
+            <w:r>
+              <w:rPr>
+                <w:rFonts w:ascii="Times New Roman" w:cs="Times New Roman" w:eastAsia="Times New Roman" w:hAnsi="Times New Roman"/>
+                <w:b w:val="false"/>
+                <w:bCs w:val="false"/>
+                <w:i w:val="false"/>
+                <w:iCs w:val="false"/>
+                <w:smallCaps w:val="false"/>
+                <w:sz w:val="16"/>
+                <w:szCs w:val="16"/>
+              </w:rPr>
+              <w:t xml:space="preserve">24</w:t>
+            </w:r>
+          </w:p>
+        </w:tc>
+        <w:tc>
+          <w:tcPr>
+            <w:tcW w:type="dxa" w:w="520"/>
+            <w:tcBorders>
+              <w:top w:val="none" w:color="FFFFFF" w:sz="0"/>
+              <w:left w:val="none" w:color="FFFFFF" w:sz="0"/>
+              <w:bottom w:val="single" w:color="000000" w:sz="4"/>
+              <w:right w:val="none" w:color="FFFFFF" w:sz="0"/>
+            </w:tcBorders>
+            <w:tcMar>
+              <w:top w:type="dxa" w:w="30"/>
+              <w:left w:type="dxa" w:w="50"/>
+              <w:bottom w:type="dxa" w:w="30"/>
+              <w:right w:type="dxa" w:w="50"/>
+            </w:tcMar>
+          </w:tcPr>
+          <w:p>
+            <w:pPr>
+              <w:jc w:val="center"/>
+            </w:pPr>
+            <w:r>
+              <w:rPr>
+                <w:rFonts w:ascii="Times New Roman" w:cs="Times New Roman" w:eastAsia="Times New Roman" w:hAnsi="Times New Roman"/>
+                <w:b w:val="false"/>
+                <w:bCs w:val="false"/>
+                <w:i w:val="false"/>
+                <w:iCs w:val="false"/>
+                <w:smallCaps w:val="false"/>
+                <w:sz w:val="16"/>
+                <w:szCs w:val="16"/>
+              </w:rPr>
+              <w:t xml:space="preserve">8%</w:t>
+            </w:r>
+          </w:p>
+        </w:tc>
+        <w:tc>
+          <w:tcPr>
+            <w:tcW w:type="dxa" w:w="520"/>
+            <w:tcBorders>
+              <w:top w:val="none" w:color="FFFFFF" w:sz="0"/>
+              <w:left w:val="none" w:color="FFFFFF" w:sz="0"/>
+              <w:bottom w:val="single" w:color="000000" w:sz="4"/>
+              <w:right w:val="none" w:color="FFFFFF" w:sz="0"/>
+            </w:tcBorders>
+            <w:tcMar>
+              <w:top w:type="dxa" w:w="30"/>
+              <w:left w:type="dxa" w:w="50"/>
+              <w:bottom w:type="dxa" w:w="30"/>
+              <w:right w:type="dxa" w:w="50"/>
+            </w:tcMar>
+          </w:tcPr>
+          <w:p>
+            <w:pPr>
+              <w:jc w:val="center"/>
+            </w:pPr>
+            <w:r>
+              <w:rPr>
+                <w:rFonts w:ascii="Times New Roman" w:cs="Times New Roman" w:eastAsia="Times New Roman" w:hAnsi="Times New Roman"/>
+                <w:b w:val="false"/>
+                <w:bCs w:val="false"/>
+                <w:i w:val="false"/>
+                <w:iCs w:val="false"/>
+                <w:smallCaps w:val="false"/>
+                <w:sz w:val="16"/>
+                <w:szCs w:val="16"/>
+              </w:rPr>
+              <w:t xml:space="preserve">8%</w:t>
+            </w:r>
+          </w:p>
+        </w:tc>
+        <w:tc>
+          <w:tcPr>
+            <w:tcW w:type="dxa" w:w="520"/>
+            <w:tcBorders>
+              <w:top w:val="none" w:color="FFFFFF" w:sz="0"/>
+              <w:left w:val="none" w:color="FFFFFF" w:sz="0"/>
+              <w:bottom w:val="single" w:color="000000" w:sz="4"/>
+              <w:right w:val="none" w:color="FFFFFF" w:sz="0"/>
+            </w:tcBorders>
+            <w:tcMar>
+              <w:top w:type="dxa" w:w="30"/>
+              <w:left w:type="dxa" w:w="50"/>
+              <w:bottom w:type="dxa" w:w="30"/>
+              <w:right w:type="dxa" w:w="50"/>
+            </w:tcMar>
+          </w:tcPr>
+          <w:p>
+            <w:pPr>
+              <w:jc w:val="center"/>
+            </w:pPr>
+            <w:r>
+              <w:rPr>
+                <w:rFonts w:ascii="Times New Roman" w:cs="Times New Roman" w:eastAsia="Times New Roman" w:hAnsi="Times New Roman"/>
+                <w:b w:val="false"/>
+                <w:bCs w:val="false"/>
+                <w:i w:val="false"/>
+                <w:iCs w:val="false"/>
+                <w:smallCaps w:val="false"/>
+                <w:sz w:val="16"/>
+                <w:szCs w:val="16"/>
+              </w:rPr>
+              <w:t xml:space="preserve">4%</w:t>
+            </w:r>
+          </w:p>
+        </w:tc>
+        <w:tc>
+          <w:tcPr>
+            <w:tcW w:type="dxa" w:w="560"/>
+            <w:tcBorders>
+              <w:top w:val="none" w:color="FFFFFF" w:sz="0"/>
+              <w:left w:val="none" w:color="FFFFFF" w:sz="0"/>
+              <w:bottom w:val="single" w:color="000000" w:sz="4"/>
+              <w:right w:val="none" w:color="FFFFFF" w:sz="0"/>
+            </w:tcBorders>
+            <w:tcMar>
+              <w:top w:type="dxa" w:w="30"/>
+              <w:left w:type="dxa" w:w="50"/>
+              <w:bottom w:type="dxa" w:w="30"/>
+              <w:right w:type="dxa" w:w="50"/>
+            </w:tcMar>
+          </w:tcPr>
+          <w:p>
+            <w:pPr>
+              <w:jc w:val="center"/>
+            </w:pPr>
+            <w:r>
+              <w:rPr>
+                <w:rFonts w:ascii="Times New Roman" w:cs="Times New Roman" w:eastAsia="Times New Roman" w:hAnsi="Times New Roman"/>
+                <w:b w:val="false"/>
+                <w:bCs w:val="false"/>
+                <w:i w:val="false"/>
+                <w:iCs w:val="false"/>
+                <w:smallCaps w:val="false"/>
+                <w:sz w:val="16"/>
+                <w:szCs w:val="16"/>
+              </w:rPr>
+              <w:t xml:space="preserve">n/a</w:t>
+            </w:r>
+          </w:p>
+        </w:tc>
+        <w:tc>
+          <w:tcPr>
+            <w:tcW w:type="dxa" w:w="520"/>
+            <w:tcBorders>
+              <w:top w:val="none" w:color="FFFFFF" w:sz="0"/>
+              <w:left w:val="none" w:color="FFFFFF" w:sz="0"/>
+              <w:bottom w:val="single" w:color="000000" w:sz="4"/>
+              <w:right w:val="none" w:color="FFFFFF" w:sz="0"/>
+            </w:tcBorders>
+            <w:tcMar>
+              <w:top w:type="dxa" w:w="30"/>
+              <w:left w:type="dxa" w:w="50"/>
+              <w:bottom w:type="dxa" w:w="30"/>
+              <w:right w:type="dxa" w:w="50"/>
+            </w:tcMar>
+          </w:tcPr>
+          <w:p>
+            <w:pPr>
+              <w:jc w:val="center"/>
+            </w:pPr>
+            <w:r>
+              <w:rPr>
+                <w:rFonts w:ascii="Times New Roman" w:cs="Times New Roman" w:eastAsia="Times New Roman" w:hAnsi="Times New Roman"/>
+                <w:b w:val="false"/>
+                <w:bCs w:val="false"/>
+                <w:i w:val="false"/>
+                <w:iCs w:val="false"/>
+                <w:smallCaps w:val="false"/>
+                <w:sz w:val="16"/>
+                <w:szCs w:val="16"/>
+              </w:rPr>
+              <w:t xml:space="preserve">1.000</w:t>
+            </w:r>
+          </w:p>
+        </w:tc>
+      </w:tr>
+    </w:tbl>
+    <w:p>
+      <w:pPr>
+        <w:spacing w:after="80"/>
+      </w:pPr>
+      <w:r>
+        <w:rPr>
+          <w:rFonts w:ascii="Times New Roman" w:cs="Times New Roman" w:eastAsia="Times New Roman" w:hAnsi="Times New Roman"/>
+          <w:b w:val="false"/>
+          <w:bCs w:val="false"/>
+          <w:i w:val="false"/>
+          <w:iCs w:val="false"/>
+          <w:smallCaps w:val="false"/>
+          <w:sz w:val="20"/>
+          <w:szCs w:val="20"/>
+        </w:rPr>
+        <w:t xml:space="preserve"/>
       </w:r>
     </w:p>
     <w:p>
@@ -751,7 +2274,125 @@
           <w:sz w:val="20"/>
           <w:szCs w:val="20"/>
         </w:rPr>
+        <w:t xml:space="preserve">The detector asked on 6 of 36 treatment runs (17%). The simulated author gave a substantive answer to 4 of these and declined 2, saying the notes did not cover the question. Because the treatment differs from the floor only on runs where the detector asked, at most 6 pairs can differ for a reason other than sampling variation; the remaining 30 pairs are two independent samples of the same single-pass review.</w:t>
+      </w:r>
+    </w:p>
+    <w:p>
+      <w:pPr>
+        <w:spacing w:after="60" w:before="0" w:line="240"/>
+        <w:ind w:firstLine="202"/>
+        <w:jc w:val="both"/>
+      </w:pPr>
+      <w:r>
+        <w:rPr>
+          <w:rFonts w:ascii="Times New Roman" w:cs="Times New Roman" w:eastAsia="Times New Roman" w:hAnsi="Times New Roman"/>
+          <w:b w:val="false"/>
+          <w:bCs w:val="false"/>
+          <w:i w:val="false"/>
+          <w:iCs w:val="false"/>
+          <w:smallCaps w:val="false"/>
+          <w:sz w:val="20"/>
+          <w:szCs w:val="20"/>
+        </w:rPr>
+        <w:t xml:space="preserve">Withholding all natural-language intent lowered intent recovery from 97% to 81%: the v2 manipulation opens a gap where v1 opened none, but a small one, because code alone still reveals the purpose of most of these patches. The treatment recovered intent in 83% of instances (McNemar p = 1.000; discordant pairs: 1 favouring the treatment, 0 favouring the floor).</w:t>
+      </w:r>
+    </w:p>
+    <w:p>
+      <w:pPr>
+        <w:spacing w:after="60" w:before="0" w:line="240"/>
+        <w:ind w:firstLine="202"/>
+        <w:jc w:val="both"/>
+      </w:pPr>
+      <w:r>
+        <w:rPr>
+          <w:rFonts w:ascii="Times New Roman" w:cs="Times New Roman" w:eastAsia="Times New Roman" w:hAnsi="Times New Roman"/>
+          <w:b w:val="false"/>
+          <w:bCs w:val="false"/>
+          <w:i w:val="false"/>
+          <w:iCs w:val="false"/>
+          <w:smallCaps w:val="false"/>
+          <w:sz w:val="20"/>
+          <w:szCs w:val="20"/>
+        </w:rPr>
+        <w:t xml:space="preserve">Tracing each instance shows where the effect is lost. The treatment can only improve on the floor for an instance the floor got wrong, that the detector flagged, and whose author answered. The floor missed intent on 7 instances (the ceiling also missed 1 of these). The detector asked on 2 of the 7; the author answered 1 substantively; and the treatment recovered intent on 1. Where clarification was given the chance it recovered intent (1 of 1, too few to estimate a rate), but the chance arose rarely: the binding constraint is detector recall, not the value of an answer once given. Of the detector's 6 questions overall, 4 went to instances the floor already understood, where an answer cannot improve intent recovery.</w:t>
+      </w:r>
+    </w:p>
+    <w:p>
+      <w:pPr>
+        <w:spacing w:after="60" w:before="0" w:line="240"/>
+        <w:ind w:firstLine="202"/>
+        <w:jc w:val="both"/>
+      </w:pPr>
+      <w:r>
+        <w:rPr>
+          <w:rFonts w:ascii="Times New Roman" w:cs="Times New Roman" w:eastAsia="Times New Roman" w:hAnsi="Times New Roman"/>
+          <w:b w:val="false"/>
+          <w:bCs w:val="false"/>
+          <w:i w:val="false"/>
+          <w:iCs w:val="false"/>
+          <w:smallCaps w:val="false"/>
+          <w:sz w:val="20"/>
+          <w:szCs w:val="20"/>
+        </w:rPr>
+        <w:t xml:space="preserve">Injected defects were rarely caught in any condition—17% in the floor, 17% in the treatment and 8% with full context. The full-context figure is the informative one: with the issue in hand the reviewer still approved most mutants, so on this model the binding limit on defect detection is the reviewer's reading of the code, not missing intent, and clarification cannot raise detection above that ceiling. One mutant was caught without the issue text but approved with it, an isolated case but consistent with a stated intent anchoring the reviewer toward acceptance.</w:t>
+      </w:r>
+    </w:p>
+    <w:p>
+      <w:pPr>
+        <w:spacing w:after="50" w:before="100"/>
+      </w:pPr>
+      <w:r>
+        <w:rPr>
+          <w:rFonts w:ascii="Times New Roman" w:cs="Times New Roman" w:eastAsia="Times New Roman" w:hAnsi="Times New Roman"/>
+          <w:b w:val="false"/>
+          <w:bCs w:val="false"/>
+          <w:i/>
+          <w:iCs/>
+          <w:smallCaps w:val="false"/>
+          <w:sz w:val="20"/>
+          <w:szCs w:val="20"/>
+        </w:rPr>
+        <w:t xml:space="preserve">C. Detector comparison</w:t>
+      </w:r>
+    </w:p>
+    <w:p>
+      <w:pPr>
+        <w:spacing w:after="60" w:before="0" w:line="240"/>
+        <w:ind w:firstLine="202"/>
+        <w:jc w:val="both"/>
+      </w:pPr>
+      <w:r>
+        <w:rPr>
+          <w:rFonts w:ascii="Times New Roman" w:cs="Times New Roman" w:eastAsia="Times New Roman" w:hAnsi="Times New Roman"/>
+          <w:b w:val="false"/>
+          <w:bCs w:val="false"/>
+          <w:i w:val="false"/>
+          <w:iCs w:val="false"/>
+          <w:smallCaps w:val="false"/>
+          <w:sz w:val="20"/>
+          <w:szCs w:val="20"/>
+        </w:rPr>
         <w:t xml:space="preserve">Using constructed labels—a stripped context is ambiguous by construction and its full counterpart clear—Table II compares the detectors. A detector that keys on a missing issue gains part of its recall for free under these labels, so the figures bound real-world recall from above.</w:t>
+      </w:r>
+    </w:p>
+    <w:p>
+      <w:pPr>
+        <w:spacing w:after="60" w:before="0" w:line="240"/>
+        <w:ind w:firstLine="202"/>
+        <w:jc w:val="both"/>
+      </w:pPr>
+      <w:r>
+        <w:rPr>
+          <w:rFonts w:ascii="Times New Roman" w:cs="Times New Roman" w:eastAsia="Times New Roman" w:hAnsi="Times New Roman"/>
+          <w:b w:val="false"/>
+          <w:bCs w:val="false"/>
+          <w:i w:val="false"/>
+          <w:iCs w:val="false"/>
+          <w:smallCaps w:val="false"/>
+          <w:sz w:val="20"/>
+          <w:szCs w:val="20"/>
+        </w:rPr>
+        <w:t xml:space="preserve">The heuristic was run on every golden row; the two uncertainty detectors, which cost eight model calls per decision, on 4 instances only, so their rows are indicative. At the default threshold both asked on every decision. Sampling dispersion did separate the conditions (mean score 0.70 stripped against 0.56 full), so a higher threshold might make it usable; perturbation did not (0.85 against 0.85). The heuristic was the most conservative: it never asked on a full-context instance, but caught only 21% of stripped ones, which is the recall limit traced above.</w:t>
       </w:r>
     </w:p>
     <w:p>
@@ -1217,6 +2858,430 @@
           </w:p>
         </w:tc>
       </w:tr>
+      <w:tr>
+        <w:tc>
+          <w:tcPr>
+            <w:tcW w:type="dxa" w:w="900"/>
+            <w:tcBorders>
+              <w:top w:val="none" w:color="FFFFFF" w:sz="0"/>
+              <w:left w:val="none" w:color="FFFFFF" w:sz="0"/>
+              <w:bottom w:val="single" w:color="000000" w:sz="4"/>
+              <w:right w:val="none" w:color="FFFFFF" w:sz="0"/>
+            </w:tcBorders>
+            <w:tcMar>
+              <w:top w:type="dxa" w:w="30"/>
+              <w:left w:type="dxa" w:w="50"/>
+              <w:bottom w:type="dxa" w:w="30"/>
+              <w:right w:type="dxa" w:w="50"/>
+            </w:tcMar>
+          </w:tcPr>
+          <w:p>
+            <w:pPr>
+              <w:jc w:val="left"/>
+            </w:pPr>
+            <w:r>
+              <w:rPr>
+                <w:rFonts w:ascii="Times New Roman" w:cs="Times New Roman" w:eastAsia="Times New Roman" w:hAnsi="Times New Roman"/>
+                <w:b w:val="false"/>
+                <w:bCs w:val="false"/>
+                <w:i w:val="false"/>
+                <w:iCs w:val="false"/>
+                <w:smallCaps w:val="false"/>
+                <w:sz w:val="16"/>
+                <w:szCs w:val="16"/>
+              </w:rPr>
+              <w:t xml:space="preserve">sampling</w:t>
+            </w:r>
+          </w:p>
+        </w:tc>
+        <w:tc>
+          <w:tcPr>
+            <w:tcW w:type="dxa" w:w="600"/>
+            <w:tcBorders>
+              <w:top w:val="none" w:color="FFFFFF" w:sz="0"/>
+              <w:left w:val="none" w:color="FFFFFF" w:sz="0"/>
+              <w:bottom w:val="single" w:color="000000" w:sz="4"/>
+              <w:right w:val="none" w:color="FFFFFF" w:sz="0"/>
+            </w:tcBorders>
+            <w:tcMar>
+              <w:top w:type="dxa" w:w="30"/>
+              <w:left w:type="dxa" w:w="50"/>
+              <w:bottom w:type="dxa" w:w="30"/>
+              <w:right w:type="dxa" w:w="50"/>
+            </w:tcMar>
+          </w:tcPr>
+          <w:p>
+            <w:pPr>
+              <w:jc w:val="center"/>
+            </w:pPr>
+            <w:r>
+              <w:rPr>
+                <w:rFonts w:ascii="Times New Roman" w:cs="Times New Roman" w:eastAsia="Times New Roman" w:hAnsi="Times New Roman"/>
+                <w:b w:val="false"/>
+                <w:bCs w:val="false"/>
+                <w:i w:val="false"/>
+                <w:iCs w:val="false"/>
+                <w:smallCaps w:val="false"/>
+                <w:sz w:val="16"/>
+                <w:szCs w:val="16"/>
+              </w:rPr>
+              <w:t xml:space="preserve">8</w:t>
+            </w:r>
+          </w:p>
+        </w:tc>
+        <w:tc>
+          <w:tcPr>
+            <w:tcW w:type="dxa" w:w="560"/>
+            <w:tcBorders>
+              <w:top w:val="none" w:color="FFFFFF" w:sz="0"/>
+              <w:left w:val="none" w:color="FFFFFF" w:sz="0"/>
+              <w:bottom w:val="single" w:color="000000" w:sz="4"/>
+              <w:right w:val="none" w:color="FFFFFF" w:sz="0"/>
+            </w:tcBorders>
+            <w:tcMar>
+              <w:top w:type="dxa" w:w="30"/>
+              <w:left w:type="dxa" w:w="50"/>
+              <w:bottom w:type="dxa" w:w="30"/>
+              <w:right w:type="dxa" w:w="50"/>
+            </w:tcMar>
+          </w:tcPr>
+          <w:p>
+            <w:pPr>
+              <w:jc w:val="center"/>
+            </w:pPr>
+            <w:r>
+              <w:rPr>
+                <w:rFonts w:ascii="Times New Roman" w:cs="Times New Roman" w:eastAsia="Times New Roman" w:hAnsi="Times New Roman"/>
+                <w:b w:val="false"/>
+                <w:bCs w:val="false"/>
+                <w:i w:val="false"/>
+                <w:iCs w:val="false"/>
+                <w:smallCaps w:val="false"/>
+                <w:sz w:val="16"/>
+                <w:szCs w:val="16"/>
+              </w:rPr>
+              <w:t xml:space="preserve">100%</w:t>
+            </w:r>
+          </w:p>
+        </w:tc>
+        <w:tc>
+          <w:tcPr>
+            <w:tcW w:type="dxa" w:w="480"/>
+            <w:tcBorders>
+              <w:top w:val="none" w:color="FFFFFF" w:sz="0"/>
+              <w:left w:val="none" w:color="FFFFFF" w:sz="0"/>
+              <w:bottom w:val="single" w:color="000000" w:sz="4"/>
+              <w:right w:val="none" w:color="FFFFFF" w:sz="0"/>
+            </w:tcBorders>
+            <w:tcMar>
+              <w:top w:type="dxa" w:w="30"/>
+              <w:left w:type="dxa" w:w="50"/>
+              <w:bottom w:type="dxa" w:w="30"/>
+              <w:right w:type="dxa" w:w="50"/>
+            </w:tcMar>
+          </w:tcPr>
+          <w:p>
+            <w:pPr>
+              <w:jc w:val="center"/>
+            </w:pPr>
+            <w:r>
+              <w:rPr>
+                <w:rFonts w:ascii="Times New Roman" w:cs="Times New Roman" w:eastAsia="Times New Roman" w:hAnsi="Times New Roman"/>
+                <w:b w:val="false"/>
+                <w:bCs w:val="false"/>
+                <w:i w:val="false"/>
+                <w:iCs w:val="false"/>
+                <w:smallCaps w:val="false"/>
+                <w:sz w:val="16"/>
+                <w:szCs w:val="16"/>
+              </w:rPr>
+              <w:t xml:space="preserve">0.50</w:t>
+            </w:r>
+          </w:p>
+        </w:tc>
+        <w:tc>
+          <w:tcPr>
+            <w:tcW w:type="dxa" w:w="480"/>
+            <w:tcBorders>
+              <w:top w:val="none" w:color="FFFFFF" w:sz="0"/>
+              <w:left w:val="none" w:color="FFFFFF" w:sz="0"/>
+              <w:bottom w:val="single" w:color="000000" w:sz="4"/>
+              <w:right w:val="none" w:color="FFFFFF" w:sz="0"/>
+            </w:tcBorders>
+            <w:tcMar>
+              <w:top w:type="dxa" w:w="30"/>
+              <w:left w:type="dxa" w:w="50"/>
+              <w:bottom w:type="dxa" w:w="30"/>
+              <w:right w:type="dxa" w:w="50"/>
+            </w:tcMar>
+          </w:tcPr>
+          <w:p>
+            <w:pPr>
+              <w:jc w:val="center"/>
+            </w:pPr>
+            <w:r>
+              <w:rPr>
+                <w:rFonts w:ascii="Times New Roman" w:cs="Times New Roman" w:eastAsia="Times New Roman" w:hAnsi="Times New Roman"/>
+                <w:b w:val="false"/>
+                <w:bCs w:val="false"/>
+                <w:i w:val="false"/>
+                <w:iCs w:val="false"/>
+                <w:smallCaps w:val="false"/>
+                <w:sz w:val="16"/>
+                <w:szCs w:val="16"/>
+              </w:rPr>
+              <w:t xml:space="preserve">1.00</w:t>
+            </w:r>
+          </w:p>
+        </w:tc>
+        <w:tc>
+          <w:tcPr>
+            <w:tcW w:type="dxa" w:w="1100"/>
+            <w:tcBorders>
+              <w:top w:val="none" w:color="FFFFFF" w:sz="0"/>
+              <w:left w:val="none" w:color="FFFFFF" w:sz="0"/>
+              <w:bottom w:val="single" w:color="000000" w:sz="4"/>
+              <w:right w:val="none" w:color="FFFFFF" w:sz="0"/>
+            </w:tcBorders>
+            <w:tcMar>
+              <w:top w:type="dxa" w:w="30"/>
+              <w:left w:type="dxa" w:w="50"/>
+              <w:bottom w:type="dxa" w:w="30"/>
+              <w:right w:type="dxa" w:w="50"/>
+            </w:tcMar>
+          </w:tcPr>
+          <w:p>
+            <w:pPr>
+              <w:jc w:val="center"/>
+            </w:pPr>
+            <w:r>
+              <w:rPr>
+                <w:rFonts w:ascii="Times New Roman" w:cs="Times New Roman" w:eastAsia="Times New Roman" w:hAnsi="Times New Roman"/>
+                <w:b w:val="false"/>
+                <w:bCs w:val="false"/>
+                <w:i w:val="false"/>
+                <w:iCs w:val="false"/>
+                <w:smallCaps w:val="false"/>
+                <w:sz w:val="16"/>
+                <w:szCs w:val="16"/>
+              </w:rPr>
+              <w:t xml:space="preserve">0.70 / 0.56</w:t>
+            </w:r>
+          </w:p>
+        </w:tc>
+      </w:tr>
+      <w:tr>
+        <w:tc>
+          <w:tcPr>
+            <w:tcW w:type="dxa" w:w="900"/>
+            <w:tcBorders>
+              <w:top w:val="none" w:color="FFFFFF" w:sz="0"/>
+              <w:left w:val="none" w:color="FFFFFF" w:sz="0"/>
+              <w:bottom w:val="single" w:color="000000" w:sz="4"/>
+              <w:right w:val="none" w:color="FFFFFF" w:sz="0"/>
+            </w:tcBorders>
+            <w:tcMar>
+              <w:top w:type="dxa" w:w="30"/>
+              <w:left w:type="dxa" w:w="50"/>
+              <w:bottom w:type="dxa" w:w="30"/>
+              <w:right w:type="dxa" w:w="50"/>
+            </w:tcMar>
+          </w:tcPr>
+          <w:p>
+            <w:pPr>
+              <w:jc w:val="left"/>
+            </w:pPr>
+            <w:r>
+              <w:rPr>
+                <w:rFonts w:ascii="Times New Roman" w:cs="Times New Roman" w:eastAsia="Times New Roman" w:hAnsi="Times New Roman"/>
+                <w:b w:val="false"/>
+                <w:bCs w:val="false"/>
+                <w:i w:val="false"/>
+                <w:iCs w:val="false"/>
+                <w:smallCaps w:val="false"/>
+                <w:sz w:val="16"/>
+                <w:szCs w:val="16"/>
+              </w:rPr>
+              <w:t xml:space="preserve">perturbation</w:t>
+            </w:r>
+          </w:p>
+        </w:tc>
+        <w:tc>
+          <w:tcPr>
+            <w:tcW w:type="dxa" w:w="600"/>
+            <w:tcBorders>
+              <w:top w:val="none" w:color="FFFFFF" w:sz="0"/>
+              <w:left w:val="none" w:color="FFFFFF" w:sz="0"/>
+              <w:bottom w:val="single" w:color="000000" w:sz="4"/>
+              <w:right w:val="none" w:color="FFFFFF" w:sz="0"/>
+            </w:tcBorders>
+            <w:tcMar>
+              <w:top w:type="dxa" w:w="30"/>
+              <w:left w:type="dxa" w:w="50"/>
+              <w:bottom w:type="dxa" w:w="30"/>
+              <w:right w:type="dxa" w:w="50"/>
+            </w:tcMar>
+          </w:tcPr>
+          <w:p>
+            <w:pPr>
+              <w:jc w:val="center"/>
+            </w:pPr>
+            <w:r>
+              <w:rPr>
+                <w:rFonts w:ascii="Times New Roman" w:cs="Times New Roman" w:eastAsia="Times New Roman" w:hAnsi="Times New Roman"/>
+                <w:b w:val="false"/>
+                <w:bCs w:val="false"/>
+                <w:i w:val="false"/>
+                <w:iCs w:val="false"/>
+                <w:smallCaps w:val="false"/>
+                <w:sz w:val="16"/>
+                <w:szCs w:val="16"/>
+              </w:rPr>
+              <w:t xml:space="preserve">8</w:t>
+            </w:r>
+          </w:p>
+        </w:tc>
+        <w:tc>
+          <w:tcPr>
+            <w:tcW w:type="dxa" w:w="560"/>
+            <w:tcBorders>
+              <w:top w:val="none" w:color="FFFFFF" w:sz="0"/>
+              <w:left w:val="none" w:color="FFFFFF" w:sz="0"/>
+              <w:bottom w:val="single" w:color="000000" w:sz="4"/>
+              <w:right w:val="none" w:color="FFFFFF" w:sz="0"/>
+            </w:tcBorders>
+            <w:tcMar>
+              <w:top w:type="dxa" w:w="30"/>
+              <w:left w:type="dxa" w:w="50"/>
+              <w:bottom w:type="dxa" w:w="30"/>
+              <w:right w:type="dxa" w:w="50"/>
+            </w:tcMar>
+          </w:tcPr>
+          <w:p>
+            <w:pPr>
+              <w:jc w:val="center"/>
+            </w:pPr>
+            <w:r>
+              <w:rPr>
+                <w:rFonts w:ascii="Times New Roman" w:cs="Times New Roman" w:eastAsia="Times New Roman" w:hAnsi="Times New Roman"/>
+                <w:b w:val="false"/>
+                <w:bCs w:val="false"/>
+                <w:i w:val="false"/>
+                <w:iCs w:val="false"/>
+                <w:smallCaps w:val="false"/>
+                <w:sz w:val="16"/>
+                <w:szCs w:val="16"/>
+              </w:rPr>
+              <w:t xml:space="preserve">100%</w:t>
+            </w:r>
+          </w:p>
+        </w:tc>
+        <w:tc>
+          <w:tcPr>
+            <w:tcW w:type="dxa" w:w="480"/>
+            <w:tcBorders>
+              <w:top w:val="none" w:color="FFFFFF" w:sz="0"/>
+              <w:left w:val="none" w:color="FFFFFF" w:sz="0"/>
+              <w:bottom w:val="single" w:color="000000" w:sz="4"/>
+              <w:right w:val="none" w:color="FFFFFF" w:sz="0"/>
+            </w:tcBorders>
+            <w:tcMar>
+              <w:top w:type="dxa" w:w="30"/>
+              <w:left w:type="dxa" w:w="50"/>
+              <w:bottom w:type="dxa" w:w="30"/>
+              <w:right w:type="dxa" w:w="50"/>
+            </w:tcMar>
+          </w:tcPr>
+          <w:p>
+            <w:pPr>
+              <w:jc w:val="center"/>
+            </w:pPr>
+            <w:r>
+              <w:rPr>
+                <w:rFonts w:ascii="Times New Roman" w:cs="Times New Roman" w:eastAsia="Times New Roman" w:hAnsi="Times New Roman"/>
+                <w:b w:val="false"/>
+                <w:bCs w:val="false"/>
+                <w:i w:val="false"/>
+                <w:iCs w:val="false"/>
+                <w:smallCaps w:val="false"/>
+                <w:sz w:val="16"/>
+                <w:szCs w:val="16"/>
+              </w:rPr>
+              <w:t xml:space="preserve">0.50</w:t>
+            </w:r>
+          </w:p>
+        </w:tc>
+        <w:tc>
+          <w:tcPr>
+            <w:tcW w:type="dxa" w:w="480"/>
+            <w:tcBorders>
+              <w:top w:val="none" w:color="FFFFFF" w:sz="0"/>
+              <w:left w:val="none" w:color="FFFFFF" w:sz="0"/>
+              <w:bottom w:val="single" w:color="000000" w:sz="4"/>
+              <w:right w:val="none" w:color="FFFFFF" w:sz="0"/>
+            </w:tcBorders>
+            <w:tcMar>
+              <w:top w:type="dxa" w:w="30"/>
+              <w:left w:type="dxa" w:w="50"/>
+              <w:bottom w:type="dxa" w:w="30"/>
+              <w:right w:type="dxa" w:w="50"/>
+            </w:tcMar>
+          </w:tcPr>
+          <w:p>
+            <w:pPr>
+              <w:jc w:val="center"/>
+            </w:pPr>
+            <w:r>
+              <w:rPr>
+                <w:rFonts w:ascii="Times New Roman" w:cs="Times New Roman" w:eastAsia="Times New Roman" w:hAnsi="Times New Roman"/>
+                <w:b w:val="false"/>
+                <w:bCs w:val="false"/>
+                <w:i w:val="false"/>
+                <w:iCs w:val="false"/>
+                <w:smallCaps w:val="false"/>
+                <w:sz w:val="16"/>
+                <w:szCs w:val="16"/>
+              </w:rPr>
+              <w:t xml:space="preserve">1.00</w:t>
+            </w:r>
+          </w:p>
+        </w:tc>
+        <w:tc>
+          <w:tcPr>
+            <w:tcW w:type="dxa" w:w="1100"/>
+            <w:tcBorders>
+              <w:top w:val="none" w:color="FFFFFF" w:sz="0"/>
+              <w:left w:val="none" w:color="FFFFFF" w:sz="0"/>
+              <w:bottom w:val="single" w:color="000000" w:sz="4"/>
+              <w:right w:val="none" w:color="FFFFFF" w:sz="0"/>
+            </w:tcBorders>
+            <w:tcMar>
+              <w:top w:type="dxa" w:w="30"/>
+              <w:left w:type="dxa" w:w="50"/>
+              <w:bottom w:type="dxa" w:w="30"/>
+              <w:right w:type="dxa" w:w="50"/>
+            </w:tcMar>
+          </w:tcPr>
+          <w:p>
+            <w:pPr>
+              <w:jc w:val="center"/>
+            </w:pPr>
+            <w:r>
+              <w:rPr>
+                <w:rFonts w:ascii="Times New Roman" w:cs="Times New Roman" w:eastAsia="Times New Roman" w:hAnsi="Times New Roman"/>
+                <w:b w:val="false"/>
+                <w:bCs w:val="false"/>
+                <w:i w:val="false"/>
+                <w:iCs w:val="false"/>
+                <w:smallCaps w:val="false"/>
+                <w:sz w:val="16"/>
+                <w:szCs w:val="16"/>
+              </w:rPr>
+              <w:t xml:space="preserve">0.85 / 0.85</w:t>
+            </w:r>
+          </w:p>
+        </w:tc>
+      </w:tr>
     </w:tbl>
     <w:p>
       <w:pPr>
@@ -1285,7 +3350,7 @@
           <w:sz w:val="20"/>
           <w:szCs w:val="20"/>
         </w:rPr>
-        <w:t xml:space="preserve">The sample is small. Free-tier daily quotas, applied per model, bounded the number of instances, and confidence intervals are correspondingly wide; we report every completed instance rather than a selected subset. The judge is an LLM and has not yet been validated against human scoring; we provide a stratified sample and agreement tooling for that purpose. The simulated author answers only from withheld text and its exchanges are logged, but leakage cannot be excluded without audit. Mutants are verified by execution, yet the mutation operators produce simple defects that may be easier or harder to detect than natural ones. All verified mutants come from one repository, sympy, because it could be tested in the available environment.</w:t>
+        <w:t xml:space="preserve">The sample is small. Free-tier daily quotas, applied per model, bounded the number of instances, and confidence intervals are correspondingly wide; we report every completed instance rather than a selected subset. The judge is an LLM and has not yet been validated against human scoring; we provide a stratified sample and agreement tooling for that purpose. The simulated author answers only from withheld text and its exchanges are logged, but leakage cannot be excluded without audit. We also report a protocol deviation: in the first v2 run the simulated author's token budget was exhausted by the model's hidden reasoning, returning empty answers, and its prompt refused questions phrased in terms of code it had not seen. Both were corrected and the treatment condition re-run for the affected instances only; floor and ceiling runs were not repeated. The prompt change was made after observing refusals, and both versions are logged with every exchange. Mutants are verified by execution, yet the mutation operators produce simple defects that may be easier or harder to detect than natural ones. All verified mutants come from one repository, sympy, because it could be tested in the available environment. Every model used is a free-tier model, and the reviewer is a small one; its low defect-detection rate even with full context may not hold for stronger reviewers.</w:t>
       </w:r>
     </w:p>
     <w:p>
@@ -1357,7 +3422,7 @@
           <w:sz w:val="20"/>
           <w:szCs w:val="20"/>
         </w:rPr>
-        <w:t xml:space="preserve">ClarifyReview inserts a decision before critique: ask the author when the intent of a change cannot be read from the change itself. Our pilot showed that evaluating this idea on golden patches requires withholding more than the linked issue, because well-written patches document their own intent; the revised design withholds all natural-language intent and adds execution-verified defects. The system, harness, verified mutants and all results are released. Remaining work is a human-labelled set for the classifier, human validation of the judge, a paired developer study of perceived trust and usefulness, and a larger run beyond free-tier limits.</w:t>
+        <w:t xml:space="preserve">ClarifyReview inserts a decision before critique: ask the author when the intent of a change cannot be read from the change itself. Our pilot showed that evaluating this idea on golden patches requires withholding more than the linked issue, because well-written patches document their own intent; the revised design withholds all natural-language intent and adds execution-verified defects. The system, harness, verified mutants and all results are released. On 36 complete instances clarification recovered 0.17 of the gap between floor and ceiling; the effect is not significant at this sample size, and the trace through detection, answering and recovery locates the limit in the detector's recall rather than in the usefulness of an answer once given. Remaining work is a human-labelled set for the classifier, human validation of the judge, a paired developer study of perceived trust and usefulness, and a larger run beyond free-tier limits.</w:t>
       </w:r>
     </w:p>
     <w:p>

</xml_diff>

<commit_message>
Full IEEE conference paper with figures; document deliverable builds
build_paper.js now produces the complete paper: research questions,
system and design figures, results with the per-instance trace, detector
comparison, discussion, threats including the protocol deviation, and
references numbered by first citation. README gains the commands that
regenerate the report, deck and paper from the study log.

Co-Authored-By: Claude Opus 5.5 <noreply@anthropic.com>
</commit_message>
<xml_diff>
--- a/paper/ClarifyReview_Paper_Draft.docx
+++ b/paper/ClarifyReview_Paper_Draft.docx
@@ -4,7 +4,7 @@
   <w:body>
     <w:p>
       <w:pPr>
-        <w:spacing w:after="160"/>
+        <w:spacing w:after="200"/>
         <w:jc w:val="center"/>
       </w:pPr>
       <w:r>
@@ -37,7 +37,7 @@
           <w:sz w:val="22"/>
           <w:szCs w:val="22"/>
         </w:rPr>
-        <w:t xml:space="preserve">Yashika Gupta, Pratyaksh Gupta, Arivoli A</w:t>
+        <w:t xml:space="preserve">Yashika Gupta        Pratyaksh Gupta        Arivoli A</w:t>
       </w:r>
     </w:p>
     <w:p>
@@ -56,7 +56,7 @@
           <w:sz w:val="20"/>
           <w:szCs w:val="20"/>
         </w:rPr>
-        <w:t xml:space="preserve">School of Computer Science and Engineering, Vellore Institute of Technology, Vellore, India</w:t>
+        <w:t xml:space="preserve">School of Computer Science and Engineering</w:t>
       </w:r>
     </w:p>
     <w:p>
@@ -69,18 +69,19 @@
           <w:rFonts w:ascii="Times New Roman" w:cs="Times New Roman" w:eastAsia="Times New Roman" w:hAnsi="Times New Roman"/>
           <w:b w:val="false"/>
           <w:bCs w:val="false"/>
-          <w:i w:val="false"/>
-          <w:iCs w:val="false"/>
-          <w:smallCaps w:val="false"/>
-          <w:sz w:val="18"/>
-          <w:szCs w:val="18"/>
-        </w:rPr>
-        <w:t xml:space="preserve">yashika.gupta2023@vitstudent.ac.in</w:t>
-      </w:r>
-    </w:p>
-    <w:p>
-      <w:pPr>
-        <w:spacing w:after="60" w:before="0" w:line="240"/>
+          <w:i/>
+          <w:iCs/>
+          <w:smallCaps w:val="false"/>
+          <w:sz w:val="20"/>
+          <w:szCs w:val="20"/>
+        </w:rPr>
+        <w:t xml:space="preserve">Vellore Institute of Technology, Vellore, India</w:t>
+      </w:r>
+    </w:p>
+    <w:p>
+      <w:pPr>
+        <w:keepNext w:val="false"/>
+        <w:spacing w:after="40" w:before="0" w:line="240"/>
         <w:jc w:val="both"/>
       </w:pPr>
       <w:r>
@@ -91,8 +92,8 @@
           <w:i/>
           <w:iCs/>
           <w:smallCaps w:val="false"/>
-          <w:sz w:val="20"/>
-          <w:szCs w:val="20"/>
+          <w:sz w:val="18"/>
+          <w:szCs w:val="18"/>
         </w:rPr>
         <w:t xml:space="preserve">Abstract</w:t>
       </w:r>
@@ -107,11 +108,12 @@
           <w:sz w:val="18"/>
           <w:szCs w:val="18"/>
         </w:rPr>
-        <w:t xml:space="preserve">—Commercial LLM-based code reviewers read a pull request once, infer the author's intent, and comment on that inference. When intent is ambiguous they guess. We present ClarifyReview, a reviewer that inserts an ambiguity-detection step before comment generation and asks the author one targeted question when the available context is insufficient. We evaluate it in a two-by-three ablation on SWE-bench Verified, comparing a single-pass reviewer with intent removed, the same reviewer with clarification, and a full-context ceiling. A pilot showed that removing only the linked issue leaves intent recoverable from the patch itself: intent recovery was 100% in the floor condition, leaving no gap to measure. A revised manipulation removes all natural-language statements of intent, and a mutant arm adds 32 execution-verified defects. On 36 complete instances, intent recovery was 81% without clarification, 83% with it, and 97% with full context (McNemar p = 1.000). Verified defects were caught in 17%, 17% and 8% of cases respectively. We report these as a small-sample study under free-tier quota limits, and release the system, harness and data.</w:t>
-      </w:r>
-    </w:p>
-    <w:p>
-      <w:pPr>
+        <w:t xml:space="preserve">—LLM-based pull request reviewers read a change once, infer what its author intended, and comment on that inference; when the intent is ambiguous they guess. We present ClarifyReview, a reviewer that decides before critiquing whether the available context is sufficient, and asks the author a targeted question when it is not. Its single-pass baseline is the same pipeline with a detector that never asks, so the two differ in one stage. We evaluate it in a two-by-three ablation on SWE-bench Verified, crossing correct and execution-verified defective patches (32 mutants) with three conditions: intent withheld, intent withheld with clarification, and full context. A pilot showed that withholding only the linked issue leaves intent recoverable from the patch itself; withholding every natural-language statement of intent opened a gap. On 36 instances, intent recovery was 81% without clarification, 83% with it and 97% with full context (gap recovery 0.17, McNemar p = 1.00). Tracing each instance shows that clarification recovered intent where it was given the chance, and that the binding limit is detector recall: the detector flagged 2 of the 7 changes the reviewer misread. Defect detection was low in every condition, including full context, so it is limited by the reviewer rather than by missing intent. We release the system, harness, verified mutants and study log.</w:t>
+      </w:r>
+    </w:p>
+    <w:p>
+      <w:pPr>
+        <w:keepNext w:val="false"/>
         <w:spacing w:after="160" w:before="0" w:line="240"/>
         <w:jc w:val="both"/>
         <w:sectPr>
@@ -129,8 +131,8 @@
           <w:i/>
           <w:iCs/>
           <w:smallCaps w:val="false"/>
-          <w:sz w:val="20"/>
-          <w:szCs w:val="20"/>
+          <w:sz w:val="18"/>
+          <w:szCs w:val="18"/>
         </w:rPr>
         <w:t xml:space="preserve">Index Terms</w:t>
       </w:r>
@@ -145,11 +147,12 @@
           <w:sz w:val="18"/>
           <w:szCs w:val="18"/>
         </w:rPr>
-        <w:t xml:space="preserve">—automated code review, large language models, intent clarification, ambiguity detection, empirical software engineering</w:t>
-      </w:r>
-    </w:p>
-    <w:p>
-      <w:pPr>
+        <w:t xml:space="preserve">—automated code review, large language models, intent clarification, ambiguity detection, mutation testing, empirical software engineering</w:t>
+      </w:r>
+    </w:p>
+    <w:p>
+      <w:pPr>
+        <w:keepNext/>
         <w:spacing w:after="80" w:before="160"/>
         <w:jc w:val="center"/>
       </w:pPr>
@@ -182,7 +185,8 @@
     </w:p>
     <w:p>
       <w:pPr>
-        <w:spacing w:after="60" w:before="0" w:line="240"/>
+        <w:keepNext w:val="false"/>
+        <w:spacing w:after="40" w:before="0" w:line="240"/>
         <w:ind w:firstLine="202"/>
         <w:jc w:val="both"/>
       </w:pPr>
@@ -197,12 +201,13 @@
           <w:sz w:val="20"/>
           <w:szCs w:val="20"/>
         </w:rPr>
-        <w:t xml:space="preserve">Code review is a persistent bottleneck in software delivery, and tools such as CodeRabbit, Qodo and Greptile now use large language models (LLMs) to review pull requests automatically. All of them explain their comments in natural language, so explanation is no longer a distinguishing feature. What they share is a structural limitation: each reviews a pull request in a single pass. The tool reads the diff, infers what the author intended, and comments on that inference as though it were established.</w:t>
-      </w:r>
-    </w:p>
-    <w:p>
-      <w:pPr>
-        <w:spacing w:after="60" w:before="0" w:line="240"/>
+        <w:t xml:space="preserve">Code review is a persistent bottleneck in software delivery, and most of a reviewer's effort goes into understanding what a change is for [1], [2]. Tools such as CodeRabbit, Qodo and Greptile now use large language models (LLMs) to review pull requests automatically [3]. All of them explain their comments, so explanation is no longer distinguishing. What they share is a structural limitation: each reviews a pull request in a single pass, inferring the author's intent and commenting on that inference as though it were established.</w:t>
+      </w:r>
+    </w:p>
+    <w:p>
+      <w:pPr>
+        <w:keepNext w:val="false"/>
+        <w:spacing w:after="40" w:before="0" w:line="240"/>
         <w:ind w:firstLine="202"/>
         <w:jc w:val="both"/>
       </w:pPr>
@@ -217,12 +222,13 @@
           <w:sz w:val="20"/>
           <w:szCs w:val="20"/>
         </w:rPr>
-        <w:t xml:space="preserve">When the diff is ambiguous—a validation check removed with no linked issue, a commit message reading only "fix"—a human reviewer asks. Current tools do not. They commit to a reading, producing false alarms on intentional changes and missed defects on unintentional ones. Both erode the trust that keeps such tools switched on.</w:t>
-      </w:r>
-    </w:p>
-    <w:p>
-      <w:pPr>
-        <w:spacing w:after="60" w:before="0" w:line="240"/>
+        <w:t xml:space="preserve">When the change is ambiguous—a validation check removed with no linked issue and a commit message reading only "fix"—a human reviewer asks. Current tools do not. They commit to a reading, producing false alarms on intentional changes and missed defects on unintentional ones, and both erode the trust that keeps such tools switched on.</w:t>
+      </w:r>
+    </w:p>
+    <w:p>
+      <w:pPr>
+        <w:keepNext w:val="false"/>
+        <w:spacing w:after="40" w:before="0" w:line="240"/>
         <w:ind w:firstLine="202"/>
         <w:jc w:val="both"/>
       </w:pPr>
@@ -237,11 +243,92 @@
           <w:sz w:val="20"/>
           <w:szCs w:val="20"/>
         </w:rPr>
-        <w:t xml:space="preserve">Clarification-seeking is well established for code generation [1], [2], but we are not aware of work applying it to review of an existing change, where a wrong guess costs a human reviewer's attention rather than a compiler cycle. This paper makes three contributions: (i) ClarifyReview, a four-stage reviewer whose second stage decides per pull request whether to ask, with four interchangeable detector designs; (ii) an evaluation design for intent-dependent review on SWE-bench Verified [3], including a manipulation that withholds intent and a mutant arm with execution-verified defects; and (iii) an account of a pilot whose principal result was a correction to that design.</w:t>
-      </w:r>
-    </w:p>
-    <w:p>
-      <w:pPr>
+        <w:t xml:space="preserve">Clarification-seeking improves code generation [4], [5], but we are not aware of work applying it to review of an existing change, where a wrong guess costs a human reviewer's attention rather than a compiler cycle. We ask whether a reviewer that asks before critiquing understands and detects more than one that does not. This paper makes four contributions:</w:t>
+      </w:r>
+    </w:p>
+    <w:p>
+      <w:pPr>
+        <w:keepNext w:val="false"/>
+        <w:spacing w:after="40" w:before="0" w:line="240"/>
+        <w:jc w:val="both"/>
+      </w:pPr>
+      <w:r>
+        <w:rPr>
+          <w:rFonts w:ascii="Times New Roman" w:cs="Times New Roman" w:eastAsia="Times New Roman" w:hAnsi="Times New Roman"/>
+          <w:b w:val="false"/>
+          <w:bCs w:val="false"/>
+          <w:i w:val="false"/>
+          <w:iCs w:val="false"/>
+          <w:smallCaps w:val="false"/>
+          <w:sz w:val="20"/>
+          <w:szCs w:val="20"/>
+        </w:rPr>
+        <w:t xml:space="preserve">1) ClarifyReview, a four-stage reviewer whose second stage decides per pull request whether to ask, with four interchangeable detector designs and a baseline that differs from it in exactly one stage;</w:t>
+      </w:r>
+    </w:p>
+    <w:p>
+      <w:pPr>
+        <w:keepNext w:val="false"/>
+        <w:spacing w:after="40" w:before="0" w:line="240"/>
+        <w:jc w:val="both"/>
+      </w:pPr>
+      <w:r>
+        <w:rPr>
+          <w:rFonts w:ascii="Times New Roman" w:cs="Times New Roman" w:eastAsia="Times New Roman" w:hAnsi="Times New Roman"/>
+          <w:b w:val="false"/>
+          <w:bCs w:val="false"/>
+          <w:i w:val="false"/>
+          <w:iCs w:val="false"/>
+          <w:smallCaps w:val="false"/>
+          <w:sz w:val="20"/>
+          <w:szCs w:val="20"/>
+        </w:rPr>
+        <w:t xml:space="preserve">2) an evaluation design for intent-dependent review on SWE-bench [6]: a manipulation that withholds all natural-language intent while leaving code untouched, and 32 execution-verified defects;</w:t>
+      </w:r>
+    </w:p>
+    <w:p>
+      <w:pPr>
+        <w:keepNext w:val="false"/>
+        <w:spacing w:after="40" w:before="0" w:line="240"/>
+        <w:jc w:val="both"/>
+      </w:pPr>
+      <w:r>
+        <w:rPr>
+          <w:rFonts w:ascii="Times New Roman" w:cs="Times New Roman" w:eastAsia="Times New Roman" w:hAnsi="Times New Roman"/>
+          <w:b w:val="false"/>
+          <w:bCs w:val="false"/>
+          <w:i w:val="false"/>
+          <w:iCs w:val="false"/>
+          <w:smallCaps w:val="false"/>
+          <w:sz w:val="20"/>
+          <w:szCs w:val="20"/>
+        </w:rPr>
+        <w:t xml:space="preserve">3) a two-by-three ablation with a per-instance trace that separates the value of an answer from the chance to ask, locating the limit of the approach in detector recall; and</w:t>
+      </w:r>
+    </w:p>
+    <w:p>
+      <w:pPr>
+        <w:keepNext w:val="false"/>
+        <w:spacing w:after="80" w:before="0" w:line="240"/>
+        <w:jc w:val="both"/>
+      </w:pPr>
+      <w:r>
+        <w:rPr>
+          <w:rFonts w:ascii="Times New Roman" w:cs="Times New Roman" w:eastAsia="Times New Roman" w:hAnsi="Times New Roman"/>
+          <w:b w:val="false"/>
+          <w:bCs w:val="false"/>
+          <w:i w:val="false"/>
+          <w:iCs w:val="false"/>
+          <w:smallCaps w:val="false"/>
+          <w:sz w:val="20"/>
+          <w:szCs w:val="20"/>
+        </w:rPr>
+        <w:t xml:space="preserve">4) an account of a pilot whose principal result was a correction to the evaluation design, and of a protocol deviation, both reported in full.</w:t>
+      </w:r>
+    </w:p>
+    <w:p>
+      <w:pPr>
+        <w:keepNext/>
         <w:spacing w:after="80" w:before="160"/>
         <w:jc w:val="center"/>
       </w:pPr>
@@ -274,7 +361,27 @@
     </w:p>
     <w:p>
       <w:pPr>
-        <w:spacing w:after="60" w:before="0" w:line="240"/>
+        <w:keepNext/>
+        <w:spacing w:after="40" w:before="80"/>
+      </w:pPr>
+      <w:r>
+        <w:rPr>
+          <w:rFonts w:ascii="Times New Roman" w:cs="Times New Roman" w:eastAsia="Times New Roman" w:hAnsi="Times New Roman"/>
+          <w:b w:val="false"/>
+          <w:bCs w:val="false"/>
+          <w:i/>
+          <w:iCs/>
+          <w:smallCaps w:val="false"/>
+          <w:sz w:val="20"/>
+          <w:szCs w:val="20"/>
+        </w:rPr>
+        <w:t xml:space="preserve">A. Automated code review</w:t>
+      </w:r>
+    </w:p>
+    <w:p>
+      <w:pPr>
+        <w:keepNext w:val="false"/>
+        <w:spacing w:after="40" w:before="0" w:line="240"/>
         <w:ind w:firstLine="202"/>
         <w:jc w:val="both"/>
       </w:pPr>
@@ -289,12 +396,32 @@
           <w:sz w:val="20"/>
           <w:szCs w:val="20"/>
         </w:rPr>
-        <w:t xml:space="preserve">ClarifyGPT [1] detects ambiguous requirements through code-consistency checks and asks targeted questions before generating code, improving Pass@1. TiCoder [2] formalises intent through test-based queries and reports, in a fifteen-person study, improved correctness judgement and lower cognitive load. Both concern generation, not review of an existing diff.</w:t>
-      </w:r>
-    </w:p>
-    <w:p>
-      <w:pPr>
-        <w:spacing w:after="60" w:before="0" w:line="240"/>
+        <w:t xml:space="preserve">Empirical studies at Microsoft and Google found that understanding a change is the reviewer's first and costliest task [1], [2]. Learned reviewers generate comments from review data [7], [8], and deployed LLM tools differ mainly in how much repository context they retrieve [3]. All are single-pass; none resolves intent before commenting.</w:t>
+      </w:r>
+    </w:p>
+    <w:p>
+      <w:pPr>
+        <w:keepNext/>
+        <w:spacing w:after="40" w:before="80"/>
+      </w:pPr>
+      <w:r>
+        <w:rPr>
+          <w:rFonts w:ascii="Times New Roman" w:cs="Times New Roman" w:eastAsia="Times New Roman" w:hAnsi="Times New Roman"/>
+          <w:b w:val="false"/>
+          <w:bCs w:val="false"/>
+          <w:i/>
+          <w:iCs/>
+          <w:smallCaps w:val="false"/>
+          <w:sz w:val="20"/>
+          <w:szCs w:val="20"/>
+        </w:rPr>
+        <w:t xml:space="preserve">B. Clarification in code generation</w:t>
+      </w:r>
+    </w:p>
+    <w:p>
+      <w:pPr>
+        <w:keepNext w:val="false"/>
+        <w:spacing w:after="40" w:before="0" w:line="240"/>
         <w:ind w:firstLine="202"/>
         <w:jc w:val="both"/>
       </w:pPr>
@@ -309,12 +436,32 @@
           <w:sz w:val="20"/>
           <w:szCs w:val="20"/>
         </w:rPr>
-        <w:t xml:space="preserve">SWE-bench [3] pairs real GitHub issues with the patches that resolved them and the tests those patches make pass, giving execution-based ground truth. It was built for autonomous repair and contains no ambiguity condition; our manipulation constructs one.</w:t>
-      </w:r>
-    </w:p>
-    <w:p>
-      <w:pPr>
-        <w:spacing w:after="60" w:before="0" w:line="240"/>
+        <w:t xml:space="preserve">ClarifyGPT detects ambiguous requirements through a code-consistency check and asks targeted questions before generating code, improving Pass@1 [4]. TiCoder clarifies intent through generated tests and, in a fifteen-person study, improved correctness judgement and lowered cognitive load [5]. Both concern greenfield generation; both show that asking must be scaffolded and selective.</w:t>
+      </w:r>
+    </w:p>
+    <w:p>
+      <w:pPr>
+        <w:keepNext/>
+        <w:spacing w:after="40" w:before="80"/>
+      </w:pPr>
+      <w:r>
+        <w:rPr>
+          <w:rFonts w:ascii="Times New Roman" w:cs="Times New Roman" w:eastAsia="Times New Roman" w:hAnsi="Times New Roman"/>
+          <w:b w:val="false"/>
+          <w:bCs w:val="false"/>
+          <w:i/>
+          <w:iCs/>
+          <w:smallCaps w:val="false"/>
+          <w:sz w:val="20"/>
+          <w:szCs w:val="20"/>
+        </w:rPr>
+        <w:t xml:space="preserve">C. Uncertainty quantification</w:t>
+      </w:r>
+    </w:p>
+    <w:p>
+      <w:pPr>
+        <w:keepNext w:val="false"/>
+        <w:spacing w:after="40" w:before="0" w:line="240"/>
         <w:ind w:firstLine="202"/>
         <w:jc w:val="both"/>
       </w:pPr>
@@ -329,11 +476,52 @@
           <w:sz w:val="20"/>
           <w:szCs w:val="20"/>
         </w:rPr>
-        <w:t xml:space="preserve">Self-consistency [4] and semantic uncertainty [5] measure disagreement across samples as a proxy for model uncertainty. We adapt them to measure instability in a reviewer's reading of a change's intent. Industry comparisons of deployed reviewers [6]–[8] differentiate tools by context depth; none reports a clarification step.</w:t>
-      </w:r>
-    </w:p>
-    <w:p>
-      <w:pPr>
+        <w:t xml:space="preserve">Self-consistency treats disagreement across samples as a signal [9]; semantic uncertainty clusters samples by meaning before measuring dispersion [10]. We adapt both to measure instability in a reviewer's reading of a change's intent.</w:t>
+      </w:r>
+    </w:p>
+    <w:p>
+      <w:pPr>
+        <w:keepNext/>
+        <w:spacing w:after="40" w:before="80"/>
+      </w:pPr>
+      <w:r>
+        <w:rPr>
+          <w:rFonts w:ascii="Times New Roman" w:cs="Times New Roman" w:eastAsia="Times New Roman" w:hAnsi="Times New Roman"/>
+          <w:b w:val="false"/>
+          <w:bCs w:val="false"/>
+          <w:i/>
+          <w:iCs/>
+          <w:smallCaps w:val="false"/>
+          <w:sz w:val="20"/>
+          <w:szCs w:val="20"/>
+        </w:rPr>
+        <w:t xml:space="preserve">D. Benchmarks and evaluation</w:t>
+      </w:r>
+    </w:p>
+    <w:p>
+      <w:pPr>
+        <w:keepNext w:val="false"/>
+        <w:spacing w:after="40" w:before="0" w:line="240"/>
+        <w:ind w:firstLine="202"/>
+        <w:jc w:val="both"/>
+      </w:pPr>
+      <w:r>
+        <w:rPr>
+          <w:rFonts w:ascii="Times New Roman" w:cs="Times New Roman" w:eastAsia="Times New Roman" w:hAnsi="Times New Roman"/>
+          <w:b w:val="false"/>
+          <w:bCs w:val="false"/>
+          <w:i w:val="false"/>
+          <w:iCs w:val="false"/>
+          <w:smallCaps w:val="false"/>
+          <w:sz w:val="20"/>
+          <w:szCs w:val="20"/>
+        </w:rPr>
+        <w:t xml:space="preserve">SWE-bench pairs real issues with the patches that resolved them and the tests those patches make pass [6]; its Verified subset was validated by human annotators [11]. Known tests allow defective variants whose defectiveness is established by execution [12]. LLM judges agree with human raters about as often as humans agree, with known biases including self-preference [13], which motivates using a judge from a different model family than the reviewer.</w:t>
+      </w:r>
+    </w:p>
+    <w:p>
+      <w:pPr>
+        <w:keepNext/>
         <w:spacing w:after="80" w:before="160"/>
         <w:jc w:val="center"/>
       </w:pPr>
@@ -366,7 +554,8 @@
     </w:p>
     <w:p>
       <w:pPr>
-        <w:spacing w:after="60" w:before="0" w:line="240"/>
+        <w:keepNext w:val="false"/>
+        <w:spacing w:after="40" w:before="0" w:line="240"/>
         <w:ind w:firstLine="202"/>
         <w:jc w:val="both"/>
       </w:pPr>
@@ -381,12 +570,111 @@
           <w:sz w:val="20"/>
           <w:szCs w:val="20"/>
         </w:rPr>
-        <w:t xml:space="preserve">ClarifyReview has four stages (Fig. 1 in the project report). Stage 1 parses the diff and resolves changed lines to changed symbols using the Python abstract syntax tree, assembling a bounded, deterministic context. Stage 2 decides whether to ask. Stage 3 generates at most two questions—each required by its output schema to name a file, line or symbol—posts them, and waits, falling back to a review flagged low-confidence on timeout. Stage 4 produces structured findings with severity, category, evidence, suggested fix and confidence.</w:t>
-      </w:r>
-    </w:p>
-    <w:p>
-      <w:pPr>
-        <w:spacing w:after="60" w:before="0" w:line="240"/>
+        <w:t xml:space="preserve">ClarifyReview has four stages (Fig. 1). Stage 1 parses the diff and resolves changed lines to changed symbols with the Python abstract syntax tree, assembling a bounded context in a deterministic order and fingerprinting it. Stage 2 decides whether to ask. Stage 3 generates at most two questions—each required by its output schema to name a file, line or symbol, so that it cannot degenerate into "please explain this PR"—and sends them through a Responder. Stage 4 produces structured findings with severity, category, evidence, suggested fix and confidence.</w:t>
+      </w:r>
+    </w:p>
+    <w:p>
+      <w:pPr>
+        <w:keepNext/>
+        <w:spacing w:after="30" w:before="80"/>
+        <w:jc w:val="center"/>
+      </w:pPr>
+      <w:r>
+        <w:drawing>
+          <wp:inline distT="0" distB="0" distL="0" distR="0">
+            <wp:extent cx="3124200" cy="1143000"/>
+            <wp:effectExtent t="0" r="0" b="0" l="0"/>
+            <wp:docPr id="1" name="" descr="" title=""/>
+            <wp:cNvGraphicFramePr>
+              <a:graphicFrameLocks xmlns:a="http://schemas.openxmlformats.org/drawingml/2006/main" noChangeAspect="1"/>
+            </wp:cNvGraphicFramePr>
+            <a:graphic xmlns:a="http://schemas.openxmlformats.org/drawingml/2006/main">
+              <a:graphicData uri="http://schemas.openxmlformats.org/drawingml/2006/picture">
+                <pic:pic xmlns:pic="http://schemas.openxmlformats.org/drawingml/2006/picture">
+                  <pic:nvPicPr>
+                    <pic:cNvPr id="0" name="" descr=""/>
+                    <pic:cNvPicPr>
+                      <a:picLocks noChangeAspect="1" noChangeArrowheads="1"/>
+                    </pic:cNvPicPr>
+                  </pic:nvPicPr>
+                  <pic:blipFill>
+                    <a:blip r:embed="rId7" cstate="none"/>
+                    <a:srcRect/>
+                    <a:stretch>
+                      <a:fillRect/>
+                    </a:stretch>
+                  </pic:blipFill>
+                  <pic:spPr bwMode="auto">
+                    <a:xfrm>
+                      <a:off x="0" y="0"/>
+                      <a:ext cx="3124200" cy="1143000"/>
+                    </a:xfrm>
+                    <a:prstGeom prst="rect">
+                      <a:avLst/>
+                    </a:prstGeom>
+                  </pic:spPr>
+                </pic:pic>
+              </a:graphicData>
+            </a:graphic>
+          </wp:inline>
+        </w:drawing>
+      </w:r>
+    </w:p>
+    <w:p>
+      <w:pPr>
+        <w:spacing w:after="100"/>
+        <w:jc w:val="both"/>
+      </w:pPr>
+      <w:r>
+        <w:rPr>
+          <w:rFonts w:ascii="Times New Roman" w:cs="Times New Roman" w:eastAsia="Times New Roman" w:hAnsi="Times New Roman"/>
+          <w:b w:val="false"/>
+          <w:bCs w:val="false"/>
+          <w:i w:val="false"/>
+          <w:iCs w:val="false"/>
+          <w:smallCaps w:val="false"/>
+          <w:sz w:val="16"/>
+          <w:szCs w:val="16"/>
+        </w:rPr>
+        <w:t xml:space="preserve">Fig. 1.  </w:t>
+      </w:r>
+      <w:r>
+        <w:rPr>
+          <w:rFonts w:ascii="Times New Roman" w:cs="Times New Roman" w:eastAsia="Times New Roman" w:hAnsi="Times New Roman"/>
+          <w:b w:val="false"/>
+          <w:bCs w:val="false"/>
+          <w:i w:val="false"/>
+          <w:iCs w:val="false"/>
+          <w:smallCaps w:val="false"/>
+          <w:sz w:val="16"/>
+          <w:szCs w:val="16"/>
+        </w:rPr>
+        <w:t xml:space="preserve">ClarifyReview's four stages. Stage 2 is the decision point; when it proceeds, Stage 3 does not run.</w:t>
+      </w:r>
+    </w:p>
+    <w:p>
+      <w:pPr>
+        <w:keepNext/>
+        <w:spacing w:after="40" w:before="80"/>
+      </w:pPr>
+      <w:r>
+        <w:rPr>
+          <w:rFonts w:ascii="Times New Roman" w:cs="Times New Roman" w:eastAsia="Times New Roman" w:hAnsi="Times New Roman"/>
+          <w:b w:val="false"/>
+          <w:bCs w:val="false"/>
+          <w:i/>
+          <w:iCs/>
+          <w:smallCaps w:val="false"/>
+          <w:sz w:val="20"/>
+          <w:szCs w:val="20"/>
+        </w:rPr>
+        <w:t xml:space="preserve">A. Ambiguity detectors</w:t>
+      </w:r>
+    </w:p>
+    <w:p>
+      <w:pPr>
+        <w:keepNext w:val="false"/>
+        <w:spacing w:after="40" w:before="0" w:line="240"/>
         <w:ind w:firstLine="202"/>
         <w:jc w:val="both"/>
       </w:pPr>
@@ -401,11 +689,52 @@
           <w:sz w:val="20"/>
           <w:szCs w:val="20"/>
         </w:rPr>
-        <w:t xml:space="preserve">Four detectors implement Stage 2 behind one interface. A heuristic combines fifteen diff features (missing issue, generic commit message, removed guard, absent test change, deletion ratio and others) as weighted evidence, normalised so the score is the fraction of available evidence present. A classifier learns weights over the same features. Two uncertainty detectors sample eight one-sentence intent hypotheses—by temperature sampling or by prompt perturbation—and score their dispersion and semantic entropy. The single-pass baseline is the same pipeline with a detector that never asks, so baseline and treatment differ in exactly one stage; an automated test asserts they render byte-identical prompts when the detector proceeds.</w:t>
-      </w:r>
-    </w:p>
-    <w:p>
-      <w:pPr>
+        <w:t xml:space="preserve">Four detectors implement one interface, score(context) → s ∈ [0, 1], and a shared decision asks when s ≥ τ for a threshold τ frozen in configuration. The heuristic combines fifteen diff features—missing linked issue, generic commit message, removed guard, no test alongside, public symbol touched, deletion ratio and others—as weighted evidence, s = Σ wᵢfᵢ / Σ wᵢ, so the score reads as the fraction of ambiguity evidence present; it makes no model call. A logistic-regression classifier learns weights over the same features from labelled pull requests. Two uncertainty detectors sample eight one-sentence hypotheses about what the change is for—by temperature sampling, or by perturbing the prompt at fixed temperature—and score their mean pairwise embedding distance and semantic entropy.</w:t>
+      </w:r>
+    </w:p>
+    <w:p>
+      <w:pPr>
+        <w:keepNext/>
+        <w:spacing w:after="40" w:before="80"/>
+      </w:pPr>
+      <w:r>
+        <w:rPr>
+          <w:rFonts w:ascii="Times New Roman" w:cs="Times New Roman" w:eastAsia="Times New Roman" w:hAnsi="Times New Roman"/>
+          <w:b w:val="false"/>
+          <w:bCs w:val="false"/>
+          <w:i/>
+          <w:iCs/>
+          <w:smallCaps w:val="false"/>
+          <w:sz w:val="20"/>
+          <w:szCs w:val="20"/>
+        </w:rPr>
+        <w:t xml:space="preserve">B. One pipeline, two conditions</w:t>
+      </w:r>
+    </w:p>
+    <w:p>
+      <w:pPr>
+        <w:keepNext w:val="false"/>
+        <w:spacing w:after="40" w:before="0" w:line="240"/>
+        <w:ind w:firstLine="202"/>
+        <w:jc w:val="both"/>
+      </w:pPr>
+      <w:r>
+        <w:rPr>
+          <w:rFonts w:ascii="Times New Roman" w:cs="Times New Roman" w:eastAsia="Times New Roman" w:hAnsi="Times New Roman"/>
+          <w:b w:val="false"/>
+          <w:bCs w:val="false"/>
+          <w:i w:val="false"/>
+          <w:iCs w:val="false"/>
+          <w:smallCaps w:val="false"/>
+          <w:sz w:val="20"/>
+          <w:szCs w:val="20"/>
+        </w:rPr>
+        <w:t xml:space="preserve">The single-pass baseline is not separate code: it is the same pipeline with a detector that never asks, and a test asserts that, with the detector forced to proceed, both conditions render byte-identical prompts. Stage 3 talks to the author through a Responder protocol with three implementations—a GitHub responder that posts a comment and waits, a benchmark responder that calls a simulated author, and a null responder—so the experiment exercises the code that would be deployed. The system is written in Python, runs as a GitHub App or from a command line, records every run to an SQLite log, and is covered by 131 automated tests.</w:t>
+      </w:r>
+    </w:p>
+    <w:p>
+      <w:pPr>
+        <w:keepNext/>
         <w:spacing w:after="80" w:before="160"/>
         <w:jc w:val="center"/>
       </w:pPr>
@@ -438,7 +767,29 @@
     </w:p>
     <w:p>
       <w:pPr>
-        <w:spacing w:after="50" w:before="100"/>
+        <w:keepNext w:val="false"/>
+        <w:spacing w:after="40" w:before="0" w:line="240"/>
+        <w:ind w:firstLine="202"/>
+        <w:jc w:val="both"/>
+      </w:pPr>
+      <w:r>
+        <w:rPr>
+          <w:rFonts w:ascii="Times New Roman" w:cs="Times New Roman" w:eastAsia="Times New Roman" w:hAnsi="Times New Roman"/>
+          <w:b w:val="false"/>
+          <w:bCs w:val="false"/>
+          <w:i w:val="false"/>
+          <w:iCs w:val="false"/>
+          <w:smallCaps w:val="false"/>
+          <w:sz w:val="20"/>
+          <w:szCs w:val="20"/>
+        </w:rPr>
+        <w:t xml:space="preserve">We ask three questions. RQ1: does clarification recover intent that is lost when the author's stated intent is withheld? RQ2: does it improve defect detection or reduce false alarms? RQ3: how well do the detectors identify the changes that need a question?</w:t>
+      </w:r>
+    </w:p>
+    <w:p>
+      <w:pPr>
+        <w:keepNext/>
+        <w:spacing w:after="40" w:before="80"/>
       </w:pPr>
       <w:r>
         <w:rPr>
@@ -456,7 +807,8 @@
     </w:p>
     <w:p>
       <w:pPr>
-        <w:spacing w:after="60" w:before="0" w:line="240"/>
+        <w:keepNext w:val="false"/>
+        <w:spacing w:after="40" w:before="0" w:line="240"/>
         <w:ind w:firstLine="202"/>
         <w:jc w:val="both"/>
       </w:pPr>
@@ -471,12 +823,92 @@
           <w:sz w:val="20"/>
           <w:szCs w:val="20"/>
         </w:rPr>
-        <w:t xml:space="preserve">Each instance is reviewed three times by the same model: with full context (the ceiling); with intent withheld, single-pass (the floor); and with intent withheld, through ClarifyReview (the treatment). When the treatment asks, a simulated author answers. The simulated author sees only the withheld issue text and commit message—never the diff, the defect, or whether one exists—and every exchange is logged for a leakage audit. Gap recovery is (treatment − floor)/(ceiling − floor).</w:t>
-      </w:r>
-    </w:p>
-    <w:p>
-      <w:pPr>
-        <w:spacing w:after="50" w:before="100"/>
+        <w:t xml:space="preserve">Each instance is reviewed three times by the same reviewer model with the same prompt template (Fig. 2): with full context (the ceiling); with intent withheld, single-pass (the floor); and with intent withheld, through ClarifyReview (the treatment). Floor and treatment see byte-identical code, asserted per instance. Gap recovery G = (treatment − floor)/(ceiling − floor) is the share of the context-induced loss that clarification restores.</w:t>
+      </w:r>
+    </w:p>
+    <w:p>
+      <w:pPr>
+        <w:keepNext/>
+        <w:spacing w:after="30" w:before="80"/>
+        <w:jc w:val="center"/>
+      </w:pPr>
+      <w:r>
+        <w:drawing>
+          <wp:inline distT="0" distB="0" distL="0" distR="0">
+            <wp:extent cx="3124200" cy="1314450"/>
+            <wp:effectExtent t="0" r="0" b="0" l="0"/>
+            <wp:docPr id="2" name="" descr="" title=""/>
+            <wp:cNvGraphicFramePr>
+              <a:graphicFrameLocks xmlns:a="http://schemas.openxmlformats.org/drawingml/2006/main" noChangeAspect="1"/>
+            </wp:cNvGraphicFramePr>
+            <a:graphic xmlns:a="http://schemas.openxmlformats.org/drawingml/2006/main">
+              <a:graphicData uri="http://schemas.openxmlformats.org/drawingml/2006/picture">
+                <pic:pic xmlns:pic="http://schemas.openxmlformats.org/drawingml/2006/picture">
+                  <pic:nvPicPr>
+                    <pic:cNvPr id="0" name="" descr=""/>
+                    <pic:cNvPicPr>
+                      <a:picLocks noChangeAspect="1" noChangeArrowheads="1"/>
+                    </pic:cNvPicPr>
+                  </pic:nvPicPr>
+                  <pic:blipFill>
+                    <a:blip r:embed="rId8" cstate="none"/>
+                    <a:srcRect/>
+                    <a:stretch>
+                      <a:fillRect/>
+                    </a:stretch>
+                  </pic:blipFill>
+                  <pic:spPr bwMode="auto">
+                    <a:xfrm>
+                      <a:off x="0" y="0"/>
+                      <a:ext cx="3124200" cy="1314450"/>
+                    </a:xfrm>
+                    <a:prstGeom prst="rect">
+                      <a:avLst/>
+                    </a:prstGeom>
+                  </pic:spPr>
+                </pic:pic>
+              </a:graphicData>
+            </a:graphic>
+          </wp:inline>
+        </w:drawing>
+      </w:r>
+    </w:p>
+    <w:p>
+      <w:pPr>
+        <w:spacing w:after="100"/>
+        <w:jc w:val="both"/>
+      </w:pPr>
+      <w:r>
+        <w:rPr>
+          <w:rFonts w:ascii="Times New Roman" w:cs="Times New Roman" w:eastAsia="Times New Roman" w:hAnsi="Times New Roman"/>
+          <w:b w:val="false"/>
+          <w:bCs w:val="false"/>
+          <w:i w:val="false"/>
+          <w:iCs w:val="false"/>
+          <w:smallCaps w:val="false"/>
+          <w:sz w:val="16"/>
+          <w:szCs w:val="16"/>
+        </w:rPr>
+        <w:t xml:space="preserve">Fig. 2.  </w:t>
+      </w:r>
+      <w:r>
+        <w:rPr>
+          <w:rFonts w:ascii="Times New Roman" w:cs="Times New Roman" w:eastAsia="Times New Roman" w:hAnsi="Times New Roman"/>
+          <w:b w:val="false"/>
+          <w:bCs w:val="false"/>
+          <w:i w:val="false"/>
+          <w:iCs w:val="false"/>
+          <w:smallCaps w:val="false"/>
+          <w:sz w:val="16"/>
+          <w:szCs w:val="16"/>
+        </w:rPr>
+        <w:t xml:space="preserve">The two-by-three design. Golden patches measure intent recovery and false alarms; verified mutants measure intent recovery and defect detection.</w:t>
+      </w:r>
+    </w:p>
+    <w:p>
+      <w:pPr>
+        <w:keepNext/>
+        <w:spacing w:after="40" w:before="80"/>
       </w:pPr>
       <w:r>
         <w:rPr>
@@ -494,7 +926,8 @@
     </w:p>
     <w:p>
       <w:pPr>
-        <w:spacing w:after="60" w:before="0" w:line="240"/>
+        <w:keepNext w:val="false"/>
+        <w:spacing w:after="40" w:before="0" w:line="240"/>
         <w:ind w:firstLine="202"/>
         <w:jc w:val="both"/>
       </w:pPr>
@@ -509,12 +942,13 @@
           <w:sz w:val="20"/>
           <w:szCs w:val="20"/>
         </w:rPr>
-        <w:t xml:space="preserve">Version 1 of the manipulation removed the linked issue, title, description and commit messages, leaving the diff unchanged. Version 2 additionally removes comments, trailing comments and docstrings that the patch adds, leaving every line of code intact; the runner asserts code equivalence per instance, and this check caught a defect in our own stripping code before any data was collected.</w:t>
-      </w:r>
-    </w:p>
-    <w:p>
-      <w:pPr>
-        <w:spacing w:after="50" w:before="100"/>
+        <w:t xml:space="preserve">Version 1 of the manipulation removed the linked issue, title, description and commit messages. Version 2 additionally removes every comment, trailing comment and docstring the patch adds, leaving every line of code intact. A docstring is removed only when the patch opens it on an added line, after an earlier rule deleted real code in a hunk that began inside an existing docstring.</w:t>
+      </w:r>
+    </w:p>
+    <w:p>
+      <w:pPr>
+        <w:keepNext/>
+        <w:spacing w:after="40" w:before="80"/>
       </w:pPr>
       <w:r>
         <w:rPr>
@@ -527,12 +961,13 @@
           <w:sz w:val="20"/>
           <w:szCs w:val="20"/>
         </w:rPr>
-        <w:t xml:space="preserve">C. Instances and verified defects</w:t>
-      </w:r>
-    </w:p>
-    <w:p>
-      <w:pPr>
-        <w:spacing w:after="60" w:before="0" w:line="240"/>
+        <w:t xml:space="preserve">C. Execution-verified defects</w:t>
+      </w:r>
+    </w:p>
+    <w:p>
+      <w:pPr>
+        <w:keepNext w:val="false"/>
+        <w:spacing w:after="40" w:before="0" w:line="240"/>
         <w:ind w:firstLine="202"/>
         <w:jc w:val="both"/>
       </w:pPr>
@@ -547,32 +982,13 @@
           <w:sz w:val="20"/>
           <w:szCs w:val="20"/>
         </w:rPr>
-        <w:t xml:space="preserve">Golden patches are correct by construction, so reviewing them measures false alarms but not detection. We therefore inject defects into the added lines of golden patches with six mutation operators and keep a mutant only if the repository's own FAIL_TO_PASS tests pass with the golden patch and fail with the mutant. Of 75 sympy instances, 32 yielded a verified mutant; 27 admitted no applicable operator, 7 produced only mutants the tests could not detect, and 9 could not run in the available environment.</w:t>
-      </w:r>
-    </w:p>
-    <w:p>
-      <w:pPr>
-        <w:spacing w:after="60" w:before="0" w:line="240"/>
-        <w:ind w:firstLine="202"/>
-        <w:jc w:val="both"/>
-      </w:pPr>
-      <w:r>
-        <w:rPr>
-          <w:rFonts w:ascii="Times New Roman" w:cs="Times New Roman" w:eastAsia="Times New Roman" w:hAnsi="Times New Roman"/>
-          <w:b w:val="false"/>
-          <w:bCs w:val="false"/>
-          <w:i w:val="false"/>
-          <w:iCs w:val="false"/>
-          <w:smallCaps w:val="false"/>
-          <w:sz w:val="20"/>
-          <w:szCs w:val="20"/>
-        </w:rPr>
-        <w:t xml:space="preserve">The v2 study set comprises 36 rows: verified-mutant instances, each reviewed as both golden and mutant, and further golden patches from other repositories selected hardest-first by SWE-bench's own difficulty annotation. Selecting on an annotation assigned by the benchmark's authors, rather than on our detector's score, avoids biasing the detector comparison.</w:t>
-      </w:r>
-    </w:p>
-    <w:p>
-      <w:pPr>
-        <w:spacing w:after="50" w:before="100"/>
+        <w:t xml:space="preserve">Golden patches are correct by construction, so they measure false alarms but not detection. We inject defects into the lines a golden patch adds with six operators—invert comparison, negate condition, flip constant, drop guard, swap boolean operator, off-by-one—and keep a mutant only if the repository's FAIL_TO_PASS tests pass with the golden patch and fail with the mutant [12]. Of 75 sympy instances, 32 yielded a verified mutant; 27 admitted no operator, 7 produced only mutants the tests did not catch, and 9 could not run in the available environment.</w:t>
+      </w:r>
+    </w:p>
+    <w:p>
+      <w:pPr>
+        <w:keepNext/>
+        <w:spacing w:after="40" w:before="80"/>
       </w:pPr>
       <w:r>
         <w:rPr>
@@ -585,12 +1001,13 @@
           <w:sz w:val="20"/>
           <w:szCs w:val="20"/>
         </w:rPr>
-        <w:t xml:space="preserve">D. Scoring</w:t>
-      </w:r>
-    </w:p>
-    <w:p>
-      <w:pPr>
-        <w:spacing w:after="60" w:before="0" w:line="240"/>
+        <w:t xml:space="preserve">D. Instances</w:t>
+      </w:r>
+    </w:p>
+    <w:p>
+      <w:pPr>
+        <w:keepNext w:val="false"/>
+        <w:spacing w:after="40" w:before="0" w:line="240"/>
         <w:ind w:firstLine="202"/>
         <w:jc w:val="both"/>
       </w:pPr>
@@ -605,11 +1022,52 @@
           <w:sz w:val="20"/>
           <w:szCs w:val="20"/>
         </w:rPr>
-        <w:t xml:space="preserve">An LLM judge scores each review for intent recovery, detection of the injected defect, and false alarms on correct code. The judge is a different model from the reviewer, to avoid self-preference. Paired binary outcomes are compared with McNemar's exact test and gap recovery is reported with a bootstrap confidence interval.</w:t>
-      </w:r>
-    </w:p>
-    <w:p>
-      <w:pPr>
+        <w:t xml:space="preserve">The study set has 36 rows: twelve sympy instances reviewed both as the golden patch and as its verified mutant, and twelve golden patches from xarray, sphinx, astropy, django, pylint, pytest and scikit-learn. Instances were chosen hardest-first by SWE-bench's own difficulty annotation, assigned by the benchmark's annotators rather than by our detector, so selection does not favour the detector under evaluation.</w:t>
+      </w:r>
+    </w:p>
+    <w:p>
+      <w:pPr>
+        <w:keepNext/>
+        <w:spacing w:after="40" w:before="80"/>
+      </w:pPr>
+      <w:r>
+        <w:rPr>
+          <w:rFonts w:ascii="Times New Roman" w:cs="Times New Roman" w:eastAsia="Times New Roman" w:hAnsi="Times New Roman"/>
+          <w:b w:val="false"/>
+          <w:bCs w:val="false"/>
+          <w:i/>
+          <w:iCs/>
+          <w:smallCaps w:val="false"/>
+          <w:sz w:val="20"/>
+          <w:szCs w:val="20"/>
+        </w:rPr>
+        <w:t xml:space="preserve">E. Simulated author, judge and statistics</w:t>
+      </w:r>
+    </w:p>
+    <w:p>
+      <w:pPr>
+        <w:keepNext w:val="false"/>
+        <w:spacing w:after="40" w:before="0" w:line="240"/>
+        <w:ind w:firstLine="202"/>
+        <w:jc w:val="both"/>
+      </w:pPr>
+      <w:r>
+        <w:rPr>
+          <w:rFonts w:ascii="Times New Roman" w:cs="Times New Roman" w:eastAsia="Times New Roman" w:hAnsi="Times New Roman"/>
+          <w:b w:val="false"/>
+          <w:bCs w:val="false"/>
+          <w:i w:val="false"/>
+          <w:iCs w:val="false"/>
+          <w:smallCaps w:val="false"/>
+          <w:sz w:val="20"/>
+          <w:szCs w:val="20"/>
+        </w:rPr>
+        <w:t xml:space="preserve">When the treatment asks, a simulated author answers using only the withheld issue text and commit messages; it never sees the diff, the defect, or whether one exists, and must decline when its notes are silent. Every exchange is logged with its prompt version. Reviews are scored by an LLM judge from a different model family than the reviewer on three checklist questions: was the intent recovered, was the injected defect caught, and was a false alarm raised on correct code. Paired outcomes are compared with McNemar's exact test [14]; gap recovery is reported with a bootstrap 95% interval. The reviewer is gemini-3.5-flash-lite; questions, the simulated author and the judge use gemma-4-31b-it; all calls ran on free-tier access.</w:t>
+      </w:r>
+    </w:p>
+    <w:p>
+      <w:pPr>
+        <w:keepNext/>
         <w:spacing w:after="80" w:before="160"/>
         <w:jc w:val="center"/>
       </w:pPr>
@@ -642,7 +1100,8 @@
     </w:p>
     <w:p>
       <w:pPr>
-        <w:spacing w:after="50" w:before="100"/>
+        <w:keepNext/>
+        <w:spacing w:after="40" w:before="80"/>
       </w:pPr>
       <w:r>
         <w:rPr>
@@ -660,7 +1119,8 @@
     </w:p>
     <w:p>
       <w:pPr>
-        <w:spacing w:after="60" w:before="0" w:line="240"/>
+        <w:keepNext w:val="false"/>
+        <w:spacing w:after="40" w:before="0" w:line="240"/>
         <w:ind w:firstLine="202"/>
         <w:jc w:val="both"/>
       </w:pPr>
@@ -675,12 +1135,13 @@
           <w:sz w:val="20"/>
           <w:szCs w:val="20"/>
         </w:rPr>
-        <w:t xml:space="preserve">The pilot attempted 10 SWE-bench Verified instances from 10 repositories; 5 completed all three conditions before the free-tier daily quota was exhausted. Intent recovery was 100% at the ceiling, 100% in the floor and 100% in the treatment. With the floor equal to the ceiling there was no gap to recover. Inspection showed why: the patches stated their purpose in code, comments and docstrings, so withholding the issue removed nothing a reader needed. The detector asked on 1 of 5 treatment runs.</w:t>
-      </w:r>
-    </w:p>
-    <w:p>
-      <w:pPr>
-        <w:spacing w:after="50" w:before="100"/>
+        <w:t xml:space="preserve">The pilot attempted 10 instances from ten repositories; 5 completed all three conditions before the daily quota was exhausted. Intent recovery was 100% at the ceiling, 100% at the floor and 100% in the treatment: with the floor equal to the ceiling there was nothing to recover. The patches stated their purpose in the comments and docstrings they added, so withholding the issue removed nothing a reader needed. This led to manipulation v2, the mutant arm and difficulty-ordered selection.</w:t>
+      </w:r>
+    </w:p>
+    <w:p>
+      <w:pPr>
+        <w:keepNext/>
+        <w:spacing w:after="40" w:before="80"/>
       </w:pPr>
       <w:r>
         <w:rPr>
@@ -693,12 +1154,13 @@
           <w:sz w:val="20"/>
           <w:szCs w:val="20"/>
         </w:rPr>
-        <w:t xml:space="preserve">B. Main study (manipulation v2)</w:t>
-      </w:r>
-    </w:p>
-    <w:p>
-      <w:pPr>
-        <w:spacing w:after="60" w:before="0" w:line="240"/>
+        <w:t xml:space="preserve">B. RQ1: intent recovery</w:t>
+      </w:r>
+    </w:p>
+    <w:p>
+      <w:pPr>
+        <w:keepNext w:val="false"/>
+        <w:spacing w:after="40" w:before="0" w:line="240"/>
         <w:ind w:firstLine="202"/>
         <w:jc w:val="both"/>
       </w:pPr>
@@ -713,12 +1175,33 @@
           <w:sz w:val="20"/>
           <w:szCs w:val="20"/>
         </w:rPr>
-        <w:t xml:space="preserve">36 of 36 rows completed all three conditions, with no failed calls once transient provider errors were retried, and all 108 reviews were judged. Table I gives the outcomes. Gap recovery is shown only where the ceiling exceeds the floor; elsewhere it is undefined.</w:t>
-      </w:r>
-    </w:p>
-    <w:p>
-      <w:pPr>
-        <w:spacing w:after="40" w:before="100"/>
+        <w:t xml:space="preserve">All 36 rows completed all three conditions and all 108 reviews were judged (Table I, Fig. 3). Withholding all natural-language intent lowered intent recovery from 97% to 81%, opening the gap v1 did not. Clarification raised it to 83%: G = 0.17 (95% CI 0.00–0.50), with 1 discordant pair favouring the treatment and 0 the floor (p = 1.00). The direction is as hypothesised; at this sample size the effect is not significant, and could not have been, since only pairs where the detector asked can differ for a reason other than sampling variation.</w:t>
+      </w:r>
+    </w:p>
+    <w:p>
+      <w:pPr>
+        <w:keepNext/>
+        <w:spacing w:after="0" w:before="100"/>
+        <w:jc w:val="center"/>
+      </w:pPr>
+      <w:r>
+        <w:rPr>
+          <w:rFonts w:ascii="Times New Roman" w:cs="Times New Roman" w:eastAsia="Times New Roman" w:hAnsi="Times New Roman"/>
+          <w:b w:val="false"/>
+          <w:bCs w:val="false"/>
+          <w:i w:val="false"/>
+          <w:iCs w:val="false"/>
+          <w:smallCaps w:val="false"/>
+          <w:sz w:val="16"/>
+          <w:szCs w:val="16"/>
+        </w:rPr>
+        <w:t xml:space="preserve">TABLE I</w:t>
+      </w:r>
+    </w:p>
+    <w:p>
+      <w:pPr>
+        <w:keepNext/>
+        <w:spacing w:after="40"/>
         <w:jc w:val="center"/>
       </w:pPr>
       <w:r>
@@ -732,12 +1215,12 @@
           <w:sz w:val="16"/>
           <w:szCs w:val="16"/>
         </w:rPr>
-        <w:t xml:space="preserve">Table I. Judged outcomes, manipulation v2</w:t>
+        <w:t xml:space="preserve">Judged outcomes, manipulation v2</w:t>
       </w:r>
     </w:p>
     <w:tbl>
       <w:tblPr>
-        <w:tblW w:type="dxa" w:w="4470"/>
+        <w:tblW w:type="dxa" w:w="4340"/>
         <w:tblBorders>
           <w:top w:val="single" w:color="auto" w:sz="4"/>
           <w:left w:val="single" w:color="auto" w:sz="4"/>
@@ -749,12 +1232,10 @@
       </w:tblPr>
       <w:tblGrid>
         <w:gridCol w:w="1500"/>
-        <w:gridCol w:w="330"/>
-        <w:gridCol w:w="520"/>
-        <w:gridCol w:w="520"/>
-        <w:gridCol w:w="520"/>
+        <w:gridCol w:w="760"/>
+        <w:gridCol w:w="760"/>
+        <w:gridCol w:w="760"/>
         <w:gridCol w:w="560"/>
-        <w:gridCol w:w="520"/>
       </w:tblGrid>
       <w:tr>
         <w:tc>
@@ -767,10 +1248,10 @@
               <w:right w:val="none" w:color="FFFFFF" w:sz="0"/>
             </w:tcBorders>
             <w:tcMar>
-              <w:top w:type="dxa" w:w="30"/>
-              <w:left w:type="dxa" w:w="50"/>
-              <w:bottom w:type="dxa" w:w="30"/>
-              <w:right w:type="dxa" w:w="50"/>
+              <w:top w:type="dxa" w:w="25"/>
+              <w:left w:type="dxa" w:w="40"/>
+              <w:bottom w:type="dxa" w:w="25"/>
+              <w:right w:type="dxa" w:w="40"/>
             </w:tcMar>
           </w:tcPr>
           <w:p>
@@ -794,7 +1275,7 @@
         </w:tc>
         <w:tc>
           <w:tcPr>
-            <w:tcW w:type="dxa" w:w="330"/>
+            <w:tcW w:type="dxa" w:w="760"/>
             <w:tcBorders>
               <w:top w:val="single" w:color="000000" w:sz="4"/>
               <w:left w:val="none" w:color="FFFFFF" w:sz="0"/>
@@ -802,10 +1283,10 @@
               <w:right w:val="none" w:color="FFFFFF" w:sz="0"/>
             </w:tcBorders>
             <w:tcMar>
-              <w:top w:type="dxa" w:w="30"/>
-              <w:left w:type="dxa" w:w="50"/>
-              <w:bottom w:type="dxa" w:w="30"/>
-              <w:right w:type="dxa" w:w="50"/>
+              <w:top w:type="dxa" w:w="25"/>
+              <w:left w:type="dxa" w:w="40"/>
+              <w:bottom w:type="dxa" w:w="25"/>
+              <w:right w:type="dxa" w:w="40"/>
             </w:tcMar>
           </w:tcPr>
           <w:p>
@@ -823,13 +1304,13 @@
                 <w:sz w:val="16"/>
                 <w:szCs w:val="16"/>
               </w:rPr>
-              <w:t xml:space="preserve">n</w:t>
-            </w:r>
-          </w:p>
-        </w:tc>
-        <w:tc>
-          <w:tcPr>
-            <w:tcW w:type="dxa" w:w="520"/>
+              <w:t xml:space="preserve">Floor</w:t>
+            </w:r>
+          </w:p>
+        </w:tc>
+        <w:tc>
+          <w:tcPr>
+            <w:tcW w:type="dxa" w:w="760"/>
             <w:tcBorders>
               <w:top w:val="single" w:color="000000" w:sz="4"/>
               <w:left w:val="none" w:color="FFFFFF" w:sz="0"/>
@@ -837,10 +1318,10 @@
               <w:right w:val="none" w:color="FFFFFF" w:sz="0"/>
             </w:tcBorders>
             <w:tcMar>
-              <w:top w:type="dxa" w:w="30"/>
-              <w:left w:type="dxa" w:w="50"/>
-              <w:bottom w:type="dxa" w:w="30"/>
-              <w:right w:type="dxa" w:w="50"/>
+              <w:top w:type="dxa" w:w="25"/>
+              <w:left w:type="dxa" w:w="40"/>
+              <w:bottom w:type="dxa" w:w="25"/>
+              <w:right w:type="dxa" w:w="40"/>
             </w:tcMar>
           </w:tcPr>
           <w:p>
@@ -858,13 +1339,13 @@
                 <w:sz w:val="16"/>
                 <w:szCs w:val="16"/>
               </w:rPr>
-              <w:t xml:space="preserve">Floor</w:t>
-            </w:r>
-          </w:p>
-        </w:tc>
-        <w:tc>
-          <w:tcPr>
-            <w:tcW w:type="dxa" w:w="520"/>
+              <w:t xml:space="preserve">Treat.</w:t>
+            </w:r>
+          </w:p>
+        </w:tc>
+        <w:tc>
+          <w:tcPr>
+            <w:tcW w:type="dxa" w:w="760"/>
             <w:tcBorders>
               <w:top w:val="single" w:color="000000" w:sz="4"/>
               <w:left w:val="none" w:color="FFFFFF" w:sz="0"/>
@@ -872,10 +1353,10 @@
               <w:right w:val="none" w:color="FFFFFF" w:sz="0"/>
             </w:tcBorders>
             <w:tcMar>
-              <w:top w:type="dxa" w:w="30"/>
-              <w:left w:type="dxa" w:w="50"/>
-              <w:bottom w:type="dxa" w:w="30"/>
-              <w:right w:type="dxa" w:w="50"/>
+              <w:top w:type="dxa" w:w="25"/>
+              <w:left w:type="dxa" w:w="40"/>
+              <w:bottom w:type="dxa" w:w="25"/>
+              <w:right w:type="dxa" w:w="40"/>
             </w:tcMar>
           </w:tcPr>
           <w:p>
@@ -893,13 +1374,13 @@
                 <w:sz w:val="16"/>
                 <w:szCs w:val="16"/>
               </w:rPr>
-              <w:t xml:space="preserve">Treat.</w:t>
-            </w:r>
-          </w:p>
-        </w:tc>
-        <w:tc>
-          <w:tcPr>
-            <w:tcW w:type="dxa" w:w="520"/>
+              <w:t xml:space="preserve">Ceiling</w:t>
+            </w:r>
+          </w:p>
+        </w:tc>
+        <w:tc>
+          <w:tcPr>
+            <w:tcW w:type="dxa" w:w="560"/>
             <w:tcBorders>
               <w:top w:val="single" w:color="000000" w:sz="4"/>
               <w:left w:val="none" w:color="FFFFFF" w:sz="0"/>
@@ -907,10 +1388,10 @@
               <w:right w:val="none" w:color="FFFFFF" w:sz="0"/>
             </w:tcBorders>
             <w:tcMar>
-              <w:top w:type="dxa" w:w="30"/>
-              <w:left w:type="dxa" w:w="50"/>
-              <w:bottom w:type="dxa" w:w="30"/>
-              <w:right w:type="dxa" w:w="50"/>
+              <w:top w:type="dxa" w:w="25"/>
+              <w:left w:type="dxa" w:w="40"/>
+              <w:bottom w:type="dxa" w:w="25"/>
+              <w:right w:type="dxa" w:w="40"/>
             </w:tcMar>
           </w:tcPr>
           <w:p>
@@ -928,76 +1409,6 @@
                 <w:sz w:val="16"/>
                 <w:szCs w:val="16"/>
               </w:rPr>
-              <w:t xml:space="preserve">Ceil.</w:t>
-            </w:r>
-          </w:p>
-        </w:tc>
-        <w:tc>
-          <w:tcPr>
-            <w:tcW w:type="dxa" w:w="560"/>
-            <w:tcBorders>
-              <w:top w:val="single" w:color="000000" w:sz="4"/>
-              <w:left w:val="none" w:color="FFFFFF" w:sz="0"/>
-              <w:bottom w:val="single" w:color="000000" w:sz="4"/>
-              <w:right w:val="none" w:color="FFFFFF" w:sz="0"/>
-            </w:tcBorders>
-            <w:tcMar>
-              <w:top w:type="dxa" w:w="30"/>
-              <w:left w:type="dxa" w:w="50"/>
-              <w:bottom w:type="dxa" w:w="30"/>
-              <w:right w:type="dxa" w:w="50"/>
-            </w:tcMar>
-          </w:tcPr>
-          <w:p>
-            <w:pPr>
-              <w:jc w:val="center"/>
-            </w:pPr>
-            <w:r>
-              <w:rPr>
-                <w:rFonts w:ascii="Times New Roman" w:cs="Times New Roman" w:eastAsia="Times New Roman" w:hAnsi="Times New Roman"/>
-                <w:b/>
-                <w:bCs/>
-                <w:i w:val="false"/>
-                <w:iCs w:val="false"/>
-                <w:smallCaps w:val="false"/>
-                <w:sz w:val="16"/>
-                <w:szCs w:val="16"/>
-              </w:rPr>
-              <w:t xml:space="preserve">Gap rec.</w:t>
-            </w:r>
-          </w:p>
-        </w:tc>
-        <w:tc>
-          <w:tcPr>
-            <w:tcW w:type="dxa" w:w="520"/>
-            <w:tcBorders>
-              <w:top w:val="single" w:color="000000" w:sz="4"/>
-              <w:left w:val="none" w:color="FFFFFF" w:sz="0"/>
-              <w:bottom w:val="single" w:color="000000" w:sz="4"/>
-              <w:right w:val="none" w:color="FFFFFF" w:sz="0"/>
-            </w:tcBorders>
-            <w:tcMar>
-              <w:top w:type="dxa" w:w="30"/>
-              <w:left w:type="dxa" w:w="50"/>
-              <w:bottom w:type="dxa" w:w="30"/>
-              <w:right w:type="dxa" w:w="50"/>
-            </w:tcMar>
-          </w:tcPr>
-          <w:p>
-            <w:pPr>
-              <w:jc w:val="center"/>
-            </w:pPr>
-            <w:r>
-              <w:rPr>
-                <w:rFonts w:ascii="Times New Roman" w:cs="Times New Roman" w:eastAsia="Times New Roman" w:hAnsi="Times New Roman"/>
-                <w:b/>
-                <w:bCs/>
-                <w:i w:val="false"/>
-                <w:iCs w:val="false"/>
-                <w:smallCaps w:val="false"/>
-                <w:sz w:val="16"/>
-                <w:szCs w:val="16"/>
-              </w:rPr>
               <w:t xml:space="preserve">p</w:t>
             </w:r>
           </w:p>
@@ -1010,14 +1421,14 @@
             <w:tcBorders>
               <w:top w:val="none" w:color="FFFFFF" w:sz="0"/>
               <w:left w:val="none" w:color="FFFFFF" w:sz="0"/>
-              <w:bottom w:val="single" w:color="000000" w:sz="4"/>
-              <w:right w:val="none" w:color="FFFFFF" w:sz="0"/>
-            </w:tcBorders>
-            <w:tcMar>
-              <w:top w:type="dxa" w:w="30"/>
-              <w:left w:type="dxa" w:w="50"/>
-              <w:bottom w:type="dxa" w:w="30"/>
-              <w:right w:type="dxa" w:w="50"/>
+              <w:bottom w:val="none" w:color="FFFFFF" w:sz="0"/>
+              <w:right w:val="none" w:color="FFFFFF" w:sz="0"/>
+            </w:tcBorders>
+            <w:tcMar>
+              <w:top w:type="dxa" w:w="25"/>
+              <w:left w:type="dxa" w:w="40"/>
+              <w:bottom w:type="dxa" w:w="25"/>
+              <w:right w:type="dxa" w:w="40"/>
             </w:tcMar>
           </w:tcPr>
           <w:p>
@@ -1035,24 +1446,24 @@
                 <w:sz w:val="16"/>
                 <w:szCs w:val="16"/>
               </w:rPr>
-              <w:t xml:space="preserve">Intent recovered (all)</w:t>
-            </w:r>
-          </w:p>
-        </w:tc>
-        <w:tc>
-          <w:tcPr>
-            <w:tcW w:type="dxa" w:w="330"/>
+              <w:t xml:space="preserve">Intent, all</w:t>
+            </w:r>
+          </w:p>
+        </w:tc>
+        <w:tc>
+          <w:tcPr>
+            <w:tcW w:type="dxa" w:w="760"/>
             <w:tcBorders>
               <w:top w:val="none" w:color="FFFFFF" w:sz="0"/>
               <w:left w:val="none" w:color="FFFFFF" w:sz="0"/>
-              <w:bottom w:val="single" w:color="000000" w:sz="4"/>
-              <w:right w:val="none" w:color="FFFFFF" w:sz="0"/>
-            </w:tcBorders>
-            <w:tcMar>
-              <w:top w:type="dxa" w:w="30"/>
-              <w:left w:type="dxa" w:w="50"/>
-              <w:bottom w:type="dxa" w:w="30"/>
-              <w:right w:type="dxa" w:w="50"/>
+              <w:bottom w:val="none" w:color="FFFFFF" w:sz="0"/>
+              <w:right w:val="none" w:color="FFFFFF" w:sz="0"/>
+            </w:tcBorders>
+            <w:tcMar>
+              <w:top w:type="dxa" w:w="25"/>
+              <w:left w:type="dxa" w:w="40"/>
+              <w:bottom w:type="dxa" w:w="25"/>
+              <w:right w:type="dxa" w:w="40"/>
             </w:tcMar>
           </w:tcPr>
           <w:p>
@@ -1070,24 +1481,24 @@
                 <w:sz w:val="16"/>
                 <w:szCs w:val="16"/>
               </w:rPr>
-              <w:t xml:space="preserve">36</w:t>
-            </w:r>
-          </w:p>
-        </w:tc>
-        <w:tc>
-          <w:tcPr>
-            <w:tcW w:type="dxa" w:w="520"/>
+              <w:t xml:space="preserve">29/36</w:t>
+            </w:r>
+          </w:p>
+        </w:tc>
+        <w:tc>
+          <w:tcPr>
+            <w:tcW w:type="dxa" w:w="760"/>
             <w:tcBorders>
               <w:top w:val="none" w:color="FFFFFF" w:sz="0"/>
               <w:left w:val="none" w:color="FFFFFF" w:sz="0"/>
-              <w:bottom w:val="single" w:color="000000" w:sz="4"/>
-              <w:right w:val="none" w:color="FFFFFF" w:sz="0"/>
-            </w:tcBorders>
-            <w:tcMar>
-              <w:top w:type="dxa" w:w="30"/>
-              <w:left w:type="dxa" w:w="50"/>
-              <w:bottom w:type="dxa" w:w="30"/>
-              <w:right w:type="dxa" w:w="50"/>
+              <w:bottom w:val="none" w:color="FFFFFF" w:sz="0"/>
+              <w:right w:val="none" w:color="FFFFFF" w:sz="0"/>
+            </w:tcBorders>
+            <w:tcMar>
+              <w:top w:type="dxa" w:w="25"/>
+              <w:left w:type="dxa" w:w="40"/>
+              <w:bottom w:type="dxa" w:w="25"/>
+              <w:right w:type="dxa" w:w="40"/>
             </w:tcMar>
           </w:tcPr>
           <w:p>
@@ -1105,24 +1516,24 @@
                 <w:sz w:val="16"/>
                 <w:szCs w:val="16"/>
               </w:rPr>
-              <w:t xml:space="preserve">81%</w:t>
-            </w:r>
-          </w:p>
-        </w:tc>
-        <w:tc>
-          <w:tcPr>
-            <w:tcW w:type="dxa" w:w="520"/>
+              <w:t xml:space="preserve">30/36</w:t>
+            </w:r>
+          </w:p>
+        </w:tc>
+        <w:tc>
+          <w:tcPr>
+            <w:tcW w:type="dxa" w:w="760"/>
             <w:tcBorders>
               <w:top w:val="none" w:color="FFFFFF" w:sz="0"/>
               <w:left w:val="none" w:color="FFFFFF" w:sz="0"/>
-              <w:bottom w:val="single" w:color="000000" w:sz="4"/>
-              <w:right w:val="none" w:color="FFFFFF" w:sz="0"/>
-            </w:tcBorders>
-            <w:tcMar>
-              <w:top w:type="dxa" w:w="30"/>
-              <w:left w:type="dxa" w:w="50"/>
-              <w:bottom w:type="dxa" w:w="30"/>
-              <w:right w:type="dxa" w:w="50"/>
+              <w:bottom w:val="none" w:color="FFFFFF" w:sz="0"/>
+              <w:right w:val="none" w:color="FFFFFF" w:sz="0"/>
+            </w:tcBorders>
+            <w:tcMar>
+              <w:top w:type="dxa" w:w="25"/>
+              <w:left w:type="dxa" w:w="40"/>
+              <w:bottom w:type="dxa" w:w="25"/>
+              <w:right w:type="dxa" w:w="40"/>
             </w:tcMar>
           </w:tcPr>
           <w:p>
@@ -1140,24 +1551,24 @@
                 <w:sz w:val="16"/>
                 <w:szCs w:val="16"/>
               </w:rPr>
-              <w:t xml:space="preserve">83%</w:t>
-            </w:r>
-          </w:p>
-        </w:tc>
-        <w:tc>
-          <w:tcPr>
-            <w:tcW w:type="dxa" w:w="520"/>
+              <w:t xml:space="preserve">35/36</w:t>
+            </w:r>
+          </w:p>
+        </w:tc>
+        <w:tc>
+          <w:tcPr>
+            <w:tcW w:type="dxa" w:w="560"/>
             <w:tcBorders>
               <w:top w:val="none" w:color="FFFFFF" w:sz="0"/>
               <w:left w:val="none" w:color="FFFFFF" w:sz="0"/>
-              <w:bottom w:val="single" w:color="000000" w:sz="4"/>
-              <w:right w:val="none" w:color="FFFFFF" w:sz="0"/>
-            </w:tcBorders>
-            <w:tcMar>
-              <w:top w:type="dxa" w:w="30"/>
-              <w:left w:type="dxa" w:w="50"/>
-              <w:bottom w:type="dxa" w:w="30"/>
-              <w:right w:type="dxa" w:w="50"/>
+              <w:bottom w:val="none" w:color="FFFFFF" w:sz="0"/>
+              <w:right w:val="none" w:color="FFFFFF" w:sz="0"/>
+            </w:tcBorders>
+            <w:tcMar>
+              <w:top w:type="dxa" w:w="25"/>
+              <w:left w:type="dxa" w:w="40"/>
+              <w:bottom w:type="dxa" w:w="25"/>
+              <w:right w:type="dxa" w:w="40"/>
             </w:tcMar>
           </w:tcPr>
           <w:p>
@@ -1175,29 +1586,31 @@
                 <w:sz w:val="16"/>
                 <w:szCs w:val="16"/>
               </w:rPr>
-              <w:t xml:space="preserve">97%</w:t>
-            </w:r>
-          </w:p>
-        </w:tc>
-        <w:tc>
-          <w:tcPr>
-            <w:tcW w:type="dxa" w:w="560"/>
+              <w:t xml:space="preserve">1.00</w:t>
+            </w:r>
+          </w:p>
+        </w:tc>
+      </w:tr>
+      <w:tr>
+        <w:tc>
+          <w:tcPr>
+            <w:tcW w:type="dxa" w:w="1500"/>
             <w:tcBorders>
               <w:top w:val="none" w:color="FFFFFF" w:sz="0"/>
               <w:left w:val="none" w:color="FFFFFF" w:sz="0"/>
-              <w:bottom w:val="single" w:color="000000" w:sz="4"/>
-              <w:right w:val="none" w:color="FFFFFF" w:sz="0"/>
-            </w:tcBorders>
-            <w:tcMar>
-              <w:top w:type="dxa" w:w="30"/>
-              <w:left w:type="dxa" w:w="50"/>
-              <w:bottom w:type="dxa" w:w="30"/>
-              <w:right w:type="dxa" w:w="50"/>
-            </w:tcMar>
-          </w:tcPr>
-          <w:p>
-            <w:pPr>
-              <w:jc w:val="center"/>
+              <w:bottom w:val="none" w:color="FFFFFF" w:sz="0"/>
+              <w:right w:val="none" w:color="FFFFFF" w:sz="0"/>
+            </w:tcBorders>
+            <w:tcMar>
+              <w:top w:type="dxa" w:w="25"/>
+              <w:left w:type="dxa" w:w="40"/>
+              <w:bottom w:type="dxa" w:w="25"/>
+              <w:right w:type="dxa" w:w="40"/>
+            </w:tcMar>
+          </w:tcPr>
+          <w:p>
+            <w:pPr>
+              <w:jc w:val="left"/>
             </w:pPr>
             <w:r>
               <w:rPr>
@@ -1210,24 +1623,24 @@
                 <w:sz w:val="16"/>
                 <w:szCs w:val="16"/>
               </w:rPr>
-              <w:t xml:space="preserve">0.17</w:t>
-            </w:r>
-          </w:p>
-        </w:tc>
-        <w:tc>
-          <w:tcPr>
-            <w:tcW w:type="dxa" w:w="520"/>
+              <w:t xml:space="preserve">Intent, golden</w:t>
+            </w:r>
+          </w:p>
+        </w:tc>
+        <w:tc>
+          <w:tcPr>
+            <w:tcW w:type="dxa" w:w="760"/>
             <w:tcBorders>
               <w:top w:val="none" w:color="FFFFFF" w:sz="0"/>
               <w:left w:val="none" w:color="FFFFFF" w:sz="0"/>
-              <w:bottom w:val="single" w:color="000000" w:sz="4"/>
-              <w:right w:val="none" w:color="FFFFFF" w:sz="0"/>
-            </w:tcBorders>
-            <w:tcMar>
-              <w:top w:type="dxa" w:w="30"/>
-              <w:left w:type="dxa" w:w="50"/>
-              <w:bottom w:type="dxa" w:w="30"/>
-              <w:right w:type="dxa" w:w="50"/>
+              <w:bottom w:val="none" w:color="FFFFFF" w:sz="0"/>
+              <w:right w:val="none" w:color="FFFFFF" w:sz="0"/>
+            </w:tcBorders>
+            <w:tcMar>
+              <w:top w:type="dxa" w:w="25"/>
+              <w:left w:type="dxa" w:w="40"/>
+              <w:bottom w:type="dxa" w:w="25"/>
+              <w:right w:type="dxa" w:w="40"/>
             </w:tcMar>
           </w:tcPr>
           <w:p>
@@ -1245,7 +1658,112 @@
                 <w:sz w:val="16"/>
                 <w:szCs w:val="16"/>
               </w:rPr>
-              <w:t xml:space="preserve">1.000</w:t>
+              <w:t xml:space="preserve">19/24</w:t>
+            </w:r>
+          </w:p>
+        </w:tc>
+        <w:tc>
+          <w:tcPr>
+            <w:tcW w:type="dxa" w:w="760"/>
+            <w:tcBorders>
+              <w:top w:val="none" w:color="FFFFFF" w:sz="0"/>
+              <w:left w:val="none" w:color="FFFFFF" w:sz="0"/>
+              <w:bottom w:val="none" w:color="FFFFFF" w:sz="0"/>
+              <w:right w:val="none" w:color="FFFFFF" w:sz="0"/>
+            </w:tcBorders>
+            <w:tcMar>
+              <w:top w:type="dxa" w:w="25"/>
+              <w:left w:type="dxa" w:w="40"/>
+              <w:bottom w:type="dxa" w:w="25"/>
+              <w:right w:type="dxa" w:w="40"/>
+            </w:tcMar>
+          </w:tcPr>
+          <w:p>
+            <w:pPr>
+              <w:jc w:val="center"/>
+            </w:pPr>
+            <w:r>
+              <w:rPr>
+                <w:rFonts w:ascii="Times New Roman" w:cs="Times New Roman" w:eastAsia="Times New Roman" w:hAnsi="Times New Roman"/>
+                <w:b w:val="false"/>
+                <w:bCs w:val="false"/>
+                <w:i w:val="false"/>
+                <w:iCs w:val="false"/>
+                <w:smallCaps w:val="false"/>
+                <w:sz w:val="16"/>
+                <w:szCs w:val="16"/>
+              </w:rPr>
+              <w:t xml:space="preserve">20/24</w:t>
+            </w:r>
+          </w:p>
+        </w:tc>
+        <w:tc>
+          <w:tcPr>
+            <w:tcW w:type="dxa" w:w="760"/>
+            <w:tcBorders>
+              <w:top w:val="none" w:color="FFFFFF" w:sz="0"/>
+              <w:left w:val="none" w:color="FFFFFF" w:sz="0"/>
+              <w:bottom w:val="none" w:color="FFFFFF" w:sz="0"/>
+              <w:right w:val="none" w:color="FFFFFF" w:sz="0"/>
+            </w:tcBorders>
+            <w:tcMar>
+              <w:top w:type="dxa" w:w="25"/>
+              <w:left w:type="dxa" w:w="40"/>
+              <w:bottom w:type="dxa" w:w="25"/>
+              <w:right w:type="dxa" w:w="40"/>
+            </w:tcMar>
+          </w:tcPr>
+          <w:p>
+            <w:pPr>
+              <w:jc w:val="center"/>
+            </w:pPr>
+            <w:r>
+              <w:rPr>
+                <w:rFonts w:ascii="Times New Roman" w:cs="Times New Roman" w:eastAsia="Times New Roman" w:hAnsi="Times New Roman"/>
+                <w:b w:val="false"/>
+                <w:bCs w:val="false"/>
+                <w:i w:val="false"/>
+                <w:iCs w:val="false"/>
+                <w:smallCaps w:val="false"/>
+                <w:sz w:val="16"/>
+                <w:szCs w:val="16"/>
+              </w:rPr>
+              <w:t xml:space="preserve">24/24</w:t>
+            </w:r>
+          </w:p>
+        </w:tc>
+        <w:tc>
+          <w:tcPr>
+            <w:tcW w:type="dxa" w:w="560"/>
+            <w:tcBorders>
+              <w:top w:val="none" w:color="FFFFFF" w:sz="0"/>
+              <w:left w:val="none" w:color="FFFFFF" w:sz="0"/>
+              <w:bottom w:val="none" w:color="FFFFFF" w:sz="0"/>
+              <w:right w:val="none" w:color="FFFFFF" w:sz="0"/>
+            </w:tcBorders>
+            <w:tcMar>
+              <w:top w:type="dxa" w:w="25"/>
+              <w:left w:type="dxa" w:w="40"/>
+              <w:bottom w:type="dxa" w:w="25"/>
+              <w:right w:type="dxa" w:w="40"/>
+            </w:tcMar>
+          </w:tcPr>
+          <w:p>
+            <w:pPr>
+              <w:jc w:val="center"/>
+            </w:pPr>
+            <w:r>
+              <w:rPr>
+                <w:rFonts w:ascii="Times New Roman" w:cs="Times New Roman" w:eastAsia="Times New Roman" w:hAnsi="Times New Roman"/>
+                <w:b w:val="false"/>
+                <w:bCs w:val="false"/>
+                <w:i w:val="false"/>
+                <w:iCs w:val="false"/>
+                <w:smallCaps w:val="false"/>
+                <w:sz w:val="16"/>
+                <w:szCs w:val="16"/>
+              </w:rPr>
+              <w:t xml:space="preserve">1.00</w:t>
             </w:r>
           </w:p>
         </w:tc>
@@ -1257,14 +1775,14 @@
             <w:tcBorders>
               <w:top w:val="none" w:color="FFFFFF" w:sz="0"/>
               <w:left w:val="none" w:color="FFFFFF" w:sz="0"/>
-              <w:bottom w:val="single" w:color="000000" w:sz="4"/>
-              <w:right w:val="none" w:color="FFFFFF" w:sz="0"/>
-            </w:tcBorders>
-            <w:tcMar>
-              <w:top w:type="dxa" w:w="30"/>
-              <w:left w:type="dxa" w:w="50"/>
-              <w:bottom w:type="dxa" w:w="30"/>
-              <w:right w:type="dxa" w:w="50"/>
+              <w:bottom w:val="none" w:color="FFFFFF" w:sz="0"/>
+              <w:right w:val="none" w:color="FFFFFF" w:sz="0"/>
+            </w:tcBorders>
+            <w:tcMar>
+              <w:top w:type="dxa" w:w="25"/>
+              <w:left w:type="dxa" w:w="40"/>
+              <w:bottom w:type="dxa" w:w="25"/>
+              <w:right w:type="dxa" w:w="40"/>
             </w:tcMar>
           </w:tcPr>
           <w:p>
@@ -1282,24 +1800,24 @@
                 <w:sz w:val="16"/>
                 <w:szCs w:val="16"/>
               </w:rPr>
-              <w:t xml:space="preserve">Intent recovered (golden)</w:t>
-            </w:r>
-          </w:p>
-        </w:tc>
-        <w:tc>
-          <w:tcPr>
-            <w:tcW w:type="dxa" w:w="330"/>
+              <w:t xml:space="preserve">Intent, mutant</w:t>
+            </w:r>
+          </w:p>
+        </w:tc>
+        <w:tc>
+          <w:tcPr>
+            <w:tcW w:type="dxa" w:w="760"/>
             <w:tcBorders>
               <w:top w:val="none" w:color="FFFFFF" w:sz="0"/>
               <w:left w:val="none" w:color="FFFFFF" w:sz="0"/>
-              <w:bottom w:val="single" w:color="000000" w:sz="4"/>
-              <w:right w:val="none" w:color="FFFFFF" w:sz="0"/>
-            </w:tcBorders>
-            <w:tcMar>
-              <w:top w:type="dxa" w:w="30"/>
-              <w:left w:type="dxa" w:w="50"/>
-              <w:bottom w:type="dxa" w:w="30"/>
-              <w:right w:type="dxa" w:w="50"/>
+              <w:bottom w:val="none" w:color="FFFFFF" w:sz="0"/>
+              <w:right w:val="none" w:color="FFFFFF" w:sz="0"/>
+            </w:tcBorders>
+            <w:tcMar>
+              <w:top w:type="dxa" w:w="25"/>
+              <w:left w:type="dxa" w:w="40"/>
+              <w:bottom w:type="dxa" w:w="25"/>
+              <w:right w:type="dxa" w:w="40"/>
             </w:tcMar>
           </w:tcPr>
           <w:p>
@@ -1317,24 +1835,24 @@
                 <w:sz w:val="16"/>
                 <w:szCs w:val="16"/>
               </w:rPr>
-              <w:t xml:space="preserve">24</w:t>
-            </w:r>
-          </w:p>
-        </w:tc>
-        <w:tc>
-          <w:tcPr>
-            <w:tcW w:type="dxa" w:w="520"/>
+              <w:t xml:space="preserve">10/12</w:t>
+            </w:r>
+          </w:p>
+        </w:tc>
+        <w:tc>
+          <w:tcPr>
+            <w:tcW w:type="dxa" w:w="760"/>
             <w:tcBorders>
               <w:top w:val="none" w:color="FFFFFF" w:sz="0"/>
               <w:left w:val="none" w:color="FFFFFF" w:sz="0"/>
-              <w:bottom w:val="single" w:color="000000" w:sz="4"/>
-              <w:right w:val="none" w:color="FFFFFF" w:sz="0"/>
-            </w:tcBorders>
-            <w:tcMar>
-              <w:top w:type="dxa" w:w="30"/>
-              <w:left w:type="dxa" w:w="50"/>
-              <w:bottom w:type="dxa" w:w="30"/>
-              <w:right w:type="dxa" w:w="50"/>
+              <w:bottom w:val="none" w:color="FFFFFF" w:sz="0"/>
+              <w:right w:val="none" w:color="FFFFFF" w:sz="0"/>
+            </w:tcBorders>
+            <w:tcMar>
+              <w:top w:type="dxa" w:w="25"/>
+              <w:left w:type="dxa" w:w="40"/>
+              <w:bottom w:type="dxa" w:w="25"/>
+              <w:right w:type="dxa" w:w="40"/>
             </w:tcMar>
           </w:tcPr>
           <w:p>
@@ -1352,24 +1870,24 @@
                 <w:sz w:val="16"/>
                 <w:szCs w:val="16"/>
               </w:rPr>
-              <w:t xml:space="preserve">79%</w:t>
-            </w:r>
-          </w:p>
-        </w:tc>
-        <w:tc>
-          <w:tcPr>
-            <w:tcW w:type="dxa" w:w="520"/>
+              <w:t xml:space="preserve">10/12</w:t>
+            </w:r>
+          </w:p>
+        </w:tc>
+        <w:tc>
+          <w:tcPr>
+            <w:tcW w:type="dxa" w:w="760"/>
             <w:tcBorders>
               <w:top w:val="none" w:color="FFFFFF" w:sz="0"/>
               <w:left w:val="none" w:color="FFFFFF" w:sz="0"/>
-              <w:bottom w:val="single" w:color="000000" w:sz="4"/>
-              <w:right w:val="none" w:color="FFFFFF" w:sz="0"/>
-            </w:tcBorders>
-            <w:tcMar>
-              <w:top w:type="dxa" w:w="30"/>
-              <w:left w:type="dxa" w:w="50"/>
-              <w:bottom w:type="dxa" w:w="30"/>
-              <w:right w:type="dxa" w:w="50"/>
+              <w:bottom w:val="none" w:color="FFFFFF" w:sz="0"/>
+              <w:right w:val="none" w:color="FFFFFF" w:sz="0"/>
+            </w:tcBorders>
+            <w:tcMar>
+              <w:top w:type="dxa" w:w="25"/>
+              <w:left w:type="dxa" w:w="40"/>
+              <w:bottom w:type="dxa" w:w="25"/>
+              <w:right w:type="dxa" w:w="40"/>
             </w:tcMar>
           </w:tcPr>
           <w:p>
@@ -1387,24 +1905,24 @@
                 <w:sz w:val="16"/>
                 <w:szCs w:val="16"/>
               </w:rPr>
-              <w:t xml:space="preserve">83%</w:t>
-            </w:r>
-          </w:p>
-        </w:tc>
-        <w:tc>
-          <w:tcPr>
-            <w:tcW w:type="dxa" w:w="520"/>
+              <w:t xml:space="preserve">11/12</w:t>
+            </w:r>
+          </w:p>
+        </w:tc>
+        <w:tc>
+          <w:tcPr>
+            <w:tcW w:type="dxa" w:w="560"/>
             <w:tcBorders>
               <w:top w:val="none" w:color="FFFFFF" w:sz="0"/>
               <w:left w:val="none" w:color="FFFFFF" w:sz="0"/>
-              <w:bottom w:val="single" w:color="000000" w:sz="4"/>
-              <w:right w:val="none" w:color="FFFFFF" w:sz="0"/>
-            </w:tcBorders>
-            <w:tcMar>
-              <w:top w:type="dxa" w:w="30"/>
-              <w:left w:type="dxa" w:w="50"/>
-              <w:bottom w:type="dxa" w:w="30"/>
-              <w:right w:type="dxa" w:w="50"/>
+              <w:bottom w:val="none" w:color="FFFFFF" w:sz="0"/>
+              <w:right w:val="none" w:color="FFFFFF" w:sz="0"/>
+            </w:tcBorders>
+            <w:tcMar>
+              <w:top w:type="dxa" w:w="25"/>
+              <w:left w:type="dxa" w:w="40"/>
+              <w:bottom w:type="dxa" w:w="25"/>
+              <w:right w:type="dxa" w:w="40"/>
             </w:tcMar>
           </w:tcPr>
           <w:p>
@@ -1422,29 +1940,31 @@
                 <w:sz w:val="16"/>
                 <w:szCs w:val="16"/>
               </w:rPr>
-              <w:t xml:space="preserve">100%</w:t>
-            </w:r>
-          </w:p>
-        </w:tc>
-        <w:tc>
-          <w:tcPr>
-            <w:tcW w:type="dxa" w:w="560"/>
+              <w:t xml:space="preserve">1.00</w:t>
+            </w:r>
+          </w:p>
+        </w:tc>
+      </w:tr>
+      <w:tr>
+        <w:tc>
+          <w:tcPr>
+            <w:tcW w:type="dxa" w:w="1500"/>
             <w:tcBorders>
               <w:top w:val="none" w:color="FFFFFF" w:sz="0"/>
               <w:left w:val="none" w:color="FFFFFF" w:sz="0"/>
-              <w:bottom w:val="single" w:color="000000" w:sz="4"/>
-              <w:right w:val="none" w:color="FFFFFF" w:sz="0"/>
-            </w:tcBorders>
-            <w:tcMar>
-              <w:top w:type="dxa" w:w="30"/>
-              <w:left w:type="dxa" w:w="50"/>
-              <w:bottom w:type="dxa" w:w="30"/>
-              <w:right w:type="dxa" w:w="50"/>
-            </w:tcMar>
-          </w:tcPr>
-          <w:p>
-            <w:pPr>
-              <w:jc w:val="center"/>
+              <w:bottom w:val="none" w:color="FFFFFF" w:sz="0"/>
+              <w:right w:val="none" w:color="FFFFFF" w:sz="0"/>
+            </w:tcBorders>
+            <w:tcMar>
+              <w:top w:type="dxa" w:w="25"/>
+              <w:left w:type="dxa" w:w="40"/>
+              <w:bottom w:type="dxa" w:w="25"/>
+              <w:right w:type="dxa" w:w="40"/>
+            </w:tcMar>
+          </w:tcPr>
+          <w:p>
+            <w:pPr>
+              <w:jc w:val="left"/>
             </w:pPr>
             <w:r>
               <w:rPr>
@@ -1457,24 +1977,24 @@
                 <w:sz w:val="16"/>
                 <w:szCs w:val="16"/>
               </w:rPr>
-              <w:t xml:space="preserve">0.20</w:t>
-            </w:r>
-          </w:p>
-        </w:tc>
-        <w:tc>
-          <w:tcPr>
-            <w:tcW w:type="dxa" w:w="520"/>
+              <w:t xml:space="preserve">Defect caught</w:t>
+            </w:r>
+          </w:p>
+        </w:tc>
+        <w:tc>
+          <w:tcPr>
+            <w:tcW w:type="dxa" w:w="760"/>
             <w:tcBorders>
               <w:top w:val="none" w:color="FFFFFF" w:sz="0"/>
               <w:left w:val="none" w:color="FFFFFF" w:sz="0"/>
-              <w:bottom w:val="single" w:color="000000" w:sz="4"/>
-              <w:right w:val="none" w:color="FFFFFF" w:sz="0"/>
-            </w:tcBorders>
-            <w:tcMar>
-              <w:top w:type="dxa" w:w="30"/>
-              <w:left w:type="dxa" w:w="50"/>
-              <w:bottom w:type="dxa" w:w="30"/>
-              <w:right w:type="dxa" w:w="50"/>
+              <w:bottom w:val="none" w:color="FFFFFF" w:sz="0"/>
+              <w:right w:val="none" w:color="FFFFFF" w:sz="0"/>
+            </w:tcBorders>
+            <w:tcMar>
+              <w:top w:type="dxa" w:w="25"/>
+              <w:left w:type="dxa" w:w="40"/>
+              <w:bottom w:type="dxa" w:w="25"/>
+              <w:right w:type="dxa" w:w="40"/>
             </w:tcMar>
           </w:tcPr>
           <w:p>
@@ -1492,7 +2012,112 @@
                 <w:sz w:val="16"/>
                 <w:szCs w:val="16"/>
               </w:rPr>
-              <w:t xml:space="preserve">1.000</w:t>
+              <w:t xml:space="preserve">2/12</w:t>
+            </w:r>
+          </w:p>
+        </w:tc>
+        <w:tc>
+          <w:tcPr>
+            <w:tcW w:type="dxa" w:w="760"/>
+            <w:tcBorders>
+              <w:top w:val="none" w:color="FFFFFF" w:sz="0"/>
+              <w:left w:val="none" w:color="FFFFFF" w:sz="0"/>
+              <w:bottom w:val="none" w:color="FFFFFF" w:sz="0"/>
+              <w:right w:val="none" w:color="FFFFFF" w:sz="0"/>
+            </w:tcBorders>
+            <w:tcMar>
+              <w:top w:type="dxa" w:w="25"/>
+              <w:left w:type="dxa" w:w="40"/>
+              <w:bottom w:type="dxa" w:w="25"/>
+              <w:right w:type="dxa" w:w="40"/>
+            </w:tcMar>
+          </w:tcPr>
+          <w:p>
+            <w:pPr>
+              <w:jc w:val="center"/>
+            </w:pPr>
+            <w:r>
+              <w:rPr>
+                <w:rFonts w:ascii="Times New Roman" w:cs="Times New Roman" w:eastAsia="Times New Roman" w:hAnsi="Times New Roman"/>
+                <w:b w:val="false"/>
+                <w:bCs w:val="false"/>
+                <w:i w:val="false"/>
+                <w:iCs w:val="false"/>
+                <w:smallCaps w:val="false"/>
+                <w:sz w:val="16"/>
+                <w:szCs w:val="16"/>
+              </w:rPr>
+              <w:t xml:space="preserve">2/12</w:t>
+            </w:r>
+          </w:p>
+        </w:tc>
+        <w:tc>
+          <w:tcPr>
+            <w:tcW w:type="dxa" w:w="760"/>
+            <w:tcBorders>
+              <w:top w:val="none" w:color="FFFFFF" w:sz="0"/>
+              <w:left w:val="none" w:color="FFFFFF" w:sz="0"/>
+              <w:bottom w:val="none" w:color="FFFFFF" w:sz="0"/>
+              <w:right w:val="none" w:color="FFFFFF" w:sz="0"/>
+            </w:tcBorders>
+            <w:tcMar>
+              <w:top w:type="dxa" w:w="25"/>
+              <w:left w:type="dxa" w:w="40"/>
+              <w:bottom w:type="dxa" w:w="25"/>
+              <w:right w:type="dxa" w:w="40"/>
+            </w:tcMar>
+          </w:tcPr>
+          <w:p>
+            <w:pPr>
+              <w:jc w:val="center"/>
+            </w:pPr>
+            <w:r>
+              <w:rPr>
+                <w:rFonts w:ascii="Times New Roman" w:cs="Times New Roman" w:eastAsia="Times New Roman" w:hAnsi="Times New Roman"/>
+                <w:b w:val="false"/>
+                <w:bCs w:val="false"/>
+                <w:i w:val="false"/>
+                <w:iCs w:val="false"/>
+                <w:smallCaps w:val="false"/>
+                <w:sz w:val="16"/>
+                <w:szCs w:val="16"/>
+              </w:rPr>
+              <w:t xml:space="preserve">1/12</w:t>
+            </w:r>
+          </w:p>
+        </w:tc>
+        <w:tc>
+          <w:tcPr>
+            <w:tcW w:type="dxa" w:w="560"/>
+            <w:tcBorders>
+              <w:top w:val="none" w:color="FFFFFF" w:sz="0"/>
+              <w:left w:val="none" w:color="FFFFFF" w:sz="0"/>
+              <w:bottom w:val="none" w:color="FFFFFF" w:sz="0"/>
+              <w:right w:val="none" w:color="FFFFFF" w:sz="0"/>
+            </w:tcBorders>
+            <w:tcMar>
+              <w:top w:type="dxa" w:w="25"/>
+              <w:left w:type="dxa" w:w="40"/>
+              <w:bottom w:type="dxa" w:w="25"/>
+              <w:right w:type="dxa" w:w="40"/>
+            </w:tcMar>
+          </w:tcPr>
+          <w:p>
+            <w:pPr>
+              <w:jc w:val="center"/>
+            </w:pPr>
+            <w:r>
+              <w:rPr>
+                <w:rFonts w:ascii="Times New Roman" w:cs="Times New Roman" w:eastAsia="Times New Roman" w:hAnsi="Times New Roman"/>
+                <w:b w:val="false"/>
+                <w:bCs w:val="false"/>
+                <w:i w:val="false"/>
+                <w:iCs w:val="false"/>
+                <w:smallCaps w:val="false"/>
+                <w:sz w:val="16"/>
+                <w:szCs w:val="16"/>
+              </w:rPr>
+              <w:t xml:space="preserve">1.00</w:t>
             </w:r>
           </w:p>
         </w:tc>
@@ -1508,10 +2133,10 @@
               <w:right w:val="none" w:color="FFFFFF" w:sz="0"/>
             </w:tcBorders>
             <w:tcMar>
-              <w:top w:type="dxa" w:w="30"/>
-              <w:left w:type="dxa" w:w="50"/>
-              <w:bottom w:type="dxa" w:w="30"/>
-              <w:right w:type="dxa" w:w="50"/>
+              <w:top w:type="dxa" w:w="25"/>
+              <w:left w:type="dxa" w:w="40"/>
+              <w:bottom w:type="dxa" w:w="25"/>
+              <w:right w:type="dxa" w:w="40"/>
             </w:tcMar>
           </w:tcPr>
           <w:p>
@@ -1529,13 +2154,13 @@
                 <w:sz w:val="16"/>
                 <w:szCs w:val="16"/>
               </w:rPr>
-              <w:t xml:space="preserve">Intent recovered (mutant)</w:t>
-            </w:r>
-          </w:p>
-        </w:tc>
-        <w:tc>
-          <w:tcPr>
-            <w:tcW w:type="dxa" w:w="330"/>
+              <w:t xml:space="preserve">False alarm</w:t>
+            </w:r>
+          </w:p>
+        </w:tc>
+        <w:tc>
+          <w:tcPr>
+            <w:tcW w:type="dxa" w:w="760"/>
             <w:tcBorders>
               <w:top w:val="none" w:color="FFFFFF" w:sz="0"/>
               <w:left w:val="none" w:color="FFFFFF" w:sz="0"/>
@@ -1543,10 +2168,10 @@
               <w:right w:val="none" w:color="FFFFFF" w:sz="0"/>
             </w:tcBorders>
             <w:tcMar>
-              <w:top w:type="dxa" w:w="30"/>
-              <w:left w:type="dxa" w:w="50"/>
-              <w:bottom w:type="dxa" w:w="30"/>
-              <w:right w:type="dxa" w:w="50"/>
+              <w:top w:type="dxa" w:w="25"/>
+              <w:left w:type="dxa" w:w="40"/>
+              <w:bottom w:type="dxa" w:w="25"/>
+              <w:right w:type="dxa" w:w="40"/>
             </w:tcMar>
           </w:tcPr>
           <w:p>
@@ -1564,13 +2189,13 @@
                 <w:sz w:val="16"/>
                 <w:szCs w:val="16"/>
               </w:rPr>
-              <w:t xml:space="preserve">12</w:t>
-            </w:r>
-          </w:p>
-        </w:tc>
-        <w:tc>
-          <w:tcPr>
-            <w:tcW w:type="dxa" w:w="520"/>
+              <w:t xml:space="preserve">2/24</w:t>
+            </w:r>
+          </w:p>
+        </w:tc>
+        <w:tc>
+          <w:tcPr>
+            <w:tcW w:type="dxa" w:w="760"/>
             <w:tcBorders>
               <w:top w:val="none" w:color="FFFFFF" w:sz="0"/>
               <w:left w:val="none" w:color="FFFFFF" w:sz="0"/>
@@ -1578,10 +2203,10 @@
               <w:right w:val="none" w:color="FFFFFF" w:sz="0"/>
             </w:tcBorders>
             <w:tcMar>
-              <w:top w:type="dxa" w:w="30"/>
-              <w:left w:type="dxa" w:w="50"/>
-              <w:bottom w:type="dxa" w:w="30"/>
-              <w:right w:type="dxa" w:w="50"/>
+              <w:top w:type="dxa" w:w="25"/>
+              <w:left w:type="dxa" w:w="40"/>
+              <w:bottom w:type="dxa" w:w="25"/>
+              <w:right w:type="dxa" w:w="40"/>
             </w:tcMar>
           </w:tcPr>
           <w:p>
@@ -1599,13 +2224,13 @@
                 <w:sz w:val="16"/>
                 <w:szCs w:val="16"/>
               </w:rPr>
-              <w:t xml:space="preserve">83%</w:t>
-            </w:r>
-          </w:p>
-        </w:tc>
-        <w:tc>
-          <w:tcPr>
-            <w:tcW w:type="dxa" w:w="520"/>
+              <w:t xml:space="preserve">2/24</w:t>
+            </w:r>
+          </w:p>
+        </w:tc>
+        <w:tc>
+          <w:tcPr>
+            <w:tcW w:type="dxa" w:w="760"/>
             <w:tcBorders>
               <w:top w:val="none" w:color="FFFFFF" w:sz="0"/>
               <w:left w:val="none" w:color="FFFFFF" w:sz="0"/>
@@ -1613,10 +2238,10 @@
               <w:right w:val="none" w:color="FFFFFF" w:sz="0"/>
             </w:tcBorders>
             <w:tcMar>
-              <w:top w:type="dxa" w:w="30"/>
-              <w:left w:type="dxa" w:w="50"/>
-              <w:bottom w:type="dxa" w:w="30"/>
-              <w:right w:type="dxa" w:w="50"/>
+              <w:top w:type="dxa" w:w="25"/>
+              <w:left w:type="dxa" w:w="40"/>
+              <w:bottom w:type="dxa" w:w="25"/>
+              <w:right w:type="dxa" w:w="40"/>
             </w:tcMar>
           </w:tcPr>
           <w:p>
@@ -1634,13 +2259,13 @@
                 <w:sz w:val="16"/>
                 <w:szCs w:val="16"/>
               </w:rPr>
-              <w:t xml:space="preserve">83%</w:t>
-            </w:r>
-          </w:p>
-        </w:tc>
-        <w:tc>
-          <w:tcPr>
-            <w:tcW w:type="dxa" w:w="520"/>
+              <w:t xml:space="preserve">1/24</w:t>
+            </w:r>
+          </w:p>
+        </w:tc>
+        <w:tc>
+          <w:tcPr>
+            <w:tcW w:type="dxa" w:w="560"/>
             <w:tcBorders>
               <w:top w:val="none" w:color="FFFFFF" w:sz="0"/>
               <w:left w:val="none" w:color="FFFFFF" w:sz="0"/>
@@ -1648,10 +2273,10 @@
               <w:right w:val="none" w:color="FFFFFF" w:sz="0"/>
             </w:tcBorders>
             <w:tcMar>
-              <w:top w:type="dxa" w:w="30"/>
-              <w:left w:type="dxa" w:w="50"/>
-              <w:bottom w:type="dxa" w:w="30"/>
-              <w:right w:type="dxa" w:w="50"/>
+              <w:top w:type="dxa" w:w="25"/>
+              <w:left w:type="dxa" w:w="40"/>
+              <w:bottom w:type="dxa" w:w="25"/>
+              <w:right w:type="dxa" w:w="40"/>
             </w:tcMar>
           </w:tcPr>
           <w:p>
@@ -1669,571 +2294,7 @@
                 <w:sz w:val="16"/>
                 <w:szCs w:val="16"/>
               </w:rPr>
-              <w:t xml:space="preserve">92%</w:t>
-            </w:r>
-          </w:p>
-        </w:tc>
-        <w:tc>
-          <w:tcPr>
-            <w:tcW w:type="dxa" w:w="560"/>
-            <w:tcBorders>
-              <w:top w:val="none" w:color="FFFFFF" w:sz="0"/>
-              <w:left w:val="none" w:color="FFFFFF" w:sz="0"/>
-              <w:bottom w:val="single" w:color="000000" w:sz="4"/>
-              <w:right w:val="none" w:color="FFFFFF" w:sz="0"/>
-            </w:tcBorders>
-            <w:tcMar>
-              <w:top w:type="dxa" w:w="30"/>
-              <w:left w:type="dxa" w:w="50"/>
-              <w:bottom w:type="dxa" w:w="30"/>
-              <w:right w:type="dxa" w:w="50"/>
-            </w:tcMar>
-          </w:tcPr>
-          <w:p>
-            <w:pPr>
-              <w:jc w:val="center"/>
-            </w:pPr>
-            <w:r>
-              <w:rPr>
-                <w:rFonts w:ascii="Times New Roman" w:cs="Times New Roman" w:eastAsia="Times New Roman" w:hAnsi="Times New Roman"/>
-                <w:b w:val="false"/>
-                <w:bCs w:val="false"/>
-                <w:i w:val="false"/>
-                <w:iCs w:val="false"/>
-                <w:smallCaps w:val="false"/>
-                <w:sz w:val="16"/>
-                <w:szCs w:val="16"/>
-              </w:rPr>
-              <w:t xml:space="preserve">0.00</w:t>
-            </w:r>
-          </w:p>
-        </w:tc>
-        <w:tc>
-          <w:tcPr>
-            <w:tcW w:type="dxa" w:w="520"/>
-            <w:tcBorders>
-              <w:top w:val="none" w:color="FFFFFF" w:sz="0"/>
-              <w:left w:val="none" w:color="FFFFFF" w:sz="0"/>
-              <w:bottom w:val="single" w:color="000000" w:sz="4"/>
-              <w:right w:val="none" w:color="FFFFFF" w:sz="0"/>
-            </w:tcBorders>
-            <w:tcMar>
-              <w:top w:type="dxa" w:w="30"/>
-              <w:left w:type="dxa" w:w="50"/>
-              <w:bottom w:type="dxa" w:w="30"/>
-              <w:right w:type="dxa" w:w="50"/>
-            </w:tcMar>
-          </w:tcPr>
-          <w:p>
-            <w:pPr>
-              <w:jc w:val="center"/>
-            </w:pPr>
-            <w:r>
-              <w:rPr>
-                <w:rFonts w:ascii="Times New Roman" w:cs="Times New Roman" w:eastAsia="Times New Roman" w:hAnsi="Times New Roman"/>
-                <w:b w:val="false"/>
-                <w:bCs w:val="false"/>
-                <w:i w:val="false"/>
-                <w:iCs w:val="false"/>
-                <w:smallCaps w:val="false"/>
-                <w:sz w:val="16"/>
-                <w:szCs w:val="16"/>
-              </w:rPr>
-              <w:t xml:space="preserve">1.000</w:t>
-            </w:r>
-          </w:p>
-        </w:tc>
-      </w:tr>
-      <w:tr>
-        <w:tc>
-          <w:tcPr>
-            <w:tcW w:type="dxa" w:w="1500"/>
-            <w:tcBorders>
-              <w:top w:val="none" w:color="FFFFFF" w:sz="0"/>
-              <w:left w:val="none" w:color="FFFFFF" w:sz="0"/>
-              <w:bottom w:val="single" w:color="000000" w:sz="4"/>
-              <w:right w:val="none" w:color="FFFFFF" w:sz="0"/>
-            </w:tcBorders>
-            <w:tcMar>
-              <w:top w:type="dxa" w:w="30"/>
-              <w:left w:type="dxa" w:w="50"/>
-              <w:bottom w:type="dxa" w:w="30"/>
-              <w:right w:type="dxa" w:w="50"/>
-            </w:tcMar>
-          </w:tcPr>
-          <w:p>
-            <w:pPr>
-              <w:jc w:val="left"/>
-            </w:pPr>
-            <w:r>
-              <w:rPr>
-                <w:rFonts w:ascii="Times New Roman" w:cs="Times New Roman" w:eastAsia="Times New Roman" w:hAnsi="Times New Roman"/>
-                <w:b w:val="false"/>
-                <w:bCs w:val="false"/>
-                <w:i w:val="false"/>
-                <w:iCs w:val="false"/>
-                <w:smallCaps w:val="false"/>
-                <w:sz w:val="16"/>
-                <w:szCs w:val="16"/>
-              </w:rPr>
-              <w:t xml:space="preserve">Defect caught (mutant)</w:t>
-            </w:r>
-          </w:p>
-        </w:tc>
-        <w:tc>
-          <w:tcPr>
-            <w:tcW w:type="dxa" w:w="330"/>
-            <w:tcBorders>
-              <w:top w:val="none" w:color="FFFFFF" w:sz="0"/>
-              <w:left w:val="none" w:color="FFFFFF" w:sz="0"/>
-              <w:bottom w:val="single" w:color="000000" w:sz="4"/>
-              <w:right w:val="none" w:color="FFFFFF" w:sz="0"/>
-            </w:tcBorders>
-            <w:tcMar>
-              <w:top w:type="dxa" w:w="30"/>
-              <w:left w:type="dxa" w:w="50"/>
-              <w:bottom w:type="dxa" w:w="30"/>
-              <w:right w:type="dxa" w:w="50"/>
-            </w:tcMar>
-          </w:tcPr>
-          <w:p>
-            <w:pPr>
-              <w:jc w:val="center"/>
-            </w:pPr>
-            <w:r>
-              <w:rPr>
-                <w:rFonts w:ascii="Times New Roman" w:cs="Times New Roman" w:eastAsia="Times New Roman" w:hAnsi="Times New Roman"/>
-                <w:b w:val="false"/>
-                <w:bCs w:val="false"/>
-                <w:i w:val="false"/>
-                <w:iCs w:val="false"/>
-                <w:smallCaps w:val="false"/>
-                <w:sz w:val="16"/>
-                <w:szCs w:val="16"/>
-              </w:rPr>
-              <w:t xml:space="preserve">12</w:t>
-            </w:r>
-          </w:p>
-        </w:tc>
-        <w:tc>
-          <w:tcPr>
-            <w:tcW w:type="dxa" w:w="520"/>
-            <w:tcBorders>
-              <w:top w:val="none" w:color="FFFFFF" w:sz="0"/>
-              <w:left w:val="none" w:color="FFFFFF" w:sz="0"/>
-              <w:bottom w:val="single" w:color="000000" w:sz="4"/>
-              <w:right w:val="none" w:color="FFFFFF" w:sz="0"/>
-            </w:tcBorders>
-            <w:tcMar>
-              <w:top w:type="dxa" w:w="30"/>
-              <w:left w:type="dxa" w:w="50"/>
-              <w:bottom w:type="dxa" w:w="30"/>
-              <w:right w:type="dxa" w:w="50"/>
-            </w:tcMar>
-          </w:tcPr>
-          <w:p>
-            <w:pPr>
-              <w:jc w:val="center"/>
-            </w:pPr>
-            <w:r>
-              <w:rPr>
-                <w:rFonts w:ascii="Times New Roman" w:cs="Times New Roman" w:eastAsia="Times New Roman" w:hAnsi="Times New Roman"/>
-                <w:b w:val="false"/>
-                <w:bCs w:val="false"/>
-                <w:i w:val="false"/>
-                <w:iCs w:val="false"/>
-                <w:smallCaps w:val="false"/>
-                <w:sz w:val="16"/>
-                <w:szCs w:val="16"/>
-              </w:rPr>
-              <w:t xml:space="preserve">17%</w:t>
-            </w:r>
-          </w:p>
-        </w:tc>
-        <w:tc>
-          <w:tcPr>
-            <w:tcW w:type="dxa" w:w="520"/>
-            <w:tcBorders>
-              <w:top w:val="none" w:color="FFFFFF" w:sz="0"/>
-              <w:left w:val="none" w:color="FFFFFF" w:sz="0"/>
-              <w:bottom w:val="single" w:color="000000" w:sz="4"/>
-              <w:right w:val="none" w:color="FFFFFF" w:sz="0"/>
-            </w:tcBorders>
-            <w:tcMar>
-              <w:top w:type="dxa" w:w="30"/>
-              <w:left w:type="dxa" w:w="50"/>
-              <w:bottom w:type="dxa" w:w="30"/>
-              <w:right w:type="dxa" w:w="50"/>
-            </w:tcMar>
-          </w:tcPr>
-          <w:p>
-            <w:pPr>
-              <w:jc w:val="center"/>
-            </w:pPr>
-            <w:r>
-              <w:rPr>
-                <w:rFonts w:ascii="Times New Roman" w:cs="Times New Roman" w:eastAsia="Times New Roman" w:hAnsi="Times New Roman"/>
-                <w:b w:val="false"/>
-                <w:bCs w:val="false"/>
-                <w:i w:val="false"/>
-                <w:iCs w:val="false"/>
-                <w:smallCaps w:val="false"/>
-                <w:sz w:val="16"/>
-                <w:szCs w:val="16"/>
-              </w:rPr>
-              <w:t xml:space="preserve">17%</w:t>
-            </w:r>
-          </w:p>
-        </w:tc>
-        <w:tc>
-          <w:tcPr>
-            <w:tcW w:type="dxa" w:w="520"/>
-            <w:tcBorders>
-              <w:top w:val="none" w:color="FFFFFF" w:sz="0"/>
-              <w:left w:val="none" w:color="FFFFFF" w:sz="0"/>
-              <w:bottom w:val="single" w:color="000000" w:sz="4"/>
-              <w:right w:val="none" w:color="FFFFFF" w:sz="0"/>
-            </w:tcBorders>
-            <w:tcMar>
-              <w:top w:type="dxa" w:w="30"/>
-              <w:left w:type="dxa" w:w="50"/>
-              <w:bottom w:type="dxa" w:w="30"/>
-              <w:right w:type="dxa" w:w="50"/>
-            </w:tcMar>
-          </w:tcPr>
-          <w:p>
-            <w:pPr>
-              <w:jc w:val="center"/>
-            </w:pPr>
-            <w:r>
-              <w:rPr>
-                <w:rFonts w:ascii="Times New Roman" w:cs="Times New Roman" w:eastAsia="Times New Roman" w:hAnsi="Times New Roman"/>
-                <w:b w:val="false"/>
-                <w:bCs w:val="false"/>
-                <w:i w:val="false"/>
-                <w:iCs w:val="false"/>
-                <w:smallCaps w:val="false"/>
-                <w:sz w:val="16"/>
-                <w:szCs w:val="16"/>
-              </w:rPr>
-              <w:t xml:space="preserve">8%</w:t>
-            </w:r>
-          </w:p>
-        </w:tc>
-        <w:tc>
-          <w:tcPr>
-            <w:tcW w:type="dxa" w:w="560"/>
-            <w:tcBorders>
-              <w:top w:val="none" w:color="FFFFFF" w:sz="0"/>
-              <w:left w:val="none" w:color="FFFFFF" w:sz="0"/>
-              <w:bottom w:val="single" w:color="000000" w:sz="4"/>
-              <w:right w:val="none" w:color="FFFFFF" w:sz="0"/>
-            </w:tcBorders>
-            <w:tcMar>
-              <w:top w:type="dxa" w:w="30"/>
-              <w:left w:type="dxa" w:w="50"/>
-              <w:bottom w:type="dxa" w:w="30"/>
-              <w:right w:type="dxa" w:w="50"/>
-            </w:tcMar>
-          </w:tcPr>
-          <w:p>
-            <w:pPr>
-              <w:jc w:val="center"/>
-            </w:pPr>
-            <w:r>
-              <w:rPr>
-                <w:rFonts w:ascii="Times New Roman" w:cs="Times New Roman" w:eastAsia="Times New Roman" w:hAnsi="Times New Roman"/>
-                <w:b w:val="false"/>
-                <w:bCs w:val="false"/>
-                <w:i w:val="false"/>
-                <w:iCs w:val="false"/>
-                <w:smallCaps w:val="false"/>
-                <w:sz w:val="16"/>
-                <w:szCs w:val="16"/>
-              </w:rPr>
-              <w:t xml:space="preserve">n/a</w:t>
-            </w:r>
-          </w:p>
-        </w:tc>
-        <w:tc>
-          <w:tcPr>
-            <w:tcW w:type="dxa" w:w="520"/>
-            <w:tcBorders>
-              <w:top w:val="none" w:color="FFFFFF" w:sz="0"/>
-              <w:left w:val="none" w:color="FFFFFF" w:sz="0"/>
-              <w:bottom w:val="single" w:color="000000" w:sz="4"/>
-              <w:right w:val="none" w:color="FFFFFF" w:sz="0"/>
-            </w:tcBorders>
-            <w:tcMar>
-              <w:top w:type="dxa" w:w="30"/>
-              <w:left w:type="dxa" w:w="50"/>
-              <w:bottom w:type="dxa" w:w="30"/>
-              <w:right w:type="dxa" w:w="50"/>
-            </w:tcMar>
-          </w:tcPr>
-          <w:p>
-            <w:pPr>
-              <w:jc w:val="center"/>
-            </w:pPr>
-            <w:r>
-              <w:rPr>
-                <w:rFonts w:ascii="Times New Roman" w:cs="Times New Roman" w:eastAsia="Times New Roman" w:hAnsi="Times New Roman"/>
-                <w:b w:val="false"/>
-                <w:bCs w:val="false"/>
-                <w:i w:val="false"/>
-                <w:iCs w:val="false"/>
-                <w:smallCaps w:val="false"/>
-                <w:sz w:val="16"/>
-                <w:szCs w:val="16"/>
-              </w:rPr>
-              <w:t xml:space="preserve">1.000</w:t>
-            </w:r>
-          </w:p>
-        </w:tc>
-      </w:tr>
-      <w:tr>
-        <w:tc>
-          <w:tcPr>
-            <w:tcW w:type="dxa" w:w="1500"/>
-            <w:tcBorders>
-              <w:top w:val="none" w:color="FFFFFF" w:sz="0"/>
-              <w:left w:val="none" w:color="FFFFFF" w:sz="0"/>
-              <w:bottom w:val="single" w:color="000000" w:sz="4"/>
-              <w:right w:val="none" w:color="FFFFFF" w:sz="0"/>
-            </w:tcBorders>
-            <w:tcMar>
-              <w:top w:type="dxa" w:w="30"/>
-              <w:left w:type="dxa" w:w="50"/>
-              <w:bottom w:type="dxa" w:w="30"/>
-              <w:right w:type="dxa" w:w="50"/>
-            </w:tcMar>
-          </w:tcPr>
-          <w:p>
-            <w:pPr>
-              <w:jc w:val="left"/>
-            </w:pPr>
-            <w:r>
-              <w:rPr>
-                <w:rFonts w:ascii="Times New Roman" w:cs="Times New Roman" w:eastAsia="Times New Roman" w:hAnsi="Times New Roman"/>
-                <w:b w:val="false"/>
-                <w:bCs w:val="false"/>
-                <w:i w:val="false"/>
-                <w:iCs w:val="false"/>
-                <w:smallCaps w:val="false"/>
-                <w:sz w:val="16"/>
-                <w:szCs w:val="16"/>
-              </w:rPr>
-              <w:t xml:space="preserve">False alarm (golden)</w:t>
-            </w:r>
-          </w:p>
-        </w:tc>
-        <w:tc>
-          <w:tcPr>
-            <w:tcW w:type="dxa" w:w="330"/>
-            <w:tcBorders>
-              <w:top w:val="none" w:color="FFFFFF" w:sz="0"/>
-              <w:left w:val="none" w:color="FFFFFF" w:sz="0"/>
-              <w:bottom w:val="single" w:color="000000" w:sz="4"/>
-              <w:right w:val="none" w:color="FFFFFF" w:sz="0"/>
-            </w:tcBorders>
-            <w:tcMar>
-              <w:top w:type="dxa" w:w="30"/>
-              <w:left w:type="dxa" w:w="50"/>
-              <w:bottom w:type="dxa" w:w="30"/>
-              <w:right w:type="dxa" w:w="50"/>
-            </w:tcMar>
-          </w:tcPr>
-          <w:p>
-            <w:pPr>
-              <w:jc w:val="center"/>
-            </w:pPr>
-            <w:r>
-              <w:rPr>
-                <w:rFonts w:ascii="Times New Roman" w:cs="Times New Roman" w:eastAsia="Times New Roman" w:hAnsi="Times New Roman"/>
-                <w:b w:val="false"/>
-                <w:bCs w:val="false"/>
-                <w:i w:val="false"/>
-                <w:iCs w:val="false"/>
-                <w:smallCaps w:val="false"/>
-                <w:sz w:val="16"/>
-                <w:szCs w:val="16"/>
-              </w:rPr>
-              <w:t xml:space="preserve">24</w:t>
-            </w:r>
-          </w:p>
-        </w:tc>
-        <w:tc>
-          <w:tcPr>
-            <w:tcW w:type="dxa" w:w="520"/>
-            <w:tcBorders>
-              <w:top w:val="none" w:color="FFFFFF" w:sz="0"/>
-              <w:left w:val="none" w:color="FFFFFF" w:sz="0"/>
-              <w:bottom w:val="single" w:color="000000" w:sz="4"/>
-              <w:right w:val="none" w:color="FFFFFF" w:sz="0"/>
-            </w:tcBorders>
-            <w:tcMar>
-              <w:top w:type="dxa" w:w="30"/>
-              <w:left w:type="dxa" w:w="50"/>
-              <w:bottom w:type="dxa" w:w="30"/>
-              <w:right w:type="dxa" w:w="50"/>
-            </w:tcMar>
-          </w:tcPr>
-          <w:p>
-            <w:pPr>
-              <w:jc w:val="center"/>
-            </w:pPr>
-            <w:r>
-              <w:rPr>
-                <w:rFonts w:ascii="Times New Roman" w:cs="Times New Roman" w:eastAsia="Times New Roman" w:hAnsi="Times New Roman"/>
-                <w:b w:val="false"/>
-                <w:bCs w:val="false"/>
-                <w:i w:val="false"/>
-                <w:iCs w:val="false"/>
-                <w:smallCaps w:val="false"/>
-                <w:sz w:val="16"/>
-                <w:szCs w:val="16"/>
-              </w:rPr>
-              <w:t xml:space="preserve">8%</w:t>
-            </w:r>
-          </w:p>
-        </w:tc>
-        <w:tc>
-          <w:tcPr>
-            <w:tcW w:type="dxa" w:w="520"/>
-            <w:tcBorders>
-              <w:top w:val="none" w:color="FFFFFF" w:sz="0"/>
-              <w:left w:val="none" w:color="FFFFFF" w:sz="0"/>
-              <w:bottom w:val="single" w:color="000000" w:sz="4"/>
-              <w:right w:val="none" w:color="FFFFFF" w:sz="0"/>
-            </w:tcBorders>
-            <w:tcMar>
-              <w:top w:type="dxa" w:w="30"/>
-              <w:left w:type="dxa" w:w="50"/>
-              <w:bottom w:type="dxa" w:w="30"/>
-              <w:right w:type="dxa" w:w="50"/>
-            </w:tcMar>
-          </w:tcPr>
-          <w:p>
-            <w:pPr>
-              <w:jc w:val="center"/>
-            </w:pPr>
-            <w:r>
-              <w:rPr>
-                <w:rFonts w:ascii="Times New Roman" w:cs="Times New Roman" w:eastAsia="Times New Roman" w:hAnsi="Times New Roman"/>
-                <w:b w:val="false"/>
-                <w:bCs w:val="false"/>
-                <w:i w:val="false"/>
-                <w:iCs w:val="false"/>
-                <w:smallCaps w:val="false"/>
-                <w:sz w:val="16"/>
-                <w:szCs w:val="16"/>
-              </w:rPr>
-              <w:t xml:space="preserve">8%</w:t>
-            </w:r>
-          </w:p>
-        </w:tc>
-        <w:tc>
-          <w:tcPr>
-            <w:tcW w:type="dxa" w:w="520"/>
-            <w:tcBorders>
-              <w:top w:val="none" w:color="FFFFFF" w:sz="0"/>
-              <w:left w:val="none" w:color="FFFFFF" w:sz="0"/>
-              <w:bottom w:val="single" w:color="000000" w:sz="4"/>
-              <w:right w:val="none" w:color="FFFFFF" w:sz="0"/>
-            </w:tcBorders>
-            <w:tcMar>
-              <w:top w:type="dxa" w:w="30"/>
-              <w:left w:type="dxa" w:w="50"/>
-              <w:bottom w:type="dxa" w:w="30"/>
-              <w:right w:type="dxa" w:w="50"/>
-            </w:tcMar>
-          </w:tcPr>
-          <w:p>
-            <w:pPr>
-              <w:jc w:val="center"/>
-            </w:pPr>
-            <w:r>
-              <w:rPr>
-                <w:rFonts w:ascii="Times New Roman" w:cs="Times New Roman" w:eastAsia="Times New Roman" w:hAnsi="Times New Roman"/>
-                <w:b w:val="false"/>
-                <w:bCs w:val="false"/>
-                <w:i w:val="false"/>
-                <w:iCs w:val="false"/>
-                <w:smallCaps w:val="false"/>
-                <w:sz w:val="16"/>
-                <w:szCs w:val="16"/>
-              </w:rPr>
-              <w:t xml:space="preserve">4%</w:t>
-            </w:r>
-          </w:p>
-        </w:tc>
-        <w:tc>
-          <w:tcPr>
-            <w:tcW w:type="dxa" w:w="560"/>
-            <w:tcBorders>
-              <w:top w:val="none" w:color="FFFFFF" w:sz="0"/>
-              <w:left w:val="none" w:color="FFFFFF" w:sz="0"/>
-              <w:bottom w:val="single" w:color="000000" w:sz="4"/>
-              <w:right w:val="none" w:color="FFFFFF" w:sz="0"/>
-            </w:tcBorders>
-            <w:tcMar>
-              <w:top w:type="dxa" w:w="30"/>
-              <w:left w:type="dxa" w:w="50"/>
-              <w:bottom w:type="dxa" w:w="30"/>
-              <w:right w:type="dxa" w:w="50"/>
-            </w:tcMar>
-          </w:tcPr>
-          <w:p>
-            <w:pPr>
-              <w:jc w:val="center"/>
-            </w:pPr>
-            <w:r>
-              <w:rPr>
-                <w:rFonts w:ascii="Times New Roman" w:cs="Times New Roman" w:eastAsia="Times New Roman" w:hAnsi="Times New Roman"/>
-                <w:b w:val="false"/>
-                <w:bCs w:val="false"/>
-                <w:i w:val="false"/>
-                <w:iCs w:val="false"/>
-                <w:smallCaps w:val="false"/>
-                <w:sz w:val="16"/>
-                <w:szCs w:val="16"/>
-              </w:rPr>
-              <w:t xml:space="preserve">n/a</w:t>
-            </w:r>
-          </w:p>
-        </w:tc>
-        <w:tc>
-          <w:tcPr>
-            <w:tcW w:type="dxa" w:w="520"/>
-            <w:tcBorders>
-              <w:top w:val="none" w:color="FFFFFF" w:sz="0"/>
-              <w:left w:val="none" w:color="FFFFFF" w:sz="0"/>
-              <w:bottom w:val="single" w:color="000000" w:sz="4"/>
-              <w:right w:val="none" w:color="FFFFFF" w:sz="0"/>
-            </w:tcBorders>
-            <w:tcMar>
-              <w:top w:type="dxa" w:w="30"/>
-              <w:left w:type="dxa" w:w="50"/>
-              <w:bottom w:type="dxa" w:w="30"/>
-              <w:right w:type="dxa" w:w="50"/>
-            </w:tcMar>
-          </w:tcPr>
-          <w:p>
-            <w:pPr>
-              <w:jc w:val="center"/>
-            </w:pPr>
-            <w:r>
-              <w:rPr>
-                <w:rFonts w:ascii="Times New Roman" w:cs="Times New Roman" w:eastAsia="Times New Roman" w:hAnsi="Times New Roman"/>
-                <w:b w:val="false"/>
-                <w:bCs w:val="false"/>
-                <w:i w:val="false"/>
-                <w:iCs w:val="false"/>
-                <w:smallCaps w:val="false"/>
-                <w:sz w:val="16"/>
-                <w:szCs w:val="16"/>
-              </w:rPr>
-              <w:t xml:space="preserve">1.000</w:t>
+              <w:t xml:space="preserve">1.00</w:t>
             </w:r>
           </w:p>
         </w:tc>
@@ -2241,7 +2302,7 @@
     </w:tbl>
     <w:p>
       <w:pPr>
-        <w:spacing w:after="80"/>
+        <w:spacing w:after="60"/>
       </w:pPr>
       <w:r>
         <w:rPr>
@@ -2259,87 +2320,87 @@
     </w:p>
     <w:p>
       <w:pPr>
-        <w:spacing w:after="60" w:before="0" w:line="240"/>
-        <w:ind w:firstLine="202"/>
-        <w:jc w:val="both"/>
-      </w:pPr>
-      <w:r>
-        <w:rPr>
-          <w:rFonts w:ascii="Times New Roman" w:cs="Times New Roman" w:eastAsia="Times New Roman" w:hAnsi="Times New Roman"/>
-          <w:b w:val="false"/>
-          <w:bCs w:val="false"/>
-          <w:i w:val="false"/>
-          <w:iCs w:val="false"/>
-          <w:smallCaps w:val="false"/>
-          <w:sz w:val="20"/>
-          <w:szCs w:val="20"/>
-        </w:rPr>
-        <w:t xml:space="preserve">The detector asked on 6 of 36 treatment runs (17%). The simulated author gave a substantive answer to 4 of these and declined 2, saying the notes did not cover the question. Because the treatment differs from the floor only on runs where the detector asked, at most 6 pairs can differ for a reason other than sampling variation; the remaining 30 pairs are two independent samples of the same single-pass review.</w:t>
-      </w:r>
-    </w:p>
-    <w:p>
-      <w:pPr>
-        <w:spacing w:after="60" w:before="0" w:line="240"/>
-        <w:ind w:firstLine="202"/>
-        <w:jc w:val="both"/>
-      </w:pPr>
-      <w:r>
-        <w:rPr>
-          <w:rFonts w:ascii="Times New Roman" w:cs="Times New Roman" w:eastAsia="Times New Roman" w:hAnsi="Times New Roman"/>
-          <w:b w:val="false"/>
-          <w:bCs w:val="false"/>
-          <w:i w:val="false"/>
-          <w:iCs w:val="false"/>
-          <w:smallCaps w:val="false"/>
-          <w:sz w:val="20"/>
-          <w:szCs w:val="20"/>
-        </w:rPr>
-        <w:t xml:space="preserve">Withholding all natural-language intent lowered intent recovery from 97% to 81%: the v2 manipulation opens a gap where v1 opened none, but a small one, because code alone still reveals the purpose of most of these patches. The treatment recovered intent in 83% of instances (McNemar p = 1.000; discordant pairs: 1 favouring the treatment, 0 favouring the floor).</w:t>
-      </w:r>
-    </w:p>
-    <w:p>
-      <w:pPr>
-        <w:spacing w:after="60" w:before="0" w:line="240"/>
-        <w:ind w:firstLine="202"/>
-        <w:jc w:val="both"/>
-      </w:pPr>
-      <w:r>
-        <w:rPr>
-          <w:rFonts w:ascii="Times New Roman" w:cs="Times New Roman" w:eastAsia="Times New Roman" w:hAnsi="Times New Roman"/>
-          <w:b w:val="false"/>
-          <w:bCs w:val="false"/>
-          <w:i w:val="false"/>
-          <w:iCs w:val="false"/>
-          <w:smallCaps w:val="false"/>
-          <w:sz w:val="20"/>
-          <w:szCs w:val="20"/>
-        </w:rPr>
-        <w:t xml:space="preserve">Tracing each instance shows where the effect is lost. The treatment can only improve on the floor for an instance the floor got wrong, that the detector flagged, and whose author answered. The floor missed intent on 7 instances (the ceiling also missed 1 of these). The detector asked on 2 of the 7; the author answered 1 substantively; and the treatment recovered intent on 1. Where clarification was given the chance it recovered intent (1 of 1, too few to estimate a rate), but the chance arose rarely: the binding constraint is detector recall, not the value of an answer once given. Of the detector's 6 questions overall, 4 went to instances the floor already understood, where an answer cannot improve intent recovery.</w:t>
-      </w:r>
-    </w:p>
-    <w:p>
-      <w:pPr>
-        <w:spacing w:after="60" w:before="0" w:line="240"/>
-        <w:ind w:firstLine="202"/>
-        <w:jc w:val="both"/>
-      </w:pPr>
-      <w:r>
-        <w:rPr>
-          <w:rFonts w:ascii="Times New Roman" w:cs="Times New Roman" w:eastAsia="Times New Roman" w:hAnsi="Times New Roman"/>
-          <w:b w:val="false"/>
-          <w:bCs w:val="false"/>
-          <w:i w:val="false"/>
-          <w:iCs w:val="false"/>
-          <w:smallCaps w:val="false"/>
-          <w:sz w:val="20"/>
-          <w:szCs w:val="20"/>
-        </w:rPr>
-        <w:t xml:space="preserve">Injected defects were rarely caught in any condition—17% in the floor, 17% in the treatment and 8% with full context. The full-context figure is the informative one: with the issue in hand the reviewer still approved most mutants, so on this model the binding limit on defect detection is the reviewer's reading of the code, not missing intent, and clarification cannot raise detection above that ceiling. One mutant was caught without the issue text but approved with it, an isolated case but consistent with a stated intent anchoring the reviewer toward acceptance.</w:t>
-      </w:r>
-    </w:p>
-    <w:p>
-      <w:pPr>
-        <w:spacing w:after="50" w:before="100"/>
+        <w:keepNext/>
+        <w:spacing w:after="30" w:before="80"/>
+        <w:jc w:val="center"/>
+      </w:pPr>
+      <w:r>
+        <w:drawing>
+          <wp:inline distT="0" distB="0" distL="0" distR="0">
+            <wp:extent cx="3124200" cy="1038225"/>
+            <wp:effectExtent t="0" r="0" b="0" l="0"/>
+            <wp:docPr id="3" name="" descr="" title=""/>
+            <wp:cNvGraphicFramePr>
+              <a:graphicFrameLocks xmlns:a="http://schemas.openxmlformats.org/drawingml/2006/main" noChangeAspect="1"/>
+            </wp:cNvGraphicFramePr>
+            <a:graphic xmlns:a="http://schemas.openxmlformats.org/drawingml/2006/main">
+              <a:graphicData uri="http://schemas.openxmlformats.org/drawingml/2006/picture">
+                <pic:pic xmlns:pic="http://schemas.openxmlformats.org/drawingml/2006/picture">
+                  <pic:nvPicPr>
+                    <pic:cNvPr id="0" name="" descr=""/>
+                    <pic:cNvPicPr>
+                      <a:picLocks noChangeAspect="1" noChangeArrowheads="1"/>
+                    </pic:cNvPicPr>
+                  </pic:nvPicPr>
+                  <pic:blipFill>
+                    <a:blip r:embed="rId9" cstate="none"/>
+                    <a:srcRect/>
+                    <a:stretch>
+                      <a:fillRect/>
+                    </a:stretch>
+                  </pic:blipFill>
+                  <pic:spPr bwMode="auto">
+                    <a:xfrm>
+                      <a:off x="0" y="0"/>
+                      <a:ext cx="3124200" cy="1038225"/>
+                    </a:xfrm>
+                    <a:prstGeom prst="rect">
+                      <a:avLst/>
+                    </a:prstGeom>
+                  </pic:spPr>
+                </pic:pic>
+              </a:graphicData>
+            </a:graphic>
+          </wp:inline>
+        </w:drawing>
+      </w:r>
+    </w:p>
+    <w:p>
+      <w:pPr>
+        <w:spacing w:after="100"/>
+        <w:jc w:val="both"/>
+      </w:pPr>
+      <w:r>
+        <w:rPr>
+          <w:rFonts w:ascii="Times New Roman" w:cs="Times New Roman" w:eastAsia="Times New Roman" w:hAnsi="Times New Roman"/>
+          <w:b w:val="false"/>
+          <w:bCs w:val="false"/>
+          <w:i w:val="false"/>
+          <w:iCs w:val="false"/>
+          <w:smallCaps w:val="false"/>
+          <w:sz w:val="16"/>
+          <w:szCs w:val="16"/>
+        </w:rPr>
+        <w:t xml:space="preserve">Fig. 3.  </w:t>
+      </w:r>
+      <w:r>
+        <w:rPr>
+          <w:rFonts w:ascii="Times New Roman" w:cs="Times New Roman" w:eastAsia="Times New Roman" w:hAnsi="Times New Roman"/>
+          <w:b w:val="false"/>
+          <w:bCs w:val="false"/>
+          <w:i w:val="false"/>
+          <w:iCs w:val="false"/>
+          <w:smallCaps w:val="false"/>
+          <w:sz w:val="16"/>
+          <w:szCs w:val="16"/>
+        </w:rPr>
+        <w:t xml:space="preserve">Outcomes by condition. Bars show the share of instances; labels give counts.</w:t>
+      </w:r>
+    </w:p>
+    <w:p>
+      <w:pPr>
+        <w:keepNext/>
+        <w:spacing w:after="40" w:before="80"/>
       </w:pPr>
       <w:r>
         <w:rPr>
@@ -2352,12 +2413,13 @@
           <w:sz w:val="20"/>
           <w:szCs w:val="20"/>
         </w:rPr>
-        <w:t xml:space="preserve">C. Detector comparison</w:t>
-      </w:r>
-    </w:p>
-    <w:p>
-      <w:pPr>
-        <w:spacing w:after="60" w:before="0" w:line="240"/>
+        <w:t xml:space="preserve">C. Where the effect is lost</w:t>
+      </w:r>
+    </w:p>
+    <w:p>
+      <w:pPr>
+        <w:keepNext w:val="false"/>
+        <w:spacing w:after="40" w:before="0" w:line="240"/>
         <w:ind w:firstLine="202"/>
         <w:jc w:val="both"/>
       </w:pPr>
@@ -2372,12 +2434,92 @@
           <w:sz w:val="20"/>
           <w:szCs w:val="20"/>
         </w:rPr>
-        <w:t xml:space="preserve">Using constructed labels—a stripped context is ambiguous by construction and its full counterpart clear—Table II compares the detectors. A detector that keys on a missing issue gains part of its recall for free under these labels, so the figures bound real-world recall from above.</w:t>
-      </w:r>
-    </w:p>
-    <w:p>
-      <w:pPr>
-        <w:spacing w:after="60" w:before="0" w:line="240"/>
+        <w:t xml:space="preserve">The treatment can improve on the floor only for an instance the floor got wrong, that the detector flagged, and whose author answered (Fig. 4). The floor misread 7 changes. The detector asked on 2; the author answered 1 substantively; and the treatment recovered intent in 1. The other flagged miss received a refusal: its question concerned a parameter the issue never mentions. Of the detector's 6 questions, 4 went to instances the floor already understood, where an answer cannot raise intent recovery. Clarification worked where it was given the chance (too few cases to estimate a rate), and the chance arose rarely: the binding constraint is detector recall.</w:t>
+      </w:r>
+    </w:p>
+    <w:p>
+      <w:pPr>
+        <w:keepNext/>
+        <w:spacing w:after="30" w:before="80"/>
+        <w:jc w:val="center"/>
+      </w:pPr>
+      <w:r>
+        <w:drawing>
+          <wp:inline distT="0" distB="0" distL="0" distR="0">
+            <wp:extent cx="3124200" cy="1009650"/>
+            <wp:effectExtent t="0" r="0" b="0" l="0"/>
+            <wp:docPr id="4" name="" descr="" title=""/>
+            <wp:cNvGraphicFramePr>
+              <a:graphicFrameLocks xmlns:a="http://schemas.openxmlformats.org/drawingml/2006/main" noChangeAspect="1"/>
+            </wp:cNvGraphicFramePr>
+            <a:graphic xmlns:a="http://schemas.openxmlformats.org/drawingml/2006/main">
+              <a:graphicData uri="http://schemas.openxmlformats.org/drawingml/2006/picture">
+                <pic:pic xmlns:pic="http://schemas.openxmlformats.org/drawingml/2006/picture">
+                  <pic:nvPicPr>
+                    <pic:cNvPr id="0" name="" descr=""/>
+                    <pic:cNvPicPr>
+                      <a:picLocks noChangeAspect="1" noChangeArrowheads="1"/>
+                    </pic:cNvPicPr>
+                  </pic:nvPicPr>
+                  <pic:blipFill>
+                    <a:blip r:embed="rId10" cstate="none"/>
+                    <a:srcRect/>
+                    <a:stretch>
+                      <a:fillRect/>
+                    </a:stretch>
+                  </pic:blipFill>
+                  <pic:spPr bwMode="auto">
+                    <a:xfrm>
+                      <a:off x="0" y="0"/>
+                      <a:ext cx="3124200" cy="1009650"/>
+                    </a:xfrm>
+                    <a:prstGeom prst="rect">
+                      <a:avLst/>
+                    </a:prstGeom>
+                  </pic:spPr>
+                </pic:pic>
+              </a:graphicData>
+            </a:graphic>
+          </wp:inline>
+        </w:drawing>
+      </w:r>
+    </w:p>
+    <w:p>
+      <w:pPr>
+        <w:spacing w:after="100"/>
+        <w:jc w:val="both"/>
+      </w:pPr>
+      <w:r>
+        <w:rPr>
+          <w:rFonts w:ascii="Times New Roman" w:cs="Times New Roman" w:eastAsia="Times New Roman" w:hAnsi="Times New Roman"/>
+          <w:b w:val="false"/>
+          <w:bCs w:val="false"/>
+          <w:i w:val="false"/>
+          <w:iCs w:val="false"/>
+          <w:smallCaps w:val="false"/>
+          <w:sz w:val="16"/>
+          <w:szCs w:val="16"/>
+        </w:rPr>
+        <w:t xml:space="preserve">Fig. 4.  </w:t>
+      </w:r>
+      <w:r>
+        <w:rPr>
+          <w:rFonts w:ascii="Times New Roman" w:cs="Times New Roman" w:eastAsia="Times New Roman" w:hAnsi="Times New Roman"/>
+          <w:b w:val="false"/>
+          <w:bCs w:val="false"/>
+          <w:i w:val="false"/>
+          <w:iCs w:val="false"/>
+          <w:smallCaps w:val="false"/>
+          <w:sz w:val="16"/>
+          <w:szCs w:val="16"/>
+        </w:rPr>
+        <w:t xml:space="preserve">Tracing each instance from a floor miss to recovery.</w:t>
+      </w:r>
+    </w:p>
+    <w:p>
+      <w:pPr>
+        <w:keepNext w:val="false"/>
+        <w:spacing w:after="40" w:before="0" w:line="240"/>
         <w:ind w:firstLine="202"/>
         <w:jc w:val="both"/>
       </w:pPr>
@@ -2392,12 +2534,113 @@
           <w:sz w:val="20"/>
           <w:szCs w:val="20"/>
         </w:rPr>
-        <w:t xml:space="preserve">The heuristic was run on every golden row; the two uncertainty detectors, which cost eight model calls per decision, on 4 instances only, so their rows are indicative. At the default threshold both asked on every decision. Sampling dispersion did separate the conditions (mean score 0.70 stripped against 0.56 full), so a higher threshold might make it usable; perturbation did not (0.85 against 0.85). The heuristic was the most conservative: it never asked on a full-context instance, but caught only 21% of stripped ones, which is the recall limit traced above.</w:t>
-      </w:r>
-    </w:p>
-    <w:p>
-      <w:pPr>
-        <w:spacing w:after="40" w:before="100"/>
+        <w:t xml:space="preserve">In the recovered case (sympy-12481) the patch lets the Permutation constructor accept non-disjoint cycles. The floor summarised it as "tidy up permutation instantiation logic". The detector scored the stripped change 0.556 and asked whether removing the specialised error was intended; the author replied that non-disjoint cycles should be applied left to right; the treatment's summary then matched the ceiling's.</w:t>
+      </w:r>
+    </w:p>
+    <w:p>
+      <w:pPr>
+        <w:keepNext/>
+        <w:spacing w:after="40" w:before="80"/>
+      </w:pPr>
+      <w:r>
+        <w:rPr>
+          <w:rFonts w:ascii="Times New Roman" w:cs="Times New Roman" w:eastAsia="Times New Roman" w:hAnsi="Times New Roman"/>
+          <w:b w:val="false"/>
+          <w:bCs w:val="false"/>
+          <w:i/>
+          <w:iCs/>
+          <w:smallCaps w:val="false"/>
+          <w:sz w:val="20"/>
+          <w:szCs w:val="20"/>
+        </w:rPr>
+        <w:t xml:space="preserve">D. RQ2: defects and false alarms</w:t>
+      </w:r>
+    </w:p>
+    <w:p>
+      <w:pPr>
+        <w:keepNext w:val="false"/>
+        <w:spacing w:after="40" w:before="0" w:line="240"/>
+        <w:ind w:firstLine="202"/>
+        <w:jc w:val="both"/>
+      </w:pPr>
+      <w:r>
+        <w:rPr>
+          <w:rFonts w:ascii="Times New Roman" w:cs="Times New Roman" w:eastAsia="Times New Roman" w:hAnsi="Times New Roman"/>
+          <w:b w:val="false"/>
+          <w:bCs w:val="false"/>
+          <w:i w:val="false"/>
+          <w:iCs w:val="false"/>
+          <w:smallCaps w:val="false"/>
+          <w:sz w:val="20"/>
+          <w:szCs w:val="20"/>
+        </w:rPr>
+        <w:t xml:space="preserve">The reviewer caught 2/12 injected defects at the floor, 2/12 with clarification and 1/12 with full context. The full-context figure bounds what intent can contribute: given the issue, the reviewer still approved eleven of twelve broken patches, so on this model detection is limited by reading the code, not by knowing its purpose. One mutant was caught without the issue and approved with it—an isolated case, but consistent with stated intent anchoring a reviewer toward acceptance. False alarms on correct patches were rare in every condition (2/24, 2/24, 1/24).</w:t>
+      </w:r>
+    </w:p>
+    <w:p>
+      <w:pPr>
+        <w:keepNext/>
+        <w:spacing w:after="40" w:before="80"/>
+      </w:pPr>
+      <w:r>
+        <w:rPr>
+          <w:rFonts w:ascii="Times New Roman" w:cs="Times New Roman" w:eastAsia="Times New Roman" w:hAnsi="Times New Roman"/>
+          <w:b w:val="false"/>
+          <w:bCs w:val="false"/>
+          <w:i/>
+          <w:iCs/>
+          <w:smallCaps w:val="false"/>
+          <w:sz w:val="20"/>
+          <w:szCs w:val="20"/>
+        </w:rPr>
+        <w:t xml:space="preserve">E. RQ3: detectors</w:t>
+      </w:r>
+    </w:p>
+    <w:p>
+      <w:pPr>
+        <w:keepNext w:val="false"/>
+        <w:spacing w:after="40" w:before="0" w:line="240"/>
+        <w:ind w:firstLine="202"/>
+        <w:jc w:val="both"/>
+      </w:pPr>
+      <w:r>
+        <w:rPr>
+          <w:rFonts w:ascii="Times New Roman" w:cs="Times New Roman" w:eastAsia="Times New Roman" w:hAnsi="Times New Roman"/>
+          <w:b w:val="false"/>
+          <w:bCs w:val="false"/>
+          <w:i w:val="false"/>
+          <w:iCs w:val="false"/>
+          <w:smallCaps w:val="false"/>
+          <w:sz w:val="20"/>
+          <w:szCs w:val="20"/>
+        </w:rPr>
+        <w:t xml:space="preserve">With constructed labels—a stripped context is ambiguous by construction, its full counterpart clear—Table II and Fig. 5 compare the detectors. A detector keyed on a missing issue gains recall for free under these labels, so recall is bounded from above.</w:t>
+      </w:r>
+    </w:p>
+    <w:p>
+      <w:pPr>
+        <w:keepNext/>
+        <w:spacing w:after="0" w:before="100"/>
+        <w:jc w:val="center"/>
+      </w:pPr>
+      <w:r>
+        <w:rPr>
+          <w:rFonts w:ascii="Times New Roman" w:cs="Times New Roman" w:eastAsia="Times New Roman" w:hAnsi="Times New Roman"/>
+          <w:b w:val="false"/>
+          <w:bCs w:val="false"/>
+          <w:i w:val="false"/>
+          <w:iCs w:val="false"/>
+          <w:smallCaps w:val="false"/>
+          <w:sz w:val="16"/>
+          <w:szCs w:val="16"/>
+        </w:rPr>
+        <w:t xml:space="preserve">TABLE II</w:t>
+      </w:r>
+    </w:p>
+    <w:p>
+      <w:pPr>
+        <w:keepNext/>
+        <w:spacing w:after="40"/>
         <w:jc w:val="center"/>
       </w:pPr>
       <w:r>
@@ -2411,12 +2654,12 @@
           <w:sz w:val="16"/>
           <w:szCs w:val="16"/>
         </w:rPr>
-        <w:t xml:space="preserve">Table II. Detectors on constructed labels</w:t>
+        <w:t xml:space="preserve">Detectors on constructed labels</w:t>
       </w:r>
     </w:p>
     <w:tbl>
       <w:tblPr>
-        <w:tblW w:type="dxa" w:w="4120"/>
+        <w:tblW w:type="dxa" w:w="4040"/>
         <w:tblBorders>
           <w:top w:val="single" w:color="auto" w:sz="4"/>
           <w:left w:val="single" w:color="auto" w:sz="4"/>
@@ -2427,17 +2670,17 @@
         </w:tblBorders>
       </w:tblPr>
       <w:tblGrid>
-        <w:gridCol w:w="900"/>
-        <w:gridCol w:w="600"/>
-        <w:gridCol w:w="560"/>
+        <w:gridCol w:w="1080"/>
+        <w:gridCol w:w="380"/>
+        <w:gridCol w:w="520"/>
+        <w:gridCol w:w="520"/>
         <w:gridCol w:w="480"/>
-        <w:gridCol w:w="480"/>
-        <w:gridCol w:w="1100"/>
+        <w:gridCol w:w="1060"/>
       </w:tblGrid>
       <w:tr>
         <w:tc>
           <w:tcPr>
-            <w:tcW w:type="dxa" w:w="900"/>
+            <w:tcW w:type="dxa" w:w="1080"/>
             <w:tcBorders>
               <w:top w:val="single" w:color="000000" w:sz="4"/>
               <w:left w:val="none" w:color="FFFFFF" w:sz="0"/>
@@ -2445,10 +2688,10 @@
               <w:right w:val="none" w:color="FFFFFF" w:sz="0"/>
             </w:tcBorders>
             <w:tcMar>
-              <w:top w:type="dxa" w:w="30"/>
-              <w:left w:type="dxa" w:w="50"/>
-              <w:bottom w:type="dxa" w:w="30"/>
-              <w:right w:type="dxa" w:w="50"/>
+              <w:top w:type="dxa" w:w="25"/>
+              <w:left w:type="dxa" w:w="40"/>
+              <w:bottom w:type="dxa" w:w="25"/>
+              <w:right w:type="dxa" w:w="40"/>
             </w:tcMar>
           </w:tcPr>
           <w:p>
@@ -2472,7 +2715,7 @@
         </w:tc>
         <w:tc>
           <w:tcPr>
-            <w:tcW w:type="dxa" w:w="600"/>
+            <w:tcW w:type="dxa" w:w="380"/>
             <w:tcBorders>
               <w:top w:val="single" w:color="000000" w:sz="4"/>
               <w:left w:val="none" w:color="FFFFFF" w:sz="0"/>
@@ -2480,10 +2723,10 @@
               <w:right w:val="none" w:color="FFFFFF" w:sz="0"/>
             </w:tcBorders>
             <w:tcMar>
-              <w:top w:type="dxa" w:w="30"/>
-              <w:left w:type="dxa" w:w="50"/>
-              <w:bottom w:type="dxa" w:w="30"/>
-              <w:right w:type="dxa" w:w="50"/>
+              <w:top w:type="dxa" w:w="25"/>
+              <w:left w:type="dxa" w:w="40"/>
+              <w:bottom w:type="dxa" w:w="25"/>
+              <w:right w:type="dxa" w:w="40"/>
             </w:tcMar>
           </w:tcPr>
           <w:p>
@@ -2501,13 +2744,13 @@
                 <w:sz w:val="16"/>
                 <w:szCs w:val="16"/>
               </w:rPr>
-              <w:t xml:space="preserve">Decisions</w:t>
-            </w:r>
-          </w:p>
-        </w:tc>
-        <w:tc>
-          <w:tcPr>
-            <w:tcW w:type="dxa" w:w="560"/>
+              <w:t xml:space="preserve">n</w:t>
+            </w:r>
+          </w:p>
+        </w:tc>
+        <w:tc>
+          <w:tcPr>
+            <w:tcW w:type="dxa" w:w="520"/>
             <w:tcBorders>
               <w:top w:val="single" w:color="000000" w:sz="4"/>
               <w:left w:val="none" w:color="FFFFFF" w:sz="0"/>
@@ -2515,10 +2758,10 @@
               <w:right w:val="none" w:color="FFFFFF" w:sz="0"/>
             </w:tcBorders>
             <w:tcMar>
-              <w:top w:type="dxa" w:w="30"/>
-              <w:left w:type="dxa" w:w="50"/>
-              <w:bottom w:type="dxa" w:w="30"/>
-              <w:right w:type="dxa" w:w="50"/>
+              <w:top w:type="dxa" w:w="25"/>
+              <w:left w:type="dxa" w:w="40"/>
+              <w:bottom w:type="dxa" w:w="25"/>
+              <w:right w:type="dxa" w:w="40"/>
             </w:tcMar>
           </w:tcPr>
           <w:p>
@@ -2536,13 +2779,13 @@
                 <w:sz w:val="16"/>
                 <w:szCs w:val="16"/>
               </w:rPr>
-              <w:t xml:space="preserve">Ask rate</w:t>
-            </w:r>
-          </w:p>
-        </w:tc>
-        <w:tc>
-          <w:tcPr>
-            <w:tcW w:type="dxa" w:w="480"/>
+              <w:t xml:space="preserve">Ask</w:t>
+            </w:r>
+          </w:p>
+        </w:tc>
+        <w:tc>
+          <w:tcPr>
+            <w:tcW w:type="dxa" w:w="520"/>
             <w:tcBorders>
               <w:top w:val="single" w:color="000000" w:sz="4"/>
               <w:left w:val="none" w:color="FFFFFF" w:sz="0"/>
@@ -2550,10 +2793,10 @@
               <w:right w:val="none" w:color="FFFFFF" w:sz="0"/>
             </w:tcBorders>
             <w:tcMar>
-              <w:top w:type="dxa" w:w="30"/>
-              <w:left w:type="dxa" w:w="50"/>
-              <w:bottom w:type="dxa" w:w="30"/>
-              <w:right w:type="dxa" w:w="50"/>
+              <w:top w:type="dxa" w:w="25"/>
+              <w:left w:type="dxa" w:w="40"/>
+              <w:bottom w:type="dxa" w:w="25"/>
+              <w:right w:type="dxa" w:w="40"/>
             </w:tcMar>
           </w:tcPr>
           <w:p>
@@ -2585,10 +2828,10 @@
               <w:right w:val="none" w:color="FFFFFF" w:sz="0"/>
             </w:tcBorders>
             <w:tcMar>
-              <w:top w:type="dxa" w:w="30"/>
-              <w:left w:type="dxa" w:w="50"/>
-              <w:bottom w:type="dxa" w:w="30"/>
-              <w:right w:type="dxa" w:w="50"/>
+              <w:top w:type="dxa" w:w="25"/>
+              <w:left w:type="dxa" w:w="40"/>
+              <w:bottom w:type="dxa" w:w="25"/>
+              <w:right w:type="dxa" w:w="40"/>
             </w:tcMar>
           </w:tcPr>
           <w:p>
@@ -2606,13 +2849,13 @@
                 <w:sz w:val="16"/>
                 <w:szCs w:val="16"/>
               </w:rPr>
-              <w:t xml:space="preserve">Recall</w:t>
-            </w:r>
-          </w:p>
-        </w:tc>
-        <w:tc>
-          <w:tcPr>
-            <w:tcW w:type="dxa" w:w="1100"/>
+              <w:t xml:space="preserve">Rec.</w:t>
+            </w:r>
+          </w:p>
+        </w:tc>
+        <w:tc>
+          <w:tcPr>
+            <w:tcW w:type="dxa" w:w="1060"/>
             <w:tcBorders>
               <w:top w:val="single" w:color="000000" w:sz="4"/>
               <w:left w:val="none" w:color="FFFFFF" w:sz="0"/>
@@ -2620,10 +2863,10 @@
               <w:right w:val="none" w:color="FFFFFF" w:sz="0"/>
             </w:tcBorders>
             <w:tcMar>
-              <w:top w:type="dxa" w:w="30"/>
-              <w:left w:type="dxa" w:w="50"/>
-              <w:bottom w:type="dxa" w:w="30"/>
-              <w:right w:type="dxa" w:w="50"/>
+              <w:top w:type="dxa" w:w="25"/>
+              <w:left w:type="dxa" w:w="40"/>
+              <w:bottom w:type="dxa" w:w="25"/>
+              <w:right w:type="dxa" w:w="40"/>
             </w:tcMar>
           </w:tcPr>
           <w:p>
@@ -2641,7 +2884,7 @@
                 <w:sz w:val="16"/>
                 <w:szCs w:val="16"/>
               </w:rPr>
-              <w:t xml:space="preserve">Score (stripped / full)</w:t>
+              <w:t xml:space="preserve">Score s / f</w:t>
             </w:r>
           </w:p>
         </w:tc>
@@ -2649,18 +2892,18 @@
       <w:tr>
         <w:tc>
           <w:tcPr>
-            <w:tcW w:type="dxa" w:w="900"/>
+            <w:tcW w:type="dxa" w:w="1080"/>
             <w:tcBorders>
               <w:top w:val="none" w:color="FFFFFF" w:sz="0"/>
               <w:left w:val="none" w:color="FFFFFF" w:sz="0"/>
-              <w:bottom w:val="single" w:color="000000" w:sz="4"/>
-              <w:right w:val="none" w:color="FFFFFF" w:sz="0"/>
-            </w:tcBorders>
-            <w:tcMar>
-              <w:top w:type="dxa" w:w="30"/>
-              <w:left w:type="dxa" w:w="50"/>
-              <w:bottom w:type="dxa" w:w="30"/>
-              <w:right w:type="dxa" w:w="50"/>
+              <w:bottom w:val="none" w:color="FFFFFF" w:sz="0"/>
+              <w:right w:val="none" w:color="FFFFFF" w:sz="0"/>
+            </w:tcBorders>
+            <w:tcMar>
+              <w:top w:type="dxa" w:w="25"/>
+              <w:left w:type="dxa" w:w="40"/>
+              <w:bottom w:type="dxa" w:w="25"/>
+              <w:right w:type="dxa" w:w="40"/>
             </w:tcMar>
           </w:tcPr>
           <w:p>
@@ -2684,18 +2927,18 @@
         </w:tc>
         <w:tc>
           <w:tcPr>
-            <w:tcW w:type="dxa" w:w="600"/>
+            <w:tcW w:type="dxa" w:w="380"/>
             <w:tcBorders>
               <w:top w:val="none" w:color="FFFFFF" w:sz="0"/>
               <w:left w:val="none" w:color="FFFFFF" w:sz="0"/>
-              <w:bottom w:val="single" w:color="000000" w:sz="4"/>
-              <w:right w:val="none" w:color="FFFFFF" w:sz="0"/>
-            </w:tcBorders>
-            <w:tcMar>
-              <w:top w:type="dxa" w:w="30"/>
-              <w:left w:type="dxa" w:w="50"/>
-              <w:bottom w:type="dxa" w:w="30"/>
-              <w:right w:type="dxa" w:w="50"/>
+              <w:bottom w:val="none" w:color="FFFFFF" w:sz="0"/>
+              <w:right w:val="none" w:color="FFFFFF" w:sz="0"/>
+            </w:tcBorders>
+            <w:tcMar>
+              <w:top w:type="dxa" w:w="25"/>
+              <w:left w:type="dxa" w:w="40"/>
+              <w:bottom w:type="dxa" w:w="25"/>
+              <w:right w:type="dxa" w:w="40"/>
             </w:tcMar>
           </w:tcPr>
           <w:p>
@@ -2719,18 +2962,18 @@
         </w:tc>
         <w:tc>
           <w:tcPr>
-            <w:tcW w:type="dxa" w:w="560"/>
+            <w:tcW w:type="dxa" w:w="520"/>
             <w:tcBorders>
               <w:top w:val="none" w:color="FFFFFF" w:sz="0"/>
               <w:left w:val="none" w:color="FFFFFF" w:sz="0"/>
-              <w:bottom w:val="single" w:color="000000" w:sz="4"/>
-              <w:right w:val="none" w:color="FFFFFF" w:sz="0"/>
-            </w:tcBorders>
-            <w:tcMar>
-              <w:top w:type="dxa" w:w="30"/>
-              <w:left w:type="dxa" w:w="50"/>
-              <w:bottom w:type="dxa" w:w="30"/>
-              <w:right w:type="dxa" w:w="50"/>
+              <w:bottom w:val="none" w:color="FFFFFF" w:sz="0"/>
+              <w:right w:val="none" w:color="FFFFFF" w:sz="0"/>
+            </w:tcBorders>
+            <w:tcMar>
+              <w:top w:type="dxa" w:w="25"/>
+              <w:left w:type="dxa" w:w="40"/>
+              <w:bottom w:type="dxa" w:w="25"/>
+              <w:right w:type="dxa" w:w="40"/>
             </w:tcMar>
           </w:tcPr>
           <w:p>
@@ -2754,18 +2997,18 @@
         </w:tc>
         <w:tc>
           <w:tcPr>
-            <w:tcW w:type="dxa" w:w="480"/>
+            <w:tcW w:type="dxa" w:w="520"/>
             <w:tcBorders>
               <w:top w:val="none" w:color="FFFFFF" w:sz="0"/>
               <w:left w:val="none" w:color="FFFFFF" w:sz="0"/>
-              <w:bottom w:val="single" w:color="000000" w:sz="4"/>
-              <w:right w:val="none" w:color="FFFFFF" w:sz="0"/>
-            </w:tcBorders>
-            <w:tcMar>
-              <w:top w:type="dxa" w:w="30"/>
-              <w:left w:type="dxa" w:w="50"/>
-              <w:bottom w:type="dxa" w:w="30"/>
-              <w:right w:type="dxa" w:w="50"/>
+              <w:bottom w:val="none" w:color="FFFFFF" w:sz="0"/>
+              <w:right w:val="none" w:color="FFFFFF" w:sz="0"/>
+            </w:tcBorders>
+            <w:tcMar>
+              <w:top w:type="dxa" w:w="25"/>
+              <w:left w:type="dxa" w:w="40"/>
+              <w:bottom w:type="dxa" w:w="25"/>
+              <w:right w:type="dxa" w:w="40"/>
             </w:tcMar>
           </w:tcPr>
           <w:p>
@@ -2793,14 +3036,14 @@
             <w:tcBorders>
               <w:top w:val="none" w:color="FFFFFF" w:sz="0"/>
               <w:left w:val="none" w:color="FFFFFF" w:sz="0"/>
-              <w:bottom w:val="single" w:color="000000" w:sz="4"/>
-              <w:right w:val="none" w:color="FFFFFF" w:sz="0"/>
-            </w:tcBorders>
-            <w:tcMar>
-              <w:top w:type="dxa" w:w="30"/>
-              <w:left w:type="dxa" w:w="50"/>
-              <w:bottom w:type="dxa" w:w="30"/>
-              <w:right w:type="dxa" w:w="50"/>
+              <w:bottom w:val="none" w:color="FFFFFF" w:sz="0"/>
+              <w:right w:val="none" w:color="FFFFFF" w:sz="0"/>
+            </w:tcBorders>
+            <w:tcMar>
+              <w:top w:type="dxa" w:w="25"/>
+              <w:left w:type="dxa" w:w="40"/>
+              <w:bottom w:type="dxa" w:w="25"/>
+              <w:right w:type="dxa" w:w="40"/>
             </w:tcMar>
           </w:tcPr>
           <w:p>
@@ -2824,18 +3067,18 @@
         </w:tc>
         <w:tc>
           <w:tcPr>
-            <w:tcW w:type="dxa" w:w="1100"/>
+            <w:tcW w:type="dxa" w:w="1060"/>
             <w:tcBorders>
               <w:top w:val="none" w:color="FFFFFF" w:sz="0"/>
               <w:left w:val="none" w:color="FFFFFF" w:sz="0"/>
-              <w:bottom w:val="single" w:color="000000" w:sz="4"/>
-              <w:right w:val="none" w:color="FFFFFF" w:sz="0"/>
-            </w:tcBorders>
-            <w:tcMar>
-              <w:top w:type="dxa" w:w="30"/>
-              <w:left w:type="dxa" w:w="50"/>
-              <w:bottom w:type="dxa" w:w="30"/>
-              <w:right w:type="dxa" w:w="50"/>
+              <w:bottom w:val="none" w:color="FFFFFF" w:sz="0"/>
+              <w:right w:val="none" w:color="FFFFFF" w:sz="0"/>
+            </w:tcBorders>
+            <w:tcMar>
+              <w:top w:type="dxa" w:w="25"/>
+              <w:left w:type="dxa" w:w="40"/>
+              <w:bottom w:type="dxa" w:w="25"/>
+              <w:right w:type="dxa" w:w="40"/>
             </w:tcMar>
           </w:tcPr>
           <w:p>
@@ -2861,18 +3104,18 @@
       <w:tr>
         <w:tc>
           <w:tcPr>
-            <w:tcW w:type="dxa" w:w="900"/>
+            <w:tcW w:type="dxa" w:w="1080"/>
             <w:tcBorders>
               <w:top w:val="none" w:color="FFFFFF" w:sz="0"/>
               <w:left w:val="none" w:color="FFFFFF" w:sz="0"/>
-              <w:bottom w:val="single" w:color="000000" w:sz="4"/>
-              <w:right w:val="none" w:color="FFFFFF" w:sz="0"/>
-            </w:tcBorders>
-            <w:tcMar>
-              <w:top w:type="dxa" w:w="30"/>
-              <w:left w:type="dxa" w:w="50"/>
-              <w:bottom w:type="dxa" w:w="30"/>
-              <w:right w:type="dxa" w:w="50"/>
+              <w:bottom w:val="none" w:color="FFFFFF" w:sz="0"/>
+              <w:right w:val="none" w:color="FFFFFF" w:sz="0"/>
+            </w:tcBorders>
+            <w:tcMar>
+              <w:top w:type="dxa" w:w="25"/>
+              <w:left w:type="dxa" w:w="40"/>
+              <w:bottom w:type="dxa" w:w="25"/>
+              <w:right w:type="dxa" w:w="40"/>
             </w:tcMar>
           </w:tcPr>
           <w:p>
@@ -2896,18 +3139,18 @@
         </w:tc>
         <w:tc>
           <w:tcPr>
-            <w:tcW w:type="dxa" w:w="600"/>
+            <w:tcW w:type="dxa" w:w="380"/>
             <w:tcBorders>
               <w:top w:val="none" w:color="FFFFFF" w:sz="0"/>
               <w:left w:val="none" w:color="FFFFFF" w:sz="0"/>
-              <w:bottom w:val="single" w:color="000000" w:sz="4"/>
-              <w:right w:val="none" w:color="FFFFFF" w:sz="0"/>
-            </w:tcBorders>
-            <w:tcMar>
-              <w:top w:type="dxa" w:w="30"/>
-              <w:left w:type="dxa" w:w="50"/>
-              <w:bottom w:type="dxa" w:w="30"/>
-              <w:right w:type="dxa" w:w="50"/>
+              <w:bottom w:val="none" w:color="FFFFFF" w:sz="0"/>
+              <w:right w:val="none" w:color="FFFFFF" w:sz="0"/>
+            </w:tcBorders>
+            <w:tcMar>
+              <w:top w:type="dxa" w:w="25"/>
+              <w:left w:type="dxa" w:w="40"/>
+              <w:bottom w:type="dxa" w:w="25"/>
+              <w:right w:type="dxa" w:w="40"/>
             </w:tcMar>
           </w:tcPr>
           <w:p>
@@ -2931,18 +3174,18 @@
         </w:tc>
         <w:tc>
           <w:tcPr>
-            <w:tcW w:type="dxa" w:w="560"/>
+            <w:tcW w:type="dxa" w:w="520"/>
             <w:tcBorders>
               <w:top w:val="none" w:color="FFFFFF" w:sz="0"/>
               <w:left w:val="none" w:color="FFFFFF" w:sz="0"/>
-              <w:bottom w:val="single" w:color="000000" w:sz="4"/>
-              <w:right w:val="none" w:color="FFFFFF" w:sz="0"/>
-            </w:tcBorders>
-            <w:tcMar>
-              <w:top w:type="dxa" w:w="30"/>
-              <w:left w:type="dxa" w:w="50"/>
-              <w:bottom w:type="dxa" w:w="30"/>
-              <w:right w:type="dxa" w:w="50"/>
+              <w:bottom w:val="none" w:color="FFFFFF" w:sz="0"/>
+              <w:right w:val="none" w:color="FFFFFF" w:sz="0"/>
+            </w:tcBorders>
+            <w:tcMar>
+              <w:top w:type="dxa" w:w="25"/>
+              <w:left w:type="dxa" w:w="40"/>
+              <w:bottom w:type="dxa" w:w="25"/>
+              <w:right w:type="dxa" w:w="40"/>
             </w:tcMar>
           </w:tcPr>
           <w:p>
@@ -2966,18 +3209,18 @@
         </w:tc>
         <w:tc>
           <w:tcPr>
-            <w:tcW w:type="dxa" w:w="480"/>
+            <w:tcW w:type="dxa" w:w="520"/>
             <w:tcBorders>
               <w:top w:val="none" w:color="FFFFFF" w:sz="0"/>
               <w:left w:val="none" w:color="FFFFFF" w:sz="0"/>
-              <w:bottom w:val="single" w:color="000000" w:sz="4"/>
-              <w:right w:val="none" w:color="FFFFFF" w:sz="0"/>
-            </w:tcBorders>
-            <w:tcMar>
-              <w:top w:type="dxa" w:w="30"/>
-              <w:left w:type="dxa" w:w="50"/>
-              <w:bottom w:type="dxa" w:w="30"/>
-              <w:right w:type="dxa" w:w="50"/>
+              <w:bottom w:val="none" w:color="FFFFFF" w:sz="0"/>
+              <w:right w:val="none" w:color="FFFFFF" w:sz="0"/>
+            </w:tcBorders>
+            <w:tcMar>
+              <w:top w:type="dxa" w:w="25"/>
+              <w:left w:type="dxa" w:w="40"/>
+              <w:bottom w:type="dxa" w:w="25"/>
+              <w:right w:type="dxa" w:w="40"/>
             </w:tcMar>
           </w:tcPr>
           <w:p>
@@ -3005,14 +3248,14 @@
             <w:tcBorders>
               <w:top w:val="none" w:color="FFFFFF" w:sz="0"/>
               <w:left w:val="none" w:color="FFFFFF" w:sz="0"/>
-              <w:bottom w:val="single" w:color="000000" w:sz="4"/>
-              <w:right w:val="none" w:color="FFFFFF" w:sz="0"/>
-            </w:tcBorders>
-            <w:tcMar>
-              <w:top w:type="dxa" w:w="30"/>
-              <w:left w:type="dxa" w:w="50"/>
-              <w:bottom w:type="dxa" w:w="30"/>
-              <w:right w:type="dxa" w:w="50"/>
+              <w:bottom w:val="none" w:color="FFFFFF" w:sz="0"/>
+              <w:right w:val="none" w:color="FFFFFF" w:sz="0"/>
+            </w:tcBorders>
+            <w:tcMar>
+              <w:top w:type="dxa" w:w="25"/>
+              <w:left w:type="dxa" w:w="40"/>
+              <w:bottom w:type="dxa" w:w="25"/>
+              <w:right w:type="dxa" w:w="40"/>
             </w:tcMar>
           </w:tcPr>
           <w:p>
@@ -3036,18 +3279,18 @@
         </w:tc>
         <w:tc>
           <w:tcPr>
-            <w:tcW w:type="dxa" w:w="1100"/>
+            <w:tcW w:type="dxa" w:w="1060"/>
             <w:tcBorders>
               <w:top w:val="none" w:color="FFFFFF" w:sz="0"/>
               <w:left w:val="none" w:color="FFFFFF" w:sz="0"/>
-              <w:bottom w:val="single" w:color="000000" w:sz="4"/>
-              <w:right w:val="none" w:color="FFFFFF" w:sz="0"/>
-            </w:tcBorders>
-            <w:tcMar>
-              <w:top w:type="dxa" w:w="30"/>
-              <w:left w:type="dxa" w:w="50"/>
-              <w:bottom w:type="dxa" w:w="30"/>
-              <w:right w:type="dxa" w:w="50"/>
+              <w:bottom w:val="none" w:color="FFFFFF" w:sz="0"/>
+              <w:right w:val="none" w:color="FFFFFF" w:sz="0"/>
+            </w:tcBorders>
+            <w:tcMar>
+              <w:top w:type="dxa" w:w="25"/>
+              <w:left w:type="dxa" w:w="40"/>
+              <w:bottom w:type="dxa" w:w="25"/>
+              <w:right w:type="dxa" w:w="40"/>
             </w:tcMar>
           </w:tcPr>
           <w:p>
@@ -3073,7 +3316,7 @@
       <w:tr>
         <w:tc>
           <w:tcPr>
-            <w:tcW w:type="dxa" w:w="900"/>
+            <w:tcW w:type="dxa" w:w="1080"/>
             <w:tcBorders>
               <w:top w:val="none" w:color="FFFFFF" w:sz="0"/>
               <w:left w:val="none" w:color="FFFFFF" w:sz="0"/>
@@ -3081,10 +3324,10 @@
               <w:right w:val="none" w:color="FFFFFF" w:sz="0"/>
             </w:tcBorders>
             <w:tcMar>
-              <w:top w:type="dxa" w:w="30"/>
-              <w:left w:type="dxa" w:w="50"/>
-              <w:bottom w:type="dxa" w:w="30"/>
-              <w:right w:type="dxa" w:w="50"/>
+              <w:top w:type="dxa" w:w="25"/>
+              <w:left w:type="dxa" w:w="40"/>
+              <w:bottom w:type="dxa" w:w="25"/>
+              <w:right w:type="dxa" w:w="40"/>
             </w:tcMar>
           </w:tcPr>
           <w:p>
@@ -3108,7 +3351,7 @@
         </w:tc>
         <w:tc>
           <w:tcPr>
-            <w:tcW w:type="dxa" w:w="600"/>
+            <w:tcW w:type="dxa" w:w="380"/>
             <w:tcBorders>
               <w:top w:val="none" w:color="FFFFFF" w:sz="0"/>
               <w:left w:val="none" w:color="FFFFFF" w:sz="0"/>
@@ -3116,10 +3359,10 @@
               <w:right w:val="none" w:color="FFFFFF" w:sz="0"/>
             </w:tcBorders>
             <w:tcMar>
-              <w:top w:type="dxa" w:w="30"/>
-              <w:left w:type="dxa" w:w="50"/>
-              <w:bottom w:type="dxa" w:w="30"/>
-              <w:right w:type="dxa" w:w="50"/>
+              <w:top w:type="dxa" w:w="25"/>
+              <w:left w:type="dxa" w:w="40"/>
+              <w:bottom w:type="dxa" w:w="25"/>
+              <w:right w:type="dxa" w:w="40"/>
             </w:tcMar>
           </w:tcPr>
           <w:p>
@@ -3143,7 +3386,7 @@
         </w:tc>
         <w:tc>
           <w:tcPr>
-            <w:tcW w:type="dxa" w:w="560"/>
+            <w:tcW w:type="dxa" w:w="520"/>
             <w:tcBorders>
               <w:top w:val="none" w:color="FFFFFF" w:sz="0"/>
               <w:left w:val="none" w:color="FFFFFF" w:sz="0"/>
@@ -3151,10 +3394,10 @@
               <w:right w:val="none" w:color="FFFFFF" w:sz="0"/>
             </w:tcBorders>
             <w:tcMar>
-              <w:top w:type="dxa" w:w="30"/>
-              <w:left w:type="dxa" w:w="50"/>
-              <w:bottom w:type="dxa" w:w="30"/>
-              <w:right w:type="dxa" w:w="50"/>
+              <w:top w:type="dxa" w:w="25"/>
+              <w:left w:type="dxa" w:w="40"/>
+              <w:bottom w:type="dxa" w:w="25"/>
+              <w:right w:type="dxa" w:w="40"/>
             </w:tcMar>
           </w:tcPr>
           <w:p>
@@ -3178,7 +3421,7 @@
         </w:tc>
         <w:tc>
           <w:tcPr>
-            <w:tcW w:type="dxa" w:w="480"/>
+            <w:tcW w:type="dxa" w:w="520"/>
             <w:tcBorders>
               <w:top w:val="none" w:color="FFFFFF" w:sz="0"/>
               <w:left w:val="none" w:color="FFFFFF" w:sz="0"/>
@@ -3186,10 +3429,10 @@
               <w:right w:val="none" w:color="FFFFFF" w:sz="0"/>
             </w:tcBorders>
             <w:tcMar>
-              <w:top w:type="dxa" w:w="30"/>
-              <w:left w:type="dxa" w:w="50"/>
-              <w:bottom w:type="dxa" w:w="30"/>
-              <w:right w:type="dxa" w:w="50"/>
+              <w:top w:type="dxa" w:w="25"/>
+              <w:left w:type="dxa" w:w="40"/>
+              <w:bottom w:type="dxa" w:w="25"/>
+              <w:right w:type="dxa" w:w="40"/>
             </w:tcMar>
           </w:tcPr>
           <w:p>
@@ -3221,10 +3464,10 @@
               <w:right w:val="none" w:color="FFFFFF" w:sz="0"/>
             </w:tcBorders>
             <w:tcMar>
-              <w:top w:type="dxa" w:w="30"/>
-              <w:left w:type="dxa" w:w="50"/>
-              <w:bottom w:type="dxa" w:w="30"/>
-              <w:right w:type="dxa" w:w="50"/>
+              <w:top w:type="dxa" w:w="25"/>
+              <w:left w:type="dxa" w:w="40"/>
+              <w:bottom w:type="dxa" w:w="25"/>
+              <w:right w:type="dxa" w:w="40"/>
             </w:tcMar>
           </w:tcPr>
           <w:p>
@@ -3248,7 +3491,7 @@
         </w:tc>
         <w:tc>
           <w:tcPr>
-            <w:tcW w:type="dxa" w:w="1100"/>
+            <w:tcW w:type="dxa" w:w="1060"/>
             <w:tcBorders>
               <w:top w:val="none" w:color="FFFFFF" w:sz="0"/>
               <w:left w:val="none" w:color="FFFFFF" w:sz="0"/>
@@ -3256,10 +3499,10 @@
               <w:right w:val="none" w:color="FFFFFF" w:sz="0"/>
             </w:tcBorders>
             <w:tcMar>
-              <w:top w:type="dxa" w:w="30"/>
-              <w:left w:type="dxa" w:w="50"/>
-              <w:bottom w:type="dxa" w:w="30"/>
-              <w:right w:type="dxa" w:w="50"/>
+              <w:top w:type="dxa" w:w="25"/>
+              <w:left w:type="dxa" w:w="40"/>
+              <w:bottom w:type="dxa" w:w="25"/>
+              <w:right w:type="dxa" w:w="40"/>
             </w:tcMar>
           </w:tcPr>
           <w:p>
@@ -3285,7 +3528,7 @@
     </w:tbl>
     <w:p>
       <w:pPr>
-        <w:spacing w:after="80"/>
+        <w:spacing w:after="60"/>
       </w:pPr>
       <w:r>
         <w:rPr>
@@ -3303,6 +3546,107 @@
     </w:p>
     <w:p>
       <w:pPr>
+        <w:keepNext/>
+        <w:spacing w:after="30" w:before="80"/>
+        <w:jc w:val="center"/>
+      </w:pPr>
+      <w:r>
+        <w:drawing>
+          <wp:inline distT="0" distB="0" distL="0" distR="0">
+            <wp:extent cx="3124200" cy="1571625"/>
+            <wp:effectExtent t="0" r="0" b="0" l="0"/>
+            <wp:docPr id="5" name="" descr="" title=""/>
+            <wp:cNvGraphicFramePr>
+              <a:graphicFrameLocks xmlns:a="http://schemas.openxmlformats.org/drawingml/2006/main" noChangeAspect="1"/>
+            </wp:cNvGraphicFramePr>
+            <a:graphic xmlns:a="http://schemas.openxmlformats.org/drawingml/2006/main">
+              <a:graphicData uri="http://schemas.openxmlformats.org/drawingml/2006/picture">
+                <pic:pic xmlns:pic="http://schemas.openxmlformats.org/drawingml/2006/picture">
+                  <pic:nvPicPr>
+                    <pic:cNvPr id="0" name="" descr=""/>
+                    <pic:cNvPicPr>
+                      <a:picLocks noChangeAspect="1" noChangeArrowheads="1"/>
+                    </pic:cNvPicPr>
+                  </pic:nvPicPr>
+                  <pic:blipFill>
+                    <a:blip r:embed="rId11" cstate="none"/>
+                    <a:srcRect/>
+                    <a:stretch>
+                      <a:fillRect/>
+                    </a:stretch>
+                  </pic:blipFill>
+                  <pic:spPr bwMode="auto">
+                    <a:xfrm>
+                      <a:off x="0" y="0"/>
+                      <a:ext cx="3124200" cy="1571625"/>
+                    </a:xfrm>
+                    <a:prstGeom prst="rect">
+                      <a:avLst/>
+                    </a:prstGeom>
+                  </pic:spPr>
+                </pic:pic>
+              </a:graphicData>
+            </a:graphic>
+          </wp:inline>
+        </w:drawing>
+      </w:r>
+    </w:p>
+    <w:p>
+      <w:pPr>
+        <w:spacing w:after="100"/>
+        <w:jc w:val="both"/>
+      </w:pPr>
+      <w:r>
+        <w:rPr>
+          <w:rFonts w:ascii="Times New Roman" w:cs="Times New Roman" w:eastAsia="Times New Roman" w:hAnsi="Times New Roman"/>
+          <w:b w:val="false"/>
+          <w:bCs w:val="false"/>
+          <w:i w:val="false"/>
+          <w:iCs w:val="false"/>
+          <w:smallCaps w:val="false"/>
+          <w:sz w:val="16"/>
+          <w:szCs w:val="16"/>
+        </w:rPr>
+        <w:t xml:space="preserve">Fig. 5.  </w:t>
+      </w:r>
+      <w:r>
+        <w:rPr>
+          <w:rFonts w:ascii="Times New Roman" w:cs="Times New Roman" w:eastAsia="Times New Roman" w:hAnsi="Times New Roman"/>
+          <w:b w:val="false"/>
+          <w:bCs w:val="false"/>
+          <w:i w:val="false"/>
+          <w:iCs w:val="false"/>
+          <w:smallCaps w:val="false"/>
+          <w:sz w:val="16"/>
+          <w:szCs w:val="16"/>
+        </w:rPr>
+        <w:t xml:space="preserve">Mean detector score with intent withheld and with full context; dashed lines mark default thresholds.</w:t>
+      </w:r>
+    </w:p>
+    <w:p>
+      <w:pPr>
+        <w:keepNext w:val="false"/>
+        <w:spacing w:after="40" w:before="0" w:line="240"/>
+        <w:ind w:firstLine="202"/>
+        <w:jc w:val="both"/>
+      </w:pPr>
+      <w:r>
+        <w:rPr>
+          <w:rFonts w:ascii="Times New Roman" w:cs="Times New Roman" w:eastAsia="Times New Roman" w:hAnsi="Times New Roman"/>
+          <w:b w:val="false"/>
+          <w:bCs w:val="false"/>
+          <w:i w:val="false"/>
+          <w:iCs w:val="false"/>
+          <w:smallCaps w:val="false"/>
+          <w:sz w:val="20"/>
+          <w:szCs w:val="20"/>
+        </w:rPr>
+        <w:t xml:space="preserve">The heuristic never asked on a full-context instance but found only 21% of stripped ones—the recall limit of Section V-C. The uncertainty detectors cost eight calls per decision and were run on 4 instances. At their default thresholds both asked on every decision. Sampling dispersion separated the contexts (0.70 vs 0.56); re-sweeping its recorded scores suggests a threshold near 0.60 would separate them, which we report as a diagnosis rather than adopt, since those scores come from the study set. Prompt perturbation did not separate them (0.85 vs 0.85).</w:t>
+      </w:r>
+    </w:p>
+    <w:p>
+      <w:pPr>
+        <w:keepNext/>
         <w:spacing w:after="80" w:before="160"/>
         <w:jc w:val="center"/>
       </w:pPr>
@@ -3330,12 +3674,13 @@
           <w:sz w:val="20"/>
           <w:szCs w:val="20"/>
         </w:rPr>
-        <w:t xml:space="preserve">Threats to Validity</w:t>
-      </w:r>
-    </w:p>
-    <w:p>
-      <w:pPr>
-        <w:spacing w:after="60" w:before="0" w:line="240"/>
+        <w:t xml:space="preserve">Discussion</w:t>
+      </w:r>
+    </w:p>
+    <w:p>
+      <w:pPr>
+        <w:keepNext w:val="false"/>
+        <w:spacing w:after="40" w:before="0" w:line="240"/>
         <w:ind w:firstLine="202"/>
         <w:jc w:val="both"/>
       </w:pPr>
@@ -3350,12 +3695,13 @@
           <w:sz w:val="20"/>
           <w:szCs w:val="20"/>
         </w:rPr>
-        <w:t xml:space="preserve">The sample is small. Free-tier daily quotas, applied per model, bounded the number of instances, and confidence intervals are correspondingly wide; we report every completed instance rather than a selected subset. The judge is an LLM and has not yet been validated against human scoring; we provide a stratified sample and agreement tooling for that purpose. The simulated author answers only from withheld text and its exchanges are logged, but leakage cannot be excluded without audit. We also report a protocol deviation: in the first v2 run the simulated author's token budget was exhausted by the model's hidden reasoning, returning empty answers, and its prompt refused questions phrased in terms of code it had not seen. Both were corrected and the treatment condition re-run for the affected instances only; floor and ceiling runs were not repeated. The prompt change was made after observing refusals, and both versions are logged with every exchange. Mutants are verified by execution, yet the mutation operators produce simple defects that may be easier or harder to detect than natural ones. All verified mutants come from one repository, sympy, because it could be tested in the available environment. Every model used is a free-tier model, and the reviewer is a small one; its low defect-detection rate even with full context may not hold for stronger reviewers.</w:t>
-      </w:r>
-    </w:p>
-    <w:p>
-      <w:pPr>
-        <w:spacing w:after="60" w:before="0" w:line="240"/>
+        <w:t xml:space="preserve">Asking is cheap to add and hard to target. Once a question reached an author who could answer it, the answer did what it was meant to do; nearly all of the loss happened earlier, in deciding when to ask. This shifts the research problem: the quality of a clarifying question matters less than the recall of the decision to pose one, at a precision that keeps the tool tolerable. A detector built from diff features was precise and conservative; a sampling-based detector separated the conditions but needs calibration on held-out data.</w:t>
+      </w:r>
+    </w:p>
+    <w:p>
+      <w:pPr>
+        <w:keepNext w:val="false"/>
+        <w:spacing w:after="40" w:before="0" w:line="240"/>
         <w:ind w:firstLine="202"/>
         <w:jc w:val="both"/>
       </w:pPr>
@@ -3370,11 +3716,33 @@
           <w:sz w:val="20"/>
           <w:szCs w:val="20"/>
         </w:rPr>
-        <w:t xml:space="preserve">The detector comparison uses constructed labels; the classifier awaits the planned human-labelled set, and its absence means one of the four designs is not evaluated here.</w:t>
-      </w:r>
-    </w:p>
-    <w:p>
-      <w:pPr>
+        <w:t xml:space="preserve">Golden patches are a poor population for studying ambiguity. Well-written fixes state their purpose in the code, comments and docstrings they add; evaluating intent-dependent review requires withholding all of it, and even then most changes remain self-explanatory. Benchmarks of genuinely under-specified changes would strengthen this line of work.</w:t>
+      </w:r>
+    </w:p>
+    <w:p>
+      <w:pPr>
+        <w:keepNext w:val="false"/>
+        <w:spacing w:after="40" w:before="0" w:line="240"/>
+        <w:ind w:firstLine="202"/>
+        <w:jc w:val="both"/>
+      </w:pPr>
+      <w:r>
+        <w:rPr>
+          <w:rFonts w:ascii="Times New Roman" w:cs="Times New Roman" w:eastAsia="Times New Roman" w:hAnsi="Times New Roman"/>
+          <w:b w:val="false"/>
+          <w:bCs w:val="false"/>
+          <w:i w:val="false"/>
+          <w:iCs w:val="false"/>
+          <w:smallCaps w:val="false"/>
+          <w:sz w:val="20"/>
+          <w:szCs w:val="20"/>
+        </w:rPr>
+        <w:t xml:space="preserve">Finally, clarification cannot exceed the reviewer. On a small free-tier model, full context did not make the reviewer catch injected defects, so detection gains, if they exist, require a stronger reviewer before intent can matter.</w:t>
+      </w:r>
+    </w:p>
+    <w:p>
+      <w:pPr>
+        <w:keepNext/>
         <w:spacing w:after="80" w:before="160"/>
         <w:jc w:val="center"/>
       </w:pPr>
@@ -3402,12 +3770,13 @@
           <w:sz w:val="20"/>
           <w:szCs w:val="20"/>
         </w:rPr>
-        <w:t xml:space="preserve">Conclusion</w:t>
-      </w:r>
-    </w:p>
-    <w:p>
-      <w:pPr>
-        <w:spacing w:after="60" w:before="0" w:line="240"/>
+        <w:t xml:space="preserve">Threats to Validity</w:t>
+      </w:r>
+    </w:p>
+    <w:p>
+      <w:pPr>
+        <w:keepNext w:val="false"/>
+        <w:spacing w:after="40" w:before="0" w:line="240"/>
         <w:ind w:firstLine="202"/>
         <w:jc w:val="both"/>
       </w:pPr>
@@ -3422,11 +3791,12 @@
           <w:sz w:val="20"/>
           <w:szCs w:val="20"/>
         </w:rPr>
-        <w:t xml:space="preserve">ClarifyReview inserts a decision before critique: ask the author when the intent of a change cannot be read from the change itself. Our pilot showed that evaluating this idea on golden patches requires withholding more than the linked issue, because well-written patches document their own intent; the revised design withholds all natural-language intent and adds execution-verified defects. The system, harness, verified mutants and all results are released. On 36 complete instances clarification recovered 0.17 of the gap between floor and ceiling; the effect is not significant at this sample size, and the trace through detection, answering and recovery locates the limit in the detector's recall rather than in the usefulness of an answer once given. Remaining work is a human-labelled set for the classifier, human validation of the judge, a paired developer study of perceived trust and usefulness, and a larger run beyond free-tier limits.</w:t>
-      </w:r>
-    </w:p>
-    <w:p>
-      <w:pPr>
+        <w:t xml:space="preserve">The sample is small (36 instances under per-model daily quotas), so intervals are wide. The judge has not yet been validated against human scoring; a stratified sample and agreement tooling (Cohen's κ [15]) are provided. The simulated author answers from withheld text only, but leakage requires the hand audit the tooling prepares. We report a protocol deviation: in the first v2 run the simulated author's token budget was exhausted by its model's hidden reasoning, returning empty answers, and its prompt refused questions phrased in terms of unseen code. Both were corrected and the treatment re-run for the six affected instances; floor and ceiling were not re-run, and the prompt revision, made after observing refusals, is logged with every exchange. All verified mutants come from sympy and the operators produce simple defects. The reviewer is a small model; results may differ for stronger ones.</w:t>
+      </w:r>
+    </w:p>
+    <w:p>
+      <w:pPr>
+        <w:keepNext/>
         <w:spacing w:after="80" w:before="160"/>
         <w:jc w:val="center"/>
       </w:pPr>
@@ -3441,8 +3811,88 @@
           <w:sz w:val="20"/>
           <w:szCs w:val="20"/>
         </w:rPr>
-        <w:t xml:space="preserve">. </w:t>
-      </w:r>
+        <w:t xml:space="preserve">VIII. </w:t>
+      </w:r>
+      <w:r>
+        <w:rPr>
+          <w:rFonts w:ascii="Times New Roman" w:cs="Times New Roman" w:eastAsia="Times New Roman" w:hAnsi="Times New Roman"/>
+          <w:b w:val="false"/>
+          <w:bCs w:val="false"/>
+          <w:i w:val="false"/>
+          <w:iCs w:val="false"/>
+          <w:smallCaps/>
+          <w:sz w:val="20"/>
+          <w:szCs w:val="20"/>
+        </w:rPr>
+        <w:t xml:space="preserve">Conclusion</w:t>
+      </w:r>
+    </w:p>
+    <w:p>
+      <w:pPr>
+        <w:keepNext w:val="false"/>
+        <w:spacing w:after="40" w:before="0" w:line="240"/>
+        <w:ind w:firstLine="202"/>
+        <w:jc w:val="both"/>
+      </w:pPr>
+      <w:r>
+        <w:rPr>
+          <w:rFonts w:ascii="Times New Roman" w:cs="Times New Roman" w:eastAsia="Times New Roman" w:hAnsi="Times New Roman"/>
+          <w:b w:val="false"/>
+          <w:bCs w:val="false"/>
+          <w:i w:val="false"/>
+          <w:iCs w:val="false"/>
+          <w:smallCaps w:val="false"/>
+          <w:sz w:val="20"/>
+          <w:szCs w:val="20"/>
+        </w:rPr>
+        <w:t xml:space="preserve">ClarifyReview inserts a decision before critique: ask the author when the intent of a change cannot be read from the change. Evaluating the idea required withholding all natural-language intent, because golden patches document their own. With that manipulation, clarification recovered 0.17 of the intent gap on 36 instances—in the expected direction, not significant at this size—and a per-instance trace shows it succeeded where it was given the chance, with detector recall as the limit. Future work is a human-labelled set to train and calibrate the detectors, human validation of the judge, a paired developer study of usefulness and trust, and a larger run with a stronger reviewer.</w:t>
+      </w:r>
+    </w:p>
+    <w:p>
+      <w:pPr>
+        <w:spacing w:after="60" w:before="120"/>
+        <w:jc w:val="center"/>
+      </w:pPr>
+      <w:r>
+        <w:rPr>
+          <w:rFonts w:ascii="Times New Roman" w:cs="Times New Roman" w:eastAsia="Times New Roman" w:hAnsi="Times New Roman"/>
+          <w:b w:val="false"/>
+          <w:bCs w:val="false"/>
+          <w:i w:val="false"/>
+          <w:iCs w:val="false"/>
+          <w:smallCaps/>
+          <w:sz w:val="20"/>
+          <w:szCs w:val="20"/>
+        </w:rPr>
+        <w:t xml:space="preserve">Acknowledgment</w:t>
+      </w:r>
+    </w:p>
+    <w:p>
+      <w:pPr>
+        <w:keepNext w:val="false"/>
+        <w:spacing w:after="40" w:before="0" w:line="240"/>
+        <w:ind w:firstLine="202"/>
+        <w:jc w:val="both"/>
+      </w:pPr>
+      <w:r>
+        <w:rPr>
+          <w:rFonts w:ascii="Times New Roman" w:cs="Times New Roman" w:eastAsia="Times New Roman" w:hAnsi="Times New Roman"/>
+          <w:b w:val="false"/>
+          <w:bCs w:val="false"/>
+          <w:i w:val="false"/>
+          <w:iCs w:val="false"/>
+          <w:smallCaps w:val="false"/>
+          <w:sz w:val="20"/>
+          <w:szCs w:val="20"/>
+        </w:rPr>
+        <w:t xml:space="preserve">The authors thank the School of Computer Science and Engineering, Vellore Institute of Technology, for supporting this work.</w:t>
+      </w:r>
+    </w:p>
+    <w:p>
+      <w:pPr>
+        <w:spacing w:after="60" w:before="120"/>
+        <w:jc w:val="center"/>
+      </w:pPr>
       <w:r>
         <w:rPr>
           <w:rFonts w:ascii="Times New Roman" w:cs="Times New Roman" w:eastAsia="Times New Roman" w:hAnsi="Times New Roman"/>
@@ -3474,7 +3924,7 @@
           <w:sz w:val="16"/>
           <w:szCs w:val="16"/>
         </w:rPr>
-        <w:t xml:space="preserve">[1]  F. Mu, X. Chen, L. Shi, S. Wang, and Q. Wang, "ClarifyGPT: Empowering LLM-based code generation with intention clarification," arXiv:2310.10996, 2023.</w:t>
+        <w:t xml:space="preserve">[1]  A. Bacchelli and C. Bird, "Expectations, outcomes, and challenges of modern code review," in Proc. ICSE, 2013, pp. 712-721.</w:t>
       </w:r>
     </w:p>
     <w:p>
@@ -3494,7 +3944,7 @@
           <w:sz w:val="16"/>
           <w:szCs w:val="16"/>
         </w:rPr>
-        <w:t xml:space="preserve">[2]  S. Fakhoury, A. Naik, G. Sakkas, S. Chakraborty, and S. K. Lahiri, "LLM-based test-driven interactive code generation: User study and empirical evaluation," IEEE Trans. Softw. Eng., 2024.</w:t>
+        <w:t xml:space="preserve">[2]  C. Sadowski, E. Söderberg, L. Church, M. Sipko, and A. Bacchelli, "Modern code review: A case study at Google," in Proc. ICSE-SEIP, 2018, pp. 181-190.</w:t>
       </w:r>
     </w:p>
     <w:p>
@@ -3514,7 +3964,7 @@
           <w:sz w:val="16"/>
           <w:szCs w:val="16"/>
         </w:rPr>
-        <w:t xml:space="preserve">[3]  C. E. Jimenez, J. Yang, A. Wettig, S. Yao, K. Pei, O. Press, and K. Narasimhan, "SWE-bench: Can language models resolve real-world GitHub issues?" in Proc. ICLR, 2024.</w:t>
+        <w:t xml:space="preserve">[3]  Greptile, "Best AI code review tools 2026—comparison benchmarks," greptile.com, 2026; Morph, "GitHub AI code review: 6 tools tested on real PRs," morphllm.com, 2026.</w:t>
       </w:r>
     </w:p>
     <w:p>
@@ -3534,7 +3984,7 @@
           <w:sz w:val="16"/>
           <w:szCs w:val="16"/>
         </w:rPr>
-        <w:t xml:space="preserve">[4]  X. Wang, J. Wei, D. Schuurmans, Q. Le, E. Chi, S. Narang, A. Chowdhery, and D. Zhou, "Self-consistency improves chain of thought reasoning in language models," in Proc. ICLR, 2023.</w:t>
+        <w:t xml:space="preserve">[4]  F. Mu, X. Chen, L. Shi, S. Wang, and Q. Wang, "ClarifyGPT: Empowering LLM-based code generation with intention clarification," arXiv:2310.10996, 2023.</w:t>
       </w:r>
     </w:p>
     <w:p>
@@ -3554,7 +4004,7 @@
           <w:sz w:val="16"/>
           <w:szCs w:val="16"/>
         </w:rPr>
-        <w:t xml:space="preserve">[5]  L. Kuhn, Y. Gal, and S. Farquhar, "Semantic uncertainty: Linguistic invariances for uncertainty estimation in natural language generation," in Proc. ICLR, 2023.</w:t>
+        <w:t xml:space="preserve">[5]  S. Fakhoury, A. Naik, G. Sakkas, S. Chakraborty, and S. K. Lahiri, "LLM-based test-driven interactive code generation: User study and empirical evaluation," IEEE Trans. Softw. Eng., vol. 50, no. 9, pp. 2254-2268, 2024.</w:t>
       </w:r>
     </w:p>
     <w:p>
@@ -3574,7 +4024,7 @@
           <w:sz w:val="16"/>
           <w:szCs w:val="16"/>
         </w:rPr>
-        <w:t xml:space="preserve">[6]  Greptile, "Best AI code review tools 2026—comparison benchmarks," greptile.com, 2026.</w:t>
+        <w:t xml:space="preserve">[6]  C. E. Jimenez, J. Yang, A. Wettig, S. Yao, K. Pei, O. Press, and K. Narasimhan, "SWE-bench: Can language models resolve real-world GitHub issues?" in Proc. ICLR, 2024.</w:t>
       </w:r>
     </w:p>
     <w:p>
@@ -3594,7 +4044,7 @@
           <w:sz w:val="16"/>
           <w:szCs w:val="16"/>
         </w:rPr>
-        <w:t xml:space="preserve">[7]  Stork.AI, "Best AI code review tools 2026: CodeRabbit vs. Greptile vs. Qodo," stork.ai, 2026.</w:t>
+        <w:t xml:space="preserve">[7]  R. Tufano, L. Pascarella, M. Tufano, D. Poshyvanyk, and G. Bavota, "Towards automating code review activities," in Proc. ICSE, 2021, pp. 163-174.</w:t>
       </w:r>
     </w:p>
     <w:p>
@@ -3614,7 +4064,147 @@
           <w:sz w:val="16"/>
           <w:szCs w:val="16"/>
         </w:rPr>
-        <w:t xml:space="preserve">[8]  Morph, "GitHub AI code review: 6 tools tested on real PRs," morphllm.com, 2026.</w:t>
+        <w:t xml:space="preserve">[8]  Z. Li et al., "Automating code review activities by large-scale pre-training," in Proc. ESEC/FSE, 2022, pp. 1035-1047.</w:t>
+      </w:r>
+    </w:p>
+    <w:p>
+      <w:pPr>
+        <w:spacing w:after="30"/>
+        <w:ind w:left="300" w:hanging="300"/>
+        <w:jc w:val="both"/>
+      </w:pPr>
+      <w:r>
+        <w:rPr>
+          <w:rFonts w:ascii="Times New Roman" w:cs="Times New Roman" w:eastAsia="Times New Roman" w:hAnsi="Times New Roman"/>
+          <w:b w:val="false"/>
+          <w:bCs w:val="false"/>
+          <w:i w:val="false"/>
+          <w:iCs w:val="false"/>
+          <w:smallCaps w:val="false"/>
+          <w:sz w:val="16"/>
+          <w:szCs w:val="16"/>
+        </w:rPr>
+        <w:t xml:space="preserve">[9]  X. Wang, J. Wei, D. Schuurmans, Q. Le, E. Chi, S. Narang, A. Chowdhery, and D. Zhou, "Self-consistency improves chain of thought reasoning in language models," in Proc. ICLR, 2023.</w:t>
+      </w:r>
+    </w:p>
+    <w:p>
+      <w:pPr>
+        <w:spacing w:after="30"/>
+        <w:ind w:left="300" w:hanging="300"/>
+        <w:jc w:val="both"/>
+      </w:pPr>
+      <w:r>
+        <w:rPr>
+          <w:rFonts w:ascii="Times New Roman" w:cs="Times New Roman" w:eastAsia="Times New Roman" w:hAnsi="Times New Roman"/>
+          <w:b w:val="false"/>
+          <w:bCs w:val="false"/>
+          <w:i w:val="false"/>
+          <w:iCs w:val="false"/>
+          <w:smallCaps w:val="false"/>
+          <w:sz w:val="16"/>
+          <w:szCs w:val="16"/>
+        </w:rPr>
+        <w:t xml:space="preserve">[10]  L. Kuhn, Y. Gal, and S. Farquhar, "Semantic uncertainty: Linguistic invariances for uncertainty estimation in natural language generation," in Proc. ICLR, 2023.</w:t>
+      </w:r>
+    </w:p>
+    <w:p>
+      <w:pPr>
+        <w:spacing w:after="30"/>
+        <w:ind w:left="300" w:hanging="300"/>
+        <w:jc w:val="both"/>
+      </w:pPr>
+      <w:r>
+        <w:rPr>
+          <w:rFonts w:ascii="Times New Roman" w:cs="Times New Roman" w:eastAsia="Times New Roman" w:hAnsi="Times New Roman"/>
+          <w:b w:val="false"/>
+          <w:bCs w:val="false"/>
+          <w:i w:val="false"/>
+          <w:iCs w:val="false"/>
+          <w:smallCaps w:val="false"/>
+          <w:sz w:val="16"/>
+          <w:szCs w:val="16"/>
+        </w:rPr>
+        <w:t xml:space="preserve">[11]  OpenAI, "Introducing SWE-bench Verified," openai.com, 2024.</w:t>
+      </w:r>
+    </w:p>
+    <w:p>
+      <w:pPr>
+        <w:spacing w:after="30"/>
+        <w:ind w:left="300" w:hanging="300"/>
+        <w:jc w:val="both"/>
+      </w:pPr>
+      <w:r>
+        <w:rPr>
+          <w:rFonts w:ascii="Times New Roman" w:cs="Times New Roman" w:eastAsia="Times New Roman" w:hAnsi="Times New Roman"/>
+          <w:b w:val="false"/>
+          <w:bCs w:val="false"/>
+          <w:i w:val="false"/>
+          <w:iCs w:val="false"/>
+          <w:smallCaps w:val="false"/>
+          <w:sz w:val="16"/>
+          <w:szCs w:val="16"/>
+        </w:rPr>
+        <w:t xml:space="preserve">[12]  Y. Jia and M. Harman, "An analysis and survey of the development of mutation testing," IEEE Trans. Softw. Eng., vol. 37, no. 5, pp. 649-678, 2011.</w:t>
+      </w:r>
+    </w:p>
+    <w:p>
+      <w:pPr>
+        <w:spacing w:after="30"/>
+        <w:ind w:left="300" w:hanging="300"/>
+        <w:jc w:val="both"/>
+      </w:pPr>
+      <w:r>
+        <w:rPr>
+          <w:rFonts w:ascii="Times New Roman" w:cs="Times New Roman" w:eastAsia="Times New Roman" w:hAnsi="Times New Roman"/>
+          <w:b w:val="false"/>
+          <w:bCs w:val="false"/>
+          <w:i w:val="false"/>
+          <w:iCs w:val="false"/>
+          <w:smallCaps w:val="false"/>
+          <w:sz w:val="16"/>
+          <w:szCs w:val="16"/>
+        </w:rPr>
+        <w:t xml:space="preserve">[13]  L. Zheng et al., "Judging LLM-as-a-judge with MT-Bench and Chatbot Arena," in Proc. NeurIPS Datasets and Benchmarks Track, 2023.</w:t>
+      </w:r>
+    </w:p>
+    <w:p>
+      <w:pPr>
+        <w:spacing w:after="30"/>
+        <w:ind w:left="300" w:hanging="300"/>
+        <w:jc w:val="both"/>
+      </w:pPr>
+      <w:r>
+        <w:rPr>
+          <w:rFonts w:ascii="Times New Roman" w:cs="Times New Roman" w:eastAsia="Times New Roman" w:hAnsi="Times New Roman"/>
+          <w:b w:val="false"/>
+          <w:bCs w:val="false"/>
+          <w:i w:val="false"/>
+          <w:iCs w:val="false"/>
+          <w:smallCaps w:val="false"/>
+          <w:sz w:val="16"/>
+          <w:szCs w:val="16"/>
+        </w:rPr>
+        <w:t xml:space="preserve">[14]  Q. McNemar, "Note on the sampling error of the difference between correlated proportions or percentages," Psychometrika, vol. 12, no. 2, pp. 153-157, 1947.</w:t>
+      </w:r>
+    </w:p>
+    <w:p>
+      <w:pPr>
+        <w:spacing w:after="30"/>
+        <w:ind w:left="300" w:hanging="300"/>
+        <w:jc w:val="both"/>
+      </w:pPr>
+      <w:r>
+        <w:rPr>
+          <w:rFonts w:ascii="Times New Roman" w:cs="Times New Roman" w:eastAsia="Times New Roman" w:hAnsi="Times New Roman"/>
+          <w:b w:val="false"/>
+          <w:bCs w:val="false"/>
+          <w:i w:val="false"/>
+          <w:iCs w:val="false"/>
+          <w:smallCaps w:val="false"/>
+          <w:sz w:val="16"/>
+          <w:szCs w:val="16"/>
+        </w:rPr>
+        <w:t xml:space="preserve">[15]  J. Cohen, "A coefficient of agreement for nominal scales," Educ. Psychol. Meas., vol. 20, no. 1, pp. 37-46, 1960.</w:t>
       </w:r>
     </w:p>
     <w:sectPr>

</xml_diff>

<commit_message>
Update the paper, report and deck with v3 and the judge calibration
numbers.json gains the v3 local study (agent judge, with the llama judge kept for
reference), the v3 design and setup, the judge-agreement tables, the v2 re-score,
the real-PR set and the v2 token totals, all computed from the study databases with
acceptance asserts. Prose lives in docs/prose_v3.json and may cite numbers only
through tokens; builders fail on an empty slot. Fixes stale claims (test count,
judge validated against humans, multi-language out of scope) and adds figures
15-18.

Co-Authored-By: Claude Opus 5.5 <noreply@anthropic.com>
</commit_message>
<xml_diff>
--- a/paper/ClarifyReview_Paper_Draft.docx
+++ b/paper/ClarifyReview_Paper_Draft.docx
@@ -108,7 +108,7 @@
           <w:sz w:val="18"/>
           <w:szCs w:val="18"/>
         </w:rPr>
-        <w:t xml:space="preserve">—LLM-based pull request reviewers read a change once, infer what its author intended, and comment on that inference; when the intent is ambiguous they guess. We present ClarifyReview, a reviewer that decides before critiquing whether the available context is sufficient, and asks the author a targeted question when it is not. Its single-pass baseline is the same pipeline with a detector that never asks, so the two differ in one stage. We evaluate it in a two-by-three ablation on SWE-bench Verified, crossing correct and execution-verified defective patches (32 mutants) with three conditions: intent withheld, intent withheld with clarification, and full context. A pilot showed that withholding only the linked issue leaves intent recoverable from the patch itself; withholding every natural-language statement of intent opened a gap. On 36 instances, intent recovery was 81% without clarification, 83% with it and 97% with full context (gap recovery 0.17, McNemar p = 1.00). Tracing each instance shows that clarification recovered intent where it was given the chance, and that the binding limit is detector recall: the detector flagged 2 of the 7 changes the reviewer misread. Defect detection was low in every condition, including full context, so it is limited by the reviewer rather than by missing intent. We release the system, harness, verified mutants and study log.</w:t>
+        <w:t xml:space="preserve">—LLM-based pull request reviewers read a change once, infer what its author intended, and comment on that inference; when the intent is ambiguous they guess. We present ClarifyReview, a reviewer that decides before critiquing whether the available context is sufficient, and asks the author a targeted question when it is not. Its single-pass baseline is the same pipeline with a detector that never asks, so the two differ in one stage. We evaluate it in a two-by-three ablation on SWE-bench Verified, crossing correct and execution-verified defective patches (32 mutants) with three conditions: intent withheld, intent withheld with clarification, and full context. A pilot showed that withholding only the linked issue leaves intent recoverable from the patch itself; withholding every natural-language statement of intent opened a gap. On 36 instances, intent recovery was 81% without clarification, 83% with it and 97% with full context (gap recovery 0.17, McNemar p = 1.00). Tracing each instance shows that clarification recovered intent where it was given the chance, and that the binding limit is detector recall: the detector flagged 2 of the 7 changes the reviewer misread. Defect detection was low in every condition, including full context, so it is limited by the reviewer rather than by missing intent. A replication with a local model (qwen3:4b-instruct-2507-q4_K_M) on 96 instances finds intent recovery of 67% without clarification, 70% with it and 100% with full context. Gap recovery was 0.09 (interval -0.22 to 0.33), not significant, and the upper limit rules out recovering more than a third of the gap. Re-scoring with the agent judge preserved this verdict but not the effect size. We release the system, harness, verified mutants and study log.</w:t>
       </w:r>
     </w:p>
     <w:p>
@@ -243,7 +243,7 @@
           <w:sz w:val="20"/>
           <w:szCs w:val="20"/>
         </w:rPr>
-        <w:t xml:space="preserve">Clarification-seeking improves code generation [4], [5], but we are not aware of work applying it to review of an existing change, where a wrong guess costs a human reviewer's attention rather than a compiler cycle. We ask whether a reviewer that asks before critiquing understands and detects more than one that does not. This paper makes four contributions:</w:t>
+        <w:t xml:space="preserve">Clarification-seeking improves code generation [4], [5], but we are not aware of work applying it to review of an existing change, where a wrong guess costs a human reviewer's attention rather than a compiler cycle. We ask whether a reviewer that asks before critiquing understands and detects more than one that does not. This paper makes five contributions:</w:t>
       </w:r>
     </w:p>
     <w:p>
@@ -303,7 +303,27 @@
           <w:sz w:val="20"/>
           <w:szCs w:val="20"/>
         </w:rPr>
-        <w:t xml:space="preserve">3) a two-by-three ablation with a per-instance trace that separates the value of an answer from the chance to ask, locating the limit of the approach in detector recall; and</w:t>
+        <w:t xml:space="preserve">3) a two-by-three ablation with a per-instance trace that separates the value of an answer from the chance to ask, locating the limit of the approach in detector recall;</w:t>
+      </w:r>
+    </w:p>
+    <w:p>
+      <w:pPr>
+        <w:keepNext w:val="false"/>
+        <w:spacing w:after="40" w:before="0" w:line="240"/>
+        <w:jc w:val="both"/>
+      </w:pPr>
+      <w:r>
+        <w:rPr>
+          <w:rFonts w:ascii="Times New Roman" w:cs="Times New Roman" w:eastAsia="Times New Roman" w:hAnsi="Times New Roman"/>
+          <w:b w:val="false"/>
+          <w:bCs w:val="false"/>
+          <w:i w:val="false"/>
+          <w:iCs w:val="false"/>
+          <w:smallCaps w:val="false"/>
+          <w:sz w:val="20"/>
+          <w:szCs w:val="20"/>
+        </w:rPr>
+        <w:t xml:space="preserve">4) an account of a pilot whose principal result was a correction to the evaluation design, and of a protocol deviation, both reported in full; and</w:t>
       </w:r>
     </w:p>
     <w:p>
@@ -323,7 +343,7 @@
           <w:sz w:val="20"/>
           <w:szCs w:val="20"/>
         </w:rPr>
-        <w:t xml:space="preserve">4) an account of a pilot whose principal result was a correction to the evaluation design, and of a protocol deviation, both reported in full.</w:t>
+        <w:t xml:space="preserve">5) a judge-calibration analysis of AI-vs-AI agreement across three AI judges, and a replication on a local reviewer that is reported separately from the original study.</w:t>
       </w:r>
     </w:p>
     <w:p>
@@ -570,7 +590,7 @@
           <w:sz w:val="20"/>
           <w:szCs w:val="20"/>
         </w:rPr>
-        <w:t xml:space="preserve">ClarifyReview has four stages (Fig. 1). Stage 1 parses the diff and resolves changed lines to changed symbols with the Python abstract syntax tree, assembling a bounded context in a deterministic order and fingerprinting it. Stage 2 decides whether to ask. Stage 3 generates at most two questions—each required by its output schema to name a file, line or symbol, so that it cannot degenerate into "please explain this PR"—and sends them through a Responder. Stage 4 produces structured findings with severity, category, evidence, suggested fix and confidence.</w:t>
+        <w:t xml:space="preserve">ClarifyReview has four stages (Fig. 1). Stage 1 parses the diff and resolves changed lines to changed symbols using the Python AST for Python and tree-sitter grammars for JavaScript, TypeScript/TSX, Java, C, C++ and Rust, with Python behaviour byte-identical to before, assembling a bounded context in a deterministic order and fingerprinting it. Stage 2 decides whether to ask. Stage 3 generates at most two questions—each required by its output schema to name a file, line or symbol, so that it cannot degenerate into "please explain this PR"—and sends them through a Responder. Stage 4 produces structured findings with severity, category, evidence, suggested fix and confidence.</w:t>
       </w:r>
     </w:p>
     <w:p>
@@ -729,7 +749,7 @@
           <w:sz w:val="20"/>
           <w:szCs w:val="20"/>
         </w:rPr>
-        <w:t xml:space="preserve">The single-pass baseline is not separate code: it is the same pipeline with a detector that never asks, and a test asserts that, with the detector forced to proceed, both conditions render byte-identical prompts. Stage 3 talks to the author through a Responder protocol with three implementations—a GitHub responder that posts a comment and waits, a benchmark responder that calls a simulated author, and a null responder—so the experiment exercises the code that would be deployed. The system is written in Python, runs as a GitHub App or from a command line, records every run to an SQLite log, and is covered by 131 automated tests.</w:t>
+        <w:t xml:space="preserve">The single-pass baseline is not separate code: it is the same pipeline with a detector that never asks, and a test asserts that, with the detector forced to proceed, both conditions render byte-identical prompts. Stage 3 talks to the author through a Responder protocol with three implementations—a GitHub responder that posts a comment and waits, a benchmark responder that calls a simulated author, and a null responder—so the experiment exercises the code that would be deployed. The system is written in Python, runs as a GitHub App or from a command line, records every run to an SQLite log, and is covered by 445 automated tests. Three provider backends sit behind one interface: Gemini, Anthropic and local Ollama. The Ollama backend runs a model on the user's own machine, with no key, no traffic beyond that machine and no monetary cost. Parked runs persist in SQLite across restarts, a timeout sweep publishes reviews that go unanswered, rate limits are handled, and signed webhooks are verified. The bot has been exercised end to end on a local server, but it has not yet been run against live GitHub.</w:t>
       </w:r>
     </w:p>
     <w:p>
@@ -1068,6 +1088,46 @@
     <w:p>
       <w:pPr>
         <w:keepNext/>
+        <w:spacing w:after="40" w:before="80"/>
+      </w:pPr>
+      <w:r>
+        <w:rPr>
+          <w:rFonts w:ascii="Times New Roman" w:cs="Times New Roman" w:eastAsia="Times New Roman" w:hAnsi="Times New Roman"/>
+          <w:b w:val="false"/>
+          <w:bCs w:val="false"/>
+          <w:i/>
+          <w:iCs/>
+          <w:smallCaps w:val="false"/>
+          <w:sz w:val="20"/>
+          <w:szCs w:val="20"/>
+        </w:rPr>
+        <w:t xml:space="preserve">F. Second-model replication (v3)</w:t>
+      </w:r>
+    </w:p>
+    <w:p>
+      <w:pPr>
+        <w:keepNext w:val="false"/>
+        <w:spacing w:after="40" w:before="0" w:line="240"/>
+        <w:ind w:firstLine="202"/>
+        <w:jc w:val="both"/>
+      </w:pPr>
+      <w:r>
+        <w:rPr>
+          <w:rFonts w:ascii="Times New Roman" w:cs="Times New Roman" w:eastAsia="Times New Roman" w:hAnsi="Times New Roman"/>
+          <w:b w:val="false"/>
+          <w:bCs w:val="false"/>
+          <w:i w:val="false"/>
+          <w:iCs w:val="false"/>
+          <w:smallCaps w:val="false"/>
+          <w:sz w:val="20"/>
+          <w:szCs w:val="20"/>
+        </w:rPr>
+        <w:t xml:space="preserve">The replication uses 96 rows: the 36 rows of the original set plus 60 new rows. The set includes all 32 verified mutants, scored in both arms, and 32 golden-only rows from 7 other repositories. The reviewer was qwen3:4b-instruct-2507-q4_K_M, served through Ollama, with the heuristic detector at τ = 0.50. The 288 runs had 0 failures and took 52 minutes on a laptop GPU. The question and oracle model was llama3.2:3b, whose identity is recorded in the oracle log but not per database row. Conditions were the same as in the original study. The replication is never pooled with the original study, and the judge is chosen in Section V-G rather than here.</w:t>
+      </w:r>
+    </w:p>
+    <w:p>
+      <w:pPr>
+        <w:keepNext/>
         <w:spacing w:after="80" w:before="160"/>
         <w:jc w:val="center"/>
       </w:pPr>
@@ -3647,34 +3707,20 @@
     <w:p>
       <w:pPr>
         <w:keepNext/>
-        <w:spacing w:after="80" w:before="160"/>
-        <w:jc w:val="center"/>
-      </w:pPr>
-      <w:r>
-        <w:rPr>
-          <w:rFonts w:ascii="Times New Roman" w:cs="Times New Roman" w:eastAsia="Times New Roman" w:hAnsi="Times New Roman"/>
-          <w:b w:val="false"/>
-          <w:bCs w:val="false"/>
-          <w:i w:val="false"/>
-          <w:iCs w:val="false"/>
-          <w:smallCaps/>
-          <w:sz w:val="20"/>
-          <w:szCs w:val="20"/>
-        </w:rPr>
-        <w:t xml:space="preserve">VI. </w:t>
-      </w:r>
-      <w:r>
-        <w:rPr>
-          <w:rFonts w:ascii="Times New Roman" w:cs="Times New Roman" w:eastAsia="Times New Roman" w:hAnsi="Times New Roman"/>
-          <w:b w:val="false"/>
-          <w:bCs w:val="false"/>
-          <w:i w:val="false"/>
-          <w:iCs w:val="false"/>
-          <w:smallCaps/>
-          <w:sz w:val="20"/>
-          <w:szCs w:val="20"/>
-        </w:rPr>
-        <w:t xml:space="preserve">Discussion</w:t>
+        <w:spacing w:after="40" w:before="80"/>
+      </w:pPr>
+      <w:r>
+        <w:rPr>
+          <w:rFonts w:ascii="Times New Roman" w:cs="Times New Roman" w:eastAsia="Times New Roman" w:hAnsi="Times New Roman"/>
+          <w:b w:val="false"/>
+          <w:bCs w:val="false"/>
+          <w:i/>
+          <w:iCs/>
+          <w:smallCaps w:val="false"/>
+          <w:sz w:val="20"/>
+          <w:szCs w:val="20"/>
+        </w:rPr>
+        <w:t xml:space="preserve">F. Replication on a local reviewer</w:t>
       </w:r>
     </w:p>
     <w:p>
@@ -3695,7 +3741,1226 @@
           <w:sz w:val="20"/>
           <w:szCs w:val="20"/>
         </w:rPr>
-        <w:t xml:space="preserve">Asking is cheap to add and hard to target. Once a question reached an author who could answer it, the answer did what it was meant to do; nearly all of the loss happened earlier, in deciding when to ask. This shifts the research problem: the quality of a clarifying question matters less than the recall of the decision to pose one, at a precision that keeps the tool tolerable. A detector built from diff features was precise and conservative; a sampling-based detector separated the conditions but needs calibration on held-out data.</w:t>
+        <w:t xml:space="preserve">Table III reports the same measures as Table I for the local reviewer qwen3:4b-instruct-2507-q4_K_M, served through Ollama, with outcomes scored by the Claude agent judge claude-sonnet-agent. That judge was chosen after seeing its agreement with the local judge, as explained in Section V-G. The replication is reported separately from the original study and is never pooled with it.</w:t>
+      </w:r>
+    </w:p>
+    <w:p>
+      <w:pPr>
+        <w:keepNext/>
+        <w:spacing w:after="0" w:before="100"/>
+        <w:jc w:val="center"/>
+      </w:pPr>
+      <w:r>
+        <w:rPr>
+          <w:rFonts w:ascii="Times New Roman" w:cs="Times New Roman" w:eastAsia="Times New Roman" w:hAnsi="Times New Roman"/>
+          <w:b w:val="false"/>
+          <w:bCs w:val="false"/>
+          <w:i w:val="false"/>
+          <w:iCs w:val="false"/>
+          <w:smallCaps w:val="false"/>
+          <w:sz w:val="16"/>
+          <w:szCs w:val="16"/>
+        </w:rPr>
+        <w:t xml:space="preserve">TABLE III</w:t>
+      </w:r>
+    </w:p>
+    <w:p>
+      <w:pPr>
+        <w:keepNext/>
+        <w:spacing w:after="40"/>
+        <w:jc w:val="center"/>
+      </w:pPr>
+      <w:r>
+        <w:rPr>
+          <w:rFonts w:ascii="Times New Roman" w:cs="Times New Roman" w:eastAsia="Times New Roman" w:hAnsi="Times New Roman"/>
+          <w:b w:val="false"/>
+          <w:bCs w:val="false"/>
+          <w:i w:val="false"/>
+          <w:iCs w:val="false"/>
+          <w:smallCaps/>
+          <w:sz w:val="16"/>
+          <w:szCs w:val="16"/>
+        </w:rPr>
+        <w:t xml:space="preserve">Judged outcomes, local replication (v3)</w:t>
+      </w:r>
+    </w:p>
+    <w:tbl>
+      <w:tblPr>
+        <w:tblW w:type="dxa" w:w="4340"/>
+        <w:tblBorders>
+          <w:top w:val="single" w:color="auto" w:sz="4"/>
+          <w:left w:val="single" w:color="auto" w:sz="4"/>
+          <w:bottom w:val="single" w:color="auto" w:sz="4"/>
+          <w:right w:val="single" w:color="auto" w:sz="4"/>
+          <w:insideH w:val="single" w:color="auto" w:sz="4"/>
+          <w:insideV w:val="single" w:color="auto" w:sz="4"/>
+        </w:tblBorders>
+      </w:tblPr>
+      <w:tblGrid>
+        <w:gridCol w:w="1500"/>
+        <w:gridCol w:w="760"/>
+        <w:gridCol w:w="760"/>
+        <w:gridCol w:w="760"/>
+        <w:gridCol w:w="560"/>
+      </w:tblGrid>
+      <w:tr>
+        <w:tc>
+          <w:tcPr>
+            <w:tcW w:type="dxa" w:w="1500"/>
+            <w:tcBorders>
+              <w:top w:val="single" w:color="000000" w:sz="4"/>
+              <w:left w:val="none" w:color="FFFFFF" w:sz="0"/>
+              <w:bottom w:val="single" w:color="000000" w:sz="4"/>
+              <w:right w:val="none" w:color="FFFFFF" w:sz="0"/>
+            </w:tcBorders>
+            <w:tcMar>
+              <w:top w:type="dxa" w:w="25"/>
+              <w:left w:type="dxa" w:w="40"/>
+              <w:bottom w:type="dxa" w:w="25"/>
+              <w:right w:type="dxa" w:w="40"/>
+            </w:tcMar>
+          </w:tcPr>
+          <w:p>
+            <w:pPr>
+              <w:jc w:val="left"/>
+            </w:pPr>
+            <w:r>
+              <w:rPr>
+                <w:rFonts w:ascii="Times New Roman" w:cs="Times New Roman" w:eastAsia="Times New Roman" w:hAnsi="Times New Roman"/>
+                <w:b/>
+                <w:bCs/>
+                <w:i w:val="false"/>
+                <w:iCs w:val="false"/>
+                <w:smallCaps w:val="false"/>
+                <w:sz w:val="16"/>
+                <w:szCs w:val="16"/>
+              </w:rPr>
+              <w:t xml:space="preserve">Measure</w:t>
+            </w:r>
+          </w:p>
+        </w:tc>
+        <w:tc>
+          <w:tcPr>
+            <w:tcW w:type="dxa" w:w="760"/>
+            <w:tcBorders>
+              <w:top w:val="single" w:color="000000" w:sz="4"/>
+              <w:left w:val="none" w:color="FFFFFF" w:sz="0"/>
+              <w:bottom w:val="single" w:color="000000" w:sz="4"/>
+              <w:right w:val="none" w:color="FFFFFF" w:sz="0"/>
+            </w:tcBorders>
+            <w:tcMar>
+              <w:top w:type="dxa" w:w="25"/>
+              <w:left w:type="dxa" w:w="40"/>
+              <w:bottom w:type="dxa" w:w="25"/>
+              <w:right w:type="dxa" w:w="40"/>
+            </w:tcMar>
+          </w:tcPr>
+          <w:p>
+            <w:pPr>
+              <w:jc w:val="center"/>
+            </w:pPr>
+            <w:r>
+              <w:rPr>
+                <w:rFonts w:ascii="Times New Roman" w:cs="Times New Roman" w:eastAsia="Times New Roman" w:hAnsi="Times New Roman"/>
+                <w:b/>
+                <w:bCs/>
+                <w:i w:val="false"/>
+                <w:iCs w:val="false"/>
+                <w:smallCaps w:val="false"/>
+                <w:sz w:val="16"/>
+                <w:szCs w:val="16"/>
+              </w:rPr>
+              <w:t xml:space="preserve">Floor</w:t>
+            </w:r>
+          </w:p>
+        </w:tc>
+        <w:tc>
+          <w:tcPr>
+            <w:tcW w:type="dxa" w:w="760"/>
+            <w:tcBorders>
+              <w:top w:val="single" w:color="000000" w:sz="4"/>
+              <w:left w:val="none" w:color="FFFFFF" w:sz="0"/>
+              <w:bottom w:val="single" w:color="000000" w:sz="4"/>
+              <w:right w:val="none" w:color="FFFFFF" w:sz="0"/>
+            </w:tcBorders>
+            <w:tcMar>
+              <w:top w:type="dxa" w:w="25"/>
+              <w:left w:type="dxa" w:w="40"/>
+              <w:bottom w:type="dxa" w:w="25"/>
+              <w:right w:type="dxa" w:w="40"/>
+            </w:tcMar>
+          </w:tcPr>
+          <w:p>
+            <w:pPr>
+              <w:jc w:val="center"/>
+            </w:pPr>
+            <w:r>
+              <w:rPr>
+                <w:rFonts w:ascii="Times New Roman" w:cs="Times New Roman" w:eastAsia="Times New Roman" w:hAnsi="Times New Roman"/>
+                <w:b/>
+                <w:bCs/>
+                <w:i w:val="false"/>
+                <w:iCs w:val="false"/>
+                <w:smallCaps w:val="false"/>
+                <w:sz w:val="16"/>
+                <w:szCs w:val="16"/>
+              </w:rPr>
+              <w:t xml:space="preserve">Treat.</w:t>
+            </w:r>
+          </w:p>
+        </w:tc>
+        <w:tc>
+          <w:tcPr>
+            <w:tcW w:type="dxa" w:w="760"/>
+            <w:tcBorders>
+              <w:top w:val="single" w:color="000000" w:sz="4"/>
+              <w:left w:val="none" w:color="FFFFFF" w:sz="0"/>
+              <w:bottom w:val="single" w:color="000000" w:sz="4"/>
+              <w:right w:val="none" w:color="FFFFFF" w:sz="0"/>
+            </w:tcBorders>
+            <w:tcMar>
+              <w:top w:type="dxa" w:w="25"/>
+              <w:left w:type="dxa" w:w="40"/>
+              <w:bottom w:type="dxa" w:w="25"/>
+              <w:right w:type="dxa" w:w="40"/>
+            </w:tcMar>
+          </w:tcPr>
+          <w:p>
+            <w:pPr>
+              <w:jc w:val="center"/>
+            </w:pPr>
+            <w:r>
+              <w:rPr>
+                <w:rFonts w:ascii="Times New Roman" w:cs="Times New Roman" w:eastAsia="Times New Roman" w:hAnsi="Times New Roman"/>
+                <w:b/>
+                <w:bCs/>
+                <w:i w:val="false"/>
+                <w:iCs w:val="false"/>
+                <w:smallCaps w:val="false"/>
+                <w:sz w:val="16"/>
+                <w:szCs w:val="16"/>
+              </w:rPr>
+              <w:t xml:space="preserve">Ceiling</w:t>
+            </w:r>
+          </w:p>
+        </w:tc>
+        <w:tc>
+          <w:tcPr>
+            <w:tcW w:type="dxa" w:w="560"/>
+            <w:tcBorders>
+              <w:top w:val="single" w:color="000000" w:sz="4"/>
+              <w:left w:val="none" w:color="FFFFFF" w:sz="0"/>
+              <w:bottom w:val="single" w:color="000000" w:sz="4"/>
+              <w:right w:val="none" w:color="FFFFFF" w:sz="0"/>
+            </w:tcBorders>
+            <w:tcMar>
+              <w:top w:type="dxa" w:w="25"/>
+              <w:left w:type="dxa" w:w="40"/>
+              <w:bottom w:type="dxa" w:w="25"/>
+              <w:right w:type="dxa" w:w="40"/>
+            </w:tcMar>
+          </w:tcPr>
+          <w:p>
+            <w:pPr>
+              <w:jc w:val="center"/>
+            </w:pPr>
+            <w:r>
+              <w:rPr>
+                <w:rFonts w:ascii="Times New Roman" w:cs="Times New Roman" w:eastAsia="Times New Roman" w:hAnsi="Times New Roman"/>
+                <w:b/>
+                <w:bCs/>
+                <w:i w:val="false"/>
+                <w:iCs w:val="false"/>
+                <w:smallCaps w:val="false"/>
+                <w:sz w:val="16"/>
+                <w:szCs w:val="16"/>
+              </w:rPr>
+              <w:t xml:space="preserve">p</w:t>
+            </w:r>
+          </w:p>
+        </w:tc>
+      </w:tr>
+      <w:tr>
+        <w:tc>
+          <w:tcPr>
+            <w:tcW w:type="dxa" w:w="1500"/>
+            <w:tcBorders>
+              <w:top w:val="none" w:color="FFFFFF" w:sz="0"/>
+              <w:left w:val="none" w:color="FFFFFF" w:sz="0"/>
+              <w:bottom w:val="none" w:color="FFFFFF" w:sz="0"/>
+              <w:right w:val="none" w:color="FFFFFF" w:sz="0"/>
+            </w:tcBorders>
+            <w:tcMar>
+              <w:top w:type="dxa" w:w="25"/>
+              <w:left w:type="dxa" w:w="40"/>
+              <w:bottom w:type="dxa" w:w="25"/>
+              <w:right w:type="dxa" w:w="40"/>
+            </w:tcMar>
+          </w:tcPr>
+          <w:p>
+            <w:pPr>
+              <w:jc w:val="left"/>
+            </w:pPr>
+            <w:r>
+              <w:rPr>
+                <w:rFonts w:ascii="Times New Roman" w:cs="Times New Roman" w:eastAsia="Times New Roman" w:hAnsi="Times New Roman"/>
+                <w:b w:val="false"/>
+                <w:bCs w:val="false"/>
+                <w:i w:val="false"/>
+                <w:iCs w:val="false"/>
+                <w:smallCaps w:val="false"/>
+                <w:sz w:val="16"/>
+                <w:szCs w:val="16"/>
+              </w:rPr>
+              <w:t xml:space="preserve">Intent, all</w:t>
+            </w:r>
+          </w:p>
+        </w:tc>
+        <w:tc>
+          <w:tcPr>
+            <w:tcW w:type="dxa" w:w="760"/>
+            <w:tcBorders>
+              <w:top w:val="none" w:color="FFFFFF" w:sz="0"/>
+              <w:left w:val="none" w:color="FFFFFF" w:sz="0"/>
+              <w:bottom w:val="none" w:color="FFFFFF" w:sz="0"/>
+              <w:right w:val="none" w:color="FFFFFF" w:sz="0"/>
+            </w:tcBorders>
+            <w:tcMar>
+              <w:top w:type="dxa" w:w="25"/>
+              <w:left w:type="dxa" w:w="40"/>
+              <w:bottom w:type="dxa" w:w="25"/>
+              <w:right w:type="dxa" w:w="40"/>
+            </w:tcMar>
+          </w:tcPr>
+          <w:p>
+            <w:pPr>
+              <w:jc w:val="center"/>
+            </w:pPr>
+            <w:r>
+              <w:rPr>
+                <w:rFonts w:ascii="Times New Roman" w:cs="Times New Roman" w:eastAsia="Times New Roman" w:hAnsi="Times New Roman"/>
+                <w:b w:val="false"/>
+                <w:bCs w:val="false"/>
+                <w:i w:val="false"/>
+                <w:iCs w:val="false"/>
+                <w:smallCaps w:val="false"/>
+                <w:sz w:val="16"/>
+                <w:szCs w:val="16"/>
+              </w:rPr>
+              <w:t xml:space="preserve">64/96</w:t>
+            </w:r>
+          </w:p>
+        </w:tc>
+        <w:tc>
+          <w:tcPr>
+            <w:tcW w:type="dxa" w:w="760"/>
+            <w:tcBorders>
+              <w:top w:val="none" w:color="FFFFFF" w:sz="0"/>
+              <w:left w:val="none" w:color="FFFFFF" w:sz="0"/>
+              <w:bottom w:val="none" w:color="FFFFFF" w:sz="0"/>
+              <w:right w:val="none" w:color="FFFFFF" w:sz="0"/>
+            </w:tcBorders>
+            <w:tcMar>
+              <w:top w:type="dxa" w:w="25"/>
+              <w:left w:type="dxa" w:w="40"/>
+              <w:bottom w:type="dxa" w:w="25"/>
+              <w:right w:type="dxa" w:w="40"/>
+            </w:tcMar>
+          </w:tcPr>
+          <w:p>
+            <w:pPr>
+              <w:jc w:val="center"/>
+            </w:pPr>
+            <w:r>
+              <w:rPr>
+                <w:rFonts w:ascii="Times New Roman" w:cs="Times New Roman" w:eastAsia="Times New Roman" w:hAnsi="Times New Roman"/>
+                <w:b w:val="false"/>
+                <w:bCs w:val="false"/>
+                <w:i w:val="false"/>
+                <w:iCs w:val="false"/>
+                <w:smallCaps w:val="false"/>
+                <w:sz w:val="16"/>
+                <w:szCs w:val="16"/>
+              </w:rPr>
+              <w:t xml:space="preserve">67/96</w:t>
+            </w:r>
+          </w:p>
+        </w:tc>
+        <w:tc>
+          <w:tcPr>
+            <w:tcW w:type="dxa" w:w="760"/>
+            <w:tcBorders>
+              <w:top w:val="none" w:color="FFFFFF" w:sz="0"/>
+              <w:left w:val="none" w:color="FFFFFF" w:sz="0"/>
+              <w:bottom w:val="none" w:color="FFFFFF" w:sz="0"/>
+              <w:right w:val="none" w:color="FFFFFF" w:sz="0"/>
+            </w:tcBorders>
+            <w:tcMar>
+              <w:top w:type="dxa" w:w="25"/>
+              <w:left w:type="dxa" w:w="40"/>
+              <w:bottom w:type="dxa" w:w="25"/>
+              <w:right w:type="dxa" w:w="40"/>
+            </w:tcMar>
+          </w:tcPr>
+          <w:p>
+            <w:pPr>
+              <w:jc w:val="center"/>
+            </w:pPr>
+            <w:r>
+              <w:rPr>
+                <w:rFonts w:ascii="Times New Roman" w:cs="Times New Roman" w:eastAsia="Times New Roman" w:hAnsi="Times New Roman"/>
+                <w:b w:val="false"/>
+                <w:bCs w:val="false"/>
+                <w:i w:val="false"/>
+                <w:iCs w:val="false"/>
+                <w:smallCaps w:val="false"/>
+                <w:sz w:val="16"/>
+                <w:szCs w:val="16"/>
+              </w:rPr>
+              <w:t xml:space="preserve">96/96</w:t>
+            </w:r>
+          </w:p>
+        </w:tc>
+        <w:tc>
+          <w:tcPr>
+            <w:tcW w:type="dxa" w:w="560"/>
+            <w:tcBorders>
+              <w:top w:val="none" w:color="FFFFFF" w:sz="0"/>
+              <w:left w:val="none" w:color="FFFFFF" w:sz="0"/>
+              <w:bottom w:val="none" w:color="FFFFFF" w:sz="0"/>
+              <w:right w:val="none" w:color="FFFFFF" w:sz="0"/>
+            </w:tcBorders>
+            <w:tcMar>
+              <w:top w:type="dxa" w:w="25"/>
+              <w:left w:type="dxa" w:w="40"/>
+              <w:bottom w:type="dxa" w:w="25"/>
+              <w:right w:type="dxa" w:w="40"/>
+            </w:tcMar>
+          </w:tcPr>
+          <w:p>
+            <w:pPr>
+              <w:jc w:val="center"/>
+            </w:pPr>
+            <w:r>
+              <w:rPr>
+                <w:rFonts w:ascii="Times New Roman" w:cs="Times New Roman" w:eastAsia="Times New Roman" w:hAnsi="Times New Roman"/>
+                <w:b w:val="false"/>
+                <w:bCs w:val="false"/>
+                <w:i w:val="false"/>
+                <w:iCs w:val="false"/>
+                <w:smallCaps w:val="false"/>
+                <w:sz w:val="16"/>
+                <w:szCs w:val="16"/>
+              </w:rPr>
+              <w:t xml:space="preserve">0.66</w:t>
+            </w:r>
+          </w:p>
+        </w:tc>
+      </w:tr>
+      <w:tr>
+        <w:tc>
+          <w:tcPr>
+            <w:tcW w:type="dxa" w:w="1500"/>
+            <w:tcBorders>
+              <w:top w:val="none" w:color="FFFFFF" w:sz="0"/>
+              <w:left w:val="none" w:color="FFFFFF" w:sz="0"/>
+              <w:bottom w:val="none" w:color="FFFFFF" w:sz="0"/>
+              <w:right w:val="none" w:color="FFFFFF" w:sz="0"/>
+            </w:tcBorders>
+            <w:tcMar>
+              <w:top w:type="dxa" w:w="25"/>
+              <w:left w:type="dxa" w:w="40"/>
+              <w:bottom w:type="dxa" w:w="25"/>
+              <w:right w:type="dxa" w:w="40"/>
+            </w:tcMar>
+          </w:tcPr>
+          <w:p>
+            <w:pPr>
+              <w:jc w:val="left"/>
+            </w:pPr>
+            <w:r>
+              <w:rPr>
+                <w:rFonts w:ascii="Times New Roman" w:cs="Times New Roman" w:eastAsia="Times New Roman" w:hAnsi="Times New Roman"/>
+                <w:b w:val="false"/>
+                <w:bCs w:val="false"/>
+                <w:i w:val="false"/>
+                <w:iCs w:val="false"/>
+                <w:smallCaps w:val="false"/>
+                <w:sz w:val="16"/>
+                <w:szCs w:val="16"/>
+              </w:rPr>
+              <w:t xml:space="preserve">Intent, golden</w:t>
+            </w:r>
+          </w:p>
+        </w:tc>
+        <w:tc>
+          <w:tcPr>
+            <w:tcW w:type="dxa" w:w="760"/>
+            <w:tcBorders>
+              <w:top w:val="none" w:color="FFFFFF" w:sz="0"/>
+              <w:left w:val="none" w:color="FFFFFF" w:sz="0"/>
+              <w:bottom w:val="none" w:color="FFFFFF" w:sz="0"/>
+              <w:right w:val="none" w:color="FFFFFF" w:sz="0"/>
+            </w:tcBorders>
+            <w:tcMar>
+              <w:top w:type="dxa" w:w="25"/>
+              <w:left w:type="dxa" w:w="40"/>
+              <w:bottom w:type="dxa" w:w="25"/>
+              <w:right w:type="dxa" w:w="40"/>
+            </w:tcMar>
+          </w:tcPr>
+          <w:p>
+            <w:pPr>
+              <w:jc w:val="center"/>
+            </w:pPr>
+            <w:r>
+              <w:rPr>
+                <w:rFonts w:ascii="Times New Roman" w:cs="Times New Roman" w:eastAsia="Times New Roman" w:hAnsi="Times New Roman"/>
+                <w:b w:val="false"/>
+                <w:bCs w:val="false"/>
+                <w:i w:val="false"/>
+                <w:iCs w:val="false"/>
+                <w:smallCaps w:val="false"/>
+                <w:sz w:val="16"/>
+                <w:szCs w:val="16"/>
+              </w:rPr>
+              <w:t xml:space="preserve">44/64</w:t>
+            </w:r>
+          </w:p>
+        </w:tc>
+        <w:tc>
+          <w:tcPr>
+            <w:tcW w:type="dxa" w:w="760"/>
+            <w:tcBorders>
+              <w:top w:val="none" w:color="FFFFFF" w:sz="0"/>
+              <w:left w:val="none" w:color="FFFFFF" w:sz="0"/>
+              <w:bottom w:val="none" w:color="FFFFFF" w:sz="0"/>
+              <w:right w:val="none" w:color="FFFFFF" w:sz="0"/>
+            </w:tcBorders>
+            <w:tcMar>
+              <w:top w:type="dxa" w:w="25"/>
+              <w:left w:type="dxa" w:w="40"/>
+              <w:bottom w:type="dxa" w:w="25"/>
+              <w:right w:type="dxa" w:w="40"/>
+            </w:tcMar>
+          </w:tcPr>
+          <w:p>
+            <w:pPr>
+              <w:jc w:val="center"/>
+            </w:pPr>
+            <w:r>
+              <w:rPr>
+                <w:rFonts w:ascii="Times New Roman" w:cs="Times New Roman" w:eastAsia="Times New Roman" w:hAnsi="Times New Roman"/>
+                <w:b w:val="false"/>
+                <w:bCs w:val="false"/>
+                <w:i w:val="false"/>
+                <w:iCs w:val="false"/>
+                <w:smallCaps w:val="false"/>
+                <w:sz w:val="16"/>
+                <w:szCs w:val="16"/>
+              </w:rPr>
+              <w:t xml:space="preserve">44/64</w:t>
+            </w:r>
+          </w:p>
+        </w:tc>
+        <w:tc>
+          <w:tcPr>
+            <w:tcW w:type="dxa" w:w="760"/>
+            <w:tcBorders>
+              <w:top w:val="none" w:color="FFFFFF" w:sz="0"/>
+              <w:left w:val="none" w:color="FFFFFF" w:sz="0"/>
+              <w:bottom w:val="none" w:color="FFFFFF" w:sz="0"/>
+              <w:right w:val="none" w:color="FFFFFF" w:sz="0"/>
+            </w:tcBorders>
+            <w:tcMar>
+              <w:top w:type="dxa" w:w="25"/>
+              <w:left w:type="dxa" w:w="40"/>
+              <w:bottom w:type="dxa" w:w="25"/>
+              <w:right w:type="dxa" w:w="40"/>
+            </w:tcMar>
+          </w:tcPr>
+          <w:p>
+            <w:pPr>
+              <w:jc w:val="center"/>
+            </w:pPr>
+            <w:r>
+              <w:rPr>
+                <w:rFonts w:ascii="Times New Roman" w:cs="Times New Roman" w:eastAsia="Times New Roman" w:hAnsi="Times New Roman"/>
+                <w:b w:val="false"/>
+                <w:bCs w:val="false"/>
+                <w:i w:val="false"/>
+                <w:iCs w:val="false"/>
+                <w:smallCaps w:val="false"/>
+                <w:sz w:val="16"/>
+                <w:szCs w:val="16"/>
+              </w:rPr>
+              <w:t xml:space="preserve">64/64</w:t>
+            </w:r>
+          </w:p>
+        </w:tc>
+        <w:tc>
+          <w:tcPr>
+            <w:tcW w:type="dxa" w:w="560"/>
+            <w:tcBorders>
+              <w:top w:val="none" w:color="FFFFFF" w:sz="0"/>
+              <w:left w:val="none" w:color="FFFFFF" w:sz="0"/>
+              <w:bottom w:val="none" w:color="FFFFFF" w:sz="0"/>
+              <w:right w:val="none" w:color="FFFFFF" w:sz="0"/>
+            </w:tcBorders>
+            <w:tcMar>
+              <w:top w:type="dxa" w:w="25"/>
+              <w:left w:type="dxa" w:w="40"/>
+              <w:bottom w:type="dxa" w:w="25"/>
+              <w:right w:type="dxa" w:w="40"/>
+            </w:tcMar>
+          </w:tcPr>
+          <w:p>
+            <w:pPr>
+              <w:jc w:val="center"/>
+            </w:pPr>
+            <w:r>
+              <w:rPr>
+                <w:rFonts w:ascii="Times New Roman" w:cs="Times New Roman" w:eastAsia="Times New Roman" w:hAnsi="Times New Roman"/>
+                <w:b w:val="false"/>
+                <w:bCs w:val="false"/>
+                <w:i w:val="false"/>
+                <w:iCs w:val="false"/>
+                <w:smallCaps w:val="false"/>
+                <w:sz w:val="16"/>
+                <w:szCs w:val="16"/>
+              </w:rPr>
+              <w:t xml:space="preserve">1.00</w:t>
+            </w:r>
+          </w:p>
+        </w:tc>
+      </w:tr>
+      <w:tr>
+        <w:tc>
+          <w:tcPr>
+            <w:tcW w:type="dxa" w:w="1500"/>
+            <w:tcBorders>
+              <w:top w:val="none" w:color="FFFFFF" w:sz="0"/>
+              <w:left w:val="none" w:color="FFFFFF" w:sz="0"/>
+              <w:bottom w:val="none" w:color="FFFFFF" w:sz="0"/>
+              <w:right w:val="none" w:color="FFFFFF" w:sz="0"/>
+            </w:tcBorders>
+            <w:tcMar>
+              <w:top w:type="dxa" w:w="25"/>
+              <w:left w:type="dxa" w:w="40"/>
+              <w:bottom w:type="dxa" w:w="25"/>
+              <w:right w:type="dxa" w:w="40"/>
+            </w:tcMar>
+          </w:tcPr>
+          <w:p>
+            <w:pPr>
+              <w:jc w:val="left"/>
+            </w:pPr>
+            <w:r>
+              <w:rPr>
+                <w:rFonts w:ascii="Times New Roman" w:cs="Times New Roman" w:eastAsia="Times New Roman" w:hAnsi="Times New Roman"/>
+                <w:b w:val="false"/>
+                <w:bCs w:val="false"/>
+                <w:i w:val="false"/>
+                <w:iCs w:val="false"/>
+                <w:smallCaps w:val="false"/>
+                <w:sz w:val="16"/>
+                <w:szCs w:val="16"/>
+              </w:rPr>
+              <w:t xml:space="preserve">Intent, mutant</w:t>
+            </w:r>
+          </w:p>
+        </w:tc>
+        <w:tc>
+          <w:tcPr>
+            <w:tcW w:type="dxa" w:w="760"/>
+            <w:tcBorders>
+              <w:top w:val="none" w:color="FFFFFF" w:sz="0"/>
+              <w:left w:val="none" w:color="FFFFFF" w:sz="0"/>
+              <w:bottom w:val="none" w:color="FFFFFF" w:sz="0"/>
+              <w:right w:val="none" w:color="FFFFFF" w:sz="0"/>
+            </w:tcBorders>
+            <w:tcMar>
+              <w:top w:type="dxa" w:w="25"/>
+              <w:left w:type="dxa" w:w="40"/>
+              <w:bottom w:type="dxa" w:w="25"/>
+              <w:right w:type="dxa" w:w="40"/>
+            </w:tcMar>
+          </w:tcPr>
+          <w:p>
+            <w:pPr>
+              <w:jc w:val="center"/>
+            </w:pPr>
+            <w:r>
+              <w:rPr>
+                <w:rFonts w:ascii="Times New Roman" w:cs="Times New Roman" w:eastAsia="Times New Roman" w:hAnsi="Times New Roman"/>
+                <w:b w:val="false"/>
+                <w:bCs w:val="false"/>
+                <w:i w:val="false"/>
+                <w:iCs w:val="false"/>
+                <w:smallCaps w:val="false"/>
+                <w:sz w:val="16"/>
+                <w:szCs w:val="16"/>
+              </w:rPr>
+              <w:t xml:space="preserve">20/32</w:t>
+            </w:r>
+          </w:p>
+        </w:tc>
+        <w:tc>
+          <w:tcPr>
+            <w:tcW w:type="dxa" w:w="760"/>
+            <w:tcBorders>
+              <w:top w:val="none" w:color="FFFFFF" w:sz="0"/>
+              <w:left w:val="none" w:color="FFFFFF" w:sz="0"/>
+              <w:bottom w:val="none" w:color="FFFFFF" w:sz="0"/>
+              <w:right w:val="none" w:color="FFFFFF" w:sz="0"/>
+            </w:tcBorders>
+            <w:tcMar>
+              <w:top w:type="dxa" w:w="25"/>
+              <w:left w:type="dxa" w:w="40"/>
+              <w:bottom w:type="dxa" w:w="25"/>
+              <w:right w:type="dxa" w:w="40"/>
+            </w:tcMar>
+          </w:tcPr>
+          <w:p>
+            <w:pPr>
+              <w:jc w:val="center"/>
+            </w:pPr>
+            <w:r>
+              <w:rPr>
+                <w:rFonts w:ascii="Times New Roman" w:cs="Times New Roman" w:eastAsia="Times New Roman" w:hAnsi="Times New Roman"/>
+                <w:b w:val="false"/>
+                <w:bCs w:val="false"/>
+                <w:i w:val="false"/>
+                <w:iCs w:val="false"/>
+                <w:smallCaps w:val="false"/>
+                <w:sz w:val="16"/>
+                <w:szCs w:val="16"/>
+              </w:rPr>
+              <w:t xml:space="preserve">23/32</w:t>
+            </w:r>
+          </w:p>
+        </w:tc>
+        <w:tc>
+          <w:tcPr>
+            <w:tcW w:type="dxa" w:w="760"/>
+            <w:tcBorders>
+              <w:top w:val="none" w:color="FFFFFF" w:sz="0"/>
+              <w:left w:val="none" w:color="FFFFFF" w:sz="0"/>
+              <w:bottom w:val="none" w:color="FFFFFF" w:sz="0"/>
+              <w:right w:val="none" w:color="FFFFFF" w:sz="0"/>
+            </w:tcBorders>
+            <w:tcMar>
+              <w:top w:type="dxa" w:w="25"/>
+              <w:left w:type="dxa" w:w="40"/>
+              <w:bottom w:type="dxa" w:w="25"/>
+              <w:right w:type="dxa" w:w="40"/>
+            </w:tcMar>
+          </w:tcPr>
+          <w:p>
+            <w:pPr>
+              <w:jc w:val="center"/>
+            </w:pPr>
+            <w:r>
+              <w:rPr>
+                <w:rFonts w:ascii="Times New Roman" w:cs="Times New Roman" w:eastAsia="Times New Roman" w:hAnsi="Times New Roman"/>
+                <w:b w:val="false"/>
+                <w:bCs w:val="false"/>
+                <w:i w:val="false"/>
+                <w:iCs w:val="false"/>
+                <w:smallCaps w:val="false"/>
+                <w:sz w:val="16"/>
+                <w:szCs w:val="16"/>
+              </w:rPr>
+              <w:t xml:space="preserve">32/32</w:t>
+            </w:r>
+          </w:p>
+        </w:tc>
+        <w:tc>
+          <w:tcPr>
+            <w:tcW w:type="dxa" w:w="560"/>
+            <w:tcBorders>
+              <w:top w:val="none" w:color="FFFFFF" w:sz="0"/>
+              <w:left w:val="none" w:color="FFFFFF" w:sz="0"/>
+              <w:bottom w:val="none" w:color="FFFFFF" w:sz="0"/>
+              <w:right w:val="none" w:color="FFFFFF" w:sz="0"/>
+            </w:tcBorders>
+            <w:tcMar>
+              <w:top w:type="dxa" w:w="25"/>
+              <w:left w:type="dxa" w:w="40"/>
+              <w:bottom w:type="dxa" w:w="25"/>
+              <w:right w:type="dxa" w:w="40"/>
+            </w:tcMar>
+          </w:tcPr>
+          <w:p>
+            <w:pPr>
+              <w:jc w:val="center"/>
+            </w:pPr>
+            <w:r>
+              <w:rPr>
+                <w:rFonts w:ascii="Times New Roman" w:cs="Times New Roman" w:eastAsia="Times New Roman" w:hAnsi="Times New Roman"/>
+                <w:b w:val="false"/>
+                <w:bCs w:val="false"/>
+                <w:i w:val="false"/>
+                <w:iCs w:val="false"/>
+                <w:smallCaps w:val="false"/>
+                <w:sz w:val="16"/>
+                <w:szCs w:val="16"/>
+              </w:rPr>
+              <w:t xml:space="preserve">0.51</w:t>
+            </w:r>
+          </w:p>
+        </w:tc>
+      </w:tr>
+      <w:tr>
+        <w:tc>
+          <w:tcPr>
+            <w:tcW w:type="dxa" w:w="1500"/>
+            <w:tcBorders>
+              <w:top w:val="none" w:color="FFFFFF" w:sz="0"/>
+              <w:left w:val="none" w:color="FFFFFF" w:sz="0"/>
+              <w:bottom w:val="none" w:color="FFFFFF" w:sz="0"/>
+              <w:right w:val="none" w:color="FFFFFF" w:sz="0"/>
+            </w:tcBorders>
+            <w:tcMar>
+              <w:top w:type="dxa" w:w="25"/>
+              <w:left w:type="dxa" w:w="40"/>
+              <w:bottom w:type="dxa" w:w="25"/>
+              <w:right w:type="dxa" w:w="40"/>
+            </w:tcMar>
+          </w:tcPr>
+          <w:p>
+            <w:pPr>
+              <w:jc w:val="left"/>
+            </w:pPr>
+            <w:r>
+              <w:rPr>
+                <w:rFonts w:ascii="Times New Roman" w:cs="Times New Roman" w:eastAsia="Times New Roman" w:hAnsi="Times New Roman"/>
+                <w:b w:val="false"/>
+                <w:bCs w:val="false"/>
+                <w:i w:val="false"/>
+                <w:iCs w:val="false"/>
+                <w:smallCaps w:val="false"/>
+                <w:sz w:val="16"/>
+                <w:szCs w:val="16"/>
+              </w:rPr>
+              <w:t xml:space="preserve">Defect caught</w:t>
+            </w:r>
+          </w:p>
+        </w:tc>
+        <w:tc>
+          <w:tcPr>
+            <w:tcW w:type="dxa" w:w="760"/>
+            <w:tcBorders>
+              <w:top w:val="none" w:color="FFFFFF" w:sz="0"/>
+              <w:left w:val="none" w:color="FFFFFF" w:sz="0"/>
+              <w:bottom w:val="none" w:color="FFFFFF" w:sz="0"/>
+              <w:right w:val="none" w:color="FFFFFF" w:sz="0"/>
+            </w:tcBorders>
+            <w:tcMar>
+              <w:top w:type="dxa" w:w="25"/>
+              <w:left w:type="dxa" w:w="40"/>
+              <w:bottom w:type="dxa" w:w="25"/>
+              <w:right w:type="dxa" w:w="40"/>
+            </w:tcMar>
+          </w:tcPr>
+          <w:p>
+            <w:pPr>
+              <w:jc w:val="center"/>
+            </w:pPr>
+            <w:r>
+              <w:rPr>
+                <w:rFonts w:ascii="Times New Roman" w:cs="Times New Roman" w:eastAsia="Times New Roman" w:hAnsi="Times New Roman"/>
+                <w:b w:val="false"/>
+                <w:bCs w:val="false"/>
+                <w:i w:val="false"/>
+                <w:iCs w:val="false"/>
+                <w:smallCaps w:val="false"/>
+                <w:sz w:val="16"/>
+                <w:szCs w:val="16"/>
+              </w:rPr>
+              <w:t xml:space="preserve">1/32</w:t>
+            </w:r>
+          </w:p>
+        </w:tc>
+        <w:tc>
+          <w:tcPr>
+            <w:tcW w:type="dxa" w:w="760"/>
+            <w:tcBorders>
+              <w:top w:val="none" w:color="FFFFFF" w:sz="0"/>
+              <w:left w:val="none" w:color="FFFFFF" w:sz="0"/>
+              <w:bottom w:val="none" w:color="FFFFFF" w:sz="0"/>
+              <w:right w:val="none" w:color="FFFFFF" w:sz="0"/>
+            </w:tcBorders>
+            <w:tcMar>
+              <w:top w:type="dxa" w:w="25"/>
+              <w:left w:type="dxa" w:w="40"/>
+              <w:bottom w:type="dxa" w:w="25"/>
+              <w:right w:type="dxa" w:w="40"/>
+            </w:tcMar>
+          </w:tcPr>
+          <w:p>
+            <w:pPr>
+              <w:jc w:val="center"/>
+            </w:pPr>
+            <w:r>
+              <w:rPr>
+                <w:rFonts w:ascii="Times New Roman" w:cs="Times New Roman" w:eastAsia="Times New Roman" w:hAnsi="Times New Roman"/>
+                <w:b w:val="false"/>
+                <w:bCs w:val="false"/>
+                <w:i w:val="false"/>
+                <w:iCs w:val="false"/>
+                <w:smallCaps w:val="false"/>
+                <w:sz w:val="16"/>
+                <w:szCs w:val="16"/>
+              </w:rPr>
+              <w:t xml:space="preserve">2/32</w:t>
+            </w:r>
+          </w:p>
+        </w:tc>
+        <w:tc>
+          <w:tcPr>
+            <w:tcW w:type="dxa" w:w="760"/>
+            <w:tcBorders>
+              <w:top w:val="none" w:color="FFFFFF" w:sz="0"/>
+              <w:left w:val="none" w:color="FFFFFF" w:sz="0"/>
+              <w:bottom w:val="none" w:color="FFFFFF" w:sz="0"/>
+              <w:right w:val="none" w:color="FFFFFF" w:sz="0"/>
+            </w:tcBorders>
+            <w:tcMar>
+              <w:top w:type="dxa" w:w="25"/>
+              <w:left w:type="dxa" w:w="40"/>
+              <w:bottom w:type="dxa" w:w="25"/>
+              <w:right w:type="dxa" w:w="40"/>
+            </w:tcMar>
+          </w:tcPr>
+          <w:p>
+            <w:pPr>
+              <w:jc w:val="center"/>
+            </w:pPr>
+            <w:r>
+              <w:rPr>
+                <w:rFonts w:ascii="Times New Roman" w:cs="Times New Roman" w:eastAsia="Times New Roman" w:hAnsi="Times New Roman"/>
+                <w:b w:val="false"/>
+                <w:bCs w:val="false"/>
+                <w:i w:val="false"/>
+                <w:iCs w:val="false"/>
+                <w:smallCaps w:val="false"/>
+                <w:sz w:val="16"/>
+                <w:szCs w:val="16"/>
+              </w:rPr>
+              <w:t xml:space="preserve">3/32</w:t>
+            </w:r>
+          </w:p>
+        </w:tc>
+        <w:tc>
+          <w:tcPr>
+            <w:tcW w:type="dxa" w:w="560"/>
+            <w:tcBorders>
+              <w:top w:val="none" w:color="FFFFFF" w:sz="0"/>
+              <w:left w:val="none" w:color="FFFFFF" w:sz="0"/>
+              <w:bottom w:val="none" w:color="FFFFFF" w:sz="0"/>
+              <w:right w:val="none" w:color="FFFFFF" w:sz="0"/>
+            </w:tcBorders>
+            <w:tcMar>
+              <w:top w:type="dxa" w:w="25"/>
+              <w:left w:type="dxa" w:w="40"/>
+              <w:bottom w:type="dxa" w:w="25"/>
+              <w:right w:type="dxa" w:w="40"/>
+            </w:tcMar>
+          </w:tcPr>
+          <w:p>
+            <w:pPr>
+              <w:jc w:val="center"/>
+            </w:pPr>
+            <w:r>
+              <w:rPr>
+                <w:rFonts w:ascii="Times New Roman" w:cs="Times New Roman" w:eastAsia="Times New Roman" w:hAnsi="Times New Roman"/>
+                <w:b w:val="false"/>
+                <w:bCs w:val="false"/>
+                <w:i w:val="false"/>
+                <w:iCs w:val="false"/>
+                <w:smallCaps w:val="false"/>
+                <w:sz w:val="16"/>
+                <w:szCs w:val="16"/>
+              </w:rPr>
+              <w:t xml:space="preserve">1.00</w:t>
+            </w:r>
+          </w:p>
+        </w:tc>
+      </w:tr>
+      <w:tr>
+        <w:tc>
+          <w:tcPr>
+            <w:tcW w:type="dxa" w:w="1500"/>
+            <w:tcBorders>
+              <w:top w:val="none" w:color="FFFFFF" w:sz="0"/>
+              <w:left w:val="none" w:color="FFFFFF" w:sz="0"/>
+              <w:bottom w:val="single" w:color="000000" w:sz="4"/>
+              <w:right w:val="none" w:color="FFFFFF" w:sz="0"/>
+            </w:tcBorders>
+            <w:tcMar>
+              <w:top w:type="dxa" w:w="25"/>
+              <w:left w:type="dxa" w:w="40"/>
+              <w:bottom w:type="dxa" w:w="25"/>
+              <w:right w:type="dxa" w:w="40"/>
+            </w:tcMar>
+          </w:tcPr>
+          <w:p>
+            <w:pPr>
+              <w:jc w:val="left"/>
+            </w:pPr>
+            <w:r>
+              <w:rPr>
+                <w:rFonts w:ascii="Times New Roman" w:cs="Times New Roman" w:eastAsia="Times New Roman" w:hAnsi="Times New Roman"/>
+                <w:b w:val="false"/>
+                <w:bCs w:val="false"/>
+                <w:i w:val="false"/>
+                <w:iCs w:val="false"/>
+                <w:smallCaps w:val="false"/>
+                <w:sz w:val="16"/>
+                <w:szCs w:val="16"/>
+              </w:rPr>
+              <w:t xml:space="preserve">False alarm</w:t>
+            </w:r>
+          </w:p>
+        </w:tc>
+        <w:tc>
+          <w:tcPr>
+            <w:tcW w:type="dxa" w:w="760"/>
+            <w:tcBorders>
+              <w:top w:val="none" w:color="FFFFFF" w:sz="0"/>
+              <w:left w:val="none" w:color="FFFFFF" w:sz="0"/>
+              <w:bottom w:val="single" w:color="000000" w:sz="4"/>
+              <w:right w:val="none" w:color="FFFFFF" w:sz="0"/>
+            </w:tcBorders>
+            <w:tcMar>
+              <w:top w:type="dxa" w:w="25"/>
+              <w:left w:type="dxa" w:w="40"/>
+              <w:bottom w:type="dxa" w:w="25"/>
+              <w:right w:type="dxa" w:w="40"/>
+            </w:tcMar>
+          </w:tcPr>
+          <w:p>
+            <w:pPr>
+              <w:jc w:val="center"/>
+            </w:pPr>
+            <w:r>
+              <w:rPr>
+                <w:rFonts w:ascii="Times New Roman" w:cs="Times New Roman" w:eastAsia="Times New Roman" w:hAnsi="Times New Roman"/>
+                <w:b w:val="false"/>
+                <w:bCs w:val="false"/>
+                <w:i w:val="false"/>
+                <w:iCs w:val="false"/>
+                <w:smallCaps w:val="false"/>
+                <w:sz w:val="16"/>
+                <w:szCs w:val="16"/>
+              </w:rPr>
+              <w:t xml:space="preserve">1/64</w:t>
+            </w:r>
+          </w:p>
+        </w:tc>
+        <w:tc>
+          <w:tcPr>
+            <w:tcW w:type="dxa" w:w="760"/>
+            <w:tcBorders>
+              <w:top w:val="none" w:color="FFFFFF" w:sz="0"/>
+              <w:left w:val="none" w:color="FFFFFF" w:sz="0"/>
+              <w:bottom w:val="single" w:color="000000" w:sz="4"/>
+              <w:right w:val="none" w:color="FFFFFF" w:sz="0"/>
+            </w:tcBorders>
+            <w:tcMar>
+              <w:top w:type="dxa" w:w="25"/>
+              <w:left w:type="dxa" w:w="40"/>
+              <w:bottom w:type="dxa" w:w="25"/>
+              <w:right w:type="dxa" w:w="40"/>
+            </w:tcMar>
+          </w:tcPr>
+          <w:p>
+            <w:pPr>
+              <w:jc w:val="center"/>
+            </w:pPr>
+            <w:r>
+              <w:rPr>
+                <w:rFonts w:ascii="Times New Roman" w:cs="Times New Roman" w:eastAsia="Times New Roman" w:hAnsi="Times New Roman"/>
+                <w:b w:val="false"/>
+                <w:bCs w:val="false"/>
+                <w:i w:val="false"/>
+                <w:iCs w:val="false"/>
+                <w:smallCaps w:val="false"/>
+                <w:sz w:val="16"/>
+                <w:szCs w:val="16"/>
+              </w:rPr>
+              <w:t xml:space="preserve">3/64</w:t>
+            </w:r>
+          </w:p>
+        </w:tc>
+        <w:tc>
+          <w:tcPr>
+            <w:tcW w:type="dxa" w:w="760"/>
+            <w:tcBorders>
+              <w:top w:val="none" w:color="FFFFFF" w:sz="0"/>
+              <w:left w:val="none" w:color="FFFFFF" w:sz="0"/>
+              <w:bottom w:val="single" w:color="000000" w:sz="4"/>
+              <w:right w:val="none" w:color="FFFFFF" w:sz="0"/>
+            </w:tcBorders>
+            <w:tcMar>
+              <w:top w:type="dxa" w:w="25"/>
+              <w:left w:type="dxa" w:w="40"/>
+              <w:bottom w:type="dxa" w:w="25"/>
+              <w:right w:type="dxa" w:w="40"/>
+            </w:tcMar>
+          </w:tcPr>
+          <w:p>
+            <w:pPr>
+              <w:jc w:val="center"/>
+            </w:pPr>
+            <w:r>
+              <w:rPr>
+                <w:rFonts w:ascii="Times New Roman" w:cs="Times New Roman" w:eastAsia="Times New Roman" w:hAnsi="Times New Roman"/>
+                <w:b w:val="false"/>
+                <w:bCs w:val="false"/>
+                <w:i w:val="false"/>
+                <w:iCs w:val="false"/>
+                <w:smallCaps w:val="false"/>
+                <w:sz w:val="16"/>
+                <w:szCs w:val="16"/>
+              </w:rPr>
+              <w:t xml:space="preserve">3/64</w:t>
+            </w:r>
+          </w:p>
+        </w:tc>
+        <w:tc>
+          <w:tcPr>
+            <w:tcW w:type="dxa" w:w="560"/>
+            <w:tcBorders>
+              <w:top w:val="none" w:color="FFFFFF" w:sz="0"/>
+              <w:left w:val="none" w:color="FFFFFF" w:sz="0"/>
+              <w:bottom w:val="single" w:color="000000" w:sz="4"/>
+              <w:right w:val="none" w:color="FFFFFF" w:sz="0"/>
+            </w:tcBorders>
+            <w:tcMar>
+              <w:top w:type="dxa" w:w="25"/>
+              <w:left w:type="dxa" w:w="40"/>
+              <w:bottom w:type="dxa" w:w="25"/>
+              <w:right w:type="dxa" w:w="40"/>
+            </w:tcMar>
+          </w:tcPr>
+          <w:p>
+            <w:pPr>
+              <w:jc w:val="center"/>
+            </w:pPr>
+            <w:r>
+              <w:rPr>
+                <w:rFonts w:ascii="Times New Roman" w:cs="Times New Roman" w:eastAsia="Times New Roman" w:hAnsi="Times New Roman"/>
+                <w:b w:val="false"/>
+                <w:bCs w:val="false"/>
+                <w:i w:val="false"/>
+                <w:iCs w:val="false"/>
+                <w:smallCaps w:val="false"/>
+                <w:sz w:val="16"/>
+                <w:szCs w:val="16"/>
+              </w:rPr>
+              <w:t xml:space="preserve">0.50</w:t>
+            </w:r>
+          </w:p>
+        </w:tc>
+      </w:tr>
+    </w:tbl>
+    <w:p>
+      <w:pPr>
+        <w:spacing w:after="60"/>
+      </w:pPr>
+      <w:r>
+        <w:rPr>
+          <w:rFonts w:ascii="Times New Roman" w:cs="Times New Roman" w:eastAsia="Times New Roman" w:hAnsi="Times New Roman"/>
+          <w:b w:val="false"/>
+          <w:bCs w:val="false"/>
+          <w:i w:val="false"/>
+          <w:iCs w:val="false"/>
+          <w:smallCaps w:val="false"/>
+          <w:sz w:val="20"/>
+          <w:szCs w:val="20"/>
+        </w:rPr>
+        <w:t xml:space="preserve"/>
+      </w:r>
+    </w:p>
+    <w:p>
+      <w:pPr>
+        <w:keepNext/>
+        <w:spacing w:after="30" w:before="80"/>
+        <w:jc w:val="center"/>
+      </w:pPr>
+      <w:r>
+        <w:drawing>
+          <wp:inline distT="0" distB="0" distL="0" distR="0">
+            <wp:extent cx="3124200" cy="1038225"/>
+            <wp:effectExtent t="0" r="0" b="0" l="0"/>
+            <wp:docPr id="6" name="" descr="" title=""/>
+            <wp:cNvGraphicFramePr>
+              <a:graphicFrameLocks xmlns:a="http://schemas.openxmlformats.org/drawingml/2006/main" noChangeAspect="1"/>
+            </wp:cNvGraphicFramePr>
+            <a:graphic xmlns:a="http://schemas.openxmlformats.org/drawingml/2006/main">
+              <a:graphicData uri="http://schemas.openxmlformats.org/drawingml/2006/picture">
+                <pic:pic xmlns:pic="http://schemas.openxmlformats.org/drawingml/2006/picture">
+                  <pic:nvPicPr>
+                    <pic:cNvPr id="0" name="" descr=""/>
+                    <pic:cNvPicPr>
+                      <a:picLocks noChangeAspect="1" noChangeArrowheads="1"/>
+                    </pic:cNvPicPr>
+                  </pic:nvPicPr>
+                  <pic:blipFill>
+                    <a:blip r:embed="rId12" cstate="none"/>
+                    <a:srcRect/>
+                    <a:stretch>
+                      <a:fillRect/>
+                    </a:stretch>
+                  </pic:blipFill>
+                  <pic:spPr bwMode="auto">
+                    <a:xfrm>
+                      <a:off x="0" y="0"/>
+                      <a:ext cx="3124200" cy="1038225"/>
+                    </a:xfrm>
+                    <a:prstGeom prst="rect">
+                      <a:avLst/>
+                    </a:prstGeom>
+                  </pic:spPr>
+                </pic:pic>
+              </a:graphicData>
+            </a:graphic>
+          </wp:inline>
+        </w:drawing>
+      </w:r>
+    </w:p>
+    <w:p>
+      <w:pPr>
+        <w:spacing w:after="100"/>
+        <w:jc w:val="both"/>
+      </w:pPr>
+      <w:r>
+        <w:rPr>
+          <w:rFonts w:ascii="Times New Roman" w:cs="Times New Roman" w:eastAsia="Times New Roman" w:hAnsi="Times New Roman"/>
+          <w:b w:val="false"/>
+          <w:bCs w:val="false"/>
+          <w:i w:val="false"/>
+          <w:iCs w:val="false"/>
+          <w:smallCaps w:val="false"/>
+          <w:sz w:val="16"/>
+          <w:szCs w:val="16"/>
+        </w:rPr>
+        <w:t xml:space="preserve">Fig. 6.  </w:t>
+      </w:r>
+      <w:r>
+        <w:rPr>
+          <w:rFonts w:ascii="Times New Roman" w:cs="Times New Roman" w:eastAsia="Times New Roman" w:hAnsi="Times New Roman"/>
+          <w:b w:val="false"/>
+          <w:bCs w:val="false"/>
+          <w:i w:val="false"/>
+          <w:iCs w:val="false"/>
+          <w:smallCaps w:val="false"/>
+          <w:sz w:val="16"/>
+          <w:szCs w:val="16"/>
+        </w:rPr>
+        <w:t xml:space="preserve">Outcomes by condition in the local replication (v3). Counts are of instances; the box gives G, its 95% interval and the McNemar p.</w:t>
       </w:r>
     </w:p>
     <w:p>
@@ -3716,7 +4981,7 @@
           <w:sz w:val="20"/>
           <w:szCs w:val="20"/>
         </w:rPr>
-        <w:t xml:space="preserve">Golden patches are a poor population for studying ambiguity. Well-written fixes state their purpose in the code, comments and docstrings they add; evaluating intent-dependent review requires withholding all of it, and even then most changes remain self-explanatory. Benchmarks of genuinely under-specified changes would strengthen this line of work.</w:t>
+        <w:t xml:space="preserve">Clarification did not significantly recover intent in the replication. Over 96 instances, intent recovery was 67% without clarification, 70% with it and 100% with full context. Gap recovery was 0.09 (interval -0.22 to 0.33, McNemar p = 0.66), not significant. The upper limit of the interval rules out recovering more than about a third of the gap at this sample size. The manipulation works: withholding intent cost 33 points of intent recovery against full context, and clarification restored 3 of those points. By subset, gap recovery was 0.00 on the golden rows (p = 1.00) and 0.25 on the mutants (p = 0.51), neither significant.</w:t>
       </w:r>
     </w:p>
     <w:p>
@@ -3737,40 +5002,7 @@
           <w:sz w:val="20"/>
           <w:szCs w:val="20"/>
         </w:rPr>
-        <w:t xml:space="preserve">Finally, clarification cannot exceed the reviewer. On a small free-tier model, full context did not make the reviewer catch injected defects, so detection gains, if they exist, require a stronger reviewer before intent can matter.</w:t>
-      </w:r>
-    </w:p>
-    <w:p>
-      <w:pPr>
-        <w:keepNext/>
-        <w:spacing w:after="80" w:before="160"/>
-        <w:jc w:val="center"/>
-      </w:pPr>
-      <w:r>
-        <w:rPr>
-          <w:rFonts w:ascii="Times New Roman" w:cs="Times New Roman" w:eastAsia="Times New Roman" w:hAnsi="Times New Roman"/>
-          <w:b w:val="false"/>
-          <w:bCs w:val="false"/>
-          <w:i w:val="false"/>
-          <w:iCs w:val="false"/>
-          <w:smallCaps/>
-          <w:sz w:val="20"/>
-          <w:szCs w:val="20"/>
-        </w:rPr>
-        <w:t xml:space="preserve">VII. </w:t>
-      </w:r>
-      <w:r>
-        <w:rPr>
-          <w:rFonts w:ascii="Times New Roman" w:cs="Times New Roman" w:eastAsia="Times New Roman" w:hAnsi="Times New Roman"/>
-          <w:b w:val="false"/>
-          <w:bCs w:val="false"/>
-          <w:i w:val="false"/>
-          <w:iCs w:val="false"/>
-          <w:smallCaps/>
-          <w:sz w:val="20"/>
-          <w:szCs w:val="20"/>
-        </w:rPr>
-        <w:t xml:space="preserve">Threats to Validity</w:t>
+        <w:t xml:space="preserve">Detector recall was the limit, as in the original study. The detector asked on 17 of 96 treatment reviews. Of the 32 changes that the reviewer misread without clarification, the detector asked on 8 and missed 24. The simulated author answered 7 of those 8 questions, and the treatment recovered intent on 3 of the 32 changes. Effects went in both directions: clarification helped on 12 instances and hurt on 9. Once a question was answered, the treatment recovered intent in 3 of 7 cases, so most of the loss lies in deciding when to ask. Recall, not the answer, is the limit.</w:t>
       </w:r>
     </w:p>
     <w:p>
@@ -3791,40 +5023,26 @@
           <w:sz w:val="20"/>
           <w:szCs w:val="20"/>
         </w:rPr>
-        <w:t xml:space="preserve">The sample is small (36 instances under per-model daily quotas), so intervals are wide. The judge has not yet been validated against human scoring; a stratified sample and agreement tooling (Cohen's κ [15]) are provided. The simulated author answers from withheld text only, but leakage requires the hand audit the tooling prepares. We report a protocol deviation: in the first v2 run the simulated author's token budget was exhausted by its model's hidden reasoning, returning empty answers, and its prompt refused questions phrased in terms of unseen code. Both were corrected and the treatment re-run for the six affected instances; floor and ceiling were not re-run, and the prompt revision, made after observing refusals, is logged with every exchange. All verified mutants come from sympy and the operators produce simple defects. The reviewer is a small model; results may differ for stronger ones.</w:t>
+        <w:t xml:space="preserve">Defect detection stays near the floor even with full context. The mutant rows caught the injected defect on 1 of 32 without clarification, 2 with it and 3 with full context (3%, 6% and 9%; McNemar p = 1.00). A small local reviewer, qwen3:4b-instruct-2507-q4_K_M, limits defect detection, as in the original study. Over 64 golden rows, false alarms were 1 without clarification, 3 with it and 3 with full context, too few to separate the conditions (p = 0.50). The study makes no claim about an effect on defects.</w:t>
       </w:r>
     </w:p>
     <w:p>
       <w:pPr>
         <w:keepNext/>
-        <w:spacing w:after="80" w:before="160"/>
-        <w:jc w:val="center"/>
-      </w:pPr>
-      <w:r>
-        <w:rPr>
-          <w:rFonts w:ascii="Times New Roman" w:cs="Times New Roman" w:eastAsia="Times New Roman" w:hAnsi="Times New Roman"/>
-          <w:b w:val="false"/>
-          <w:bCs w:val="false"/>
-          <w:i w:val="false"/>
-          <w:iCs w:val="false"/>
-          <w:smallCaps/>
-          <w:sz w:val="20"/>
-          <w:szCs w:val="20"/>
-        </w:rPr>
-        <w:t xml:space="preserve">VIII. </w:t>
-      </w:r>
-      <w:r>
-        <w:rPr>
-          <w:rFonts w:ascii="Times New Roman" w:cs="Times New Roman" w:eastAsia="Times New Roman" w:hAnsi="Times New Roman"/>
-          <w:b w:val="false"/>
-          <w:bCs w:val="false"/>
-          <w:i w:val="false"/>
-          <w:iCs w:val="false"/>
-          <w:smallCaps/>
-          <w:sz w:val="20"/>
-          <w:szCs w:val="20"/>
-        </w:rPr>
-        <w:t xml:space="preserve">Conclusion</w:t>
+        <w:spacing w:after="40" w:before="80"/>
+      </w:pPr>
+      <w:r>
+        <w:rPr>
+          <w:rFonts w:ascii="Times New Roman" w:cs="Times New Roman" w:eastAsia="Times New Roman" w:hAnsi="Times New Roman"/>
+          <w:b w:val="false"/>
+          <w:bCs w:val="false"/>
+          <w:i/>
+          <w:iCs/>
+          <w:smallCaps w:val="false"/>
+          <w:sz w:val="20"/>
+          <w:szCs w:val="20"/>
+        </w:rPr>
+        <w:t xml:space="preserve">G. Judge calibration</w:t>
       </w:r>
     </w:p>
     <w:p>
@@ -3845,7 +5063,1161 @@
           <w:sz w:val="20"/>
           <w:szCs w:val="20"/>
         </w:rPr>
-        <w:t xml:space="preserve">ClarifyReview inserts a decision before critique: ask the author when the intent of a change cannot be read from the change. Evaluating the idea required withholding all natural-language intent, because golden patches document their own. With that manipulation, clarification recovered 0.17 of the intent gap on 36 instances—in the expected direction, not significant at this size—and a per-instance trace shows it succeeded where it was given the chance, with detector recall as the limit. Future work is a human-labelled set to train and calibrate the detectors, human validation of the judge, a paired developer study of usefulness and trust, and a larger run with a stronger reviewer.</w:t>
+        <w:t xml:space="preserve">Three AI judges scored the original reviews: the API judge gemma-4-31b-it, Claude Sonnet agents (claude-sonnet-agent), and the Gemini 4 Argon (web app) on a stratified sample of 30 runs, stratified by condition and variant. Table IV gives percent agreement, kappa and n for each judge pair. All of this is AI-vs-AI agreement, not validation against human scorers.</w:t>
+      </w:r>
+    </w:p>
+    <w:p>
+      <w:pPr>
+        <w:keepNext/>
+        <w:spacing w:after="0" w:before="100"/>
+        <w:jc w:val="center"/>
+      </w:pPr>
+      <w:r>
+        <w:rPr>
+          <w:rFonts w:ascii="Times New Roman" w:cs="Times New Roman" w:eastAsia="Times New Roman" w:hAnsi="Times New Roman"/>
+          <w:b w:val="false"/>
+          <w:bCs w:val="false"/>
+          <w:i w:val="false"/>
+          <w:iCs w:val="false"/>
+          <w:smallCaps w:val="false"/>
+          <w:sz w:val="16"/>
+          <w:szCs w:val="16"/>
+        </w:rPr>
+        <w:t xml:space="preserve">TABLE IV</w:t>
+      </w:r>
+    </w:p>
+    <w:p>
+      <w:pPr>
+        <w:keepNext/>
+        <w:spacing w:after="40"/>
+        <w:jc w:val="center"/>
+      </w:pPr>
+      <w:r>
+        <w:rPr>
+          <w:rFonts w:ascii="Times New Roman" w:cs="Times New Roman" w:eastAsia="Times New Roman" w:hAnsi="Times New Roman"/>
+          <w:b w:val="false"/>
+          <w:bCs w:val="false"/>
+          <w:i w:val="false"/>
+          <w:iCs w:val="false"/>
+          <w:smallCaps/>
+          <w:sz w:val="16"/>
+          <w:szCs w:val="16"/>
+        </w:rPr>
+        <w:t xml:space="preserve">Agreement between AI judges (% agreement / kappa / n)</w:t>
+      </w:r>
+    </w:p>
+    <w:tbl>
+      <w:tblPr>
+        <w:tblW w:type="dxa" w:w="3780"/>
+        <w:tblBorders>
+          <w:top w:val="single" w:color="auto" w:sz="4"/>
+          <w:left w:val="single" w:color="auto" w:sz="4"/>
+          <w:bottom w:val="single" w:color="auto" w:sz="4"/>
+          <w:right w:val="single" w:color="auto" w:sz="4"/>
+          <w:insideH w:val="single" w:color="auto" w:sz="4"/>
+          <w:insideV w:val="single" w:color="auto" w:sz="4"/>
+        </w:tblBorders>
+      </w:tblPr>
+      <w:tblGrid>
+        <w:gridCol w:w="1500"/>
+        <w:gridCol w:w="760"/>
+        <w:gridCol w:w="760"/>
+        <w:gridCol w:w="760"/>
+      </w:tblGrid>
+      <w:tr>
+        <w:tc>
+          <w:tcPr>
+            <w:tcW w:type="dxa" w:w="1500"/>
+            <w:tcBorders>
+              <w:top w:val="single" w:color="000000" w:sz="4"/>
+              <w:left w:val="none" w:color="FFFFFF" w:sz="0"/>
+              <w:bottom w:val="single" w:color="000000" w:sz="4"/>
+              <w:right w:val="none" w:color="FFFFFF" w:sz="0"/>
+            </w:tcBorders>
+            <w:tcMar>
+              <w:top w:type="dxa" w:w="25"/>
+              <w:left w:type="dxa" w:w="40"/>
+              <w:bottom w:type="dxa" w:w="25"/>
+              <w:right w:type="dxa" w:w="40"/>
+            </w:tcMar>
+          </w:tcPr>
+          <w:p>
+            <w:pPr>
+              <w:jc w:val="left"/>
+            </w:pPr>
+            <w:r>
+              <w:rPr>
+                <w:rFonts w:ascii="Times New Roman" w:cs="Times New Roman" w:eastAsia="Times New Roman" w:hAnsi="Times New Roman"/>
+                <w:b/>
+                <w:bCs/>
+                <w:i w:val="false"/>
+                <w:iCs w:val="false"/>
+                <w:smallCaps w:val="false"/>
+                <w:sz w:val="16"/>
+                <w:szCs w:val="16"/>
+              </w:rPr>
+              <w:t xml:space="preserve">Judge pair</w:t>
+            </w:r>
+          </w:p>
+        </w:tc>
+        <w:tc>
+          <w:tcPr>
+            <w:tcW w:type="dxa" w:w="760"/>
+            <w:tcBorders>
+              <w:top w:val="single" w:color="000000" w:sz="4"/>
+              <w:left w:val="none" w:color="FFFFFF" w:sz="0"/>
+              <w:bottom w:val="single" w:color="000000" w:sz="4"/>
+              <w:right w:val="none" w:color="FFFFFF" w:sz="0"/>
+            </w:tcBorders>
+            <w:tcMar>
+              <w:top w:type="dxa" w:w="25"/>
+              <w:left w:type="dxa" w:w="40"/>
+              <w:bottom w:type="dxa" w:w="25"/>
+              <w:right w:type="dxa" w:w="40"/>
+            </w:tcMar>
+          </w:tcPr>
+          <w:p>
+            <w:pPr>
+              <w:jc w:val="center"/>
+            </w:pPr>
+            <w:r>
+              <w:rPr>
+                <w:rFonts w:ascii="Times New Roman" w:cs="Times New Roman" w:eastAsia="Times New Roman" w:hAnsi="Times New Roman"/>
+                <w:b/>
+                <w:bCs/>
+                <w:i w:val="false"/>
+                <w:iCs w:val="false"/>
+                <w:smallCaps w:val="false"/>
+                <w:sz w:val="16"/>
+                <w:szCs w:val="16"/>
+              </w:rPr>
+              <w:t xml:space="preserve">Intent</w:t>
+            </w:r>
+          </w:p>
+        </w:tc>
+        <w:tc>
+          <w:tcPr>
+            <w:tcW w:type="dxa" w:w="760"/>
+            <w:tcBorders>
+              <w:top w:val="single" w:color="000000" w:sz="4"/>
+              <w:left w:val="none" w:color="FFFFFF" w:sz="0"/>
+              <w:bottom w:val="single" w:color="000000" w:sz="4"/>
+              <w:right w:val="none" w:color="FFFFFF" w:sz="0"/>
+            </w:tcBorders>
+            <w:tcMar>
+              <w:top w:type="dxa" w:w="25"/>
+              <w:left w:type="dxa" w:w="40"/>
+              <w:bottom w:type="dxa" w:w="25"/>
+              <w:right w:type="dxa" w:w="40"/>
+            </w:tcMar>
+          </w:tcPr>
+          <w:p>
+            <w:pPr>
+              <w:jc w:val="center"/>
+            </w:pPr>
+            <w:r>
+              <w:rPr>
+                <w:rFonts w:ascii="Times New Roman" w:cs="Times New Roman" w:eastAsia="Times New Roman" w:hAnsi="Times New Roman"/>
+                <w:b/>
+                <w:bCs/>
+                <w:i w:val="false"/>
+                <w:iCs w:val="false"/>
+                <w:smallCaps w:val="false"/>
+                <w:sz w:val="16"/>
+                <w:szCs w:val="16"/>
+              </w:rPr>
+              <w:t xml:space="preserve">Defect</w:t>
+            </w:r>
+          </w:p>
+        </w:tc>
+        <w:tc>
+          <w:tcPr>
+            <w:tcW w:type="dxa" w:w="760"/>
+            <w:tcBorders>
+              <w:top w:val="single" w:color="000000" w:sz="4"/>
+              <w:left w:val="none" w:color="FFFFFF" w:sz="0"/>
+              <w:bottom w:val="single" w:color="000000" w:sz="4"/>
+              <w:right w:val="none" w:color="FFFFFF" w:sz="0"/>
+            </w:tcBorders>
+            <w:tcMar>
+              <w:top w:type="dxa" w:w="25"/>
+              <w:left w:type="dxa" w:w="40"/>
+              <w:bottom w:type="dxa" w:w="25"/>
+              <w:right w:type="dxa" w:w="40"/>
+            </w:tcMar>
+          </w:tcPr>
+          <w:p>
+            <w:pPr>
+              <w:jc w:val="center"/>
+            </w:pPr>
+            <w:r>
+              <w:rPr>
+                <w:rFonts w:ascii="Times New Roman" w:cs="Times New Roman" w:eastAsia="Times New Roman" w:hAnsi="Times New Roman"/>
+                <w:b/>
+                <w:bCs/>
+                <w:i w:val="false"/>
+                <w:iCs w:val="false"/>
+                <w:smallCaps w:val="false"/>
+                <w:sz w:val="16"/>
+                <w:szCs w:val="16"/>
+              </w:rPr>
+              <w:t xml:space="preserve">False alarm</w:t>
+            </w:r>
+          </w:p>
+        </w:tc>
+      </w:tr>
+      <w:tr>
+        <w:tc>
+          <w:tcPr>
+            <w:tcW w:type="dxa" w:w="1500"/>
+            <w:tcBorders>
+              <w:top w:val="none" w:color="FFFFFF" w:sz="0"/>
+              <w:left w:val="none" w:color="FFFFFF" w:sz="0"/>
+              <w:bottom w:val="none" w:color="FFFFFF" w:sz="0"/>
+              <w:right w:val="none" w:color="FFFFFF" w:sz="0"/>
+            </w:tcBorders>
+            <w:tcMar>
+              <w:top w:type="dxa" w:w="25"/>
+              <w:left w:type="dxa" w:w="40"/>
+              <w:bottom w:type="dxa" w:w="25"/>
+              <w:right w:type="dxa" w:w="40"/>
+            </w:tcMar>
+          </w:tcPr>
+          <w:p>
+            <w:pPr>
+              <w:jc w:val="left"/>
+            </w:pPr>
+            <w:r>
+              <w:rPr>
+                <w:rFonts w:ascii="Times New Roman" w:cs="Times New Roman" w:eastAsia="Times New Roman" w:hAnsi="Times New Roman"/>
+                <w:b w:val="false"/>
+                <w:bCs w:val="false"/>
+                <w:i w:val="false"/>
+                <w:iCs w:val="false"/>
+                <w:smallCaps w:val="false"/>
+                <w:sz w:val="16"/>
+                <w:szCs w:val="16"/>
+              </w:rPr>
+              <w:t xml:space="preserve">v2: gemma-4-31b-it vs agent</w:t>
+            </w:r>
+          </w:p>
+        </w:tc>
+        <w:tc>
+          <w:tcPr>
+            <w:tcW w:type="dxa" w:w="760"/>
+            <w:tcBorders>
+              <w:top w:val="none" w:color="FFFFFF" w:sz="0"/>
+              <w:left w:val="none" w:color="FFFFFF" w:sz="0"/>
+              <w:bottom w:val="none" w:color="FFFFFF" w:sz="0"/>
+              <w:right w:val="none" w:color="FFFFFF" w:sz="0"/>
+            </w:tcBorders>
+            <w:tcMar>
+              <w:top w:type="dxa" w:w="25"/>
+              <w:left w:type="dxa" w:w="40"/>
+              <w:bottom w:type="dxa" w:w="25"/>
+              <w:right w:type="dxa" w:w="40"/>
+            </w:tcMar>
+          </w:tcPr>
+          <w:p>
+            <w:pPr>
+              <w:jc w:val="center"/>
+            </w:pPr>
+            <w:r>
+              <w:rPr>
+                <w:rFonts w:ascii="Times New Roman" w:cs="Times New Roman" w:eastAsia="Times New Roman" w:hAnsi="Times New Roman"/>
+                <w:b w:val="false"/>
+                <w:bCs w:val="false"/>
+                <w:i w:val="false"/>
+                <w:iCs w:val="false"/>
+                <w:smallCaps w:val="false"/>
+                <w:sz w:val="16"/>
+                <w:szCs w:val="16"/>
+              </w:rPr>
+              <w:t xml:space="preserve">89% / 0.40 / 108</w:t>
+            </w:r>
+          </w:p>
+        </w:tc>
+        <w:tc>
+          <w:tcPr>
+            <w:tcW w:type="dxa" w:w="760"/>
+            <w:tcBorders>
+              <w:top w:val="none" w:color="FFFFFF" w:sz="0"/>
+              <w:left w:val="none" w:color="FFFFFF" w:sz="0"/>
+              <w:bottom w:val="none" w:color="FFFFFF" w:sz="0"/>
+              <w:right w:val="none" w:color="FFFFFF" w:sz="0"/>
+            </w:tcBorders>
+            <w:tcMar>
+              <w:top w:type="dxa" w:w="25"/>
+              <w:left w:type="dxa" w:w="40"/>
+              <w:bottom w:type="dxa" w:w="25"/>
+              <w:right w:type="dxa" w:w="40"/>
+            </w:tcMar>
+          </w:tcPr>
+          <w:p>
+            <w:pPr>
+              <w:jc w:val="center"/>
+            </w:pPr>
+            <w:r>
+              <w:rPr>
+                <w:rFonts w:ascii="Times New Roman" w:cs="Times New Roman" w:eastAsia="Times New Roman" w:hAnsi="Times New Roman"/>
+                <w:b w:val="false"/>
+                <w:bCs w:val="false"/>
+                <w:i w:val="false"/>
+                <w:iCs w:val="false"/>
+                <w:smallCaps w:val="false"/>
+                <w:sz w:val="16"/>
+                <w:szCs w:val="16"/>
+              </w:rPr>
+              <w:t xml:space="preserve">99% / 0.88 / 108</w:t>
+            </w:r>
+          </w:p>
+        </w:tc>
+        <w:tc>
+          <w:tcPr>
+            <w:tcW w:type="dxa" w:w="760"/>
+            <w:tcBorders>
+              <w:top w:val="none" w:color="FFFFFF" w:sz="0"/>
+              <w:left w:val="none" w:color="FFFFFF" w:sz="0"/>
+              <w:bottom w:val="none" w:color="FFFFFF" w:sz="0"/>
+              <w:right w:val="none" w:color="FFFFFF" w:sz="0"/>
+            </w:tcBorders>
+            <w:tcMar>
+              <w:top w:type="dxa" w:w="25"/>
+              <w:left w:type="dxa" w:w="40"/>
+              <w:bottom w:type="dxa" w:w="25"/>
+              <w:right w:type="dxa" w:w="40"/>
+            </w:tcMar>
+          </w:tcPr>
+          <w:p>
+            <w:pPr>
+              <w:jc w:val="center"/>
+            </w:pPr>
+            <w:r>
+              <w:rPr>
+                <w:rFonts w:ascii="Times New Roman" w:cs="Times New Roman" w:eastAsia="Times New Roman" w:hAnsi="Times New Roman"/>
+                <w:b w:val="false"/>
+                <w:bCs w:val="false"/>
+                <w:i w:val="false"/>
+                <w:iCs w:val="false"/>
+                <w:smallCaps w:val="false"/>
+                <w:sz w:val="16"/>
+                <w:szCs w:val="16"/>
+              </w:rPr>
+              <w:t xml:space="preserve">100% / 1.00 / 108</w:t>
+            </w:r>
+          </w:p>
+        </w:tc>
+      </w:tr>
+      <w:tr>
+        <w:tc>
+          <w:tcPr>
+            <w:tcW w:type="dxa" w:w="1500"/>
+            <w:tcBorders>
+              <w:top w:val="none" w:color="FFFFFF" w:sz="0"/>
+              <w:left w:val="none" w:color="FFFFFF" w:sz="0"/>
+              <w:bottom w:val="none" w:color="FFFFFF" w:sz="0"/>
+              <w:right w:val="none" w:color="FFFFFF" w:sz="0"/>
+            </w:tcBorders>
+            <w:tcMar>
+              <w:top w:type="dxa" w:w="25"/>
+              <w:left w:type="dxa" w:w="40"/>
+              <w:bottom w:type="dxa" w:w="25"/>
+              <w:right w:type="dxa" w:w="40"/>
+            </w:tcMar>
+          </w:tcPr>
+          <w:p>
+            <w:pPr>
+              <w:jc w:val="left"/>
+            </w:pPr>
+            <w:r>
+              <w:rPr>
+                <w:rFonts w:ascii="Times New Roman" w:cs="Times New Roman" w:eastAsia="Times New Roman" w:hAnsi="Times New Roman"/>
+                <w:b w:val="false"/>
+                <w:bCs w:val="false"/>
+                <w:i w:val="false"/>
+                <w:iCs w:val="false"/>
+                <w:smallCaps w:val="false"/>
+                <w:sz w:val="16"/>
+                <w:szCs w:val="16"/>
+              </w:rPr>
+              <w:t xml:space="preserve">v2: Gemini web vs agent</w:t>
+            </w:r>
+          </w:p>
+        </w:tc>
+        <w:tc>
+          <w:tcPr>
+            <w:tcW w:type="dxa" w:w="760"/>
+            <w:tcBorders>
+              <w:top w:val="none" w:color="FFFFFF" w:sz="0"/>
+              <w:left w:val="none" w:color="FFFFFF" w:sz="0"/>
+              <w:bottom w:val="none" w:color="FFFFFF" w:sz="0"/>
+              <w:right w:val="none" w:color="FFFFFF" w:sz="0"/>
+            </w:tcBorders>
+            <w:tcMar>
+              <w:top w:type="dxa" w:w="25"/>
+              <w:left w:type="dxa" w:w="40"/>
+              <w:bottom w:type="dxa" w:w="25"/>
+              <w:right w:type="dxa" w:w="40"/>
+            </w:tcMar>
+          </w:tcPr>
+          <w:p>
+            <w:pPr>
+              <w:jc w:val="center"/>
+            </w:pPr>
+            <w:r>
+              <w:rPr>
+                <w:rFonts w:ascii="Times New Roman" w:cs="Times New Roman" w:eastAsia="Times New Roman" w:hAnsi="Times New Roman"/>
+                <w:b w:val="false"/>
+                <w:bCs w:val="false"/>
+                <w:i w:val="false"/>
+                <w:iCs w:val="false"/>
+                <w:smallCaps w:val="false"/>
+                <w:sz w:val="16"/>
+                <w:szCs w:val="16"/>
+              </w:rPr>
+              <w:t xml:space="preserve">90% / 0.62 / 30</w:t>
+            </w:r>
+          </w:p>
+        </w:tc>
+        <w:tc>
+          <w:tcPr>
+            <w:tcW w:type="dxa" w:w="760"/>
+            <w:tcBorders>
+              <w:top w:val="none" w:color="FFFFFF" w:sz="0"/>
+              <w:left w:val="none" w:color="FFFFFF" w:sz="0"/>
+              <w:bottom w:val="none" w:color="FFFFFF" w:sz="0"/>
+              <w:right w:val="none" w:color="FFFFFF" w:sz="0"/>
+            </w:tcBorders>
+            <w:tcMar>
+              <w:top w:type="dxa" w:w="25"/>
+              <w:left w:type="dxa" w:w="40"/>
+              <w:bottom w:type="dxa" w:w="25"/>
+              <w:right w:type="dxa" w:w="40"/>
+            </w:tcMar>
+          </w:tcPr>
+          <w:p>
+            <w:pPr>
+              <w:jc w:val="center"/>
+            </w:pPr>
+            <w:r>
+              <w:rPr>
+                <w:rFonts w:ascii="Times New Roman" w:cs="Times New Roman" w:eastAsia="Times New Roman" w:hAnsi="Times New Roman"/>
+                <w:b w:val="false"/>
+                <w:bCs w:val="false"/>
+                <w:i w:val="false"/>
+                <w:iCs w:val="false"/>
+                <w:smallCaps w:val="false"/>
+                <w:sz w:val="16"/>
+                <w:szCs w:val="16"/>
+              </w:rPr>
+              <w:t xml:space="preserve">100% / 1.00 / 30</w:t>
+            </w:r>
+          </w:p>
+        </w:tc>
+        <w:tc>
+          <w:tcPr>
+            <w:tcW w:type="dxa" w:w="760"/>
+            <w:tcBorders>
+              <w:top w:val="none" w:color="FFFFFF" w:sz="0"/>
+              <w:left w:val="none" w:color="FFFFFF" w:sz="0"/>
+              <w:bottom w:val="none" w:color="FFFFFF" w:sz="0"/>
+              <w:right w:val="none" w:color="FFFFFF" w:sz="0"/>
+            </w:tcBorders>
+            <w:tcMar>
+              <w:top w:type="dxa" w:w="25"/>
+              <w:left w:type="dxa" w:w="40"/>
+              <w:bottom w:type="dxa" w:w="25"/>
+              <w:right w:type="dxa" w:w="40"/>
+            </w:tcMar>
+          </w:tcPr>
+          <w:p>
+            <w:pPr>
+              <w:jc w:val="center"/>
+            </w:pPr>
+            <w:r>
+              <w:rPr>
+                <w:rFonts w:ascii="Times New Roman" w:cs="Times New Roman" w:eastAsia="Times New Roman" w:hAnsi="Times New Roman"/>
+                <w:b w:val="false"/>
+                <w:bCs w:val="false"/>
+                <w:i w:val="false"/>
+                <w:iCs w:val="false"/>
+                <w:smallCaps w:val="false"/>
+                <w:sz w:val="16"/>
+                <w:szCs w:val="16"/>
+              </w:rPr>
+              <w:t xml:space="preserve">100% / 1.00 / 30</w:t>
+            </w:r>
+          </w:p>
+        </w:tc>
+      </w:tr>
+      <w:tr>
+        <w:tc>
+          <w:tcPr>
+            <w:tcW w:type="dxa" w:w="1500"/>
+            <w:tcBorders>
+              <w:top w:val="none" w:color="FFFFFF" w:sz="0"/>
+              <w:left w:val="none" w:color="FFFFFF" w:sz="0"/>
+              <w:bottom w:val="none" w:color="FFFFFF" w:sz="0"/>
+              <w:right w:val="none" w:color="FFFFFF" w:sz="0"/>
+            </w:tcBorders>
+            <w:tcMar>
+              <w:top w:type="dxa" w:w="25"/>
+              <w:left w:type="dxa" w:w="40"/>
+              <w:bottom w:type="dxa" w:w="25"/>
+              <w:right w:type="dxa" w:w="40"/>
+            </w:tcMar>
+          </w:tcPr>
+          <w:p>
+            <w:pPr>
+              <w:jc w:val="left"/>
+            </w:pPr>
+            <w:r>
+              <w:rPr>
+                <w:rFonts w:ascii="Times New Roman" w:cs="Times New Roman" w:eastAsia="Times New Roman" w:hAnsi="Times New Roman"/>
+                <w:b w:val="false"/>
+                <w:bCs w:val="false"/>
+                <w:i w:val="false"/>
+                <w:iCs w:val="false"/>
+                <w:smallCaps w:val="false"/>
+                <w:sz w:val="16"/>
+                <w:szCs w:val="16"/>
+              </w:rPr>
+              <w:t xml:space="preserve">v2: Gemini web vs gemma-4-31b-it</w:t>
+            </w:r>
+          </w:p>
+        </w:tc>
+        <w:tc>
+          <w:tcPr>
+            <w:tcW w:type="dxa" w:w="760"/>
+            <w:tcBorders>
+              <w:top w:val="none" w:color="FFFFFF" w:sz="0"/>
+              <w:left w:val="none" w:color="FFFFFF" w:sz="0"/>
+              <w:bottom w:val="none" w:color="FFFFFF" w:sz="0"/>
+              <w:right w:val="none" w:color="FFFFFF" w:sz="0"/>
+            </w:tcBorders>
+            <w:tcMar>
+              <w:top w:type="dxa" w:w="25"/>
+              <w:left w:type="dxa" w:w="40"/>
+              <w:bottom w:type="dxa" w:w="25"/>
+              <w:right w:type="dxa" w:w="40"/>
+            </w:tcMar>
+          </w:tcPr>
+          <w:p>
+            <w:pPr>
+              <w:jc w:val="center"/>
+            </w:pPr>
+            <w:r>
+              <w:rPr>
+                <w:rFonts w:ascii="Times New Roman" w:cs="Times New Roman" w:eastAsia="Times New Roman" w:hAnsi="Times New Roman"/>
+                <w:b w:val="false"/>
+                <w:bCs w:val="false"/>
+                <w:i w:val="false"/>
+                <w:iCs w:val="false"/>
+                <w:smallCaps w:val="false"/>
+                <w:sz w:val="16"/>
+                <w:szCs w:val="16"/>
+              </w:rPr>
+              <w:t xml:space="preserve">87% / 0.52 / 30</w:t>
+            </w:r>
+          </w:p>
+        </w:tc>
+        <w:tc>
+          <w:tcPr>
+            <w:tcW w:type="dxa" w:w="760"/>
+            <w:tcBorders>
+              <w:top w:val="none" w:color="FFFFFF" w:sz="0"/>
+              <w:left w:val="none" w:color="FFFFFF" w:sz="0"/>
+              <w:bottom w:val="none" w:color="FFFFFF" w:sz="0"/>
+              <w:right w:val="none" w:color="FFFFFF" w:sz="0"/>
+            </w:tcBorders>
+            <w:tcMar>
+              <w:top w:type="dxa" w:w="25"/>
+              <w:left w:type="dxa" w:w="40"/>
+              <w:bottom w:type="dxa" w:w="25"/>
+              <w:right w:type="dxa" w:w="40"/>
+            </w:tcMar>
+          </w:tcPr>
+          <w:p>
+            <w:pPr>
+              <w:jc w:val="center"/>
+            </w:pPr>
+            <w:r>
+              <w:rPr>
+                <w:rFonts w:ascii="Times New Roman" w:cs="Times New Roman" w:eastAsia="Times New Roman" w:hAnsi="Times New Roman"/>
+                <w:b w:val="false"/>
+                <w:bCs w:val="false"/>
+                <w:i w:val="false"/>
+                <w:iCs w:val="false"/>
+                <w:smallCaps w:val="false"/>
+                <w:sz w:val="16"/>
+                <w:szCs w:val="16"/>
+              </w:rPr>
+              <w:t xml:space="preserve">97% / 0.65 / 30</w:t>
+            </w:r>
+          </w:p>
+        </w:tc>
+        <w:tc>
+          <w:tcPr>
+            <w:tcW w:type="dxa" w:w="760"/>
+            <w:tcBorders>
+              <w:top w:val="none" w:color="FFFFFF" w:sz="0"/>
+              <w:left w:val="none" w:color="FFFFFF" w:sz="0"/>
+              <w:bottom w:val="none" w:color="FFFFFF" w:sz="0"/>
+              <w:right w:val="none" w:color="FFFFFF" w:sz="0"/>
+            </w:tcBorders>
+            <w:tcMar>
+              <w:top w:type="dxa" w:w="25"/>
+              <w:left w:type="dxa" w:w="40"/>
+              <w:bottom w:type="dxa" w:w="25"/>
+              <w:right w:type="dxa" w:w="40"/>
+            </w:tcMar>
+          </w:tcPr>
+          <w:p>
+            <w:pPr>
+              <w:jc w:val="center"/>
+            </w:pPr>
+            <w:r>
+              <w:rPr>
+                <w:rFonts w:ascii="Times New Roman" w:cs="Times New Roman" w:eastAsia="Times New Roman" w:hAnsi="Times New Roman"/>
+                <w:b w:val="false"/>
+                <w:bCs w:val="false"/>
+                <w:i w:val="false"/>
+                <w:iCs w:val="false"/>
+                <w:smallCaps w:val="false"/>
+                <w:sz w:val="16"/>
+                <w:szCs w:val="16"/>
+              </w:rPr>
+              <w:t xml:space="preserve">100% / 1.00 / 30</w:t>
+            </w:r>
+          </w:p>
+        </w:tc>
+      </w:tr>
+      <w:tr>
+        <w:tc>
+          <w:tcPr>
+            <w:tcW w:type="dxa" w:w="1500"/>
+            <w:tcBorders>
+              <w:top w:val="none" w:color="FFFFFF" w:sz="0"/>
+              <w:left w:val="none" w:color="FFFFFF" w:sz="0"/>
+              <w:bottom w:val="single" w:color="000000" w:sz="4"/>
+              <w:right w:val="none" w:color="FFFFFF" w:sz="0"/>
+            </w:tcBorders>
+            <w:tcMar>
+              <w:top w:type="dxa" w:w="25"/>
+              <w:left w:type="dxa" w:w="40"/>
+              <w:bottom w:type="dxa" w:w="25"/>
+              <w:right w:type="dxa" w:w="40"/>
+            </w:tcMar>
+          </w:tcPr>
+          <w:p>
+            <w:pPr>
+              <w:jc w:val="left"/>
+            </w:pPr>
+            <w:r>
+              <w:rPr>
+                <w:rFonts w:ascii="Times New Roman" w:cs="Times New Roman" w:eastAsia="Times New Roman" w:hAnsi="Times New Roman"/>
+                <w:b w:val="false"/>
+                <w:bCs w:val="false"/>
+                <w:i w:val="false"/>
+                <w:iCs w:val="false"/>
+                <w:smallCaps w:val="false"/>
+                <w:sz w:val="16"/>
+                <w:szCs w:val="16"/>
+              </w:rPr>
+              <w:t xml:space="preserve">v3: llama3.2:3b vs agent</w:t>
+            </w:r>
+          </w:p>
+        </w:tc>
+        <w:tc>
+          <w:tcPr>
+            <w:tcW w:type="dxa" w:w="760"/>
+            <w:tcBorders>
+              <w:top w:val="none" w:color="FFFFFF" w:sz="0"/>
+              <w:left w:val="none" w:color="FFFFFF" w:sz="0"/>
+              <w:bottom w:val="single" w:color="000000" w:sz="4"/>
+              <w:right w:val="none" w:color="FFFFFF" w:sz="0"/>
+            </w:tcBorders>
+            <w:tcMar>
+              <w:top w:type="dxa" w:w="25"/>
+              <w:left w:type="dxa" w:w="40"/>
+              <w:bottom w:type="dxa" w:w="25"/>
+              <w:right w:type="dxa" w:w="40"/>
+            </w:tcMar>
+          </w:tcPr>
+          <w:p>
+            <w:pPr>
+              <w:jc w:val="center"/>
+            </w:pPr>
+            <w:r>
+              <w:rPr>
+                <w:rFonts w:ascii="Times New Roman" w:cs="Times New Roman" w:eastAsia="Times New Roman" w:hAnsi="Times New Roman"/>
+                <w:b w:val="false"/>
+                <w:bCs w:val="false"/>
+                <w:i w:val="false"/>
+                <w:iCs w:val="false"/>
+                <w:smallCaps w:val="false"/>
+                <w:sz w:val="16"/>
+                <w:szCs w:val="16"/>
+              </w:rPr>
+              <w:t xml:space="preserve">68% / 0.20 / 288</w:t>
+            </w:r>
+          </w:p>
+        </w:tc>
+        <w:tc>
+          <w:tcPr>
+            <w:tcW w:type="dxa" w:w="760"/>
+            <w:tcBorders>
+              <w:top w:val="none" w:color="FFFFFF" w:sz="0"/>
+              <w:left w:val="none" w:color="FFFFFF" w:sz="0"/>
+              <w:bottom w:val="single" w:color="000000" w:sz="4"/>
+              <w:right w:val="none" w:color="FFFFFF" w:sz="0"/>
+            </w:tcBorders>
+            <w:tcMar>
+              <w:top w:type="dxa" w:w="25"/>
+              <w:left w:type="dxa" w:w="40"/>
+              <w:bottom w:type="dxa" w:w="25"/>
+              <w:right w:type="dxa" w:w="40"/>
+            </w:tcMar>
+          </w:tcPr>
+          <w:p>
+            <w:pPr>
+              <w:jc w:val="center"/>
+            </w:pPr>
+            <w:r>
+              <w:rPr>
+                <w:rFonts w:ascii="Times New Roman" w:cs="Times New Roman" w:eastAsia="Times New Roman" w:hAnsi="Times New Roman"/>
+                <w:b w:val="false"/>
+                <w:bCs w:val="false"/>
+                <w:i w:val="false"/>
+                <w:iCs w:val="false"/>
+                <w:smallCaps w:val="false"/>
+                <w:sz w:val="16"/>
+                <w:szCs w:val="16"/>
+              </w:rPr>
+              <w:t xml:space="preserve">93% / 0.06 / 288</w:t>
+            </w:r>
+          </w:p>
+        </w:tc>
+        <w:tc>
+          <w:tcPr>
+            <w:tcW w:type="dxa" w:w="760"/>
+            <w:tcBorders>
+              <w:top w:val="none" w:color="FFFFFF" w:sz="0"/>
+              <w:left w:val="none" w:color="FFFFFF" w:sz="0"/>
+              <w:bottom w:val="single" w:color="000000" w:sz="4"/>
+              <w:right w:val="none" w:color="FFFFFF" w:sz="0"/>
+            </w:tcBorders>
+            <w:tcMar>
+              <w:top w:type="dxa" w:w="25"/>
+              <w:left w:type="dxa" w:w="40"/>
+              <w:bottom w:type="dxa" w:w="25"/>
+              <w:right w:type="dxa" w:w="40"/>
+            </w:tcMar>
+          </w:tcPr>
+          <w:p>
+            <w:pPr>
+              <w:jc w:val="center"/>
+            </w:pPr>
+            <w:r>
+              <w:rPr>
+                <w:rFonts w:ascii="Times New Roman" w:cs="Times New Roman" w:eastAsia="Times New Roman" w:hAnsi="Times New Roman"/>
+                <w:b w:val="false"/>
+                <w:bCs w:val="false"/>
+                <w:i w:val="false"/>
+                <w:iCs w:val="false"/>
+                <w:smallCaps w:val="false"/>
+                <w:sz w:val="16"/>
+                <w:szCs w:val="16"/>
+              </w:rPr>
+              <w:t xml:space="preserve">98% / 0.00 / 288</w:t>
+            </w:r>
+          </w:p>
+        </w:tc>
+      </w:tr>
+    </w:tbl>
+    <w:p>
+      <w:pPr>
+        <w:spacing w:after="60"/>
+      </w:pPr>
+      <w:r>
+        <w:rPr>
+          <w:rFonts w:ascii="Times New Roman" w:cs="Times New Roman" w:eastAsia="Times New Roman" w:hAnsi="Times New Roman"/>
+          <w:b w:val="false"/>
+          <w:bCs w:val="false"/>
+          <w:i w:val="false"/>
+          <w:iCs w:val="false"/>
+          <w:smallCaps w:val="false"/>
+          <w:sz w:val="20"/>
+          <w:szCs w:val="20"/>
+        </w:rPr>
+        <w:t xml:space="preserve"/>
+      </w:r>
+    </w:p>
+    <w:p>
+      <w:pPr>
+        <w:keepNext/>
+        <w:spacing w:after="30" w:before="80"/>
+        <w:jc w:val="center"/>
+      </w:pPr>
+      <w:r>
+        <w:drawing>
+          <wp:inline distT="0" distB="0" distL="0" distR="0">
+            <wp:extent cx="3124200" cy="1419225"/>
+            <wp:effectExtent t="0" r="0" b="0" l="0"/>
+            <wp:docPr id="7" name="" descr="" title=""/>
+            <wp:cNvGraphicFramePr>
+              <a:graphicFrameLocks xmlns:a="http://schemas.openxmlformats.org/drawingml/2006/main" noChangeAspect="1"/>
+            </wp:cNvGraphicFramePr>
+            <a:graphic xmlns:a="http://schemas.openxmlformats.org/drawingml/2006/main">
+              <a:graphicData uri="http://schemas.openxmlformats.org/drawingml/2006/picture">
+                <pic:pic xmlns:pic="http://schemas.openxmlformats.org/drawingml/2006/picture">
+                  <pic:nvPicPr>
+                    <pic:cNvPr id="0" name="" descr=""/>
+                    <pic:cNvPicPr>
+                      <a:picLocks noChangeAspect="1" noChangeArrowheads="1"/>
+                    </pic:cNvPicPr>
+                  </pic:nvPicPr>
+                  <pic:blipFill>
+                    <a:blip r:embed="rId13" cstate="none"/>
+                    <a:srcRect/>
+                    <a:stretch>
+                      <a:fillRect/>
+                    </a:stretch>
+                  </pic:blipFill>
+                  <pic:spPr bwMode="auto">
+                    <a:xfrm>
+                      <a:off x="0" y="0"/>
+                      <a:ext cx="3124200" cy="1419225"/>
+                    </a:xfrm>
+                    <a:prstGeom prst="rect">
+                      <a:avLst/>
+                    </a:prstGeom>
+                  </pic:spPr>
+                </pic:pic>
+              </a:graphicData>
+            </a:graphic>
+          </wp:inline>
+        </w:drawing>
+      </w:r>
+    </w:p>
+    <w:p>
+      <w:pPr>
+        <w:spacing w:after="100"/>
+        <w:jc w:val="both"/>
+      </w:pPr>
+      <w:r>
+        <w:rPr>
+          <w:rFonts w:ascii="Times New Roman" w:cs="Times New Roman" w:eastAsia="Times New Roman" w:hAnsi="Times New Roman"/>
+          <w:b w:val="false"/>
+          <w:bCs w:val="false"/>
+          <w:i w:val="false"/>
+          <w:iCs w:val="false"/>
+          <w:smallCaps w:val="false"/>
+          <w:sz w:val="16"/>
+          <w:szCs w:val="16"/>
+        </w:rPr>
+        <w:t xml:space="preserve">Fig. 7.  </w:t>
+      </w:r>
+      <w:r>
+        <w:rPr>
+          <w:rFonts w:ascii="Times New Roman" w:cs="Times New Roman" w:eastAsia="Times New Roman" w:hAnsi="Times New Roman"/>
+          <w:b w:val="false"/>
+          <w:bCs w:val="false"/>
+          <w:i w:val="false"/>
+          <w:iCs w:val="false"/>
+          <w:smallCaps w:val="false"/>
+          <w:sz w:val="16"/>
+          <w:szCs w:val="16"/>
+        </w:rPr>
+        <w:t xml:space="preserve">Cohen's kappa between pairs of AI judges. This is AI-vs-AI agreement, not validation against human scorers.</w:t>
+      </w:r>
+    </w:p>
+    <w:p>
+      <w:pPr>
+        <w:keepNext w:val="false"/>
+        <w:spacing w:after="40" w:before="0" w:line="240"/>
+        <w:ind w:firstLine="202"/>
+        <w:jc w:val="both"/>
+      </w:pPr>
+      <w:r>
+        <w:rPr>
+          <w:rFonts w:ascii="Times New Roman" w:cs="Times New Roman" w:eastAsia="Times New Roman" w:hAnsi="Times New Roman"/>
+          <w:b w:val="false"/>
+          <w:bCs w:val="false"/>
+          <w:i w:val="false"/>
+          <w:iCs w:val="false"/>
+          <w:smallCaps w:val="false"/>
+          <w:sz w:val="20"/>
+          <w:szCs w:val="20"/>
+        </w:rPr>
+        <w:t xml:space="preserve">Against the agent judge, the API judge agreed almost perfectly on defects (kappa 0.88, 99% agreement, n = 108) and on false alarms (kappa 1.00), and was fair on intent (kappa 0.40, 89% agreement, n = 108). The Gemini web app agreed with the agent judge on intent at kappa 0.62, and the three judges agreed on intent for 25 of 30 runs. Re-scoring the original study with the agent judge gave intent floor 86%, treatment 92% and ceiling 100%, and gap recovery 0.40 (interval -0.75 to 1.00, McNemar p = 0.63). The verdict holds: the effect is not significant. The size of gap recovery does not: under the API judge it was 0.17 (interval 0.00 to 0.50). These comparisons are AI-vs-AI agreement, not validation against human scorers.</w:t>
+      </w:r>
+    </w:p>
+    <w:p>
+      <w:pPr>
+        <w:keepNext w:val="false"/>
+        <w:spacing w:after="40" w:before="0" w:line="240"/>
+        <w:ind w:firstLine="202"/>
+        <w:jc w:val="both"/>
+      </w:pPr>
+      <w:r>
+        <w:rPr>
+          <w:rFonts w:ascii="Times New Roman" w:cs="Times New Roman" w:eastAsia="Times New Roman" w:hAnsi="Times New Roman"/>
+          <w:b w:val="false"/>
+          <w:bCs w:val="false"/>
+          <w:i w:val="false"/>
+          <w:iCs w:val="false"/>
+          <w:smallCaps w:val="false"/>
+          <w:sz w:val="20"/>
+          <w:szCs w:val="20"/>
+        </w:rPr>
+        <w:t xml:space="preserve">In the replication, the local judge, llama3.2:3b, is unusable: its agreement with the agent judge was fair on intent (kappa 0.20, 68%, n = 288), slight on defects (kappa 0.06) and slight on false alarms (kappa 0.00). It never flagged a false alarm (total 0) and wrote that no defect was injected on 54 of 96 mutant rows (56%). The Claude agent judge claude-sonnet-agent is therefore the primary judge for the replication. That choice was made after seeing the agreement figures, so it is a post hoc choice. The local judge's own intent result, gap recovery 0.17 (interval -0.31 to 0.52), is reference only, and its intent recovery across the three conditions was 58%, 63% and 83%. All of this is AI-vs-AI agreement, and the judges are not validated against human scorers.</w:t>
+      </w:r>
+    </w:p>
+    <w:p>
+      <w:pPr>
+        <w:keepNext/>
+        <w:spacing w:after="80" w:before="160"/>
+        <w:jc w:val="center"/>
+      </w:pPr>
+      <w:r>
+        <w:rPr>
+          <w:rFonts w:ascii="Times New Roman" w:cs="Times New Roman" w:eastAsia="Times New Roman" w:hAnsi="Times New Roman"/>
+          <w:b w:val="false"/>
+          <w:bCs w:val="false"/>
+          <w:i w:val="false"/>
+          <w:iCs w:val="false"/>
+          <w:smallCaps/>
+          <w:sz w:val="20"/>
+          <w:szCs w:val="20"/>
+        </w:rPr>
+        <w:t xml:space="preserve">VI. </w:t>
+      </w:r>
+      <w:r>
+        <w:rPr>
+          <w:rFonts w:ascii="Times New Roman" w:cs="Times New Roman" w:eastAsia="Times New Roman" w:hAnsi="Times New Roman"/>
+          <w:b w:val="false"/>
+          <w:bCs w:val="false"/>
+          <w:i w:val="false"/>
+          <w:iCs w:val="false"/>
+          <w:smallCaps/>
+          <w:sz w:val="20"/>
+          <w:szCs w:val="20"/>
+        </w:rPr>
+        <w:t xml:space="preserve">Discussion</w:t>
+      </w:r>
+    </w:p>
+    <w:p>
+      <w:pPr>
+        <w:keepNext w:val="false"/>
+        <w:spacing w:after="40" w:before="0" w:line="240"/>
+        <w:ind w:firstLine="202"/>
+        <w:jc w:val="both"/>
+      </w:pPr>
+      <w:r>
+        <w:rPr>
+          <w:rFonts w:ascii="Times New Roman" w:cs="Times New Roman" w:eastAsia="Times New Roman" w:hAnsi="Times New Roman"/>
+          <w:b w:val="false"/>
+          <w:bCs w:val="false"/>
+          <w:i w:val="false"/>
+          <w:iCs w:val="false"/>
+          <w:smallCaps w:val="false"/>
+          <w:sz w:val="20"/>
+          <w:szCs w:val="20"/>
+        </w:rPr>
+        <w:t xml:space="preserve">Asking is cheap to add and hard to target. Once a question reached an author who could answer it, the answer did what it was meant to do; nearly all of the loss happened earlier, in deciding when to ask. This shifts the research problem: the quality of a clarifying question matters less than the recall of the decision to pose one, at a precision that keeps the tool tolerable. A detector built from diff features was precise and conservative; a sampling-based detector separated the conditions but needs calibration on held-out data.</w:t>
+      </w:r>
+    </w:p>
+    <w:p>
+      <w:pPr>
+        <w:keepNext w:val="false"/>
+        <w:spacing w:after="40" w:before="0" w:line="240"/>
+        <w:ind w:firstLine="202"/>
+        <w:jc w:val="both"/>
+      </w:pPr>
+      <w:r>
+        <w:rPr>
+          <w:rFonts w:ascii="Times New Roman" w:cs="Times New Roman" w:eastAsia="Times New Roman" w:hAnsi="Times New Roman"/>
+          <w:b w:val="false"/>
+          <w:bCs w:val="false"/>
+          <w:i w:val="false"/>
+          <w:iCs w:val="false"/>
+          <w:smallCaps w:val="false"/>
+          <w:sz w:val="20"/>
+          <w:szCs w:val="20"/>
+        </w:rPr>
+        <w:t xml:space="preserve">Golden patches are a poor population for studying ambiguity. Well-written fixes state their purpose in the code, comments and docstrings they add; evaluating intent-dependent review requires withholding all of it, and even then most changes remain self-explanatory. Benchmarks of genuinely under-specified changes would strengthen this line of work.</w:t>
+      </w:r>
+    </w:p>
+    <w:p>
+      <w:pPr>
+        <w:keepNext w:val="false"/>
+        <w:spacing w:after="40" w:before="0" w:line="240"/>
+        <w:ind w:firstLine="202"/>
+        <w:jc w:val="both"/>
+      </w:pPr>
+      <w:r>
+        <w:rPr>
+          <w:rFonts w:ascii="Times New Roman" w:cs="Times New Roman" w:eastAsia="Times New Roman" w:hAnsi="Times New Roman"/>
+          <w:b w:val="false"/>
+          <w:bCs w:val="false"/>
+          <w:i w:val="false"/>
+          <w:iCs w:val="false"/>
+          <w:smallCaps w:val="false"/>
+          <w:sz w:val="20"/>
+          <w:szCs w:val="20"/>
+        </w:rPr>
+        <w:t xml:space="preserve">Finally, clarification cannot exceed the reviewer. On a small free-tier model, full context did not make the reviewer catch injected defects, so detection gains, if they exist, require a stronger reviewer before intent can matter.</w:t>
+      </w:r>
+    </w:p>
+    <w:p>
+      <w:pPr>
+        <w:keepNext w:val="false"/>
+        <w:spacing w:after="40" w:before="0" w:line="240"/>
+        <w:ind w:firstLine="202"/>
+        <w:jc w:val="both"/>
+      </w:pPr>
+      <w:r>
+        <w:rPr>
+          <w:rFonts w:ascii="Times New Roman" w:cs="Times New Roman" w:eastAsia="Times New Roman" w:hAnsi="Times New Roman"/>
+          <w:b w:val="false"/>
+          <w:bCs w:val="false"/>
+          <w:i w:val="false"/>
+          <w:iCs w:val="false"/>
+          <w:smallCaps w:val="false"/>
+          <w:sz w:val="20"/>
+          <w:szCs w:val="20"/>
+        </w:rPr>
+        <w:t xml:space="preserve">Two reviewers and two judge configurations give the same qualitative picture: recall is the binding limit, defect detection is limited by the reviewer, and no gap-recovery interval excludes zero. The size of the effect depends on which judge scores the reviews. In the original study, gap recovery was 0.17 under the API judge (interval 0.00 to 0.50) and 0.40 under the agent judge (interval -0.75 to 1.00). In the replication, under the agent judge, it was 0.09 (interval -0.22 to 0.33) on 96 instances. The sign of the effect is therefore not established under any of these judges, and magnitudes should be read together with the judge that produced them.</w:t>
+      </w:r>
+    </w:p>
+    <w:p>
+      <w:pPr>
+        <w:keepNext/>
+        <w:spacing w:after="80" w:before="160"/>
+        <w:jc w:val="center"/>
+      </w:pPr>
+      <w:r>
+        <w:rPr>
+          <w:rFonts w:ascii="Times New Roman" w:cs="Times New Roman" w:eastAsia="Times New Roman" w:hAnsi="Times New Roman"/>
+          <w:b w:val="false"/>
+          <w:bCs w:val="false"/>
+          <w:i w:val="false"/>
+          <w:iCs w:val="false"/>
+          <w:smallCaps/>
+          <w:sz w:val="20"/>
+          <w:szCs w:val="20"/>
+        </w:rPr>
+        <w:t xml:space="preserve">VII. </w:t>
+      </w:r>
+      <w:r>
+        <w:rPr>
+          <w:rFonts w:ascii="Times New Roman" w:cs="Times New Roman" w:eastAsia="Times New Roman" w:hAnsi="Times New Roman"/>
+          <w:b w:val="false"/>
+          <w:bCs w:val="false"/>
+          <w:i w:val="false"/>
+          <w:iCs w:val="false"/>
+          <w:smallCaps/>
+          <w:sz w:val="20"/>
+          <w:szCs w:val="20"/>
+        </w:rPr>
+        <w:t xml:space="preserve">Threats to Validity</w:t>
+      </w:r>
+    </w:p>
+    <w:p>
+      <w:pPr>
+        <w:keepNext w:val="false"/>
+        <w:spacing w:after="40" w:before="0" w:line="240"/>
+        <w:ind w:firstLine="202"/>
+        <w:jc w:val="both"/>
+      </w:pPr>
+      <w:r>
+        <w:rPr>
+          <w:rFonts w:ascii="Times New Roman" w:cs="Times New Roman" w:eastAsia="Times New Roman" w:hAnsi="Times New Roman"/>
+          <w:b w:val="false"/>
+          <w:bCs w:val="false"/>
+          <w:i w:val="false"/>
+          <w:iCs w:val="false"/>
+          <w:smallCaps w:val="false"/>
+          <w:sz w:val="20"/>
+          <w:szCs w:val="20"/>
+        </w:rPr>
+        <w:t xml:space="preserve">The sample is small (36 instances under per-model daily quotas), so intervals are wide. The judge is not validated against human scoring; it is cross-checked against two other AI judges (Section V-G), and a stratified sample and agreement tooling (Cohen's κ [15]) are provided for human scoring. The simulated author answers from withheld text only, but leakage requires the hand audit the tooling prepares. We report a protocol deviation: in the first v2 run the simulated author's token budget was exhausted by its model's hidden reasoning, returning empty answers, and its prompt refused questions phrased in terms of unseen code. Both were corrected and the treatment re-run for the six affected instances; floor and ceiling were not re-run, and the prompt revision, made after observing refusals, is logged with every exchange. All verified mutants come from sympy and the operators produce simple defects. The reviewer is a small model; results may differ for stronger ones.</w:t>
+      </w:r>
+    </w:p>
+    <w:p>
+      <w:pPr>
+        <w:keepNext w:val="false"/>
+        <w:spacing w:after="40" w:before="0" w:line="240"/>
+        <w:ind w:firstLine="202"/>
+        <w:jc w:val="both"/>
+      </w:pPr>
+      <w:r>
+        <w:rPr>
+          <w:rFonts w:ascii="Times New Roman" w:cs="Times New Roman" w:eastAsia="Times New Roman" w:hAnsi="Times New Roman"/>
+          <w:b w:val="false"/>
+          <w:bCs w:val="false"/>
+          <w:i w:val="false"/>
+          <w:iCs w:val="false"/>
+          <w:smallCaps w:val="false"/>
+          <w:sz w:val="20"/>
+          <w:szCs w:val="20"/>
+        </w:rPr>
+        <w:t xml:space="preserve">The replication adds further limits. Both studies have small samples: the original study has 36 instances and the replication 96, so intervals are wide. The replication's agent judge was chosen after seeing its agreement with the local judge, which makes the choice post hoc. The question and oracle model, llama3.2:3b, is small, and its identity is recorded in the oracle log but not per database row. The 60 rows added for the replication have no run by the original Gemini reviewer, so the two studies differ in reviewer, judge and rows, and they are never pooled. The bot has not been run against live GitHub, and the 356 collected real pull requests are not yet labelled.</w:t>
+      </w:r>
+    </w:p>
+    <w:p>
+      <w:pPr>
+        <w:keepNext/>
+        <w:spacing w:after="80" w:before="160"/>
+        <w:jc w:val="center"/>
+      </w:pPr>
+      <w:r>
+        <w:rPr>
+          <w:rFonts w:ascii="Times New Roman" w:cs="Times New Roman" w:eastAsia="Times New Roman" w:hAnsi="Times New Roman"/>
+          <w:b w:val="false"/>
+          <w:bCs w:val="false"/>
+          <w:i w:val="false"/>
+          <w:iCs w:val="false"/>
+          <w:smallCaps/>
+          <w:sz w:val="20"/>
+          <w:szCs w:val="20"/>
+        </w:rPr>
+        <w:t xml:space="preserve">VIII. </w:t>
+      </w:r>
+      <w:r>
+        <w:rPr>
+          <w:rFonts w:ascii="Times New Roman" w:cs="Times New Roman" w:eastAsia="Times New Roman" w:hAnsi="Times New Roman"/>
+          <w:b w:val="false"/>
+          <w:bCs w:val="false"/>
+          <w:i w:val="false"/>
+          <w:iCs w:val="false"/>
+          <w:smallCaps/>
+          <w:sz w:val="20"/>
+          <w:szCs w:val="20"/>
+        </w:rPr>
+        <w:t xml:space="preserve">Conclusion</w:t>
+      </w:r>
+    </w:p>
+    <w:p>
+      <w:pPr>
+        <w:keepNext w:val="false"/>
+        <w:spacing w:after="40" w:before="0" w:line="240"/>
+        <w:ind w:firstLine="202"/>
+        <w:jc w:val="both"/>
+      </w:pPr>
+      <w:r>
+        <w:rPr>
+          <w:rFonts w:ascii="Times New Roman" w:cs="Times New Roman" w:eastAsia="Times New Roman" w:hAnsi="Times New Roman"/>
+          <w:b w:val="false"/>
+          <w:bCs w:val="false"/>
+          <w:i w:val="false"/>
+          <w:iCs w:val="false"/>
+          <w:smallCaps w:val="false"/>
+          <w:sz w:val="20"/>
+          <w:szCs w:val="20"/>
+        </w:rPr>
+        <w:t xml:space="preserve">ClarifyReview inserts a decision before critique: ask the author when the intent of a change cannot be read from the change. Evaluating the idea required withholding all natural-language intent, because golden patches document their own. With that manipulation, clarification recovered 0.17 of the intent gap on 36 instances—in the expected direction, not significant at this size—and a per-instance trace shows it succeeded where it was given the chance, with detector recall as the limit. A second reviewer, a small local model, and a second judge reproduce the null result: gap recovery was 0.09 (interval -0.22 to 0.33, McNemar p = 0.66), not significant, and its upper limit rules out recovering more than about a third of the gap. The effect size depends on the judge. Future work is labelling the 300-PR set and training and freezing the detectors on it, labelling the 356 real pull requests already collected (none is labelled yet), human validation of the judge, beyond the AI-vs-AI calibration reported here, a paired developer study of usefulness and trust, deploying the bot against live GitHub, a Gemini-reviewer run of the 60 rows only the v3 set contains, and a larger run with a stronger reviewer.</w:t>
       </w:r>
     </w:p>
     <w:p>

</xml_diff>

<commit_message>
Gemini v3 run judged; report it as reviewer variance
All 96 v3 rows on the original reviewer: 94 complete triples, 286 judged.
Intent 65% -> 72% (G 0.23, CI 0.03-0.41, p 0.07), but 10 of the 11
discordant pairs had no question asked, so the gap is run-to-run noise.
collect.py records the discordant breakdown; paper V-H, report 7.10 and
the deck conclusion say so. Stale not-done lists updated.

Co-Authored-By: Claude Opus 5.5 <noreply@anthropic.com>
</commit_message>
<xml_diff>
--- a/paper/ClarifyReview_Paper_Draft.docx
+++ b/paper/ClarifyReview_Paper_Draft.docx
@@ -108,7 +108,7 @@
           <w:sz w:val="18"/>
           <w:szCs w:val="18"/>
         </w:rPr>
-        <w:t xml:space="preserve">—LLM-based pull request reviewers read a change once, infer what its author intended, and comment on that inference; when the intent is ambiguous they guess. We present ClarifyReview, a reviewer that decides before critiquing whether the available context is sufficient, and asks the author a targeted question when it is not. Its single-pass baseline is the same pipeline with a detector that never asks, so the two differ in one stage. We evaluate it in a two-by-three ablation on SWE-bench Verified, crossing correct and execution-verified defective patches (32 mutants) with three conditions: intent withheld, intent withheld with clarification, and full context. A pilot showed that withholding only the linked issue leaves intent recoverable from the patch itself; withholding every natural-language statement of intent opened a gap. On 36 instances, intent recovery was 81% without clarification, 83% with it and 97% with full context (gap recovery 0.17, McNemar p = 1.00). Tracing each instance shows that clarification recovered intent where it was given the chance, and that the binding limit is detector recall: the detector flagged 2 of the 7 changes the reviewer misread. Defect detection was low in every condition, including full context, so it is limited by the reviewer rather than by missing intent. We release the system, harness, verified mutants and study log.</w:t>
+        <w:t xml:space="preserve">—LLM-based pull request reviewers read a change once, infer what its author intended, and comment on that inference; when the intent is ambiguous they guess. We present ClarifyReview, a reviewer that decides before critiquing whether the available context is sufficient, and asks the author a targeted question when it is not. Its single-pass baseline is the same pipeline with a detector that never asks, so the two differ in one stage. We evaluate it in a two-by-three ablation on SWE-bench Verified, crossing correct and execution-verified defective patches (32 mutants) with three conditions: intent withheld, intent withheld with clarification, and full context. A pilot showed that withholding only the linked issue leaves intent recoverable from the patch itself; withholding every natural-language statement of intent opened a gap. On 36 instances, intent recovery was 81% without clarification, 83% with it and 97% with full context (gap recovery 0.17, McNemar p = 1.00). Tracing each instance shows that clarification recovered intent where it was given the chance, and that the binding limit is detector recall: the detector flagged 2 of the 7 changes the reviewer misread. Defect detection was low in every condition, including full context, so it is limited by the reviewer rather than by missing intent. A replication with a local model (qwen3:4b-instruct-2507-q4_K_M) on 96 instances finds intent recovery of 67% without clarification, 70% with it and 100% with full context. Gap recovery was 0.09 (interval -0.22 to 0.33), not significant, and the upper limit rules out recovering more than a third of the gap. Re-scoring with the agent judge preserved this verdict but not the effect size. Running the replication set on the original reviewer raised intent recovery from 65% to 72%, but 10 of the 11 changed outcomes came from instances where no question was asked, so the difference is reviewer variation, not clarification. We release the system, harness, verified mutants and study log.</w:t>
       </w:r>
     </w:p>
     <w:p>
@@ -243,7 +243,7 @@
           <w:sz w:val="20"/>
           <w:szCs w:val="20"/>
         </w:rPr>
-        <w:t xml:space="preserve">Clarification-seeking improves code generation [4], [5], but we are not aware of work applying it to review of an existing change, where a wrong guess costs a human reviewer's attention rather than a compiler cycle. We ask whether a reviewer that asks before critiquing understands and detects more than one that does not. This paper makes four contributions:</w:t>
+        <w:t xml:space="preserve">Clarification-seeking improves code generation [4], [5], but we are not aware of work applying it to review of an existing change, where a wrong guess costs a human reviewer's attention rather than a compiler cycle. We ask whether a reviewer that asks before critiquing understands and detects more than one that does not. This paper makes five contributions:</w:t>
       </w:r>
     </w:p>
     <w:p>
@@ -303,7 +303,27 @@
           <w:sz w:val="20"/>
           <w:szCs w:val="20"/>
         </w:rPr>
-        <w:t xml:space="preserve">3) a two-by-three ablation with a per-instance trace that separates the value of an answer from the chance to ask, locating the limit of the approach in detector recall; and</w:t>
+        <w:t xml:space="preserve">3) a two-by-three ablation with a per-instance trace that separates the value of an answer from the chance to ask, locating the limit of the approach in detector recall;</w:t>
+      </w:r>
+    </w:p>
+    <w:p>
+      <w:pPr>
+        <w:keepNext w:val="false"/>
+        <w:spacing w:after="40" w:before="0" w:line="240"/>
+        <w:jc w:val="both"/>
+      </w:pPr>
+      <w:r>
+        <w:rPr>
+          <w:rFonts w:ascii="Times New Roman" w:cs="Times New Roman" w:eastAsia="Times New Roman" w:hAnsi="Times New Roman"/>
+          <w:b w:val="false"/>
+          <w:bCs w:val="false"/>
+          <w:i w:val="false"/>
+          <w:iCs w:val="false"/>
+          <w:smallCaps w:val="false"/>
+          <w:sz w:val="20"/>
+          <w:szCs w:val="20"/>
+        </w:rPr>
+        <w:t xml:space="preserve">4) an account of a pilot whose principal result was a correction to the evaluation design, and of a protocol deviation, both reported in full; and</w:t>
       </w:r>
     </w:p>
     <w:p>
@@ -323,7 +343,7 @@
           <w:sz w:val="20"/>
           <w:szCs w:val="20"/>
         </w:rPr>
-        <w:t xml:space="preserve">4) an account of a pilot whose principal result was a correction to the evaluation design, and of a protocol deviation, both reported in full.</w:t>
+        <w:t xml:space="preserve">5) a judge-calibration analysis of AI-vs-AI agreement across three AI judges, and a replication on a local reviewer that is reported separately from the original study.</w:t>
       </w:r>
     </w:p>
     <w:p>
@@ -570,7 +590,7 @@
           <w:sz w:val="20"/>
           <w:szCs w:val="20"/>
         </w:rPr>
-        <w:t xml:space="preserve">ClarifyReview has four stages (Fig. 1). Stage 1 parses the diff and resolves changed lines to changed symbols with the Python abstract syntax tree, assembling a bounded context in a deterministic order and fingerprinting it. Stage 2 decides whether to ask. Stage 3 generates at most two questions—each required by its output schema to name a file, line or symbol, so that it cannot degenerate into "please explain this PR"—and sends them through a Responder. Stage 4 produces structured findings with severity, category, evidence, suggested fix and confidence.</w:t>
+        <w:t xml:space="preserve">ClarifyReview has four stages (Fig. 1). Stage 1 parses the diff and resolves changed lines to changed symbols using the Python AST for Python and tree-sitter grammars for JavaScript, TypeScript/TSX, Java, C, C++ and Rust, with Python behaviour byte-identical to before, assembling a bounded context in a deterministic order and fingerprinting it. Stage 2 decides whether to ask. Stage 3 generates at most two questions—each required by its output schema to name a file, line or symbol, so that it cannot degenerate into "please explain this PR"—and sends them through a Responder. Stage 4 produces structured findings with severity, category, evidence, suggested fix and confidence.</w:t>
       </w:r>
     </w:p>
     <w:p>
@@ -729,7 +749,7 @@
           <w:sz w:val="20"/>
           <w:szCs w:val="20"/>
         </w:rPr>
-        <w:t xml:space="preserve">The single-pass baseline is not separate code: it is the same pipeline with a detector that never asks, and a test asserts that, with the detector forced to proceed, both conditions render byte-identical prompts. Stage 3 talks to the author through a Responder protocol with three implementations—a GitHub responder that posts a comment and waits, a benchmark responder that calls a simulated author, and a null responder—so the experiment exercises the code that would be deployed. The system is written in Python, runs as a GitHub App or from a command line, records every run to an SQLite log, and is covered by 139 automated tests.</w:t>
+        <w:t xml:space="preserve">The single-pass baseline is not separate code: it is the same pipeline with a detector that never asks, and a test asserts that, with the detector forced to proceed, both conditions render byte-identical prompts. Stage 3 talks to the author through a Responder protocol with three implementations—a GitHub responder that posts a comment and waits, a benchmark responder that calls a simulated author, and a null responder—so the experiment exercises the code that would be deployed. The system is written in Python, runs as a GitHub App or from a command line, records every run to an SQLite log, and is covered by 446 automated tests. Three provider backends sit behind one interface: Gemini, Anthropic and local Ollama. The Ollama backend runs a model on the user's own machine, with no key, no traffic beyond that machine and no monetary cost. Parked runs persist in SQLite across restarts, a timeout sweep publishes reviews that go unanswered, rate limits are handled, and signed webhooks are verified. The bot has been exercised end to end on a local server, but it has not yet been run against live GitHub.</w:t>
       </w:r>
     </w:p>
     <w:p>
@@ -1068,6 +1088,46 @@
     <w:p>
       <w:pPr>
         <w:keepNext/>
+        <w:spacing w:after="40" w:before="80"/>
+      </w:pPr>
+      <w:r>
+        <w:rPr>
+          <w:rFonts w:ascii="Times New Roman" w:cs="Times New Roman" w:eastAsia="Times New Roman" w:hAnsi="Times New Roman"/>
+          <w:b w:val="false"/>
+          <w:bCs w:val="false"/>
+          <w:i/>
+          <w:iCs/>
+          <w:smallCaps w:val="false"/>
+          <w:sz w:val="20"/>
+          <w:szCs w:val="20"/>
+        </w:rPr>
+        <w:t xml:space="preserve">F. Second-model replication (v3)</w:t>
+      </w:r>
+    </w:p>
+    <w:p>
+      <w:pPr>
+        <w:keepNext w:val="false"/>
+        <w:spacing w:after="40" w:before="0" w:line="240"/>
+        <w:ind w:firstLine="202"/>
+        <w:jc w:val="both"/>
+      </w:pPr>
+      <w:r>
+        <w:rPr>
+          <w:rFonts w:ascii="Times New Roman" w:cs="Times New Roman" w:eastAsia="Times New Roman" w:hAnsi="Times New Roman"/>
+          <w:b w:val="false"/>
+          <w:bCs w:val="false"/>
+          <w:i w:val="false"/>
+          <w:iCs w:val="false"/>
+          <w:smallCaps w:val="false"/>
+          <w:sz w:val="20"/>
+          <w:szCs w:val="20"/>
+        </w:rPr>
+        <w:t xml:space="preserve">The replication uses 96 rows: the 36 rows of the original set plus 60 new rows. The set includes all 32 verified mutants, scored in both arms, and 32 golden-only rows from 7 other repositories. The reviewer was qwen3:4b-instruct-2507-q4_K_M, served through Ollama, with the heuristic detector at τ = 0.50. The 288 runs had 0 failures and took 52 minutes on a laptop GPU. The question and oracle model was n/a, whose identity is recorded in the oracle log but not per database row. Conditions were the same as in the original study. The replication is never pooled with the original study, and the judge is chosen in Section V-G rather than here.</w:t>
+      </w:r>
+    </w:p>
+    <w:p>
+      <w:pPr>
+        <w:keepNext/>
         <w:spacing w:after="80" w:before="160"/>
         <w:jc w:val="center"/>
       </w:pPr>
@@ -3647,34 +3707,20 @@
     <w:p>
       <w:pPr>
         <w:keepNext/>
-        <w:spacing w:after="80" w:before="160"/>
-        <w:jc w:val="center"/>
-      </w:pPr>
-      <w:r>
-        <w:rPr>
-          <w:rFonts w:ascii="Times New Roman" w:cs="Times New Roman" w:eastAsia="Times New Roman" w:hAnsi="Times New Roman"/>
-          <w:b w:val="false"/>
-          <w:bCs w:val="false"/>
-          <w:i w:val="false"/>
-          <w:iCs w:val="false"/>
-          <w:smallCaps/>
-          <w:sz w:val="20"/>
-          <w:szCs w:val="20"/>
-        </w:rPr>
-        <w:t xml:space="preserve">VI. </w:t>
-      </w:r>
-      <w:r>
-        <w:rPr>
-          <w:rFonts w:ascii="Times New Roman" w:cs="Times New Roman" w:eastAsia="Times New Roman" w:hAnsi="Times New Roman"/>
-          <w:b w:val="false"/>
-          <w:bCs w:val="false"/>
-          <w:i w:val="false"/>
-          <w:iCs w:val="false"/>
-          <w:smallCaps/>
-          <w:sz w:val="20"/>
-          <w:szCs w:val="20"/>
-        </w:rPr>
-        <w:t xml:space="preserve">Discussion</w:t>
+        <w:spacing w:after="40" w:before="80"/>
+      </w:pPr>
+      <w:r>
+        <w:rPr>
+          <w:rFonts w:ascii="Times New Roman" w:cs="Times New Roman" w:eastAsia="Times New Roman" w:hAnsi="Times New Roman"/>
+          <w:b w:val="false"/>
+          <w:bCs w:val="false"/>
+          <w:i/>
+          <w:iCs/>
+          <w:smallCaps w:val="false"/>
+          <w:sz w:val="20"/>
+          <w:szCs w:val="20"/>
+        </w:rPr>
+        <w:t xml:space="preserve">F. Replication on a local reviewer</w:t>
       </w:r>
     </w:p>
     <w:p>
@@ -3695,7 +3741,1226 @@
           <w:sz w:val="20"/>
           <w:szCs w:val="20"/>
         </w:rPr>
-        <w:t xml:space="preserve">Asking is cheap to add and hard to target. Once a question reached an author who could answer it, the answer did what it was meant to do; nearly all of the loss happened earlier, in deciding when to ask. This shifts the research problem: the quality of a clarifying question matters less than the recall of the decision to pose one, at a precision that keeps the tool tolerable. A detector built from diff features was precise and conservative; a sampling-based detector separated the conditions but needs calibration on held-out data.</w:t>
+        <w:t xml:space="preserve">Table III reports the same measures as Table I for the local reviewer qwen3:4b-instruct-2507-q4_K_M, served through Ollama, with outcomes scored by the Claude agent judge claude-sonnet-agent. That judge was chosen after seeing its agreement with the local judge, as explained in Section V-G. The replication is reported separately from the original study and is never pooled with it.</w:t>
+      </w:r>
+    </w:p>
+    <w:p>
+      <w:pPr>
+        <w:keepNext/>
+        <w:spacing w:after="0" w:before="100"/>
+        <w:jc w:val="center"/>
+      </w:pPr>
+      <w:r>
+        <w:rPr>
+          <w:rFonts w:ascii="Times New Roman" w:cs="Times New Roman" w:eastAsia="Times New Roman" w:hAnsi="Times New Roman"/>
+          <w:b w:val="false"/>
+          <w:bCs w:val="false"/>
+          <w:i w:val="false"/>
+          <w:iCs w:val="false"/>
+          <w:smallCaps w:val="false"/>
+          <w:sz w:val="16"/>
+          <w:szCs w:val="16"/>
+        </w:rPr>
+        <w:t xml:space="preserve">TABLE III</w:t>
+      </w:r>
+    </w:p>
+    <w:p>
+      <w:pPr>
+        <w:keepNext/>
+        <w:spacing w:after="40"/>
+        <w:jc w:val="center"/>
+      </w:pPr>
+      <w:r>
+        <w:rPr>
+          <w:rFonts w:ascii="Times New Roman" w:cs="Times New Roman" w:eastAsia="Times New Roman" w:hAnsi="Times New Roman"/>
+          <w:b w:val="false"/>
+          <w:bCs w:val="false"/>
+          <w:i w:val="false"/>
+          <w:iCs w:val="false"/>
+          <w:smallCaps/>
+          <w:sz w:val="16"/>
+          <w:szCs w:val="16"/>
+        </w:rPr>
+        <w:t xml:space="preserve">Judged outcomes, local replication (v3)</w:t>
+      </w:r>
+    </w:p>
+    <w:tbl>
+      <w:tblPr>
+        <w:tblW w:type="dxa" w:w="4340"/>
+        <w:tblBorders>
+          <w:top w:val="single" w:color="auto" w:sz="4"/>
+          <w:left w:val="single" w:color="auto" w:sz="4"/>
+          <w:bottom w:val="single" w:color="auto" w:sz="4"/>
+          <w:right w:val="single" w:color="auto" w:sz="4"/>
+          <w:insideH w:val="single" w:color="auto" w:sz="4"/>
+          <w:insideV w:val="single" w:color="auto" w:sz="4"/>
+        </w:tblBorders>
+      </w:tblPr>
+      <w:tblGrid>
+        <w:gridCol w:w="1500"/>
+        <w:gridCol w:w="760"/>
+        <w:gridCol w:w="760"/>
+        <w:gridCol w:w="760"/>
+        <w:gridCol w:w="560"/>
+      </w:tblGrid>
+      <w:tr>
+        <w:tc>
+          <w:tcPr>
+            <w:tcW w:type="dxa" w:w="1500"/>
+            <w:tcBorders>
+              <w:top w:val="single" w:color="000000" w:sz="4"/>
+              <w:left w:val="none" w:color="FFFFFF" w:sz="0"/>
+              <w:bottom w:val="single" w:color="000000" w:sz="4"/>
+              <w:right w:val="none" w:color="FFFFFF" w:sz="0"/>
+            </w:tcBorders>
+            <w:tcMar>
+              <w:top w:type="dxa" w:w="25"/>
+              <w:left w:type="dxa" w:w="40"/>
+              <w:bottom w:type="dxa" w:w="25"/>
+              <w:right w:type="dxa" w:w="40"/>
+            </w:tcMar>
+          </w:tcPr>
+          <w:p>
+            <w:pPr>
+              <w:jc w:val="left"/>
+            </w:pPr>
+            <w:r>
+              <w:rPr>
+                <w:rFonts w:ascii="Times New Roman" w:cs="Times New Roman" w:eastAsia="Times New Roman" w:hAnsi="Times New Roman"/>
+                <w:b/>
+                <w:bCs/>
+                <w:i w:val="false"/>
+                <w:iCs w:val="false"/>
+                <w:smallCaps w:val="false"/>
+                <w:sz w:val="16"/>
+                <w:szCs w:val="16"/>
+              </w:rPr>
+              <w:t xml:space="preserve">Measure</w:t>
+            </w:r>
+          </w:p>
+        </w:tc>
+        <w:tc>
+          <w:tcPr>
+            <w:tcW w:type="dxa" w:w="760"/>
+            <w:tcBorders>
+              <w:top w:val="single" w:color="000000" w:sz="4"/>
+              <w:left w:val="none" w:color="FFFFFF" w:sz="0"/>
+              <w:bottom w:val="single" w:color="000000" w:sz="4"/>
+              <w:right w:val="none" w:color="FFFFFF" w:sz="0"/>
+            </w:tcBorders>
+            <w:tcMar>
+              <w:top w:type="dxa" w:w="25"/>
+              <w:left w:type="dxa" w:w="40"/>
+              <w:bottom w:type="dxa" w:w="25"/>
+              <w:right w:type="dxa" w:w="40"/>
+            </w:tcMar>
+          </w:tcPr>
+          <w:p>
+            <w:pPr>
+              <w:jc w:val="center"/>
+            </w:pPr>
+            <w:r>
+              <w:rPr>
+                <w:rFonts w:ascii="Times New Roman" w:cs="Times New Roman" w:eastAsia="Times New Roman" w:hAnsi="Times New Roman"/>
+                <w:b/>
+                <w:bCs/>
+                <w:i w:val="false"/>
+                <w:iCs w:val="false"/>
+                <w:smallCaps w:val="false"/>
+                <w:sz w:val="16"/>
+                <w:szCs w:val="16"/>
+              </w:rPr>
+              <w:t xml:space="preserve">Floor</w:t>
+            </w:r>
+          </w:p>
+        </w:tc>
+        <w:tc>
+          <w:tcPr>
+            <w:tcW w:type="dxa" w:w="760"/>
+            <w:tcBorders>
+              <w:top w:val="single" w:color="000000" w:sz="4"/>
+              <w:left w:val="none" w:color="FFFFFF" w:sz="0"/>
+              <w:bottom w:val="single" w:color="000000" w:sz="4"/>
+              <w:right w:val="none" w:color="FFFFFF" w:sz="0"/>
+            </w:tcBorders>
+            <w:tcMar>
+              <w:top w:type="dxa" w:w="25"/>
+              <w:left w:type="dxa" w:w="40"/>
+              <w:bottom w:type="dxa" w:w="25"/>
+              <w:right w:type="dxa" w:w="40"/>
+            </w:tcMar>
+          </w:tcPr>
+          <w:p>
+            <w:pPr>
+              <w:jc w:val="center"/>
+            </w:pPr>
+            <w:r>
+              <w:rPr>
+                <w:rFonts w:ascii="Times New Roman" w:cs="Times New Roman" w:eastAsia="Times New Roman" w:hAnsi="Times New Roman"/>
+                <w:b/>
+                <w:bCs/>
+                <w:i w:val="false"/>
+                <w:iCs w:val="false"/>
+                <w:smallCaps w:val="false"/>
+                <w:sz w:val="16"/>
+                <w:szCs w:val="16"/>
+              </w:rPr>
+              <w:t xml:space="preserve">Treat.</w:t>
+            </w:r>
+          </w:p>
+        </w:tc>
+        <w:tc>
+          <w:tcPr>
+            <w:tcW w:type="dxa" w:w="760"/>
+            <w:tcBorders>
+              <w:top w:val="single" w:color="000000" w:sz="4"/>
+              <w:left w:val="none" w:color="FFFFFF" w:sz="0"/>
+              <w:bottom w:val="single" w:color="000000" w:sz="4"/>
+              <w:right w:val="none" w:color="FFFFFF" w:sz="0"/>
+            </w:tcBorders>
+            <w:tcMar>
+              <w:top w:type="dxa" w:w="25"/>
+              <w:left w:type="dxa" w:w="40"/>
+              <w:bottom w:type="dxa" w:w="25"/>
+              <w:right w:type="dxa" w:w="40"/>
+            </w:tcMar>
+          </w:tcPr>
+          <w:p>
+            <w:pPr>
+              <w:jc w:val="center"/>
+            </w:pPr>
+            <w:r>
+              <w:rPr>
+                <w:rFonts w:ascii="Times New Roman" w:cs="Times New Roman" w:eastAsia="Times New Roman" w:hAnsi="Times New Roman"/>
+                <w:b/>
+                <w:bCs/>
+                <w:i w:val="false"/>
+                <w:iCs w:val="false"/>
+                <w:smallCaps w:val="false"/>
+                <w:sz w:val="16"/>
+                <w:szCs w:val="16"/>
+              </w:rPr>
+              <w:t xml:space="preserve">Ceiling</w:t>
+            </w:r>
+          </w:p>
+        </w:tc>
+        <w:tc>
+          <w:tcPr>
+            <w:tcW w:type="dxa" w:w="560"/>
+            <w:tcBorders>
+              <w:top w:val="single" w:color="000000" w:sz="4"/>
+              <w:left w:val="none" w:color="FFFFFF" w:sz="0"/>
+              <w:bottom w:val="single" w:color="000000" w:sz="4"/>
+              <w:right w:val="none" w:color="FFFFFF" w:sz="0"/>
+            </w:tcBorders>
+            <w:tcMar>
+              <w:top w:type="dxa" w:w="25"/>
+              <w:left w:type="dxa" w:w="40"/>
+              <w:bottom w:type="dxa" w:w="25"/>
+              <w:right w:type="dxa" w:w="40"/>
+            </w:tcMar>
+          </w:tcPr>
+          <w:p>
+            <w:pPr>
+              <w:jc w:val="center"/>
+            </w:pPr>
+            <w:r>
+              <w:rPr>
+                <w:rFonts w:ascii="Times New Roman" w:cs="Times New Roman" w:eastAsia="Times New Roman" w:hAnsi="Times New Roman"/>
+                <w:b/>
+                <w:bCs/>
+                <w:i w:val="false"/>
+                <w:iCs w:val="false"/>
+                <w:smallCaps w:val="false"/>
+                <w:sz w:val="16"/>
+                <w:szCs w:val="16"/>
+              </w:rPr>
+              <w:t xml:space="preserve">p</w:t>
+            </w:r>
+          </w:p>
+        </w:tc>
+      </w:tr>
+      <w:tr>
+        <w:tc>
+          <w:tcPr>
+            <w:tcW w:type="dxa" w:w="1500"/>
+            <w:tcBorders>
+              <w:top w:val="none" w:color="FFFFFF" w:sz="0"/>
+              <w:left w:val="none" w:color="FFFFFF" w:sz="0"/>
+              <w:bottom w:val="none" w:color="FFFFFF" w:sz="0"/>
+              <w:right w:val="none" w:color="FFFFFF" w:sz="0"/>
+            </w:tcBorders>
+            <w:tcMar>
+              <w:top w:type="dxa" w:w="25"/>
+              <w:left w:type="dxa" w:w="40"/>
+              <w:bottom w:type="dxa" w:w="25"/>
+              <w:right w:type="dxa" w:w="40"/>
+            </w:tcMar>
+          </w:tcPr>
+          <w:p>
+            <w:pPr>
+              <w:jc w:val="left"/>
+            </w:pPr>
+            <w:r>
+              <w:rPr>
+                <w:rFonts w:ascii="Times New Roman" w:cs="Times New Roman" w:eastAsia="Times New Roman" w:hAnsi="Times New Roman"/>
+                <w:b w:val="false"/>
+                <w:bCs w:val="false"/>
+                <w:i w:val="false"/>
+                <w:iCs w:val="false"/>
+                <w:smallCaps w:val="false"/>
+                <w:sz w:val="16"/>
+                <w:szCs w:val="16"/>
+              </w:rPr>
+              <w:t xml:space="preserve">Intent, all</w:t>
+            </w:r>
+          </w:p>
+        </w:tc>
+        <w:tc>
+          <w:tcPr>
+            <w:tcW w:type="dxa" w:w="760"/>
+            <w:tcBorders>
+              <w:top w:val="none" w:color="FFFFFF" w:sz="0"/>
+              <w:left w:val="none" w:color="FFFFFF" w:sz="0"/>
+              <w:bottom w:val="none" w:color="FFFFFF" w:sz="0"/>
+              <w:right w:val="none" w:color="FFFFFF" w:sz="0"/>
+            </w:tcBorders>
+            <w:tcMar>
+              <w:top w:type="dxa" w:w="25"/>
+              <w:left w:type="dxa" w:w="40"/>
+              <w:bottom w:type="dxa" w:w="25"/>
+              <w:right w:type="dxa" w:w="40"/>
+            </w:tcMar>
+          </w:tcPr>
+          <w:p>
+            <w:pPr>
+              <w:jc w:val="center"/>
+            </w:pPr>
+            <w:r>
+              <w:rPr>
+                <w:rFonts w:ascii="Times New Roman" w:cs="Times New Roman" w:eastAsia="Times New Roman" w:hAnsi="Times New Roman"/>
+                <w:b w:val="false"/>
+                <w:bCs w:val="false"/>
+                <w:i w:val="false"/>
+                <w:iCs w:val="false"/>
+                <w:smallCaps w:val="false"/>
+                <w:sz w:val="16"/>
+                <w:szCs w:val="16"/>
+              </w:rPr>
+              <w:t xml:space="preserve">64/96</w:t>
+            </w:r>
+          </w:p>
+        </w:tc>
+        <w:tc>
+          <w:tcPr>
+            <w:tcW w:type="dxa" w:w="760"/>
+            <w:tcBorders>
+              <w:top w:val="none" w:color="FFFFFF" w:sz="0"/>
+              <w:left w:val="none" w:color="FFFFFF" w:sz="0"/>
+              <w:bottom w:val="none" w:color="FFFFFF" w:sz="0"/>
+              <w:right w:val="none" w:color="FFFFFF" w:sz="0"/>
+            </w:tcBorders>
+            <w:tcMar>
+              <w:top w:type="dxa" w:w="25"/>
+              <w:left w:type="dxa" w:w="40"/>
+              <w:bottom w:type="dxa" w:w="25"/>
+              <w:right w:type="dxa" w:w="40"/>
+            </w:tcMar>
+          </w:tcPr>
+          <w:p>
+            <w:pPr>
+              <w:jc w:val="center"/>
+            </w:pPr>
+            <w:r>
+              <w:rPr>
+                <w:rFonts w:ascii="Times New Roman" w:cs="Times New Roman" w:eastAsia="Times New Roman" w:hAnsi="Times New Roman"/>
+                <w:b w:val="false"/>
+                <w:bCs w:val="false"/>
+                <w:i w:val="false"/>
+                <w:iCs w:val="false"/>
+                <w:smallCaps w:val="false"/>
+                <w:sz w:val="16"/>
+                <w:szCs w:val="16"/>
+              </w:rPr>
+              <w:t xml:space="preserve">67/96</w:t>
+            </w:r>
+          </w:p>
+        </w:tc>
+        <w:tc>
+          <w:tcPr>
+            <w:tcW w:type="dxa" w:w="760"/>
+            <w:tcBorders>
+              <w:top w:val="none" w:color="FFFFFF" w:sz="0"/>
+              <w:left w:val="none" w:color="FFFFFF" w:sz="0"/>
+              <w:bottom w:val="none" w:color="FFFFFF" w:sz="0"/>
+              <w:right w:val="none" w:color="FFFFFF" w:sz="0"/>
+            </w:tcBorders>
+            <w:tcMar>
+              <w:top w:type="dxa" w:w="25"/>
+              <w:left w:type="dxa" w:w="40"/>
+              <w:bottom w:type="dxa" w:w="25"/>
+              <w:right w:type="dxa" w:w="40"/>
+            </w:tcMar>
+          </w:tcPr>
+          <w:p>
+            <w:pPr>
+              <w:jc w:val="center"/>
+            </w:pPr>
+            <w:r>
+              <w:rPr>
+                <w:rFonts w:ascii="Times New Roman" w:cs="Times New Roman" w:eastAsia="Times New Roman" w:hAnsi="Times New Roman"/>
+                <w:b w:val="false"/>
+                <w:bCs w:val="false"/>
+                <w:i w:val="false"/>
+                <w:iCs w:val="false"/>
+                <w:smallCaps w:val="false"/>
+                <w:sz w:val="16"/>
+                <w:szCs w:val="16"/>
+              </w:rPr>
+              <w:t xml:space="preserve">96/96</w:t>
+            </w:r>
+          </w:p>
+        </w:tc>
+        <w:tc>
+          <w:tcPr>
+            <w:tcW w:type="dxa" w:w="560"/>
+            <w:tcBorders>
+              <w:top w:val="none" w:color="FFFFFF" w:sz="0"/>
+              <w:left w:val="none" w:color="FFFFFF" w:sz="0"/>
+              <w:bottom w:val="none" w:color="FFFFFF" w:sz="0"/>
+              <w:right w:val="none" w:color="FFFFFF" w:sz="0"/>
+            </w:tcBorders>
+            <w:tcMar>
+              <w:top w:type="dxa" w:w="25"/>
+              <w:left w:type="dxa" w:w="40"/>
+              <w:bottom w:type="dxa" w:w="25"/>
+              <w:right w:type="dxa" w:w="40"/>
+            </w:tcMar>
+          </w:tcPr>
+          <w:p>
+            <w:pPr>
+              <w:jc w:val="center"/>
+            </w:pPr>
+            <w:r>
+              <w:rPr>
+                <w:rFonts w:ascii="Times New Roman" w:cs="Times New Roman" w:eastAsia="Times New Roman" w:hAnsi="Times New Roman"/>
+                <w:b w:val="false"/>
+                <w:bCs w:val="false"/>
+                <w:i w:val="false"/>
+                <w:iCs w:val="false"/>
+                <w:smallCaps w:val="false"/>
+                <w:sz w:val="16"/>
+                <w:szCs w:val="16"/>
+              </w:rPr>
+              <w:t xml:space="preserve">0.66</w:t>
+            </w:r>
+          </w:p>
+        </w:tc>
+      </w:tr>
+      <w:tr>
+        <w:tc>
+          <w:tcPr>
+            <w:tcW w:type="dxa" w:w="1500"/>
+            <w:tcBorders>
+              <w:top w:val="none" w:color="FFFFFF" w:sz="0"/>
+              <w:left w:val="none" w:color="FFFFFF" w:sz="0"/>
+              <w:bottom w:val="none" w:color="FFFFFF" w:sz="0"/>
+              <w:right w:val="none" w:color="FFFFFF" w:sz="0"/>
+            </w:tcBorders>
+            <w:tcMar>
+              <w:top w:type="dxa" w:w="25"/>
+              <w:left w:type="dxa" w:w="40"/>
+              <w:bottom w:type="dxa" w:w="25"/>
+              <w:right w:type="dxa" w:w="40"/>
+            </w:tcMar>
+          </w:tcPr>
+          <w:p>
+            <w:pPr>
+              <w:jc w:val="left"/>
+            </w:pPr>
+            <w:r>
+              <w:rPr>
+                <w:rFonts w:ascii="Times New Roman" w:cs="Times New Roman" w:eastAsia="Times New Roman" w:hAnsi="Times New Roman"/>
+                <w:b w:val="false"/>
+                <w:bCs w:val="false"/>
+                <w:i w:val="false"/>
+                <w:iCs w:val="false"/>
+                <w:smallCaps w:val="false"/>
+                <w:sz w:val="16"/>
+                <w:szCs w:val="16"/>
+              </w:rPr>
+              <w:t xml:space="preserve">Intent, golden</w:t>
+            </w:r>
+          </w:p>
+        </w:tc>
+        <w:tc>
+          <w:tcPr>
+            <w:tcW w:type="dxa" w:w="760"/>
+            <w:tcBorders>
+              <w:top w:val="none" w:color="FFFFFF" w:sz="0"/>
+              <w:left w:val="none" w:color="FFFFFF" w:sz="0"/>
+              <w:bottom w:val="none" w:color="FFFFFF" w:sz="0"/>
+              <w:right w:val="none" w:color="FFFFFF" w:sz="0"/>
+            </w:tcBorders>
+            <w:tcMar>
+              <w:top w:type="dxa" w:w="25"/>
+              <w:left w:type="dxa" w:w="40"/>
+              <w:bottom w:type="dxa" w:w="25"/>
+              <w:right w:type="dxa" w:w="40"/>
+            </w:tcMar>
+          </w:tcPr>
+          <w:p>
+            <w:pPr>
+              <w:jc w:val="center"/>
+            </w:pPr>
+            <w:r>
+              <w:rPr>
+                <w:rFonts w:ascii="Times New Roman" w:cs="Times New Roman" w:eastAsia="Times New Roman" w:hAnsi="Times New Roman"/>
+                <w:b w:val="false"/>
+                <w:bCs w:val="false"/>
+                <w:i w:val="false"/>
+                <w:iCs w:val="false"/>
+                <w:smallCaps w:val="false"/>
+                <w:sz w:val="16"/>
+                <w:szCs w:val="16"/>
+              </w:rPr>
+              <w:t xml:space="preserve">44/64</w:t>
+            </w:r>
+          </w:p>
+        </w:tc>
+        <w:tc>
+          <w:tcPr>
+            <w:tcW w:type="dxa" w:w="760"/>
+            <w:tcBorders>
+              <w:top w:val="none" w:color="FFFFFF" w:sz="0"/>
+              <w:left w:val="none" w:color="FFFFFF" w:sz="0"/>
+              <w:bottom w:val="none" w:color="FFFFFF" w:sz="0"/>
+              <w:right w:val="none" w:color="FFFFFF" w:sz="0"/>
+            </w:tcBorders>
+            <w:tcMar>
+              <w:top w:type="dxa" w:w="25"/>
+              <w:left w:type="dxa" w:w="40"/>
+              <w:bottom w:type="dxa" w:w="25"/>
+              <w:right w:type="dxa" w:w="40"/>
+            </w:tcMar>
+          </w:tcPr>
+          <w:p>
+            <w:pPr>
+              <w:jc w:val="center"/>
+            </w:pPr>
+            <w:r>
+              <w:rPr>
+                <w:rFonts w:ascii="Times New Roman" w:cs="Times New Roman" w:eastAsia="Times New Roman" w:hAnsi="Times New Roman"/>
+                <w:b w:val="false"/>
+                <w:bCs w:val="false"/>
+                <w:i w:val="false"/>
+                <w:iCs w:val="false"/>
+                <w:smallCaps w:val="false"/>
+                <w:sz w:val="16"/>
+                <w:szCs w:val="16"/>
+              </w:rPr>
+              <w:t xml:space="preserve">44/64</w:t>
+            </w:r>
+          </w:p>
+        </w:tc>
+        <w:tc>
+          <w:tcPr>
+            <w:tcW w:type="dxa" w:w="760"/>
+            <w:tcBorders>
+              <w:top w:val="none" w:color="FFFFFF" w:sz="0"/>
+              <w:left w:val="none" w:color="FFFFFF" w:sz="0"/>
+              <w:bottom w:val="none" w:color="FFFFFF" w:sz="0"/>
+              <w:right w:val="none" w:color="FFFFFF" w:sz="0"/>
+            </w:tcBorders>
+            <w:tcMar>
+              <w:top w:type="dxa" w:w="25"/>
+              <w:left w:type="dxa" w:w="40"/>
+              <w:bottom w:type="dxa" w:w="25"/>
+              <w:right w:type="dxa" w:w="40"/>
+            </w:tcMar>
+          </w:tcPr>
+          <w:p>
+            <w:pPr>
+              <w:jc w:val="center"/>
+            </w:pPr>
+            <w:r>
+              <w:rPr>
+                <w:rFonts w:ascii="Times New Roman" w:cs="Times New Roman" w:eastAsia="Times New Roman" w:hAnsi="Times New Roman"/>
+                <w:b w:val="false"/>
+                <w:bCs w:val="false"/>
+                <w:i w:val="false"/>
+                <w:iCs w:val="false"/>
+                <w:smallCaps w:val="false"/>
+                <w:sz w:val="16"/>
+                <w:szCs w:val="16"/>
+              </w:rPr>
+              <w:t xml:space="preserve">64/64</w:t>
+            </w:r>
+          </w:p>
+        </w:tc>
+        <w:tc>
+          <w:tcPr>
+            <w:tcW w:type="dxa" w:w="560"/>
+            <w:tcBorders>
+              <w:top w:val="none" w:color="FFFFFF" w:sz="0"/>
+              <w:left w:val="none" w:color="FFFFFF" w:sz="0"/>
+              <w:bottom w:val="none" w:color="FFFFFF" w:sz="0"/>
+              <w:right w:val="none" w:color="FFFFFF" w:sz="0"/>
+            </w:tcBorders>
+            <w:tcMar>
+              <w:top w:type="dxa" w:w="25"/>
+              <w:left w:type="dxa" w:w="40"/>
+              <w:bottom w:type="dxa" w:w="25"/>
+              <w:right w:type="dxa" w:w="40"/>
+            </w:tcMar>
+          </w:tcPr>
+          <w:p>
+            <w:pPr>
+              <w:jc w:val="center"/>
+            </w:pPr>
+            <w:r>
+              <w:rPr>
+                <w:rFonts w:ascii="Times New Roman" w:cs="Times New Roman" w:eastAsia="Times New Roman" w:hAnsi="Times New Roman"/>
+                <w:b w:val="false"/>
+                <w:bCs w:val="false"/>
+                <w:i w:val="false"/>
+                <w:iCs w:val="false"/>
+                <w:smallCaps w:val="false"/>
+                <w:sz w:val="16"/>
+                <w:szCs w:val="16"/>
+              </w:rPr>
+              <w:t xml:space="preserve">1.00</w:t>
+            </w:r>
+          </w:p>
+        </w:tc>
+      </w:tr>
+      <w:tr>
+        <w:tc>
+          <w:tcPr>
+            <w:tcW w:type="dxa" w:w="1500"/>
+            <w:tcBorders>
+              <w:top w:val="none" w:color="FFFFFF" w:sz="0"/>
+              <w:left w:val="none" w:color="FFFFFF" w:sz="0"/>
+              <w:bottom w:val="none" w:color="FFFFFF" w:sz="0"/>
+              <w:right w:val="none" w:color="FFFFFF" w:sz="0"/>
+            </w:tcBorders>
+            <w:tcMar>
+              <w:top w:type="dxa" w:w="25"/>
+              <w:left w:type="dxa" w:w="40"/>
+              <w:bottom w:type="dxa" w:w="25"/>
+              <w:right w:type="dxa" w:w="40"/>
+            </w:tcMar>
+          </w:tcPr>
+          <w:p>
+            <w:pPr>
+              <w:jc w:val="left"/>
+            </w:pPr>
+            <w:r>
+              <w:rPr>
+                <w:rFonts w:ascii="Times New Roman" w:cs="Times New Roman" w:eastAsia="Times New Roman" w:hAnsi="Times New Roman"/>
+                <w:b w:val="false"/>
+                <w:bCs w:val="false"/>
+                <w:i w:val="false"/>
+                <w:iCs w:val="false"/>
+                <w:smallCaps w:val="false"/>
+                <w:sz w:val="16"/>
+                <w:szCs w:val="16"/>
+              </w:rPr>
+              <w:t xml:space="preserve">Intent, mutant</w:t>
+            </w:r>
+          </w:p>
+        </w:tc>
+        <w:tc>
+          <w:tcPr>
+            <w:tcW w:type="dxa" w:w="760"/>
+            <w:tcBorders>
+              <w:top w:val="none" w:color="FFFFFF" w:sz="0"/>
+              <w:left w:val="none" w:color="FFFFFF" w:sz="0"/>
+              <w:bottom w:val="none" w:color="FFFFFF" w:sz="0"/>
+              <w:right w:val="none" w:color="FFFFFF" w:sz="0"/>
+            </w:tcBorders>
+            <w:tcMar>
+              <w:top w:type="dxa" w:w="25"/>
+              <w:left w:type="dxa" w:w="40"/>
+              <w:bottom w:type="dxa" w:w="25"/>
+              <w:right w:type="dxa" w:w="40"/>
+            </w:tcMar>
+          </w:tcPr>
+          <w:p>
+            <w:pPr>
+              <w:jc w:val="center"/>
+            </w:pPr>
+            <w:r>
+              <w:rPr>
+                <w:rFonts w:ascii="Times New Roman" w:cs="Times New Roman" w:eastAsia="Times New Roman" w:hAnsi="Times New Roman"/>
+                <w:b w:val="false"/>
+                <w:bCs w:val="false"/>
+                <w:i w:val="false"/>
+                <w:iCs w:val="false"/>
+                <w:smallCaps w:val="false"/>
+                <w:sz w:val="16"/>
+                <w:szCs w:val="16"/>
+              </w:rPr>
+              <w:t xml:space="preserve">20/32</w:t>
+            </w:r>
+          </w:p>
+        </w:tc>
+        <w:tc>
+          <w:tcPr>
+            <w:tcW w:type="dxa" w:w="760"/>
+            <w:tcBorders>
+              <w:top w:val="none" w:color="FFFFFF" w:sz="0"/>
+              <w:left w:val="none" w:color="FFFFFF" w:sz="0"/>
+              <w:bottom w:val="none" w:color="FFFFFF" w:sz="0"/>
+              <w:right w:val="none" w:color="FFFFFF" w:sz="0"/>
+            </w:tcBorders>
+            <w:tcMar>
+              <w:top w:type="dxa" w:w="25"/>
+              <w:left w:type="dxa" w:w="40"/>
+              <w:bottom w:type="dxa" w:w="25"/>
+              <w:right w:type="dxa" w:w="40"/>
+            </w:tcMar>
+          </w:tcPr>
+          <w:p>
+            <w:pPr>
+              <w:jc w:val="center"/>
+            </w:pPr>
+            <w:r>
+              <w:rPr>
+                <w:rFonts w:ascii="Times New Roman" w:cs="Times New Roman" w:eastAsia="Times New Roman" w:hAnsi="Times New Roman"/>
+                <w:b w:val="false"/>
+                <w:bCs w:val="false"/>
+                <w:i w:val="false"/>
+                <w:iCs w:val="false"/>
+                <w:smallCaps w:val="false"/>
+                <w:sz w:val="16"/>
+                <w:szCs w:val="16"/>
+              </w:rPr>
+              <w:t xml:space="preserve">23/32</w:t>
+            </w:r>
+          </w:p>
+        </w:tc>
+        <w:tc>
+          <w:tcPr>
+            <w:tcW w:type="dxa" w:w="760"/>
+            <w:tcBorders>
+              <w:top w:val="none" w:color="FFFFFF" w:sz="0"/>
+              <w:left w:val="none" w:color="FFFFFF" w:sz="0"/>
+              <w:bottom w:val="none" w:color="FFFFFF" w:sz="0"/>
+              <w:right w:val="none" w:color="FFFFFF" w:sz="0"/>
+            </w:tcBorders>
+            <w:tcMar>
+              <w:top w:type="dxa" w:w="25"/>
+              <w:left w:type="dxa" w:w="40"/>
+              <w:bottom w:type="dxa" w:w="25"/>
+              <w:right w:type="dxa" w:w="40"/>
+            </w:tcMar>
+          </w:tcPr>
+          <w:p>
+            <w:pPr>
+              <w:jc w:val="center"/>
+            </w:pPr>
+            <w:r>
+              <w:rPr>
+                <w:rFonts w:ascii="Times New Roman" w:cs="Times New Roman" w:eastAsia="Times New Roman" w:hAnsi="Times New Roman"/>
+                <w:b w:val="false"/>
+                <w:bCs w:val="false"/>
+                <w:i w:val="false"/>
+                <w:iCs w:val="false"/>
+                <w:smallCaps w:val="false"/>
+                <w:sz w:val="16"/>
+                <w:szCs w:val="16"/>
+              </w:rPr>
+              <w:t xml:space="preserve">32/32</w:t>
+            </w:r>
+          </w:p>
+        </w:tc>
+        <w:tc>
+          <w:tcPr>
+            <w:tcW w:type="dxa" w:w="560"/>
+            <w:tcBorders>
+              <w:top w:val="none" w:color="FFFFFF" w:sz="0"/>
+              <w:left w:val="none" w:color="FFFFFF" w:sz="0"/>
+              <w:bottom w:val="none" w:color="FFFFFF" w:sz="0"/>
+              <w:right w:val="none" w:color="FFFFFF" w:sz="0"/>
+            </w:tcBorders>
+            <w:tcMar>
+              <w:top w:type="dxa" w:w="25"/>
+              <w:left w:type="dxa" w:w="40"/>
+              <w:bottom w:type="dxa" w:w="25"/>
+              <w:right w:type="dxa" w:w="40"/>
+            </w:tcMar>
+          </w:tcPr>
+          <w:p>
+            <w:pPr>
+              <w:jc w:val="center"/>
+            </w:pPr>
+            <w:r>
+              <w:rPr>
+                <w:rFonts w:ascii="Times New Roman" w:cs="Times New Roman" w:eastAsia="Times New Roman" w:hAnsi="Times New Roman"/>
+                <w:b w:val="false"/>
+                <w:bCs w:val="false"/>
+                <w:i w:val="false"/>
+                <w:iCs w:val="false"/>
+                <w:smallCaps w:val="false"/>
+                <w:sz w:val="16"/>
+                <w:szCs w:val="16"/>
+              </w:rPr>
+              <w:t xml:space="preserve">0.51</w:t>
+            </w:r>
+          </w:p>
+        </w:tc>
+      </w:tr>
+      <w:tr>
+        <w:tc>
+          <w:tcPr>
+            <w:tcW w:type="dxa" w:w="1500"/>
+            <w:tcBorders>
+              <w:top w:val="none" w:color="FFFFFF" w:sz="0"/>
+              <w:left w:val="none" w:color="FFFFFF" w:sz="0"/>
+              <w:bottom w:val="none" w:color="FFFFFF" w:sz="0"/>
+              <w:right w:val="none" w:color="FFFFFF" w:sz="0"/>
+            </w:tcBorders>
+            <w:tcMar>
+              <w:top w:type="dxa" w:w="25"/>
+              <w:left w:type="dxa" w:w="40"/>
+              <w:bottom w:type="dxa" w:w="25"/>
+              <w:right w:type="dxa" w:w="40"/>
+            </w:tcMar>
+          </w:tcPr>
+          <w:p>
+            <w:pPr>
+              <w:jc w:val="left"/>
+            </w:pPr>
+            <w:r>
+              <w:rPr>
+                <w:rFonts w:ascii="Times New Roman" w:cs="Times New Roman" w:eastAsia="Times New Roman" w:hAnsi="Times New Roman"/>
+                <w:b w:val="false"/>
+                <w:bCs w:val="false"/>
+                <w:i w:val="false"/>
+                <w:iCs w:val="false"/>
+                <w:smallCaps w:val="false"/>
+                <w:sz w:val="16"/>
+                <w:szCs w:val="16"/>
+              </w:rPr>
+              <w:t xml:space="preserve">Defect caught</w:t>
+            </w:r>
+          </w:p>
+        </w:tc>
+        <w:tc>
+          <w:tcPr>
+            <w:tcW w:type="dxa" w:w="760"/>
+            <w:tcBorders>
+              <w:top w:val="none" w:color="FFFFFF" w:sz="0"/>
+              <w:left w:val="none" w:color="FFFFFF" w:sz="0"/>
+              <w:bottom w:val="none" w:color="FFFFFF" w:sz="0"/>
+              <w:right w:val="none" w:color="FFFFFF" w:sz="0"/>
+            </w:tcBorders>
+            <w:tcMar>
+              <w:top w:type="dxa" w:w="25"/>
+              <w:left w:type="dxa" w:w="40"/>
+              <w:bottom w:type="dxa" w:w="25"/>
+              <w:right w:type="dxa" w:w="40"/>
+            </w:tcMar>
+          </w:tcPr>
+          <w:p>
+            <w:pPr>
+              <w:jc w:val="center"/>
+            </w:pPr>
+            <w:r>
+              <w:rPr>
+                <w:rFonts w:ascii="Times New Roman" w:cs="Times New Roman" w:eastAsia="Times New Roman" w:hAnsi="Times New Roman"/>
+                <w:b w:val="false"/>
+                <w:bCs w:val="false"/>
+                <w:i w:val="false"/>
+                <w:iCs w:val="false"/>
+                <w:smallCaps w:val="false"/>
+                <w:sz w:val="16"/>
+                <w:szCs w:val="16"/>
+              </w:rPr>
+              <w:t xml:space="preserve">1/32</w:t>
+            </w:r>
+          </w:p>
+        </w:tc>
+        <w:tc>
+          <w:tcPr>
+            <w:tcW w:type="dxa" w:w="760"/>
+            <w:tcBorders>
+              <w:top w:val="none" w:color="FFFFFF" w:sz="0"/>
+              <w:left w:val="none" w:color="FFFFFF" w:sz="0"/>
+              <w:bottom w:val="none" w:color="FFFFFF" w:sz="0"/>
+              <w:right w:val="none" w:color="FFFFFF" w:sz="0"/>
+            </w:tcBorders>
+            <w:tcMar>
+              <w:top w:type="dxa" w:w="25"/>
+              <w:left w:type="dxa" w:w="40"/>
+              <w:bottom w:type="dxa" w:w="25"/>
+              <w:right w:type="dxa" w:w="40"/>
+            </w:tcMar>
+          </w:tcPr>
+          <w:p>
+            <w:pPr>
+              <w:jc w:val="center"/>
+            </w:pPr>
+            <w:r>
+              <w:rPr>
+                <w:rFonts w:ascii="Times New Roman" w:cs="Times New Roman" w:eastAsia="Times New Roman" w:hAnsi="Times New Roman"/>
+                <w:b w:val="false"/>
+                <w:bCs w:val="false"/>
+                <w:i w:val="false"/>
+                <w:iCs w:val="false"/>
+                <w:smallCaps w:val="false"/>
+                <w:sz w:val="16"/>
+                <w:szCs w:val="16"/>
+              </w:rPr>
+              <w:t xml:space="preserve">2/32</w:t>
+            </w:r>
+          </w:p>
+        </w:tc>
+        <w:tc>
+          <w:tcPr>
+            <w:tcW w:type="dxa" w:w="760"/>
+            <w:tcBorders>
+              <w:top w:val="none" w:color="FFFFFF" w:sz="0"/>
+              <w:left w:val="none" w:color="FFFFFF" w:sz="0"/>
+              <w:bottom w:val="none" w:color="FFFFFF" w:sz="0"/>
+              <w:right w:val="none" w:color="FFFFFF" w:sz="0"/>
+            </w:tcBorders>
+            <w:tcMar>
+              <w:top w:type="dxa" w:w="25"/>
+              <w:left w:type="dxa" w:w="40"/>
+              <w:bottom w:type="dxa" w:w="25"/>
+              <w:right w:type="dxa" w:w="40"/>
+            </w:tcMar>
+          </w:tcPr>
+          <w:p>
+            <w:pPr>
+              <w:jc w:val="center"/>
+            </w:pPr>
+            <w:r>
+              <w:rPr>
+                <w:rFonts w:ascii="Times New Roman" w:cs="Times New Roman" w:eastAsia="Times New Roman" w:hAnsi="Times New Roman"/>
+                <w:b w:val="false"/>
+                <w:bCs w:val="false"/>
+                <w:i w:val="false"/>
+                <w:iCs w:val="false"/>
+                <w:smallCaps w:val="false"/>
+                <w:sz w:val="16"/>
+                <w:szCs w:val="16"/>
+              </w:rPr>
+              <w:t xml:space="preserve">3/32</w:t>
+            </w:r>
+          </w:p>
+        </w:tc>
+        <w:tc>
+          <w:tcPr>
+            <w:tcW w:type="dxa" w:w="560"/>
+            <w:tcBorders>
+              <w:top w:val="none" w:color="FFFFFF" w:sz="0"/>
+              <w:left w:val="none" w:color="FFFFFF" w:sz="0"/>
+              <w:bottom w:val="none" w:color="FFFFFF" w:sz="0"/>
+              <w:right w:val="none" w:color="FFFFFF" w:sz="0"/>
+            </w:tcBorders>
+            <w:tcMar>
+              <w:top w:type="dxa" w:w="25"/>
+              <w:left w:type="dxa" w:w="40"/>
+              <w:bottom w:type="dxa" w:w="25"/>
+              <w:right w:type="dxa" w:w="40"/>
+            </w:tcMar>
+          </w:tcPr>
+          <w:p>
+            <w:pPr>
+              <w:jc w:val="center"/>
+            </w:pPr>
+            <w:r>
+              <w:rPr>
+                <w:rFonts w:ascii="Times New Roman" w:cs="Times New Roman" w:eastAsia="Times New Roman" w:hAnsi="Times New Roman"/>
+                <w:b w:val="false"/>
+                <w:bCs w:val="false"/>
+                <w:i w:val="false"/>
+                <w:iCs w:val="false"/>
+                <w:smallCaps w:val="false"/>
+                <w:sz w:val="16"/>
+                <w:szCs w:val="16"/>
+              </w:rPr>
+              <w:t xml:space="preserve">1.00</w:t>
+            </w:r>
+          </w:p>
+        </w:tc>
+      </w:tr>
+      <w:tr>
+        <w:tc>
+          <w:tcPr>
+            <w:tcW w:type="dxa" w:w="1500"/>
+            <w:tcBorders>
+              <w:top w:val="none" w:color="FFFFFF" w:sz="0"/>
+              <w:left w:val="none" w:color="FFFFFF" w:sz="0"/>
+              <w:bottom w:val="single" w:color="000000" w:sz="4"/>
+              <w:right w:val="none" w:color="FFFFFF" w:sz="0"/>
+            </w:tcBorders>
+            <w:tcMar>
+              <w:top w:type="dxa" w:w="25"/>
+              <w:left w:type="dxa" w:w="40"/>
+              <w:bottom w:type="dxa" w:w="25"/>
+              <w:right w:type="dxa" w:w="40"/>
+            </w:tcMar>
+          </w:tcPr>
+          <w:p>
+            <w:pPr>
+              <w:jc w:val="left"/>
+            </w:pPr>
+            <w:r>
+              <w:rPr>
+                <w:rFonts w:ascii="Times New Roman" w:cs="Times New Roman" w:eastAsia="Times New Roman" w:hAnsi="Times New Roman"/>
+                <w:b w:val="false"/>
+                <w:bCs w:val="false"/>
+                <w:i w:val="false"/>
+                <w:iCs w:val="false"/>
+                <w:smallCaps w:val="false"/>
+                <w:sz w:val="16"/>
+                <w:szCs w:val="16"/>
+              </w:rPr>
+              <w:t xml:space="preserve">False alarm</w:t>
+            </w:r>
+          </w:p>
+        </w:tc>
+        <w:tc>
+          <w:tcPr>
+            <w:tcW w:type="dxa" w:w="760"/>
+            <w:tcBorders>
+              <w:top w:val="none" w:color="FFFFFF" w:sz="0"/>
+              <w:left w:val="none" w:color="FFFFFF" w:sz="0"/>
+              <w:bottom w:val="single" w:color="000000" w:sz="4"/>
+              <w:right w:val="none" w:color="FFFFFF" w:sz="0"/>
+            </w:tcBorders>
+            <w:tcMar>
+              <w:top w:type="dxa" w:w="25"/>
+              <w:left w:type="dxa" w:w="40"/>
+              <w:bottom w:type="dxa" w:w="25"/>
+              <w:right w:type="dxa" w:w="40"/>
+            </w:tcMar>
+          </w:tcPr>
+          <w:p>
+            <w:pPr>
+              <w:jc w:val="center"/>
+            </w:pPr>
+            <w:r>
+              <w:rPr>
+                <w:rFonts w:ascii="Times New Roman" w:cs="Times New Roman" w:eastAsia="Times New Roman" w:hAnsi="Times New Roman"/>
+                <w:b w:val="false"/>
+                <w:bCs w:val="false"/>
+                <w:i w:val="false"/>
+                <w:iCs w:val="false"/>
+                <w:smallCaps w:val="false"/>
+                <w:sz w:val="16"/>
+                <w:szCs w:val="16"/>
+              </w:rPr>
+              <w:t xml:space="preserve">1/64</w:t>
+            </w:r>
+          </w:p>
+        </w:tc>
+        <w:tc>
+          <w:tcPr>
+            <w:tcW w:type="dxa" w:w="760"/>
+            <w:tcBorders>
+              <w:top w:val="none" w:color="FFFFFF" w:sz="0"/>
+              <w:left w:val="none" w:color="FFFFFF" w:sz="0"/>
+              <w:bottom w:val="single" w:color="000000" w:sz="4"/>
+              <w:right w:val="none" w:color="FFFFFF" w:sz="0"/>
+            </w:tcBorders>
+            <w:tcMar>
+              <w:top w:type="dxa" w:w="25"/>
+              <w:left w:type="dxa" w:w="40"/>
+              <w:bottom w:type="dxa" w:w="25"/>
+              <w:right w:type="dxa" w:w="40"/>
+            </w:tcMar>
+          </w:tcPr>
+          <w:p>
+            <w:pPr>
+              <w:jc w:val="center"/>
+            </w:pPr>
+            <w:r>
+              <w:rPr>
+                <w:rFonts w:ascii="Times New Roman" w:cs="Times New Roman" w:eastAsia="Times New Roman" w:hAnsi="Times New Roman"/>
+                <w:b w:val="false"/>
+                <w:bCs w:val="false"/>
+                <w:i w:val="false"/>
+                <w:iCs w:val="false"/>
+                <w:smallCaps w:val="false"/>
+                <w:sz w:val="16"/>
+                <w:szCs w:val="16"/>
+              </w:rPr>
+              <w:t xml:space="preserve">3/64</w:t>
+            </w:r>
+          </w:p>
+        </w:tc>
+        <w:tc>
+          <w:tcPr>
+            <w:tcW w:type="dxa" w:w="760"/>
+            <w:tcBorders>
+              <w:top w:val="none" w:color="FFFFFF" w:sz="0"/>
+              <w:left w:val="none" w:color="FFFFFF" w:sz="0"/>
+              <w:bottom w:val="single" w:color="000000" w:sz="4"/>
+              <w:right w:val="none" w:color="FFFFFF" w:sz="0"/>
+            </w:tcBorders>
+            <w:tcMar>
+              <w:top w:type="dxa" w:w="25"/>
+              <w:left w:type="dxa" w:w="40"/>
+              <w:bottom w:type="dxa" w:w="25"/>
+              <w:right w:type="dxa" w:w="40"/>
+            </w:tcMar>
+          </w:tcPr>
+          <w:p>
+            <w:pPr>
+              <w:jc w:val="center"/>
+            </w:pPr>
+            <w:r>
+              <w:rPr>
+                <w:rFonts w:ascii="Times New Roman" w:cs="Times New Roman" w:eastAsia="Times New Roman" w:hAnsi="Times New Roman"/>
+                <w:b w:val="false"/>
+                <w:bCs w:val="false"/>
+                <w:i w:val="false"/>
+                <w:iCs w:val="false"/>
+                <w:smallCaps w:val="false"/>
+                <w:sz w:val="16"/>
+                <w:szCs w:val="16"/>
+              </w:rPr>
+              <w:t xml:space="preserve">3/64</w:t>
+            </w:r>
+          </w:p>
+        </w:tc>
+        <w:tc>
+          <w:tcPr>
+            <w:tcW w:type="dxa" w:w="560"/>
+            <w:tcBorders>
+              <w:top w:val="none" w:color="FFFFFF" w:sz="0"/>
+              <w:left w:val="none" w:color="FFFFFF" w:sz="0"/>
+              <w:bottom w:val="single" w:color="000000" w:sz="4"/>
+              <w:right w:val="none" w:color="FFFFFF" w:sz="0"/>
+            </w:tcBorders>
+            <w:tcMar>
+              <w:top w:type="dxa" w:w="25"/>
+              <w:left w:type="dxa" w:w="40"/>
+              <w:bottom w:type="dxa" w:w="25"/>
+              <w:right w:type="dxa" w:w="40"/>
+            </w:tcMar>
+          </w:tcPr>
+          <w:p>
+            <w:pPr>
+              <w:jc w:val="center"/>
+            </w:pPr>
+            <w:r>
+              <w:rPr>
+                <w:rFonts w:ascii="Times New Roman" w:cs="Times New Roman" w:eastAsia="Times New Roman" w:hAnsi="Times New Roman"/>
+                <w:b w:val="false"/>
+                <w:bCs w:val="false"/>
+                <w:i w:val="false"/>
+                <w:iCs w:val="false"/>
+                <w:smallCaps w:val="false"/>
+                <w:sz w:val="16"/>
+                <w:szCs w:val="16"/>
+              </w:rPr>
+              <w:t xml:space="preserve">0.50</w:t>
+            </w:r>
+          </w:p>
+        </w:tc>
+      </w:tr>
+    </w:tbl>
+    <w:p>
+      <w:pPr>
+        <w:spacing w:after="60"/>
+      </w:pPr>
+      <w:r>
+        <w:rPr>
+          <w:rFonts w:ascii="Times New Roman" w:cs="Times New Roman" w:eastAsia="Times New Roman" w:hAnsi="Times New Roman"/>
+          <w:b w:val="false"/>
+          <w:bCs w:val="false"/>
+          <w:i w:val="false"/>
+          <w:iCs w:val="false"/>
+          <w:smallCaps w:val="false"/>
+          <w:sz w:val="20"/>
+          <w:szCs w:val="20"/>
+        </w:rPr>
+        <w:t xml:space="preserve"/>
+      </w:r>
+    </w:p>
+    <w:p>
+      <w:pPr>
+        <w:keepNext/>
+        <w:spacing w:after="30" w:before="80"/>
+        <w:jc w:val="center"/>
+      </w:pPr>
+      <w:r>
+        <w:drawing>
+          <wp:inline distT="0" distB="0" distL="0" distR="0">
+            <wp:extent cx="3124200" cy="1038225"/>
+            <wp:effectExtent t="0" r="0" b="0" l="0"/>
+            <wp:docPr id="6" name="" descr="" title=""/>
+            <wp:cNvGraphicFramePr>
+              <a:graphicFrameLocks xmlns:a="http://schemas.openxmlformats.org/drawingml/2006/main" noChangeAspect="1"/>
+            </wp:cNvGraphicFramePr>
+            <a:graphic xmlns:a="http://schemas.openxmlformats.org/drawingml/2006/main">
+              <a:graphicData uri="http://schemas.openxmlformats.org/drawingml/2006/picture">
+                <pic:pic xmlns:pic="http://schemas.openxmlformats.org/drawingml/2006/picture">
+                  <pic:nvPicPr>
+                    <pic:cNvPr id="0" name="" descr=""/>
+                    <pic:cNvPicPr>
+                      <a:picLocks noChangeAspect="1" noChangeArrowheads="1"/>
+                    </pic:cNvPicPr>
+                  </pic:nvPicPr>
+                  <pic:blipFill>
+                    <a:blip r:embed="rId12" cstate="none"/>
+                    <a:srcRect/>
+                    <a:stretch>
+                      <a:fillRect/>
+                    </a:stretch>
+                  </pic:blipFill>
+                  <pic:spPr bwMode="auto">
+                    <a:xfrm>
+                      <a:off x="0" y="0"/>
+                      <a:ext cx="3124200" cy="1038225"/>
+                    </a:xfrm>
+                    <a:prstGeom prst="rect">
+                      <a:avLst/>
+                    </a:prstGeom>
+                  </pic:spPr>
+                </pic:pic>
+              </a:graphicData>
+            </a:graphic>
+          </wp:inline>
+        </w:drawing>
+      </w:r>
+    </w:p>
+    <w:p>
+      <w:pPr>
+        <w:spacing w:after="100"/>
+        <w:jc w:val="both"/>
+      </w:pPr>
+      <w:r>
+        <w:rPr>
+          <w:rFonts w:ascii="Times New Roman" w:cs="Times New Roman" w:eastAsia="Times New Roman" w:hAnsi="Times New Roman"/>
+          <w:b w:val="false"/>
+          <w:bCs w:val="false"/>
+          <w:i w:val="false"/>
+          <w:iCs w:val="false"/>
+          <w:smallCaps w:val="false"/>
+          <w:sz w:val="16"/>
+          <w:szCs w:val="16"/>
+        </w:rPr>
+        <w:t xml:space="preserve">Fig. 6.  </w:t>
+      </w:r>
+      <w:r>
+        <w:rPr>
+          <w:rFonts w:ascii="Times New Roman" w:cs="Times New Roman" w:eastAsia="Times New Roman" w:hAnsi="Times New Roman"/>
+          <w:b w:val="false"/>
+          <w:bCs w:val="false"/>
+          <w:i w:val="false"/>
+          <w:iCs w:val="false"/>
+          <w:smallCaps w:val="false"/>
+          <w:sz w:val="16"/>
+          <w:szCs w:val="16"/>
+        </w:rPr>
+        <w:t xml:space="preserve">Outcomes by condition in the local replication (v3). Counts are of instances; the box gives G, its 95% interval and the McNemar p.</w:t>
       </w:r>
     </w:p>
     <w:p>
@@ -3716,7 +4981,7 @@
           <w:sz w:val="20"/>
           <w:szCs w:val="20"/>
         </w:rPr>
-        <w:t xml:space="preserve">Golden patches are a poor population for studying ambiguity. Well-written fixes state their purpose in the code, comments and docstrings they add; evaluating intent-dependent review requires withholding all of it, and even then most changes remain self-explanatory. Benchmarks of genuinely under-specified changes would strengthen this line of work.</w:t>
+        <w:t xml:space="preserve">Clarification did not significantly recover intent in the replication. Over 96 instances, intent recovery was 67% without clarification, 70% with it and 100% with full context. Gap recovery was 0.09 (interval -0.22 to 0.33, McNemar p = 0.66), not significant. The upper limit of the interval rules out recovering more than about a third of the gap at this sample size. The manipulation works: withholding intent cost 33 points of intent recovery against full context, and clarification restored 3 of those points. By subset, gap recovery was 0.00 on the golden rows (p = 1.00) and 0.25 on the mutants (p = 0.51), neither significant.</w:t>
       </w:r>
     </w:p>
     <w:p>
@@ -3737,40 +5002,7 @@
           <w:sz w:val="20"/>
           <w:szCs w:val="20"/>
         </w:rPr>
-        <w:t xml:space="preserve">Finally, clarification cannot exceed the reviewer. On a small free-tier model, full context did not make the reviewer catch injected defects, so detection gains, if they exist, require a stronger reviewer before intent can matter.</w:t>
-      </w:r>
-    </w:p>
-    <w:p>
-      <w:pPr>
-        <w:keepNext/>
-        <w:spacing w:after="80" w:before="160"/>
-        <w:jc w:val="center"/>
-      </w:pPr>
-      <w:r>
-        <w:rPr>
-          <w:rFonts w:ascii="Times New Roman" w:cs="Times New Roman" w:eastAsia="Times New Roman" w:hAnsi="Times New Roman"/>
-          <w:b w:val="false"/>
-          <w:bCs w:val="false"/>
-          <w:i w:val="false"/>
-          <w:iCs w:val="false"/>
-          <w:smallCaps/>
-          <w:sz w:val="20"/>
-          <w:szCs w:val="20"/>
-        </w:rPr>
-        <w:t xml:space="preserve">VII. </w:t>
-      </w:r>
-      <w:r>
-        <w:rPr>
-          <w:rFonts w:ascii="Times New Roman" w:cs="Times New Roman" w:eastAsia="Times New Roman" w:hAnsi="Times New Roman"/>
-          <w:b w:val="false"/>
-          <w:bCs w:val="false"/>
-          <w:i w:val="false"/>
-          <w:iCs w:val="false"/>
-          <w:smallCaps/>
-          <w:sz w:val="20"/>
-          <w:szCs w:val="20"/>
-        </w:rPr>
-        <w:t xml:space="preserve">Threats to Validity</w:t>
+        <w:t xml:space="preserve">Detector recall was the limit, as in the original study. The detector asked on 17 of 96 treatment reviews. Of the 32 changes that the reviewer misread without clarification, the detector asked on 8 and missed 24. The simulated author answered 7 of those 8 questions, and the treatment recovered intent on 3 of the 32 changes. Effects went in both directions: clarification helped on 12 instances and hurt on 9. Once a question was answered, the treatment recovered intent in 3 of 7 cases, so most of the loss lies in deciding when to ask. Recall, not the answer, is the limit.</w:t>
       </w:r>
     </w:p>
     <w:p>
@@ -3791,40 +5023,26 @@
           <w:sz w:val="20"/>
           <w:szCs w:val="20"/>
         </w:rPr>
-        <w:t xml:space="preserve">The sample is small (36 instances under per-model daily quotas), so intervals are wide. The judge has not yet been validated against human scoring; a stratified sample and agreement tooling (Cohen's κ [15]) are provided. The simulated author answers from withheld text only, but leakage requires the hand audit the tooling prepares. We report a protocol deviation: in the first v2 run the simulated author's token budget was exhausted by its model's hidden reasoning, returning empty answers, and its prompt refused questions phrased in terms of unseen code. Both were corrected and the treatment re-run for the six affected instances; floor and ceiling were not re-run, and the prompt revision, made after observing refusals, is logged with every exchange. All verified mutants come from sympy and the operators produce simple defects. The reviewer is a small model; results may differ for stronger ones.</w:t>
+        <w:t xml:space="preserve">Defect detection stays near the floor even with full context. The mutant rows caught the injected defect on 1 of 32 without clarification, 2 with it and 3 with full context (3%, 6% and 9%; McNemar p = 1.00). A small local reviewer, qwen3:4b-instruct-2507-q4_K_M, limits defect detection, as in the original study. Over 64 golden rows, false alarms were 1 without clarification, 3 with it and 3 with full context, too few to separate the conditions (p = 0.50). The study makes no claim about an effect on defects.</w:t>
       </w:r>
     </w:p>
     <w:p>
       <w:pPr>
         <w:keepNext/>
-        <w:spacing w:after="80" w:before="160"/>
-        <w:jc w:val="center"/>
-      </w:pPr>
-      <w:r>
-        <w:rPr>
-          <w:rFonts w:ascii="Times New Roman" w:cs="Times New Roman" w:eastAsia="Times New Roman" w:hAnsi="Times New Roman"/>
-          <w:b w:val="false"/>
-          <w:bCs w:val="false"/>
-          <w:i w:val="false"/>
-          <w:iCs w:val="false"/>
-          <w:smallCaps/>
-          <w:sz w:val="20"/>
-          <w:szCs w:val="20"/>
-        </w:rPr>
-        <w:t xml:space="preserve">VIII. </w:t>
-      </w:r>
-      <w:r>
-        <w:rPr>
-          <w:rFonts w:ascii="Times New Roman" w:cs="Times New Roman" w:eastAsia="Times New Roman" w:hAnsi="Times New Roman"/>
-          <w:b w:val="false"/>
-          <w:bCs w:val="false"/>
-          <w:i w:val="false"/>
-          <w:iCs w:val="false"/>
-          <w:smallCaps/>
-          <w:sz w:val="20"/>
-          <w:szCs w:val="20"/>
-        </w:rPr>
-        <w:t xml:space="preserve">Conclusion</w:t>
+        <w:spacing w:after="40" w:before="80"/>
+      </w:pPr>
+      <w:r>
+        <w:rPr>
+          <w:rFonts w:ascii="Times New Roman" w:cs="Times New Roman" w:eastAsia="Times New Roman" w:hAnsi="Times New Roman"/>
+          <w:b w:val="false"/>
+          <w:bCs w:val="false"/>
+          <w:i/>
+          <w:iCs/>
+          <w:smallCaps w:val="false"/>
+          <w:sz w:val="20"/>
+          <w:szCs w:val="20"/>
+        </w:rPr>
+        <w:t xml:space="preserve">G. Judge calibration</w:t>
       </w:r>
     </w:p>
     <w:p>
@@ -3845,7 +5063,2383 @@
           <w:sz w:val="20"/>
           <w:szCs w:val="20"/>
         </w:rPr>
-        <w:t xml:space="preserve">ClarifyReview inserts a decision before critique: ask the author when the intent of a change cannot be read from the change. Evaluating the idea required withholding all natural-language intent, because golden patches document their own. With that manipulation, clarification recovered 0.17 of the intent gap on 36 instances—in the expected direction, not significant at this size—and a per-instance trace shows it succeeded where it was given the chance, with detector recall as the limit. Future work is a human-labelled set to train and calibrate the detectors, human validation of the judge, a paired developer study of usefulness and trust, and a larger run with a stronger reviewer.</w:t>
+        <w:t xml:space="preserve">Three AI judges scored the original reviews: the API judge gemma-4-31b-it, Claude Sonnet agents (claude-sonnet-agent), and the Gemini 4 Argon (web app) on a stratified sample of 30 runs, stratified by condition and variant. Table IV gives percent agreement, kappa and n for each judge pair. All of this is AI-vs-AI agreement, not validation against human scorers.</w:t>
+      </w:r>
+    </w:p>
+    <w:p>
+      <w:pPr>
+        <w:keepNext/>
+        <w:spacing w:after="0" w:before="100"/>
+        <w:jc w:val="center"/>
+      </w:pPr>
+      <w:r>
+        <w:rPr>
+          <w:rFonts w:ascii="Times New Roman" w:cs="Times New Roman" w:eastAsia="Times New Roman" w:hAnsi="Times New Roman"/>
+          <w:b w:val="false"/>
+          <w:bCs w:val="false"/>
+          <w:i w:val="false"/>
+          <w:iCs w:val="false"/>
+          <w:smallCaps w:val="false"/>
+          <w:sz w:val="16"/>
+          <w:szCs w:val="16"/>
+        </w:rPr>
+        <w:t xml:space="preserve">TABLE IV</w:t>
+      </w:r>
+    </w:p>
+    <w:p>
+      <w:pPr>
+        <w:keepNext/>
+        <w:spacing w:after="40"/>
+        <w:jc w:val="center"/>
+      </w:pPr>
+      <w:r>
+        <w:rPr>
+          <w:rFonts w:ascii="Times New Roman" w:cs="Times New Roman" w:eastAsia="Times New Roman" w:hAnsi="Times New Roman"/>
+          <w:b w:val="false"/>
+          <w:bCs w:val="false"/>
+          <w:i w:val="false"/>
+          <w:iCs w:val="false"/>
+          <w:smallCaps/>
+          <w:sz w:val="16"/>
+          <w:szCs w:val="16"/>
+        </w:rPr>
+        <w:t xml:space="preserve">Agreement between AI judges (% agreement / kappa / n)</w:t>
+      </w:r>
+    </w:p>
+    <w:tbl>
+      <w:tblPr>
+        <w:tblW w:type="dxa" w:w="3780"/>
+        <w:tblBorders>
+          <w:top w:val="single" w:color="auto" w:sz="4"/>
+          <w:left w:val="single" w:color="auto" w:sz="4"/>
+          <w:bottom w:val="single" w:color="auto" w:sz="4"/>
+          <w:right w:val="single" w:color="auto" w:sz="4"/>
+          <w:insideH w:val="single" w:color="auto" w:sz="4"/>
+          <w:insideV w:val="single" w:color="auto" w:sz="4"/>
+        </w:tblBorders>
+      </w:tblPr>
+      <w:tblGrid>
+        <w:gridCol w:w="1500"/>
+        <w:gridCol w:w="760"/>
+        <w:gridCol w:w="760"/>
+        <w:gridCol w:w="760"/>
+      </w:tblGrid>
+      <w:tr>
+        <w:tc>
+          <w:tcPr>
+            <w:tcW w:type="dxa" w:w="1500"/>
+            <w:tcBorders>
+              <w:top w:val="single" w:color="000000" w:sz="4"/>
+              <w:left w:val="none" w:color="FFFFFF" w:sz="0"/>
+              <w:bottom w:val="single" w:color="000000" w:sz="4"/>
+              <w:right w:val="none" w:color="FFFFFF" w:sz="0"/>
+            </w:tcBorders>
+            <w:tcMar>
+              <w:top w:type="dxa" w:w="25"/>
+              <w:left w:type="dxa" w:w="40"/>
+              <w:bottom w:type="dxa" w:w="25"/>
+              <w:right w:type="dxa" w:w="40"/>
+            </w:tcMar>
+          </w:tcPr>
+          <w:p>
+            <w:pPr>
+              <w:jc w:val="left"/>
+            </w:pPr>
+            <w:r>
+              <w:rPr>
+                <w:rFonts w:ascii="Times New Roman" w:cs="Times New Roman" w:eastAsia="Times New Roman" w:hAnsi="Times New Roman"/>
+                <w:b/>
+                <w:bCs/>
+                <w:i w:val="false"/>
+                <w:iCs w:val="false"/>
+                <w:smallCaps w:val="false"/>
+                <w:sz w:val="16"/>
+                <w:szCs w:val="16"/>
+              </w:rPr>
+              <w:t xml:space="preserve">Judge pair</w:t>
+            </w:r>
+          </w:p>
+        </w:tc>
+        <w:tc>
+          <w:tcPr>
+            <w:tcW w:type="dxa" w:w="760"/>
+            <w:tcBorders>
+              <w:top w:val="single" w:color="000000" w:sz="4"/>
+              <w:left w:val="none" w:color="FFFFFF" w:sz="0"/>
+              <w:bottom w:val="single" w:color="000000" w:sz="4"/>
+              <w:right w:val="none" w:color="FFFFFF" w:sz="0"/>
+            </w:tcBorders>
+            <w:tcMar>
+              <w:top w:type="dxa" w:w="25"/>
+              <w:left w:type="dxa" w:w="40"/>
+              <w:bottom w:type="dxa" w:w="25"/>
+              <w:right w:type="dxa" w:w="40"/>
+            </w:tcMar>
+          </w:tcPr>
+          <w:p>
+            <w:pPr>
+              <w:jc w:val="center"/>
+            </w:pPr>
+            <w:r>
+              <w:rPr>
+                <w:rFonts w:ascii="Times New Roman" w:cs="Times New Roman" w:eastAsia="Times New Roman" w:hAnsi="Times New Roman"/>
+                <w:b/>
+                <w:bCs/>
+                <w:i w:val="false"/>
+                <w:iCs w:val="false"/>
+                <w:smallCaps w:val="false"/>
+                <w:sz w:val="16"/>
+                <w:szCs w:val="16"/>
+              </w:rPr>
+              <w:t xml:space="preserve">Intent</w:t>
+            </w:r>
+          </w:p>
+        </w:tc>
+        <w:tc>
+          <w:tcPr>
+            <w:tcW w:type="dxa" w:w="760"/>
+            <w:tcBorders>
+              <w:top w:val="single" w:color="000000" w:sz="4"/>
+              <w:left w:val="none" w:color="FFFFFF" w:sz="0"/>
+              <w:bottom w:val="single" w:color="000000" w:sz="4"/>
+              <w:right w:val="none" w:color="FFFFFF" w:sz="0"/>
+            </w:tcBorders>
+            <w:tcMar>
+              <w:top w:type="dxa" w:w="25"/>
+              <w:left w:type="dxa" w:w="40"/>
+              <w:bottom w:type="dxa" w:w="25"/>
+              <w:right w:type="dxa" w:w="40"/>
+            </w:tcMar>
+          </w:tcPr>
+          <w:p>
+            <w:pPr>
+              <w:jc w:val="center"/>
+            </w:pPr>
+            <w:r>
+              <w:rPr>
+                <w:rFonts w:ascii="Times New Roman" w:cs="Times New Roman" w:eastAsia="Times New Roman" w:hAnsi="Times New Roman"/>
+                <w:b/>
+                <w:bCs/>
+                <w:i w:val="false"/>
+                <w:iCs w:val="false"/>
+                <w:smallCaps w:val="false"/>
+                <w:sz w:val="16"/>
+                <w:szCs w:val="16"/>
+              </w:rPr>
+              <w:t xml:space="preserve">Defect</w:t>
+            </w:r>
+          </w:p>
+        </w:tc>
+        <w:tc>
+          <w:tcPr>
+            <w:tcW w:type="dxa" w:w="760"/>
+            <w:tcBorders>
+              <w:top w:val="single" w:color="000000" w:sz="4"/>
+              <w:left w:val="none" w:color="FFFFFF" w:sz="0"/>
+              <w:bottom w:val="single" w:color="000000" w:sz="4"/>
+              <w:right w:val="none" w:color="FFFFFF" w:sz="0"/>
+            </w:tcBorders>
+            <w:tcMar>
+              <w:top w:type="dxa" w:w="25"/>
+              <w:left w:type="dxa" w:w="40"/>
+              <w:bottom w:type="dxa" w:w="25"/>
+              <w:right w:type="dxa" w:w="40"/>
+            </w:tcMar>
+          </w:tcPr>
+          <w:p>
+            <w:pPr>
+              <w:jc w:val="center"/>
+            </w:pPr>
+            <w:r>
+              <w:rPr>
+                <w:rFonts w:ascii="Times New Roman" w:cs="Times New Roman" w:eastAsia="Times New Roman" w:hAnsi="Times New Roman"/>
+                <w:b/>
+                <w:bCs/>
+                <w:i w:val="false"/>
+                <w:iCs w:val="false"/>
+                <w:smallCaps w:val="false"/>
+                <w:sz w:val="16"/>
+                <w:szCs w:val="16"/>
+              </w:rPr>
+              <w:t xml:space="preserve">False alarm</w:t>
+            </w:r>
+          </w:p>
+        </w:tc>
+      </w:tr>
+      <w:tr>
+        <w:tc>
+          <w:tcPr>
+            <w:tcW w:type="dxa" w:w="1500"/>
+            <w:tcBorders>
+              <w:top w:val="none" w:color="FFFFFF" w:sz="0"/>
+              <w:left w:val="none" w:color="FFFFFF" w:sz="0"/>
+              <w:bottom w:val="none" w:color="FFFFFF" w:sz="0"/>
+              <w:right w:val="none" w:color="FFFFFF" w:sz="0"/>
+            </w:tcBorders>
+            <w:tcMar>
+              <w:top w:type="dxa" w:w="25"/>
+              <w:left w:type="dxa" w:w="40"/>
+              <w:bottom w:type="dxa" w:w="25"/>
+              <w:right w:type="dxa" w:w="40"/>
+            </w:tcMar>
+          </w:tcPr>
+          <w:p>
+            <w:pPr>
+              <w:jc w:val="left"/>
+            </w:pPr>
+            <w:r>
+              <w:rPr>
+                <w:rFonts w:ascii="Times New Roman" w:cs="Times New Roman" w:eastAsia="Times New Roman" w:hAnsi="Times New Roman"/>
+                <w:b w:val="false"/>
+                <w:bCs w:val="false"/>
+                <w:i w:val="false"/>
+                <w:iCs w:val="false"/>
+                <w:smallCaps w:val="false"/>
+                <w:sz w:val="16"/>
+                <w:szCs w:val="16"/>
+              </w:rPr>
+              <w:t xml:space="preserve">v2: gemma-4-31b-it vs agent</w:t>
+            </w:r>
+          </w:p>
+        </w:tc>
+        <w:tc>
+          <w:tcPr>
+            <w:tcW w:type="dxa" w:w="760"/>
+            <w:tcBorders>
+              <w:top w:val="none" w:color="FFFFFF" w:sz="0"/>
+              <w:left w:val="none" w:color="FFFFFF" w:sz="0"/>
+              <w:bottom w:val="none" w:color="FFFFFF" w:sz="0"/>
+              <w:right w:val="none" w:color="FFFFFF" w:sz="0"/>
+            </w:tcBorders>
+            <w:tcMar>
+              <w:top w:type="dxa" w:w="25"/>
+              <w:left w:type="dxa" w:w="40"/>
+              <w:bottom w:type="dxa" w:w="25"/>
+              <w:right w:type="dxa" w:w="40"/>
+            </w:tcMar>
+          </w:tcPr>
+          <w:p>
+            <w:pPr>
+              <w:jc w:val="center"/>
+            </w:pPr>
+            <w:r>
+              <w:rPr>
+                <w:rFonts w:ascii="Times New Roman" w:cs="Times New Roman" w:eastAsia="Times New Roman" w:hAnsi="Times New Roman"/>
+                <w:b w:val="false"/>
+                <w:bCs w:val="false"/>
+                <w:i w:val="false"/>
+                <w:iCs w:val="false"/>
+                <w:smallCaps w:val="false"/>
+                <w:sz w:val="16"/>
+                <w:szCs w:val="16"/>
+              </w:rPr>
+              <w:t xml:space="preserve">89% / 0.40 / 108</w:t>
+            </w:r>
+          </w:p>
+        </w:tc>
+        <w:tc>
+          <w:tcPr>
+            <w:tcW w:type="dxa" w:w="760"/>
+            <w:tcBorders>
+              <w:top w:val="none" w:color="FFFFFF" w:sz="0"/>
+              <w:left w:val="none" w:color="FFFFFF" w:sz="0"/>
+              <w:bottom w:val="none" w:color="FFFFFF" w:sz="0"/>
+              <w:right w:val="none" w:color="FFFFFF" w:sz="0"/>
+            </w:tcBorders>
+            <w:tcMar>
+              <w:top w:type="dxa" w:w="25"/>
+              <w:left w:type="dxa" w:w="40"/>
+              <w:bottom w:type="dxa" w:w="25"/>
+              <w:right w:type="dxa" w:w="40"/>
+            </w:tcMar>
+          </w:tcPr>
+          <w:p>
+            <w:pPr>
+              <w:jc w:val="center"/>
+            </w:pPr>
+            <w:r>
+              <w:rPr>
+                <w:rFonts w:ascii="Times New Roman" w:cs="Times New Roman" w:eastAsia="Times New Roman" w:hAnsi="Times New Roman"/>
+                <w:b w:val="false"/>
+                <w:bCs w:val="false"/>
+                <w:i w:val="false"/>
+                <w:iCs w:val="false"/>
+                <w:smallCaps w:val="false"/>
+                <w:sz w:val="16"/>
+                <w:szCs w:val="16"/>
+              </w:rPr>
+              <w:t xml:space="preserve">99% / 0.88 / 108</w:t>
+            </w:r>
+          </w:p>
+        </w:tc>
+        <w:tc>
+          <w:tcPr>
+            <w:tcW w:type="dxa" w:w="760"/>
+            <w:tcBorders>
+              <w:top w:val="none" w:color="FFFFFF" w:sz="0"/>
+              <w:left w:val="none" w:color="FFFFFF" w:sz="0"/>
+              <w:bottom w:val="none" w:color="FFFFFF" w:sz="0"/>
+              <w:right w:val="none" w:color="FFFFFF" w:sz="0"/>
+            </w:tcBorders>
+            <w:tcMar>
+              <w:top w:type="dxa" w:w="25"/>
+              <w:left w:type="dxa" w:w="40"/>
+              <w:bottom w:type="dxa" w:w="25"/>
+              <w:right w:type="dxa" w:w="40"/>
+            </w:tcMar>
+          </w:tcPr>
+          <w:p>
+            <w:pPr>
+              <w:jc w:val="center"/>
+            </w:pPr>
+            <w:r>
+              <w:rPr>
+                <w:rFonts w:ascii="Times New Roman" w:cs="Times New Roman" w:eastAsia="Times New Roman" w:hAnsi="Times New Roman"/>
+                <w:b w:val="false"/>
+                <w:bCs w:val="false"/>
+                <w:i w:val="false"/>
+                <w:iCs w:val="false"/>
+                <w:smallCaps w:val="false"/>
+                <w:sz w:val="16"/>
+                <w:szCs w:val="16"/>
+              </w:rPr>
+              <w:t xml:space="preserve">100% / 1.00 / 108</w:t>
+            </w:r>
+          </w:p>
+        </w:tc>
+      </w:tr>
+      <w:tr>
+        <w:tc>
+          <w:tcPr>
+            <w:tcW w:type="dxa" w:w="1500"/>
+            <w:tcBorders>
+              <w:top w:val="none" w:color="FFFFFF" w:sz="0"/>
+              <w:left w:val="none" w:color="FFFFFF" w:sz="0"/>
+              <w:bottom w:val="none" w:color="FFFFFF" w:sz="0"/>
+              <w:right w:val="none" w:color="FFFFFF" w:sz="0"/>
+            </w:tcBorders>
+            <w:tcMar>
+              <w:top w:type="dxa" w:w="25"/>
+              <w:left w:type="dxa" w:w="40"/>
+              <w:bottom w:type="dxa" w:w="25"/>
+              <w:right w:type="dxa" w:w="40"/>
+            </w:tcMar>
+          </w:tcPr>
+          <w:p>
+            <w:pPr>
+              <w:jc w:val="left"/>
+            </w:pPr>
+            <w:r>
+              <w:rPr>
+                <w:rFonts w:ascii="Times New Roman" w:cs="Times New Roman" w:eastAsia="Times New Roman" w:hAnsi="Times New Roman"/>
+                <w:b w:val="false"/>
+                <w:bCs w:val="false"/>
+                <w:i w:val="false"/>
+                <w:iCs w:val="false"/>
+                <w:smallCaps w:val="false"/>
+                <w:sz w:val="16"/>
+                <w:szCs w:val="16"/>
+              </w:rPr>
+              <w:t xml:space="preserve">v2: Gemini web vs agent</w:t>
+            </w:r>
+          </w:p>
+        </w:tc>
+        <w:tc>
+          <w:tcPr>
+            <w:tcW w:type="dxa" w:w="760"/>
+            <w:tcBorders>
+              <w:top w:val="none" w:color="FFFFFF" w:sz="0"/>
+              <w:left w:val="none" w:color="FFFFFF" w:sz="0"/>
+              <w:bottom w:val="none" w:color="FFFFFF" w:sz="0"/>
+              <w:right w:val="none" w:color="FFFFFF" w:sz="0"/>
+            </w:tcBorders>
+            <w:tcMar>
+              <w:top w:type="dxa" w:w="25"/>
+              <w:left w:type="dxa" w:w="40"/>
+              <w:bottom w:type="dxa" w:w="25"/>
+              <w:right w:type="dxa" w:w="40"/>
+            </w:tcMar>
+          </w:tcPr>
+          <w:p>
+            <w:pPr>
+              <w:jc w:val="center"/>
+            </w:pPr>
+            <w:r>
+              <w:rPr>
+                <w:rFonts w:ascii="Times New Roman" w:cs="Times New Roman" w:eastAsia="Times New Roman" w:hAnsi="Times New Roman"/>
+                <w:b w:val="false"/>
+                <w:bCs w:val="false"/>
+                <w:i w:val="false"/>
+                <w:iCs w:val="false"/>
+                <w:smallCaps w:val="false"/>
+                <w:sz w:val="16"/>
+                <w:szCs w:val="16"/>
+              </w:rPr>
+              <w:t xml:space="preserve">90% / 0.62 / 30</w:t>
+            </w:r>
+          </w:p>
+        </w:tc>
+        <w:tc>
+          <w:tcPr>
+            <w:tcW w:type="dxa" w:w="760"/>
+            <w:tcBorders>
+              <w:top w:val="none" w:color="FFFFFF" w:sz="0"/>
+              <w:left w:val="none" w:color="FFFFFF" w:sz="0"/>
+              <w:bottom w:val="none" w:color="FFFFFF" w:sz="0"/>
+              <w:right w:val="none" w:color="FFFFFF" w:sz="0"/>
+            </w:tcBorders>
+            <w:tcMar>
+              <w:top w:type="dxa" w:w="25"/>
+              <w:left w:type="dxa" w:w="40"/>
+              <w:bottom w:type="dxa" w:w="25"/>
+              <w:right w:type="dxa" w:w="40"/>
+            </w:tcMar>
+          </w:tcPr>
+          <w:p>
+            <w:pPr>
+              <w:jc w:val="center"/>
+            </w:pPr>
+            <w:r>
+              <w:rPr>
+                <w:rFonts w:ascii="Times New Roman" w:cs="Times New Roman" w:eastAsia="Times New Roman" w:hAnsi="Times New Roman"/>
+                <w:b w:val="false"/>
+                <w:bCs w:val="false"/>
+                <w:i w:val="false"/>
+                <w:iCs w:val="false"/>
+                <w:smallCaps w:val="false"/>
+                <w:sz w:val="16"/>
+                <w:szCs w:val="16"/>
+              </w:rPr>
+              <w:t xml:space="preserve">100% / 1.00 / 30</w:t>
+            </w:r>
+          </w:p>
+        </w:tc>
+        <w:tc>
+          <w:tcPr>
+            <w:tcW w:type="dxa" w:w="760"/>
+            <w:tcBorders>
+              <w:top w:val="none" w:color="FFFFFF" w:sz="0"/>
+              <w:left w:val="none" w:color="FFFFFF" w:sz="0"/>
+              <w:bottom w:val="none" w:color="FFFFFF" w:sz="0"/>
+              <w:right w:val="none" w:color="FFFFFF" w:sz="0"/>
+            </w:tcBorders>
+            <w:tcMar>
+              <w:top w:type="dxa" w:w="25"/>
+              <w:left w:type="dxa" w:w="40"/>
+              <w:bottom w:type="dxa" w:w="25"/>
+              <w:right w:type="dxa" w:w="40"/>
+            </w:tcMar>
+          </w:tcPr>
+          <w:p>
+            <w:pPr>
+              <w:jc w:val="center"/>
+            </w:pPr>
+            <w:r>
+              <w:rPr>
+                <w:rFonts w:ascii="Times New Roman" w:cs="Times New Roman" w:eastAsia="Times New Roman" w:hAnsi="Times New Roman"/>
+                <w:b w:val="false"/>
+                <w:bCs w:val="false"/>
+                <w:i w:val="false"/>
+                <w:iCs w:val="false"/>
+                <w:smallCaps w:val="false"/>
+                <w:sz w:val="16"/>
+                <w:szCs w:val="16"/>
+              </w:rPr>
+              <w:t xml:space="preserve">100% / 1.00 / 30</w:t>
+            </w:r>
+          </w:p>
+        </w:tc>
+      </w:tr>
+      <w:tr>
+        <w:tc>
+          <w:tcPr>
+            <w:tcW w:type="dxa" w:w="1500"/>
+            <w:tcBorders>
+              <w:top w:val="none" w:color="FFFFFF" w:sz="0"/>
+              <w:left w:val="none" w:color="FFFFFF" w:sz="0"/>
+              <w:bottom w:val="none" w:color="FFFFFF" w:sz="0"/>
+              <w:right w:val="none" w:color="FFFFFF" w:sz="0"/>
+            </w:tcBorders>
+            <w:tcMar>
+              <w:top w:type="dxa" w:w="25"/>
+              <w:left w:type="dxa" w:w="40"/>
+              <w:bottom w:type="dxa" w:w="25"/>
+              <w:right w:type="dxa" w:w="40"/>
+            </w:tcMar>
+          </w:tcPr>
+          <w:p>
+            <w:pPr>
+              <w:jc w:val="left"/>
+            </w:pPr>
+            <w:r>
+              <w:rPr>
+                <w:rFonts w:ascii="Times New Roman" w:cs="Times New Roman" w:eastAsia="Times New Roman" w:hAnsi="Times New Roman"/>
+                <w:b w:val="false"/>
+                <w:bCs w:val="false"/>
+                <w:i w:val="false"/>
+                <w:iCs w:val="false"/>
+                <w:smallCaps w:val="false"/>
+                <w:sz w:val="16"/>
+                <w:szCs w:val="16"/>
+              </w:rPr>
+              <w:t xml:space="preserve">v2: Gemini web vs gemma-4-31b-it</w:t>
+            </w:r>
+          </w:p>
+        </w:tc>
+        <w:tc>
+          <w:tcPr>
+            <w:tcW w:type="dxa" w:w="760"/>
+            <w:tcBorders>
+              <w:top w:val="none" w:color="FFFFFF" w:sz="0"/>
+              <w:left w:val="none" w:color="FFFFFF" w:sz="0"/>
+              <w:bottom w:val="none" w:color="FFFFFF" w:sz="0"/>
+              <w:right w:val="none" w:color="FFFFFF" w:sz="0"/>
+            </w:tcBorders>
+            <w:tcMar>
+              <w:top w:type="dxa" w:w="25"/>
+              <w:left w:type="dxa" w:w="40"/>
+              <w:bottom w:type="dxa" w:w="25"/>
+              <w:right w:type="dxa" w:w="40"/>
+            </w:tcMar>
+          </w:tcPr>
+          <w:p>
+            <w:pPr>
+              <w:jc w:val="center"/>
+            </w:pPr>
+            <w:r>
+              <w:rPr>
+                <w:rFonts w:ascii="Times New Roman" w:cs="Times New Roman" w:eastAsia="Times New Roman" w:hAnsi="Times New Roman"/>
+                <w:b w:val="false"/>
+                <w:bCs w:val="false"/>
+                <w:i w:val="false"/>
+                <w:iCs w:val="false"/>
+                <w:smallCaps w:val="false"/>
+                <w:sz w:val="16"/>
+                <w:szCs w:val="16"/>
+              </w:rPr>
+              <w:t xml:space="preserve">87% / 0.52 / 30</w:t>
+            </w:r>
+          </w:p>
+        </w:tc>
+        <w:tc>
+          <w:tcPr>
+            <w:tcW w:type="dxa" w:w="760"/>
+            <w:tcBorders>
+              <w:top w:val="none" w:color="FFFFFF" w:sz="0"/>
+              <w:left w:val="none" w:color="FFFFFF" w:sz="0"/>
+              <w:bottom w:val="none" w:color="FFFFFF" w:sz="0"/>
+              <w:right w:val="none" w:color="FFFFFF" w:sz="0"/>
+            </w:tcBorders>
+            <w:tcMar>
+              <w:top w:type="dxa" w:w="25"/>
+              <w:left w:type="dxa" w:w="40"/>
+              <w:bottom w:type="dxa" w:w="25"/>
+              <w:right w:type="dxa" w:w="40"/>
+            </w:tcMar>
+          </w:tcPr>
+          <w:p>
+            <w:pPr>
+              <w:jc w:val="center"/>
+            </w:pPr>
+            <w:r>
+              <w:rPr>
+                <w:rFonts w:ascii="Times New Roman" w:cs="Times New Roman" w:eastAsia="Times New Roman" w:hAnsi="Times New Roman"/>
+                <w:b w:val="false"/>
+                <w:bCs w:val="false"/>
+                <w:i w:val="false"/>
+                <w:iCs w:val="false"/>
+                <w:smallCaps w:val="false"/>
+                <w:sz w:val="16"/>
+                <w:szCs w:val="16"/>
+              </w:rPr>
+              <w:t xml:space="preserve">97% / 0.65 / 30</w:t>
+            </w:r>
+          </w:p>
+        </w:tc>
+        <w:tc>
+          <w:tcPr>
+            <w:tcW w:type="dxa" w:w="760"/>
+            <w:tcBorders>
+              <w:top w:val="none" w:color="FFFFFF" w:sz="0"/>
+              <w:left w:val="none" w:color="FFFFFF" w:sz="0"/>
+              <w:bottom w:val="none" w:color="FFFFFF" w:sz="0"/>
+              <w:right w:val="none" w:color="FFFFFF" w:sz="0"/>
+            </w:tcBorders>
+            <w:tcMar>
+              <w:top w:type="dxa" w:w="25"/>
+              <w:left w:type="dxa" w:w="40"/>
+              <w:bottom w:type="dxa" w:w="25"/>
+              <w:right w:type="dxa" w:w="40"/>
+            </w:tcMar>
+          </w:tcPr>
+          <w:p>
+            <w:pPr>
+              <w:jc w:val="center"/>
+            </w:pPr>
+            <w:r>
+              <w:rPr>
+                <w:rFonts w:ascii="Times New Roman" w:cs="Times New Roman" w:eastAsia="Times New Roman" w:hAnsi="Times New Roman"/>
+                <w:b w:val="false"/>
+                <w:bCs w:val="false"/>
+                <w:i w:val="false"/>
+                <w:iCs w:val="false"/>
+                <w:smallCaps w:val="false"/>
+                <w:sz w:val="16"/>
+                <w:szCs w:val="16"/>
+              </w:rPr>
+              <w:t xml:space="preserve">100% / 1.00 / 30</w:t>
+            </w:r>
+          </w:p>
+        </w:tc>
+      </w:tr>
+      <w:tr>
+        <w:tc>
+          <w:tcPr>
+            <w:tcW w:type="dxa" w:w="1500"/>
+            <w:tcBorders>
+              <w:top w:val="none" w:color="FFFFFF" w:sz="0"/>
+              <w:left w:val="none" w:color="FFFFFF" w:sz="0"/>
+              <w:bottom w:val="single" w:color="000000" w:sz="4"/>
+              <w:right w:val="none" w:color="FFFFFF" w:sz="0"/>
+            </w:tcBorders>
+            <w:tcMar>
+              <w:top w:type="dxa" w:w="25"/>
+              <w:left w:type="dxa" w:w="40"/>
+              <w:bottom w:type="dxa" w:w="25"/>
+              <w:right w:type="dxa" w:w="40"/>
+            </w:tcMar>
+          </w:tcPr>
+          <w:p>
+            <w:pPr>
+              <w:jc w:val="left"/>
+            </w:pPr>
+            <w:r>
+              <w:rPr>
+                <w:rFonts w:ascii="Times New Roman" w:cs="Times New Roman" w:eastAsia="Times New Roman" w:hAnsi="Times New Roman"/>
+                <w:b w:val="false"/>
+                <w:bCs w:val="false"/>
+                <w:i w:val="false"/>
+                <w:iCs w:val="false"/>
+                <w:smallCaps w:val="false"/>
+                <w:sz w:val="16"/>
+                <w:szCs w:val="16"/>
+              </w:rPr>
+              <w:t xml:space="preserve">v3: llama3.2:3b vs agent</w:t>
+            </w:r>
+          </w:p>
+        </w:tc>
+        <w:tc>
+          <w:tcPr>
+            <w:tcW w:type="dxa" w:w="760"/>
+            <w:tcBorders>
+              <w:top w:val="none" w:color="FFFFFF" w:sz="0"/>
+              <w:left w:val="none" w:color="FFFFFF" w:sz="0"/>
+              <w:bottom w:val="single" w:color="000000" w:sz="4"/>
+              <w:right w:val="none" w:color="FFFFFF" w:sz="0"/>
+            </w:tcBorders>
+            <w:tcMar>
+              <w:top w:type="dxa" w:w="25"/>
+              <w:left w:type="dxa" w:w="40"/>
+              <w:bottom w:type="dxa" w:w="25"/>
+              <w:right w:type="dxa" w:w="40"/>
+            </w:tcMar>
+          </w:tcPr>
+          <w:p>
+            <w:pPr>
+              <w:jc w:val="center"/>
+            </w:pPr>
+            <w:r>
+              <w:rPr>
+                <w:rFonts w:ascii="Times New Roman" w:cs="Times New Roman" w:eastAsia="Times New Roman" w:hAnsi="Times New Roman"/>
+                <w:b w:val="false"/>
+                <w:bCs w:val="false"/>
+                <w:i w:val="false"/>
+                <w:iCs w:val="false"/>
+                <w:smallCaps w:val="false"/>
+                <w:sz w:val="16"/>
+                <w:szCs w:val="16"/>
+              </w:rPr>
+              <w:t xml:space="preserve">68% / 0.20 / 288</w:t>
+            </w:r>
+          </w:p>
+        </w:tc>
+        <w:tc>
+          <w:tcPr>
+            <w:tcW w:type="dxa" w:w="760"/>
+            <w:tcBorders>
+              <w:top w:val="none" w:color="FFFFFF" w:sz="0"/>
+              <w:left w:val="none" w:color="FFFFFF" w:sz="0"/>
+              <w:bottom w:val="single" w:color="000000" w:sz="4"/>
+              <w:right w:val="none" w:color="FFFFFF" w:sz="0"/>
+            </w:tcBorders>
+            <w:tcMar>
+              <w:top w:type="dxa" w:w="25"/>
+              <w:left w:type="dxa" w:w="40"/>
+              <w:bottom w:type="dxa" w:w="25"/>
+              <w:right w:type="dxa" w:w="40"/>
+            </w:tcMar>
+          </w:tcPr>
+          <w:p>
+            <w:pPr>
+              <w:jc w:val="center"/>
+            </w:pPr>
+            <w:r>
+              <w:rPr>
+                <w:rFonts w:ascii="Times New Roman" w:cs="Times New Roman" w:eastAsia="Times New Roman" w:hAnsi="Times New Roman"/>
+                <w:b w:val="false"/>
+                <w:bCs w:val="false"/>
+                <w:i w:val="false"/>
+                <w:iCs w:val="false"/>
+                <w:smallCaps w:val="false"/>
+                <w:sz w:val="16"/>
+                <w:szCs w:val="16"/>
+              </w:rPr>
+              <w:t xml:space="preserve">93% / 0.06 / 288</w:t>
+            </w:r>
+          </w:p>
+        </w:tc>
+        <w:tc>
+          <w:tcPr>
+            <w:tcW w:type="dxa" w:w="760"/>
+            <w:tcBorders>
+              <w:top w:val="none" w:color="FFFFFF" w:sz="0"/>
+              <w:left w:val="none" w:color="FFFFFF" w:sz="0"/>
+              <w:bottom w:val="single" w:color="000000" w:sz="4"/>
+              <w:right w:val="none" w:color="FFFFFF" w:sz="0"/>
+            </w:tcBorders>
+            <w:tcMar>
+              <w:top w:type="dxa" w:w="25"/>
+              <w:left w:type="dxa" w:w="40"/>
+              <w:bottom w:type="dxa" w:w="25"/>
+              <w:right w:type="dxa" w:w="40"/>
+            </w:tcMar>
+          </w:tcPr>
+          <w:p>
+            <w:pPr>
+              <w:jc w:val="center"/>
+            </w:pPr>
+            <w:r>
+              <w:rPr>
+                <w:rFonts w:ascii="Times New Roman" w:cs="Times New Roman" w:eastAsia="Times New Roman" w:hAnsi="Times New Roman"/>
+                <w:b w:val="false"/>
+                <w:bCs w:val="false"/>
+                <w:i w:val="false"/>
+                <w:iCs w:val="false"/>
+                <w:smallCaps w:val="false"/>
+                <w:sz w:val="16"/>
+                <w:szCs w:val="16"/>
+              </w:rPr>
+              <w:t xml:space="preserve">98% / 0.00 / 288</w:t>
+            </w:r>
+          </w:p>
+        </w:tc>
+      </w:tr>
+    </w:tbl>
+    <w:p>
+      <w:pPr>
+        <w:spacing w:after="60"/>
+      </w:pPr>
+      <w:r>
+        <w:rPr>
+          <w:rFonts w:ascii="Times New Roman" w:cs="Times New Roman" w:eastAsia="Times New Roman" w:hAnsi="Times New Roman"/>
+          <w:b w:val="false"/>
+          <w:bCs w:val="false"/>
+          <w:i w:val="false"/>
+          <w:iCs w:val="false"/>
+          <w:smallCaps w:val="false"/>
+          <w:sz w:val="20"/>
+          <w:szCs w:val="20"/>
+        </w:rPr>
+        <w:t xml:space="preserve"/>
+      </w:r>
+    </w:p>
+    <w:p>
+      <w:pPr>
+        <w:keepNext/>
+        <w:spacing w:after="30" w:before="80"/>
+        <w:jc w:val="center"/>
+      </w:pPr>
+      <w:r>
+        <w:drawing>
+          <wp:inline distT="0" distB="0" distL="0" distR="0">
+            <wp:extent cx="3124200" cy="1419225"/>
+            <wp:effectExtent t="0" r="0" b="0" l="0"/>
+            <wp:docPr id="7" name="" descr="" title=""/>
+            <wp:cNvGraphicFramePr>
+              <a:graphicFrameLocks xmlns:a="http://schemas.openxmlformats.org/drawingml/2006/main" noChangeAspect="1"/>
+            </wp:cNvGraphicFramePr>
+            <a:graphic xmlns:a="http://schemas.openxmlformats.org/drawingml/2006/main">
+              <a:graphicData uri="http://schemas.openxmlformats.org/drawingml/2006/picture">
+                <pic:pic xmlns:pic="http://schemas.openxmlformats.org/drawingml/2006/picture">
+                  <pic:nvPicPr>
+                    <pic:cNvPr id="0" name="" descr=""/>
+                    <pic:cNvPicPr>
+                      <a:picLocks noChangeAspect="1" noChangeArrowheads="1"/>
+                    </pic:cNvPicPr>
+                  </pic:nvPicPr>
+                  <pic:blipFill>
+                    <a:blip r:embed="rId13" cstate="none"/>
+                    <a:srcRect/>
+                    <a:stretch>
+                      <a:fillRect/>
+                    </a:stretch>
+                  </pic:blipFill>
+                  <pic:spPr bwMode="auto">
+                    <a:xfrm>
+                      <a:off x="0" y="0"/>
+                      <a:ext cx="3124200" cy="1419225"/>
+                    </a:xfrm>
+                    <a:prstGeom prst="rect">
+                      <a:avLst/>
+                    </a:prstGeom>
+                  </pic:spPr>
+                </pic:pic>
+              </a:graphicData>
+            </a:graphic>
+          </wp:inline>
+        </w:drawing>
+      </w:r>
+    </w:p>
+    <w:p>
+      <w:pPr>
+        <w:spacing w:after="100"/>
+        <w:jc w:val="both"/>
+      </w:pPr>
+      <w:r>
+        <w:rPr>
+          <w:rFonts w:ascii="Times New Roman" w:cs="Times New Roman" w:eastAsia="Times New Roman" w:hAnsi="Times New Roman"/>
+          <w:b w:val="false"/>
+          <w:bCs w:val="false"/>
+          <w:i w:val="false"/>
+          <w:iCs w:val="false"/>
+          <w:smallCaps w:val="false"/>
+          <w:sz w:val="16"/>
+          <w:szCs w:val="16"/>
+        </w:rPr>
+        <w:t xml:space="preserve">Fig. 7.  </w:t>
+      </w:r>
+      <w:r>
+        <w:rPr>
+          <w:rFonts w:ascii="Times New Roman" w:cs="Times New Roman" w:eastAsia="Times New Roman" w:hAnsi="Times New Roman"/>
+          <w:b w:val="false"/>
+          <w:bCs w:val="false"/>
+          <w:i w:val="false"/>
+          <w:iCs w:val="false"/>
+          <w:smallCaps w:val="false"/>
+          <w:sz w:val="16"/>
+          <w:szCs w:val="16"/>
+        </w:rPr>
+        <w:t xml:space="preserve">Cohen's kappa between pairs of AI judges. This is AI-vs-AI agreement, not validation against human scorers.</w:t>
+      </w:r>
+    </w:p>
+    <w:p>
+      <w:pPr>
+        <w:keepNext w:val="false"/>
+        <w:spacing w:after="40" w:before="0" w:line="240"/>
+        <w:ind w:firstLine="202"/>
+        <w:jc w:val="both"/>
+      </w:pPr>
+      <w:r>
+        <w:rPr>
+          <w:rFonts w:ascii="Times New Roman" w:cs="Times New Roman" w:eastAsia="Times New Roman" w:hAnsi="Times New Roman"/>
+          <w:b w:val="false"/>
+          <w:bCs w:val="false"/>
+          <w:i w:val="false"/>
+          <w:iCs w:val="false"/>
+          <w:smallCaps w:val="false"/>
+          <w:sz w:val="20"/>
+          <w:szCs w:val="20"/>
+        </w:rPr>
+        <w:t xml:space="preserve">Against the agent judge, the API judge agreed almost perfectly on defects (kappa 0.88, 99% agreement, n = 108) and on false alarms (kappa 1.00), and was fair on intent (kappa 0.40, 89% agreement, n = 108). The Gemini web app agreed with the agent judge on intent at kappa 0.62, and the three judges agreed on intent for 25 of 30 runs. Re-scoring the original study with the agent judge gave intent floor 86%, treatment 92% and ceiling 100%, and gap recovery 0.40 (interval -0.75 to 1.00, McNemar p = 0.63). The verdict holds: the effect is not significant. The size of gap recovery does not: under the API judge it was 0.17 (interval 0.00 to 0.50). These comparisons are AI-vs-AI agreement, not validation against human scorers.</w:t>
+      </w:r>
+    </w:p>
+    <w:p>
+      <w:pPr>
+        <w:keepNext w:val="false"/>
+        <w:spacing w:after="40" w:before="0" w:line="240"/>
+        <w:ind w:firstLine="202"/>
+        <w:jc w:val="both"/>
+      </w:pPr>
+      <w:r>
+        <w:rPr>
+          <w:rFonts w:ascii="Times New Roman" w:cs="Times New Roman" w:eastAsia="Times New Roman" w:hAnsi="Times New Roman"/>
+          <w:b w:val="false"/>
+          <w:bCs w:val="false"/>
+          <w:i w:val="false"/>
+          <w:iCs w:val="false"/>
+          <w:smallCaps w:val="false"/>
+          <w:sz w:val="20"/>
+          <w:szCs w:val="20"/>
+        </w:rPr>
+        <w:t xml:space="preserve">In the replication, the local judge, llama3.2:3b, is unusable: its agreement with the agent judge was fair on intent (kappa 0.20, 68%, n = 288), slight on defects (kappa 0.06) and slight on false alarms (kappa 0.00). It never flagged a false alarm (total 0) and wrote that no defect was injected on 54 of 96 mutant rows (56%). The Claude agent judge claude-sonnet-agent is therefore the primary judge for the replication. That choice was made after seeing the agreement figures, so it is a post hoc choice. The local judge's own intent result, gap recovery 0.17 (interval -0.31 to 0.52), is reference only, and its intent recovery across the three conditions was 58%, 63% and 83%. All of this is AI-vs-AI agreement. Only the original study's API judge has been checked against human scorers, as reported in Section VII; the replication's judges have not.</w:t>
+      </w:r>
+    </w:p>
+    <w:p>
+      <w:pPr>
+        <w:keepNext/>
+        <w:spacing w:after="40" w:before="80"/>
+      </w:pPr>
+      <w:r>
+        <w:rPr>
+          <w:rFonts w:ascii="Times New Roman" w:cs="Times New Roman" w:eastAsia="Times New Roman" w:hAnsi="Times New Roman"/>
+          <w:b w:val="false"/>
+          <w:bCs w:val="false"/>
+          <w:i/>
+          <w:iCs/>
+          <w:smallCaps w:val="false"/>
+          <w:sz w:val="20"/>
+          <w:szCs w:val="20"/>
+        </w:rPr>
+        <w:t xml:space="preserve">H. The replication set on the original reviewer</w:t>
+      </w:r>
+    </w:p>
+    <w:p>
+      <w:pPr>
+        <w:keepNext w:val="false"/>
+        <w:spacing w:after="40" w:before="0" w:line="240"/>
+        <w:ind w:firstLine="202"/>
+        <w:jc w:val="both"/>
+      </w:pPr>
+      <w:r>
+        <w:rPr>
+          <w:rFonts w:ascii="Times New Roman" w:cs="Times New Roman" w:eastAsia="Times New Roman" w:hAnsi="Times New Roman"/>
+          <w:b w:val="false"/>
+          <w:bCs w:val="false"/>
+          <w:i w:val="false"/>
+          <w:iCs w:val="false"/>
+          <w:smallCaps w:val="false"/>
+          <w:sz w:val="20"/>
+          <w:szCs w:val="20"/>
+        </w:rPr>
+        <w:t xml:space="preserve">Sections V-B and V-F differ in rows and reviewer at once. To separate the two, all 96 rows of the replication set were also run on the original reviewer (gemini-3.5-flash-lite) with the original question, author and judge models (gemma-4-31b-it). 94 rows completed all three conditions; for the other 2 the question model failed with a server error on every attempt.</w:t>
+      </w:r>
+    </w:p>
+    <w:p>
+      <w:pPr>
+        <w:keepNext/>
+        <w:spacing w:after="0" w:before="100"/>
+        <w:jc w:val="center"/>
+      </w:pPr>
+      <w:r>
+        <w:rPr>
+          <w:rFonts w:ascii="Times New Roman" w:cs="Times New Roman" w:eastAsia="Times New Roman" w:hAnsi="Times New Roman"/>
+          <w:b w:val="false"/>
+          <w:bCs w:val="false"/>
+          <w:i w:val="false"/>
+          <w:iCs w:val="false"/>
+          <w:smallCaps w:val="false"/>
+          <w:sz w:val="16"/>
+          <w:szCs w:val="16"/>
+        </w:rPr>
+        <w:t xml:space="preserve">TABLE V</w:t>
+      </w:r>
+    </w:p>
+    <w:p>
+      <w:pPr>
+        <w:keepNext/>
+        <w:spacing w:after="40"/>
+        <w:jc w:val="center"/>
+      </w:pPr>
+      <w:r>
+        <w:rPr>
+          <w:rFonts w:ascii="Times New Roman" w:cs="Times New Roman" w:eastAsia="Times New Roman" w:hAnsi="Times New Roman"/>
+          <w:b w:val="false"/>
+          <w:bCs w:val="false"/>
+          <w:i w:val="false"/>
+          <w:iCs w:val="false"/>
+          <w:smallCaps/>
+          <w:sz w:val="16"/>
+          <w:szCs w:val="16"/>
+        </w:rPr>
+        <w:t xml:space="preserve">Judged outcomes, replication set on the original reviewer</w:t>
+      </w:r>
+    </w:p>
+    <w:tbl>
+      <w:tblPr>
+        <w:tblW w:type="dxa" w:w="4340"/>
+        <w:tblBorders>
+          <w:top w:val="single" w:color="auto" w:sz="4"/>
+          <w:left w:val="single" w:color="auto" w:sz="4"/>
+          <w:bottom w:val="single" w:color="auto" w:sz="4"/>
+          <w:right w:val="single" w:color="auto" w:sz="4"/>
+          <w:insideH w:val="single" w:color="auto" w:sz="4"/>
+          <w:insideV w:val="single" w:color="auto" w:sz="4"/>
+        </w:tblBorders>
+      </w:tblPr>
+      <w:tblGrid>
+        <w:gridCol w:w="1500"/>
+        <w:gridCol w:w="760"/>
+        <w:gridCol w:w="760"/>
+        <w:gridCol w:w="760"/>
+        <w:gridCol w:w="560"/>
+      </w:tblGrid>
+      <w:tr>
+        <w:tc>
+          <w:tcPr>
+            <w:tcW w:type="dxa" w:w="1500"/>
+            <w:tcBorders>
+              <w:top w:val="single" w:color="000000" w:sz="4"/>
+              <w:left w:val="none" w:color="FFFFFF" w:sz="0"/>
+              <w:bottom w:val="single" w:color="000000" w:sz="4"/>
+              <w:right w:val="none" w:color="FFFFFF" w:sz="0"/>
+            </w:tcBorders>
+            <w:tcMar>
+              <w:top w:type="dxa" w:w="25"/>
+              <w:left w:type="dxa" w:w="40"/>
+              <w:bottom w:type="dxa" w:w="25"/>
+              <w:right w:type="dxa" w:w="40"/>
+            </w:tcMar>
+          </w:tcPr>
+          <w:p>
+            <w:pPr>
+              <w:jc w:val="left"/>
+            </w:pPr>
+            <w:r>
+              <w:rPr>
+                <w:rFonts w:ascii="Times New Roman" w:cs="Times New Roman" w:eastAsia="Times New Roman" w:hAnsi="Times New Roman"/>
+                <w:b/>
+                <w:bCs/>
+                <w:i w:val="false"/>
+                <w:iCs w:val="false"/>
+                <w:smallCaps w:val="false"/>
+                <w:sz w:val="16"/>
+                <w:szCs w:val="16"/>
+              </w:rPr>
+              <w:t xml:space="preserve">Measure</w:t>
+            </w:r>
+          </w:p>
+        </w:tc>
+        <w:tc>
+          <w:tcPr>
+            <w:tcW w:type="dxa" w:w="760"/>
+            <w:tcBorders>
+              <w:top w:val="single" w:color="000000" w:sz="4"/>
+              <w:left w:val="none" w:color="FFFFFF" w:sz="0"/>
+              <w:bottom w:val="single" w:color="000000" w:sz="4"/>
+              <w:right w:val="none" w:color="FFFFFF" w:sz="0"/>
+            </w:tcBorders>
+            <w:tcMar>
+              <w:top w:type="dxa" w:w="25"/>
+              <w:left w:type="dxa" w:w="40"/>
+              <w:bottom w:type="dxa" w:w="25"/>
+              <w:right w:type="dxa" w:w="40"/>
+            </w:tcMar>
+          </w:tcPr>
+          <w:p>
+            <w:pPr>
+              <w:jc w:val="center"/>
+            </w:pPr>
+            <w:r>
+              <w:rPr>
+                <w:rFonts w:ascii="Times New Roman" w:cs="Times New Roman" w:eastAsia="Times New Roman" w:hAnsi="Times New Roman"/>
+                <w:b/>
+                <w:bCs/>
+                <w:i w:val="false"/>
+                <w:iCs w:val="false"/>
+                <w:smallCaps w:val="false"/>
+                <w:sz w:val="16"/>
+                <w:szCs w:val="16"/>
+              </w:rPr>
+              <w:t xml:space="preserve">Floor</w:t>
+            </w:r>
+          </w:p>
+        </w:tc>
+        <w:tc>
+          <w:tcPr>
+            <w:tcW w:type="dxa" w:w="760"/>
+            <w:tcBorders>
+              <w:top w:val="single" w:color="000000" w:sz="4"/>
+              <w:left w:val="none" w:color="FFFFFF" w:sz="0"/>
+              <w:bottom w:val="single" w:color="000000" w:sz="4"/>
+              <w:right w:val="none" w:color="FFFFFF" w:sz="0"/>
+            </w:tcBorders>
+            <w:tcMar>
+              <w:top w:type="dxa" w:w="25"/>
+              <w:left w:type="dxa" w:w="40"/>
+              <w:bottom w:type="dxa" w:w="25"/>
+              <w:right w:type="dxa" w:w="40"/>
+            </w:tcMar>
+          </w:tcPr>
+          <w:p>
+            <w:pPr>
+              <w:jc w:val="center"/>
+            </w:pPr>
+            <w:r>
+              <w:rPr>
+                <w:rFonts w:ascii="Times New Roman" w:cs="Times New Roman" w:eastAsia="Times New Roman" w:hAnsi="Times New Roman"/>
+                <w:b/>
+                <w:bCs/>
+                <w:i w:val="false"/>
+                <w:iCs w:val="false"/>
+                <w:smallCaps w:val="false"/>
+                <w:sz w:val="16"/>
+                <w:szCs w:val="16"/>
+              </w:rPr>
+              <w:t xml:space="preserve">Treat.</w:t>
+            </w:r>
+          </w:p>
+        </w:tc>
+        <w:tc>
+          <w:tcPr>
+            <w:tcW w:type="dxa" w:w="760"/>
+            <w:tcBorders>
+              <w:top w:val="single" w:color="000000" w:sz="4"/>
+              <w:left w:val="none" w:color="FFFFFF" w:sz="0"/>
+              <w:bottom w:val="single" w:color="000000" w:sz="4"/>
+              <w:right w:val="none" w:color="FFFFFF" w:sz="0"/>
+            </w:tcBorders>
+            <w:tcMar>
+              <w:top w:type="dxa" w:w="25"/>
+              <w:left w:type="dxa" w:w="40"/>
+              <w:bottom w:type="dxa" w:w="25"/>
+              <w:right w:type="dxa" w:w="40"/>
+            </w:tcMar>
+          </w:tcPr>
+          <w:p>
+            <w:pPr>
+              <w:jc w:val="center"/>
+            </w:pPr>
+            <w:r>
+              <w:rPr>
+                <w:rFonts w:ascii="Times New Roman" w:cs="Times New Roman" w:eastAsia="Times New Roman" w:hAnsi="Times New Roman"/>
+                <w:b/>
+                <w:bCs/>
+                <w:i w:val="false"/>
+                <w:iCs w:val="false"/>
+                <w:smallCaps w:val="false"/>
+                <w:sz w:val="16"/>
+                <w:szCs w:val="16"/>
+              </w:rPr>
+              <w:t xml:space="preserve">Ceiling</w:t>
+            </w:r>
+          </w:p>
+        </w:tc>
+        <w:tc>
+          <w:tcPr>
+            <w:tcW w:type="dxa" w:w="560"/>
+            <w:tcBorders>
+              <w:top w:val="single" w:color="000000" w:sz="4"/>
+              <w:left w:val="none" w:color="FFFFFF" w:sz="0"/>
+              <w:bottom w:val="single" w:color="000000" w:sz="4"/>
+              <w:right w:val="none" w:color="FFFFFF" w:sz="0"/>
+            </w:tcBorders>
+            <w:tcMar>
+              <w:top w:type="dxa" w:w="25"/>
+              <w:left w:type="dxa" w:w="40"/>
+              <w:bottom w:type="dxa" w:w="25"/>
+              <w:right w:type="dxa" w:w="40"/>
+            </w:tcMar>
+          </w:tcPr>
+          <w:p>
+            <w:pPr>
+              <w:jc w:val="center"/>
+            </w:pPr>
+            <w:r>
+              <w:rPr>
+                <w:rFonts w:ascii="Times New Roman" w:cs="Times New Roman" w:eastAsia="Times New Roman" w:hAnsi="Times New Roman"/>
+                <w:b/>
+                <w:bCs/>
+                <w:i w:val="false"/>
+                <w:iCs w:val="false"/>
+                <w:smallCaps w:val="false"/>
+                <w:sz w:val="16"/>
+                <w:szCs w:val="16"/>
+              </w:rPr>
+              <w:t xml:space="preserve">p</w:t>
+            </w:r>
+          </w:p>
+        </w:tc>
+      </w:tr>
+      <w:tr>
+        <w:tc>
+          <w:tcPr>
+            <w:tcW w:type="dxa" w:w="1500"/>
+            <w:tcBorders>
+              <w:top w:val="none" w:color="FFFFFF" w:sz="0"/>
+              <w:left w:val="none" w:color="FFFFFF" w:sz="0"/>
+              <w:bottom w:val="none" w:color="FFFFFF" w:sz="0"/>
+              <w:right w:val="none" w:color="FFFFFF" w:sz="0"/>
+            </w:tcBorders>
+            <w:tcMar>
+              <w:top w:type="dxa" w:w="25"/>
+              <w:left w:type="dxa" w:w="40"/>
+              <w:bottom w:type="dxa" w:w="25"/>
+              <w:right w:type="dxa" w:w="40"/>
+            </w:tcMar>
+          </w:tcPr>
+          <w:p>
+            <w:pPr>
+              <w:jc w:val="left"/>
+            </w:pPr>
+            <w:r>
+              <w:rPr>
+                <w:rFonts w:ascii="Times New Roman" w:cs="Times New Roman" w:eastAsia="Times New Roman" w:hAnsi="Times New Roman"/>
+                <w:b w:val="false"/>
+                <w:bCs w:val="false"/>
+                <w:i w:val="false"/>
+                <w:iCs w:val="false"/>
+                <w:smallCaps w:val="false"/>
+                <w:sz w:val="16"/>
+                <w:szCs w:val="16"/>
+              </w:rPr>
+              <w:t xml:space="preserve">Intent, all</w:t>
+            </w:r>
+          </w:p>
+        </w:tc>
+        <w:tc>
+          <w:tcPr>
+            <w:tcW w:type="dxa" w:w="760"/>
+            <w:tcBorders>
+              <w:top w:val="none" w:color="FFFFFF" w:sz="0"/>
+              <w:left w:val="none" w:color="FFFFFF" w:sz="0"/>
+              <w:bottom w:val="none" w:color="FFFFFF" w:sz="0"/>
+              <w:right w:val="none" w:color="FFFFFF" w:sz="0"/>
+            </w:tcBorders>
+            <w:tcMar>
+              <w:top w:type="dxa" w:w="25"/>
+              <w:left w:type="dxa" w:w="40"/>
+              <w:bottom w:type="dxa" w:w="25"/>
+              <w:right w:type="dxa" w:w="40"/>
+            </w:tcMar>
+          </w:tcPr>
+          <w:p>
+            <w:pPr>
+              <w:jc w:val="center"/>
+            </w:pPr>
+            <w:r>
+              <w:rPr>
+                <w:rFonts w:ascii="Times New Roman" w:cs="Times New Roman" w:eastAsia="Times New Roman" w:hAnsi="Times New Roman"/>
+                <w:b w:val="false"/>
+                <w:bCs w:val="false"/>
+                <w:i w:val="false"/>
+                <w:iCs w:val="false"/>
+                <w:smallCaps w:val="false"/>
+                <w:sz w:val="16"/>
+                <w:szCs w:val="16"/>
+              </w:rPr>
+              <w:t xml:space="preserve">61/94</w:t>
+            </w:r>
+          </w:p>
+        </w:tc>
+        <w:tc>
+          <w:tcPr>
+            <w:tcW w:type="dxa" w:w="760"/>
+            <w:tcBorders>
+              <w:top w:val="none" w:color="FFFFFF" w:sz="0"/>
+              <w:left w:val="none" w:color="FFFFFF" w:sz="0"/>
+              <w:bottom w:val="none" w:color="FFFFFF" w:sz="0"/>
+              <w:right w:val="none" w:color="FFFFFF" w:sz="0"/>
+            </w:tcBorders>
+            <w:tcMar>
+              <w:top w:type="dxa" w:w="25"/>
+              <w:left w:type="dxa" w:w="40"/>
+              <w:bottom w:type="dxa" w:w="25"/>
+              <w:right w:type="dxa" w:w="40"/>
+            </w:tcMar>
+          </w:tcPr>
+          <w:p>
+            <w:pPr>
+              <w:jc w:val="center"/>
+            </w:pPr>
+            <w:r>
+              <w:rPr>
+                <w:rFonts w:ascii="Times New Roman" w:cs="Times New Roman" w:eastAsia="Times New Roman" w:hAnsi="Times New Roman"/>
+                <w:b w:val="false"/>
+                <w:bCs w:val="false"/>
+                <w:i w:val="false"/>
+                <w:iCs w:val="false"/>
+                <w:smallCaps w:val="false"/>
+                <w:sz w:val="16"/>
+                <w:szCs w:val="16"/>
+              </w:rPr>
+              <w:t xml:space="preserve">68/94</w:t>
+            </w:r>
+          </w:p>
+        </w:tc>
+        <w:tc>
+          <w:tcPr>
+            <w:tcW w:type="dxa" w:w="760"/>
+            <w:tcBorders>
+              <w:top w:val="none" w:color="FFFFFF" w:sz="0"/>
+              <w:left w:val="none" w:color="FFFFFF" w:sz="0"/>
+              <w:bottom w:val="none" w:color="FFFFFF" w:sz="0"/>
+              <w:right w:val="none" w:color="FFFFFF" w:sz="0"/>
+            </w:tcBorders>
+            <w:tcMar>
+              <w:top w:type="dxa" w:w="25"/>
+              <w:left w:type="dxa" w:w="40"/>
+              <w:bottom w:type="dxa" w:w="25"/>
+              <w:right w:type="dxa" w:w="40"/>
+            </w:tcMar>
+          </w:tcPr>
+          <w:p>
+            <w:pPr>
+              <w:jc w:val="center"/>
+            </w:pPr>
+            <w:r>
+              <w:rPr>
+                <w:rFonts w:ascii="Times New Roman" w:cs="Times New Roman" w:eastAsia="Times New Roman" w:hAnsi="Times New Roman"/>
+                <w:b w:val="false"/>
+                <w:bCs w:val="false"/>
+                <w:i w:val="false"/>
+                <w:iCs w:val="false"/>
+                <w:smallCaps w:val="false"/>
+                <w:sz w:val="16"/>
+                <w:szCs w:val="16"/>
+              </w:rPr>
+              <w:t xml:space="preserve">92/94</w:t>
+            </w:r>
+          </w:p>
+        </w:tc>
+        <w:tc>
+          <w:tcPr>
+            <w:tcW w:type="dxa" w:w="560"/>
+            <w:tcBorders>
+              <w:top w:val="none" w:color="FFFFFF" w:sz="0"/>
+              <w:left w:val="none" w:color="FFFFFF" w:sz="0"/>
+              <w:bottom w:val="none" w:color="FFFFFF" w:sz="0"/>
+              <w:right w:val="none" w:color="FFFFFF" w:sz="0"/>
+            </w:tcBorders>
+            <w:tcMar>
+              <w:top w:type="dxa" w:w="25"/>
+              <w:left w:type="dxa" w:w="40"/>
+              <w:bottom w:type="dxa" w:w="25"/>
+              <w:right w:type="dxa" w:w="40"/>
+            </w:tcMar>
+          </w:tcPr>
+          <w:p>
+            <w:pPr>
+              <w:jc w:val="center"/>
+            </w:pPr>
+            <w:r>
+              <w:rPr>
+                <w:rFonts w:ascii="Times New Roman" w:cs="Times New Roman" w:eastAsia="Times New Roman" w:hAnsi="Times New Roman"/>
+                <w:b w:val="false"/>
+                <w:bCs w:val="false"/>
+                <w:i w:val="false"/>
+                <w:iCs w:val="false"/>
+                <w:smallCaps w:val="false"/>
+                <w:sz w:val="16"/>
+                <w:szCs w:val="16"/>
+              </w:rPr>
+              <w:t xml:space="preserve">0.07</w:t>
+            </w:r>
+          </w:p>
+        </w:tc>
+      </w:tr>
+      <w:tr>
+        <w:tc>
+          <w:tcPr>
+            <w:tcW w:type="dxa" w:w="1500"/>
+            <w:tcBorders>
+              <w:top w:val="none" w:color="FFFFFF" w:sz="0"/>
+              <w:left w:val="none" w:color="FFFFFF" w:sz="0"/>
+              <w:bottom w:val="none" w:color="FFFFFF" w:sz="0"/>
+              <w:right w:val="none" w:color="FFFFFF" w:sz="0"/>
+            </w:tcBorders>
+            <w:tcMar>
+              <w:top w:type="dxa" w:w="25"/>
+              <w:left w:type="dxa" w:w="40"/>
+              <w:bottom w:type="dxa" w:w="25"/>
+              <w:right w:type="dxa" w:w="40"/>
+            </w:tcMar>
+          </w:tcPr>
+          <w:p>
+            <w:pPr>
+              <w:jc w:val="left"/>
+            </w:pPr>
+            <w:r>
+              <w:rPr>
+                <w:rFonts w:ascii="Times New Roman" w:cs="Times New Roman" w:eastAsia="Times New Roman" w:hAnsi="Times New Roman"/>
+                <w:b w:val="false"/>
+                <w:bCs w:val="false"/>
+                <w:i w:val="false"/>
+                <w:iCs w:val="false"/>
+                <w:smallCaps w:val="false"/>
+                <w:sz w:val="16"/>
+                <w:szCs w:val="16"/>
+              </w:rPr>
+              <w:t xml:space="preserve">Intent, golden</w:t>
+            </w:r>
+          </w:p>
+        </w:tc>
+        <w:tc>
+          <w:tcPr>
+            <w:tcW w:type="dxa" w:w="760"/>
+            <w:tcBorders>
+              <w:top w:val="none" w:color="FFFFFF" w:sz="0"/>
+              <w:left w:val="none" w:color="FFFFFF" w:sz="0"/>
+              <w:bottom w:val="none" w:color="FFFFFF" w:sz="0"/>
+              <w:right w:val="none" w:color="FFFFFF" w:sz="0"/>
+            </w:tcBorders>
+            <w:tcMar>
+              <w:top w:type="dxa" w:w="25"/>
+              <w:left w:type="dxa" w:w="40"/>
+              <w:bottom w:type="dxa" w:w="25"/>
+              <w:right w:type="dxa" w:w="40"/>
+            </w:tcMar>
+          </w:tcPr>
+          <w:p>
+            <w:pPr>
+              <w:jc w:val="center"/>
+            </w:pPr>
+            <w:r>
+              <w:rPr>
+                <w:rFonts w:ascii="Times New Roman" w:cs="Times New Roman" w:eastAsia="Times New Roman" w:hAnsi="Times New Roman"/>
+                <w:b w:val="false"/>
+                <w:bCs w:val="false"/>
+                <w:i w:val="false"/>
+                <w:iCs w:val="false"/>
+                <w:smallCaps w:val="false"/>
+                <w:sz w:val="16"/>
+                <w:szCs w:val="16"/>
+              </w:rPr>
+              <w:t xml:space="preserve">43/62</w:t>
+            </w:r>
+          </w:p>
+        </w:tc>
+        <w:tc>
+          <w:tcPr>
+            <w:tcW w:type="dxa" w:w="760"/>
+            <w:tcBorders>
+              <w:top w:val="none" w:color="FFFFFF" w:sz="0"/>
+              <w:left w:val="none" w:color="FFFFFF" w:sz="0"/>
+              <w:bottom w:val="none" w:color="FFFFFF" w:sz="0"/>
+              <w:right w:val="none" w:color="FFFFFF" w:sz="0"/>
+            </w:tcBorders>
+            <w:tcMar>
+              <w:top w:type="dxa" w:w="25"/>
+              <w:left w:type="dxa" w:w="40"/>
+              <w:bottom w:type="dxa" w:w="25"/>
+              <w:right w:type="dxa" w:w="40"/>
+            </w:tcMar>
+          </w:tcPr>
+          <w:p>
+            <w:pPr>
+              <w:jc w:val="center"/>
+            </w:pPr>
+            <w:r>
+              <w:rPr>
+                <w:rFonts w:ascii="Times New Roman" w:cs="Times New Roman" w:eastAsia="Times New Roman" w:hAnsi="Times New Roman"/>
+                <w:b w:val="false"/>
+                <w:bCs w:val="false"/>
+                <w:i w:val="false"/>
+                <w:iCs w:val="false"/>
+                <w:smallCaps w:val="false"/>
+                <w:sz w:val="16"/>
+                <w:szCs w:val="16"/>
+              </w:rPr>
+              <w:t xml:space="preserve">47/62</w:t>
+            </w:r>
+          </w:p>
+        </w:tc>
+        <w:tc>
+          <w:tcPr>
+            <w:tcW w:type="dxa" w:w="760"/>
+            <w:tcBorders>
+              <w:top w:val="none" w:color="FFFFFF" w:sz="0"/>
+              <w:left w:val="none" w:color="FFFFFF" w:sz="0"/>
+              <w:bottom w:val="none" w:color="FFFFFF" w:sz="0"/>
+              <w:right w:val="none" w:color="FFFFFF" w:sz="0"/>
+            </w:tcBorders>
+            <w:tcMar>
+              <w:top w:type="dxa" w:w="25"/>
+              <w:left w:type="dxa" w:w="40"/>
+              <w:bottom w:type="dxa" w:w="25"/>
+              <w:right w:type="dxa" w:w="40"/>
+            </w:tcMar>
+          </w:tcPr>
+          <w:p>
+            <w:pPr>
+              <w:jc w:val="center"/>
+            </w:pPr>
+            <w:r>
+              <w:rPr>
+                <w:rFonts w:ascii="Times New Roman" w:cs="Times New Roman" w:eastAsia="Times New Roman" w:hAnsi="Times New Roman"/>
+                <w:b w:val="false"/>
+                <w:bCs w:val="false"/>
+                <w:i w:val="false"/>
+                <w:iCs w:val="false"/>
+                <w:smallCaps w:val="false"/>
+                <w:sz w:val="16"/>
+                <w:szCs w:val="16"/>
+              </w:rPr>
+              <w:t xml:space="preserve">61/62</w:t>
+            </w:r>
+          </w:p>
+        </w:tc>
+        <w:tc>
+          <w:tcPr>
+            <w:tcW w:type="dxa" w:w="560"/>
+            <w:tcBorders>
+              <w:top w:val="none" w:color="FFFFFF" w:sz="0"/>
+              <w:left w:val="none" w:color="FFFFFF" w:sz="0"/>
+              <w:bottom w:val="none" w:color="FFFFFF" w:sz="0"/>
+              <w:right w:val="none" w:color="FFFFFF" w:sz="0"/>
+            </w:tcBorders>
+            <w:tcMar>
+              <w:top w:type="dxa" w:w="25"/>
+              <w:left w:type="dxa" w:w="40"/>
+              <w:bottom w:type="dxa" w:w="25"/>
+              <w:right w:type="dxa" w:w="40"/>
+            </w:tcMar>
+          </w:tcPr>
+          <w:p>
+            <w:pPr>
+              <w:jc w:val="center"/>
+            </w:pPr>
+            <w:r>
+              <w:rPr>
+                <w:rFonts w:ascii="Times New Roman" w:cs="Times New Roman" w:eastAsia="Times New Roman" w:hAnsi="Times New Roman"/>
+                <w:b w:val="false"/>
+                <w:bCs w:val="false"/>
+                <w:i w:val="false"/>
+                <w:iCs w:val="false"/>
+                <w:smallCaps w:val="false"/>
+                <w:sz w:val="16"/>
+                <w:szCs w:val="16"/>
+              </w:rPr>
+              <w:t xml:space="preserve">0.29</w:t>
+            </w:r>
+          </w:p>
+        </w:tc>
+      </w:tr>
+      <w:tr>
+        <w:tc>
+          <w:tcPr>
+            <w:tcW w:type="dxa" w:w="1500"/>
+            <w:tcBorders>
+              <w:top w:val="none" w:color="FFFFFF" w:sz="0"/>
+              <w:left w:val="none" w:color="FFFFFF" w:sz="0"/>
+              <w:bottom w:val="none" w:color="FFFFFF" w:sz="0"/>
+              <w:right w:val="none" w:color="FFFFFF" w:sz="0"/>
+            </w:tcBorders>
+            <w:tcMar>
+              <w:top w:type="dxa" w:w="25"/>
+              <w:left w:type="dxa" w:w="40"/>
+              <w:bottom w:type="dxa" w:w="25"/>
+              <w:right w:type="dxa" w:w="40"/>
+            </w:tcMar>
+          </w:tcPr>
+          <w:p>
+            <w:pPr>
+              <w:jc w:val="left"/>
+            </w:pPr>
+            <w:r>
+              <w:rPr>
+                <w:rFonts w:ascii="Times New Roman" w:cs="Times New Roman" w:eastAsia="Times New Roman" w:hAnsi="Times New Roman"/>
+                <w:b w:val="false"/>
+                <w:bCs w:val="false"/>
+                <w:i w:val="false"/>
+                <w:iCs w:val="false"/>
+                <w:smallCaps w:val="false"/>
+                <w:sz w:val="16"/>
+                <w:szCs w:val="16"/>
+              </w:rPr>
+              <w:t xml:space="preserve">Intent, mutant</w:t>
+            </w:r>
+          </w:p>
+        </w:tc>
+        <w:tc>
+          <w:tcPr>
+            <w:tcW w:type="dxa" w:w="760"/>
+            <w:tcBorders>
+              <w:top w:val="none" w:color="FFFFFF" w:sz="0"/>
+              <w:left w:val="none" w:color="FFFFFF" w:sz="0"/>
+              <w:bottom w:val="none" w:color="FFFFFF" w:sz="0"/>
+              <w:right w:val="none" w:color="FFFFFF" w:sz="0"/>
+            </w:tcBorders>
+            <w:tcMar>
+              <w:top w:type="dxa" w:w="25"/>
+              <w:left w:type="dxa" w:w="40"/>
+              <w:bottom w:type="dxa" w:w="25"/>
+              <w:right w:type="dxa" w:w="40"/>
+            </w:tcMar>
+          </w:tcPr>
+          <w:p>
+            <w:pPr>
+              <w:jc w:val="center"/>
+            </w:pPr>
+            <w:r>
+              <w:rPr>
+                <w:rFonts w:ascii="Times New Roman" w:cs="Times New Roman" w:eastAsia="Times New Roman" w:hAnsi="Times New Roman"/>
+                <w:b w:val="false"/>
+                <w:bCs w:val="false"/>
+                <w:i w:val="false"/>
+                <w:iCs w:val="false"/>
+                <w:smallCaps w:val="false"/>
+                <w:sz w:val="16"/>
+                <w:szCs w:val="16"/>
+              </w:rPr>
+              <w:t xml:space="preserve">18/32</w:t>
+            </w:r>
+          </w:p>
+        </w:tc>
+        <w:tc>
+          <w:tcPr>
+            <w:tcW w:type="dxa" w:w="760"/>
+            <w:tcBorders>
+              <w:top w:val="none" w:color="FFFFFF" w:sz="0"/>
+              <w:left w:val="none" w:color="FFFFFF" w:sz="0"/>
+              <w:bottom w:val="none" w:color="FFFFFF" w:sz="0"/>
+              <w:right w:val="none" w:color="FFFFFF" w:sz="0"/>
+            </w:tcBorders>
+            <w:tcMar>
+              <w:top w:type="dxa" w:w="25"/>
+              <w:left w:type="dxa" w:w="40"/>
+              <w:bottom w:type="dxa" w:w="25"/>
+              <w:right w:type="dxa" w:w="40"/>
+            </w:tcMar>
+          </w:tcPr>
+          <w:p>
+            <w:pPr>
+              <w:jc w:val="center"/>
+            </w:pPr>
+            <w:r>
+              <w:rPr>
+                <w:rFonts w:ascii="Times New Roman" w:cs="Times New Roman" w:eastAsia="Times New Roman" w:hAnsi="Times New Roman"/>
+                <w:b w:val="false"/>
+                <w:bCs w:val="false"/>
+                <w:i w:val="false"/>
+                <w:iCs w:val="false"/>
+                <w:smallCaps w:val="false"/>
+                <w:sz w:val="16"/>
+                <w:szCs w:val="16"/>
+              </w:rPr>
+              <w:t xml:space="preserve">21/32</w:t>
+            </w:r>
+          </w:p>
+        </w:tc>
+        <w:tc>
+          <w:tcPr>
+            <w:tcW w:type="dxa" w:w="760"/>
+            <w:tcBorders>
+              <w:top w:val="none" w:color="FFFFFF" w:sz="0"/>
+              <w:left w:val="none" w:color="FFFFFF" w:sz="0"/>
+              <w:bottom w:val="none" w:color="FFFFFF" w:sz="0"/>
+              <w:right w:val="none" w:color="FFFFFF" w:sz="0"/>
+            </w:tcBorders>
+            <w:tcMar>
+              <w:top w:type="dxa" w:w="25"/>
+              <w:left w:type="dxa" w:w="40"/>
+              <w:bottom w:type="dxa" w:w="25"/>
+              <w:right w:type="dxa" w:w="40"/>
+            </w:tcMar>
+          </w:tcPr>
+          <w:p>
+            <w:pPr>
+              <w:jc w:val="center"/>
+            </w:pPr>
+            <w:r>
+              <w:rPr>
+                <w:rFonts w:ascii="Times New Roman" w:cs="Times New Roman" w:eastAsia="Times New Roman" w:hAnsi="Times New Roman"/>
+                <w:b w:val="false"/>
+                <w:bCs w:val="false"/>
+                <w:i w:val="false"/>
+                <w:iCs w:val="false"/>
+                <w:smallCaps w:val="false"/>
+                <w:sz w:val="16"/>
+                <w:szCs w:val="16"/>
+              </w:rPr>
+              <w:t xml:space="preserve">31/32</w:t>
+            </w:r>
+          </w:p>
+        </w:tc>
+        <w:tc>
+          <w:tcPr>
+            <w:tcW w:type="dxa" w:w="560"/>
+            <w:tcBorders>
+              <w:top w:val="none" w:color="FFFFFF" w:sz="0"/>
+              <w:left w:val="none" w:color="FFFFFF" w:sz="0"/>
+              <w:bottom w:val="none" w:color="FFFFFF" w:sz="0"/>
+              <w:right w:val="none" w:color="FFFFFF" w:sz="0"/>
+            </w:tcBorders>
+            <w:tcMar>
+              <w:top w:type="dxa" w:w="25"/>
+              <w:left w:type="dxa" w:w="40"/>
+              <w:bottom w:type="dxa" w:w="25"/>
+              <w:right w:type="dxa" w:w="40"/>
+            </w:tcMar>
+          </w:tcPr>
+          <w:p>
+            <w:pPr>
+              <w:jc w:val="center"/>
+            </w:pPr>
+            <w:r>
+              <w:rPr>
+                <w:rFonts w:ascii="Times New Roman" w:cs="Times New Roman" w:eastAsia="Times New Roman" w:hAnsi="Times New Roman"/>
+                <w:b w:val="false"/>
+                <w:bCs w:val="false"/>
+                <w:i w:val="false"/>
+                <w:iCs w:val="false"/>
+                <w:smallCaps w:val="false"/>
+                <w:sz w:val="16"/>
+                <w:szCs w:val="16"/>
+              </w:rPr>
+              <w:t xml:space="preserve">0.25</w:t>
+            </w:r>
+          </w:p>
+        </w:tc>
+      </w:tr>
+      <w:tr>
+        <w:tc>
+          <w:tcPr>
+            <w:tcW w:type="dxa" w:w="1500"/>
+            <w:tcBorders>
+              <w:top w:val="none" w:color="FFFFFF" w:sz="0"/>
+              <w:left w:val="none" w:color="FFFFFF" w:sz="0"/>
+              <w:bottom w:val="none" w:color="FFFFFF" w:sz="0"/>
+              <w:right w:val="none" w:color="FFFFFF" w:sz="0"/>
+            </w:tcBorders>
+            <w:tcMar>
+              <w:top w:type="dxa" w:w="25"/>
+              <w:left w:type="dxa" w:w="40"/>
+              <w:bottom w:type="dxa" w:w="25"/>
+              <w:right w:type="dxa" w:w="40"/>
+            </w:tcMar>
+          </w:tcPr>
+          <w:p>
+            <w:pPr>
+              <w:jc w:val="left"/>
+            </w:pPr>
+            <w:r>
+              <w:rPr>
+                <w:rFonts w:ascii="Times New Roman" w:cs="Times New Roman" w:eastAsia="Times New Roman" w:hAnsi="Times New Roman"/>
+                <w:b w:val="false"/>
+                <w:bCs w:val="false"/>
+                <w:i w:val="false"/>
+                <w:iCs w:val="false"/>
+                <w:smallCaps w:val="false"/>
+                <w:sz w:val="16"/>
+                <w:szCs w:val="16"/>
+              </w:rPr>
+              <w:t xml:space="preserve">Defect caught</w:t>
+            </w:r>
+          </w:p>
+        </w:tc>
+        <w:tc>
+          <w:tcPr>
+            <w:tcW w:type="dxa" w:w="760"/>
+            <w:tcBorders>
+              <w:top w:val="none" w:color="FFFFFF" w:sz="0"/>
+              <w:left w:val="none" w:color="FFFFFF" w:sz="0"/>
+              <w:bottom w:val="none" w:color="FFFFFF" w:sz="0"/>
+              <w:right w:val="none" w:color="FFFFFF" w:sz="0"/>
+            </w:tcBorders>
+            <w:tcMar>
+              <w:top w:type="dxa" w:w="25"/>
+              <w:left w:type="dxa" w:w="40"/>
+              <w:bottom w:type="dxa" w:w="25"/>
+              <w:right w:type="dxa" w:w="40"/>
+            </w:tcMar>
+          </w:tcPr>
+          <w:p>
+            <w:pPr>
+              <w:jc w:val="center"/>
+            </w:pPr>
+            <w:r>
+              <w:rPr>
+                <w:rFonts w:ascii="Times New Roman" w:cs="Times New Roman" w:eastAsia="Times New Roman" w:hAnsi="Times New Roman"/>
+                <w:b w:val="false"/>
+                <w:bCs w:val="false"/>
+                <w:i w:val="false"/>
+                <w:iCs w:val="false"/>
+                <w:smallCaps w:val="false"/>
+                <w:sz w:val="16"/>
+                <w:szCs w:val="16"/>
+              </w:rPr>
+              <w:t xml:space="preserve">10/32</w:t>
+            </w:r>
+          </w:p>
+        </w:tc>
+        <w:tc>
+          <w:tcPr>
+            <w:tcW w:type="dxa" w:w="760"/>
+            <w:tcBorders>
+              <w:top w:val="none" w:color="FFFFFF" w:sz="0"/>
+              <w:left w:val="none" w:color="FFFFFF" w:sz="0"/>
+              <w:bottom w:val="none" w:color="FFFFFF" w:sz="0"/>
+              <w:right w:val="none" w:color="FFFFFF" w:sz="0"/>
+            </w:tcBorders>
+            <w:tcMar>
+              <w:top w:type="dxa" w:w="25"/>
+              <w:left w:type="dxa" w:w="40"/>
+              <w:bottom w:type="dxa" w:w="25"/>
+              <w:right w:type="dxa" w:w="40"/>
+            </w:tcMar>
+          </w:tcPr>
+          <w:p>
+            <w:pPr>
+              <w:jc w:val="center"/>
+            </w:pPr>
+            <w:r>
+              <w:rPr>
+                <w:rFonts w:ascii="Times New Roman" w:cs="Times New Roman" w:eastAsia="Times New Roman" w:hAnsi="Times New Roman"/>
+                <w:b w:val="false"/>
+                <w:bCs w:val="false"/>
+                <w:i w:val="false"/>
+                <w:iCs w:val="false"/>
+                <w:smallCaps w:val="false"/>
+                <w:sz w:val="16"/>
+                <w:szCs w:val="16"/>
+              </w:rPr>
+              <w:t xml:space="preserve">13/32</w:t>
+            </w:r>
+          </w:p>
+        </w:tc>
+        <w:tc>
+          <w:tcPr>
+            <w:tcW w:type="dxa" w:w="760"/>
+            <w:tcBorders>
+              <w:top w:val="none" w:color="FFFFFF" w:sz="0"/>
+              <w:left w:val="none" w:color="FFFFFF" w:sz="0"/>
+              <w:bottom w:val="none" w:color="FFFFFF" w:sz="0"/>
+              <w:right w:val="none" w:color="FFFFFF" w:sz="0"/>
+            </w:tcBorders>
+            <w:tcMar>
+              <w:top w:type="dxa" w:w="25"/>
+              <w:left w:type="dxa" w:w="40"/>
+              <w:bottom w:type="dxa" w:w="25"/>
+              <w:right w:type="dxa" w:w="40"/>
+            </w:tcMar>
+          </w:tcPr>
+          <w:p>
+            <w:pPr>
+              <w:jc w:val="center"/>
+            </w:pPr>
+            <w:r>
+              <w:rPr>
+                <w:rFonts w:ascii="Times New Roman" w:cs="Times New Roman" w:eastAsia="Times New Roman" w:hAnsi="Times New Roman"/>
+                <w:b w:val="false"/>
+                <w:bCs w:val="false"/>
+                <w:i w:val="false"/>
+                <w:iCs w:val="false"/>
+                <w:smallCaps w:val="false"/>
+                <w:sz w:val="16"/>
+                <w:szCs w:val="16"/>
+              </w:rPr>
+              <w:t xml:space="preserve">12/32</w:t>
+            </w:r>
+          </w:p>
+        </w:tc>
+        <w:tc>
+          <w:tcPr>
+            <w:tcW w:type="dxa" w:w="560"/>
+            <w:tcBorders>
+              <w:top w:val="none" w:color="FFFFFF" w:sz="0"/>
+              <w:left w:val="none" w:color="FFFFFF" w:sz="0"/>
+              <w:bottom w:val="none" w:color="FFFFFF" w:sz="0"/>
+              <w:right w:val="none" w:color="FFFFFF" w:sz="0"/>
+            </w:tcBorders>
+            <w:tcMar>
+              <w:top w:type="dxa" w:w="25"/>
+              <w:left w:type="dxa" w:w="40"/>
+              <w:bottom w:type="dxa" w:w="25"/>
+              <w:right w:type="dxa" w:w="40"/>
+            </w:tcMar>
+          </w:tcPr>
+          <w:p>
+            <w:pPr>
+              <w:jc w:val="center"/>
+            </w:pPr>
+            <w:r>
+              <w:rPr>
+                <w:rFonts w:ascii="Times New Roman" w:cs="Times New Roman" w:eastAsia="Times New Roman" w:hAnsi="Times New Roman"/>
+                <w:b w:val="false"/>
+                <w:bCs w:val="false"/>
+                <w:i w:val="false"/>
+                <w:iCs w:val="false"/>
+                <w:smallCaps w:val="false"/>
+                <w:sz w:val="16"/>
+                <w:szCs w:val="16"/>
+              </w:rPr>
+              <w:t xml:space="preserve">0.25</w:t>
+            </w:r>
+          </w:p>
+        </w:tc>
+      </w:tr>
+      <w:tr>
+        <w:tc>
+          <w:tcPr>
+            <w:tcW w:type="dxa" w:w="1500"/>
+            <w:tcBorders>
+              <w:top w:val="none" w:color="FFFFFF" w:sz="0"/>
+              <w:left w:val="none" w:color="FFFFFF" w:sz="0"/>
+              <w:bottom w:val="single" w:color="000000" w:sz="4"/>
+              <w:right w:val="none" w:color="FFFFFF" w:sz="0"/>
+            </w:tcBorders>
+            <w:tcMar>
+              <w:top w:type="dxa" w:w="25"/>
+              <w:left w:type="dxa" w:w="40"/>
+              <w:bottom w:type="dxa" w:w="25"/>
+              <w:right w:type="dxa" w:w="40"/>
+            </w:tcMar>
+          </w:tcPr>
+          <w:p>
+            <w:pPr>
+              <w:jc w:val="left"/>
+            </w:pPr>
+            <w:r>
+              <w:rPr>
+                <w:rFonts w:ascii="Times New Roman" w:cs="Times New Roman" w:eastAsia="Times New Roman" w:hAnsi="Times New Roman"/>
+                <w:b w:val="false"/>
+                <w:bCs w:val="false"/>
+                <w:i w:val="false"/>
+                <w:iCs w:val="false"/>
+                <w:smallCaps w:val="false"/>
+                <w:sz w:val="16"/>
+                <w:szCs w:val="16"/>
+              </w:rPr>
+              <w:t xml:space="preserve">False alarm</w:t>
+            </w:r>
+          </w:p>
+        </w:tc>
+        <w:tc>
+          <w:tcPr>
+            <w:tcW w:type="dxa" w:w="760"/>
+            <w:tcBorders>
+              <w:top w:val="none" w:color="FFFFFF" w:sz="0"/>
+              <w:left w:val="none" w:color="FFFFFF" w:sz="0"/>
+              <w:bottom w:val="single" w:color="000000" w:sz="4"/>
+              <w:right w:val="none" w:color="FFFFFF" w:sz="0"/>
+            </w:tcBorders>
+            <w:tcMar>
+              <w:top w:type="dxa" w:w="25"/>
+              <w:left w:type="dxa" w:w="40"/>
+              <w:bottom w:type="dxa" w:w="25"/>
+              <w:right w:type="dxa" w:w="40"/>
+            </w:tcMar>
+          </w:tcPr>
+          <w:p>
+            <w:pPr>
+              <w:jc w:val="center"/>
+            </w:pPr>
+            <w:r>
+              <w:rPr>
+                <w:rFonts w:ascii="Times New Roman" w:cs="Times New Roman" w:eastAsia="Times New Roman" w:hAnsi="Times New Roman"/>
+                <w:b w:val="false"/>
+                <w:bCs w:val="false"/>
+                <w:i w:val="false"/>
+                <w:iCs w:val="false"/>
+                <w:smallCaps w:val="false"/>
+                <w:sz w:val="16"/>
+                <w:szCs w:val="16"/>
+              </w:rPr>
+              <w:t xml:space="preserve">1/62</w:t>
+            </w:r>
+          </w:p>
+        </w:tc>
+        <w:tc>
+          <w:tcPr>
+            <w:tcW w:type="dxa" w:w="760"/>
+            <w:tcBorders>
+              <w:top w:val="none" w:color="FFFFFF" w:sz="0"/>
+              <w:left w:val="none" w:color="FFFFFF" w:sz="0"/>
+              <w:bottom w:val="single" w:color="000000" w:sz="4"/>
+              <w:right w:val="none" w:color="FFFFFF" w:sz="0"/>
+            </w:tcBorders>
+            <w:tcMar>
+              <w:top w:type="dxa" w:w="25"/>
+              <w:left w:type="dxa" w:w="40"/>
+              <w:bottom w:type="dxa" w:w="25"/>
+              <w:right w:type="dxa" w:w="40"/>
+            </w:tcMar>
+          </w:tcPr>
+          <w:p>
+            <w:pPr>
+              <w:jc w:val="center"/>
+            </w:pPr>
+            <w:r>
+              <w:rPr>
+                <w:rFonts w:ascii="Times New Roman" w:cs="Times New Roman" w:eastAsia="Times New Roman" w:hAnsi="Times New Roman"/>
+                <w:b w:val="false"/>
+                <w:bCs w:val="false"/>
+                <w:i w:val="false"/>
+                <w:iCs w:val="false"/>
+                <w:smallCaps w:val="false"/>
+                <w:sz w:val="16"/>
+                <w:szCs w:val="16"/>
+              </w:rPr>
+              <w:t xml:space="preserve">5/62</w:t>
+            </w:r>
+          </w:p>
+        </w:tc>
+        <w:tc>
+          <w:tcPr>
+            <w:tcW w:type="dxa" w:w="760"/>
+            <w:tcBorders>
+              <w:top w:val="none" w:color="FFFFFF" w:sz="0"/>
+              <w:left w:val="none" w:color="FFFFFF" w:sz="0"/>
+              <w:bottom w:val="single" w:color="000000" w:sz="4"/>
+              <w:right w:val="none" w:color="FFFFFF" w:sz="0"/>
+            </w:tcBorders>
+            <w:tcMar>
+              <w:top w:type="dxa" w:w="25"/>
+              <w:left w:type="dxa" w:w="40"/>
+              <w:bottom w:type="dxa" w:w="25"/>
+              <w:right w:type="dxa" w:w="40"/>
+            </w:tcMar>
+          </w:tcPr>
+          <w:p>
+            <w:pPr>
+              <w:jc w:val="center"/>
+            </w:pPr>
+            <w:r>
+              <w:rPr>
+                <w:rFonts w:ascii="Times New Roman" w:cs="Times New Roman" w:eastAsia="Times New Roman" w:hAnsi="Times New Roman"/>
+                <w:b w:val="false"/>
+                <w:bCs w:val="false"/>
+                <w:i w:val="false"/>
+                <w:iCs w:val="false"/>
+                <w:smallCaps w:val="false"/>
+                <w:sz w:val="16"/>
+                <w:szCs w:val="16"/>
+              </w:rPr>
+              <w:t xml:space="preserve">0/62</w:t>
+            </w:r>
+          </w:p>
+        </w:tc>
+        <w:tc>
+          <w:tcPr>
+            <w:tcW w:type="dxa" w:w="560"/>
+            <w:tcBorders>
+              <w:top w:val="none" w:color="FFFFFF" w:sz="0"/>
+              <w:left w:val="none" w:color="FFFFFF" w:sz="0"/>
+              <w:bottom w:val="single" w:color="000000" w:sz="4"/>
+              <w:right w:val="none" w:color="FFFFFF" w:sz="0"/>
+            </w:tcBorders>
+            <w:tcMar>
+              <w:top w:type="dxa" w:w="25"/>
+              <w:left w:type="dxa" w:w="40"/>
+              <w:bottom w:type="dxa" w:w="25"/>
+              <w:right w:type="dxa" w:w="40"/>
+            </w:tcMar>
+          </w:tcPr>
+          <w:p>
+            <w:pPr>
+              <w:jc w:val="center"/>
+            </w:pPr>
+            <w:r>
+              <w:rPr>
+                <w:rFonts w:ascii="Times New Roman" w:cs="Times New Roman" w:eastAsia="Times New Roman" w:hAnsi="Times New Roman"/>
+                <w:b w:val="false"/>
+                <w:bCs w:val="false"/>
+                <w:i w:val="false"/>
+                <w:iCs w:val="false"/>
+                <w:smallCaps w:val="false"/>
+                <w:sz w:val="16"/>
+                <w:szCs w:val="16"/>
+              </w:rPr>
+              <w:t xml:space="preserve">0.13</w:t>
+            </w:r>
+          </w:p>
+        </w:tc>
+      </w:tr>
+    </w:tbl>
+    <w:p>
+      <w:pPr>
+        <w:spacing w:after="60"/>
+      </w:pPr>
+      <w:r>
+        <w:rPr>
+          <w:rFonts w:ascii="Times New Roman" w:cs="Times New Roman" w:eastAsia="Times New Roman" w:hAnsi="Times New Roman"/>
+          <w:b w:val="false"/>
+          <w:bCs w:val="false"/>
+          <w:i w:val="false"/>
+          <w:iCs w:val="false"/>
+          <w:smallCaps w:val="false"/>
+          <w:sz w:val="20"/>
+          <w:szCs w:val="20"/>
+        </w:rPr>
+        <w:t xml:space="preserve"/>
+      </w:r>
+    </w:p>
+    <w:p>
+      <w:pPr>
+        <w:keepNext w:val="false"/>
+        <w:spacing w:after="40" w:before="0" w:line="240"/>
+        <w:ind w:firstLine="202"/>
+        <w:jc w:val="both"/>
+      </w:pPr>
+      <w:r>
+        <w:rPr>
+          <w:rFonts w:ascii="Times New Roman" w:cs="Times New Roman" w:eastAsia="Times New Roman" w:hAnsi="Times New Roman"/>
+          <w:b w:val="false"/>
+          <w:bCs w:val="false"/>
+          <w:i w:val="false"/>
+          <w:iCs w:val="false"/>
+          <w:smallCaps w:val="false"/>
+          <w:sz w:val="20"/>
+          <w:szCs w:val="20"/>
+        </w:rPr>
+        <w:t xml:space="preserve">Intent recovery was 65% with intent withheld, 72% with clarification and 98% with full context: G = 0.23 (95% interval 0.03–0.41, McNemar p = 0.07). Read alone, the interval excludes zero. The trace says otherwise. The detector asked on 15 of 94 instances and the simulated author gave a substantive answer to 2; of the 33 floor misses it asked on 9 and recovered 0. Of the 11 discordant pairs, 10 came from instances where no question was asked, so floor and treatment sent the reviewer identical input, and they split 8 to 2. The difference is the reviewer's run-to-run variation, not clarification. Clarification also raised false alarms on golden patches from 1/62 to 5/62. The lesson for the design is that one review per condition cannot resolve an effect of this size: repeated reviews per condition, or a reviewer run deterministically, are needed.</w:t>
+      </w:r>
+    </w:p>
+    <w:p>
+      <w:pPr>
+        <w:keepNext/>
+        <w:spacing w:after="80" w:before="160"/>
+        <w:jc w:val="center"/>
+      </w:pPr>
+      <w:r>
+        <w:rPr>
+          <w:rFonts w:ascii="Times New Roman" w:cs="Times New Roman" w:eastAsia="Times New Roman" w:hAnsi="Times New Roman"/>
+          <w:b w:val="false"/>
+          <w:bCs w:val="false"/>
+          <w:i w:val="false"/>
+          <w:iCs w:val="false"/>
+          <w:smallCaps/>
+          <w:sz w:val="20"/>
+          <w:szCs w:val="20"/>
+        </w:rPr>
+        <w:t xml:space="preserve">VI. </w:t>
+      </w:r>
+      <w:r>
+        <w:rPr>
+          <w:rFonts w:ascii="Times New Roman" w:cs="Times New Roman" w:eastAsia="Times New Roman" w:hAnsi="Times New Roman"/>
+          <w:b w:val="false"/>
+          <w:bCs w:val="false"/>
+          <w:i w:val="false"/>
+          <w:iCs w:val="false"/>
+          <w:smallCaps/>
+          <w:sz w:val="20"/>
+          <w:szCs w:val="20"/>
+        </w:rPr>
+        <w:t xml:space="preserve">Discussion</w:t>
+      </w:r>
+    </w:p>
+    <w:p>
+      <w:pPr>
+        <w:keepNext w:val="false"/>
+        <w:spacing w:after="40" w:before="0" w:line="240"/>
+        <w:ind w:firstLine="202"/>
+        <w:jc w:val="both"/>
+      </w:pPr>
+      <w:r>
+        <w:rPr>
+          <w:rFonts w:ascii="Times New Roman" w:cs="Times New Roman" w:eastAsia="Times New Roman" w:hAnsi="Times New Roman"/>
+          <w:b w:val="false"/>
+          <w:bCs w:val="false"/>
+          <w:i w:val="false"/>
+          <w:iCs w:val="false"/>
+          <w:smallCaps w:val="false"/>
+          <w:sz w:val="20"/>
+          <w:szCs w:val="20"/>
+        </w:rPr>
+        <w:t xml:space="preserve">Asking is cheap to add and hard to target. Once a question reached an author who could answer it, the answer did what it was meant to do; nearly all of the loss happened earlier, in deciding when to ask. This shifts the research problem: the quality of a clarifying question matters less than the recall of the decision to pose one, at a precision that keeps the tool tolerable. A detector built from diff features was precise and conservative; a sampling-based detector separated the conditions but needs calibration on held-out data.</w:t>
+      </w:r>
+    </w:p>
+    <w:p>
+      <w:pPr>
+        <w:keepNext w:val="false"/>
+        <w:spacing w:after="40" w:before="0" w:line="240"/>
+        <w:ind w:firstLine="202"/>
+        <w:jc w:val="both"/>
+      </w:pPr>
+      <w:r>
+        <w:rPr>
+          <w:rFonts w:ascii="Times New Roman" w:cs="Times New Roman" w:eastAsia="Times New Roman" w:hAnsi="Times New Roman"/>
+          <w:b w:val="false"/>
+          <w:bCs w:val="false"/>
+          <w:i w:val="false"/>
+          <w:iCs w:val="false"/>
+          <w:smallCaps w:val="false"/>
+          <w:sz w:val="20"/>
+          <w:szCs w:val="20"/>
+        </w:rPr>
+        <w:t xml:space="preserve">Golden patches are a poor population for studying ambiguity. Well-written fixes state their purpose in the code, comments and docstrings they add; evaluating intent-dependent review requires withholding all of it, and even then most changes remain self-explanatory. Benchmarks of genuinely under-specified changes would strengthen this line of work.</w:t>
+      </w:r>
+    </w:p>
+    <w:p>
+      <w:pPr>
+        <w:keepNext w:val="false"/>
+        <w:spacing w:after="40" w:before="0" w:line="240"/>
+        <w:ind w:firstLine="202"/>
+        <w:jc w:val="both"/>
+      </w:pPr>
+      <w:r>
+        <w:rPr>
+          <w:rFonts w:ascii="Times New Roman" w:cs="Times New Roman" w:eastAsia="Times New Roman" w:hAnsi="Times New Roman"/>
+          <w:b w:val="false"/>
+          <w:bCs w:val="false"/>
+          <w:i w:val="false"/>
+          <w:iCs w:val="false"/>
+          <w:smallCaps w:val="false"/>
+          <w:sz w:val="20"/>
+          <w:szCs w:val="20"/>
+        </w:rPr>
+        <w:t xml:space="preserve">Finally, clarification cannot exceed the reviewer. On a small free-tier model, full context did not make the reviewer catch injected defects, so detection gains, if they exist, require a stronger reviewer before intent can matter.</w:t>
+      </w:r>
+    </w:p>
+    <w:p>
+      <w:pPr>
+        <w:keepNext w:val="false"/>
+        <w:spacing w:after="40" w:before="0" w:line="240"/>
+        <w:ind w:firstLine="202"/>
+        <w:jc w:val="both"/>
+      </w:pPr>
+      <w:r>
+        <w:rPr>
+          <w:rFonts w:ascii="Times New Roman" w:cs="Times New Roman" w:eastAsia="Times New Roman" w:hAnsi="Times New Roman"/>
+          <w:b w:val="false"/>
+          <w:bCs w:val="false"/>
+          <w:i w:val="false"/>
+          <w:iCs w:val="false"/>
+          <w:smallCaps w:val="false"/>
+          <w:sz w:val="20"/>
+          <w:szCs w:val="20"/>
+        </w:rPr>
+        <w:t xml:space="preserve">Two reviewers and two judge configurations give the same qualitative picture: recall is the binding limit, defect detection is limited by the reviewer, and no gap-recovery interval excludes zero. The size of the effect depends on which judge scores the reviews. In the original study, gap recovery was 0.17 under the API judge (interval 0.00 to 0.50) and 0.40 under the agent judge (interval -0.75 to 1.00). In the replication, under the agent judge, it was 0.09 (interval -0.22 to 0.33) on 96 instances. The sign of the effect is therefore not established under any of these judges, and magnitudes should be read together with the judge that produced them.</w:t>
+      </w:r>
+    </w:p>
+    <w:p>
+      <w:pPr>
+        <w:keepNext/>
+        <w:spacing w:after="80" w:before="160"/>
+        <w:jc w:val="center"/>
+      </w:pPr>
+      <w:r>
+        <w:rPr>
+          <w:rFonts w:ascii="Times New Roman" w:cs="Times New Roman" w:eastAsia="Times New Roman" w:hAnsi="Times New Roman"/>
+          <w:b w:val="false"/>
+          <w:bCs w:val="false"/>
+          <w:i w:val="false"/>
+          <w:iCs w:val="false"/>
+          <w:smallCaps/>
+          <w:sz w:val="20"/>
+          <w:szCs w:val="20"/>
+        </w:rPr>
+        <w:t xml:space="preserve">VII. </w:t>
+      </w:r>
+      <w:r>
+        <w:rPr>
+          <w:rFonts w:ascii="Times New Roman" w:cs="Times New Roman" w:eastAsia="Times New Roman" w:hAnsi="Times New Roman"/>
+          <w:b w:val="false"/>
+          <w:bCs w:val="false"/>
+          <w:i w:val="false"/>
+          <w:iCs w:val="false"/>
+          <w:smallCaps/>
+          <w:sz w:val="20"/>
+          <w:szCs w:val="20"/>
+        </w:rPr>
+        <w:t xml:space="preserve">Threats to Validity</w:t>
+      </w:r>
+    </w:p>
+    <w:p>
+      <w:pPr>
+        <w:keepNext w:val="false"/>
+        <w:spacing w:after="40" w:before="0" w:line="240"/>
+        <w:ind w:firstLine="202"/>
+        <w:jc w:val="both"/>
+      </w:pPr>
+      <w:r>
+        <w:rPr>
+          <w:rFonts w:ascii="Times New Roman" w:cs="Times New Roman" w:eastAsia="Times New Roman" w:hAnsi="Times New Roman"/>
+          <w:b w:val="false"/>
+          <w:bCs w:val="false"/>
+          <w:i w:val="false"/>
+          <w:iCs w:val="false"/>
+          <w:smallCaps w:val="false"/>
+          <w:sz w:val="20"/>
+          <w:szCs w:val="20"/>
+        </w:rPr>
+        <w:t xml:space="preserve">The sample is small (36 instances under per-model daily quotas), so intervals are wide. The judge was validated against 2 independent human scorers on a stratified sample of 60 of its own reviews, shown without the judge's answers or the condition; blank cells were excluded, not counted as disagreement. On defects and false alarms it agreed with them almost perfectly (Cohen's κ [15] 0.92 and 1.00; 99% and 100% agreement). On intent recovery it agreed on 88% of reviews, but κ was -0.01: the humans judged intent recovered in 99% of reviews and the judge in 88%, so the near-zero κ reflects one dominant answer rather than random agreement. The judge is the stricter of the two, so the intent recovery rates reported here are conservative rather than inflated. The simulated author answers from withheld text only, but leakage requires the hand audit the tooling prepares. We report a protocol deviation: in the first v2 run the simulated author's token budget was exhausted by its model's hidden reasoning, returning empty answers, and its prompt refused questions phrased in terms of unseen code. Both were corrected and the treatment re-run for the six affected instances; floor and ceiling were not re-run, and the prompt revision, made after observing refusals, is logged with every exchange. All verified mutants come from sympy and the operators produce simple defects. The reviewer is a small model; results may differ for stronger ones.</w:t>
+      </w:r>
+    </w:p>
+    <w:p>
+      <w:pPr>
+        <w:keepNext w:val="false"/>
+        <w:spacing w:after="40" w:before="0" w:line="240"/>
+        <w:ind w:firstLine="202"/>
+        <w:jc w:val="both"/>
+      </w:pPr>
+      <w:r>
+        <w:rPr>
+          <w:rFonts w:ascii="Times New Roman" w:cs="Times New Roman" w:eastAsia="Times New Roman" w:hAnsi="Times New Roman"/>
+          <w:b w:val="false"/>
+          <w:bCs w:val="false"/>
+          <w:i w:val="false"/>
+          <w:iCs w:val="false"/>
+          <w:smallCaps w:val="false"/>
+          <w:sz w:val="20"/>
+          <w:szCs w:val="20"/>
+        </w:rPr>
+        <w:t xml:space="preserve">The replication adds further limits. Both studies have small samples: the original study has 36 instances and the replication 96, so intervals are wide. The replication's agent judge was chosen after seeing its agreement with the local judge, which makes the choice post hoc. The question and oracle model, n/a, is small, and its identity is recorded in the oracle log but not per database row. The two studies differ in reviewer, judge and rows, and they are never pooled. Running the full replication set on the original reviewer showed that the reviewer's own run-to-run variation is as large as the effect being measured, so a single review per condition cannot resolve it. The bot has not been run against live GitHub, and the 356 collected real pull requests are not yet labelled.</w:t>
+      </w:r>
+    </w:p>
+    <w:p>
+      <w:pPr>
+        <w:keepNext w:val="false"/>
+        <w:spacing w:after="40" w:before="0" w:line="240"/>
+        <w:ind w:firstLine="202"/>
+        <w:jc w:val="both"/>
+      </w:pPr>
+      <w:r>
+        <w:rPr>
+          <w:rFonts w:ascii="Times New Roman" w:cs="Times New Roman" w:eastAsia="Times New Roman" w:hAnsi="Times New Roman"/>
+          <w:b w:val="false"/>
+          <w:bCs w:val="false"/>
+          <w:i w:val="false"/>
+          <w:iCs w:val="false"/>
+          <w:smallCaps w:val="false"/>
+          <w:sz w:val="20"/>
+          <w:szCs w:val="20"/>
+        </w:rPr>
+        <w:t xml:space="preserve">Human labelling. Two annotators independently labelled 300 pull requests as clear or unclear from the code change alone; Cohen's κ [15] was 0.21 (fair, observed agreement 98%). The 7 disagreements were adjudicated by an AI model (Claude (claude-opus-5-5, AI)) applying the same codebook, at the authors' request; these 7 labels are therefore not human judgements. Thresholds were frozen on a development split of these labels (300 labelled, 4 ambiguous) before any threshold-dependent evaluation; note that Study A itself ran with the default thresholds.</w:t>
+      </w:r>
+    </w:p>
+    <w:p>
+      <w:pPr>
+        <w:keepNext/>
+        <w:spacing w:after="80" w:before="160"/>
+        <w:jc w:val="center"/>
+      </w:pPr>
+      <w:r>
+        <w:rPr>
+          <w:rFonts w:ascii="Times New Roman" w:cs="Times New Roman" w:eastAsia="Times New Roman" w:hAnsi="Times New Roman"/>
+          <w:b w:val="false"/>
+          <w:bCs w:val="false"/>
+          <w:i w:val="false"/>
+          <w:iCs w:val="false"/>
+          <w:smallCaps/>
+          <w:sz w:val="20"/>
+          <w:szCs w:val="20"/>
+        </w:rPr>
+        <w:t xml:space="preserve">VIII. </w:t>
+      </w:r>
+      <w:r>
+        <w:rPr>
+          <w:rFonts w:ascii="Times New Roman" w:cs="Times New Roman" w:eastAsia="Times New Roman" w:hAnsi="Times New Roman"/>
+          <w:b w:val="false"/>
+          <w:bCs w:val="false"/>
+          <w:i w:val="false"/>
+          <w:iCs w:val="false"/>
+          <w:smallCaps/>
+          <w:sz w:val="20"/>
+          <w:szCs w:val="20"/>
+        </w:rPr>
+        <w:t xml:space="preserve">Conclusion</w:t>
+      </w:r>
+    </w:p>
+    <w:p>
+      <w:pPr>
+        <w:keepNext w:val="false"/>
+        <w:spacing w:after="40" w:before="0" w:line="240"/>
+        <w:ind w:firstLine="202"/>
+        <w:jc w:val="both"/>
+      </w:pPr>
+      <w:r>
+        <w:rPr>
+          <w:rFonts w:ascii="Times New Roman" w:cs="Times New Roman" w:eastAsia="Times New Roman" w:hAnsi="Times New Roman"/>
+          <w:b w:val="false"/>
+          <w:bCs w:val="false"/>
+          <w:i w:val="false"/>
+          <w:iCs w:val="false"/>
+          <w:smallCaps w:val="false"/>
+          <w:sz w:val="20"/>
+          <w:szCs w:val="20"/>
+        </w:rPr>
+        <w:t xml:space="preserve">ClarifyReview inserts a decision before critique: ask the author when the intent of a change cannot be read from the change. Evaluating the idea required withholding all natural-language intent, because golden patches document their own. With that manipulation, clarification recovered 0.17 of the intent gap on 36 instances—in the expected direction, not significant at this size—and a per-instance trace shows it succeeded where it was given the chance, with detector recall as the limit. A second reviewer, a small local model, and a second judge reproduce the null result: gap recovery was 0.09 (interval -0.22 to 0.33, McNemar p = 0.66), not significant, and its upper limit rules out recovering more than about a third of the gap. The effect size depends on the judge. Future work is labelling the 356 real pull requests already collected (none is labelled yet), a paired developer study of usefulness and trust, deploying the bot against live GitHub, repeated reviews per condition to separate the effect from the reviewer's run-to-run variation, and a larger run with a stronger reviewer.</w:t>
       </w:r>
     </w:p>
     <w:p>

</xml_diff>

<commit_message>
Report the live GitHub run in the paper, report and deck
The bot and the CLI ran end to end on two constructed pull requests in the
team's sandbox repository: the CLI with --post on one, the webhook bot behind a
tunnel on the other. experiments/export_live_demo.py snapshots both runs from the
local run log into data/live_demo.json, collect.py turns it into numbers with
acceptance asserts, and the documents describe it as a demonstration, not an
evaluation. The 'not yet run against live GitHub' claims are replaced; permanent
hosting and runs on third-party pull requests stay future work. A stale threats
bullet that said the new v3 rows had no Gemini run is corrected.

CLI runs against a real PR now log as github_live instead of the study's
stripped_clarify condition; local --diff runs are unchanged.

Co-Authored-By: Claude Opus 5.5 <noreply@anthropic.com>
</commit_message>
<xml_diff>
--- a/paper/ClarifyReview_Paper_Draft.docx
+++ b/paper/ClarifyReview_Paper_Draft.docx
@@ -749,7 +749,28 @@
           <w:sz w:val="20"/>
           <w:szCs w:val="20"/>
         </w:rPr>
-        <w:t xml:space="preserve">The single-pass baseline is not separate code: it is the same pipeline with a detector that never asks, and a test asserts that, with the detector forced to proceed, both conditions render byte-identical prompts. Stage 3 talks to the author through a Responder protocol with three implementations—a GitHub responder that posts a comment and waits, a benchmark responder that calls a simulated author, and a null responder—so the experiment exercises the code that would be deployed. The system is written in Python, runs as a GitHub App or from a command line, records every run to an SQLite log, and is covered by 446 automated tests. Three provider backends sit behind one interface: Gemini, Anthropic and local Ollama. The Ollama backend runs a model on the user's own machine, with no key, no traffic beyond that machine and no monetary cost. Parked runs persist in SQLite across restarts, a timeout sweep publishes reviews that go unanswered, rate limits are handled, and signed webhooks are verified. The bot has been exercised end to end on a local server, but it has not yet been run against live GitHub.</w:t>
+        <w:t xml:space="preserve">The single-pass baseline is not separate code: it is the same pipeline with a detector that never asks, and a test asserts that, with the detector forced to proceed, both conditions render byte-identical prompts. Stage 3 talks to the author through a Responder protocol with three implementations—a GitHub responder that posts a comment and waits, a benchmark responder that calls a simulated author, and a null responder—so the experiment exercises the code that would be deployed. The system is written in Python, runs as a GitHub App or from a command line, records every run to an SQLite log, and is covered by 455 automated tests. Three provider backends sit behind one interface: Gemini, Anthropic and local Ollama. The Ollama backend runs a model on the user's own machine, with no key, no traffic beyond that machine and no monetary cost. Parked runs persist in SQLite across restarts, a timeout sweep publishes reviews that go unanswered, rate limits are handled, and signed webhooks are verified. The bot passes offline end-to-end tests and has also been run on live GitHub in a sandbox repository, as described below.</w:t>
+      </w:r>
+    </w:p>
+    <w:p>
+      <w:pPr>
+        <w:keepNext w:val="false"/>
+        <w:spacing w:after="40" w:before="0" w:line="240"/>
+        <w:ind w:firstLine="202"/>
+        <w:jc w:val="both"/>
+      </w:pPr>
+      <w:r>
+        <w:rPr>
+          <w:rFonts w:ascii="Times New Roman" w:cs="Times New Roman" w:eastAsia="Times New Roman" w:hAnsi="Times New Roman"/>
+          <w:b w:val="false"/>
+          <w:bCs w:val="false"/>
+          <w:i w:val="false"/>
+          <w:iCs w:val="false"/>
+          <w:smallCaps w:val="false"/>
+          <w:sz w:val="20"/>
+          <w:szCs w:val="20"/>
+        </w:rPr>
+        <w:t xml:space="preserve">A demonstration, not an evaluation: 2 constructed pull requests in the authors' sandbox repository. On the first, reviewed from the command line, the detector asked (score 0.89, threshold 0.50) and the author confirmed that the removed email check was intentional, raising the reviewer's confidence from 80% to 100%; the verdict was approve. On the second, reviewed by the webhook bot behind a tunnel, the answer showed that removing the disabled-account check was unintended, and the bot requested changes with 1 major correctness finding. The bot retried through 3 transient provider errors. The run used a laptop, a free-tier quota and a heuristic detector, so it estimates no rate or effect.</w:t>
       </w:r>
     </w:p>
     <w:p>
@@ -7364,7 +7385,7 @@
           <w:sz w:val="20"/>
           <w:szCs w:val="20"/>
         </w:rPr>
-        <w:t xml:space="preserve">The replication adds further limits. Both studies have small samples: the original study has 36 instances and the replication 96, so intervals are wide. The replication's agent judge was chosen after seeing its agreement with the local judge, which makes the choice post hoc. The question and oracle model, n/a, is small, and its identity is recorded in the oracle log but not per database row. The two studies differ in reviewer, judge and rows, and they are never pooled. Running the full replication set on the original reviewer showed that the reviewer's own run-to-run variation is as large as the effect being measured, so a single review per condition cannot resolve it. The bot has not been run against live GitHub, and the 356 collected real pull requests are not yet labelled.</w:t>
+        <w:t xml:space="preserve">The replication adds further limits. Both studies have small samples: the original has 36 instances and the replication 96, so intervals are wide. The agent judge was chosen after seeing its agreement with the local judge, which makes the choice post hoc. The question and oracle model is small, and its identity is recorded in the oracle log but not per database row. The studies differ in reviewer and judge as well as in rows, and they are never pooled. A single review per condition cannot separate the effect from the reviewer's own run-to-run variation. The live GitHub demonstration covers 2 constructed pull requests in the authors' own sandbox repository, run from a laptop behind a tunnel; it shows that the loop works but estimates nothing. Live deployment on real third-party pull requests is not done, and the 356 collected real pull requests are not yet labelled.</w:t>
       </w:r>
     </w:p>
     <w:p>
@@ -7439,7 +7460,7 @@
           <w:sz w:val="20"/>
           <w:szCs w:val="20"/>
         </w:rPr>
-        <w:t xml:space="preserve">ClarifyReview inserts a decision before critique: ask the author when the intent of a change cannot be read from the change. Evaluating the idea required withholding all natural-language intent, because golden patches document their own. With that manipulation, clarification recovered 0.17 of the intent gap on 36 instances—in the expected direction, not significant at this size—and a per-instance trace shows it succeeded where it was given the chance, with detector recall as the limit. A second reviewer, a small local model, and a second judge reproduce the null result: gap recovery was 0.09 (interval -0.22 to 0.33, McNemar p = 0.66), not significant, and its upper limit rules out recovering more than about a third of the gap. The effect size depends on the judge. Future work is labelling the 356 real pull requests already collected (none is labelled yet), a paired developer study of usefulness and trust, deploying the bot against live GitHub, repeated reviews per condition to separate the effect from the reviewer's run-to-run variation, and a larger run with a stronger reviewer.</w:t>
+        <w:t xml:space="preserve">ClarifyReview inserts a decision before critique: ask the author when the intent of a change cannot be read from the change. Evaluating the idea required withholding all natural-language intent, because golden patches document their own. With that manipulation, clarification recovered 0.17 of the intent gap on 36 instances—in the expected direction, not significant at this size—and a per-instance trace shows it succeeded where it was given the chance, with detector recall as the limit. A second reviewer, a small local model, and a second judge reproduce the null result: gap recovery was 0.09 (interval -0.22 to 0.33, McNemar p = 0.66), not significant, and its upper limit rules out recovering more than about a third of the gap. The effect size depends on the judge. Future work is labelling the 356 real pull requests already collected (none is labelled yet), a paired developer study of usefulness and trust, permanent hosting of the bot and a run on real third-party pull requests at scale, repeated reviews per condition to separate the effect from the reviewer's run-to-run variation, and a larger run with a stronger reviewer.</w:t>
       </w:r>
     </w:p>
     <w:p>

</xml_diff>

<commit_message>
Rewrite the conference paper in the authors' own words
The abstract and Sections I-VIII now carry the authors' rewritten text. Every
number in it is still bound to numbers.json, so a re-run keeps the prose and the
data in step. Em and en dashes are gone throughout: ranges read 'a to b', asides
use commas or parentheses. Two small accuracy fixes to the new text: the
original study drew its defective variants from the 32 verified mutants rather
than using all of them, and the frozen thresholds rested on four ambiguous
labels in total, not four in the development split. The AI-written prose slots
the paper no longer uses are removed from the prose spec.

Co-Authored-By: Claude Opus 5.5 <noreply@anthropic.com>
</commit_message>
<xml_diff>
--- a/paper/ClarifyReview_Paper_Draft.docx
+++ b/paper/ClarifyReview_Paper_Draft.docx
@@ -108,7 +108,7 @@
           <w:sz w:val="18"/>
           <w:szCs w:val="18"/>
         </w:rPr>
-        <w:t xml:space="preserve">—LLM-based pull request reviewers read a change once, infer what its author intended, and comment on that inference; when the intent is ambiguous they guess. We present ClarifyReview, a reviewer that decides before critiquing whether the available context is sufficient, and asks the author a targeted question when it is not. Its single-pass baseline is the same pipeline with a detector that never asks, so the two differ in one stage. We evaluate it in a two-by-three ablation on SWE-bench Verified, crossing correct and execution-verified defective patches (32 mutants) with three conditions: intent withheld, intent withheld with clarification, and full context. A pilot showed that withholding only the linked issue leaves intent recoverable from the patch itself; withholding every natural-language statement of intent opened a gap. On 36 instances, intent recovery was 81% without clarification, 83% with it and 97% with full context (gap recovery 0.17, McNemar p = 1.00). Tracing each instance shows that clarification recovered intent where it was given the chance, and that the binding limit is detector recall: the detector flagged 2 of the 7 changes the reviewer misread. Defect detection was low in every condition, including full context, so it is limited by the reviewer rather than by missing intent. A replication with a local model (qwen3:4b-instruct-2507-q4_K_M) on 96 instances finds intent recovery of 67% without clarification, 70% with it and 100% with full context. Gap recovery was 0.09 (interval -0.22 to 0.33), not significant, and the upper limit rules out recovering more than a third of the gap. Re-scoring with the agent judge preserved this verdict but not the effect size. Running the replication set on the original reviewer raised intent recovery from 65% to 72%, but 10 of the 11 changed outcomes came from instances where no question was asked, so the difference is reviewer variation, not clarification. We release the system, harness, verified mutants and study log.</w:t>
+        <w:t xml:space="preserve">: LLM-based pull request reviewers typically inspect a change, infer the author's intent, and generate comments based on that interpretation. When the intent is unclear, the reviewer may make an incorrect assumption. We introduce ClarifyReview, a system that checks whether the available context is sufficient before producing feedback and asks the author a focused question when additional information is needed. The single-pass baseline uses the same pipeline but disables clarification, allowing us to isolate the effect of this decision stage. We evaluate ClarifyReview on SWE-bench Verified using a two-by-three ablation that includes correct patches and defective variants drawn from 32 execution-verified mutants. Each instance is assessed under three conditions: with intent withheld, with intent withheld but clarification enabled, and with full context available. An initial pilot showed that removing only the linked issue was insufficient because the patch itself often revealed its purpose. We therefore removed all natural-language statements of intent while preserving the code. Across 36 instances, intent recovery was 81% without clarification, 83% with clarification, and 97% with full context. The resulting gap recovery was 0.17, with a McNemar p-value of 1.00. Instance-level analysis suggests that clarification can recover intent when the detector identifies a need to ask, but detector recall remains a major limitation: it flagged only two of the seven changes whose intent the reviewer misinterpreted. Defect detection remained low even with full context, indicating that the reviewer's ability to identify defects, rather than missing intent alone, limits performance. We also replicated the experiment on 96 instances using a local model, qwen3:4b-instruct-2507-q4_K_M. Intent recovery was 67% without clarification, 70% with clarification, and 100% with full context. Gap recovery was 0.09 (95% interval: -0.22 to 0.33), which was not statistically significant. Re-scoring the original study with an alternative judge preserved the overall conclusion, although the estimated effect changed. When the replication set was evaluated using the original reviewer, intent recovery increased from 65% to 72%. However, ten of the eleven instances with changed outcomes involved cases where no clarification question was asked, suggesting that run-to-run reviewer variation, rather than clarification, explains most of this difference. We release the system, evaluation harness, verified mutants, and study log.</w:t>
       </w:r>
     </w:p>
     <w:p>
@@ -147,7 +147,7 @@
           <w:sz w:val="18"/>
           <w:szCs w:val="18"/>
         </w:rPr>
-        <w:t xml:space="preserve">—automated code review, large language models, intent clarification, ambiguity detection, mutation testing, empirical software engineering</w:t>
+        <w:t xml:space="preserve">: automated code review, large language models, intent clarification, ambiguity detection, mutation testing, empirical software engineering.</w:t>
       </w:r>
     </w:p>
     <w:p>
@@ -201,7 +201,7 @@
           <w:sz w:val="20"/>
           <w:szCs w:val="20"/>
         </w:rPr>
-        <w:t xml:space="preserve">Code review is a persistent bottleneck in software delivery, and most of a reviewer's effort goes into understanding what a change is for [1], [2]. Tools such as CodeRabbit, Qodo and Greptile now use large language models (LLMs) to review pull requests automatically [3]. All of them explain their comments, so explanation is no longer distinguishing. What they share is a structural limitation: each reviews a pull request in a single pass, inferring the author's intent and commenting on that inference as though it were established.</w:t>
+        <w:t xml:space="preserve">Code review remains a bottleneck in software development, with much of a reviewer's effort spent understanding the purpose of a change [1], [2]. Tools such as CodeRabbit, Qodo, and Greptile use large language models (LLMs) to review pull requests automatically [3]. Although these tools can explain their findings, they share a limitation: they inspect a pull request in a single pass and provide feedback based on an inferred interpretation of the author's intent, even when that interpretation is uncertain.</w:t>
       </w:r>
     </w:p>
     <w:p>
@@ -222,7 +222,7 @@
           <w:sz w:val="20"/>
           <w:szCs w:val="20"/>
         </w:rPr>
-        <w:t xml:space="preserve">When the change is ambiguous—a validation check removed with no linked issue and a commit message reading only "fix"—a human reviewer asks. Current tools do not. They commit to a reading, producing false alarms on intentional changes and missed defects on unintentional ones, and both erode the trust that keeps such tools switched on.</w:t>
+        <w:t xml:space="preserve">Consider a change that removes a validation check without a linked issue or a descriptive commit message. A human reviewer would typically ask the author why the check was removed. Existing automated reviewers generally proceed with the information available. If their interpretation is wrong, they may flag an intentional change as defective or overlook a genuine defect. Both outcomes can undermine the trust developers place in automated review tools.</w:t>
       </w:r>
     </w:p>
     <w:p>
@@ -243,27 +243,28 @@
           <w:sz w:val="20"/>
           <w:szCs w:val="20"/>
         </w:rPr>
-        <w:t xml:space="preserve">Clarification-seeking improves code generation [4], [5], but we are not aware of work applying it to review of an existing change, where a wrong guess costs a human reviewer's attention rather than a compiler cycle. We ask whether a reviewer that asks before critiquing understands and detects more than one that does not. This paper makes five contributions:</w:t>
+        <w:t xml:space="preserve">Clarification has been studied in code generation [4], [5], but its application to reviewing existing changes remains less explored. The setting is different: an incorrect assumption during code generation may lead to an unsuccessful result, whereas an incorrect review can cost a developer time and attention. This raises a practical question: can a reviewer that asks for clarification before commenting interpret changes and identify defects more effectively than one that proceeds without asking?</w:t>
       </w:r>
     </w:p>
     <w:p>
       <w:pPr>
         <w:keepNext w:val="false"/>
         <w:spacing w:after="40" w:before="0" w:line="240"/>
-        <w:jc w:val="both"/>
-      </w:pPr>
-      <w:r>
-        <w:rPr>
-          <w:rFonts w:ascii="Times New Roman" w:cs="Times New Roman" w:eastAsia="Times New Roman" w:hAnsi="Times New Roman"/>
-          <w:b w:val="false"/>
-          <w:bCs w:val="false"/>
-          <w:i w:val="false"/>
-          <w:iCs w:val="false"/>
-          <w:smallCaps w:val="false"/>
-          <w:sz w:val="20"/>
-          <w:szCs w:val="20"/>
-        </w:rPr>
-        <w:t xml:space="preserve">1) ClarifyReview, a four-stage reviewer whose second stage decides per pull request whether to ask, with four interchangeable detector designs and a baseline that differs from it in exactly one stage;</w:t>
+        <w:ind w:firstLine="202"/>
+        <w:jc w:val="both"/>
+      </w:pPr>
+      <w:r>
+        <w:rPr>
+          <w:rFonts w:ascii="Times New Roman" w:cs="Times New Roman" w:eastAsia="Times New Roman" w:hAnsi="Times New Roman"/>
+          <w:b w:val="false"/>
+          <w:bCs w:val="false"/>
+          <w:i w:val="false"/>
+          <w:iCs w:val="false"/>
+          <w:smallCaps w:val="false"/>
+          <w:sz w:val="20"/>
+          <w:szCs w:val="20"/>
+        </w:rPr>
+        <w:t xml:space="preserve">This paper makes five contributions:</w:t>
       </w:r>
     </w:p>
     <w:p>
@@ -283,7 +284,7 @@
           <w:sz w:val="20"/>
           <w:szCs w:val="20"/>
         </w:rPr>
-        <w:t xml:space="preserve">2) an evaluation design for intent-dependent review on SWE-bench [6]: a manipulation that withholds all natural-language intent while leaving code untouched, and 32 execution-verified defects;</w:t>
+        <w:t xml:space="preserve">1) We introduce ClarifyReview, a four-stage review system in which the second stage decides whether clarification is needed for each pull request. The system supports four interchangeable ambiguity detectors and uses a baseline that differs only in this decision stage.</w:t>
       </w:r>
     </w:p>
     <w:p>
@@ -303,7 +304,7 @@
           <w:sz w:val="20"/>
           <w:szCs w:val="20"/>
         </w:rPr>
-        <w:t xml:space="preserve">3) a two-by-three ablation with a per-instance trace that separates the value of an answer from the chance to ask, locating the limit of the approach in detector recall;</w:t>
+        <w:t xml:space="preserve">2) We develop an evaluation design for intent-dependent code review on SWE-bench [6]. It removes natural-language statements of intent without modifying the code and includes 32 defects verified through execution.</w:t>
       </w:r>
     </w:p>
     <w:p>
@@ -323,7 +324,27 @@
           <w:sz w:val="20"/>
           <w:szCs w:val="20"/>
         </w:rPr>
-        <w:t xml:space="preserve">4) an account of a pilot whose principal result was a correction to the evaluation design, and of a protocol deviation, both reported in full; and</w:t>
+        <w:t xml:space="preserve">3) We conduct a two-by-three ablation and trace individual instances to distinguish the value of an author's answer from the detector's ability to identify when a question is needed. The analysis identifies detector recall as a key limitation.</w:t>
+      </w:r>
+    </w:p>
+    <w:p>
+      <w:pPr>
+        <w:keepNext w:val="false"/>
+        <w:spacing w:after="40" w:before="0" w:line="240"/>
+        <w:jc w:val="both"/>
+      </w:pPr>
+      <w:r>
+        <w:rPr>
+          <w:rFonts w:ascii="Times New Roman" w:cs="Times New Roman" w:eastAsia="Times New Roman" w:hAnsi="Times New Roman"/>
+          <w:b w:val="false"/>
+          <w:bCs w:val="false"/>
+          <w:i w:val="false"/>
+          <w:iCs w:val="false"/>
+          <w:smallCaps w:val="false"/>
+          <w:sz w:val="20"/>
+          <w:szCs w:val="20"/>
+        </w:rPr>
+        <w:t xml:space="preserve">4) We report an initial pilot that led to changes in the evaluation design, together with a protocol deviation and the steps taken to address it.</w:t>
       </w:r>
     </w:p>
     <w:p>
@@ -343,7 +364,7 @@
           <w:sz w:val="20"/>
           <w:szCs w:val="20"/>
         </w:rPr>
-        <w:t xml:space="preserve">5) a judge-calibration analysis of AI-vs-AI agreement across three AI judges, and a replication on a local reviewer that is reported separately from the original study.</w:t>
+        <w:t xml:space="preserve">5) We examine agreement among three AI judges and replicate the experiment using a local reviewer. The replication is reported separately from the original study.</w:t>
       </w:r>
     </w:p>
     <w:p>
@@ -395,7 +416,7 @@
           <w:sz w:val="20"/>
           <w:szCs w:val="20"/>
         </w:rPr>
-        <w:t xml:space="preserve">A. Automated code review</w:t>
+        <w:t xml:space="preserve">A. Automated Code Review</w:t>
       </w:r>
     </w:p>
     <w:p>
@@ -416,7 +437,7 @@
           <w:sz w:val="20"/>
           <w:szCs w:val="20"/>
         </w:rPr>
-        <w:t xml:space="preserve">Empirical studies at Microsoft and Google found that understanding a change is the reviewer's first and costliest task [1], [2]. Learned reviewers generate comments from review data [7], [8], and deployed LLM tools differ mainly in how much repository context they retrieve [3]. All are single-pass; none resolves intent before commenting.</w:t>
+        <w:t xml:space="preserve">Studies at Microsoft and Google identified understanding a proposed change as one of the most demanding parts of code review [1], [2]. Learning-based reviewers generate comments from historical review data [7], [8], while deployed LLM-based tools vary in how they retrieve and use repository context [3]. These approaches generally produce feedback in a single pass. ClarifyReview instead introduces a decision point at which the system can request additional information before evaluating the change.</w:t>
       </w:r>
     </w:p>
     <w:p>
@@ -435,7 +456,7 @@
           <w:sz w:val="20"/>
           <w:szCs w:val="20"/>
         </w:rPr>
-        <w:t xml:space="preserve">B. Clarification in code generation</w:t>
+        <w:t xml:space="preserve">B. Clarification in Code Generation</w:t>
       </w:r>
     </w:p>
     <w:p>
@@ -456,7 +477,7 @@
           <w:sz w:val="20"/>
           <w:szCs w:val="20"/>
         </w:rPr>
-        <w:t xml:space="preserve">ClarifyGPT detects ambiguous requirements through a code-consistency check and asks targeted questions before generating code, improving Pass@1 [4]. TiCoder clarifies intent through generated tests and, in a fifteen-person study, improved correctness judgement and lowered cognitive load [5]. Both concern greenfield generation; both show that asking must be scaffolded and selective.</w:t>
+        <w:t xml:space="preserve">ClarifyGPT identifies ambiguous requirements using a code-consistency check and asks targeted questions before generating code, improving Pass@1 performance [4]. TiCoder uses generated tests to help clarify user intent and reports improvements in correctness judgement and reductions in cognitive load in a study involving fifteen participants [5]. Both systems focus on generating new code rather than reviewing existing changes. Their findings also highlight the importance of making clarification targeted and selective rather than asking questions indiscriminately.</w:t>
       </w:r>
     </w:p>
     <w:p>
@@ -475,7 +496,7 @@
           <w:sz w:val="20"/>
           <w:szCs w:val="20"/>
         </w:rPr>
-        <w:t xml:space="preserve">C. Uncertainty quantification</w:t>
+        <w:t xml:space="preserve">C. Uncertainty Quantification</w:t>
       </w:r>
     </w:p>
     <w:p>
@@ -496,7 +517,7 @@
           <w:sz w:val="20"/>
           <w:szCs w:val="20"/>
         </w:rPr>
-        <w:t xml:space="preserve">Self-consistency treats disagreement across samples as a signal [9]; semantic uncertainty clusters samples by meaning before measuring dispersion [10]. We adapt both to measure instability in a reviewer's reading of a change's intent.</w:t>
+        <w:t xml:space="preserve">Self-consistency uses disagreement among multiple generated samples as an indicator of uncertainty [9]. Semantic uncertainty groups responses according to their meaning before measuring variation [10]. We adapt these ideas to assess how consistently a reviewer interprets the intent behind a code change. The aim is to identify cases where the reviewer's interpretation may be unstable enough to warrant clarification.</w:t>
       </w:r>
     </w:p>
     <w:p>
@@ -515,7 +536,7 @@
           <w:sz w:val="20"/>
           <w:szCs w:val="20"/>
         </w:rPr>
-        <w:t xml:space="preserve">D. Benchmarks and evaluation</w:t>
+        <w:t xml:space="preserve">D. Benchmarks and Evaluation</w:t>
       </w:r>
     </w:p>
     <w:p>
@@ -536,7 +557,7 @@
           <w:sz w:val="20"/>
           <w:szCs w:val="20"/>
         </w:rPr>
-        <w:t xml:space="preserve">SWE-bench pairs real issues with the patches that resolved them and the tests those patches make pass [6]; its Verified subset was validated by human annotators [11]. Known tests allow defective variants whose defectiveness is established by execution [12]. LLM judges agree with human raters about as often as humans agree, with known biases including self-preference [13], which motivates using a judge from a different model family than the reviewer.</w:t>
+        <w:t xml:space="preserve">SWE-bench links real software issues to the patches that resolve them and the tests that those patches pass [6]. Its Verified subset underwent human validation [11]. Existing test suites can also be used to assess defective patch variants by checking whether the original patch passes the relevant tests while the modified version fails them [12]. LLM-based judges provide another way to evaluate generated reviews, but their assessments can exhibit biases, including preferences for outputs from their own model family [13]. For this reason, our evaluation uses a judge from a different model family than the reviewer and separately examines agreement between judges.</w:t>
       </w:r>
     </w:p>
     <w:p>
@@ -590,7 +611,7 @@
           <w:sz w:val="20"/>
           <w:szCs w:val="20"/>
         </w:rPr>
-        <w:t xml:space="preserve">ClarifyReview has four stages (Fig. 1). Stage 1 parses the diff and resolves changed lines to changed symbols using the Python AST for Python and tree-sitter grammars for JavaScript, TypeScript/TSX, Java, C, C++ and Rust, with Python behaviour byte-identical to before, assembling a bounded context in a deterministic order and fingerprinting it. Stage 2 decides whether to ask. Stage 3 generates at most two questions—each required by its output schema to name a file, line or symbol, so that it cannot degenerate into "please explain this PR"—and sends them through a Responder. Stage 4 produces structured findings with severity, category, evidence, suggested fix and confidence.</w:t>
+        <w:t xml:space="preserve">ClarifyReview consists of four stages, as shown in Fig. 1. Stage 1 parses the diff and maps changed lines to the corresponding symbols. It uses the Python Abstract Syntax Tree (AST) for Python and tree-sitter grammars for JavaScript, TypeScript/TSX, Java, C, C++, and Rust. The system then builds a bounded context in a deterministic order and computes its fingerprint. Python behaviour remains byte-identical to the previous implementation. Stage 2 determines whether clarification is needed. If the detector decides to ask, Stage 3 generates at most two questions and sends them through a Responder. Each question must identify a file, line, or symbol, preventing vague requests such as "please explain this PR." Stage 4 produces structured review findings containing severity, category, evidence, a suggested fix, and confidence.</w:t>
       </w:r>
     </w:p>
     <w:p>
@@ -669,7 +690,7 @@
           <w:sz w:val="16"/>
           <w:szCs w:val="16"/>
         </w:rPr>
-        <w:t xml:space="preserve">ClarifyReview's four stages. Stage 2 is the decision point; when it proceeds, Stage 3 does not run.</w:t>
+        <w:t xml:space="preserve">The four stages of ClarifyReview. Stage 2 determines whether clarification is needed; Stage 3 is skipped when the system proceeds directly to review.</w:t>
       </w:r>
     </w:p>
     <w:p>
@@ -688,7 +709,7 @@
           <w:sz w:val="20"/>
           <w:szCs w:val="20"/>
         </w:rPr>
-        <w:t xml:space="preserve">A. Ambiguity detectors</w:t>
+        <w:t xml:space="preserve">A. Ambiguity Detectors</w:t>
       </w:r>
     </w:p>
     <w:p>
@@ -709,7 +730,7 @@
           <w:sz w:val="20"/>
           <w:szCs w:val="20"/>
         </w:rPr>
-        <w:t xml:space="preserve">Four detectors implement one interface, score(context) → s ∈ [0, 1], and a shared decision asks when s ≥ τ for a threshold τ frozen in configuration. The heuristic combines fifteen diff features—missing linked issue, generic commit message, removed guard, no test alongside, public symbol touched, deletion ratio and others—as weighted evidence, s = Σ wᵢfᵢ / Σ wᵢ, so the score reads as the fraction of ambiguity evidence present; it makes no model call. A logistic-regression classifier learns weights over the same features from labelled pull requests. Two uncertainty detectors sample eight one-sentence hypotheses about what the change is for—by temperature sampling, or by perturbing the prompt at fixed temperature—and score their mean pairwise embedding distance and semantic entropy.</w:t>
+        <w:t xml:space="preserve">The four detectors share a common interface that maps a context to a score s ∈ [0, 1]. A shared decision rule triggers clarification when s ≥ τ, where the threshold τ is fixed in the configuration. The heuristic detector combines fifteen diff features, including the absence of a linked issue, a generic commit message, a removed guard, the lack of an accompanying test, changes to public symbols, and the deletion ratio. These features contribute weighted evidence according to s = Σᵢ wᵢfᵢ / Σᵢ wᵢ, where fᵢ represents a feature and wᵢ its weight. The detector requires no model call. A logistic-regression classifier learns weights for the same features from labelled pull requests. The other two detectors estimate uncertainty by generating eight one-sentence hypotheses about the purpose of a change. One uses temperature sampling, while the other perturbs the prompt at a fixed temperature. Both assess the resulting hypotheses using mean pairwise embedding distance and semantic entropy.</w:t>
       </w:r>
     </w:p>
     <w:p>
@@ -728,7 +749,7 @@
           <w:sz w:val="20"/>
           <w:szCs w:val="20"/>
         </w:rPr>
-        <w:t xml:space="preserve">B. One pipeline, two conditions</w:t>
+        <w:t xml:space="preserve">B. One Pipeline, Two Conditions</w:t>
       </w:r>
     </w:p>
     <w:p>
@@ -749,7 +770,7 @@
           <w:sz w:val="20"/>
           <w:szCs w:val="20"/>
         </w:rPr>
-        <w:t xml:space="preserve">The single-pass baseline is not separate code: it is the same pipeline with a detector that never asks, and a test asserts that, with the detector forced to proceed, both conditions render byte-identical prompts. Stage 3 talks to the author through a Responder protocol with three implementations—a GitHub responder that posts a comment and waits, a benchmark responder that calls a simulated author, and a null responder—so the experiment exercises the code that would be deployed. The system is written in Python, runs as a GitHub App or from a command line, records every run to an SQLite log, and is covered by 455 automated tests. Three provider backends sit behind one interface: Gemini, Anthropic and local Ollama. The Ollama backend runs a model on the user's own machine, with no key, no traffic beyond that machine and no monetary cost. Parked runs persist in SQLite across restarts, a timeout sweep publishes reviews that go unanswered, rate limits are handled, and signed webhooks are verified. The bot passes offline end-to-end tests and has also been run on live GitHub in a sandbox repository, as described below.</w:t>
+        <w:t xml:space="preserve">The single-pass baseline does not use a separate implementation. It runs the same pipeline with clarification disabled. An automated test verifies that, when the detector is forced to proceed without asking, the two conditions produce byte-identical prompts.</w:t>
       </w:r>
     </w:p>
     <w:p>
@@ -770,7 +791,83 @@
           <w:sz w:val="20"/>
           <w:szCs w:val="20"/>
         </w:rPr>
-        <w:t xml:space="preserve">A demonstration, not an evaluation: 2 constructed pull requests in the authors' sandbox repository. On the first, reviewed from the command line, the detector asked (score 0.89, threshold 0.50) and the author confirmed that the removed email check was intentional, raising the reviewer's confidence from 80% to 100%; the verdict was approve. On the second, reviewed by the webhook bot behind a tunnel, the answer showed that removing the disabled-account check was unintended, and the bot requested changes with 1 major correctness finding. The bot retried through 3 transient provider errors. The run used a laptop, a free-tier quota and a heuristic detector, so it estimates no rate or effect.</w:t>
+        <w:t xml:space="preserve">Stage 3 communicates with the author through a Responder interface with three implementations: a GitHub responder that posts a comment and waits for a reply, a benchmark responder that queries a simulated author, and a null responder. This design allows the experiment to exercise the same interaction code intended for deployment.</w:t>
+      </w:r>
+    </w:p>
+    <w:p>
+      <w:pPr>
+        <w:keepNext w:val="false"/>
+        <w:spacing w:after="40" w:before="0" w:line="240"/>
+        <w:ind w:firstLine="202"/>
+        <w:jc w:val="both"/>
+      </w:pPr>
+      <w:r>
+        <w:rPr>
+          <w:rFonts w:ascii="Times New Roman" w:cs="Times New Roman" w:eastAsia="Times New Roman" w:hAnsi="Times New Roman"/>
+          <w:b w:val="false"/>
+          <w:bCs w:val="false"/>
+          <w:i w:val="false"/>
+          <w:iCs w:val="false"/>
+          <w:smallCaps w:val="false"/>
+          <w:sz w:val="20"/>
+          <w:szCs w:val="20"/>
+        </w:rPr>
+        <w:t xml:space="preserve">The system is written in Python and runs either as a GitHub App or from the command line. It records each run in an SQLite database and is covered by 455 automated tests. Three provider backends implement a common interface: Gemini, Anthropic, and local Ollama. The Ollama backend runs the model on the user's machine without an API key, external model traffic, or per-call monetary cost. Pending runs persist across restarts, and a timeout mechanism publishes reviews when authors do not respond. The system also handles rate limits and verifies signed webhooks. It passes offline end-to-end tests and has been exercised on live GitHub in a sandbox repository.</w:t>
+      </w:r>
+    </w:p>
+    <w:p>
+      <w:pPr>
+        <w:keepNext w:val="false"/>
+        <w:spacing w:after="40" w:before="0" w:line="240"/>
+        <w:ind w:firstLine="202"/>
+        <w:jc w:val="both"/>
+      </w:pPr>
+      <w:r>
+        <w:rPr>
+          <w:rFonts w:ascii="Times New Roman" w:cs="Times New Roman" w:eastAsia="Times New Roman" w:hAnsi="Times New Roman"/>
+          <w:b w:val="false"/>
+          <w:bCs w:val="false"/>
+          <w:i/>
+          <w:iCs/>
+          <w:smallCaps w:val="false"/>
+          <w:sz w:val="20"/>
+          <w:szCs w:val="20"/>
+        </w:rPr>
+        <w:t xml:space="preserve">Sandbox demonstration, not an evaluation. </w:t>
+      </w:r>
+      <w:r>
+        <w:rPr>
+          <w:rFonts w:ascii="Times New Roman" w:cs="Times New Roman" w:eastAsia="Times New Roman" w:hAnsi="Times New Roman"/>
+          <w:b w:val="false"/>
+          <w:bCs w:val="false"/>
+          <w:i w:val="false"/>
+          <w:iCs w:val="false"/>
+          <w:smallCaps w:val="false"/>
+          <w:sz w:val="20"/>
+          <w:szCs w:val="20"/>
+        </w:rPr>
+        <w:t xml:space="preserve">We tested two constructed pull requests in the authors' sandbox repository. In the first, reviewed from the command line, the detector asked a question at a score of 0.89, above the threshold of 0.50. The author confirmed that removing the email check was intentional, and the reviewer's confidence increased from 80% to 100%. The final verdict was to approve the change.</w:t>
+      </w:r>
+    </w:p>
+    <w:p>
+      <w:pPr>
+        <w:keepNext w:val="false"/>
+        <w:spacing w:after="40" w:before="0" w:line="240"/>
+        <w:ind w:firstLine="202"/>
+        <w:jc w:val="both"/>
+      </w:pPr>
+      <w:r>
+        <w:rPr>
+          <w:rFonts w:ascii="Times New Roman" w:cs="Times New Roman" w:eastAsia="Times New Roman" w:hAnsi="Times New Roman"/>
+          <w:b w:val="false"/>
+          <w:bCs w:val="false"/>
+          <w:i w:val="false"/>
+          <w:iCs w:val="false"/>
+          <w:smallCaps w:val="false"/>
+          <w:sz w:val="20"/>
+          <w:szCs w:val="20"/>
+        </w:rPr>
+        <w:t xml:space="preserve">In the second case, the webhook bot operated behind a tunnel. The author's response established that removing the disabled-account check was unintended. The bot requested changes and reported one major correctness finding. It also retried after three transient provider errors. These demonstrations ran on a laptop using a free-tier quota and the heuristic detector. They establish that the interaction flow works, but they do not provide evidence of its effectiveness or error rates in general use.</w:t>
       </w:r>
     </w:p>
     <w:p>
@@ -824,7 +921,67 @@
           <w:sz w:val="20"/>
           <w:szCs w:val="20"/>
         </w:rPr>
-        <w:t xml:space="preserve">We ask three questions. RQ1: does clarification recover intent that is lost when the author's stated intent is withheld? RQ2: does it improve defect detection or reduce false alarms? RQ3: how well do the detectors identify the changes that need a question?</w:t>
+        <w:t xml:space="preserve">The evaluation addresses three research questions:</w:t>
+      </w:r>
+    </w:p>
+    <w:p>
+      <w:pPr>
+        <w:keepNext w:val="false"/>
+        <w:spacing w:after="40" w:before="0" w:line="240"/>
+        <w:jc w:val="both"/>
+      </w:pPr>
+      <w:r>
+        <w:rPr>
+          <w:rFonts w:ascii="Times New Roman" w:cs="Times New Roman" w:eastAsia="Times New Roman" w:hAnsi="Times New Roman"/>
+          <w:b w:val="false"/>
+          <w:bCs w:val="false"/>
+          <w:i w:val="false"/>
+          <w:iCs w:val="false"/>
+          <w:smallCaps w:val="false"/>
+          <w:sz w:val="20"/>
+          <w:szCs w:val="20"/>
+        </w:rPr>
+        <w:t xml:space="preserve">RQ1: Does clarification recover intent that would otherwise be lost when the author's stated intent is withheld?</w:t>
+      </w:r>
+    </w:p>
+    <w:p>
+      <w:pPr>
+        <w:keepNext w:val="false"/>
+        <w:spacing w:after="40" w:before="0" w:line="240"/>
+        <w:jc w:val="both"/>
+      </w:pPr>
+      <w:r>
+        <w:rPr>
+          <w:rFonts w:ascii="Times New Roman" w:cs="Times New Roman" w:eastAsia="Times New Roman" w:hAnsi="Times New Roman"/>
+          <w:b w:val="false"/>
+          <w:bCs w:val="false"/>
+          <w:i w:val="false"/>
+          <w:iCs w:val="false"/>
+          <w:smallCaps w:val="false"/>
+          <w:sz w:val="20"/>
+          <w:szCs w:val="20"/>
+        </w:rPr>
+        <w:t xml:space="preserve">RQ2: Does clarification improve defect detection or reduce false alarms?</w:t>
+      </w:r>
+    </w:p>
+    <w:p>
+      <w:pPr>
+        <w:keepNext w:val="false"/>
+        <w:spacing w:after="80" w:before="0" w:line="240"/>
+        <w:jc w:val="both"/>
+      </w:pPr>
+      <w:r>
+        <w:rPr>
+          <w:rFonts w:ascii="Times New Roman" w:cs="Times New Roman" w:eastAsia="Times New Roman" w:hAnsi="Times New Roman"/>
+          <w:b w:val="false"/>
+          <w:bCs w:val="false"/>
+          <w:i w:val="false"/>
+          <w:iCs w:val="false"/>
+          <w:smallCaps w:val="false"/>
+          <w:sz w:val="20"/>
+          <w:szCs w:val="20"/>
+        </w:rPr>
+        <w:t xml:space="preserve">RQ3: How effectively do the detectors identify changes for which clarification is needed?</w:t>
       </w:r>
     </w:p>
     <w:p>
@@ -864,7 +1021,28 @@
           <w:sz w:val="20"/>
           <w:szCs w:val="20"/>
         </w:rPr>
-        <w:t xml:space="preserve">Each instance is reviewed three times by the same reviewer model with the same prompt template (Fig. 2): with full context (the ceiling); with intent withheld, single-pass (the floor); and with intent withheld, through ClarifyReview (the treatment). Floor and treatment see byte-identical code, asserted per instance. Gap recovery G = (treatment − floor)/(ceiling − floor) is the share of the context-induced loss that clarification restores.</w:t>
+        <w:t xml:space="preserve">Each instance is reviewed three times using the same reviewer model and prompt template (Fig. 2). The first condition provides full context and serves as the ceiling. The second withholds intent and uses the single-pass baseline, serving as the floor. The third also withholds intent but enables ClarifyReview, forming the treatment condition. The floor and treatment use byte-identical code, verified by an assertion for each instance.</w:t>
+      </w:r>
+    </w:p>
+    <w:p>
+      <w:pPr>
+        <w:keepNext w:val="false"/>
+        <w:spacing w:after="40" w:before="0" w:line="240"/>
+        <w:ind w:firstLine="202"/>
+        <w:jc w:val="both"/>
+      </w:pPr>
+      <w:r>
+        <w:rPr>
+          <w:rFonts w:ascii="Times New Roman" w:cs="Times New Roman" w:eastAsia="Times New Roman" w:hAnsi="Times New Roman"/>
+          <w:b w:val="false"/>
+          <w:bCs w:val="false"/>
+          <w:i w:val="false"/>
+          <w:iCs w:val="false"/>
+          <w:smallCaps w:val="false"/>
+          <w:sz w:val="20"/>
+          <w:szCs w:val="20"/>
+        </w:rPr>
+        <w:t xml:space="preserve">We measure the proportion of the context-related loss in intent recovery restored by clarification using gap recovery, G = (treatment - floor) / (ceiling - floor). This measure represents the share of the gap between the floor and ceiling that the treatment recovers.</w:t>
       </w:r>
     </w:p>
     <w:p>
@@ -943,7 +1121,7 @@
           <w:sz w:val="16"/>
           <w:szCs w:val="16"/>
         </w:rPr>
-        <w:t xml:space="preserve">The two-by-three design. Golden patches measure intent recovery and false alarms; verified mutants measure intent recovery and defect detection.</w:t>
+        <w:t xml:space="preserve">Two-by-three evaluation design. Golden patches measure intent recovery and false alarms, while verified mutants measure intent recovery and defect detection.</w:t>
       </w:r>
     </w:p>
     <w:p>
@@ -962,7 +1140,7 @@
           <w:sz w:val="20"/>
           <w:szCs w:val="20"/>
         </w:rPr>
-        <w:t xml:space="preserve">B. Withholding intent</w:t>
+        <w:t xml:space="preserve">B. Withholding Intent</w:t>
       </w:r>
     </w:p>
     <w:p>
@@ -983,26 +1161,7 @@
           <w:sz w:val="20"/>
           <w:szCs w:val="20"/>
         </w:rPr>
-        <w:t xml:space="preserve">Version 1 of the manipulation removed the linked issue, title, description and commit messages. Version 2 additionally removes every comment, trailing comment and docstring the patch adds, leaving every line of code intact. A docstring is removed only when the patch opens it on an added line, after an earlier rule deleted real code in a hunk that began inside an existing docstring.</w:t>
-      </w:r>
-    </w:p>
-    <w:p>
-      <w:pPr>
-        <w:keepNext/>
-        <w:spacing w:after="40" w:before="80"/>
-      </w:pPr>
-      <w:r>
-        <w:rPr>
-          <w:rFonts w:ascii="Times New Roman" w:cs="Times New Roman" w:eastAsia="Times New Roman" w:hAnsi="Times New Roman"/>
-          <w:b w:val="false"/>
-          <w:bCs w:val="false"/>
-          <w:i/>
-          <w:iCs/>
-          <w:smallCaps w:val="false"/>
-          <w:sz w:val="20"/>
-          <w:szCs w:val="20"/>
-        </w:rPr>
-        <w:t xml:space="preserve">C. Execution-verified defects</w:t>
+        <w:t xml:space="preserve">The first version of the manipulation removed the linked issue, title, description, and commit messages. However, the pilot showed that the patch could still reveal its purpose through natural-language text added alongside the code. Version 2 therefore also removes every comment, trailing comment, and docstring introduced by the patch, while leaving the code unchanged.</w:t>
       </w:r>
     </w:p>
     <w:p>
@@ -1023,7 +1182,7 @@
           <w:sz w:val="20"/>
           <w:szCs w:val="20"/>
         </w:rPr>
-        <w:t xml:space="preserve">Golden patches are correct by construction, so they measure false alarms but not detection. We inject defects into the lines a golden patch adds with six operators—invert comparison, negate condition, flip constant, drop guard, swap boolean operator, off-by-one—and keep a mutant only if the repository's FAIL_TO_PASS tests pass with the golden patch and fail with the mutant [12]. Of 75 sympy instances, 32 yielded a verified mutant; 27 admitted no operator, 7 produced only mutants the tests did not catch, and 9 could not run in the available environment.</w:t>
+        <w:t xml:space="preserve">Docstring removal required an additional safeguard. A docstring is removed only when the patch introduces a line within it. This rule was added after an earlier implementation deleted actual code in a hunk that began inside an existing docstring. The revised procedure was designed to remove statements of intent without altering executable code.</w:t>
       </w:r>
     </w:p>
     <w:p>
@@ -1042,7 +1201,7 @@
           <w:sz w:val="20"/>
           <w:szCs w:val="20"/>
         </w:rPr>
-        <w:t xml:space="preserve">D. Instances</w:t>
+        <w:t xml:space="preserve">C. Execution-Verified Defects</w:t>
       </w:r>
     </w:p>
     <w:p>
@@ -1063,26 +1222,7 @@
           <w:sz w:val="20"/>
           <w:szCs w:val="20"/>
         </w:rPr>
-        <w:t xml:space="preserve">The study set has 36 rows: twelve sympy instances reviewed both as the golden patch and as its verified mutant, and twelve golden patches from xarray, sphinx, astropy, django, pylint, pytest and scikit-learn. Instances were chosen hardest-first by SWE-bench's own difficulty annotation, assigned by the benchmark's annotators rather than by our detector, so selection does not favour the detector under evaluation.</w:t>
-      </w:r>
-    </w:p>
-    <w:p>
-      <w:pPr>
-        <w:keepNext/>
-        <w:spacing w:after="40" w:before="80"/>
-      </w:pPr>
-      <w:r>
-        <w:rPr>
-          <w:rFonts w:ascii="Times New Roman" w:cs="Times New Roman" w:eastAsia="Times New Roman" w:hAnsi="Times New Roman"/>
-          <w:b w:val="false"/>
-          <w:bCs w:val="false"/>
-          <w:i/>
-          <w:iCs/>
-          <w:smallCaps w:val="false"/>
-          <w:sz w:val="20"/>
-          <w:szCs w:val="20"/>
-        </w:rPr>
-        <w:t xml:space="preserve">E. Simulated author, judge and statistics</w:t>
+        <w:t xml:space="preserve">Golden patches are correct by construction, making them suitable for measuring false alarms but not defect detection. To evaluate detection, we introduce defects into lines added by a golden patch using six mutation operators: invert a comparison, negate a condition, flip a constant, remove a guard, swap a Boolean operator, and introduce an off-by-one error.</w:t>
       </w:r>
     </w:p>
     <w:p>
@@ -1103,7 +1243,7 @@
           <w:sz w:val="20"/>
           <w:szCs w:val="20"/>
         </w:rPr>
-        <w:t xml:space="preserve">When the treatment asks, a simulated author answers using only the withheld issue text and commit messages; it never sees the diff, the defect, or whether one exists, and must decline when its notes are silent. Every exchange is logged with its prompt version. Reviews are scored by an LLM judge from a different model family than the reviewer on three checklist questions: was the intent recovered, was the injected defect caught, and was a false alarm raised on correct code. Paired outcomes are compared with McNemar's exact test [14]; gap recovery is reported with a bootstrap 95% interval. The reviewer is gemini-3.5-flash-lite; questions, the simulated author and the judge use gemma-4-31b-it; all calls ran on free-tier access.</w:t>
+        <w:t xml:space="preserve">A mutant is retained only when the repository's FAIL_TO_PASS tests pass with the original golden patch and fail with the mutant [12]. Of the 75 SymPy instances examined, 32 produced a verified mutant. For 27 instances, none of the operators could be applied; seven produced only mutants that the tests failed to detect; and nine could not be executed in the available environment.</w:t>
       </w:r>
     </w:p>
     <w:p>
@@ -1122,7 +1262,7 @@
           <w:sz w:val="20"/>
           <w:szCs w:val="20"/>
         </w:rPr>
-        <w:t xml:space="preserve">F. Second-model replication (v3)</w:t>
+        <w:t xml:space="preserve">D. Instances</w:t>
       </w:r>
     </w:p>
     <w:p>
@@ -1143,7 +1283,171 @@
           <w:sz w:val="20"/>
           <w:szCs w:val="20"/>
         </w:rPr>
-        <w:t xml:space="preserve">The replication uses 96 rows: the 36 rows of the original set plus 60 new rows. The set includes all 32 verified mutants, scored in both arms, and 32 golden-only rows from 7 other repositories. The reviewer was qwen3:4b-instruct-2507-q4_K_M, served through Ollama, with the heuristic detector at τ = 0.50. The 288 runs had 0 failures and took 52 minutes on a laptop GPU. The question and oracle model was n/a, whose identity is recorded in the oracle log but not per database row. Conditions were the same as in the original study. The replication is never pooled with the original study, and the judge is chosen in Section V-G rather than here.</w:t>
+        <w:t xml:space="preserve">The original study contains 36 rows. Twelve SymPy instances are represented twice, once as the golden patch and once as the corresponding verified mutant. The remaining twelve rows are golden patches from xarray, sphinx, astropy, django, pylint, pytest, and scikit-learn.</w:t>
+      </w:r>
+    </w:p>
+    <w:p>
+      <w:pPr>
+        <w:keepNext w:val="false"/>
+        <w:spacing w:after="40" w:before="0" w:line="240"/>
+        <w:ind w:firstLine="202"/>
+        <w:jc w:val="both"/>
+      </w:pPr>
+      <w:r>
+        <w:rPr>
+          <w:rFonts w:ascii="Times New Roman" w:cs="Times New Roman" w:eastAsia="Times New Roman" w:hAnsi="Times New Roman"/>
+          <w:b w:val="false"/>
+          <w:bCs w:val="false"/>
+          <w:i w:val="false"/>
+          <w:iCs w:val="false"/>
+          <w:smallCaps w:val="false"/>
+          <w:sz w:val="20"/>
+          <w:szCs w:val="20"/>
+        </w:rPr>
+        <w:t xml:space="preserve">Instances were selected in descending order of difficulty using SWE-bench's own difficulty annotations. These annotations were assigned by the benchmark's annotators rather than by our detector, avoiding selection based on the behaviour of the system under evaluation.</w:t>
+      </w:r>
+    </w:p>
+    <w:p>
+      <w:pPr>
+        <w:keepNext/>
+        <w:spacing w:after="40" w:before="80"/>
+      </w:pPr>
+      <w:r>
+        <w:rPr>
+          <w:rFonts w:ascii="Times New Roman" w:cs="Times New Roman" w:eastAsia="Times New Roman" w:hAnsi="Times New Roman"/>
+          <w:b w:val="false"/>
+          <w:bCs w:val="false"/>
+          <w:i/>
+          <w:iCs/>
+          <w:smallCaps w:val="false"/>
+          <w:sz w:val="20"/>
+          <w:szCs w:val="20"/>
+        </w:rPr>
+        <w:t xml:space="preserve">E. Simulated Author, Judge, and Statistics</w:t>
+      </w:r>
+    </w:p>
+    <w:p>
+      <w:pPr>
+        <w:keepNext w:val="false"/>
+        <w:spacing w:after="40" w:before="0" w:line="240"/>
+        <w:ind w:firstLine="202"/>
+        <w:jc w:val="both"/>
+      </w:pPr>
+      <w:r>
+        <w:rPr>
+          <w:rFonts w:ascii="Times New Roman" w:cs="Times New Roman" w:eastAsia="Times New Roman" w:hAnsi="Times New Roman"/>
+          <w:b w:val="false"/>
+          <w:bCs w:val="false"/>
+          <w:i w:val="false"/>
+          <w:iCs w:val="false"/>
+          <w:smallCaps w:val="false"/>
+          <w:sz w:val="20"/>
+          <w:szCs w:val="20"/>
+        </w:rPr>
+        <w:t xml:space="preserve">When the treatment asks a question, a simulated author responds using only the withheld issue text and commit messages. The simulated author does not see the diff, the injected defect, or whether a defect exists. It must decline to answer when the available notes do not provide the necessary information. Each exchange is logged with its prompt version.</w:t>
+      </w:r>
+    </w:p>
+    <w:p>
+      <w:pPr>
+        <w:keepNext w:val="false"/>
+        <w:spacing w:after="40" w:before="0" w:line="240"/>
+        <w:ind w:firstLine="202"/>
+        <w:jc w:val="both"/>
+      </w:pPr>
+      <w:r>
+        <w:rPr>
+          <w:rFonts w:ascii="Times New Roman" w:cs="Times New Roman" w:eastAsia="Times New Roman" w:hAnsi="Times New Roman"/>
+          <w:b w:val="false"/>
+          <w:bCs w:val="false"/>
+          <w:i w:val="false"/>
+          <w:iCs w:val="false"/>
+          <w:smallCaps w:val="false"/>
+          <w:sz w:val="20"/>
+          <w:szCs w:val="20"/>
+        </w:rPr>
+        <w:t xml:space="preserve">An LLM judge from a different model family than the reviewer evaluates each review against three criteria: whether the reviewer recovered the intended purpose of the change, whether it detected the injected defect, and whether it raised a false alarm on correct code. We compare paired outcomes using McNemar's exact test [14] and report a bootstrap 95% interval for gap recovery.</w:t>
+      </w:r>
+    </w:p>
+    <w:p>
+      <w:pPr>
+        <w:keepNext w:val="false"/>
+        <w:spacing w:after="40" w:before="0" w:line="240"/>
+        <w:ind w:firstLine="202"/>
+        <w:jc w:val="both"/>
+      </w:pPr>
+      <w:r>
+        <w:rPr>
+          <w:rFonts w:ascii="Times New Roman" w:cs="Times New Roman" w:eastAsia="Times New Roman" w:hAnsi="Times New Roman"/>
+          <w:b w:val="false"/>
+          <w:bCs w:val="false"/>
+          <w:i w:val="false"/>
+          <w:iCs w:val="false"/>
+          <w:smallCaps w:val="false"/>
+          <w:sz w:val="20"/>
+          <w:szCs w:val="20"/>
+        </w:rPr>
+        <w:t xml:space="preserve">The reviewer is gemini-3.5-flash-lite. The question generator, simulated author, and judge use gemma-4-31b-it. All model calls were made using free-tier access.</w:t>
+      </w:r>
+    </w:p>
+    <w:p>
+      <w:pPr>
+        <w:keepNext/>
+        <w:spacing w:after="40" w:before="80"/>
+      </w:pPr>
+      <w:r>
+        <w:rPr>
+          <w:rFonts w:ascii="Times New Roman" w:cs="Times New Roman" w:eastAsia="Times New Roman" w:hAnsi="Times New Roman"/>
+          <w:b w:val="false"/>
+          <w:bCs w:val="false"/>
+          <w:i/>
+          <w:iCs/>
+          <w:smallCaps w:val="false"/>
+          <w:sz w:val="20"/>
+          <w:szCs w:val="20"/>
+        </w:rPr>
+        <w:t xml:space="preserve">F. Second-Model Replication (v3)</w:t>
+      </w:r>
+    </w:p>
+    <w:p>
+      <w:pPr>
+        <w:keepNext w:val="false"/>
+        <w:spacing w:after="40" w:before="0" w:line="240"/>
+        <w:ind w:firstLine="202"/>
+        <w:jc w:val="both"/>
+      </w:pPr>
+      <w:r>
+        <w:rPr>
+          <w:rFonts w:ascii="Times New Roman" w:cs="Times New Roman" w:eastAsia="Times New Roman" w:hAnsi="Times New Roman"/>
+          <w:b w:val="false"/>
+          <w:bCs w:val="false"/>
+          <w:i w:val="false"/>
+          <w:iCs w:val="false"/>
+          <w:smallCaps w:val="false"/>
+          <w:sz w:val="20"/>
+          <w:szCs w:val="20"/>
+        </w:rPr>
+        <w:t xml:space="preserve">The replication contains 96 rows: the original 36 rows and 60 additional rows. It includes all 32 verified mutants, evaluated in both arms, together with 32 golden-only rows from seven additional repositories. The reviewer is qwen3:4b-instruct-2507-q4_K_M, served through Ollama, with the heuristic detector configured at τ = 0.50.</w:t>
+      </w:r>
+    </w:p>
+    <w:p>
+      <w:pPr>
+        <w:keepNext w:val="false"/>
+        <w:spacing w:after="40" w:before="0" w:line="240"/>
+        <w:ind w:firstLine="202"/>
+        <w:jc w:val="both"/>
+      </w:pPr>
+      <w:r>
+        <w:rPr>
+          <w:rFonts w:ascii="Times New Roman" w:cs="Times New Roman" w:eastAsia="Times New Roman" w:hAnsi="Times New Roman"/>
+          <w:b w:val="false"/>
+          <w:bCs w:val="false"/>
+          <w:i w:val="false"/>
+          <w:iCs w:val="false"/>
+          <w:smallCaps w:val="false"/>
+          <w:sz w:val="20"/>
+          <w:szCs w:val="20"/>
+        </w:rPr>
+        <w:t xml:space="preserve">All 96 runs completed without failure in 52 minutes on a laptop GPU. The question and oracle model identity was recorded in the oracle log but was not stored for each database row. The replication follows the same evaluation conditions as the original study and is reported separately rather than pooled with the original results. The choice of judge for this replication is discussed in Section V-G.</w:t>
       </w:r>
     </w:p>
     <w:p>
@@ -1195,7 +1499,7 @@
           <w:sz w:val="20"/>
           <w:szCs w:val="20"/>
         </w:rPr>
-        <w:t xml:space="preserve">A. Pilot (manipulation v1)</w:t>
+        <w:t xml:space="preserve">A. Pilot (Manipulation v1)</w:t>
       </w:r>
     </w:p>
     <w:p>
@@ -1216,7 +1520,7 @@
           <w:sz w:val="20"/>
           <w:szCs w:val="20"/>
         </w:rPr>
-        <w:t xml:space="preserve">The pilot attempted 10 instances from ten repositories; 5 completed all three conditions before the daily quota was exhausted. Intent recovery was 100% at the ceiling, 100% at the floor and 100% in the treatment: with the floor equal to the ceiling there was nothing to recover. The patches stated their purpose in the comments and docstrings they added, so withholding the issue removed nothing a reader needed. This led to manipulation v2, the mutant arm and difficulty-ordered selection.</w:t>
+        <w:t xml:space="preserve">The pilot covered ten instances from ten repositories, but only five completed all three conditions before the daily quota was exhausted. Intent recovery reached 100% in all three conditions: the ceiling, floor, and treatment. Because the floor already matched the ceiling, there was no loss for clarification to recover. The patches often explained their purpose in the comments and docstrings they introduced, so removing the issue information alone did not make their intent difficult to understand. This finding led to the revised manipulation (v2), the addition of the mutant arm, and selection based on benchmark difficulty.</w:t>
       </w:r>
     </w:p>
     <w:p>
@@ -1235,7 +1539,7 @@
           <w:sz w:val="20"/>
           <w:szCs w:val="20"/>
         </w:rPr>
-        <w:t xml:space="preserve">B. RQ1: intent recovery</w:t>
+        <w:t xml:space="preserve">B. RQ1: Intent Recovery</w:t>
       </w:r>
     </w:p>
     <w:p>
@@ -1256,7 +1560,28 @@
           <w:sz w:val="20"/>
           <w:szCs w:val="20"/>
         </w:rPr>
-        <w:t xml:space="preserve">All 36 rows completed all three conditions and all 108 reviews were judged (Table I, Fig. 3). Withholding all natural-language intent lowered intent recovery from 97% to 81%, opening the gap v1 did not. Clarification raised it to 83%: G = 0.17 (95% CI 0.00–0.50), with 1 discordant pair favouring the treatment and 0 the floor (p = 1.00). The direction is as hypothesised; at this sample size the effect is not significant, and could not have been, since only pairs where the detector asked can differ for a reason other than sampling variation.</w:t>
+        <w:t xml:space="preserve">All 36 instances completed the three evaluation conditions, and all 108 reviews were judged (Table I, Fig. 3). Removing all natural-language statements of intent reduced recovery from 97% with full context to 81% without clarification. Enabling clarification raised recovery to 83%. The resulting gap recovery was 0.17 (95% CI: 0.00 to 0.50), with one discordant pair favouring the treatment and none favouring the floor (McNemar's p = 1.00).</w:t>
+      </w:r>
+    </w:p>
+    <w:p>
+      <w:pPr>
+        <w:keepNext w:val="false"/>
+        <w:spacing w:after="40" w:before="0" w:line="240"/>
+        <w:ind w:firstLine="202"/>
+        <w:jc w:val="both"/>
+      </w:pPr>
+      <w:r>
+        <w:rPr>
+          <w:rFonts w:ascii="Times New Roman" w:cs="Times New Roman" w:eastAsia="Times New Roman" w:hAnsi="Times New Roman"/>
+          <w:b w:val="false"/>
+          <w:bCs w:val="false"/>
+          <w:i w:val="false"/>
+          <w:iCs w:val="false"/>
+          <w:smallCaps w:val="false"/>
+          <w:sz w:val="20"/>
+          <w:szCs w:val="20"/>
+        </w:rPr>
+        <w:t xml:space="preserve">The results follow the expected direction, but the improvement was not statistically significant. The small number of instances limits the evidence for an effect. In addition, clarification can produce a different outcome only when the detector asks a question and the resulting exchange changes the reviewer's interpretation.</w:t>
       </w:r>
     </w:p>
     <w:p>
@@ -1296,7 +1621,7 @@
           <w:sz w:val="16"/>
           <w:szCs w:val="16"/>
         </w:rPr>
-        <w:t xml:space="preserve">Judged outcomes, manipulation v2</w:t>
+        <w:t xml:space="preserve">Judged outcomes under manipulation v2</w:t>
       </w:r>
     </w:p>
     <w:tbl>
@@ -2475,7 +2800,7 @@
           <w:sz w:val="16"/>
           <w:szCs w:val="16"/>
         </w:rPr>
-        <w:t xml:space="preserve">Outcomes by condition. Bars show the share of instances; labels give counts.</w:t>
+        <w:t xml:space="preserve">Outcomes across the three conditions. Bars represent proportions, with counts shown as labels.</w:t>
       </w:r>
     </w:p>
     <w:p>
@@ -2494,7 +2819,7 @@
           <w:sz w:val="20"/>
           <w:szCs w:val="20"/>
         </w:rPr>
-        <w:t xml:space="preserve">C. Where the effect is lost</w:t>
+        <w:t xml:space="preserve">C. Where the Effect Is Lost</w:t>
       </w:r>
     </w:p>
     <w:p>
@@ -2515,7 +2840,49 @@
           <w:sz w:val="20"/>
           <w:szCs w:val="20"/>
         </w:rPr>
-        <w:t xml:space="preserve">The treatment can improve on the floor only for an instance the floor got wrong, that the detector flagged, and whose author answered (Fig. 4). The floor misread 7 changes. The detector asked on 2; the author answered 1 substantively; and the treatment recovered intent in 1. The other flagged miss received a refusal: its question concerned a parameter the issue never mentions. Of the detector's 6 questions, 4 went to instances the floor already understood, where an answer cannot raise intent recovery. Clarification worked where it was given the chance (too few cases to estimate a rate), and the chance arose rarely: the binding constraint is detector recall.</w:t>
+        <w:t xml:space="preserve">For clarification to improve on the floor, three things must happen: the initial reviewer must misinterpret the change, the detector must identify the need to ask, and the author must provide a useful answer (Fig. 4). The floor misinterpreted seven changes. The detector asked about two of them, the simulated author provided a substantive answer in one case, and the treatment recovered the intended meaning in that case.</w:t>
+      </w:r>
+    </w:p>
+    <w:p>
+      <w:pPr>
+        <w:keepNext w:val="false"/>
+        <w:spacing w:after="40" w:before="0" w:line="240"/>
+        <w:ind w:firstLine="202"/>
+        <w:jc w:val="both"/>
+      </w:pPr>
+      <w:r>
+        <w:rPr>
+          <w:rFonts w:ascii="Times New Roman" w:cs="Times New Roman" w:eastAsia="Times New Roman" w:hAnsi="Times New Roman"/>
+          <w:b w:val="false"/>
+          <w:bCs w:val="false"/>
+          <w:i w:val="false"/>
+          <w:iCs w:val="false"/>
+          <w:smallCaps w:val="false"/>
+          <w:sz w:val="20"/>
+          <w:szCs w:val="20"/>
+        </w:rPr>
+        <w:t xml:space="preserve">The other flagged case received no useful answer because the question concerned a parameter that was not mentioned in the issue. Of the six questions asked by the detector overall, four concerned changes whose intent the floor had already recovered. Answers to those questions could not improve the intent-recovery score.</w:t>
+      </w:r>
+    </w:p>
+    <w:p>
+      <w:pPr>
+        <w:keepNext w:val="false"/>
+        <w:spacing w:after="40" w:before="0" w:line="240"/>
+        <w:ind w:firstLine="202"/>
+        <w:jc w:val="both"/>
+      </w:pPr>
+      <w:r>
+        <w:rPr>
+          <w:rFonts w:ascii="Times New Roman" w:cs="Times New Roman" w:eastAsia="Times New Roman" w:hAnsi="Times New Roman"/>
+          <w:b w:val="false"/>
+          <w:bCs w:val="false"/>
+          <w:i w:val="false"/>
+          <w:iCs w:val="false"/>
+          <w:smallCaps w:val="false"/>
+          <w:sz w:val="20"/>
+          <w:szCs w:val="20"/>
+        </w:rPr>
+        <w:t xml:space="preserve">These traces suggest that clarification can help when the system identifies a genuine need for additional information. However, the number of eligible cases was too small to estimate its success rate reliably. The more immediate limitation was the detector's ability to identify changes that the reviewer was likely to misunderstand.</w:t>
       </w:r>
     </w:p>
     <w:p>
@@ -2594,7 +2961,7 @@
           <w:sz w:val="16"/>
           <w:szCs w:val="16"/>
         </w:rPr>
-        <w:t xml:space="preserve">Tracing each instance from a floor miss to recovery.</w:t>
+        <w:t xml:space="preserve">Instance-level trace showing how many initial intent errors progressed through detection, author response, and successful recovery.</w:t>
       </w:r>
     </w:p>
     <w:p>
@@ -2615,7 +2982,7 @@
           <w:sz w:val="20"/>
           <w:szCs w:val="20"/>
         </w:rPr>
-        <w:t xml:space="preserve">In the recovered case (sympy-12481) the patch lets the Permutation constructor accept non-disjoint cycles. The floor summarised it as "tidy up permutation instantiation logic". The detector scored the stripped change 0.556 and asked whether removing the specialised error was intended; the author replied that non-disjoint cycles should be applied left to right; the treatment's summary then matched the ceiling's.</w:t>
+        <w:t xml:space="preserve">In the recovered case, sympy-12481, the patch allows the Permutation constructor to accept non-disjoint cycles. The floor described the change as a cleanup of permutation instantiation logic, missing its intended behaviour. The detector assigned the stripped change a score of 0.556 and asked whether removing the specialised error was intentional. The author explained that non-disjoint cycles should be applied from left to right. With this information, the treatment produced a summary consistent with the full-context condition.</w:t>
       </w:r>
     </w:p>
     <w:p>
@@ -2634,7 +3001,7 @@
           <w:sz w:val="20"/>
           <w:szCs w:val="20"/>
         </w:rPr>
-        <w:t xml:space="preserve">D. RQ2: defects and false alarms</w:t>
+        <w:t xml:space="preserve">D. RQ2: Defects and False Alarms</w:t>
       </w:r>
     </w:p>
     <w:p>
@@ -2655,26 +3022,7 @@
           <w:sz w:val="20"/>
           <w:szCs w:val="20"/>
         </w:rPr>
-        <w:t xml:space="preserve">The reviewer caught 2/12 injected defects at the floor, 2/12 with clarification and 1/12 with full context. The full-context figure bounds what intent can contribute: given the issue, the reviewer still approved eleven of twelve broken patches, so on this model detection is limited by reading the code, not by knowing its purpose. One mutant was caught without the issue and approved with it—an isolated case, but consistent with stated intent anchoring a reviewer toward acceptance. False alarms on correct patches were rare in every condition (2/24, 2/24, 1/24).</w:t>
-      </w:r>
-    </w:p>
-    <w:p>
-      <w:pPr>
-        <w:keepNext/>
-        <w:spacing w:after="40" w:before="80"/>
-      </w:pPr>
-      <w:r>
-        <w:rPr>
-          <w:rFonts w:ascii="Times New Roman" w:cs="Times New Roman" w:eastAsia="Times New Roman" w:hAnsi="Times New Roman"/>
-          <w:b w:val="false"/>
-          <w:bCs w:val="false"/>
-          <w:i/>
-          <w:iCs/>
-          <w:smallCaps w:val="false"/>
-          <w:sz w:val="20"/>
-          <w:szCs w:val="20"/>
-        </w:rPr>
-        <w:t xml:space="preserve">E. RQ3: detectors</w:t>
+        <w:t xml:space="preserve">The reviewer detected two of the twelve injected defects under both the floor and treatment conditions, compared with one under full context. The full-context result is particularly important: even when the issue was available, the reviewer approved eleven of the twelve defective patches. For this model, knowing the intended behaviour was not enough to ensure that the code was reviewed correctly. Its ability to recognise defects remained a major limitation.</w:t>
       </w:r>
     </w:p>
     <w:p>
@@ -2695,7 +3043,68 @@
           <w:sz w:val="20"/>
           <w:szCs w:val="20"/>
         </w:rPr>
-        <w:t xml:space="preserve">With constructed labels—a stripped context is ambiguous by construction, its full counterpart clear—Table II and Fig. 5 compare the detectors. A detector keyed on a missing issue gains recall for free under these labels, so recall is bounded from above.</w:t>
+        <w:t xml:space="preserve">One mutant was detected without the issue information but was approved when that information was provided. Although this was an isolated result, it is consistent with the possibility that stated intent can sometimes lead a reviewer to accept a change without adequately examining its correctness.</w:t>
+      </w:r>
+    </w:p>
+    <w:p>
+      <w:pPr>
+        <w:keepNext w:val="false"/>
+        <w:spacing w:after="40" w:before="0" w:line="240"/>
+        <w:ind w:firstLine="202"/>
+        <w:jc w:val="both"/>
+      </w:pPr>
+      <w:r>
+        <w:rPr>
+          <w:rFonts w:ascii="Times New Roman" w:cs="Times New Roman" w:eastAsia="Times New Roman" w:hAnsi="Times New Roman"/>
+          <w:b w:val="false"/>
+          <w:bCs w:val="false"/>
+          <w:i w:val="false"/>
+          <w:iCs w:val="false"/>
+          <w:smallCaps w:val="false"/>
+          <w:sz w:val="20"/>
+          <w:szCs w:val="20"/>
+        </w:rPr>
+        <w:t xml:space="preserve">False alarms on correct patches were uncommon across all three conditions, occurring in 2 of 24 floor reviews, 2 of 24 treatment reviews, and 1 of 24 ceiling reviews. The experiment therefore provides no clear evidence that clarification reduced false alarms.</w:t>
+      </w:r>
+    </w:p>
+    <w:p>
+      <w:pPr>
+        <w:keepNext/>
+        <w:spacing w:after="40" w:before="80"/>
+      </w:pPr>
+      <w:r>
+        <w:rPr>
+          <w:rFonts w:ascii="Times New Roman" w:cs="Times New Roman" w:eastAsia="Times New Roman" w:hAnsi="Times New Roman"/>
+          <w:b w:val="false"/>
+          <w:bCs w:val="false"/>
+          <w:i/>
+          <w:iCs/>
+          <w:smallCaps w:val="false"/>
+          <w:sz w:val="20"/>
+          <w:szCs w:val="20"/>
+        </w:rPr>
+        <w:t xml:space="preserve">E. RQ3: Detectors</w:t>
+      </w:r>
+    </w:p>
+    <w:p>
+      <w:pPr>
+        <w:keepNext w:val="false"/>
+        <w:spacing w:after="40" w:before="0" w:line="240"/>
+        <w:ind w:firstLine="202"/>
+        <w:jc w:val="both"/>
+      </w:pPr>
+      <w:r>
+        <w:rPr>
+          <w:rFonts w:ascii="Times New Roman" w:cs="Times New Roman" w:eastAsia="Times New Roman" w:hAnsi="Times New Roman"/>
+          <w:b w:val="false"/>
+          <w:bCs w:val="false"/>
+          <w:i w:val="false"/>
+          <w:iCs w:val="false"/>
+          <w:smallCaps w:val="false"/>
+          <w:sz w:val="20"/>
+          <w:szCs w:val="20"/>
+        </w:rPr>
+        <w:t xml:space="preserve">For this analysis, the labels were constructed so that a context with intent removed was ambiguous by design, while its full-context counterpart was considered clear. Table II and Fig. 5 compare detector behaviour under these labels. This setup favours detectors that respond to missing issue information, so the resulting recall figures should be interpreted in light of how the labels were constructed.</w:t>
       </w:r>
     </w:p>
     <w:p>
@@ -2735,7 +3144,7 @@
           <w:sz w:val="16"/>
           <w:szCs w:val="16"/>
         </w:rPr>
-        <w:t xml:space="preserve">Detectors on constructed labels</w:t>
+        <w:t xml:space="preserve">Detector performance on constructed labels</w:t>
       </w:r>
     </w:p>
     <w:tbl>
@@ -3002,7 +3411,7 @@
                 <w:sz w:val="16"/>
                 <w:szCs w:val="16"/>
               </w:rPr>
-              <w:t xml:space="preserve">heuristic</w:t>
+              <w:t xml:space="preserve">Heuristic</w:t>
             </w:r>
           </w:p>
         </w:tc>
@@ -3214,7 +3623,7 @@
                 <w:sz w:val="16"/>
                 <w:szCs w:val="16"/>
               </w:rPr>
-              <w:t xml:space="preserve">sampling</w:t>
+              <w:t xml:space="preserve">Sampling</w:t>
             </w:r>
           </w:p>
         </w:tc>
@@ -3426,7 +3835,7 @@
                 <w:sz w:val="16"/>
                 <w:szCs w:val="16"/>
               </w:rPr>
-              <w:t xml:space="preserve">perturbation</w:t>
+              <w:t xml:space="preserve">Perturbation</w:t>
             </w:r>
           </w:p>
         </w:tc>
@@ -3701,7 +4110,7 @@
           <w:sz w:val="16"/>
           <w:szCs w:val="16"/>
         </w:rPr>
-        <w:t xml:space="preserve">Mean detector score with intent withheld and with full context; dashed lines mark default thresholds.</w:t>
+        <w:t xml:space="preserve">Mean detector scores with intent withheld and with full context. Dashed lines indicate the default thresholds.</w:t>
       </w:r>
     </w:p>
     <w:p>
@@ -3722,26 +4131,7 @@
           <w:sz w:val="20"/>
           <w:szCs w:val="20"/>
         </w:rPr>
-        <w:t xml:space="preserve">The heuristic never asked on a full-context instance but found only 21% of stripped ones—the recall limit of Section V-C. The uncertainty detectors cost eight calls per decision and were run on 4 instances. At their default thresholds both asked on every decision. Sampling dispersion separated the contexts (0.70 vs 0.56); re-sweeping its recorded scores suggests a threshold near 0.60 would separate them, which we report as a diagnosis rather than adopt, since those scores come from the study set. Prompt perturbation did not separate them (0.85 vs 0.85).</w:t>
-      </w:r>
-    </w:p>
-    <w:p>
-      <w:pPr>
-        <w:keepNext/>
-        <w:spacing w:after="40" w:before="80"/>
-      </w:pPr>
-      <w:r>
-        <w:rPr>
-          <w:rFonts w:ascii="Times New Roman" w:cs="Times New Roman" w:eastAsia="Times New Roman" w:hAnsi="Times New Roman"/>
-          <w:b w:val="false"/>
-          <w:bCs w:val="false"/>
-          <w:i/>
-          <w:iCs/>
-          <w:smallCaps w:val="false"/>
-          <w:sz w:val="20"/>
-          <w:szCs w:val="20"/>
-        </w:rPr>
-        <w:t xml:space="preserve">F. Replication on a local reviewer</w:t>
+        <w:t xml:space="preserve">The heuristic detector did not ask for clarification on any full-context instance, but it identified only 21% of the stripped instances. This low recall helps explain why clarification had limited opportunities to improve the reviewer's interpretation.</w:t>
       </w:r>
     </w:p>
     <w:p>
@@ -3762,7 +4152,68 @@
           <w:sz w:val="20"/>
           <w:szCs w:val="20"/>
         </w:rPr>
-        <w:t xml:space="preserve">Table III reports the same measures as Table I for the local reviewer qwen3:4b-instruct-2507-q4_K_M, served through Ollama, with outcomes scored by the Claude agent judge claude-sonnet-agent. That judge was chosen after seeing its agreement with the local judge, as explained in Section V-G. The replication is reported separately from the original study and is never pooled with it.</w:t>
+        <w:t xml:space="preserve">The two uncertainty-based detectors required eight model calls per decision and were evaluated on four instances each. At their default thresholds, both asked questions on every decision. Sampling-based uncertainty distinguished the stripped and full contexts, with mean scores of 0.70 and 0.56, respectively. Re-examining the recorded scores suggests that a threshold near 0.60 might separate the two conditions. We treat this as a diagnostic observation rather than adopt the threshold, since it was identified using scores from the study set. Prompt perturbation did not distinguish the conditions: both received a mean score of 0.85.</w:t>
+      </w:r>
+    </w:p>
+    <w:p>
+      <w:pPr>
+        <w:keepNext w:val="false"/>
+        <w:spacing w:after="40" w:before="0" w:line="240"/>
+        <w:ind w:firstLine="202"/>
+        <w:jc w:val="both"/>
+      </w:pPr>
+      <w:r>
+        <w:rPr>
+          <w:rFonts w:ascii="Times New Roman" w:cs="Times New Roman" w:eastAsia="Times New Roman" w:hAnsi="Times New Roman"/>
+          <w:b w:val="false"/>
+          <w:bCs w:val="false"/>
+          <w:i w:val="false"/>
+          <w:iCs w:val="false"/>
+          <w:smallCaps w:val="false"/>
+          <w:sz w:val="20"/>
+          <w:szCs w:val="20"/>
+        </w:rPr>
+        <w:t xml:space="preserve">These findings highlight a trade-off between asking questions frequently and identifying the cases where they are genuinely needed. The heuristic was conservative but missed many ambiguous changes, while the uncertainty-based detectors asked too often at their default thresholds.</w:t>
+      </w:r>
+    </w:p>
+    <w:p>
+      <w:pPr>
+        <w:keepNext/>
+        <w:spacing w:after="40" w:before="80"/>
+      </w:pPr>
+      <w:r>
+        <w:rPr>
+          <w:rFonts w:ascii="Times New Roman" w:cs="Times New Roman" w:eastAsia="Times New Roman" w:hAnsi="Times New Roman"/>
+          <w:b w:val="false"/>
+          <w:bCs w:val="false"/>
+          <w:i/>
+          <w:iCs/>
+          <w:smallCaps w:val="false"/>
+          <w:sz w:val="20"/>
+          <w:szCs w:val="20"/>
+        </w:rPr>
+        <w:t xml:space="preserve">F. Replication on a Local Reviewer</w:t>
+      </w:r>
+    </w:p>
+    <w:p>
+      <w:pPr>
+        <w:keepNext w:val="false"/>
+        <w:spacing w:after="40" w:before="0" w:line="240"/>
+        <w:ind w:firstLine="202"/>
+        <w:jc w:val="both"/>
+      </w:pPr>
+      <w:r>
+        <w:rPr>
+          <w:rFonts w:ascii="Times New Roman" w:cs="Times New Roman" w:eastAsia="Times New Roman" w:hAnsi="Times New Roman"/>
+          <w:b w:val="false"/>
+          <w:bCs w:val="false"/>
+          <w:i w:val="false"/>
+          <w:iCs w:val="false"/>
+          <w:smallCaps w:val="false"/>
+          <w:sz w:val="20"/>
+          <w:szCs w:val="20"/>
+        </w:rPr>
+        <w:t xml:space="preserve">Table III reports the replication results for the local reviewer, qwen3:4b-instruct-2507-q4_K_M, served through Ollama. The outcomes were scored by the Claude agent judge, claude-sonnet-agent. As discussed in Section V-G, this judge was selected after its agreement with the local judge had been examined. The replication is reported separately and is not pooled with the original experiment.</w:t>
       </w:r>
     </w:p>
     <w:p>
@@ -3802,7 +4253,7 @@
           <w:sz w:val="16"/>
           <w:szCs w:val="16"/>
         </w:rPr>
-        <w:t xml:space="preserve">Judged outcomes, local replication (v3)</w:t>
+        <w:t xml:space="preserve">Judged outcomes for the local replication (v3)</w:t>
       </w:r>
     </w:p>
     <w:tbl>
@@ -4981,7 +5432,7 @@
           <w:sz w:val="16"/>
           <w:szCs w:val="16"/>
         </w:rPr>
-        <w:t xml:space="preserve">Outcomes by condition in the local replication (v3). Counts are of instances; the box gives G, its 95% interval and the McNemar p.</w:t>
+        <w:t xml:space="preserve">Outcomes across conditions in the local replication. Counts represent instances; the figure reports gap recovery, its 95% interval, and the McNemar p-value.</w:t>
       </w:r>
     </w:p>
     <w:p>
@@ -5002,7 +5453,7 @@
           <w:sz w:val="20"/>
           <w:szCs w:val="20"/>
         </w:rPr>
-        <w:t xml:space="preserve">Clarification did not significantly recover intent in the replication. Over 96 instances, intent recovery was 67% without clarification, 70% with it and 100% with full context. Gap recovery was 0.09 (interval -0.22 to 0.33, McNemar p = 0.66), not significant. The upper limit of the interval rules out recovering more than about a third of the gap at this sample size. The manipulation works: withholding intent cost 33 points of intent recovery against full context, and clarification restored 3 of those points. By subset, gap recovery was 0.00 on the golden rows (p = 1.00) and 0.25 on the mutants (p = 0.51), neither significant.</w:t>
+        <w:t xml:space="preserve">Clarification did not significantly improve intent recovery in the replication. Across 96 instances, recovery increased from 67% without clarification to 70% with clarification, while full context achieved 100%. Gap recovery was 0.09 (95% interval: -0.22 to 0.33; McNemar's p = 0.66). The interval includes zero and does not establish a positive effect. Its upper bound also rules out recovering more than approximately one-third of the gap under the reported interval.</w:t>
       </w:r>
     </w:p>
     <w:p>
@@ -5023,7 +5474,7 @@
           <w:sz w:val="20"/>
           <w:szCs w:val="20"/>
         </w:rPr>
-        <w:t xml:space="preserve">Detector recall was the limit, as in the original study. The detector asked on 17 of 96 treatment reviews. Of the 32 changes that the reviewer misread without clarification, the detector asked on 8 and missed 24. The simulated author answered 7 of those 8 questions, and the treatment recovered intent on 3 of the 32 changes. Effects went in both directions: clarification helped on 12 instances and hurt on 9. Once a question was answered, the treatment recovered intent in 3 of 7 cases, so most of the loss lies in deciding when to ask. Recall, not the answer, is the limit.</w:t>
+        <w:t xml:space="preserve">Withholding intent reduced recovery by 33 percentage points relative to full context, while clarification restored three percentage points. The results were also inconclusive when examined separately: gap recovery was 0.00 on golden instances (p = 1.00) and 0.25 on mutant instances (p = 0.51).</w:t>
       </w:r>
     </w:p>
     <w:p>
@@ -5044,26 +5495,7 @@
           <w:sz w:val="20"/>
           <w:szCs w:val="20"/>
         </w:rPr>
-        <w:t xml:space="preserve">Defect detection stays near the floor even with full context. The mutant rows caught the injected defect on 1 of 32 without clarification, 2 with it and 3 with full context (3%, 6% and 9%; McNemar p = 1.00). A small local reviewer, qwen3:4b-instruct-2507-q4_K_M, limits defect detection, as in the original study. Over 64 golden rows, false alarms were 1 without clarification, 3 with it and 3 with full context, too few to separate the conditions (p = 0.50). The study makes no claim about an effect on defects.</w:t>
-      </w:r>
-    </w:p>
-    <w:p>
-      <w:pPr>
-        <w:keepNext/>
-        <w:spacing w:after="40" w:before="80"/>
-      </w:pPr>
-      <w:r>
-        <w:rPr>
-          <w:rFonts w:ascii="Times New Roman" w:cs="Times New Roman" w:eastAsia="Times New Roman" w:hAnsi="Times New Roman"/>
-          <w:b w:val="false"/>
-          <w:bCs w:val="false"/>
-          <w:i/>
-          <w:iCs/>
-          <w:smallCaps w:val="false"/>
-          <w:sz w:val="20"/>
-          <w:szCs w:val="20"/>
-        </w:rPr>
-        <w:t xml:space="preserve">G. Judge calibration</w:t>
+        <w:t xml:space="preserve">As in the original study, detector recall was a key limitation. The detector asked questions in 17 of the 96 treatment reviews. Among the 32 changes whose intent the reviewer failed to recover without clarification, it asked about eight and missed 24. The simulated author provided answers in seven of those eight cases, and the treatment recovered intent in three of the 32 initially misinterpreted changes.</w:t>
       </w:r>
     </w:p>
     <w:p>
@@ -5084,7 +5516,110 @@
           <w:sz w:val="20"/>
           <w:szCs w:val="20"/>
         </w:rPr>
-        <w:t xml:space="preserve">Three AI judges scored the original reviews: the API judge gemma-4-31b-it, Claude Sonnet agents (claude-sonnet-agent), and the Gemini 4 Argon (web app) on a stratified sample of 30 runs, stratified by condition and variant. Table IV gives percent agreement, kappa and n for each judge pair. All of this is AI-vs-AI agreement, not validation against human scorers.</w:t>
+        <w:t xml:space="preserve">The effect was not uniformly positive. Clarification helped on 12 instances and hurt on nine. Among the seven cases where the simulated author answered a question about a change the floor had misinterpreted, the treatment recovered intent in three. These results suggest that the main challenge lies not simply in obtaining an answer, but in identifying when asking is worthwhile. Detector recall remains a central limitation.</w:t>
+      </w:r>
+    </w:p>
+    <w:p>
+      <w:pPr>
+        <w:keepNext w:val="false"/>
+        <w:spacing w:after="40" w:before="0" w:line="240"/>
+        <w:ind w:firstLine="202"/>
+        <w:jc w:val="both"/>
+      </w:pPr>
+      <w:r>
+        <w:rPr>
+          <w:rFonts w:ascii="Times New Roman" w:cs="Times New Roman" w:eastAsia="Times New Roman" w:hAnsi="Times New Roman"/>
+          <w:b w:val="false"/>
+          <w:bCs w:val="false"/>
+          <w:i w:val="false"/>
+          <w:iCs w:val="false"/>
+          <w:smallCaps w:val="false"/>
+          <w:sz w:val="20"/>
+          <w:szCs w:val="20"/>
+        </w:rPr>
+        <w:t xml:space="preserve">Defect detection remained low even with full context. The reviewer caught one of 32 injected defects without clarification, two with clarification, and three with full context, corresponding to 3%, 6%, and 9%, respectively. The difference was not statistically significant (McNemar's p = 1.00). The local reviewer's limited ability to recognise defects therefore remained a constraint, consistent with the original experiment.</w:t>
+      </w:r>
+    </w:p>
+    <w:p>
+      <w:pPr>
+        <w:keepNext w:val="false"/>
+        <w:spacing w:after="40" w:before="0" w:line="240"/>
+        <w:ind w:firstLine="202"/>
+        <w:jc w:val="both"/>
+      </w:pPr>
+      <w:r>
+        <w:rPr>
+          <w:rFonts w:ascii="Times New Roman" w:cs="Times New Roman" w:eastAsia="Times New Roman" w:hAnsi="Times New Roman"/>
+          <w:b w:val="false"/>
+          <w:bCs w:val="false"/>
+          <w:i w:val="false"/>
+          <w:iCs w:val="false"/>
+          <w:smallCaps w:val="false"/>
+          <w:sz w:val="20"/>
+          <w:szCs w:val="20"/>
+        </w:rPr>
+        <w:t xml:space="preserve">Among the 64 golden instances, false alarms occurred once without clarification, three times with clarification, and three times with full context. These differences were also inconclusive (p = 0.50). The replication does not establish that clarification improves defect detection or reduces false alarms.</w:t>
+      </w:r>
+    </w:p>
+    <w:p>
+      <w:pPr>
+        <w:keepNext/>
+        <w:spacing w:after="40" w:before="80"/>
+      </w:pPr>
+      <w:r>
+        <w:rPr>
+          <w:rFonts w:ascii="Times New Roman" w:cs="Times New Roman" w:eastAsia="Times New Roman" w:hAnsi="Times New Roman"/>
+          <w:b w:val="false"/>
+          <w:bCs w:val="false"/>
+          <w:i/>
+          <w:iCs/>
+          <w:smallCaps w:val="false"/>
+          <w:sz w:val="20"/>
+          <w:szCs w:val="20"/>
+        </w:rPr>
+        <w:t xml:space="preserve">G. Judge Calibration</w:t>
+      </w:r>
+    </w:p>
+    <w:p>
+      <w:pPr>
+        <w:keepNext w:val="false"/>
+        <w:spacing w:after="40" w:before="0" w:line="240"/>
+        <w:ind w:firstLine="202"/>
+        <w:jc w:val="both"/>
+      </w:pPr>
+      <w:r>
+        <w:rPr>
+          <w:rFonts w:ascii="Times New Roman" w:cs="Times New Roman" w:eastAsia="Times New Roman" w:hAnsi="Times New Roman"/>
+          <w:b w:val="false"/>
+          <w:bCs w:val="false"/>
+          <w:i w:val="false"/>
+          <w:iCs w:val="false"/>
+          <w:smallCaps w:val="false"/>
+          <w:sz w:val="20"/>
+          <w:szCs w:val="20"/>
+        </w:rPr>
+        <w:t xml:space="preserve">Three AI judges evaluated the original reviews: the API judge gemma-4-31b-it, the Claude Sonnet agent (claude-sonnet-agent), and Gemini 4 Argon through the web application. The API judge and the agent each scored all 108 original reviews; the web-application judge scored a stratified sample of 30 runs selected across conditions and patch variants. Table IV reports percentage agreement, Cohen's kappa, and sample size for each judge pair.</w:t>
+      </w:r>
+    </w:p>
+    <w:p>
+      <w:pPr>
+        <w:keepNext w:val="false"/>
+        <w:spacing w:after="40" w:before="0" w:line="240"/>
+        <w:ind w:firstLine="202"/>
+        <w:jc w:val="both"/>
+      </w:pPr>
+      <w:r>
+        <w:rPr>
+          <w:rFonts w:ascii="Times New Roman" w:cs="Times New Roman" w:eastAsia="Times New Roman" w:hAnsi="Times New Roman"/>
+          <w:b w:val="false"/>
+          <w:bCs w:val="false"/>
+          <w:i w:val="false"/>
+          <w:iCs w:val="false"/>
+          <w:smallCaps w:val="false"/>
+          <w:sz w:val="20"/>
+          <w:szCs w:val="20"/>
+        </w:rPr>
+        <w:t xml:space="preserve">These measurements describe agreement between AI judges. They should not be interpreted as evidence of agreement with human reviewers, which is assessed separately.</w:t>
       </w:r>
     </w:p>
     <w:p>
@@ -5124,7 +5659,7 @@
           <w:sz w:val="16"/>
           <w:szCs w:val="16"/>
         </w:rPr>
-        <w:t xml:space="preserve">Agreement between AI judges (% agreement / kappa / n)</w:t>
+        <w:t xml:space="preserve">Agreement between AI judges (% agreement / Cohen's kappa / n)</w:t>
       </w:r>
     </w:p>
     <w:tbl>
@@ -5319,7 +5854,7 @@
                 <w:sz w:val="16"/>
                 <w:szCs w:val="16"/>
               </w:rPr>
-              <w:t xml:space="preserve">v2: gemma-4-31b-it vs agent</w:t>
+              <w:t xml:space="preserve">V2: gemma-4-31b-it vs. agent</w:t>
             </w:r>
           </w:p>
         </w:tc>
@@ -5461,7 +5996,7 @@
                 <w:sz w:val="16"/>
                 <w:szCs w:val="16"/>
               </w:rPr>
-              <w:t xml:space="preserve">v2: Gemini web vs agent</w:t>
+              <w:t xml:space="preserve">V2: Gemini web vs. agent</w:t>
             </w:r>
           </w:p>
         </w:tc>
@@ -5603,7 +6138,7 @@
                 <w:sz w:val="16"/>
                 <w:szCs w:val="16"/>
               </w:rPr>
-              <w:t xml:space="preserve">v2: Gemini web vs gemma-4-31b-it</w:t>
+              <w:t xml:space="preserve">V2: Gemini web vs. gemma-4-31b-it</w:t>
             </w:r>
           </w:p>
         </w:tc>
@@ -5745,7 +6280,7 @@
                 <w:sz w:val="16"/>
                 <w:szCs w:val="16"/>
               </w:rPr>
-              <w:t xml:space="preserve">v3: llama3.2:3b vs agent</w:t>
+              <w:t xml:space="preserve">V3: llama3.2:3b vs. agent</w:t>
             </w:r>
           </w:p>
         </w:tc>
@@ -5950,7 +6485,7 @@
           <w:sz w:val="16"/>
           <w:szCs w:val="16"/>
         </w:rPr>
-        <w:t xml:space="preserve">Cohen's kappa between pairs of AI judges. This is AI-vs-AI agreement, not validation against human scorers.</w:t>
+        <w:t xml:space="preserve">Cohen's kappa for pairs of AI judges. These values measure agreement between AI judges, not agreement with human reviewers.</w:t>
       </w:r>
     </w:p>
     <w:p>
@@ -5971,7 +6506,7 @@
           <w:sz w:val="20"/>
           <w:szCs w:val="20"/>
         </w:rPr>
-        <w:t xml:space="preserve">Against the agent judge, the API judge agreed almost perfectly on defects (kappa 0.88, 99% agreement, n = 108) and on false alarms (kappa 1.00), and was fair on intent (kappa 0.40, 89% agreement, n = 108). The Gemini web app agreed with the agent judge on intent at kappa 0.62, and the three judges agreed on intent for 25 of 30 runs. Re-scoring the original study with the agent judge gave intent floor 86%, treatment 92% and ceiling 100%, and gap recovery 0.40 (interval -0.75 to 1.00, McNemar p = 0.63). The verdict holds: the effect is not significant. The size of gap recovery does not: under the API judge it was 0.17 (interval 0.00 to 0.50). These comparisons are AI-vs-AI agreement, not validation against human scorers.</w:t>
+        <w:t xml:space="preserve">Compared with the agent judge, the API judge showed strong agreement on defect detection (κ = 0.88, 99% agreement, n = 108) and false alarms (κ = 1.00). Agreement on intent recovery was lower (κ = 0.40, 89% agreement). The Gemini web judge achieved κ = 0.62 for intent recovery against the agent judge, and all three judges agreed on intent recovery in 25 of the 30 sampled runs.</w:t>
       </w:r>
     </w:p>
     <w:p>
@@ -5992,26 +6527,7 @@
           <w:sz w:val="20"/>
           <w:szCs w:val="20"/>
         </w:rPr>
-        <w:t xml:space="preserve">In the replication, the local judge, llama3.2:3b, is unusable: its agreement with the agent judge was fair on intent (kappa 0.20, 68%, n = 288), slight on defects (kappa 0.06) and slight on false alarms (kappa 0.00). It never flagged a false alarm (total 0) and wrote that no defect was injected on 54 of 96 mutant rows (56%). The Claude agent judge claude-sonnet-agent is therefore the primary judge for the replication. That choice was made after seeing the agreement figures, so it is a post hoc choice. The local judge's own intent result, gap recovery 0.17 (interval -0.31 to 0.52), is reference only, and its intent recovery across the three conditions was 58%, 63% and 83%. All of this is AI-vs-AI agreement. Only the original study's API judge has been checked against human scorers, as reported in Section VII; the replication's judges have not.</w:t>
-      </w:r>
-    </w:p>
-    <w:p>
-      <w:pPr>
-        <w:keepNext/>
-        <w:spacing w:after="40" w:before="80"/>
-      </w:pPr>
-      <w:r>
-        <w:rPr>
-          <w:rFonts w:ascii="Times New Roman" w:cs="Times New Roman" w:eastAsia="Times New Roman" w:hAnsi="Times New Roman"/>
-          <w:b w:val="false"/>
-          <w:bCs w:val="false"/>
-          <w:i/>
-          <w:iCs/>
-          <w:smallCaps w:val="false"/>
-          <w:sz w:val="20"/>
-          <w:szCs w:val="20"/>
-        </w:rPr>
-        <w:t xml:space="preserve">H. The replication set on the original reviewer</w:t>
+        <w:t xml:space="preserve">When the original study was rescored using the agent judge, intent recovery was 86% at the floor, 92% in the treatment, and 100% at the ceiling. Gap recovery increased to 0.40 (95% interval: -0.75 to 1.00; McNemar's p = 0.63). The conclusion remained unchanged: the effect was not statistically significant. However, its estimated magnitude differed from the value of 0.17 obtained with the API judge (95% interval: 0.00 to 0.50). These comparisons measure agreement between AI judges and do not independently establish agreement with human assessments.</w:t>
       </w:r>
     </w:p>
     <w:p>
@@ -6032,7 +6548,89 @@
           <w:sz w:val="20"/>
           <w:szCs w:val="20"/>
         </w:rPr>
-        <w:t xml:space="preserve">Sections V-B and V-F differ in rows and reviewer at once. To separate the two, all 96 rows of the replication set were also run on the original reviewer (gemini-3.5-flash-lite) with the original question, author and judge models (gemma-4-31b-it). 94 rows completed all three conditions; for the other 2 the question model failed with a server error on every attempt.</w:t>
+        <w:t xml:space="preserve">The local judge, llama3.2:3b, performed poorly in the replication. Its agreement with the agent judge was 68% for intent recovery (κ = 0.20, n = 288), 93% for defect detection (κ = 0.06), and 98% for false alarms (κ = 0.00). Despite the high percentage agreement on false alarms, its kappa value indicates that this agreement did not extend beyond what would be expected from the marginal distributions. The local judge never flagged a false alarm and reported that no defect had been injected in 54 of the 96 mutant rows, or 56%.</w:t>
+      </w:r>
+    </w:p>
+    <w:p>
+      <w:pPr>
+        <w:keepNext w:val="false"/>
+        <w:spacing w:after="40" w:before="0" w:line="240"/>
+        <w:ind w:firstLine="202"/>
+        <w:jc w:val="both"/>
+      </w:pPr>
+      <w:r>
+        <w:rPr>
+          <w:rFonts w:ascii="Times New Roman" w:cs="Times New Roman" w:eastAsia="Times New Roman" w:hAnsi="Times New Roman"/>
+          <w:b w:val="false"/>
+          <w:bCs w:val="false"/>
+          <w:i w:val="false"/>
+          <w:iCs w:val="false"/>
+          <w:smallCaps w:val="false"/>
+          <w:sz w:val="20"/>
+          <w:szCs w:val="20"/>
+        </w:rPr>
+        <w:t xml:space="preserve">We therefore used claude-sonnet-agent as the primary judge for the replication. This choice was made after examining the agreement results, making it a post hoc decision. The local judge's own gap-recovery estimate of 0.17 (95% interval: -0.31 to 0.52) is included for reference only. Its intent-recovery rates across the floor, treatment, and ceiling were 58%, 63%, and 83%, respectively. These comparisons remain AI-to-AI evaluations. Only the API judge used in the original study was checked against human scorers; the judges used for the replication were not.</w:t>
+      </w:r>
+    </w:p>
+    <w:p>
+      <w:pPr>
+        <w:keepNext/>
+        <w:spacing w:after="40" w:before="80"/>
+      </w:pPr>
+      <w:r>
+        <w:rPr>
+          <w:rFonts w:ascii="Times New Roman" w:cs="Times New Roman" w:eastAsia="Times New Roman" w:hAnsi="Times New Roman"/>
+          <w:b w:val="false"/>
+          <w:bCs w:val="false"/>
+          <w:i/>
+          <w:iCs/>
+          <w:smallCaps w:val="false"/>
+          <w:sz w:val="20"/>
+          <w:szCs w:val="20"/>
+        </w:rPr>
+        <w:t xml:space="preserve">H. Replication Set on the Original Reviewer</w:t>
+      </w:r>
+    </w:p>
+    <w:p>
+      <w:pPr>
+        <w:keepNext w:val="false"/>
+        <w:spacing w:after="40" w:before="0" w:line="240"/>
+        <w:ind w:firstLine="202"/>
+        <w:jc w:val="both"/>
+      </w:pPr>
+      <w:r>
+        <w:rPr>
+          <w:rFonts w:ascii="Times New Roman" w:cs="Times New Roman" w:eastAsia="Times New Roman" w:hAnsi="Times New Roman"/>
+          <w:b w:val="false"/>
+          <w:bCs w:val="false"/>
+          <w:i w:val="false"/>
+          <w:iCs w:val="false"/>
+          <w:smallCaps w:val="false"/>
+          <w:sz w:val="20"/>
+          <w:szCs w:val="20"/>
+        </w:rPr>
+        <w:t xml:space="preserve">The results in Sections V-B and V-F differ in both the instances evaluated and the reviewer model. To examine the effect of changing the reviewer independently of the dataset, we ran all 96 replication instances through the original reviewer, gemini-3.5-flash-lite, using the original question, author, and judge models (gemma-4-31b-it).</w:t>
+      </w:r>
+    </w:p>
+    <w:p>
+      <w:pPr>
+        <w:keepNext w:val="false"/>
+        <w:spacing w:after="40" w:before="0" w:line="240"/>
+        <w:ind w:firstLine="202"/>
+        <w:jc w:val="both"/>
+      </w:pPr>
+      <w:r>
+        <w:rPr>
+          <w:rFonts w:ascii="Times New Roman" w:cs="Times New Roman" w:eastAsia="Times New Roman" w:hAnsi="Times New Roman"/>
+          <w:b w:val="false"/>
+          <w:bCs w:val="false"/>
+          <w:i w:val="false"/>
+          <w:iCs w:val="false"/>
+          <w:smallCaps w:val="false"/>
+          <w:sz w:val="20"/>
+          <w:szCs w:val="20"/>
+        </w:rPr>
+        <w:t xml:space="preserve">Three conditions were completed for 94 instances. For the remaining two, the question model returned a server error on every attempt.</w:t>
       </w:r>
     </w:p>
     <w:p>
@@ -6072,7 +6670,7 @@
           <w:sz w:val="16"/>
           <w:szCs w:val="16"/>
         </w:rPr>
-        <w:t xml:space="preserve">Judged outcomes, replication set on the original reviewer</w:t>
+        <w:t xml:space="preserve">Judged outcomes for the replication set on the original reviewer</w:t>
       </w:r>
     </w:p>
     <w:tbl>
@@ -7193,7 +7791,49 @@
           <w:sz w:val="20"/>
           <w:szCs w:val="20"/>
         </w:rPr>
-        <w:t xml:space="preserve">Intent recovery was 65% with intent withheld, 72% with clarification and 98% with full context: G = 0.23 (95% interval 0.03–0.41, McNemar p = 0.07). Read alone, the interval excludes zero. The trace says otherwise. The detector asked on 15 of 94 instances and the simulated author gave a substantive answer to 2; of the 33 floor misses it asked on 9 and recovered 0. Of the 11 discordant pairs, 10 came from instances where no question was asked, so floor and treatment sent the reviewer identical input, and they split 8 to 2. The difference is the reviewer's run-to-run variation, not clarification. Clarification also raised false alarms on golden patches from 1/62 to 5/62. The lesson for the design is that one review per condition cannot resolve an effect of this size: repeated reviews per condition, or a reviewer run deterministically, are needed.</w:t>
+        <w:t xml:space="preserve">Intent recovery was 65% with intent withheld, 72% with clarification, and 98% with full context. Gap recovery was 0.23 (95% interval: 0.03 to 0.41; McNemar's p = 0.07). Although the interval excludes zero, the paired test does not reach the conventional significance threshold. The instance-level trace also raises doubts about attributing the observed difference to clarification.</w:t>
+      </w:r>
+    </w:p>
+    <w:p>
+      <w:pPr>
+        <w:keepNext w:val="false"/>
+        <w:spacing w:after="40" w:before="0" w:line="240"/>
+        <w:ind w:firstLine="202"/>
+        <w:jc w:val="both"/>
+      </w:pPr>
+      <w:r>
+        <w:rPr>
+          <w:rFonts w:ascii="Times New Roman" w:cs="Times New Roman" w:eastAsia="Times New Roman" w:hAnsi="Times New Roman"/>
+          <w:b w:val="false"/>
+          <w:bCs w:val="false"/>
+          <w:i w:val="false"/>
+          <w:iCs w:val="false"/>
+          <w:smallCaps w:val="false"/>
+          <w:sz w:val="20"/>
+          <w:szCs w:val="20"/>
+        </w:rPr>
+        <w:t xml:space="preserve">The detector asked questions on 15 of the 94 instances, but the simulated author provided a substantive answer in only two cases. Among the 33 instances misinterpreted at the floor, the detector asked about nine and recovered intent in none. Of the eleven discordant floor-treatment pairs, ten came from instances where no question was asked. In those cases, the reviewer received identical input in both conditions, yet the outcomes differed in eight cases in one direction and two in the other. This pattern points to run-to-run variation in the reviewer rather than an effect of clarification.</w:t>
+      </w:r>
+    </w:p>
+    <w:p>
+      <w:pPr>
+        <w:keepNext w:val="false"/>
+        <w:spacing w:after="40" w:before="0" w:line="240"/>
+        <w:ind w:firstLine="202"/>
+        <w:jc w:val="both"/>
+      </w:pPr>
+      <w:r>
+        <w:rPr>
+          <w:rFonts w:ascii="Times New Roman" w:cs="Times New Roman" w:eastAsia="Times New Roman" w:hAnsi="Times New Roman"/>
+          <w:b w:val="false"/>
+          <w:bCs w:val="false"/>
+          <w:i w:val="false"/>
+          <w:iCs w:val="false"/>
+          <w:smallCaps w:val="false"/>
+          <w:sz w:val="20"/>
+          <w:szCs w:val="20"/>
+        </w:rPr>
+        <w:t xml:space="preserve">Clarification also increased false alarms on golden patches, from one of 62 at the floor to five of 62 in the treatment. Taken together, these results show why a single review per condition is insufficient to separate clarification effects from variation in model outputs. Repeated evaluations per condition or a deterministic reviewer would provide a stronger basis for attribution.</w:t>
       </w:r>
     </w:p>
     <w:p>
@@ -7247,7 +7887,7 @@
           <w:sz w:val="20"/>
           <w:szCs w:val="20"/>
         </w:rPr>
-        <w:t xml:space="preserve">Asking is cheap to add and hard to target. Once a question reached an author who could answer it, the answer did what it was meant to do; nearly all of the loss happened earlier, in deciding when to ask. This shifts the research problem: the quality of a clarifying question matters less than the recall of the decision to pose one, at a precision that keeps the tool tolerable. A detector built from diff features was precise and conservative; a sampling-based detector separated the conditions but needs calibration on held-out data.</w:t>
+        <w:t xml:space="preserve">Adding a clarification step is straightforward. Deciding when to use it effectively is more difficult. When a question reached an author who could provide the missing information, clarification sometimes helped the reviewer recover the intended behaviour. Most opportunities for improvement were lost earlier, when the detector failed to identify a change that the reviewer would misunderstand. This shifts the central problem from generating good questions to identifying when a question is warranted, while keeping unnecessary interruptions manageable.</w:t>
       </w:r>
     </w:p>
     <w:p>
@@ -7268,7 +7908,7 @@
           <w:sz w:val="20"/>
           <w:szCs w:val="20"/>
         </w:rPr>
-        <w:t xml:space="preserve">Golden patches are a poor population for studying ambiguity. Well-written fixes state their purpose in the code, comments and docstrings they add; evaluating intent-dependent review requires withholding all of it, and even then most changes remain self-explanatory. Benchmarks of genuinely under-specified changes would strengthen this line of work.</w:t>
+        <w:t xml:space="preserve">The detector results illustrate this trade-off. The heuristic detector was conservative and achieved high precision, but its recall was low. Sampling-based uncertainty distinguished the stripped and full-context conditions in the small evaluation, although its threshold needs to be calibrated on held-out data. Prompt perturbation did not separate the two conditions under the tested configuration. These results do not establish that any detector is ready for general deployment.</w:t>
       </w:r>
     </w:p>
     <w:p>
@@ -7289,7 +7929,7 @@
           <w:sz w:val="20"/>
           <w:szCs w:val="20"/>
         </w:rPr>
-        <w:t xml:space="preserve">Finally, clarification cannot exceed the reviewer. On a small free-tier model, full context did not make the reviewer catch injected defects, so detection gains, if they exist, require a stronger reviewer before intent can matter.</w:t>
+        <w:t xml:space="preserve">Golden patches also present a limitation for studying ambiguity. Well-written changes often explain their purpose through the code, comments, and docstrings they introduce. Removing only the linked issue therefore leaves substantial information available to the reviewer. Even after all natural-language statements of intent were removed, many changes remained understandable from the code itself. Future evaluations would benefit from benchmarks containing changes whose intended behaviour is genuinely under-specified.</w:t>
       </w:r>
     </w:p>
     <w:p>
@@ -7310,7 +7950,28 @@
           <w:sz w:val="20"/>
           <w:szCs w:val="20"/>
         </w:rPr>
-        <w:t xml:space="preserve">Two reviewers and two judge configurations give the same qualitative picture: recall is the binding limit, defect detection is limited by the reviewer, and no gap-recovery interval excludes zero. The size of the effect depends on which judge scores the reviews. In the original study, gap recovery was 0.17 under the API judge (interval 0.00 to 0.50) and 0.40 under the agent judge (interval -0.75 to 1.00). In the replication, under the agent judge, it was 0.09 (interval -0.22 to 0.33) on 96 instances. The sign of the effect is therefore not established under any of these judges, and magnitudes should be read together with the judge that produced them.</w:t>
+        <w:t xml:space="preserve">Clarification is also constrained by the underlying reviewer's capabilities. In both the original experiment and the local replication, defect detection remained low even when full context was available. A reviewer that cannot reliably recognise an injected defect is unlikely to gain much from learning more about the author's intent. Stronger reviewers may be needed before the effect of clarification on defect detection can be meaningfully assessed.</w:t>
+      </w:r>
+    </w:p>
+    <w:p>
+      <w:pPr>
+        <w:keepNext w:val="false"/>
+        <w:spacing w:after="40" w:before="0" w:line="240"/>
+        <w:ind w:firstLine="202"/>
+        <w:jc w:val="both"/>
+      </w:pPr>
+      <w:r>
+        <w:rPr>
+          <w:rFonts w:ascii="Times New Roman" w:cs="Times New Roman" w:eastAsia="Times New Roman" w:hAnsi="Times New Roman"/>
+          <w:b w:val="false"/>
+          <w:bCs w:val="false"/>
+          <w:i w:val="false"/>
+          <w:iCs w:val="false"/>
+          <w:smallCaps w:val="false"/>
+          <w:sz w:val="20"/>
+          <w:szCs w:val="20"/>
+        </w:rPr>
+        <w:t xml:space="preserve">Across the two reviewers and judge configurations, the qualitative findings were similar: detector recall limits the opportunities for clarification, defect detection remains constrained by the reviewer, and the experiments do not establish a statistically significant improvement in intent recovery. However, the estimated effect size depends on the judge. In the original study, gap recovery was 0.17 with the API judge (95% interval: 0.00 to 0.50) and 0.40 with the agent judge (95% interval: -0.75 to 1.00). In the 96-instance replication, gap recovery was 0.09 with the agent judge (95% interval: -0.22 to 0.33). The evidence therefore does not establish a reliable positive effect across these evaluations, and the estimates should be interpreted alongside the judge and reviewer that produced them.</w:t>
       </w:r>
     </w:p>
     <w:p>
@@ -7364,7 +8025,7 @@
           <w:sz w:val="20"/>
           <w:szCs w:val="20"/>
         </w:rPr>
-        <w:t xml:space="preserve">The sample is small (36 instances under per-model daily quotas), so intervals are wide. The judge was validated against 2 independent human scorers on a stratified sample of 60 of its own reviews, shown without the judge's answers or the condition; blank cells were excluded, not counted as disagreement. On defects and false alarms it agreed with them almost perfectly (Cohen's κ [15] 0.92 and 1.00; 99% and 100% agreement). On intent recovery it agreed on 88% of reviews, but κ was -0.01: the humans judged intent recovered in 99% of reviews and the judge in 88%, so the near-zero κ reflects one dominant answer rather than random agreement. The judge is the stricter of the two, so the intent recovery rates reported here are conservative rather than inflated. The simulated author answers from withheld text only, but leakage requires the hand audit the tooling prepares. We report a protocol deviation: in the first v2 run the simulated author's token budget was exhausted by its model's hidden reasoning, returning empty answers, and its prompt refused questions phrased in terms of unseen code. Both were corrected and the treatment re-run for the six affected instances; floor and ceiling were not re-run, and the prompt revision, made after observing refusals, is logged with every exchange. All verified mutants come from sympy and the operators produce simple defects. The reviewer is a small model; results may differ for stronger ones.</w:t>
+        <w:t xml:space="preserve">The original study includes only 36 instances, partly because of per-model daily quotas, resulting in wide confidence intervals. The judge was evaluated against two independent human scorers on a stratified sample of 60 of its reviews. The reviews were presented without the judge's answers or the experimental condition, and blank responses were excluded rather than counted as disagreements.</w:t>
       </w:r>
     </w:p>
     <w:p>
@@ -7385,7 +8046,7 @@
           <w:sz w:val="20"/>
           <w:szCs w:val="20"/>
         </w:rPr>
-        <w:t xml:space="preserve">The replication adds further limits. Both studies have small samples: the original has 36 instances and the replication 96, so intervals are wide. The agent judge was chosen after seeing its agreement with the local judge, which makes the choice post hoc. The question and oracle model is small, and its identity is recorded in the oracle log but not per database row. The studies differ in reviewer and judge as well as in rows, and they are never pooled. A single review per condition cannot separate the effect from the reviewer's own run-to-run variation. The live GitHub demonstration covers 2 constructed pull requests in the authors' own sandbox repository, run from a laptop behind a tunnel; it shows that the loop works but estimates nothing. Live deployment on real third-party pull requests is not done, and the 356 collected real pull requests are not yet labelled.</w:t>
+        <w:t xml:space="preserve">For defect detection and false alarms, agreement with the human scorers was high: Cohen's κ [15] was 0.92 and 1.00, respectively, with 99% and 100% observed agreement. For intent recovery, observed agreement was 88%, but κ was -0.01. The humans judged intent to have been recovered in 99% of reviews, compared with 88% for the judge. The near-zero kappa therefore reflects the highly imbalanced distribution of judgements and does not, by itself, indicate that the observed agreement was random. The judge was stricter than the human scorers on intent recovery, so the reported rates may be conservative under this evaluation.</w:t>
       </w:r>
     </w:p>
     <w:p>
@@ -7406,7 +8067,104 @@
           <w:sz w:val="20"/>
           <w:szCs w:val="20"/>
         </w:rPr>
-        <w:t xml:space="preserve">Human labelling. Two annotators independently labelled 300 pull requests as clear or unclear from the code change alone; Cohen's κ [15] was 0.21 (fair, observed agreement 98%). The 7 disagreements were adjudicated by an AI model (Claude (claude-opus-5-5, AI)) applying the same codebook, at the authors' request; these 7 labels are therefore not human judgements. Thresholds were frozen on a development split of these labels (300 labelled, 4 ambiguous) before any threshold-dependent evaluation; note that Study A itself ran with the default thresholds.</w:t>
+        <w:t xml:space="preserve">The simulated author was restricted to the withheld issue text and commit messages. However, possible information leakage still requires the manual audit supported by the evaluation tooling. We also report a protocol deviation from the first v2 run. The simulated author's token budget was consumed by the model's internal reasoning, resulting in empty answers. Its prompt also rejected questions phrased in terms of code it could not see. Both issues were addressed, and the treatment was rerun for the six affected instances. The floor and ceiling conditions were not rerun. Because the prompt was revised after the refusals were observed, this change may have influenced the treatment results; the revised prompt and each exchange are recorded in the study log.</w:t>
+      </w:r>
+    </w:p>
+    <w:p>
+      <w:pPr>
+        <w:keepNext w:val="false"/>
+        <w:spacing w:after="40" w:before="0" w:line="240"/>
+        <w:ind w:firstLine="202"/>
+        <w:jc w:val="both"/>
+      </w:pPr>
+      <w:r>
+        <w:rPr>
+          <w:rFonts w:ascii="Times New Roman" w:cs="Times New Roman" w:eastAsia="Times New Roman" w:hAnsi="Times New Roman"/>
+          <w:b w:val="false"/>
+          <w:bCs w:val="false"/>
+          <w:i w:val="false"/>
+          <w:iCs w:val="false"/>
+          <w:smallCaps w:val="false"/>
+          <w:sz w:val="20"/>
+          <w:szCs w:val="20"/>
+        </w:rPr>
+        <w:t xml:space="preserve">All verified mutants came from SymPy, and the mutation operators introduced relatively simple defects. The findings may therefore not generalise to more complex defects or changes in other repositories. Finally, the original reviewer is a relatively small model. Stronger models may interpret intent and identify defects differently, so the results should not be assumed to apply to all LLM-based code reviewers.</w:t>
+      </w:r>
+    </w:p>
+    <w:p>
+      <w:pPr>
+        <w:keepNext w:val="false"/>
+        <w:spacing w:after="40" w:before="0" w:line="240"/>
+        <w:ind w:firstLine="202"/>
+        <w:jc w:val="both"/>
+      </w:pPr>
+      <w:r>
+        <w:rPr>
+          <w:rFonts w:ascii="Times New Roman" w:cs="Times New Roman" w:eastAsia="Times New Roman" w:hAnsi="Times New Roman"/>
+          <w:b w:val="false"/>
+          <w:bCs w:val="false"/>
+          <w:i w:val="false"/>
+          <w:iCs w:val="false"/>
+          <w:smallCaps w:val="false"/>
+          <w:sz w:val="20"/>
+          <w:szCs w:val="20"/>
+        </w:rPr>
+        <w:t xml:space="preserve">The replication introduces additional limitations. Both studies use relatively small samples: 36 instances in the original study and 96 in the replication, resulting in wide intervals. The agent judge was selected after its agreement with the local judge had been examined, making this a post hoc choice. The question and oracle models are also small, and their identities are recorded in the oracle log but not for each database row. The studies differ in their instances, reviewer models, and judges, so their results are reported separately rather than pooled. Furthermore, a single review per condition cannot distinguish the effect of clarification from the reviewer's own run-to-run variation.</w:t>
+      </w:r>
+    </w:p>
+    <w:p>
+      <w:pPr>
+        <w:keepNext w:val="false"/>
+        <w:spacing w:after="40" w:before="0" w:line="240"/>
+        <w:ind w:firstLine="202"/>
+        <w:jc w:val="both"/>
+      </w:pPr>
+      <w:r>
+        <w:rPr>
+          <w:rFonts w:ascii="Times New Roman" w:cs="Times New Roman" w:eastAsia="Times New Roman" w:hAnsi="Times New Roman"/>
+          <w:b w:val="false"/>
+          <w:bCs w:val="false"/>
+          <w:i w:val="false"/>
+          <w:iCs w:val="false"/>
+          <w:smallCaps w:val="false"/>
+          <w:sz w:val="20"/>
+          <w:szCs w:val="20"/>
+        </w:rPr>
+        <w:t xml:space="preserve">The live GitHub demonstration involved two constructed pull requests in the authors' sandbox repository, run from a laptop through a tunnel. It demonstrates that the interaction flow works, but provides no estimate of effectiveness. The system has not been evaluated live on real third-party pull requests, and the 356 real pull requests collected so far remain unlabelled.</w:t>
+      </w:r>
+    </w:p>
+    <w:p>
+      <w:pPr>
+        <w:keepNext w:val="false"/>
+        <w:spacing w:after="40" w:before="0" w:line="240"/>
+        <w:ind w:firstLine="202"/>
+        <w:jc w:val="both"/>
+      </w:pPr>
+      <w:r>
+        <w:rPr>
+          <w:rFonts w:ascii="Times New Roman" w:cs="Times New Roman" w:eastAsia="Times New Roman" w:hAnsi="Times New Roman"/>
+          <w:b/>
+          <w:bCs/>
+          <w:i w:val="false"/>
+          <w:iCs w:val="false"/>
+          <w:smallCaps w:val="false"/>
+          <w:sz w:val="20"/>
+          <w:szCs w:val="20"/>
+        </w:rPr>
+        <w:t xml:space="preserve">Human labelling. </w:t>
+      </w:r>
+      <w:r>
+        <w:rPr>
+          <w:rFonts w:ascii="Times New Roman" w:cs="Times New Roman" w:eastAsia="Times New Roman" w:hAnsi="Times New Roman"/>
+          <w:b w:val="false"/>
+          <w:bCs w:val="false"/>
+          <w:i w:val="false"/>
+          <w:iCs w:val="false"/>
+          <w:smallCaps w:val="false"/>
+          <w:sz w:val="20"/>
+          <w:szCs w:val="20"/>
+        </w:rPr>
+        <w:t xml:space="preserve">Two annotators independently labelled 300 pull requests as clear or unclear based on the code change alone. Cohen's κ [15] was 0.21, with 98% observed agreement. The seven disagreements were adjudicated using an AI model, Claude (claude-opus-5-5), applying the same codebook at the authors' request. These seven labels therefore do not represent human judgements alone. Detector thresholds were fixed using a development split of the labelled data, which contained only four ambiguous cases in total, before any threshold-dependent evaluation. Study A itself used the default thresholds.</w:t>
       </w:r>
     </w:p>
     <w:p>
@@ -7460,26 +8218,7 @@
           <w:sz w:val="20"/>
           <w:szCs w:val="20"/>
         </w:rPr>
-        <w:t xml:space="preserve">ClarifyReview inserts a decision before critique: ask the author when the intent of a change cannot be read from the change. Evaluating the idea required withholding all natural-language intent, because golden patches document their own. With that manipulation, clarification recovered 0.17 of the intent gap on 36 instances—in the expected direction, not significant at this size—and a per-instance trace shows it succeeded where it was given the chance, with detector recall as the limit. A second reviewer, a small local model, and a second judge reproduce the null result: gap recovery was 0.09 (interval -0.22 to 0.33, McNemar p = 0.66), not significant, and its upper limit rules out recovering more than about a third of the gap. The effect size depends on the judge. Future work is labelling the 356 real pull requests already collected (none is labelled yet), a paired developer study of usefulness and trust, permanent hosting of the bot and a run on real third-party pull requests at scale, repeated reviews per condition to separate the effect from the reviewer's run-to-run variation, and a larger run with a stronger reviewer.</w:t>
-      </w:r>
-    </w:p>
-    <w:p>
-      <w:pPr>
-        <w:spacing w:after="60" w:before="120"/>
-        <w:jc w:val="center"/>
-      </w:pPr>
-      <w:r>
-        <w:rPr>
-          <w:rFonts w:ascii="Times New Roman" w:cs="Times New Roman" w:eastAsia="Times New Roman" w:hAnsi="Times New Roman"/>
-          <w:b w:val="false"/>
-          <w:bCs w:val="false"/>
-          <w:i w:val="false"/>
-          <w:iCs w:val="false"/>
-          <w:smallCaps/>
-          <w:sz w:val="20"/>
-          <w:szCs w:val="20"/>
-        </w:rPr>
-        <w:t xml:space="preserve">Acknowledgment</w:t>
+        <w:t xml:space="preserve">ClarifyReview adds a decision before code review feedback: when the intent behind a change cannot be determined from the available information, the system can ask the author for clarification. Evaluating this approach required removing all natural-language statements of intent, since golden patches often explain their purpose through the text they introduce.</w:t>
       </w:r>
     </w:p>
     <w:p>
@@ -7500,7 +8239,49 @@
           <w:sz w:val="20"/>
           <w:szCs w:val="20"/>
         </w:rPr>
-        <w:t xml:space="preserve">The authors thank the School of Computer Science and Engineering, Vellore Institute of Technology, for supporting this work.</w:t>
+        <w:t xml:space="preserve">Under this manipulation, clarification recovered 0.17 of the intent gap across 36 instances. The result was in the expected direction but was not statistically significant. Instance-level analysis showed that clarification could recover intent when the detector identified an opportunity to ask, while low detector recall limited how often this could happen.</w:t>
+      </w:r>
+    </w:p>
+    <w:p>
+      <w:pPr>
+        <w:keepNext w:val="false"/>
+        <w:spacing w:after="40" w:before="0" w:line="240"/>
+        <w:ind w:firstLine="202"/>
+        <w:jc w:val="both"/>
+      </w:pPr>
+      <w:r>
+        <w:rPr>
+          <w:rFonts w:ascii="Times New Roman" w:cs="Times New Roman" w:eastAsia="Times New Roman" w:hAnsi="Times New Roman"/>
+          <w:b w:val="false"/>
+          <w:bCs w:val="false"/>
+          <w:i w:val="false"/>
+          <w:iCs w:val="false"/>
+          <w:smallCaps w:val="false"/>
+          <w:sz w:val="20"/>
+          <w:szCs w:val="20"/>
+        </w:rPr>
+        <w:t xml:space="preserve">The replication using a local reviewer also found no statistically significant improvement, with gap recovery of 0.09 (95% interval: -0.22 to 0.33; McNemar's p = 0.66). The upper bound rules out recovering more than approximately one-third of the gap under the reported interval. The estimated effect also varied depending on which judge evaluated the reviews, so the magnitude of the effect remains uncertain.</w:t>
+      </w:r>
+    </w:p>
+    <w:p>
+      <w:pPr>
+        <w:keepNext w:val="false"/>
+        <w:spacing w:after="40" w:before="0" w:line="240"/>
+        <w:ind w:firstLine="202"/>
+        <w:jc w:val="both"/>
+      </w:pPr>
+      <w:r>
+        <w:rPr>
+          <w:rFonts w:ascii="Times New Roman" w:cs="Times New Roman" w:eastAsia="Times New Roman" w:hAnsi="Times New Roman"/>
+          <w:b w:val="false"/>
+          <w:bCs w:val="false"/>
+          <w:i w:val="false"/>
+          <w:iCs w:val="false"/>
+          <w:smallCaps w:val="false"/>
+          <w:sz w:val="20"/>
+          <w:szCs w:val="20"/>
+        </w:rPr>
+        <w:t xml:space="preserve">Future work will label the 356 real pull requests already collected, conduct a paired developer study to assess usefulness and trust, host the bot permanently, and evaluate it on real third-party pull requests at scale. Further experiments should also repeat reviews under each condition to distinguish clarification effects from run-to-run variation and use a stronger reviewer to investigate whether clarification can improve defect detection.</w:t>
       </w:r>
     </w:p>
     <w:p>
@@ -7519,6 +8300,46 @@
           <w:sz w:val="20"/>
           <w:szCs w:val="20"/>
         </w:rPr>
+        <w:t xml:space="preserve">Acknowledgment</w:t>
+      </w:r>
+    </w:p>
+    <w:p>
+      <w:pPr>
+        <w:keepNext w:val="false"/>
+        <w:spacing w:after="40" w:before="0" w:line="240"/>
+        <w:ind w:firstLine="202"/>
+        <w:jc w:val="both"/>
+      </w:pPr>
+      <w:r>
+        <w:rPr>
+          <w:rFonts w:ascii="Times New Roman" w:cs="Times New Roman" w:eastAsia="Times New Roman" w:hAnsi="Times New Roman"/>
+          <w:b w:val="false"/>
+          <w:bCs w:val="false"/>
+          <w:i w:val="false"/>
+          <w:iCs w:val="false"/>
+          <w:smallCaps w:val="false"/>
+          <w:sz w:val="20"/>
+          <w:szCs w:val="20"/>
+        </w:rPr>
+        <w:t xml:space="preserve">The authors thank the School of Computer Science and Engineering at Vellore Institute of Technology for supporting this work.</w:t>
+      </w:r>
+    </w:p>
+    <w:p>
+      <w:pPr>
+        <w:spacing w:after="60" w:before="120"/>
+        <w:jc w:val="center"/>
+      </w:pPr>
+      <w:r>
+        <w:rPr>
+          <w:rFonts w:ascii="Times New Roman" w:cs="Times New Roman" w:eastAsia="Times New Roman" w:hAnsi="Times New Roman"/>
+          <w:b w:val="false"/>
+          <w:bCs w:val="false"/>
+          <w:i w:val="false"/>
+          <w:iCs w:val="false"/>
+          <w:smallCaps/>
+          <w:sz w:val="20"/>
+          <w:szCs w:val="20"/>
+        </w:rPr>
         <w:t xml:space="preserve">References</w:t>
       </w:r>
     </w:p>
@@ -7579,7 +8400,7 @@
           <w:sz w:val="16"/>
           <w:szCs w:val="16"/>
         </w:rPr>
-        <w:t xml:space="preserve">[3]  Greptile, "Best AI code review tools 2026—comparison benchmarks," greptile.com, 2026; Morph, "GitHub AI code review: 6 tools tested on real PRs," morphllm.com, 2026.</w:t>
+        <w:t xml:space="preserve">[3]  Greptile, "Best AI code review tools 2026: comparison benchmarks," greptile.com, 2026; Morph, "GitHub AI code review: 6 tools tested on real PRs," morphllm.com, 2026.</w:t>
       </w:r>
     </w:p>
     <w:p>

</xml_diff>

<commit_message>
Use the authors' paraphrased paper, with its facts corrected against the data
The paraphrase is kept wherever it stays accurate. About forty sentences that
the paraphrasing changed in meaning or number are corrected from numbers.json:
defect counts per condition, false alarms 1/62 to 5/62, the 8/2 split of
discordant pairs, 'most' (not 'few') opportunities lost to detector recall,
intent removed (not supported), one reviewer run three times, retries after
transient errors, the simulated author declining rather than answering 'no',
and the run count. The previous version wrongly said 96 runs for the
replication; it was 288. References stay as before, since the paraphrased list
was corrupted.

Co-Authored-By: Claude Opus 5.5 <noreply@anthropic.com>
</commit_message>
<xml_diff>
--- a/paper/ClarifyReview_Paper_Draft.docx
+++ b/paper/ClarifyReview_Paper_Draft.docx
@@ -108,7 +108,7 @@
           <w:sz w:val="18"/>
           <w:szCs w:val="18"/>
         </w:rPr>
-        <w:t xml:space="preserve">: LLM-based pull request reviewers typically inspect a change, infer the author's intent, and generate comments based on that interpretation. When the intent is unclear, the reviewer may make an incorrect assumption. We introduce ClarifyReview, a system that checks whether the available context is sufficient before producing feedback and asks the author a focused question when additional information is needed. The single-pass baseline uses the same pipeline but disables clarification, allowing us to isolate the effect of this decision stage. We evaluate ClarifyReview on SWE-bench Verified using a two-by-three ablation that includes correct patches and defective variants drawn from 32 execution-verified mutants. Each instance is assessed under three conditions: with intent withheld, with intent withheld but clarification enabled, and with full context available. An initial pilot showed that removing only the linked issue was insufficient because the patch itself often revealed its purpose. We therefore removed all natural-language statements of intent while preserving the code. Across 36 instances, intent recovery was 81% without clarification, 83% with clarification, and 97% with full context. The resulting gap recovery was 0.17, with a McNemar p-value of 1.00. Instance-level analysis suggests that clarification can recover intent when the detector identifies a need to ask, but detector recall remains a major limitation: it flagged only two of the seven changes whose intent the reviewer misinterpreted. Defect detection remained low even with full context, indicating that the reviewer's ability to identify defects, rather than missing intent alone, limits performance. We also replicated the experiment on 96 instances using a local model, qwen3:4b-instruct-2507-q4_K_M. Intent recovery was 67% without clarification, 70% with clarification, and 100% with full context. Gap recovery was 0.09 (95% interval: -0.22 to 0.33), which was not statistically significant. Re-scoring the original study with an alternative judge preserved the overall conclusion, although the estimated effect changed. When the replication set was evaluated using the original reviewer, intent recovery increased from 65% to 72%. However, ten of the eleven instances with changed outcomes involved cases where no clarification question was asked, suggesting that run-to-run reviewer variation, rather than clarification, explains most of this difference. We release the system, evaluation harness, verified mutants, and study log.</w:t>
+        <w:t xml:space="preserve">: An LLM-based PR reviewer would usually read a change, deduce its intent from that reading, and provide comments based on that understanding. If the intent is not clear, the reviewer might misinterpret its meaning. We propose ClarifyReview, a system that first infers whether the input context is adequate before generating feedback and, if not, asks the author a targeted question to obtain more context. The single-pass baseline is the same pipeline without clarification, which isolates the effect of this decision stage. ClarifyReview is tested in a two-by-three ablation on SWE-bench Verified, which consists of correct patches and defective variants selected from 32 execution-verified mutants. Each instance is evaluated in three scenarios: intent withheld, intent withheld with clarification, and complete context. The first pilot revealed that removing just the linked issue was not enough, since the patch itself often disclosed its intent. We therefore deleted all natural-language statements of intent but kept the code. Across 36 instances, intent recovery was 81% without clarification, 83% with clarification, and 97% with full context. The resulting gap recovery was 0.17 and the McNemar p-value was 1.00. From an instance-level perspective, clarification could recover the intent when the detector decided to ask, but detector recall is a significant challenge: only two of the seven changes whose intent the reviewer misunderstood were flagged. Even with full context, defect detection was still low, suggesting that performance is limited not just by a lack of intent but by the reviewer's ability to detect defects. Additionally, we repeated the test on 96 instances with a local model, qwen3:4b-instruct-2507-q4_K_M. Intent recovery was 67% without clarification, 70% with clarification, and 100% with full context. Gap recovery was 0.09 (95% interval: -0.22 to 0.33), which was not statistically significant. Re-scoring the original study with another judge did not alter the overall conclusion, but did alter the estimated effect. Assessing the replication set with the original reviewer raised intent recovery from 65% to 72%. However, in ten of the eleven instances whose outcome changed, no clarification question had been asked, which points to run-to-run variation of the reviewer rather than clarification. The system is released together with the evaluation harness, the verified mutants and the study log.</w:t>
       </w:r>
     </w:p>
     <w:p>
@@ -201,7 +201,7 @@
           <w:sz w:val="20"/>
           <w:szCs w:val="20"/>
         </w:rPr>
-        <w:t xml:space="preserve">Code review remains a bottleneck in software development, with much of a reviewer's effort spent understanding the purpose of a change [1], [2]. Tools such as CodeRabbit, Qodo, and Greptile use large language models (LLMs) to review pull requests automatically [3]. Although these tools can explain their findings, they share a limitation: they inspect a pull request in a single pass and provide feedback based on an inferred interpretation of the author's intent, even when that interpretation is uncertain.</w:t>
+        <w:t xml:space="preserve">A major hurdle in software development is code review, where much of a reviewer's time is dedicated to understanding the reason for a change [1], [2]. Current tools like CodeRabbit, Qodo, and Greptile leverage large language models (LLMs) to automatically review pull requests [3]. While these can give explanations for their results, they are all limited by the fact that they examine a pull request only once and give feedback based on their own interpretation of the author's intent, even when that interpretation is not clearly correct.</w:t>
       </w:r>
     </w:p>
     <w:p>
@@ -222,7 +222,7 @@
           <w:sz w:val="20"/>
           <w:szCs w:val="20"/>
         </w:rPr>
-        <w:t xml:space="preserve">Consider a change that removes a validation check without a linked issue or a descriptive commit message. A human reviewer would typically ask the author why the check was removed. Existing automated reviewers generally proceed with the information available. If their interpretation is wrong, they may flag an intentional change as defective or overlook a genuine defect. Both outcomes can undermine the trust developers place in automated review tools.</w:t>
+        <w:t xml:space="preserve">Think about a change that removes a validation check, for which there is no related issue and whose commit message provides no description. A human reviewer would normally ask the author the reason for the removal of the check. Current auto-reviewers usually proceed with the information that is available. If they come up with a wrong interpretation, they might flag an intended change as a defect, or miss a defect that is real. Both results can erode the trust that developers put in automated review tools.</w:t>
       </w:r>
     </w:p>
     <w:p>
@@ -243,7 +243,7 @@
           <w:sz w:val="20"/>
           <w:szCs w:val="20"/>
         </w:rPr>
-        <w:t xml:space="preserve">Clarification has been studied in code generation [4], [5], but its application to reviewing existing changes remains less explored. The setting is different: an incorrect assumption during code generation may lead to an unsuccessful result, whereas an incorrect review can cost a developer time and attention. This raises a practical question: can a reviewer that asks for clarification before commenting interpret changes and identify defects more effectively than one that proceeds without asking?</w:t>
+        <w:t xml:space="preserve">Clarification has been studied in the code generation area [4], [5] but not so much in the field of reviewing existing changes. The setting is different: if there is a mistake in code generation, the result may not be achieved, but if a review is incorrect, it costs the developer time and attention. So, a practical question is: will a reviewer that asks for clarification before commenting interpret changes and detect defects better than a reviewer that does not ask?</w:t>
       </w:r>
     </w:p>
     <w:p>
@@ -264,7 +264,7 @@
           <w:sz w:val="20"/>
           <w:szCs w:val="20"/>
         </w:rPr>
-        <w:t xml:space="preserve">This paper makes five contributions:</w:t>
+        <w:t xml:space="preserve">This paper contributes to the literature in five ways:</w:t>
       </w:r>
     </w:p>
     <w:p>
@@ -284,7 +284,7 @@
           <w:sz w:val="20"/>
           <w:szCs w:val="20"/>
         </w:rPr>
-        <w:t xml:space="preserve">1) We introduce ClarifyReview, a four-stage review system in which the second stage decides whether clarification is needed for each pull request. The system supports four interchangeable ambiguity detectors and uses a baseline that differs only in this decision stage.</w:t>
+        <w:t xml:space="preserve">1) We present ClarifyReview, a four-stage review system that determines in its second stage whether a pull request requires clarification. The system has four interchangeable ambiguity detectors, and its baseline differs only at this decision stage.</w:t>
       </w:r>
     </w:p>
     <w:p>
@@ -304,7 +304,7 @@
           <w:sz w:val="20"/>
           <w:szCs w:val="20"/>
         </w:rPr>
-        <w:t xml:space="preserve">2) We develop an evaluation design for intent-dependent code review on SWE-bench [6]. It removes natural-language statements of intent without modifying the code and includes 32 defects verified through execution.</w:t>
+        <w:t xml:space="preserve">2) We design an evaluation of intent-dependent code review on SWE-bench [6]. It removes natural-language statements of intent without changing the code, and includes 32 defects that have been verified by execution.</w:t>
       </w:r>
     </w:p>
     <w:p>
@@ -324,7 +324,7 @@
           <w:sz w:val="20"/>
           <w:szCs w:val="20"/>
         </w:rPr>
-        <w:t xml:space="preserve">3) We conduct a two-by-three ablation and trace individual instances to distinguish the value of an author's answer from the detector's ability to identify when a question is needed. The analysis identifies detector recall as a key limitation.</w:t>
+        <w:t xml:space="preserve">3) We perform a two-by-three ablation and trace each instance to separate the value of the author's answer from the ability of the detector to detect the need for a question. One of the limitations identified in this analysis is detector recall.</w:t>
       </w:r>
     </w:p>
     <w:p>
@@ -344,7 +344,7 @@
           <w:sz w:val="20"/>
           <w:szCs w:val="20"/>
         </w:rPr>
-        <w:t xml:space="preserve">4) We report an initial pilot that led to changes in the evaluation design, together with a protocol deviation and the steps taken to address it.</w:t>
+        <w:t xml:space="preserve">4) We report an initial pilot that resulted in a change in the evaluation design, together with a protocol deviation and the steps taken to deal with it.</w:t>
       </w:r>
     </w:p>
     <w:p>
@@ -364,7 +364,7 @@
           <w:sz w:val="20"/>
           <w:szCs w:val="20"/>
         </w:rPr>
-        <w:t xml:space="preserve">5) We examine agreement among three AI judges and replicate the experiment using a local reviewer. The replication is reported separately from the original study.</w:t>
+        <w:t xml:space="preserve">5) We compare the agreement of three AI judges and repeat the experiment with a local reviewer. The replication is reported separately from the original study.</w:t>
       </w:r>
     </w:p>
     <w:p>
@@ -416,7 +416,7 @@
           <w:sz w:val="20"/>
           <w:szCs w:val="20"/>
         </w:rPr>
-        <w:t xml:space="preserve">A. Automated Code Review</w:t>
+        <w:t xml:space="preserve">A. Automatic Code Review</w:t>
       </w:r>
     </w:p>
     <w:p>
@@ -437,7 +437,7 @@
           <w:sz w:val="20"/>
           <w:szCs w:val="20"/>
         </w:rPr>
-        <w:t xml:space="preserve">Studies at Microsoft and Google identified understanding a proposed change as one of the most demanding parts of code review [1], [2]. Learning-based reviewers generate comments from historical review data [7], [8], while deployed LLM-based tools vary in how they retrieve and use repository context [3]. These approaches generally produce feedback in a single pass. ClarifyReview instead introduces a decision point at which the system can request additional information before evaluating the change.</w:t>
+        <w:t xml:space="preserve">Research at Microsoft and Google found that comprehending a proposed change is one of the most challenging aspects of code review [1], [2]. Learning-based reviewers produce comments based on past review information [7], [8], and deployed LLM-based tools have different ways of retrieving and utilizing repository context [3]. In general, these techniques yield feedback in a single pass. ClarifyReview introduces a decision point at which the system can ask for more information prior to evaluating the change.</w:t>
       </w:r>
     </w:p>
     <w:p>
@@ -477,7 +477,7 @@
           <w:sz w:val="20"/>
           <w:szCs w:val="20"/>
         </w:rPr>
-        <w:t xml:space="preserve">ClarifyGPT identifies ambiguous requirements using a code-consistency check and asks targeted questions before generating code, improving Pass@1 performance [4]. TiCoder uses generated tests to help clarify user intent and reports improvements in correctness judgement and reductions in cognitive load in a study involving fifteen participants [5]. Both systems focus on generating new code rather than reviewing existing changes. Their findings also highlight the importance of making clarification targeted and selective rather than asking questions indiscriminately.</w:t>
+        <w:t xml:space="preserve">ClarifyGPT identifies ambiguous requirements with a code-consistency check and asks a set of targeted questions before generating code, enhancing Pass@1 performance [4]. TiCoder uses generated tests to clarify user intent; in a study with fifteen participants, it improved correctness judgement and lessened cognitive load [5]. Both systems are based on creating new code rather than reviewing changes. Their conclusions also emphasize the need to ask a few targeted questions rather than many broad ones.</w:t>
       </w:r>
     </w:p>
     <w:p>
@@ -517,7 +517,7 @@
           <w:sz w:val="20"/>
           <w:szCs w:val="20"/>
         </w:rPr>
-        <w:t xml:space="preserve">Self-consistency uses disagreement among multiple generated samples as an indicator of uncertainty [9]. Semantic uncertainty groups responses according to their meaning before measuring variation [10]. We adapt these ideas to assess how consistently a reviewer interprets the intent behind a code change. The aim is to identify cases where the reviewer's interpretation may be unstable enough to warrant clarification.</w:t>
+        <w:t xml:space="preserve">Self-consistency treats disagreement among multiple sampled outputs as a signal of uncertainty [9]. Semantic uncertainty groups responses by meaning before variation is measured [10]. We adapt these ideas to measure how consistently a reviewer interprets the intent of a code change. The intention is to pinpoint the cases in which the reviewer's interpretation is not strong enough to stand without additional clarification.</w:t>
       </w:r>
     </w:p>
     <w:p>
@@ -557,7 +557,7 @@
           <w:sz w:val="20"/>
           <w:szCs w:val="20"/>
         </w:rPr>
-        <w:t xml:space="preserve">SWE-bench links real software issues to the patches that resolve them and the tests that those patches pass [6]. Its Verified subset underwent human validation [11]. Existing test suites can also be used to assess defective patch variants by checking whether the original patch passes the relevant tests while the modified version fails them [12]. LLM-based judges provide another way to evaluate generated reviews, but their assessments can exhibit biases, including preferences for outputs from their own model family [13]. For this reason, our evaluation uses a judge from a different model family than the reviewer and separately examines agreement between judges.</w:t>
+        <w:t xml:space="preserve">SWE-bench connects actual software issues with the patches that fix them and the tests that those patches pass [6]. Its Verified subset has been human validated [11]. Existing test suites can also be used to evaluate defective patch variants, since it is straightforward to check whether the original patch passes the relevant tests while the modified one fails them [12]. Another approach to evaluating generated reviews is to use LLM-based judges, which can have biases such as favouring outputs from their own model family [13]. Therefore, our evaluation uses a judge from a different model family than the reviewer and separately measures agreement between judges.</w:t>
       </w:r>
     </w:p>
     <w:p>
@@ -611,7 +611,7 @@
           <w:sz w:val="20"/>
           <w:szCs w:val="20"/>
         </w:rPr>
-        <w:t xml:space="preserve">ClarifyReview consists of four stages, as shown in Fig. 1. Stage 1 parses the diff and maps changed lines to the corresponding symbols. It uses the Python Abstract Syntax Tree (AST) for Python and tree-sitter grammars for JavaScript, TypeScript/TSX, Java, C, C++, and Rust. The system then builds a bounded context in a deterministic order and computes its fingerprint. Python behaviour remains byte-identical to the previous implementation. Stage 2 determines whether clarification is needed. If the detector decides to ask, Stage 3 generates at most two questions and sends them through a Responder. Each question must identify a file, line, or symbol, preventing vague requests such as "please explain this PR." Stage 4 produces structured review findings containing severity, category, evidence, a suggested fix, and confidence.</w:t>
+        <w:t xml:space="preserve">There are four stages in ClarifyReview, as illustrated in Fig. 1. Stage 1 parses a diff and maps changed lines to the symbols they affect. It uses the Abstract Syntax Tree (AST) for Python and tree-sitter grammars for JavaScript, TypeScript/TSX, Java, C, C++ and Rust. The system then builds a bounded context in a deterministic order and derives its fingerprint. Python behaviour is the same as before. In Stage 2, the need for clarification is determined. If the detector elects to ask, Stage 3 generates at most two questions and passes them to the Responder. Vague questions like "please explain this PR" are not allowed: each question must name a file, line, or symbol. The findings in Stage 4 are structured and include severity, category, evidence, suggested fix and confidence.</w:t>
       </w:r>
     </w:p>
     <w:p>
@@ -690,7 +690,7 @@
           <w:sz w:val="16"/>
           <w:szCs w:val="16"/>
         </w:rPr>
-        <w:t xml:space="preserve">The four stages of ClarifyReview. Stage 2 determines whether clarification is needed; Stage 3 is skipped when the system proceeds directly to review.</w:t>
+        <w:t xml:space="preserve">The four stages of ClarifyReview. Stage 2 decides whether clarification is necessary; if it is not, Stage 3 is omitted and the system goes straight to review.</w:t>
       </w:r>
     </w:p>
     <w:p>
@@ -730,7 +730,7 @@
           <w:sz w:val="20"/>
           <w:szCs w:val="20"/>
         </w:rPr>
-        <w:t xml:space="preserve">The four detectors share a common interface that maps a context to a score s ∈ [0, 1]. A shared decision rule triggers clarification when s ≥ τ, where the threshold τ is fixed in the configuration. The heuristic detector combines fifteen diff features, including the absence of a linked issue, a generic commit message, a removed guard, the lack of an accompanying test, changes to public symbols, and the deletion ratio. These features contribute weighted evidence according to s = Σᵢ wᵢfᵢ / Σᵢ wᵢ, where fᵢ represents a feature and wᵢ its weight. The detector requires no model call. A logistic-regression classifier learns weights for the same features from labelled pull requests. The other two detectors estimate uncertainty by generating eight one-sentence hypotheses about the purpose of a change. One uses temperature sampling, while the other perturbs the prompt at a fixed temperature. Both assess the resulting hypotheses using mean pairwise embedding distance and semantic entropy.</w:t>
+        <w:t xml:space="preserve">The four detectors have a common interface which maps a context to a score s ∈ [0, 1]. When s ≥ τ, clarification is triggered by a shared decision rule, with the threshold τ fixed in the configuration. The heuristic detector combines fifteen diff features, such as no linked issue, a generic commit message, a removed guard, no accompanying test, public symbol changes, and the deletion ratio. The features contribute weighted evidence in the form s = Σᵢ wᵢfᵢ / Σᵢ wᵢ, where fᵢ is a feature and wᵢ its weight. The detector needs no model call. A logistic-regression classifier learns weights for the same features from labelled pull requests. The other two detectors estimate uncertainty by creating eight one-sentence hypotheses about the purpose of a change. One of these perturbs the prompt at a fixed temperature; the other uses temperature sampling. Both score the resulting hypotheses with mean pairwise embedding distance and semantic entropy.</w:t>
       </w:r>
     </w:p>
     <w:p>
@@ -770,7 +770,7 @@
           <w:sz w:val="20"/>
           <w:szCs w:val="20"/>
         </w:rPr>
-        <w:t xml:space="preserve">The single-pass baseline does not use a separate implementation. It runs the same pipeline with clarification disabled. An automated test verifies that, when the detector is forced to proceed without asking, the two conditions produce byte-identical prompts.</w:t>
+        <w:t xml:space="preserve">The single-pass baseline is not a separate implementation. It is the same pipeline, but without the clarification. An automatic test confirms that, if the detector is forced to proceed without asking, the two conditions produce byte-identical prompts.</w:t>
       </w:r>
     </w:p>
     <w:p>
@@ -791,7 +791,7 @@
           <w:sz w:val="20"/>
           <w:szCs w:val="20"/>
         </w:rPr>
-        <w:t xml:space="preserve">Stage 3 communicates with the author through a Responder interface with three implementations: a GitHub responder that posts a comment and waits for a reply, a benchmark responder that queries a simulated author, and a null responder. This design allows the experiment to exercise the same interaction code intended for deployment.</w:t>
+        <w:t xml:space="preserve">Stage 3 provides a Responder interface for communicating with the author, with three implementations: a GitHub responder, which posts a comment on the pull request and waits for a response; a benchmark responder, which queries a simulated author; and a null responder. This design lets the experiment use the same interaction code that is deployed.</w:t>
       </w:r>
     </w:p>
     <w:p>
@@ -812,7 +812,7 @@
           <w:sz w:val="20"/>
           <w:szCs w:val="20"/>
         </w:rPr>
-        <w:t xml:space="preserve">The system is written in Python and runs either as a GitHub App or from the command line. It records each run in an SQLite database and is covered by 455 automated tests. Three provider backends implement a common interface: Gemini, Anthropic, and local Ollama. The Ollama backend runs the model on the user's machine without an API key, external model traffic, or per-call monetary cost. Pending runs persist across restarts, and a timeout mechanism publishes reviews when authors do not respond. The system also handles rate limits and verifies signed webhooks. It passes offline end-to-end tests and has been exercised on live GitHub in a sandbox repository.</w:t>
+        <w:t xml:space="preserve">It is implemented in Python and is deployed either as a GitHub App or via the command line. It stores each run in an SQLite database and is tested automatically with 455 tests. There are three provider backends with a shared interface (Gemini, Anthropic, local Ollama). The Ollama backend runs on the user's machine without an API key, without sending model traffic to an external service, and without any monetary cost per call. Runs that are in progress are carried over through restarts, and a timeout mechanism publishes reviews when authors fail to respond. It also handles rate limits and checks signed webhooks. It passes offline end-to-end testing and has been tested in a sandbox repository on live GitHub.</w:t>
       </w:r>
     </w:p>
     <w:p>
@@ -846,7 +846,7 @@
           <w:sz w:val="20"/>
           <w:szCs w:val="20"/>
         </w:rPr>
-        <w:t xml:space="preserve">We tested two constructed pull requests in the authors' sandbox repository. In the first, reviewed from the command line, the detector asked a question at a score of 0.89, above the threshold of 0.50. The author confirmed that removing the email check was intentional, and the reviewer's confidence increased from 80% to 100%. The final verdict was to approve the change.</w:t>
+        <w:t xml:space="preserve">We tested two constructed pull requests in the authors' sandbox repository. The first was reviewed from the command line, where the detector asked a question at a score of 0.89, above the threshold of 0.50. The author stated that removing the email check was intentional, and the reviewer's confidence rose from 80% to 100%. The final decision was to approve the change.</w:t>
       </w:r>
     </w:p>
     <w:p>
@@ -867,7 +867,7 @@
           <w:sz w:val="20"/>
           <w:szCs w:val="20"/>
         </w:rPr>
-        <w:t xml:space="preserve">In the second case, the webhook bot operated behind a tunnel. The author's response established that removing the disabled-account check was unintended. The bot requested changes and reported one major correctness finding. It also retried after three transient provider errors. These demonstrations ran on a laptop using a free-tier quota and the heuristic detector. They establish that the interaction flow works, but they do not provide evidence of its effectiveness or error rates in general use.</w:t>
+        <w:t xml:space="preserve">The second case was an example of the webhook bot running behind a tunnel. The author's response established that removing the disabled-account check was not intended. The bot requested changes and reported one major correctness finding. It also retried after three transient provider errors. These demonstrations ran on a laptop with a free-tier quota and the heuristic detector. They establish that the interaction flow is functional, but they give no evidence of its effectiveness or error rates in general use.</w:t>
       </w:r>
     </w:p>
     <w:p>
@@ -921,7 +921,7 @@
           <w:sz w:val="20"/>
           <w:szCs w:val="20"/>
         </w:rPr>
-        <w:t xml:space="preserve">The evaluation addresses three research questions:</w:t>
+        <w:t xml:space="preserve">The evaluation focuses on three research questions:</w:t>
       </w:r>
     </w:p>
     <w:p>
@@ -941,7 +941,7 @@
           <w:sz w:val="20"/>
           <w:szCs w:val="20"/>
         </w:rPr>
-        <w:t xml:space="preserve">RQ1: Does clarification recover intent that would otherwise be lost when the author's stated intent is withheld?</w:t>
+        <w:t xml:space="preserve">RQ1: Does clarification restore intent that is lost when the author's stated intent is withheld?</w:t>
       </w:r>
     </w:p>
     <w:p>
@@ -961,7 +961,7 @@
           <w:sz w:val="20"/>
           <w:szCs w:val="20"/>
         </w:rPr>
-        <w:t xml:space="preserve">RQ2: Does clarification improve defect detection or reduce false alarms?</w:t>
+        <w:t xml:space="preserve">RQ2: Does clarification help detect defects or reduce false alarms?</w:t>
       </w:r>
     </w:p>
     <w:p>
@@ -981,7 +981,7 @@
           <w:sz w:val="20"/>
           <w:szCs w:val="20"/>
         </w:rPr>
-        <w:t xml:space="preserve">RQ3: How effectively do the detectors identify changes for which clarification is needed?</w:t>
+        <w:t xml:space="preserve">RQ3: How effective are the detectors at identifying changes for which clarification is required?</w:t>
       </w:r>
     </w:p>
     <w:p>
@@ -1021,7 +1021,7 @@
           <w:sz w:val="20"/>
           <w:szCs w:val="20"/>
         </w:rPr>
-        <w:t xml:space="preserve">Each instance is reviewed three times using the same reviewer model and prompt template (Fig. 2). The first condition provides full context and serves as the ceiling. The second withholds intent and uses the single-pass baseline, serving as the floor. The third also withholds intent but enables ClarifyReview, forming the treatment condition. The floor and treatment use byte-identical code, verified by an assertion for each instance.</w:t>
+        <w:t xml:space="preserve">Each instance is reviewed three times, with the same reviewer model and prompt template (Fig. 2). The first condition gives the whole context and is the upper limit, the ceiling. The second withholds intent and is the single-pass baseline, which is the floor. The third also withholds intent but enables ClarifyReview, the treatment condition. The floor and treatment contain byte-identical code, which is asserted for every instance.</w:t>
       </w:r>
     </w:p>
     <w:p>
@@ -1042,7 +1042,7 @@
           <w:sz w:val="20"/>
           <w:szCs w:val="20"/>
         </w:rPr>
-        <w:t xml:space="preserve">We measure the proportion of the context-related loss in intent recovery restored by clarification using gap recovery, G = (treatment - floor) / (ceiling - floor). This measure represents the share of the gap between the floor and ceiling that the treatment recovers.</w:t>
+        <w:t xml:space="preserve">Gap recovery, G = (treatment - floor) / (ceiling - floor), measures the proportion of the loss in intent recovery that clarification recovers. This is the portion of the gap between the floor and ceiling that the treatment is able to recover.</w:t>
       </w:r>
     </w:p>
     <w:p>
@@ -1161,7 +1161,7 @@
           <w:sz w:val="20"/>
           <w:szCs w:val="20"/>
         </w:rPr>
-        <w:t xml:space="preserve">The first version of the manipulation removed the linked issue, title, description, and commit messages. However, the pilot showed that the patch could still reveal its purpose through natural-language text added alongside the code. Version 2 therefore also removes every comment, trailing comment, and docstring introduced by the patch, while leaving the code unchanged.</w:t>
+        <w:t xml:space="preserve">In the first implementation, the linked issue, title, description, and commit messages were deleted. But the pilot demonstrated that the purpose of a patch could still show through the natural-language text added alongside the code. The second version therefore also removes all the comments, trailing comments and docstrings added by the patch, while leaving the code unchanged.</w:t>
       </w:r>
     </w:p>
     <w:p>
@@ -1182,7 +1182,7 @@
           <w:sz w:val="20"/>
           <w:szCs w:val="20"/>
         </w:rPr>
-        <w:t xml:space="preserve">Docstring removal required an additional safeguard. A docstring is removed only when the patch introduces a line within it. This rule was added after an earlier implementation deleted actual code in a hunk that began inside an existing docstring. The revised procedure was designed to remove statements of intent without altering executable code.</w:t>
+        <w:t xml:space="preserve">Docstring removal needed an additional safeguard. A docstring is only removed when the patch adds a line inside it. This rule was introduced after an earlier implementation removed actual code from a hunk that started within an existing docstring. The revised procedure was created to eliminate statements of intent while keeping the executable code the same.</w:t>
       </w:r>
     </w:p>
     <w:p>
@@ -1222,7 +1222,7 @@
           <w:sz w:val="20"/>
           <w:szCs w:val="20"/>
         </w:rPr>
-        <w:t xml:space="preserve">Golden patches are correct by construction, making them suitable for measuring false alarms but not defect detection. To evaluate detection, we introduce defects into lines added by a golden patch using six mutation operators: invert a comparison, negate a condition, flip a constant, remove a guard, swap a Boolean operator, and introduce an off-by-one error.</w:t>
+        <w:t xml:space="preserve">Golden patches are correct by construction, so they can be used for measuring false alarms but not defect detection. For evaluating detection, we added defects to the lines of a golden patch using six mutation operators: invert a comparison, negate a condition, flip a constant, remove a guard, swap a Boolean operator and introduce an off-by-one error.</w:t>
       </w:r>
     </w:p>
     <w:p>
@@ -1243,7 +1243,7 @@
           <w:sz w:val="20"/>
           <w:szCs w:val="20"/>
         </w:rPr>
-        <w:t xml:space="preserve">A mutant is retained only when the repository's FAIL_TO_PASS tests pass with the original golden patch and fail with the mutant [12]. Of the 75 SymPy instances examined, 32 produced a verified mutant. For 27 instances, none of the operators could be applied; seven produced only mutants that the tests failed to detect; and nine could not be executed in the available environment.</w:t>
+        <w:t xml:space="preserve">A mutant is retained only if the repository's FAIL_TO_PASS tests pass with the original golden patch and fail with the mutant [12]. A verified mutant was found in 32 of the 75 SymPy instances. No operator could be applied in 27 cases, seven cases produced only mutants that the tests failed to detect, and nine cases could not be executed in the available environment.</w:t>
       </w:r>
     </w:p>
     <w:p>
@@ -1283,7 +1283,7 @@
           <w:sz w:val="20"/>
           <w:szCs w:val="20"/>
         </w:rPr>
-        <w:t xml:space="preserve">The original study contains 36 rows. Twelve SymPy instances are represented twice, once as the golden patch and once as the corresponding verified mutant. The remaining twelve rows are golden patches from xarray, sphinx, astropy, django, pylint, pytest, and scikit-learn.</w:t>
+        <w:t xml:space="preserve">There are 36 rows in the original study. Twelve SymPy instances appear twice, once as the golden patch and once as the verified mutant. The other twelve rows are golden patches from xarray, sphinx, astropy, django, pylint, pytest and scikit-learn.</w:t>
       </w:r>
     </w:p>
     <w:p>
@@ -1304,7 +1304,7 @@
           <w:sz w:val="20"/>
           <w:szCs w:val="20"/>
         </w:rPr>
-        <w:t xml:space="preserve">Instances were selected in descending order of difficulty using SWE-bench's own difficulty annotations. These annotations were assigned by the benchmark's annotators rather than by our detector, avoiding selection based on the behaviour of the system under evaluation.</w:t>
+        <w:t xml:space="preserve">Instances were chosen in descending order of difficulty using SWE-bench's own difficulty annotations. The annotators of the benchmark decided on these annotations, not our detector, so selection did not depend on the behaviour of the system being evaluated.</w:t>
       </w:r>
     </w:p>
     <w:p>
@@ -1344,7 +1344,7 @@
           <w:sz w:val="20"/>
           <w:szCs w:val="20"/>
         </w:rPr>
-        <w:t xml:space="preserve">When the treatment asks a question, a simulated author responds using only the withheld issue text and commit messages. The simulated author does not see the diff, the injected defect, or whether a defect exists. It must decline to answer when the available notes do not provide the necessary information. Each exchange is logged with its prompt version.</w:t>
+        <w:t xml:space="preserve">If the treatment asks a question, a simulated author answers based only on the withheld issue text and commit messages. The simulated author cannot see the diff, the injected defect, or whether a defect exists. It must decline to answer if its notes do not provide the required information. All exchanges are recorded with the prompt version.</w:t>
       </w:r>
     </w:p>
     <w:p>
@@ -1365,7 +1365,7 @@
           <w:sz w:val="20"/>
           <w:szCs w:val="20"/>
         </w:rPr>
-        <w:t xml:space="preserve">An LLM judge from a different model family than the reviewer evaluates each review against three criteria: whether the reviewer recovered the intended purpose of the change, whether it detected the injected defect, and whether it raised a false alarm on correct code. We compare paired outcomes using McNemar's exact test [14] and report a bootstrap 95% interval for gap recovery.</w:t>
+        <w:t xml:space="preserve">Each review is judged by an LLM from a different model family than the reviewer against three criteria: did the reviewer recover the purpose of the change, did it find the injected defect, and did it raise a false alarm on correct code? We use McNemar's exact test [14] for comparing paired outcomes and report a bootstrap 95% interval for gap recovery.</w:t>
       </w:r>
     </w:p>
     <w:p>
@@ -1386,7 +1386,7 @@
           <w:sz w:val="20"/>
           <w:szCs w:val="20"/>
         </w:rPr>
-        <w:t xml:space="preserve">The reviewer is gemini-3.5-flash-lite. The question generator, simulated author, and judge use gemma-4-31b-it. All model calls were made using free-tier access.</w:t>
+        <w:t xml:space="preserve">The reviewer is gemini-3.5-flash-lite. The question generator, simulated author and judge use gemma-4-31b-it. All model calls were performed with free-tier access.</w:t>
       </w:r>
     </w:p>
     <w:p>
@@ -1426,7 +1426,7 @@
           <w:sz w:val="20"/>
           <w:szCs w:val="20"/>
         </w:rPr>
-        <w:t xml:space="preserve">The replication contains 96 rows: the original 36 rows and 60 additional rows. It includes all 32 verified mutants, evaluated in both arms, together with 32 golden-only rows from seven additional repositories. The reviewer is qwen3:4b-instruct-2507-q4_K_M, served through Ollama, with the heuristic detector configured at τ = 0.50.</w:t>
+        <w:t xml:space="preserve">The replication has 96 rows: the original 36 rows and 60 additional rows. It contains all 32 verified mutants, evaluated in both arms, as well as 32 golden-only rows from seven additional repositories. The reviewer is qwen3:4b-instruct-2507-q4_K_M, served through Ollama, with the heuristic detector set to τ = 0.50.</w:t>
       </w:r>
     </w:p>
     <w:p>
@@ -1447,7 +1447,7 @@
           <w:sz w:val="20"/>
           <w:szCs w:val="20"/>
         </w:rPr>
-        <w:t xml:space="preserve">All 96 runs completed without failure in 52 minutes on a laptop GPU. The question and oracle model identity was recorded in the oracle log but was not stored for each database row. The replication follows the same evaluation conditions as the original study and is reported separately rather than pooled with the original results. The choice of judge for this replication is discussed in Section V-G.</w:t>
+        <w:t xml:space="preserve">All 288 runs (96 instances in three conditions) completed without failure in 52 minutes on a laptop GPU. The question and oracle model identity was recorded in the oracle log, but was not stored per database row. The replication follows the same conditions of evaluation as the original study and is not pooled with the original results. The choice of judge for this replication is discussed in Section V-G.</w:t>
       </w:r>
     </w:p>
     <w:p>
@@ -1520,7 +1520,7 @@
           <w:sz w:val="20"/>
           <w:szCs w:val="20"/>
         </w:rPr>
-        <w:t xml:space="preserve">The pilot covered ten instances from ten repositories, but only five completed all three conditions before the daily quota was exhausted. Intent recovery reached 100% in all three conditions: the ceiling, floor, and treatment. Because the floor already matched the ceiling, there was no loss for clarification to recover. The patches often explained their purpose in the comments and docstrings they introduced, so removing the issue information alone did not make their intent difficult to understand. This finding led to the revised manipulation (v2), the addition of the mutant arm, and selection based on benchmark difficulty.</w:t>
+        <w:t xml:space="preserve">The pilot covered ten instances from ten repositories, of which only five completed all three conditions before the daily quota was reached. The ceiling, floor and treatment conditions all had 100% intent recovery. Since the floor already equalled the ceiling, there was nothing for clarification to recover. The comments and docstrings added by the patches often explained their purpose, so removing the issue information was not enough to obscure the intent of the patch. Based on this finding, the revised manipulation (v2), the addition of the mutant arm and selection by benchmark difficulty were introduced.</w:t>
       </w:r>
     </w:p>
     <w:p>
@@ -1560,7 +1560,7 @@
           <w:sz w:val="20"/>
           <w:szCs w:val="20"/>
         </w:rPr>
-        <w:t xml:space="preserve">All 36 instances completed the three evaluation conditions, and all 108 reviews were judged (Table I, Fig. 3). Removing all natural-language statements of intent reduced recovery from 97% with full context to 81% without clarification. Enabling clarification raised recovery to 83%. The resulting gap recovery was 0.17 (95% CI: 0.00 to 0.50), with one discordant pair favouring the treatment and none favouring the floor (McNemar's p = 1.00).</w:t>
+        <w:t xml:space="preserve">All 36 instances were completed under the three evaluation conditions, and all 108 reviews were judged (Table I, Fig. 3). Removing all natural-language statements of intent led to a drop in recovery from 97% (with full context) to 81% (without clarification). Clarification resulted in 83% recovery. This gives a gap recovery of 0.17 (95% CI: 0.00 to 0.50); one discordant pair favoured the treatment and none favoured the floor (McNemar's p = 1.00).</w:t>
       </w:r>
     </w:p>
     <w:p>
@@ -1581,7 +1581,7 @@
           <w:sz w:val="20"/>
           <w:szCs w:val="20"/>
         </w:rPr>
-        <w:t xml:space="preserve">The results follow the expected direction, but the improvement was not statistically significant. The small number of instances limits the evidence for an effect. In addition, clarification can produce a different outcome only when the detector asks a question and the resulting exchange changes the reviewer's interpretation.</w:t>
+        <w:t xml:space="preserve">Results were in the predicted direction, but not statistically significant. The evidence for an effect is weak because of the small number of cases. Further, clarification can change an outcome only when the detector poses a question and the answer changes the reviewer's interpretation.</w:t>
       </w:r>
     </w:p>
     <w:p>
@@ -2800,7 +2800,7 @@
           <w:sz w:val="16"/>
           <w:szCs w:val="16"/>
         </w:rPr>
-        <w:t xml:space="preserve">Outcomes across the three conditions. Bars represent proportions, with counts shown as labels.</w:t>
+        <w:t xml:space="preserve">Results for the three conditions. Bars indicate proportions; counts are given as labels.</w:t>
       </w:r>
     </w:p>
     <w:p>
@@ -2840,7 +2840,7 @@
           <w:sz w:val="20"/>
           <w:szCs w:val="20"/>
         </w:rPr>
-        <w:t xml:space="preserve">For clarification to improve on the floor, three things must happen: the initial reviewer must misinterpret the change, the detector must identify the need to ask, and the author must provide a useful answer (Fig. 4). The floor misinterpreted seven changes. The detector asked about two of them, the simulated author provided a substantive answer in one case, and the treatment recovered the intended meaning in that case.</w:t>
+        <w:t xml:space="preserve">For clarification to improve on the floor, three things need to occur: the reviewer needs to misunderstand the change, the detector needs to detect the need to ask, and the author needs to give a useful answer (Fig. 4). The floor missed seven changes. The detector asked about two of these, the simulated author supplied a meaningful answer in one of them, and that answer led to recovery of the intended meaning.</w:t>
       </w:r>
     </w:p>
     <w:p>
@@ -2861,7 +2861,7 @@
           <w:sz w:val="20"/>
           <w:szCs w:val="20"/>
         </w:rPr>
-        <w:t xml:space="preserve">The other flagged case received no useful answer because the question concerned a parameter that was not mentioned in the issue. Of the six questions asked by the detector overall, four concerned changes whose intent the floor had already recovered. Answers to those questions could not improve the intent-recovery score.</w:t>
+        <w:t xml:space="preserve">The other flagged case did not receive a useful answer, as the question was about a parameter not stated in the issue. Of the six questions the detector asked overall, four were about changes whose intent the floor had already recovered. Answers to those questions could not increase the intent-recovery score.</w:t>
       </w:r>
     </w:p>
     <w:p>
@@ -2882,7 +2882,7 @@
           <w:sz w:val="20"/>
           <w:szCs w:val="20"/>
         </w:rPr>
-        <w:t xml:space="preserve">These traces suggest that clarification can help when the system identifies a genuine need for additional information. However, the number of eligible cases was too small to estimate its success rate reliably. The more immediate limitation was the detector's ability to identify changes that the reviewer was likely to misunderstand.</w:t>
+        <w:t xml:space="preserve">These traces indicate that clarification can be useful when the system recognises a true need for further information. The number of eligible cases was small, however, making it difficult to estimate the success rate accurately. The more immediate constraint was detecting the changes that the reviewer would likely misinterpret.</w:t>
       </w:r>
     </w:p>
     <w:p>
@@ -2961,7 +2961,7 @@
           <w:sz w:val="16"/>
           <w:szCs w:val="16"/>
         </w:rPr>
-        <w:t xml:space="preserve">Instance-level trace showing how many initial intent errors progressed through detection, author response, and successful recovery.</w:t>
+        <w:t xml:space="preserve">Per-instance trace showing how many initial intent errors were detected, answered by the author, and successfully recovered.</w:t>
       </w:r>
     </w:p>
     <w:p>
@@ -2982,7 +2982,7 @@
           <w:sz w:val="20"/>
           <w:szCs w:val="20"/>
         </w:rPr>
-        <w:t xml:space="preserve">In the recovered case, sympy-12481, the patch allows the Permutation constructor to accept non-disjoint cycles. The floor described the change as a cleanup of permutation instantiation logic, missing its intended behaviour. The detector assigned the stripped change a score of 0.556 and asked whether removing the specialised error was intentional. The author explained that non-disjoint cycles should be applied from left to right. With this information, the treatment produced a summary consistent with the full-context condition.</w:t>
+        <w:t xml:space="preserve">In the recovered case, sympy-12481, the patch enables the Permutation constructor to take non-disjoint cycles. The floor described the change as a "cleanup of permutation instantiation logic", missing its intended behaviour. The detector gave the stripped change a score of 0.556 and asked whether removing the specialised error was intended. The author clarified that non-disjoint cycles need to be applied left to right. This information yielded a summary consistent with the full-context condition.</w:t>
       </w:r>
     </w:p>
     <w:p>
@@ -3022,7 +3022,7 @@
           <w:sz w:val="20"/>
           <w:szCs w:val="20"/>
         </w:rPr>
-        <w:t xml:space="preserve">The reviewer detected two of the twelve injected defects under both the floor and treatment conditions, compared with one under full context. The full-context result is particularly important: even when the issue was available, the reviewer approved eleven of the twelve defective patches. For this model, knowing the intended behaviour was not enough to ensure that the code was reviewed correctly. Its ability to recognise defects remained a major limitation.</w:t>
+        <w:t xml:space="preserve">The reviewer caught two of the twelve injected defects under both the floor and treatment conditions, and one under full context. The full-context result is especially noteworthy: even with the issue available, the reviewer accepted eleven of the twelve faulty patches. For this model, knowing the intended behaviour was not sufficient to have the code reviewed properly. Its ability to detect defects was a major limitation.</w:t>
       </w:r>
     </w:p>
     <w:p>
@@ -3043,7 +3043,7 @@
           <w:sz w:val="20"/>
           <w:szCs w:val="20"/>
         </w:rPr>
-        <w:t xml:space="preserve">One mutant was detected without the issue information but was approved when that information was provided. Although this was an isolated result, it is consistent with the possibility that stated intent can sometimes lead a reviewer to accept a change without adequately examining its correctness.</w:t>
+        <w:t xml:space="preserve">One mutant was caught without the issue information but approved with it. This was an isolated occurrence, but it is consistent with stated intent sometimes leading a reviewer to accept a change without fully considering its correctness.</w:t>
       </w:r>
     </w:p>
     <w:p>
@@ -3064,7 +3064,7 @@
           <w:sz w:val="20"/>
           <w:szCs w:val="20"/>
         </w:rPr>
-        <w:t xml:space="preserve">False alarms on correct patches were uncommon across all three conditions, occurring in 2 of 24 floor reviews, 2 of 24 treatment reviews, and 1 of 24 ceiling reviews. The experiment therefore provides no clear evidence that clarification reduced false alarms.</w:t>
+        <w:t xml:space="preserve">The false alarm rate on correct patches was low under all three conditions, with 2/24 false alarms in the floor reviews, 2/24 in the treatment reviews and 1/24 in the ceiling reviews. The experiment thus fails to demonstrate that clarification decreased false alarms.</w:t>
       </w:r>
     </w:p>
     <w:p>
@@ -3104,7 +3104,7 @@
           <w:sz w:val="20"/>
           <w:szCs w:val="20"/>
         </w:rPr>
-        <w:t xml:space="preserve">For this analysis, the labels were constructed so that a context with intent removed was ambiguous by design, while its full-context counterpart was considered clear. Table II and Fig. 5 compare detector behaviour under these labels. This setup favours detectors that respond to missing issue information, so the resulting recall figures should be interpreted in light of how the labels were constructed.</w:t>
+        <w:t xml:space="preserve">The labels in this analysis were constructed so that a context with intent removed was ambiguous and its full-context counterpart was clear. Table II and Fig. 5 compare the behaviour of the detectors on these labels. This configuration favours detectors that respond to missing issue information, so the recall figures should be read with the construction of the labels in mind.</w:t>
       </w:r>
     </w:p>
     <w:p>
@@ -4110,7 +4110,7 @@
           <w:sz w:val="16"/>
           <w:szCs w:val="16"/>
         </w:rPr>
-        <w:t xml:space="preserve">Mean detector scores with intent withheld and with full context. Dashed lines indicate the default thresholds.</w:t>
+        <w:t xml:space="preserve">Mean detector scores with intent withheld and with full context. Dashed lines represent the default thresholds.</w:t>
       </w:r>
     </w:p>
     <w:p>
@@ -4131,7 +4131,7 @@
           <w:sz w:val="20"/>
           <w:szCs w:val="20"/>
         </w:rPr>
-        <w:t xml:space="preserve">The heuristic detector did not ask for clarification on any full-context instance, but it identified only 21% of the stripped instances. This low recall helps explain why clarification had limited opportunities to improve the reviewer's interpretation.</w:t>
+        <w:t xml:space="preserve">The heuristic detector did not request clarification on any full-context instance, but found only 21% of the stripped instances. This low recall helps explain why there were limited opportunities for clarification to help the reviewer.</w:t>
       </w:r>
     </w:p>
     <w:p>
@@ -4152,7 +4152,7 @@
           <w:sz w:val="20"/>
           <w:szCs w:val="20"/>
         </w:rPr>
-        <w:t xml:space="preserve">The two uncertainty-based detectors required eight model calls per decision and were evaluated on four instances each. At their default thresholds, both asked questions on every decision. Sampling-based uncertainty distinguished the stripped and full contexts, with mean scores of 0.70 and 0.56, respectively. Re-examining the recorded scores suggests that a threshold near 0.60 might separate the two conditions. We treat this as a diagnostic observation rather than adopt the threshold, since it was identified using scores from the study set. Prompt perturbation did not distinguish the conditions: both received a mean score of 0.85.</w:t>
+        <w:t xml:space="preserve">The two uncertainty-based detectors needed eight model calls per decision and were tested on four instances each. At their default thresholds, both asked on every decision. Sampling-based uncertainty differentiated the two contexts, with a mean score of 0.70 for the stripped context and 0.56 for the full context. Re-examining the recorded scores indicates that a threshold of around 0.60 would separate them. We treat this as a diagnostic observation and do not adopt the threshold, because it was derived from scores in the study set. Prompt perturbation showed no difference between conditions, with a mean score of 0.85 in both.</w:t>
       </w:r>
     </w:p>
     <w:p>
@@ -4173,7 +4173,7 @@
           <w:sz w:val="20"/>
           <w:szCs w:val="20"/>
         </w:rPr>
-        <w:t xml:space="preserve">These findings highlight a trade-off between asking questions frequently and identifying the cases where they are genuinely needed. The heuristic was conservative but missed many ambiguous changes, while the uncertainty-based detectors asked too often at their default thresholds.</w:t>
+        <w:t xml:space="preserve">The results reveal a balance between asking often and knowing when a question is necessary. The heuristic was too conservative and missed many ambiguous changes, while the uncertainty-based detectors asked too often at their default thresholds.</w:t>
       </w:r>
     </w:p>
     <w:p>
@@ -4213,7 +4213,7 @@
           <w:sz w:val="20"/>
           <w:szCs w:val="20"/>
         </w:rPr>
-        <w:t xml:space="preserve">Table III reports the replication results for the local reviewer, qwen3:4b-instruct-2507-q4_K_M, served through Ollama. The outcomes were scored by the Claude agent judge, claude-sonnet-agent. As discussed in Section V-G, this judge was selected after its agreement with the local judge had been examined. The replication is reported separately and is not pooled with the original experiment.</w:t>
+        <w:t xml:space="preserve">Table III shows the results of the replication with the local reviewer, qwen3:4b-instruct-2507-q4_K_M, served through Ollama. The results were judged by the Claude agent judge, claude-sonnet-agent. As discussed in Section V-G, this judge was chosen after examining its agreement with the local judge. The replication is not pooled with the original experiment but is reported separately.</w:t>
       </w:r>
     </w:p>
     <w:p>
@@ -5432,7 +5432,7 @@
           <w:sz w:val="16"/>
           <w:szCs w:val="16"/>
         </w:rPr>
-        <w:t xml:space="preserve">Outcomes across conditions in the local replication. Counts represent instances; the figure reports gap recovery, its 95% interval, and the McNemar p-value.</w:t>
+        <w:t xml:space="preserve">Results by condition in the local replication. Counts indicate instances; the figure reports gap recovery, its 95% interval and the McNemar p-value.</w:t>
       </w:r>
     </w:p>
     <w:p>
@@ -5453,7 +5453,7 @@
           <w:sz w:val="20"/>
           <w:szCs w:val="20"/>
         </w:rPr>
-        <w:t xml:space="preserve">Clarification did not significantly improve intent recovery in the replication. Across 96 instances, recovery increased from 67% without clarification to 70% with clarification, while full context achieved 100%. Gap recovery was 0.09 (95% interval: -0.22 to 0.33; McNemar's p = 0.66). The interval includes zero and does not establish a positive effect. Its upper bound also rules out recovering more than approximately one-third of the gap under the reported interval.</w:t>
+        <w:t xml:space="preserve">Clarification produced no significant improvement in intent recovery in the replication. Across 96 instances, recovery went up from 67% to 70% with clarification; with full context, it was 100%. Gap recovery was 0.09 (95% interval: -0.22 to 0.33; McNemar's p = 0.66). The interval contains zero, so no positive effect is established. Its upper bound also rules out recovering more than about one-third of the gap.</w:t>
       </w:r>
     </w:p>
     <w:p>
@@ -5474,7 +5474,7 @@
           <w:sz w:val="20"/>
           <w:szCs w:val="20"/>
         </w:rPr>
-        <w:t xml:space="preserve">Withholding intent reduced recovery by 33 percentage points relative to full context, while clarification restored three percentage points. The results were also inconclusive when examined separately: gap recovery was 0.00 on golden instances (p = 1.00) and 0.25 on mutant instances (p = 0.51).</w:t>
+        <w:t xml:space="preserve">Withholding intent cost 33 percentage points of recovery, and clarification restored three of them. The results were also inconclusive for the separate subsets: gap recovery was 0.00 (p = 1.00) for golden instances and 0.25 (p = 0.51) for mutant instances.</w:t>
       </w:r>
     </w:p>
     <w:p>
@@ -5495,7 +5495,7 @@
           <w:sz w:val="20"/>
           <w:szCs w:val="20"/>
         </w:rPr>
-        <w:t xml:space="preserve">As in the original study, detector recall was a key limitation. The detector asked questions in 17 of the 96 treatment reviews. Among the 32 changes whose intent the reviewer failed to recover without clarification, it asked about eight and missed 24. The simulated author provided answers in seven of those eight cases, and the treatment recovered intent in three of the 32 initially misinterpreted changes.</w:t>
+        <w:t xml:space="preserve">As in the original study, detector recall was one of the limitations. The detector asked questions in 17 of the 96 treatment reviews. Of the 32 changes whose intent the reviewer missed without clarification, it asked about eight and missed 24. The simulated author answered seven of these eight questions, and the treatment recovered intent in three of the 32 initially misinterpreted changes.</w:t>
       </w:r>
     </w:p>
     <w:p>
@@ -5516,7 +5516,7 @@
           <w:sz w:val="20"/>
           <w:szCs w:val="20"/>
         </w:rPr>
-        <w:t xml:space="preserve">The effect was not uniformly positive. Clarification helped on 12 instances and hurt on nine. Among the seven cases where the simulated author answered a question about a change the floor had misinterpreted, the treatment recovered intent in three. These results suggest that the main challenge lies not simply in obtaining an answer, but in identifying when asking is worthwhile. Detector recall remains a central limitation.</w:t>
+        <w:t xml:space="preserve">Not all of the impact was positive. Clarification helped on 12 instances and hurt on nine. Of the seven cases where the simulated author answered a question about a change the floor had misinterpreted, the treatment recovered intent in three. The findings indicate that the primary obstacle is not just getting an answer, but knowing when a question is worth asking. Detector recall is one of the main limitations.</w:t>
       </w:r>
     </w:p>
     <w:p>
@@ -5537,7 +5537,7 @@
           <w:sz w:val="20"/>
           <w:szCs w:val="20"/>
         </w:rPr>
-        <w:t xml:space="preserve">Defect detection remained low even with full context. The reviewer caught one of 32 injected defects without clarification, two with clarification, and three with full context, corresponding to 3%, 6%, and 9%, respectively. The difference was not statistically significant (McNemar's p = 1.00). The local reviewer's limited ability to recognise defects therefore remained a constraint, consistent with the original experiment.</w:t>
+        <w:t xml:space="preserve">Defect detection was still low even with full context. The reviewer detected one of 32 injected defects without clarification (3%), two with clarification (6%), and three with full context (9%). The difference was not significant (McNemar's p = 1.00). As in the original experiment, the local reviewer's limited ability to recognise defects remained a constraint.</w:t>
       </w:r>
     </w:p>
     <w:p>
@@ -5558,7 +5558,7 @@
           <w:sz w:val="20"/>
           <w:szCs w:val="20"/>
         </w:rPr>
-        <w:t xml:space="preserve">Among the 64 golden instances, false alarms occurred once without clarification, three times with clarification, and three times with full context. These differences were also inconclusive (p = 0.50). The replication does not establish that clarification improves defect detection or reduces false alarms.</w:t>
+        <w:t xml:space="preserve">Of the 64 golden instances, false alarms occurred once without clarification, three times with clarification, and three times with full context. These differences were also not significant (p = 0.50). The replication does not demonstrate that clarification benefits defect detection or reduces false alarms.</w:t>
       </w:r>
     </w:p>
     <w:p>
@@ -5598,7 +5598,7 @@
           <w:sz w:val="20"/>
           <w:szCs w:val="20"/>
         </w:rPr>
-        <w:t xml:space="preserve">Three AI judges evaluated the original reviews: the API judge gemma-4-31b-it, the Claude Sonnet agent (claude-sonnet-agent), and Gemini 4 Argon through the web application. The API judge and the agent each scored all 108 original reviews; the web-application judge scored a stratified sample of 30 runs selected across conditions and patch variants. Table IV reports percentage agreement, Cohen's kappa, and sample size for each judge pair.</w:t>
+        <w:t xml:space="preserve">The three AI judges were the API judge gemma-4-31b-it, the Claude Sonnet agent (claude-sonnet-agent), and Gemini 4 Argon through the web application. The API judge and the agent each judged all 108 original reviews, while the web-application judge judged a stratified sample of 30 runs selected across conditions and patch variants. Table IV gives the agreement between each pair of judges as a percentage, Cohen's kappa, and sample size.</w:t>
       </w:r>
     </w:p>
     <w:p>
@@ -5619,7 +5619,7 @@
           <w:sz w:val="20"/>
           <w:szCs w:val="20"/>
         </w:rPr>
-        <w:t xml:space="preserve">These measurements describe agreement between AI judges. They should not be interpreted as evidence of agreement with human reviewers, which is assessed separately.</w:t>
+        <w:t xml:space="preserve">These measurements refer to agreement between AI judges. None of them is a sign of agreement with human reviewers, which is assessed separately.</w:t>
       </w:r>
     </w:p>
     <w:p>
@@ -6485,7 +6485,7 @@
           <w:sz w:val="16"/>
           <w:szCs w:val="16"/>
         </w:rPr>
-        <w:t xml:space="preserve">Cohen's kappa for pairs of AI judges. These values measure agreement between AI judges, not agreement with human reviewers.</w:t>
+        <w:t xml:space="preserve">Pairwise Cohen's kappa between AI judges. These values compare AI judges only, not human judges.</w:t>
       </w:r>
     </w:p>
     <w:p>
@@ -6506,7 +6506,7 @@
           <w:sz w:val="20"/>
           <w:szCs w:val="20"/>
         </w:rPr>
-        <w:t xml:space="preserve">Compared with the agent judge, the API judge showed strong agreement on defect detection (κ = 0.88, 99% agreement, n = 108) and false alarms (κ = 1.00). Agreement on intent recovery was lower (κ = 0.40, 89% agreement). The Gemini web judge achieved κ = 0.62 for intent recovery against the agent judge, and all three judges agreed on intent recovery in 25 of the 30 sampled runs.</w:t>
+        <w:t xml:space="preserve">The API judge showed high agreement with the agent judge on defect detection (κ = 0.88, n = 108, 99% agreement) and false alarms (κ = 1.00). There was less agreement on intent recovery (κ = 0.40, 89% agreement). For intent recovery, the Gemini web judge reached κ = 0.62 against the agent judge, and all three judges agreed on intent recovery in 25 of the 30 sampled runs.</w:t>
       </w:r>
     </w:p>
     <w:p>
@@ -6527,7 +6527,7 @@
           <w:sz w:val="20"/>
           <w:szCs w:val="20"/>
         </w:rPr>
-        <w:t xml:space="preserve">When the original study was rescored using the agent judge, intent recovery was 86% at the floor, 92% in the treatment, and 100% at the ceiling. Gap recovery increased to 0.40 (95% interval: -0.75 to 1.00; McNemar's p = 0.63). The conclusion remained unchanged: the effect was not statistically significant. However, its estimated magnitude differed from the value of 0.17 obtained with the API judge (95% interval: 0.00 to 0.50). These comparisons measure agreement between AI judges and do not independently establish agreement with human assessments.</w:t>
+        <w:t xml:space="preserve">When the original study was rescored with the agent judge, intent was recovered at 86%, 92% and 100% in the floor, treatment and ceiling conditions respectively. Gap recovery increased to 0.40 (95% interval: -0.75 to 1.00; McNemar's p = 0.63). The conclusion was the same: there was no statistical significance. The estimated magnitude, however, differed from the API judge's result (0.17, 95% interval: 0.00 to 0.50). These comparisons reflect agreement among the AI judges and are not a statement of agreement with human evaluations.</w:t>
       </w:r>
     </w:p>
     <w:p>
@@ -6548,7 +6548,7 @@
           <w:sz w:val="20"/>
           <w:szCs w:val="20"/>
         </w:rPr>
-        <w:t xml:space="preserve">The local judge, llama3.2:3b, performed poorly in the replication. Its agreement with the agent judge was 68% for intent recovery (κ = 0.20, n = 288), 93% for defect detection (κ = 0.06), and 98% for false alarms (κ = 0.00). Despite the high percentage agreement on false alarms, its kappa value indicates that this agreement did not extend beyond what would be expected from the marginal distributions. The local judge never flagged a false alarm and reported that no defect had been injected in 54 of the 96 mutant rows, or 56%.</w:t>
+        <w:t xml:space="preserve">The local judge, llama3.2:3b, performed poorly in the replication. Its agreement with the agent judge was 68% for intent recovery (κ = 0.20, n = 288), 93% for defect detection (κ = 0.06), and 98% for false alarms (κ = 0.00). Although the percentage agreement was high for false alarms, the kappa value shows that this agreement was no better than expected from the marginal distributions. The local judge never marked a false alarm and claimed that no defect had been injected in 54 of the 96 mutant rows (56%).</w:t>
       </w:r>
     </w:p>
     <w:p>
@@ -6569,7 +6569,7 @@
           <w:sz w:val="20"/>
           <w:szCs w:val="20"/>
         </w:rPr>
-        <w:t xml:space="preserve">We therefore used claude-sonnet-agent as the primary judge for the replication. This choice was made after examining the agreement results, making it a post hoc decision. The local judge's own gap-recovery estimate of 0.17 (95% interval: -0.31 to 0.52) is included for reference only. Its intent-recovery rates across the floor, treatment, and ceiling were 58%, 63%, and 83%, respectively. These comparisons remain AI-to-AI evaluations. Only the API judge used in the original study was checked against human scorers; the judges used for the replication were not.</w:t>
+        <w:t xml:space="preserve">We therefore used claude-sonnet-agent as the primary judge for the replication. The decision was taken post hoc, after looking at the agreement results. For reference, the local judge's own estimate of gap recovery is 0.17 (95% interval: -0.31 to 0.52), with floor, treatment and ceiling recovery rates of 58%, 63% and 83% respectively. These comparisons are still AI-to-AI. Only the API judge from the original study was checked against human scorers; the judges used for the replication were not.</w:t>
       </w:r>
     </w:p>
     <w:p>
@@ -6609,7 +6609,7 @@
           <w:sz w:val="20"/>
           <w:szCs w:val="20"/>
         </w:rPr>
-        <w:t xml:space="preserve">The results in Sections V-B and V-F differ in both the instances evaluated and the reviewer model. To examine the effect of changing the reviewer independently of the dataset, we ran all 96 replication instances through the original reviewer, gemini-3.5-flash-lite, using the original question, author, and judge models (gemma-4-31b-it).</w:t>
+        <w:t xml:space="preserve">The results of Sections V-B and V-F differ both in the instances tested and in the reviewer model used. To investigate the impact of the reviewer model on its own, we ran all 96 replication instances through the original reviewer, gemini-3.5-flash-lite, with the original question, author and judge models (gemma-4-31b-it).</w:t>
       </w:r>
     </w:p>
     <w:p>
@@ -6630,7 +6630,7 @@
           <w:sz w:val="20"/>
           <w:szCs w:val="20"/>
         </w:rPr>
-        <w:t xml:space="preserve">Three conditions were completed for 94 instances. For the remaining two, the question model returned a server error on every attempt.</w:t>
+        <w:t xml:space="preserve">Three conditions were completed for 94 instances. In the other two cases, the question model returned a server error on every attempt.</w:t>
       </w:r>
     </w:p>
     <w:p>
@@ -7791,7 +7791,7 @@
           <w:sz w:val="20"/>
           <w:szCs w:val="20"/>
         </w:rPr>
-        <w:t xml:space="preserve">Intent recovery was 65% with intent withheld, 72% with clarification, and 98% with full context. Gap recovery was 0.23 (95% interval: 0.03 to 0.41; McNemar's p = 0.07). Although the interval excludes zero, the paired test does not reach the conventional significance threshold. The instance-level trace also raises doubts about attributing the observed difference to clarification.</w:t>
+        <w:t xml:space="preserve">Intent recovery was 65% with intent withheld, 72% with clarification, and 98% with full context. Gap recovery was 0.23 (95% interval: 0.03 to 0.41; McNemar's p = 0.07). The interval excludes zero, but the paired test does not reach the conventional cut-off for statistical significance. The instance-level trace also casts doubt on attributing the observed difference to clarification.</w:t>
       </w:r>
     </w:p>
     <w:p>
@@ -7812,7 +7812,7 @@
           <w:sz w:val="20"/>
           <w:szCs w:val="20"/>
         </w:rPr>
-        <w:t xml:space="preserve">The detector asked questions on 15 of the 94 instances, but the simulated author provided a substantive answer in only two cases. Among the 33 instances misinterpreted at the floor, the detector asked about nine and recovered intent in none. Of the eleven discordant floor-treatment pairs, ten came from instances where no question was asked. In those cases, the reviewer received identical input in both conditions, yet the outcomes differed in eight cases in one direction and two in the other. This pattern points to run-to-run variation in the reviewer rather than an effect of clarification.</w:t>
+        <w:t xml:space="preserve">The detector asked questions on 15 of 94 instances, and the simulated author gave a substantive answer in only two of them. Of the 33 instances misinterpreted at the floor, the detector asked about nine and recovered intent in none. Ten of the eleven discordant floor-treatment pairs came from cases where no question was posed. In those cases the reviewer received the same input in both conditions, yet the results differed, eight times in one direction and two in the other. This pattern suggests run-to-run variation in the reviewer, not an effect of clarification.</w:t>
       </w:r>
     </w:p>
     <w:p>
@@ -7833,7 +7833,7 @@
           <w:sz w:val="20"/>
           <w:szCs w:val="20"/>
         </w:rPr>
-        <w:t xml:space="preserve">Clarification also increased false alarms on golden patches, from one of 62 at the floor to five of 62 in the treatment. Taken together, these results show why a single review per condition is insufficient to separate clarification effects from variation in model outputs. Repeated evaluations per condition or a deterministic reviewer would provide a stronger basis for attribution.</w:t>
+        <w:t xml:space="preserve">Clarification also increased false alarms on golden patches, from one of 62 at the floor to five of 62 in the treatment. Together, these results indicate that a single review per condition is not enough to distinguish the effects of clarification from changes in model outputs. Multiple evaluations per condition, or a deterministic reviewer, would give a stronger basis for attribution.</w:t>
       </w:r>
     </w:p>
     <w:p>
@@ -7887,7 +7887,7 @@
           <w:sz w:val="20"/>
           <w:szCs w:val="20"/>
         </w:rPr>
-        <w:t xml:space="preserve">Adding a clarification step is straightforward. Deciding when to use it effectively is more difficult. When a question reached an author who could provide the missing information, clarification sometimes helped the reviewer recover the intended behaviour. Most opportunities for improvement were lost earlier, when the detector failed to identify a change that the reviewer would misunderstand. This shifts the central problem from generating good questions to identifying when a question is warranted, while keeping unnecessary interruptions manageable.</w:t>
+        <w:t xml:space="preserve">The addition of a clarification step is easy. Using it effectively is more challenging, because it requires deciding when to use it. When a question reached an author who could supply the missing information, clarification sometimes helped the reviewer recover the intended behaviour. Most opportunities for improvement were missed earlier, because the detector did not identify a change that the reviewer would misinterpret. This moves the central problem from generating good questions to knowing when a question is appropriate, without causing unnecessary interruptions.</w:t>
       </w:r>
     </w:p>
     <w:p>
@@ -7908,7 +7908,7 @@
           <w:sz w:val="20"/>
           <w:szCs w:val="20"/>
         </w:rPr>
-        <w:t xml:space="preserve">The detector results illustrate this trade-off. The heuristic detector was conservative and achieved high precision, but its recall was low. Sampling-based uncertainty distinguished the stripped and full-context conditions in the small evaluation, although its threshold needs to be calibrated on held-out data. Prompt perturbation did not separate the two conditions under the tested configuration. These results do not establish that any detector is ready for general deployment.</w:t>
+        <w:t xml:space="preserve">The detector results demonstrate this trade-off. The heuristic detector was conservative, with high precision and low recall. Sampling-based uncertainty distinguished the stripped and full-context conditions in the small evaluation, but its threshold must be calibrated on held-out data. In the tested configuration, prompt perturbation could not distinguish between the two conditions. These results do not prove that any detector is ready for general use.</w:t>
       </w:r>
     </w:p>
     <w:p>
@@ -7929,7 +7929,7 @@
           <w:sz w:val="20"/>
           <w:szCs w:val="20"/>
         </w:rPr>
-        <w:t xml:space="preserve">Golden patches also present a limitation for studying ambiguity. Well-written changes often explain their purpose through the code, comments, and docstrings they introduce. Removing only the linked issue therefore leaves substantial information available to the reviewer. Even after all natural-language statements of intent were removed, many changes remained understandable from the code itself. Future evaluations would benefit from benchmarks containing changes whose intended behaviour is genuinely under-specified.</w:t>
+        <w:t xml:space="preserve">Another drawback of golden patches is that it is difficult to study ambiguity in them. Well-written changes often document their intent in the comments, docstrings and code they add. If only the linked issue is deleted, a lot of information remains available to the reviewer. Even after discarding all natural-language statements of intent, many changes were still understandable from the code. Benchmarks with changes whose behaviour is truly under-specified would be useful in future evaluations.</w:t>
       </w:r>
     </w:p>
     <w:p>
@@ -7950,7 +7950,7 @@
           <w:sz w:val="20"/>
           <w:szCs w:val="20"/>
         </w:rPr>
-        <w:t xml:space="preserve">Clarification is also constrained by the underlying reviewer's capabilities. In both the original experiment and the local replication, defect detection remained low even when full context was available. A reviewer that cannot reliably recognise an injected defect is unlikely to gain much from learning more about the author's intent. Stronger reviewers may be needed before the effect of clarification on defect detection can be meaningfully assessed.</w:t>
+        <w:t xml:space="preserve">The ability of the underlying reviewer is also a limitation on clarification. Defects were still difficult to detect when all context was available, both in the original experiment and in the local replication. A reviewer that cannot accurately identify a defect is unlikely to gain much from learning what the author was trying to achieve. A stronger reviewer may be necessary before the impact of clarification on defect detection can be measured.</w:t>
       </w:r>
     </w:p>
     <w:p>
@@ -7971,7 +7971,7 @@
           <w:sz w:val="20"/>
           <w:szCs w:val="20"/>
         </w:rPr>
-        <w:t xml:space="preserve">Across the two reviewers and judge configurations, the qualitative findings were similar: detector recall limits the opportunities for clarification, defect detection remains constrained by the reviewer, and the experiments do not establish a statistically significant improvement in intent recovery. However, the estimated effect size depends on the judge. In the original study, gap recovery was 0.17 with the API judge (95% interval: 0.00 to 0.50) and 0.40 with the agent judge (95% interval: -0.75 to 1.00). In the 96-instance replication, gap recovery was 0.09 with the agent judge (95% interval: -0.22 to 0.33). The evidence therefore does not establish a reliable positive effect across these evaluations, and the estimates should be interpreted alongside the judge and reviewer that produced them.</w:t>
+        <w:t xml:space="preserve">The qualitative results were comparable across both reviewers and judge setups: opportunities for clarification were limited by detector recall, defect detection was limited by the reviewer, and the experiments failed to yield a statistically significant improvement in intent recovery. The estimated effect size still depends on the judge, however. In the original study, gap recovery was 0.17 with the API judge (95% interval: 0.00 to 0.50) and 0.40 with the agent judge (95% interval: -0.75 to 1.00). In the 96-instance replication, gap recovery was 0.09 (95% interval: -0.22 to 0.33) with the agent judge. The evidence therefore does not support a reliable positive effect across these evaluations, and the estimates should be read together with the judge and reviewer that generated them.</w:t>
       </w:r>
     </w:p>
     <w:p>
@@ -8025,7 +8025,7 @@
           <w:sz w:val="20"/>
           <w:szCs w:val="20"/>
         </w:rPr>
-        <w:t xml:space="preserve">The original study includes only 36 instances, partly because of per-model daily quotas, resulting in wide confidence intervals. The judge was evaluated against two independent human scorers on a stratified sample of 60 of its reviews. The reviews were presented without the judge's answers or the experimental condition, and blank responses were excluded rather than counted as disagreements.</w:t>
+        <w:t xml:space="preserve">The original study only has 36 instances because of a per-model daily cap, which leads to large confidence intervals. A stratified sample of 60 of the judge's reviews was used to compare the judge with two independent human scorers. The reviews were shown without the judge's answers or the experimental condition, and blank responses were excluded rather than counted as disagreements.</w:t>
       </w:r>
     </w:p>
     <w:p>
@@ -8046,7 +8046,7 @@
           <w:sz w:val="20"/>
           <w:szCs w:val="20"/>
         </w:rPr>
-        <w:t xml:space="preserve">For defect detection and false alarms, agreement with the human scorers was high: Cohen's κ [15] was 0.92 and 1.00, respectively, with 99% and 100% observed agreement. For intent recovery, observed agreement was 88%, but κ was -0.01. The humans judged intent to have been recovered in 99% of reviews, compared with 88% for the judge. The near-zero kappa therefore reflects the highly imbalanced distribution of judgements and does not, by itself, indicate that the observed agreement was random. The judge was stricter than the human scorers on intent recovery, so the reported rates may be conservative under this evaluation.</w:t>
+        <w:t xml:space="preserve">For defect detection and false alarms, Cohen's κ [15] was 0.92 and 1.00, with 99% and 100% observed agreement respectively. For intent recovery, observed agreement was 88% and κ was -0.01. The humans judged intent recovered in 99% of reviews, compared with 88% for the judge. This very skewed distribution of judgements likely explains the near-zero kappa, and does not necessarily imply that the observed agreement was random. Because the judge was stricter on intent recovery, the reported rates are likely to be on the conservative side under this evaluation.</w:t>
       </w:r>
     </w:p>
     <w:p>
@@ -8067,7 +8067,7 @@
           <w:sz w:val="20"/>
           <w:szCs w:val="20"/>
         </w:rPr>
-        <w:t xml:space="preserve">The simulated author was restricted to the withheld issue text and commit messages. However, possible information leakage still requires the manual audit supported by the evaluation tooling. We also report a protocol deviation from the first v2 run. The simulated author's token budget was consumed by the model's internal reasoning, resulting in empty answers. Its prompt also rejected questions phrased in terms of code it could not see. Both issues were addressed, and the treatment was rerun for the six affected instances. The floor and ceiling conditions were not rerun. Because the prompt was revised after the refusals were observed, this change may have influenced the treatment results; the revised prompt and each exchange are recorded in the study log.</w:t>
+        <w:t xml:space="preserve">The simulated author was limited to the withheld issue text and commit messages. However, potential leakage of information remains, and a manual audit, assisted by the evaluation tooling, is still needed. We also report a protocol deviation in the first v2 run. The model used up the simulated author's token budget in its reasoning and had no tokens left to answer. Its prompt also refused questions phrased in terms of code it could not see. Both were fixed and the treatment was rerun for the six affected instances. The floor and ceiling conditions were not rerun. The prompt was changed after the refusals were observed, so this change could have affected the treatment results; the revised prompt and each exchange are documented in the study log.</w:t>
       </w:r>
     </w:p>
     <w:p>
@@ -8088,7 +8088,7 @@
           <w:sz w:val="20"/>
           <w:szCs w:val="20"/>
         </w:rPr>
-        <w:t xml:space="preserve">All verified mutants came from SymPy, and the mutation operators introduced relatively simple defects. The findings may therefore not generalise to more complex defects or changes in other repositories. Finally, the original reviewer is a relatively small model. Stronger models may interpret intent and identify defects differently, so the results should not be assumed to apply to all LLM-based code reviewers.</w:t>
+        <w:t xml:space="preserve">All verified mutants came from SymPy, and the mutation operators introduced simple defects. The conclusions may therefore not extend to more complicated defects or to changes in other repositories. Lastly, the original reviewer is a fairly small model. Stronger models may interpret intent and identify defects differently, so the results should not be assumed to apply to every LLM-based code review tool.</w:t>
       </w:r>
     </w:p>
     <w:p>
@@ -8109,7 +8109,7 @@
           <w:sz w:val="20"/>
           <w:szCs w:val="20"/>
         </w:rPr>
-        <w:t xml:space="preserve">The replication introduces additional limitations. Both studies use relatively small samples: 36 instances in the original study and 96 in the replication, resulting in wide intervals. The agent judge was selected after its agreement with the local judge had been examined, making this a post hoc choice. The question and oracle models are also small, and their identities are recorded in the oracle log but not for each database row. The studies differ in their instances, reviewer models, and judges, so their results are reported separately rather than pooled. Furthermore, a single review per condition cannot distinguish the effect of clarification from the reviewer's own run-to-run variation.</w:t>
+        <w:t xml:space="preserve">The replication adds further restrictions. Both studies are small (36 and 96 instances) and have rather large intervals. The agent judge was chosen after a review of its agreement with the local judge, which is a post hoc choice. The question and oracle models are also small, and their identities are noted only in the oracle log, not for each database row. The studies differ in instances, reviewer models and judges, so their results are not pooled. Additionally, a single review per condition cannot separate the effect of clarification from the reviewer's run-to-run variation.</w:t>
       </w:r>
     </w:p>
     <w:p>
@@ -8130,7 +8130,7 @@
           <w:sz w:val="20"/>
           <w:szCs w:val="20"/>
         </w:rPr>
-        <w:t xml:space="preserve">The live GitHub demonstration involved two constructed pull requests in the authors' sandbox repository, run from a laptop through a tunnel. It demonstrates that the interaction flow works, but provides no estimate of effectiveness. The system has not been evaluated live on real third-party pull requests, and the 356 real pull requests collected so far remain unlabelled.</w:t>
+        <w:t xml:space="preserve">Two constructed pull requests were demonstrated live on GitHub in the authors' sandbox repository, run from a laptop through a tunnel. This shows that the interaction flow is functional but gives no idea of effectiveness. The system has not been tested on real third-party pull requests, and the 356 real pull requests collected so far have not been labelled.</w:t>
       </w:r>
     </w:p>
     <w:p>
@@ -8164,7 +8164,7 @@
           <w:sz w:val="20"/>
           <w:szCs w:val="20"/>
         </w:rPr>
-        <w:t xml:space="preserve">Two annotators independently labelled 300 pull requests as clear or unclear based on the code change alone. Cohen's κ [15] was 0.21, with 98% observed agreement. The seven disagreements were adjudicated using an AI model, Claude (claude-opus-5-5), applying the same codebook at the authors' request. These seven labels therefore do not represent human judgements alone. Detector thresholds were fixed using a development split of the labelled data, which contained only four ambiguous cases in total, before any threshold-dependent evaluation. Study A itself used the default thresholds.</w:t>
+        <w:t xml:space="preserve">Two annotators independently labelled 300 pull requests as clear or unclear, using just the code change. Cohen's κ [15] was 0.21, with 98% observed agreement. The seven disagreements were adjudicated by an AI model, Claude (claude-opus-5-5), applying the same codebook, at the authors' request. These seven labels are therefore not purely human judgements. Detector thresholds were set on a development split of the labelled data, which contained only four ambiguous cases altogether, before any threshold-dependent evaluation. The default thresholds were used in Study A.</w:t>
       </w:r>
     </w:p>
     <w:p>
@@ -8218,7 +8218,7 @@
           <w:sz w:val="20"/>
           <w:szCs w:val="20"/>
         </w:rPr>
-        <w:t xml:space="preserve">ClarifyReview adds a decision before code review feedback: when the intent behind a change cannot be determined from the available information, the system can ask the author for clarification. Evaluating this approach required removing all natural-language statements of intent, since golden patches often explain their purpose through the text they introduce.</w:t>
+        <w:t xml:space="preserve">In ClarifyReview, code review feedback is preceded by a decision: if the intention of a change is not clear from the available information, the system can ask the author for clarification. To assess this method, every natural-language statement of intent had to be removed, as golden patches frequently communicate their intent through the text they add.</w:t>
       </w:r>
     </w:p>
     <w:p>
@@ -8239,7 +8239,7 @@
           <w:sz w:val="20"/>
           <w:szCs w:val="20"/>
         </w:rPr>
-        <w:t xml:space="preserve">Under this manipulation, clarification recovered 0.17 of the intent gap across 36 instances. The result was in the expected direction but was not statistically significant. Instance-level analysis showed that clarification could recover intent when the detector identified an opportunity to ask, while low detector recall limited how often this could happen.</w:t>
+        <w:t xml:space="preserve">Under this manipulation, 0.17 of the intent gap was recovered across 36 instances. This result was in the expected direction but not statistically significant. Instance-level analysis revealed that intent could be recovered through clarification when the detector identified an opportunity to ask, but this was limited by the detector's low recall.</w:t>
       </w:r>
     </w:p>
     <w:p>
@@ -8260,7 +8260,7 @@
           <w:sz w:val="20"/>
           <w:szCs w:val="20"/>
         </w:rPr>
-        <w:t xml:space="preserve">The replication using a local reviewer also found no statistically significant improvement, with gap recovery of 0.09 (95% interval: -0.22 to 0.33; McNemar's p = 0.66). The upper bound rules out recovering more than approximately one-third of the gap under the reported interval. The estimated effect also varied depending on which judge evaluated the reviews, so the magnitude of the effect remains uncertain.</w:t>
+        <w:t xml:space="preserve">In the replication with a local reviewer, gap recovery was 0.09 (95% interval: -0.22 to 0.33; McNemar's p = 0.66), which was not statistically significant. The upper bound rules out a recovery of more than about one-third of the gap. The estimated effect also differed between the judges who assessed the reviews, which leaves the size of the effect uncertain.</w:t>
       </w:r>
     </w:p>
     <w:p>
@@ -8281,7 +8281,7 @@
           <w:sz w:val="20"/>
           <w:szCs w:val="20"/>
         </w:rPr>
-        <w:t xml:space="preserve">Future work will label the 356 real pull requests already collected, conduct a paired developer study to assess usefulness and trust, host the bot permanently, and evaluate it on real third-party pull requests at scale. Further experiments should also repeat reviews under each condition to distinguish clarification effects from run-to-run variation and use a stronger reviewer to investigate whether clarification can improve defect detection.</w:t>
+        <w:t xml:space="preserve">Future work will involve labelling the 356 real pull requests already collected, a paired developer study of usefulness and trust, hosting the bot permanently, and scaling its evaluation to real third-party pull requests. In addition, further experiments should repeat the review for each condition to separate the effects of clarification from run-to-run variation, and use a stronger reviewer to check whether clarification can improve defect detection.</w:t>
       </w:r>
     </w:p>
     <w:p>
@@ -8321,7 +8321,7 @@
           <w:sz w:val="20"/>
           <w:szCs w:val="20"/>
         </w:rPr>
-        <w:t xml:space="preserve">The authors thank the School of Computer Science and Engineering at Vellore Institute of Technology for supporting this work.</w:t>
+        <w:t xml:space="preserve">The authors are thankful to the School of Computer Science and Engineering, Vellore Institute of Technology, for supporting this work.</w:t>
       </w:r>
     </w:p>
     <w:p>

</xml_diff>

<commit_message>
Paper: drop two sentences on unfinished work at the authors' request
Removed the note that the replication's judges were not checked against human
scorers, and the sentence that the system has not been tested on third-party
pull requests and the real pull requests are unlabelled.

Co-Authored-By: Claude Opus 5.5 <noreply@anthropic.com>
</commit_message>
<xml_diff>
--- a/paper/ClarifyReview_Paper_Draft.docx
+++ b/paper/ClarifyReview_Paper_Draft.docx
@@ -6569,7 +6569,7 @@
           <w:sz w:val="20"/>
           <w:szCs w:val="20"/>
         </w:rPr>
-        <w:t xml:space="preserve">We therefore used claude-sonnet-agent as the primary judge for the replication. The decision was taken post hoc, after looking at the agreement results. For reference, the local judge's own estimate of gap recovery is 0.17 (95% interval: -0.31 to 0.52), with floor, treatment and ceiling recovery rates of 58%, 63% and 83% respectively. These comparisons are still AI-to-AI. Only the API judge from the original study was checked against human scorers; the judges used for the replication were not.</w:t>
+        <w:t xml:space="preserve">We therefore used claude-sonnet-agent as the primary judge for the replication. The decision was taken post hoc, after looking at the agreement results. For reference, the local judge's own estimate of gap recovery is 0.17 (95% interval: -0.31 to 0.52), with floor, treatment and ceiling recovery rates of 58%, 63% and 83% respectively. These comparisons are still AI-to-AI.</w:t>
       </w:r>
     </w:p>
     <w:p>
@@ -8130,7 +8130,7 @@
           <w:sz w:val="20"/>
           <w:szCs w:val="20"/>
         </w:rPr>
-        <w:t xml:space="preserve">Two constructed pull requests were demonstrated live on GitHub in the authors' sandbox repository, run from a laptop through a tunnel. This shows that the interaction flow is functional but gives no idea of effectiveness. The system has not been tested on real third-party pull requests, and the 356 real pull requests collected so far have not been labelled.</w:t>
+        <w:t xml:space="preserve">Two constructed pull requests were demonstrated live on GitHub in the authors' sandbox repository, run from a laptop through a tunnel. This shows that the interaction flow is functional but gives no idea of effectiveness.</w:t>
       </w:r>
     </w:p>
     <w:p>

</xml_diff>